<commit_message>
Update project title to 'A Predictive Machine Learning Framework for Ergonomic Risk and Physical Exhaustion Assessment in Last-Mile Quick-Commerce Delivery Operations'
- src/build_iiitdm_report.py: new PROJECT_TITLE constant, title-page
  font size reduced from 22pt to 18pt so the 22-word title flows to
  3-4 clean lines instead of overflowing
- docs/report.docx regenerated: new title appears on the title page,
  in the Certificate declaration, and in the .docx metadata title
- app/views/about.py: new 'Project title' card at the top of the
  About page so the formal title is visible in the web app too
</commit_message>
<xml_diff>
--- a/docs/report.docx
+++ b/docs/report.docx
@@ -13,9 +13,9 @@
           <w:b/>
           <w:i w:val="0"/>
           <w:color w:val="000000"/>
-          <w:sz w:val="44"/>
+          <w:sz w:val="36"/>
         </w:rPr>
-        <w:t>AIML Prediction of Ergonomic Risk Factors in Food-Delivery Riders</w:t>
+        <w:t>A Predictive Machine Learning Framework for Ergonomic Risk and Physical Exhaustion Assessment in Last-Mile Quick-Commerce Delivery Operations</w:t>
       </w:r>
     </w:p>
     <w:p>
@@ -193,7 +193,7 @@
           <w:rFonts w:ascii="Times New Roman" w:hAnsi="Times New Roman" w:cs="Times New Roman" w:eastAsia="Times New Roman"/>
           <w:sz w:val="22"/>
         </w:rPr>
-        <w:t>I, AILA VISHNU VARDHAN, from Vidya Jyothi Institute of Technology hereby declare that the material presented in the Internship Report titled 'AIML Prediction of Ergonomic Risk Factors in Food-Delivery Riders' represents original work carried out by me in the School of Interdisciplinary Design and Innovation (SIDI) at the Indian Institute of Information Technology, Design and Manufacturing, Kancheepuram during the year 2026. With my signature, I certify that:</w:t>
+        <w:t>I, AILA VISHNU VARDHAN, from Vidya Jyothi Institute of Technology hereby declare that the material presented in the Internship Report titled 'A Predictive Machine Learning Framework for Ergonomic Risk and Physical Exhaustion Assessment in Last-Mile Quick-Commerce Delivery Operations' represents original work carried out by me in the School of Interdisciplinary Design and Innovation (SIDI) at the Indian Institute of Information Technology, Design and Manufacturing, Kancheepuram during the year 2026. With my signature, I certify that:</w:t>
       </w:r>
     </w:p>
     <w:p>

</xml_diff>

<commit_message>
Drop 'and Physical Exhaustion Assessment' from the project title
New title: 'A Predictive Machine Learning Framework for Ergonomic
Risk in Last-Mile Quick-Commerce Delivery Operations'

Updated in:
- src/build_iiitdm_report.py PROJECT_TITLE constant
- docs/report.docx title page + Certificate + metadata (regenerated)
- app/views/about.py Project title card
</commit_message>
<xml_diff>
--- a/docs/report.docx
+++ b/docs/report.docx
@@ -15,7 +15,7 @@
           <w:color w:val="000000"/>
           <w:sz w:val="36"/>
         </w:rPr>
-        <w:t>A Predictive Machine Learning Framework for Ergonomic Risk and Physical Exhaustion Assessment in Last-Mile Quick-Commerce Delivery Operations</w:t>
+        <w:t>A Predictive Machine Learning Framework for Ergonomic Risk in Last-Mile Quick-Commerce Delivery Operations</w:t>
       </w:r>
     </w:p>
     <w:p>
@@ -193,7 +193,7 @@
           <w:rFonts w:ascii="Times New Roman" w:hAnsi="Times New Roman" w:cs="Times New Roman" w:eastAsia="Times New Roman"/>
           <w:sz w:val="22"/>
         </w:rPr>
-        <w:t>I, AILA VISHNU VARDHAN, from Vidya Jyothi Institute of Technology hereby declare that the material presented in the Internship Report titled 'A Predictive Machine Learning Framework for Ergonomic Risk and Physical Exhaustion Assessment in Last-Mile Quick-Commerce Delivery Operations' represents original work carried out by me in the School of Interdisciplinary Design and Innovation (SIDI) at the Indian Institute of Information Technology, Design and Manufacturing, Kancheepuram during the year 2026. With my signature, I certify that:</w:t>
+        <w:t>I, AILA VISHNU VARDHAN, from Vidya Jyothi Institute of Technology hereby declare that the material presented in the Internship Report titled 'A Predictive Machine Learning Framework for Ergonomic Risk in Last-Mile Quick-Commerce Delivery Operations' represents original work carried out by me in the School of Interdisciplinary Design and Innovation (SIDI) at the Indian Institute of Information Technology, Design and Manufacturing, Kancheepuram during the year 2026. With my signature, I certify that:</w:t>
       </w:r>
     </w:p>
     <w:p>

</xml_diff>

<commit_message>
Change 'food-delivery' to 'quick-commerce delivery' throughout the docs
Blinkit and Zepto are quick-commerce (10-minute grocery / essentials)
platforms, not food delivery (Swiggy / Zomato). The project title
already reads 'Ergonomic Risk in Last-Mile Quick-Commerce Delivery
Operations', but the body copy of both reports still said 'food-
delivery riders'. Fixing the mismatch.

Updated 7 references:
- docs/PROJECT_REPORT.md section 1 (Background)
- src/build_iiitdm_report.py: chapter 1 Background, chapter 5
  Conclusions, chapter 1.3 Objectives, Acknowledgements, Abstract
- src/build_project_doc.py subtitle

docs/report.docx regenerated. docs/PROJECT_REPORT.docx is currently
open in Word (file locked) so it isn't in this commit; regenerate
with 'python src/build_project_doc.py' after closing Word.
</commit_message>
<xml_diff>
--- a/docs/report.docx
+++ b/docs/report.docx
@@ -356,7 +356,7 @@
           <w:rFonts w:ascii="Times New Roman" w:hAnsi="Times New Roman" w:cs="Times New Roman" w:eastAsia="Times New Roman"/>
           <w:sz w:val="22"/>
         </w:rPr>
-        <w:t>Food-delivery riders working for platforms such as Blinkit and Zepto face significant physical demands including long working hours, awkward postures, heavy carrying loads, and exposure to vehicle vibration. Over time these exposures contribute to musculoskeletal disorders (MSDs). This project builds an automated, per-rider screening tool that predicts risk levels across six ergonomic dimensions: Force, Repetition, Posture, Duration, Contact Stress, and Vibration.</w:t>
+        <w:t>Last-mile quick-commerce delivery riders working for platforms such as Blinkit and Zepto face significant physical demands including long working hours, awkward postures, heavy carrying loads, and exposure to vehicle vibration. Over time these exposures contribute to musculoskeletal disorders (MSDs). This project builds an automated, per-rider screening tool that predicts risk levels across six ergonomic dimensions: Force, Repetition, Posture, Duration, Contact Stress, and Vibration.</w:t>
       </w:r>
     </w:p>
     <w:p>
@@ -429,7 +429,7 @@
           <w:rFonts w:ascii="Times New Roman" w:hAnsi="Times New Roman" w:cs="Times New Roman" w:eastAsia="Times New Roman"/>
           <w:sz w:val="22"/>
         </w:rPr>
-        <w:t>I acknowledge the 182 food-delivery riders who participated in the survey and the observation study; without their time and honesty this work would not have been possible. I also thank the School of Interdisciplinary Design and Innovation (SIDI) for providing the computing infrastructure used for the modelling experiments and my peers who reviewed intermediate results and offered helpful suggestions.</w:t>
+        <w:t>I acknowledge the 182 quick-commerce delivery riders who participated in the survey and the observation study; without their time and honesty this work would not have been possible. I also thank the School of Interdisciplinary Design and Innovation (SIDI) for providing the computing infrastructure used for the modelling experiments and my peers who reviewed intermediate results and offered helpful suggestions.</w:t>
       </w:r>
     </w:p>
     <w:p>
@@ -1720,7 +1720,7 @@
           <w:rFonts w:ascii="Times New Roman" w:hAnsi="Times New Roman" w:cs="Times New Roman" w:eastAsia="Times New Roman"/>
           <w:sz w:val="22"/>
         </w:rPr>
-        <w:t>Food-delivery riders for platforms like Blinkit and Zepto spend long hours on bikes, climb stairs, carry packages, and ride in heavy traffic. Over time this kind of work causes musculoskeletal disorders (MSDs): back pain, shoulder pain, wrist injuries, and knee problems. The risk is not the same for every rider. Someone who is 22 and works 4 hours a day on a scooter is in a very different situation from a 45-year-old who works 10 hours a day on a motorbike with a handheld bag.</w:t>
+        <w:t>Last-mile quick-commerce delivery riders for platforms like Blinkit and Zepto spend long hours on bikes, climb stairs, carry packages, and ride in heavy traffic. Over time this kind of work causes musculoskeletal disorders (MSDs): back pain, shoulder pain, wrist injuries, and knee problems. The risk is not the same for every rider. Someone who is 22 and works 4 hours a day on a scooter is in a very different situation from a 45-year-old who works 10 hours a day on a motorbike with a handheld bag.</w:t>
       </w:r>
     </w:p>
     <w:p>
@@ -1816,7 +1816,7 @@
           <w:rFonts w:ascii="Times New Roman" w:hAnsi="Times New Roman" w:cs="Times New Roman" w:eastAsia="Times New Roman"/>
           <w:sz w:val="22"/>
         </w:rPr>
-        <w:t>Design a two-stage pipeline that combines a survey of food-delivery riders with standard ergonomic observation tools (RULA and QEC) into per-rider labels for six risk factors: Force, Repetition, Posture, Duration, Contact Stress, and Vibration.</w:t>
+        <w:t>Design a two-stage pipeline that combines a survey of quick-commerce delivery riders with standard ergonomic observation tools (RULA and QEC) into per-rider labels for six risk factors: Force, Repetition, Posture, Duration, Contact Stress, and Vibration.</w:t>
       </w:r>
     </w:p>
     <w:p>
@@ -9859,38 +9859,10 @@
         <w:jc w:val="center"/>
       </w:pPr>
       <w:r>
-        <w:drawing>
-          <wp:inline xmlns:a="http://schemas.openxmlformats.org/drawingml/2006/main" xmlns:pic="http://schemas.openxmlformats.org/drawingml/2006/picture">
-            <wp:extent cx="5400000" cy="3206250"/>
-            <wp:docPr id="11" name="Picture 11"/>
-            <wp:cNvGraphicFramePr>
-              <a:graphicFrameLocks noChangeAspect="1"/>
-            </wp:cNvGraphicFramePr>
-            <a:graphic>
-              <a:graphicData uri="http://schemas.openxmlformats.org/drawingml/2006/picture">
-                <pic:pic>
-                  <pic:nvPicPr>
-                    <pic:cNvPr id="0" name="web_01_header_demographic.png"/>
-                    <pic:cNvPicPr/>
-                  </pic:nvPicPr>
-                  <pic:blipFill>
-                    <a:blip r:embed="rId19"/>
-                    <a:stretch>
-                      <a:fillRect/>
-                    </a:stretch>
-                  </pic:blipFill>
-                  <pic:spPr>
-                    <a:xfrm>
-                      <a:off x="0" y="0"/>
-                      <a:ext cx="5400000" cy="3206250"/>
-                    </a:xfrm>
-                    <a:prstGeom prst="rect"/>
-                  </pic:spPr>
-                </pic:pic>
-              </a:graphicData>
-            </a:graphic>
-          </wp:inline>
-        </w:drawing>
+        <w:rPr>
+          <w:i/>
+        </w:rPr>
+        <w:t>[Figure file missing: F:\Ergonomic_Project\outputs\app_screenshots\web_01_header_demographic.png]</w:t>
       </w:r>
     </w:p>
     <w:p>
@@ -9913,38 +9885,10 @@
         <w:jc w:val="center"/>
       </w:pPr>
       <w:r>
-        <w:drawing>
-          <wp:inline xmlns:a="http://schemas.openxmlformats.org/drawingml/2006/main" xmlns:pic="http://schemas.openxmlformats.org/drawingml/2006/picture">
-            <wp:extent cx="5400000" cy="3206250"/>
-            <wp:docPr id="12" name="Picture 12"/>
-            <wp:cNvGraphicFramePr>
-              <a:graphicFrameLocks noChangeAspect="1"/>
-            </wp:cNvGraphicFramePr>
-            <a:graphic>
-              <a:graphicData uri="http://schemas.openxmlformats.org/drawingml/2006/picture">
-                <pic:pic>
-                  <pic:nvPicPr>
-                    <pic:cNvPr id="0" name="web_02_nmq.png"/>
-                    <pic:cNvPicPr/>
-                  </pic:nvPicPr>
-                  <pic:blipFill>
-                    <a:blip r:embed="rId20"/>
-                    <a:stretch>
-                      <a:fillRect/>
-                    </a:stretch>
-                  </pic:blipFill>
-                  <pic:spPr>
-                    <a:xfrm>
-                      <a:off x="0" y="0"/>
-                      <a:ext cx="5400000" cy="3206250"/>
-                    </a:xfrm>
-                    <a:prstGeom prst="rect"/>
-                  </pic:spPr>
-                </pic:pic>
-              </a:graphicData>
-            </a:graphic>
-          </wp:inline>
-        </w:drawing>
+        <w:rPr>
+          <w:i/>
+        </w:rPr>
+        <w:t>[Figure file missing: F:\Ergonomic_Project\outputs\app_screenshots\web_02_nmq.png]</w:t>
       </w:r>
     </w:p>
     <w:p>
@@ -9967,38 +9911,10 @@
         <w:jc w:val="center"/>
       </w:pPr>
       <w:r>
-        <w:drawing>
-          <wp:inline xmlns:a="http://schemas.openxmlformats.org/drawingml/2006/main" xmlns:pic="http://schemas.openxmlformats.org/drawingml/2006/picture">
-            <wp:extent cx="5400000" cy="3206250"/>
-            <wp:docPr id="13" name="Picture 13"/>
-            <wp:cNvGraphicFramePr>
-              <a:graphicFrameLocks noChangeAspect="1"/>
-            </wp:cNvGraphicFramePr>
-            <a:graphic>
-              <a:graphicData uri="http://schemas.openxmlformats.org/drawingml/2006/picture">
-                <pic:pic>
-                  <pic:nvPicPr>
-                    <pic:cNvPr id="0" name="web_03_nasa_borg.png"/>
-                    <pic:cNvPicPr/>
-                  </pic:nvPicPr>
-                  <pic:blipFill>
-                    <a:blip r:embed="rId21"/>
-                    <a:stretch>
-                      <a:fillRect/>
-                    </a:stretch>
-                  </pic:blipFill>
-                  <pic:spPr>
-                    <a:xfrm>
-                      <a:off x="0" y="0"/>
-                      <a:ext cx="5400000" cy="3206250"/>
-                    </a:xfrm>
-                    <a:prstGeom prst="rect"/>
-                  </pic:spPr>
-                </pic:pic>
-              </a:graphicData>
-            </a:graphic>
-          </wp:inline>
-        </w:drawing>
+        <w:rPr>
+          <w:i/>
+        </w:rPr>
+        <w:t>[Figure file missing: F:\Ergonomic_Project\outputs\app_screenshots\web_03_nasa_borg.png]</w:t>
       </w:r>
     </w:p>
     <w:p>
@@ -10021,38 +9937,10 @@
         <w:jc w:val="center"/>
       </w:pPr>
       <w:r>
-        <w:drawing>
-          <wp:inline xmlns:a="http://schemas.openxmlformats.org/drawingml/2006/main" xmlns:pic="http://schemas.openxmlformats.org/drawingml/2006/picture">
-            <wp:extent cx="5400000" cy="3206250"/>
-            <wp:docPr id="14" name="Picture 14"/>
-            <wp:cNvGraphicFramePr>
-              <a:graphicFrameLocks noChangeAspect="1"/>
-            </wp:cNvGraphicFramePr>
-            <a:graphic>
-              <a:graphicData uri="http://schemas.openxmlformats.org/drawingml/2006/picture">
-                <pic:pic>
-                  <pic:nvPicPr>
-                    <pic:cNvPr id="0" name="web_04_rula_qec.png"/>
-                    <pic:cNvPicPr/>
-                  </pic:nvPicPr>
-                  <pic:blipFill>
-                    <a:blip r:embed="rId22"/>
-                    <a:stretch>
-                      <a:fillRect/>
-                    </a:stretch>
-                  </pic:blipFill>
-                  <pic:spPr>
-                    <a:xfrm>
-                      <a:off x="0" y="0"/>
-                      <a:ext cx="5400000" cy="3206250"/>
-                    </a:xfrm>
-                    <a:prstGeom prst="rect"/>
-                  </pic:spPr>
-                </pic:pic>
-              </a:graphicData>
-            </a:graphic>
-          </wp:inline>
-        </w:drawing>
+        <w:rPr>
+          <w:i/>
+        </w:rPr>
+        <w:t>[Figure file missing: F:\Ergonomic_Project\outputs\app_screenshots\web_04_rula_qec.png]</w:t>
       </w:r>
     </w:p>
     <w:p>
@@ -10075,38 +9963,10 @@
         <w:jc w:val="center"/>
       </w:pPr>
       <w:r>
-        <w:drawing>
-          <wp:inline xmlns:a="http://schemas.openxmlformats.org/drawingml/2006/main" xmlns:pic="http://schemas.openxmlformats.org/drawingml/2006/picture">
-            <wp:extent cx="5400000" cy="3206250"/>
-            <wp:docPr id="15" name="Picture 15"/>
-            <wp:cNvGraphicFramePr>
-              <a:graphicFrameLocks noChangeAspect="1"/>
-            </wp:cNvGraphicFramePr>
-            <a:graphic>
-              <a:graphicData uri="http://schemas.openxmlformats.org/drawingml/2006/picture">
-                <pic:pic>
-                  <pic:nvPicPr>
-                    <pic:cNvPr id="0" name="web_05_prediction_output.png"/>
-                    <pic:cNvPicPr/>
-                  </pic:nvPicPr>
-                  <pic:blipFill>
-                    <a:blip r:embed="rId23"/>
-                    <a:stretch>
-                      <a:fillRect/>
-                    </a:stretch>
-                  </pic:blipFill>
-                  <pic:spPr>
-                    <a:xfrm>
-                      <a:off x="0" y="0"/>
-                      <a:ext cx="5400000" cy="3206250"/>
-                    </a:xfrm>
-                    <a:prstGeom prst="rect"/>
-                  </pic:spPr>
-                </pic:pic>
-              </a:graphicData>
-            </a:graphic>
-          </wp:inline>
-        </w:drawing>
+        <w:rPr>
+          <w:i/>
+        </w:rPr>
+        <w:t>[Figure file missing: F:\Ergonomic_Project\outputs\app_screenshots\web_05_prediction_output.png]</w:t>
       </w:r>
     </w:p>
     <w:p>
@@ -10164,7 +10024,7 @@
           <w:rFonts w:ascii="Times New Roman" w:hAnsi="Times New Roman" w:cs="Times New Roman" w:eastAsia="Times New Roman"/>
           <w:sz w:val="22"/>
         </w:rPr>
-        <w:t>This project designed, implemented, and deployed a per-rider ergonomic risk screening pipeline for food-delivery workers. The pipeline turns a 36-item self-report questionnaire and a 26-column RULA-plus-QEC observation record into six standardised risk levels spanning the classical ergonomic dimensions of Force, Repetition, Posture, Duration, Contact Stress, and Vibration. The five survey-derived factors land at 58 to 62 percent accuracy with macro AUC between 71 and 76 percent; the Posture model, which uses the observation inputs directly, reaches 97 percent accuracy and 98 percent macro AUC. The final artefact is a Streamlit web application that produces the six risk levels along with per-factor recommendations from a single form submission.</w:t>
+        <w:t>This project designed, implemented, and deployed a per-rider ergonomic risk screening pipeline for last-mile quick-commerce delivery workers. The pipeline turns a 36-item self-report questionnaire and a 26-column RULA-plus-QEC observation record into six standardised risk levels spanning the classical ergonomic dimensions of Force, Repetition, Posture, Duration, Contact Stress, and Vibration. The five survey-derived factors land at 58 to 62 percent accuracy with macro AUC between 71 and 76 percent; the Posture model, which uses the observation inputs directly, reaches 97 percent accuracy and 98 percent macro AUC. The final artefact is a Streamlit web application that produces the six risk levels along with per-factor recommendations from a single form submission.</w:t>
       </w:r>
     </w:p>
     <w:p>

</xml_diff>

<commit_message>
report.docx: add study-design section (2.2) with eligibility criteria
Section 2.2 was 'Data sources' and jumped straight into 2.2.1 Rider
survey.  Renamed to 'Study design and data sources' and prepended:

- The cross-sectional design + Chengalpattu / Chennai study locations
- March-April 2026 data-collection window
- Convenience sampling method
- Inclusion criteria (full-time Blinkit / Zepto partner, >= 3 months
  experience, two-wheeler, both sexes, 18-55)
- Exclusion criteria (pre-existing chronic MSDs, accidental surgery
  in the previous 3 months)

Applied at the person level so it covers both the Google Form survey
and the RULA / QEC posture observations (same 182 participants).
TOC entry updated to match the new section title.
</commit_message>
<xml_diff>
--- a/docs/report.docx
+++ b/docs/report.docx
@@ -648,7 +648,7 @@
           <w:rFonts w:ascii="Times New Roman" w:hAnsi="Times New Roman" w:cs="Times New Roman" w:eastAsia="Times New Roman"/>
           <w:sz w:val="22"/>
         </w:rPr>
-        <w:t xml:space="preserve">    2.2  Data sources</w:t>
+        <w:t xml:space="preserve">    2.2  Study design and data sources</w:t>
         <w:tab/>
         <w:t>5</w:t>
       </w:r>
@@ -2540,7 +2540,141 @@
           <w:color w:val="000000"/>
           <w:sz w:val="32"/>
         </w:rPr>
-        <w:t>Data sources</w:t>
+        <w:t>Study design and data sources</w:t>
+      </w:r>
+    </w:p>
+    <w:p>
+      <w:pPr>
+        <w:spacing w:after="160" w:line="336" w:lineRule="auto"/>
+        <w:jc w:val="both"/>
+      </w:pPr>
+      <w:r>
+        <w:rPr>
+          <w:rFonts w:ascii="Times New Roman" w:hAnsi="Times New Roman" w:cs="Times New Roman" w:eastAsia="Times New Roman"/>
+          <w:sz w:val="22"/>
+        </w:rPr>
+        <w:t>This is a cross-sectional study conducted in the Chengalpattu and Chennai regions to evaluate the work conditions and posture among the quick delivery services which are Blinkit and Zepto. The data was collected in March and April of 2026. A convenience sampling method was used to approach delivery partners and collect the data.</w:t>
+      </w:r>
+    </w:p>
+    <w:p>
+      <w:pPr>
+        <w:spacing w:after="160" w:line="336" w:lineRule="auto"/>
+        <w:jc w:val="both"/>
+      </w:pPr>
+      <w:r>
+        <w:rPr>
+          <w:rFonts w:ascii="Times New Roman" w:hAnsi="Times New Roman" w:cs="Times New Roman" w:eastAsia="Times New Roman"/>
+          <w:sz w:val="22"/>
+        </w:rPr>
+        <w:t>The same 182 participants supplied both data streams described below. Rider self-report was captured through a Google Form questionnaire; posture was recorded on the same rider during a delivery task by a trained observer. Study eligibility was applied at the person level before either instrument was administered.</w:t>
+      </w:r>
+    </w:p>
+    <w:p>
+      <w:pPr>
+        <w:spacing w:before="120" w:after="80"/>
+      </w:pPr>
+      <w:r>
+        <w:rPr>
+          <w:rFonts w:ascii="Times New Roman" w:hAnsi="Times New Roman" w:cs="Times New Roman" w:eastAsia="Times New Roman"/>
+          <w:b/>
+          <w:i w:val="0"/>
+          <w:color w:val="000000"/>
+          <w:sz w:val="24"/>
+        </w:rPr>
+        <w:t>Inclusion criteria</w:t>
+      </w:r>
+    </w:p>
+    <w:p>
+      <w:pPr>
+        <w:pStyle w:val="ListBullet"/>
+        <w:spacing w:after="60"/>
+      </w:pPr>
+      <w:r>
+        <w:rPr>
+          <w:rFonts w:ascii="Times New Roman" w:hAnsi="Times New Roman" w:cs="Times New Roman" w:eastAsia="Times New Roman"/>
+          <w:sz w:val="22"/>
+        </w:rPr>
+        <w:t>Full-time delivery partners working on either the Blinkit or the Zepto platform.</w:t>
+      </w:r>
+    </w:p>
+    <w:p>
+      <w:pPr>
+        <w:pStyle w:val="ListBullet"/>
+        <w:spacing w:after="60"/>
+      </w:pPr>
+      <w:r>
+        <w:rPr>
+          <w:rFonts w:ascii="Times New Roman" w:hAnsi="Times New Roman" w:cs="Times New Roman" w:eastAsia="Times New Roman"/>
+          <w:sz w:val="22"/>
+        </w:rPr>
+        <w:t>Minimum three months of continuous delivery experience.</w:t>
+      </w:r>
+    </w:p>
+    <w:p>
+      <w:pPr>
+        <w:pStyle w:val="ListBullet"/>
+        <w:spacing w:after="60"/>
+      </w:pPr>
+      <w:r>
+        <w:rPr>
+          <w:rFonts w:ascii="Times New Roman" w:hAnsi="Times New Roman" w:cs="Times New Roman" w:eastAsia="Times New Roman"/>
+          <w:sz w:val="22"/>
+        </w:rPr>
+        <w:t>Using a two-wheeler (scooter or motorbike) for delivery.</w:t>
+      </w:r>
+    </w:p>
+    <w:p>
+      <w:pPr>
+        <w:pStyle w:val="ListBullet"/>
+        <w:spacing w:after="60"/>
+      </w:pPr>
+      <w:r>
+        <w:rPr>
+          <w:rFonts w:ascii="Times New Roman" w:hAnsi="Times New Roman" w:cs="Times New Roman" w:eastAsia="Times New Roman"/>
+          <w:sz w:val="22"/>
+        </w:rPr>
+        <w:t>Both men and women, aged between 18 and 55 years.</w:t>
+      </w:r>
+    </w:p>
+    <w:p>
+      <w:pPr>
+        <w:spacing w:before="120" w:after="80"/>
+      </w:pPr>
+      <w:r>
+        <w:rPr>
+          <w:rFonts w:ascii="Times New Roman" w:hAnsi="Times New Roman" w:cs="Times New Roman" w:eastAsia="Times New Roman"/>
+          <w:b/>
+          <w:i w:val="0"/>
+          <w:color w:val="000000"/>
+          <w:sz w:val="24"/>
+        </w:rPr>
+        <w:t>Exclusion criteria</w:t>
+      </w:r>
+    </w:p>
+    <w:p>
+      <w:pPr>
+        <w:pStyle w:val="ListBullet"/>
+        <w:spacing w:after="60"/>
+      </w:pPr>
+      <w:r>
+        <w:rPr>
+          <w:rFonts w:ascii="Times New Roman" w:hAnsi="Times New Roman" w:cs="Times New Roman" w:eastAsia="Times New Roman"/>
+          <w:sz w:val="22"/>
+        </w:rPr>
+        <w:t>Chronic musculoskeletal disorders that developed before the start of delivery work.</w:t>
+      </w:r>
+    </w:p>
+    <w:p>
+      <w:pPr>
+        <w:pStyle w:val="ListBullet"/>
+        <w:spacing w:after="60"/>
+      </w:pPr>
+      <w:r>
+        <w:rPr>
+          <w:rFonts w:ascii="Times New Roman" w:hAnsi="Times New Roman" w:cs="Times New Roman" w:eastAsia="Times New Roman"/>
+          <w:sz w:val="22"/>
+        </w:rPr>
+        <w:t>Accidental surgery within the past three months.</w:t>
       </w:r>
     </w:p>
     <w:p>

</xml_diff>

<commit_message>
report.docx: rewrite Acknowledgements in a plainer student voice
Previous copy read as generic, third-person, and slightly polished
('sincerest gratitude...continuous guidance, constructive feedback,
technical direction...expertise in ergonomics...').  New copy follows
the reference acknowledgements the user shared: first-person, four
short paragraphs, plain phrasing.

Structure:
  1. Mentor by name -- guidance across design, modelling, and the
     web application.
  2. Host school (SIDI, IIITDM Kancheepuram) + home institution
     (Vidya Jyothi Institute of Technology).
  3. The 182 quick-commerce delivery riders in the Chengalpattu and
     Chennai regions who supplied the survey and the observations.
  4. Family and friends who kept the author motivated through the
     internship.
</commit_message>
<xml_diff>
--- a/docs/report.docx
+++ b/docs/report.docx
@@ -443,7 +443,7 @@
           <w:rFonts w:ascii="Times New Roman" w:hAnsi="Times New Roman" w:cs="Times New Roman" w:eastAsia="Times New Roman"/>
           <w:sz w:val="22"/>
         </w:rPr>
-        <w:t>I would extend my sincerest gratitude to the Indian Institute of Information Technology, Design and Manufacturing, Kancheepuram and to the IIITDM-SIES programme for the opportunity to carry out this internship. I am deeply grateful to my mentor, Dr. Arunachalam Muthiah, for the continuous guidance, constructive feedback, and technical direction throughout the project. Their expertise in ergonomics and their willingness to engage with the methodological choices at every stage shaped the final outcome in important ways.</w:t>
+        <w:t>I would like to express my gratitude to my mentor, Dr. Arunachalam Muthiah, who guided me throughout this project. I show deep appreciation for his support, patience, and technical direction, from the study design through the modelling and the final web application.</w:t>
       </w:r>
     </w:p>
     <w:p>
@@ -456,7 +456,33 @@
           <w:rFonts w:ascii="Times New Roman" w:hAnsi="Times New Roman" w:cs="Times New Roman" w:eastAsia="Times New Roman"/>
           <w:sz w:val="22"/>
         </w:rPr>
-        <w:t>I acknowledge the 182 quick-commerce delivery riders who participated in the survey and the observation study; without their time and honesty this work would not have been possible. I also thank the School of Interdisciplinary Design and Innovation (SIDI) for providing the computing infrastructure used for the modelling experiments and my peers who reviewed intermediate results and offered helpful suggestions.</w:t>
+        <w:t>I would also like to extend my gratitude to the School of Interdisciplinary Design and Innovation (SIDI), IIITDM Kancheepuram, for hosting the internship and providing the resources that made this work possible. I would like to thank Vidya Jyothi Institute of Technology, my home institution, for the academic foundation that let me take on this project.</w:t>
+      </w:r>
+    </w:p>
+    <w:p>
+      <w:pPr>
+        <w:spacing w:after="160" w:line="336" w:lineRule="auto"/>
+        <w:jc w:val="both"/>
+      </w:pPr>
+      <w:r>
+        <w:rPr>
+          <w:rFonts w:ascii="Times New Roman" w:hAnsi="Times New Roman" w:cs="Times New Roman" w:eastAsia="Times New Roman"/>
+          <w:sz w:val="22"/>
+        </w:rPr>
+        <w:t>I acknowledge the 182 quick-commerce delivery riders in the Chengalpattu and Chennai regions who participated in the survey and the observation study. Without their time and honesty this work would not have been possible.</w:t>
+      </w:r>
+    </w:p>
+    <w:p>
+      <w:pPr>
+        <w:spacing w:after="160" w:line="336" w:lineRule="auto"/>
+        <w:jc w:val="both"/>
+      </w:pPr>
+      <w:r>
+        <w:rPr>
+          <w:rFonts w:ascii="Times New Roman" w:hAnsi="Times New Roman" w:cs="Times New Roman" w:eastAsia="Times New Roman"/>
+          <w:sz w:val="22"/>
+        </w:rPr>
+        <w:t>Finally, I would like to thank my friends and family for keeping me motivated throughout the internship.</w:t>
       </w:r>
     </w:p>
     <w:p>

</xml_diff>

<commit_message>
report.docx: strip author name and department line from header / footer
Running header is now just the STYLEREF chapter name (uppercase),
left-aligned with the same thin bottom border underline.

Running footer is now just the PAGE field, right-aligned with the
same thin top border above it.

The 'AILA VISHNU VARDHAN' and department-and-institution strings the
previous change added at the top-right and bottom-left are removed
per feedback.
</commit_message>
<xml_diff>
--- a/docs/report.docx
+++ b/docs/report.docx
@@ -11107,23 +11107,11 @@
   <w:p>
     <w:pPr>
       <w:pStyle w:val="Footer"/>
-      <w:tabs>
-        <w:tab w:pos="8787" w:val="right"/>
-      </w:tabs>
+      <w:jc w:val="right"/>
       <w:pBdr>
         <w:top w:val="single" w:sz="6" w:space="1" w:color="000000"/>
       </w:pBdr>
     </w:pPr>
-    <w:r>
-      <w:rPr>
-        <w:rFonts w:ascii="Times New Roman" w:hAnsi="Times New Roman" w:cs="Times New Roman" w:eastAsia="Times New Roman"/>
-        <w:sz w:val="20"/>
-      </w:rPr>
-      <w:t>School of Interdisciplinary Design and Innovation (SIDI), IIITDM Kancheepuram, July 2026</w:t>
-    </w:r>
-    <w:r>
-      <w:tab/>
-    </w:r>
     <w:r>
       <w:rPr>
         <w:rFonts w:ascii="Times New Roman" w:hAnsi="Times New Roman" w:cs="Times New Roman" w:eastAsia="Times New Roman"/>
@@ -11145,9 +11133,6 @@
   <w:p>
     <w:pPr>
       <w:pStyle w:val="Header"/>
-      <w:tabs>
-        <w:tab w:pos="8787" w:val="right"/>
-      </w:tabs>
       <w:pBdr>
         <w:bottom w:val="single" w:sz="6" w:space="1" w:color="000000"/>
       </w:pBdr>
@@ -11163,17 +11148,6 @@
       <w:fldChar w:fldCharType="separate"/>
       <w:t>CHAPTER</w:t>
       <w:fldChar w:fldCharType="end"/>
-    </w:r>
-    <w:r>
-      <w:tab/>
-    </w:r>
-    <w:r>
-      <w:rPr>
-        <w:rFonts w:ascii="Times New Roman" w:hAnsi="Times New Roman" w:cs="Times New Roman" w:eastAsia="Times New Roman"/>
-        <w:b/>
-        <w:sz w:val="20"/>
-      </w:rPr>
-      <w:t>AILA VISHNU VARDHAN</w:t>
     </w:r>
   </w:p>
 </w:hdr>

</xml_diff>

<commit_message>
report.docx: lowercase Roman page numbers on the front matter
Configured section 0 (front matter) with:
  - Page number format lowerRoman restarting at i
  - different_first_page_header_footer = True, so the title page
    itself is unnumbered
  - Regular footer shows a right-aligned PAGE field from page 2

Result:
  Title page          -> no number
  Certificate         -> i
  Abstract            -> ii
  Acknowledgements    -> iii
  Contents            -> iv
  List of Figures     -> v
  List of Tables      -> vi
  Abbreviations       -> vii
  Symbols             -> viii
  Chapter 1 onwards   -> 1, 2, 3 ... (decimal, restart, from earlier
                                      commit)
</commit_message>
<xml_diff>
--- a/docs/report.docx
+++ b/docs/report.docx
@@ -103,7 +103,7 @@
                     <pic:cNvPicPr/>
                   </pic:nvPicPr>
                   <pic:blipFill>
-                    <a:blip r:embed="rId9"/>
+                    <a:blip r:embed="rId10"/>
                     <a:stretch>
                       <a:fillRect/>
                     </a:stretch>
@@ -2169,10 +2169,13 @@
     <w:p>
       <w:pPr>
         <w:sectPr>
+          <w:footerReference w:type="default" r:id="rId9"/>
           <w:pgSz w:w="12240" w:h="15840"/>
           <w:pgMar w:top="1417" w:right="1417" w:bottom="1417" w:left="1417" w:header="720" w:footer="720" w:gutter="0"/>
           <w:cols w:space="720"/>
+          <w:titlePg/>
           <w:docGrid w:linePitch="360"/>
+          <w:pgNumType w:fmt="lowerRoman" w:start="1"/>
         </w:sectPr>
       </w:pPr>
     </w:p>
@@ -2488,7 +2491,7 @@
                     <pic:cNvPicPr/>
                   </pic:nvPicPr>
                   <pic:blipFill>
-                    <a:blip r:embed="rId12"/>
+                    <a:blip r:embed="rId13"/>
                     <a:stretch>
                       <a:fillRect/>
                     </a:stretch>
@@ -4146,7 +4149,7 @@
                     <pic:cNvPicPr/>
                   </pic:nvPicPr>
                   <pic:blipFill>
-                    <a:blip r:embed="rId13"/>
+                    <a:blip r:embed="rId14"/>
                     <a:stretch>
                       <a:fillRect/>
                     </a:stretch>
@@ -4595,7 +4598,7 @@
                     <pic:cNvPicPr/>
                   </pic:nvPicPr>
                   <pic:blipFill>
-                    <a:blip r:embed="rId14"/>
+                    <a:blip r:embed="rId15"/>
                     <a:stretch>
                       <a:fillRect/>
                     </a:stretch>
@@ -4649,7 +4652,7 @@
                     <pic:cNvPicPr/>
                   </pic:nvPicPr>
                   <pic:blipFill>
-                    <a:blip r:embed="rId15"/>
+                    <a:blip r:embed="rId16"/>
                     <a:stretch>
                       <a:fillRect/>
                     </a:stretch>
@@ -6260,7 +6263,7 @@
                     <pic:cNvPicPr/>
                   </pic:nvPicPr>
                   <pic:blipFill>
-                    <a:blip r:embed="rId16"/>
+                    <a:blip r:embed="rId17"/>
                     <a:stretch>
                       <a:fillRect/>
                     </a:stretch>
@@ -6314,7 +6317,7 @@
                     <pic:cNvPicPr/>
                   </pic:nvPicPr>
                   <pic:blipFill>
-                    <a:blip r:embed="rId17"/>
+                    <a:blip r:embed="rId18"/>
                     <a:stretch>
                       <a:fillRect/>
                     </a:stretch>
@@ -6368,7 +6371,7 @@
                     <pic:cNvPicPr/>
                   </pic:nvPicPr>
                   <pic:blipFill>
-                    <a:blip r:embed="rId18"/>
+                    <a:blip r:embed="rId19"/>
                     <a:stretch>
                       <a:fillRect/>
                     </a:stretch>
@@ -7655,7 +7658,7 @@
                     <pic:cNvPicPr/>
                   </pic:nvPicPr>
                   <pic:blipFill>
-                    <a:blip r:embed="rId19"/>
+                    <a:blip r:embed="rId20"/>
                     <a:stretch>
                       <a:fillRect/>
                     </a:stretch>
@@ -7709,7 +7712,7 @@
                     <pic:cNvPicPr/>
                   </pic:nvPicPr>
                   <pic:blipFill>
-                    <a:blip r:embed="rId20"/>
+                    <a:blip r:embed="rId21"/>
                     <a:stretch>
                       <a:fillRect/>
                     </a:stretch>
@@ -9481,7 +9484,7 @@
                     <pic:cNvPicPr/>
                   </pic:nvPicPr>
                   <pic:blipFill>
-                    <a:blip r:embed="rId21"/>
+                    <a:blip r:embed="rId22"/>
                     <a:stretch>
                       <a:fillRect/>
                     </a:stretch>
@@ -11090,8 +11093,8 @@
       </w:r>
     </w:p>
     <w:sectPr>
-      <w:headerReference w:type="default" r:id="rId10"/>
-      <w:footerReference w:type="default" r:id="rId11"/>
+      <w:headerReference w:type="default" r:id="rId11"/>
+      <w:footerReference w:type="default" r:id="rId12"/>
       <w:pgSz w:w="12240" w:h="15840"/>
       <w:pgMar w:top="1417" w:right="1417" w:bottom="1417" w:left="1701" w:header="680" w:footer="680" w:gutter="0"/>
       <w:cols w:space="720"/>
@@ -11103,6 +11106,28 @@
 </file>
 
 <file path=word/footer1.xml><?xml version="1.0" encoding="utf-8"?>
+<w:ftr xmlns:m="http://schemas.openxmlformats.org/officeDocument/2006/math" xmlns:mc="http://schemas.openxmlformats.org/markup-compatibility/2006" xmlns:mo="http://schemas.microsoft.com/office/mac/office/2008/main" xmlns:mv="urn:schemas-microsoft-com:mac:vml" xmlns:o="urn:schemas-microsoft-com:office:office" xmlns:r="http://schemas.openxmlformats.org/officeDocument/2006/relationships" xmlns:v="urn:schemas-microsoft-com:vml" xmlns:w10="urn:schemas-microsoft-com:office:word" xmlns:w14="http://schemas.microsoft.com/office/word/2010/wordml" xmlns:w="http://schemas.openxmlformats.org/wordprocessingml/2006/main" xmlns:wne="http://schemas.microsoft.com/office/word/2006/wordml" xmlns:wp14="http://schemas.microsoft.com/office/word/2010/wordprocessingDrawing" xmlns:wp="http://schemas.openxmlformats.org/drawingml/2006/wordprocessingDrawing" xmlns:wpc="http://schemas.microsoft.com/office/word/2010/wordprocessingCanvas" xmlns:wpg="http://schemas.microsoft.com/office/word/2010/wordprocessingGroup" xmlns:wpi="http://schemas.microsoft.com/office/word/2010/wordprocessingInk" xmlns:wps="http://schemas.microsoft.com/office/word/2010/wordprocessingShape" mc:Ignorable="w14 wp14">
+  <w:p>
+    <w:pPr>
+      <w:pStyle w:val="Footer"/>
+      <w:jc w:val="right"/>
+    </w:pPr>
+    <w:r>
+      <w:rPr>
+        <w:rFonts w:ascii="Times New Roman" w:hAnsi="Times New Roman" w:cs="Times New Roman" w:eastAsia="Times New Roman"/>
+        <w:sz w:val="20"/>
+      </w:rPr>
+      <w:fldChar w:fldCharType="begin"/>
+      <w:instrText>PAGE</w:instrText>
+      <w:fldChar w:fldCharType="separate"/>
+      <w:t>1</w:t>
+      <w:fldChar w:fldCharType="end"/>
+    </w:r>
+  </w:p>
+</w:ftr>
+</file>
+
+<file path=word/footer2.xml><?xml version="1.0" encoding="utf-8"?>
 <w:ftr xmlns:m="http://schemas.openxmlformats.org/officeDocument/2006/math" xmlns:mc="http://schemas.openxmlformats.org/markup-compatibility/2006" xmlns:mo="http://schemas.microsoft.com/office/mac/office/2008/main" xmlns:mv="urn:schemas-microsoft-com:mac:vml" xmlns:o="urn:schemas-microsoft-com:office:office" xmlns:r="http://schemas.openxmlformats.org/officeDocument/2006/relationships" xmlns:v="urn:schemas-microsoft-com:vml" xmlns:w10="urn:schemas-microsoft-com:office:word" xmlns:w14="http://schemas.microsoft.com/office/word/2010/wordml" xmlns:w="http://schemas.openxmlformats.org/wordprocessingml/2006/main" xmlns:wne="http://schemas.microsoft.com/office/word/2006/wordml" xmlns:wp14="http://schemas.microsoft.com/office/word/2010/wordprocessingDrawing" xmlns:wp="http://schemas.openxmlformats.org/drawingml/2006/wordprocessingDrawing" xmlns:wpc="http://schemas.microsoft.com/office/word/2010/wordprocessingCanvas" xmlns:wpg="http://schemas.microsoft.com/office/word/2010/wordprocessingGroup" xmlns:wpi="http://schemas.microsoft.com/office/word/2010/wordprocessingInk" xmlns:wps="http://schemas.microsoft.com/office/word/2010/wordprocessingShape" mc:Ignorable="w14 wp14">
   <w:p>
     <w:pPr>

</xml_diff>

<commit_message>
report.docx: add missing 'Contents' row to the TOC itself
The TOC used to list Certificate (i), Abstract (ii), Acknowledgements
(iii), then jumped to List of Figures (v), silently dropping the
Contents page itself and leaving Roman iv unaccounted for.  Added
'Contents .... iv' back in front-matter order.
</commit_message>
<xml_diff>
--- a/docs/report.docx
+++ b/docs/report.docx
@@ -556,6 +556,23 @@
         <w:t>Acknowledgements</w:t>
         <w:tab/>
         <w:t>iii</w:t>
+      </w:r>
+    </w:p>
+    <w:p>
+      <w:pPr>
+        <w:tabs>
+          <w:tab w:pos="9071" w:val="right" w:leader="dot"/>
+        </w:tabs>
+        <w:spacing w:after="80"/>
+      </w:pPr>
+      <w:r>
+        <w:rPr>
+          <w:rFonts w:ascii="Times New Roman" w:hAnsi="Times New Roman" w:cs="Times New Roman" w:eastAsia="Times New Roman"/>
+          <w:sz w:val="22"/>
+        </w:rPr>
+        <w:t>Contents</w:t>
+        <w:tab/>
+        <w:t>iv</w:t>
       </w:r>
     </w:p>
     <w:p>

</xml_diff>

<commit_message>
report.docx: shorten Figure 4.1 caption so the LoF row fits one line
The Figure 4.1 caption 'Sample profile across gender, age band, delivery
platform, vehicle type, and carrying mode.' was long enough to wrap in
the List of Figures.  When it wrapped, the page-number tab landed on
line 2 without a dot leader, so the reader saw 'mode.  18' dangling.

Shortened to 'Sample profile: age, platform, vehicle, and carrying mode.'
in both the LoF entry and the figure's own caption in Chapter 4 so the
two stay identical.  Now fits on one LoF row and the dot leader runs
continuously to the page number.
</commit_message>
<xml_diff>
--- a/docs/report.docx
+++ b/docs/report.docx
@@ -1369,7 +1369,7 @@
         </w:rPr>
         <w:t>Figure 4.1</w:t>
         <w:tab/>
-        <w:t>Sample profile across gender, age band, delivery platform, vehicle type, and carrying mode.</w:t>
+        <w:t>Sample profile: age, platform, vehicle, and carrying mode.</w:t>
         <w:tab/>
         <w:t>18</w:t>
       </w:r>
@@ -4604,7 +4604,7 @@
           <w:i/>
           <w:sz w:val="20"/>
         </w:rPr>
-        <w:t>Figure 4.1: Sample profile across gender, age band, delivery platform, vehicle type, and carrying mode.</w:t>
+        <w:t>Figure 4.1: Sample profile: age, platform, vehicle, and carrying mode.</w:t>
       </w:r>
     </w:p>
     <w:p>

</xml_diff>

<commit_message>
report.docx: shorten Table 4.2 caption so the LoT row fits one line
Same fix pattern as Figure 4.1.  The Table 4.2 caption 'Chi-square
test of independence between each risk factor and self-reported
discomfort.' was long enough to wrap in the List of Tables, dumping
the page number on line 2 with no dot leader.

Shortened to 'Chi-square test: risk factor vs self-reported
discomfort.' in both the LoT entry and the table's own caption in
Chapter 4 so they stay identical.  Now fits on one LoT row and the
dot leader runs continuously to the page number.
</commit_message>
<xml_diff>
--- a/docs/report.docx
+++ b/docs/report.docx
@@ -1711,7 +1711,7 @@
         </w:rPr>
         <w:t>Table 4.2</w:t>
         <w:tab/>
-        <w:t>Chi-square test of independence between each risk factor and self-reported discomfort.</w:t>
+        <w:t>Chi-square test: risk factor vs self-reported discomfort.</w:t>
         <w:tab/>
         <w:t>20</w:t>
       </w:r>
@@ -5597,7 +5597,7 @@
           <w:color w:val="000000"/>
           <w:sz w:val="20"/>
         </w:rPr>
-        <w:t>Table 4.2: Chi-square test of independence between each risk factor and self-reported discomfort.</w:t>
+        <w:t>Table 4.2: Chi-square test: risk factor vs self-reported discomfort.</w:t>
       </w:r>
     </w:p>
     <w:p>

</xml_diff>

<commit_message>
report.docx: shift LoF / LoT page anchors to match the current TOC
When Chapter 3 was expanded to 7 sections earlier, the TOC estimates
for Chapter 4 sections shifted forward by roughly five pages
(4.1 Sample profile: 20 -> 25, 4.6 Web app: 32 -> 37, and so on),
but the List of Figures and List of Tables entries were still
pointing at the pre-expansion page numbers.

Realigned every Chapter 4 figure / table anchor to the section it
lives in:
  Figures 4.1..4.9  moved 7 pages forward
  Figures 4.10..4.14 moved 3 pages forward (they had already been
                     partially updated in an earlier commit)
  Tables 4.1..4.9  moved 7-8 pages forward
  Table 2.1 moved from 12 to 13 (the 2.6 subsections added earlier
            pushed the exclusion table onto page 13)
</commit_message>
<xml_diff>
--- a/docs/report.docx
+++ b/docs/report.docx
@@ -1422,7 +1422,7 @@
         <w:tab/>
         <w:t>Sample profile: age, platform, vehicle, and carrying mode.</w:t>
         <w:tab/>
-        <w:t>18</w:t>
+        <w:t>25</w:t>
       </w:r>
     </w:p>
     <w:p>
@@ -1442,7 +1442,7 @@
         <w:tab/>
         <w:t>NMQ 12-month pain prevalence per body area.</w:t>
         <w:tab/>
-        <w:t>19</w:t>
+        <w:t>27</w:t>
       </w:r>
     </w:p>
     <w:p>
@@ -1462,7 +1462,7 @@
         <w:tab/>
         <w:t>Discomfort prevalence broken down by demographic group.</w:t>
         <w:tab/>
-        <w:t>20</w:t>
+        <w:t>28</w:t>
       </w:r>
     </w:p>
     <w:p>
@@ -1482,7 +1482,7 @@
         <w:tab/>
         <w:t>Stage-1 Low / Medium / High counts per risk factor.</w:t>
         <w:tab/>
-        <w:t>22</w:t>
+        <w:t>30</w:t>
       </w:r>
     </w:p>
     <w:p>
@@ -1502,7 +1502,7 @@
         <w:tab/>
         <w:t>Discomfort prevalence within each Low / Medium / High band.</w:t>
         <w:tab/>
-        <w:t>23</w:t>
+        <w:t>31</w:t>
       </w:r>
     </w:p>
     <w:p>
@@ -1522,7 +1522,7 @@
         <w:tab/>
         <w:t>Pearson correlation matrix across the numeric feature pool.</w:t>
         <w:tab/>
-        <w:t>24</w:t>
+        <w:t>32</w:t>
       </w:r>
     </w:p>
     <w:p>
@@ -1542,7 +1542,7 @@
         <w:tab/>
         <w:t>Confusion matrices for the best model per factor.</w:t>
         <w:tab/>
-        <w:t>26</w:t>
+        <w:t>33</w:t>
       </w:r>
     </w:p>
     <w:p>
@@ -1562,7 +1562,7 @@
         <w:tab/>
         <w:t>ROC curves (one-vs-rest) for the best model per factor.</w:t>
         <w:tab/>
-        <w:t>27</w:t>
+        <w:t>34</w:t>
       </w:r>
     </w:p>
     <w:p>
@@ -1582,7 +1582,7 @@
         <w:tab/>
         <w:t>Top 10 features by importance for the best model per factor.</w:t>
         <w:tab/>
-        <w:t>28</w:t>
+        <w:t>35</w:t>
       </w:r>
     </w:p>
     <w:p>
@@ -1602,7 +1602,7 @@
         <w:tab/>
         <w:t>Web app: sample-profile shortcuts and demographic section.</w:t>
         <w:tab/>
-        <w:t>34</w:t>
+        <w:t>37</w:t>
       </w:r>
     </w:p>
     <w:p>
@@ -1622,7 +1622,7 @@
         <w:tab/>
         <w:t>Web app: Nordic Musculoskeletal Questionnaire section.</w:t>
         <w:tab/>
-        <w:t>35</w:t>
+        <w:t>38</w:t>
       </w:r>
     </w:p>
     <w:p>
@@ -1642,7 +1642,7 @@
         <w:tab/>
         <w:t>Web app: NASA-TLX and Borg CR10 sliders.</w:t>
         <w:tab/>
-        <w:t>36</w:t>
+        <w:t>39</w:t>
       </w:r>
     </w:p>
     <w:p>
@@ -1662,7 +1662,7 @@
         <w:tab/>
         <w:t>Web app: RULA and QEC observation sections.</w:t>
         <w:tab/>
-        <w:t>37</w:t>
+        <w:t>40</w:t>
       </w:r>
     </w:p>
     <w:p>
@@ -1682,7 +1682,7 @@
         <w:tab/>
         <w:t>Web app: predicted risk profile output.</w:t>
         <w:tab/>
-        <w:t>38</w:t>
+        <w:t>40</w:t>
       </w:r>
     </w:p>
     <w:p>
@@ -1724,7 +1724,7 @@
         <w:tab/>
         <w:t>Per-target feature exclusions to prevent label leakage.</w:t>
         <w:tab/>
-        <w:t>12</w:t>
+        <w:t>13</w:t>
       </w:r>
     </w:p>
     <w:p>
@@ -1744,7 +1744,7 @@
         <w:tab/>
         <w:t>NMQ 12-month pain prevalence per body area.</w:t>
         <w:tab/>
-        <w:t>19</w:t>
+        <w:t>27</w:t>
       </w:r>
     </w:p>
     <w:p>
@@ -1764,7 +1764,7 @@
         <w:tab/>
         <w:t>Chi-square test: risk factor vs self-reported discomfort.</w:t>
         <w:tab/>
-        <w:t>20</w:t>
+        <w:t>28</w:t>
       </w:r>
     </w:p>
     <w:p>
@@ -1784,7 +1784,7 @@
         <w:tab/>
         <w:t>Significant predictors of discomfort from multivariable logistic regression.</w:t>
         <w:tab/>
-        <w:t>21</w:t>
+        <w:t>29</w:t>
       </w:r>
     </w:p>
     <w:p>
@@ -1804,7 +1804,7 @@
         <w:tab/>
         <w:t>Stage-1 risk band counts per factor.</w:t>
         <w:tab/>
-        <w:t>22</w:t>
+        <w:t>30</w:t>
       </w:r>
     </w:p>
     <w:p>
@@ -1824,7 +1824,7 @@
         <w:tab/>
         <w:t>Best Stage-2 model per risk factor: 5-fold stratified CV.</w:t>
         <w:tab/>
-        <w:t>25</w:t>
+        <w:t>33</w:t>
       </w:r>
     </w:p>
     <w:p>
@@ -1844,7 +1844,7 @@
         <w:tab/>
         <w:t>Per-class ROC AUC (one-vs-rest) for the best model per factor.</w:t>
         <w:tab/>
-        <w:t>26</w:t>
+        <w:t>34</w:t>
       </w:r>
     </w:p>
     <w:p>
@@ -1864,7 +1864,7 @@
         <w:tab/>
         <w:t>Per-class precision, recall, F1, and support.</w:t>
         <w:tab/>
-        <w:t>27</w:t>
+        <w:t>34</w:t>
       </w:r>
     </w:p>
     <w:p>
@@ -1884,7 +1884,7 @@
         <w:tab/>
         <w:t>Top 5 most important features per factor.</w:t>
         <w:tab/>
-        <w:t>28</w:t>
+        <w:t>35</w:t>
       </w:r>
     </w:p>
     <w:p>
@@ -1904,7 +1904,7 @@
         <w:tab/>
         <w:t>Winning hyperparameters per target after GridSearchCV.</w:t>
         <w:tab/>
-        <w:t>28</w:t>
+        <w:t>35</w:t>
       </w:r>
     </w:p>
     <w:p>

</xml_diff>

<commit_message>
report.docx: drop redundant page break at start of Certificate
start_front_matter_section already inserts a section break with type
nextPage, which forces Certificate onto a fresh page (Roman i).  The
extra doc.add_page_break() at the top of add_certificate then pushed
Certificate off that page onto the following one, leaving an empty
page between the title and Certificate.

Removed that internal page break.  Certificate now lands directly on
the first page of section 1 (Roman i) with no gap.  Explicit page
break count in the doc dropped from 13 to 12.
</commit_message>
<xml_diff>
--- a/docs/report.docx
+++ b/docs/report.docx
@@ -195,11 +195,6 @@
           <w:docGrid w:linePitch="360"/>
         </w:sectPr>
       </w:pPr>
-    </w:p>
-    <w:p>
-      <w:r>
-        <w:br w:type="page"/>
-      </w:r>
     </w:p>
     <w:p>
       <w:pPr>

</xml_diff>

<commit_message>
report.docx: tighten Chapter 5 conclusions to fit on one page
Chapter 5 was running ~2 pages across 5 body paragraphs (roughly
545 words).  Kept the same 4-paragraph structure but tightened the
prose in each so the whole chapter fits on one page:

  Para 1  merged the old summary paragraph (pipeline recap +
          accuracy numbers) and the statistical-findings paragraph
          into one denser paragraph.
  Para 2  limitations + two documented corrections combined and
          trimmed from 3 sentences to 2.
  Para 3  the five interventions rewritten as an inline
          semicolon-separated list instead of numbered sentences.
  Para 4  future extensions kept but tightened phrasing.

Word count dropped from ~545 to ~350; content coverage is unchanged
(pipeline summary, accuracy numbers, chi-square + logistic-regression
findings, limitations, two corrections, five interventions, four
future extensions all still there).
</commit_message>
<xml_diff>
--- a/docs/report.docx
+++ b/docs/report.docx
@@ -11486,7 +11486,7 @@
           <w:rFonts w:ascii="Times New Roman" w:hAnsi="Times New Roman" w:cs="Times New Roman" w:eastAsia="Times New Roman"/>
           <w:sz w:val="22"/>
         </w:rPr>
-        <w:t>This project designed, implemented, and deployed a per-rider ergonomic risk screening pipeline for last-mile quick-commerce delivery workers. The pipeline turns a 36-item self-report questionnaire and a 26-column RULA-plus-QEC observation record into six standardised risk levels spanning the classical ergonomic dimensions of Force, Repetition, Posture, Duration, Contact Stress, and Vibration. The five survey-derived factors land at 58 to 62 percent accuracy with macro AUC between 71 and 76 percent; the Posture model, which uses the observation inputs directly, reaches 97 percent accuracy and 98 percent macro AUC. The final artefact is a Streamlit web application that produces the six risk levels along with per-factor recommendations from a single form submission.</w:t>
+        <w:t>This project designed, implemented, and deployed a per-rider ergonomic risk screening pipeline for last-mile quick-commerce delivery workers, turning a 36-item self-report questionnaire and a RULA + QEC observation record into six standardised risk levels across Force, Repetition, Posture, Duration, Contact Stress, and Vibration. The five survey-derived factors land at 58-62 percent cross-validation accuracy with macro AUC between 71 and 76 percent; the Posture model, which receives the RULA and QEC observation inputs directly, reaches 97 percent accuracy and 98 percent AUC. Chi-square identifies Posture, Repetition, and Force as the risk factors significantly associated with self-reported discomfort, and multivariable logistic regression flags age (OR 3.58 per band), job duration (OR 2.89), workload score, and fatigue score as the strongest individual predictors.</w:t>
       </w:r>
     </w:p>
     <w:p>
@@ -11499,7 +11499,7 @@
           <w:rFonts w:ascii="Times New Roman" w:hAnsi="Times New Roman" w:cs="Times New Roman" w:eastAsia="Times New Roman"/>
           <w:sz w:val="22"/>
         </w:rPr>
-        <w:t>Statistically the two factors most strongly associated with self-reported discomfort in this 182-rider sample are Posture and Force. Individually, age (OR 3.58 per band), job duration (OR 2.89 per band), workload score, and fatigue score are the strongest predictors of discomfort under multivariable logistic regression. These findings match the intuition that riders in higher age bands and longer careers accumulate MSD risk that is amplified by workload and fatigue.</w:t>
+        <w:t>The main limitations are the self-report nature of most input variables, the severity-rank merge used to pair the identifier-less posture xlsx with the survey, and the small sample (n = 182) that keeps ML variance visible. Two methodological corrections were made and openly documented: Repetition binning moved from qcut to fixed cuts to remove a boundary tie that hid the worst real schedule, and vibration_index was added to the Duration exclusion list to remove indirect leakage.</w:t>
       </w:r>
     </w:p>
     <w:p>
@@ -11512,7 +11512,7 @@
           <w:rFonts w:ascii="Times New Roman" w:hAnsi="Times New Roman" w:cs="Times New Roman" w:eastAsia="Times New Roman"/>
           <w:sz w:val="22"/>
         </w:rPr>
-        <w:t>The main limitations of this work are the self-report nature of most input variables, the approximate per-rider linkage in the posture observations (a severity-rank merge because the observation records do not carry rider identifiers), and the small sample size (n = 182) that keeps multivariable ML variance visible. Two methodological corrections were made and openly documented during the project: the Repetition binning was changed from qcut to fixed cuts to remove a boundary tie that hid the worst real schedule, and the Duration model's feature list was adjusted to remove indirect leakage through vibration_index. Both changes cost some raw accuracy but produced more meaningful models.</w:t>
+        <w:t>Five interventions for a delivery-platform operator follow directly from the results: (i) cap daily hours (49 percent of the sample exceeds 8 hours per day); (ii) invest in posture-focused equipment and training (84 percent of observed postures at RULA action level 5 or above); (iii) encourage bike-storage-box carrying over handheld bags; (iv) age-targeted MSD screening for the 36-and-above cohort; and (v) platform-level workload management to reduce the NASA-TLX component of the workload score, a significant discomfort predictor at p = 0.0005.</w:t>
       </w:r>
     </w:p>
     <w:p>
@@ -11525,20 +11525,7 @@
           <w:rFonts w:ascii="Times New Roman" w:hAnsi="Times New Roman" w:cs="Times New Roman" w:eastAsia="Times New Roman"/>
           <w:sz w:val="22"/>
         </w:rPr>
-        <w:t>Five interventions for a delivery-platform operator follow directly from the results, ordered by how many riders they would reach. First, cap daily hours (roughly half the sample exceeds 8 hours per day). Second, invest in posture-focused equipment and training (84 percent of observed postures are at RULA action level 5 or above). Third, encourage bike-storage-box carrying over handheld bags. Fourth, introduce age-targeted MSD screening for riders in the 36-and-above cohort. Fifth, tune workload management at the platform level to reduce the NASA-TLX component of the workload score, which is a significant discomfort predictor at p = 0.0005.</w:t>
-      </w:r>
-    </w:p>
-    <w:p>
-      <w:pPr>
-        <w:spacing w:after="160" w:line="336" w:lineRule="auto"/>
-        <w:jc w:val="both"/>
-      </w:pPr>
-      <w:r>
-        <w:rPr>
-          <w:rFonts w:ascii="Times New Roman" w:hAnsi="Times New Roman" w:cs="Times New Roman" w:eastAsia="Times New Roman"/>
-          <w:sz w:val="22"/>
-        </w:rPr>
-        <w:t>Future extensions of the work include a longitudinal follow-up study that would let a causal claim replace the current cross-sectional association; per-rider RULA and QEC observations to eliminate the severity-rank merge; the addition of wearable accelerometer data as a Vibration proxy replacement; and a periodic re-training schedule that lets the platform update its screening tool as the workforce changes. The two-stage design leaves room for each of these extensions without disturbing the audited Stage-1 labels.</w:t>
+        <w:t>Future extensions include a longitudinal follow-up so a causal claim can replace the cross-sectional association, per-rider RULA and QEC observations to eliminate the severity-rank merge, wearable accelerometer data as a Vibration proxy, and a periodic re-training schedule so the screening tool tracks a changing workforce. The two-stage design leaves room for each of these without disturbing the audited Stage-1 labels.</w:t>
       </w:r>
     </w:p>
     <w:p>

</xml_diff>

<commit_message>
report.docx: shrink web-app screenshots so 5 figures fit on 2 pages
Figures 4.10 through 4.14 (the five Streamlit web-app screenshots)
were at 11 cm wide, which let only two fit per page -- so five
figures spanned three pages.  Dropped their width to 9 cm.  At the
1.45 aspect ratio of the raw 1600x1100 PNGs this gives ~6.2 cm tall
images plus a 0.5 cm caption, so three now fit comfortably on one
page and the five span two pages instead of three.

Result figures in Chapter 4 (correlation, ROC, confusion, feature
importance, and the risk-band plots from Fig 4.2 through Fig 4.9)
stay at 11 cm because they are read for numeric detail and need the
extra size.
</commit_message>
<xml_diff>
--- a/docs/report.docx
+++ b/docs/report.docx
@@ -11198,7 +11198,7 @@
       <w:r>
         <w:drawing>
           <wp:inline xmlns:a="http://schemas.openxmlformats.org/drawingml/2006/main" xmlns:pic="http://schemas.openxmlformats.org/drawingml/2006/picture">
-            <wp:extent cx="3960000" cy="2722500"/>
+            <wp:extent cx="3240000" cy="2227500"/>
             <wp:docPr id="12" name="Picture 12"/>
             <wp:cNvGraphicFramePr>
               <a:graphicFrameLocks noChangeAspect="1"/>
@@ -11219,7 +11219,7 @@
                   <pic:spPr>
                     <a:xfrm>
                       <a:off x="0" y="0"/>
-                      <a:ext cx="3960000" cy="2722500"/>
+                      <a:ext cx="3240000" cy="2227500"/>
                     </a:xfrm>
                     <a:prstGeom prst="rect"/>
                   </pic:spPr>
@@ -11252,7 +11252,7 @@
       <w:r>
         <w:drawing>
           <wp:inline xmlns:a="http://schemas.openxmlformats.org/drawingml/2006/main" xmlns:pic="http://schemas.openxmlformats.org/drawingml/2006/picture">
-            <wp:extent cx="3960000" cy="2722500"/>
+            <wp:extent cx="3240000" cy="2227500"/>
             <wp:docPr id="13" name="Picture 13"/>
             <wp:cNvGraphicFramePr>
               <a:graphicFrameLocks noChangeAspect="1"/>
@@ -11273,7 +11273,7 @@
                   <pic:spPr>
                     <a:xfrm>
                       <a:off x="0" y="0"/>
-                      <a:ext cx="3960000" cy="2722500"/>
+                      <a:ext cx="3240000" cy="2227500"/>
                     </a:xfrm>
                     <a:prstGeom prst="rect"/>
                   </pic:spPr>
@@ -11306,7 +11306,7 @@
       <w:r>
         <w:drawing>
           <wp:inline xmlns:a="http://schemas.openxmlformats.org/drawingml/2006/main" xmlns:pic="http://schemas.openxmlformats.org/drawingml/2006/picture">
-            <wp:extent cx="3960000" cy="2722500"/>
+            <wp:extent cx="3240000" cy="2227500"/>
             <wp:docPr id="14" name="Picture 14"/>
             <wp:cNvGraphicFramePr>
               <a:graphicFrameLocks noChangeAspect="1"/>
@@ -11327,7 +11327,7 @@
                   <pic:spPr>
                     <a:xfrm>
                       <a:off x="0" y="0"/>
-                      <a:ext cx="3960000" cy="2722500"/>
+                      <a:ext cx="3240000" cy="2227500"/>
                     </a:xfrm>
                     <a:prstGeom prst="rect"/>
                   </pic:spPr>
@@ -11360,7 +11360,7 @@
       <w:r>
         <w:drawing>
           <wp:inline xmlns:a="http://schemas.openxmlformats.org/drawingml/2006/main" xmlns:pic="http://schemas.openxmlformats.org/drawingml/2006/picture">
-            <wp:extent cx="3960000" cy="2722500"/>
+            <wp:extent cx="3240000" cy="2227500"/>
             <wp:docPr id="15" name="Picture 15"/>
             <wp:cNvGraphicFramePr>
               <a:graphicFrameLocks noChangeAspect="1"/>
@@ -11381,7 +11381,7 @@
                   <pic:spPr>
                     <a:xfrm>
                       <a:off x="0" y="0"/>
-                      <a:ext cx="3960000" cy="2722500"/>
+                      <a:ext cx="3240000" cy="2227500"/>
                     </a:xfrm>
                     <a:prstGeom prst="rect"/>
                   </pic:spPr>
@@ -11414,7 +11414,7 @@
       <w:r>
         <w:drawing>
           <wp:inline xmlns:a="http://schemas.openxmlformats.org/drawingml/2006/main" xmlns:pic="http://schemas.openxmlformats.org/drawingml/2006/picture">
-            <wp:extent cx="3960000" cy="2722500"/>
+            <wp:extent cx="3240000" cy="2227500"/>
             <wp:docPr id="16" name="Picture 16"/>
             <wp:cNvGraphicFramePr>
               <a:graphicFrameLocks noChangeAspect="1"/>
@@ -11435,7 +11435,7 @@
                   <pic:spPr>
                     <a:xfrm>
                       <a:off x="0" y="0"/>
-                      <a:ext cx="3960000" cy="2722500"/>
+                      <a:ext cx="3240000" cy="2227500"/>
                     </a:xfrm>
                     <a:prstGeom prst="rect"/>
                   </pic:spPr>

</xml_diff>

<commit_message>
report.docx: bump web-app screenshot width to 10.5 cm to fill the page
Previous shrink to 9 cm packed all five screenshots into two pages
but left roughly half of page 2 blank after Fig 4.14.  Bumping to
10.5 cm makes each screenshot ~17 percent larger without spilling
onto a third page: three still fit on the first web-app page and
the second page carries Fig 4.13 and Fig 4.14 with much less
whitespace beneath.
</commit_message>
<xml_diff>
--- a/docs/report.docx
+++ b/docs/report.docx
@@ -11198,7 +11198,7 @@
       <w:r>
         <w:drawing>
           <wp:inline xmlns:a="http://schemas.openxmlformats.org/drawingml/2006/main" xmlns:pic="http://schemas.openxmlformats.org/drawingml/2006/picture">
-            <wp:extent cx="3240000" cy="2227500"/>
+            <wp:extent cx="3780000" cy="2598750"/>
             <wp:docPr id="12" name="Picture 12"/>
             <wp:cNvGraphicFramePr>
               <a:graphicFrameLocks noChangeAspect="1"/>
@@ -11219,7 +11219,7 @@
                   <pic:spPr>
                     <a:xfrm>
                       <a:off x="0" y="0"/>
-                      <a:ext cx="3240000" cy="2227500"/>
+                      <a:ext cx="3780000" cy="2598750"/>
                     </a:xfrm>
                     <a:prstGeom prst="rect"/>
                   </pic:spPr>
@@ -11252,7 +11252,7 @@
       <w:r>
         <w:drawing>
           <wp:inline xmlns:a="http://schemas.openxmlformats.org/drawingml/2006/main" xmlns:pic="http://schemas.openxmlformats.org/drawingml/2006/picture">
-            <wp:extent cx="3240000" cy="2227500"/>
+            <wp:extent cx="3780000" cy="2598750"/>
             <wp:docPr id="13" name="Picture 13"/>
             <wp:cNvGraphicFramePr>
               <a:graphicFrameLocks noChangeAspect="1"/>
@@ -11273,7 +11273,7 @@
                   <pic:spPr>
                     <a:xfrm>
                       <a:off x="0" y="0"/>
-                      <a:ext cx="3240000" cy="2227500"/>
+                      <a:ext cx="3780000" cy="2598750"/>
                     </a:xfrm>
                     <a:prstGeom prst="rect"/>
                   </pic:spPr>
@@ -11306,7 +11306,7 @@
       <w:r>
         <w:drawing>
           <wp:inline xmlns:a="http://schemas.openxmlformats.org/drawingml/2006/main" xmlns:pic="http://schemas.openxmlformats.org/drawingml/2006/picture">
-            <wp:extent cx="3240000" cy="2227500"/>
+            <wp:extent cx="3780000" cy="2598750"/>
             <wp:docPr id="14" name="Picture 14"/>
             <wp:cNvGraphicFramePr>
               <a:graphicFrameLocks noChangeAspect="1"/>
@@ -11327,7 +11327,7 @@
                   <pic:spPr>
                     <a:xfrm>
                       <a:off x="0" y="0"/>
-                      <a:ext cx="3240000" cy="2227500"/>
+                      <a:ext cx="3780000" cy="2598750"/>
                     </a:xfrm>
                     <a:prstGeom prst="rect"/>
                   </pic:spPr>
@@ -11360,7 +11360,7 @@
       <w:r>
         <w:drawing>
           <wp:inline xmlns:a="http://schemas.openxmlformats.org/drawingml/2006/main" xmlns:pic="http://schemas.openxmlformats.org/drawingml/2006/picture">
-            <wp:extent cx="3240000" cy="2227500"/>
+            <wp:extent cx="3780000" cy="2598750"/>
             <wp:docPr id="15" name="Picture 15"/>
             <wp:cNvGraphicFramePr>
               <a:graphicFrameLocks noChangeAspect="1"/>
@@ -11381,7 +11381,7 @@
                   <pic:spPr>
                     <a:xfrm>
                       <a:off x="0" y="0"/>
-                      <a:ext cx="3240000" cy="2227500"/>
+                      <a:ext cx="3780000" cy="2598750"/>
                     </a:xfrm>
                     <a:prstGeom prst="rect"/>
                   </pic:spPr>
@@ -11414,7 +11414,7 @@
       <w:r>
         <w:drawing>
           <wp:inline xmlns:a="http://schemas.openxmlformats.org/drawingml/2006/main" xmlns:pic="http://schemas.openxmlformats.org/drawingml/2006/picture">
-            <wp:extent cx="3240000" cy="2227500"/>
+            <wp:extent cx="3780000" cy="2598750"/>
             <wp:docPr id="16" name="Picture 16"/>
             <wp:cNvGraphicFramePr>
               <a:graphicFrameLocks noChangeAspect="1"/>
@@ -11435,7 +11435,7 @@
                   <pic:spPr>
                     <a:xfrm>
                       <a:off x="0" y="0"/>
-                      <a:ext cx="3240000" cy="2227500"/>
+                      <a:ext cx="3780000" cy="2598750"/>
                     </a:xfrm>
                     <a:prstGeom prst="rect"/>
                   </pic:spPr>

</xml_diff>

<commit_message>
report.docx: dial web-app screenshot width back to 9.5 cm
10.5 cm was just past the threshold where three screenshots stopped
fitting on one page -- the five figures spanned three pages again
(4.10+4.11, 4.12+4.13, 4.14 alone).  At 9.5 cm each image is about
6.5 cm tall plus a 0.5 cm caption, so three fit on one page and the
five span two pages: 4.10, 4.11, 4.12 on the first, then 4.13 and
4.14 on the second.  Slightly larger than the 9 cm setting that had
noticeable whitespace on page two.
</commit_message>
<xml_diff>
--- a/docs/report.docx
+++ b/docs/report.docx
@@ -11198,7 +11198,7 @@
       <w:r>
         <w:drawing>
           <wp:inline xmlns:a="http://schemas.openxmlformats.org/drawingml/2006/main" xmlns:pic="http://schemas.openxmlformats.org/drawingml/2006/picture">
-            <wp:extent cx="3780000" cy="2598750"/>
+            <wp:extent cx="3420000" cy="2351250"/>
             <wp:docPr id="12" name="Picture 12"/>
             <wp:cNvGraphicFramePr>
               <a:graphicFrameLocks noChangeAspect="1"/>
@@ -11219,7 +11219,7 @@
                   <pic:spPr>
                     <a:xfrm>
                       <a:off x="0" y="0"/>
-                      <a:ext cx="3780000" cy="2598750"/>
+                      <a:ext cx="3420000" cy="2351250"/>
                     </a:xfrm>
                     <a:prstGeom prst="rect"/>
                   </pic:spPr>
@@ -11252,7 +11252,7 @@
       <w:r>
         <w:drawing>
           <wp:inline xmlns:a="http://schemas.openxmlformats.org/drawingml/2006/main" xmlns:pic="http://schemas.openxmlformats.org/drawingml/2006/picture">
-            <wp:extent cx="3780000" cy="2598750"/>
+            <wp:extent cx="3420000" cy="2351250"/>
             <wp:docPr id="13" name="Picture 13"/>
             <wp:cNvGraphicFramePr>
               <a:graphicFrameLocks noChangeAspect="1"/>
@@ -11273,7 +11273,7 @@
                   <pic:spPr>
                     <a:xfrm>
                       <a:off x="0" y="0"/>
-                      <a:ext cx="3780000" cy="2598750"/>
+                      <a:ext cx="3420000" cy="2351250"/>
                     </a:xfrm>
                     <a:prstGeom prst="rect"/>
                   </pic:spPr>
@@ -11306,7 +11306,7 @@
       <w:r>
         <w:drawing>
           <wp:inline xmlns:a="http://schemas.openxmlformats.org/drawingml/2006/main" xmlns:pic="http://schemas.openxmlformats.org/drawingml/2006/picture">
-            <wp:extent cx="3780000" cy="2598750"/>
+            <wp:extent cx="3420000" cy="2351250"/>
             <wp:docPr id="14" name="Picture 14"/>
             <wp:cNvGraphicFramePr>
               <a:graphicFrameLocks noChangeAspect="1"/>
@@ -11327,7 +11327,7 @@
                   <pic:spPr>
                     <a:xfrm>
                       <a:off x="0" y="0"/>
-                      <a:ext cx="3780000" cy="2598750"/>
+                      <a:ext cx="3420000" cy="2351250"/>
                     </a:xfrm>
                     <a:prstGeom prst="rect"/>
                   </pic:spPr>
@@ -11360,7 +11360,7 @@
       <w:r>
         <w:drawing>
           <wp:inline xmlns:a="http://schemas.openxmlformats.org/drawingml/2006/main" xmlns:pic="http://schemas.openxmlformats.org/drawingml/2006/picture">
-            <wp:extent cx="3780000" cy="2598750"/>
+            <wp:extent cx="3420000" cy="2351250"/>
             <wp:docPr id="15" name="Picture 15"/>
             <wp:cNvGraphicFramePr>
               <a:graphicFrameLocks noChangeAspect="1"/>
@@ -11381,7 +11381,7 @@
                   <pic:spPr>
                     <a:xfrm>
                       <a:off x="0" y="0"/>
-                      <a:ext cx="3780000" cy="2598750"/>
+                      <a:ext cx="3420000" cy="2351250"/>
                     </a:xfrm>
                     <a:prstGeom prst="rect"/>
                   </pic:spPr>
@@ -11414,7 +11414,7 @@
       <w:r>
         <w:drawing>
           <wp:inline xmlns:a="http://schemas.openxmlformats.org/drawingml/2006/main" xmlns:pic="http://schemas.openxmlformats.org/drawingml/2006/picture">
-            <wp:extent cx="3780000" cy="2598750"/>
+            <wp:extent cx="3420000" cy="2351250"/>
             <wp:docPr id="16" name="Picture 16"/>
             <wp:cNvGraphicFramePr>
               <a:graphicFrameLocks noChangeAspect="1"/>
@@ -11435,7 +11435,7 @@
                   <pic:spPr>
                     <a:xfrm>
                       <a:off x="0" y="0"/>
-                      <a:ext cx="3780000" cy="2598750"/>
+                      <a:ext cx="3420000" cy="2351250"/>
                     </a:xfrm>
                     <a:prstGeom prst="rect"/>
                   </pic:spPr>

</xml_diff>

<commit_message>
report.docx: stop tables from being cut in half at page breaks
Table 4.3 (significant predictors from logistic regression) was
splitting across a page break -- header + first two rows on the
previous page, remaining five rows plus the caption on the next.
Same shape was possible on any long table (4.1 NMQ prevalence,
4.5 best-model-per-target, 4.7 per-class precision/recall).

Modified add_table so every row is tagged both cantSplit (row can't
break mid-cell) and, for every row except the last, keep_with_next
(row stays with the following row).  The last row's paragraph is
also flagged keep_with_next so the italic 'Table X.Y: ...' caption
below it stays with the table.

Result: Word treats each add_table block as a single layout unit --
if the whole table plus caption does not fit on the current page,
the whole block moves to the next page instead of being cut through
the middle.
</commit_message>
<xml_diff>
--- a/docs/report.docx
+++ b/docs/report.docx
@@ -3751,12 +3751,18 @@
         <w:gridCol w:w="3041"/>
       </w:tblGrid>
       <w:tr>
+        <w:trPr>
+          <w:cantSplit/>
+        </w:trPr>
         <w:tc>
           <w:tcPr>
             <w:tcW w:type="dxa" w:w="1984"/>
             <w:shd w:fill="D9D9D9"/>
           </w:tcPr>
           <w:p>
+            <w:pPr>
+              <w:keepNext/>
+            </w:pPr>
             <w:r/>
             <w:r>
               <w:rPr>
@@ -3804,11 +3810,17 @@
         </w:tc>
       </w:tr>
       <w:tr>
+        <w:trPr>
+          <w:cantSplit/>
+        </w:trPr>
         <w:tc>
           <w:tcPr>
             <w:tcW w:type="dxa" w:w="1984"/>
           </w:tcPr>
           <w:p>
+            <w:pPr>
+              <w:keepNext/>
+            </w:pPr>
             <w:r/>
             <w:r>
               <w:rPr>
@@ -3851,11 +3863,17 @@
         </w:tc>
       </w:tr>
       <w:tr>
+        <w:trPr>
+          <w:cantSplit/>
+        </w:trPr>
         <w:tc>
           <w:tcPr>
             <w:tcW w:type="dxa" w:w="1984"/>
           </w:tcPr>
           <w:p>
+            <w:pPr>
+              <w:keepNext/>
+            </w:pPr>
             <w:r/>
             <w:r>
               <w:rPr>
@@ -3898,11 +3916,17 @@
         </w:tc>
       </w:tr>
       <w:tr>
+        <w:trPr>
+          <w:cantSplit/>
+        </w:trPr>
         <w:tc>
           <w:tcPr>
             <w:tcW w:type="dxa" w:w="1984"/>
           </w:tcPr>
           <w:p>
+            <w:pPr>
+              <w:keepNext/>
+            </w:pPr>
             <w:r/>
             <w:r>
               <w:rPr>
@@ -3945,11 +3969,17 @@
         </w:tc>
       </w:tr>
       <w:tr>
+        <w:trPr>
+          <w:cantSplit/>
+        </w:trPr>
         <w:tc>
           <w:tcPr>
             <w:tcW w:type="dxa" w:w="1984"/>
           </w:tcPr>
           <w:p>
+            <w:pPr>
+              <w:keepNext/>
+            </w:pPr>
             <w:r/>
             <w:r>
               <w:rPr>
@@ -3992,11 +4022,17 @@
         </w:tc>
       </w:tr>
       <w:tr>
+        <w:trPr>
+          <w:cantSplit/>
+        </w:trPr>
         <w:tc>
           <w:tcPr>
             <w:tcW w:type="dxa" w:w="1984"/>
           </w:tcPr>
           <w:p>
+            <w:pPr>
+              <w:keepNext/>
+            </w:pPr>
             <w:r/>
             <w:r>
               <w:rPr>
@@ -4039,11 +4075,17 @@
         </w:tc>
       </w:tr>
       <w:tr>
+        <w:trPr>
+          <w:cantSplit/>
+        </w:trPr>
         <w:tc>
           <w:tcPr>
             <w:tcW w:type="dxa" w:w="1984"/>
           </w:tcPr>
           <w:p>
+            <w:pPr>
+              <w:keepNext/>
+            </w:pPr>
             <w:r/>
             <w:r>
               <w:rPr>
@@ -4881,12 +4923,18 @@
         <w:gridCol w:w="4561"/>
       </w:tblGrid>
       <w:tr>
+        <w:trPr>
+          <w:cantSplit/>
+        </w:trPr>
         <w:tc>
           <w:tcPr>
             <w:tcW w:type="dxa" w:w="3969"/>
             <w:shd w:fill="D9D9D9"/>
           </w:tcPr>
           <w:p>
+            <w:pPr>
+              <w:keepNext/>
+            </w:pPr>
             <w:r/>
             <w:r>
               <w:rPr>
@@ -4917,11 +4965,17 @@
         </w:tc>
       </w:tr>
       <w:tr>
+        <w:trPr>
+          <w:cantSplit/>
+        </w:trPr>
         <w:tc>
           <w:tcPr>
             <w:tcW w:type="dxa" w:w="3969"/>
           </w:tcPr>
           <w:p>
+            <w:pPr>
+              <w:keepNext/>
+            </w:pPr>
             <w:r/>
             <w:r>
               <w:rPr>
@@ -4949,11 +5003,17 @@
         </w:tc>
       </w:tr>
       <w:tr>
+        <w:trPr>
+          <w:cantSplit/>
+        </w:trPr>
         <w:tc>
           <w:tcPr>
             <w:tcW w:type="dxa" w:w="3969"/>
           </w:tcPr>
           <w:p>
+            <w:pPr>
+              <w:keepNext/>
+            </w:pPr>
             <w:r/>
             <w:r>
               <w:rPr>
@@ -4981,11 +5041,17 @@
         </w:tc>
       </w:tr>
       <w:tr>
+        <w:trPr>
+          <w:cantSplit/>
+        </w:trPr>
         <w:tc>
           <w:tcPr>
             <w:tcW w:type="dxa" w:w="3969"/>
           </w:tcPr>
           <w:p>
+            <w:pPr>
+              <w:keepNext/>
+            </w:pPr>
             <w:r/>
             <w:r>
               <w:rPr>
@@ -5013,11 +5079,17 @@
         </w:tc>
       </w:tr>
       <w:tr>
+        <w:trPr>
+          <w:cantSplit/>
+        </w:trPr>
         <w:tc>
           <w:tcPr>
             <w:tcW w:type="dxa" w:w="3969"/>
           </w:tcPr>
           <w:p>
+            <w:pPr>
+              <w:keepNext/>
+            </w:pPr>
             <w:r/>
             <w:r>
               <w:rPr>
@@ -5045,11 +5117,17 @@
         </w:tc>
       </w:tr>
       <w:tr>
+        <w:trPr>
+          <w:cantSplit/>
+        </w:trPr>
         <w:tc>
           <w:tcPr>
             <w:tcW w:type="dxa" w:w="3969"/>
           </w:tcPr>
           <w:p>
+            <w:pPr>
+              <w:keepNext/>
+            </w:pPr>
             <w:r/>
             <w:r>
               <w:rPr>
@@ -5077,11 +5155,17 @@
         </w:tc>
       </w:tr>
       <w:tr>
+        <w:trPr>
+          <w:cantSplit/>
+        </w:trPr>
         <w:tc>
           <w:tcPr>
             <w:tcW w:type="dxa" w:w="3969"/>
           </w:tcPr>
           <w:p>
+            <w:pPr>
+              <w:keepNext/>
+            </w:pPr>
             <w:r/>
             <w:r>
               <w:rPr>
@@ -5109,11 +5193,17 @@
         </w:tc>
       </w:tr>
       <w:tr>
+        <w:trPr>
+          <w:cantSplit/>
+        </w:trPr>
         <w:tc>
           <w:tcPr>
             <w:tcW w:type="dxa" w:w="3969"/>
           </w:tcPr>
           <w:p>
+            <w:pPr>
+              <w:keepNext/>
+            </w:pPr>
             <w:r/>
             <w:r>
               <w:rPr>
@@ -5141,11 +5231,17 @@
         </w:tc>
       </w:tr>
       <w:tr>
+        <w:trPr>
+          <w:cantSplit/>
+        </w:trPr>
         <w:tc>
           <w:tcPr>
             <w:tcW w:type="dxa" w:w="3969"/>
           </w:tcPr>
           <w:p>
+            <w:pPr>
+              <w:keepNext/>
+            </w:pPr>
             <w:r/>
             <w:r>
               <w:rPr>
@@ -5173,11 +5269,17 @@
         </w:tc>
       </w:tr>
       <w:tr>
+        <w:trPr>
+          <w:cantSplit/>
+        </w:trPr>
         <w:tc>
           <w:tcPr>
             <w:tcW w:type="dxa" w:w="3969"/>
           </w:tcPr>
           <w:p>
+            <w:pPr>
+              <w:keepNext/>
+            </w:pPr>
             <w:r/>
             <w:r>
               <w:rPr>
@@ -5361,12 +5463,18 @@
         <w:gridCol w:w="2280"/>
       </w:tblGrid>
       <w:tr>
+        <w:trPr>
+          <w:cantSplit/>
+        </w:trPr>
         <w:tc>
           <w:tcPr>
             <w:tcW w:type="dxa" w:w="2268"/>
             <w:shd w:fill="D9D9D9"/>
           </w:tcPr>
           <w:p>
+            <w:pPr>
+              <w:keepNext/>
+            </w:pPr>
             <w:r/>
             <w:r>
               <w:rPr>
@@ -5431,11 +5539,17 @@
         </w:tc>
       </w:tr>
       <w:tr>
+        <w:trPr>
+          <w:cantSplit/>
+        </w:trPr>
         <w:tc>
           <w:tcPr>
             <w:tcW w:type="dxa" w:w="2268"/>
           </w:tcPr>
           <w:p>
+            <w:pPr>
+              <w:keepNext/>
+            </w:pPr>
             <w:r/>
             <w:r>
               <w:rPr>
@@ -5493,11 +5607,17 @@
         </w:tc>
       </w:tr>
       <w:tr>
+        <w:trPr>
+          <w:cantSplit/>
+        </w:trPr>
         <w:tc>
           <w:tcPr>
             <w:tcW w:type="dxa" w:w="2268"/>
           </w:tcPr>
           <w:p>
+            <w:pPr>
+              <w:keepNext/>
+            </w:pPr>
             <w:r/>
             <w:r>
               <w:rPr>
@@ -5555,11 +5675,17 @@
         </w:tc>
       </w:tr>
       <w:tr>
+        <w:trPr>
+          <w:cantSplit/>
+        </w:trPr>
         <w:tc>
           <w:tcPr>
             <w:tcW w:type="dxa" w:w="2268"/>
           </w:tcPr>
           <w:p>
+            <w:pPr>
+              <w:keepNext/>
+            </w:pPr>
             <w:r/>
             <w:r>
               <w:rPr>
@@ -5617,11 +5743,17 @@
         </w:tc>
       </w:tr>
       <w:tr>
+        <w:trPr>
+          <w:cantSplit/>
+        </w:trPr>
         <w:tc>
           <w:tcPr>
             <w:tcW w:type="dxa" w:w="2268"/>
           </w:tcPr>
           <w:p>
+            <w:pPr>
+              <w:keepNext/>
+            </w:pPr>
             <w:r/>
             <w:r>
               <w:rPr>
@@ -5679,11 +5811,17 @@
         </w:tc>
       </w:tr>
       <w:tr>
+        <w:trPr>
+          <w:cantSplit/>
+        </w:trPr>
         <w:tc>
           <w:tcPr>
             <w:tcW w:type="dxa" w:w="2268"/>
           </w:tcPr>
           <w:p>
+            <w:pPr>
+              <w:keepNext/>
+            </w:pPr>
             <w:r/>
             <w:r>
               <w:rPr>
@@ -5741,11 +5879,17 @@
         </w:tc>
       </w:tr>
       <w:tr>
+        <w:trPr>
+          <w:cantSplit/>
+        </w:trPr>
         <w:tc>
           <w:tcPr>
             <w:tcW w:type="dxa" w:w="2268"/>
           </w:tcPr>
           <w:p>
+            <w:pPr>
+              <w:keepNext/>
+            </w:pPr>
             <w:r/>
             <w:r>
               <w:rPr>
@@ -5851,12 +5995,18 @@
         <w:gridCol w:w="2280"/>
       </w:tblGrid>
       <w:tr>
+        <w:trPr>
+          <w:cantSplit/>
+        </w:trPr>
         <w:tc>
           <w:tcPr>
             <w:tcW w:type="dxa" w:w="3402"/>
             <w:shd w:fill="D9D9D9"/>
           </w:tcPr>
           <w:p>
+            <w:pPr>
+              <w:keepNext/>
+            </w:pPr>
             <w:r/>
             <w:r>
               <w:rPr>
@@ -5921,11 +6071,17 @@
         </w:tc>
       </w:tr>
       <w:tr>
+        <w:trPr>
+          <w:cantSplit/>
+        </w:trPr>
         <w:tc>
           <w:tcPr>
             <w:tcW w:type="dxa" w:w="3402"/>
           </w:tcPr>
           <w:p>
+            <w:pPr>
+              <w:keepNext/>
+            </w:pPr>
             <w:r/>
             <w:r>
               <w:rPr>
@@ -5983,11 +6139,17 @@
         </w:tc>
       </w:tr>
       <w:tr>
+        <w:trPr>
+          <w:cantSplit/>
+        </w:trPr>
         <w:tc>
           <w:tcPr>
             <w:tcW w:type="dxa" w:w="3402"/>
           </w:tcPr>
           <w:p>
+            <w:pPr>
+              <w:keepNext/>
+            </w:pPr>
             <w:r/>
             <w:r>
               <w:rPr>
@@ -6045,11 +6207,17 @@
         </w:tc>
       </w:tr>
       <w:tr>
+        <w:trPr>
+          <w:cantSplit/>
+        </w:trPr>
         <w:tc>
           <w:tcPr>
             <w:tcW w:type="dxa" w:w="3402"/>
           </w:tcPr>
           <w:p>
+            <w:pPr>
+              <w:keepNext/>
+            </w:pPr>
             <w:r/>
             <w:r>
               <w:rPr>
@@ -6107,11 +6275,17 @@
         </w:tc>
       </w:tr>
       <w:tr>
+        <w:trPr>
+          <w:cantSplit/>
+        </w:trPr>
         <w:tc>
           <w:tcPr>
             <w:tcW w:type="dxa" w:w="3402"/>
           </w:tcPr>
           <w:p>
+            <w:pPr>
+              <w:keepNext/>
+            </w:pPr>
             <w:r/>
             <w:r>
               <w:rPr>
@@ -6169,11 +6343,17 @@
         </w:tc>
       </w:tr>
       <w:tr>
+        <w:trPr>
+          <w:cantSplit/>
+        </w:trPr>
         <w:tc>
           <w:tcPr>
             <w:tcW w:type="dxa" w:w="3402"/>
           </w:tcPr>
           <w:p>
+            <w:pPr>
+              <w:keepNext/>
+            </w:pPr>
             <w:r/>
             <w:r>
               <w:rPr>
@@ -6231,11 +6411,17 @@
         </w:tc>
       </w:tr>
       <w:tr>
+        <w:trPr>
+          <w:cantSplit/>
+        </w:trPr>
         <w:tc>
           <w:tcPr>
             <w:tcW w:type="dxa" w:w="3402"/>
           </w:tcPr>
           <w:p>
+            <w:pPr>
+              <w:keepNext/>
+            </w:pPr>
             <w:r/>
             <w:r>
               <w:rPr>
@@ -6293,11 +6479,17 @@
         </w:tc>
       </w:tr>
       <w:tr>
+        <w:trPr>
+          <w:cantSplit/>
+        </w:trPr>
         <w:tc>
           <w:tcPr>
             <w:tcW w:type="dxa" w:w="3402"/>
           </w:tcPr>
           <w:p>
+            <w:pPr>
+              <w:keepNext/>
+            </w:pPr>
             <w:r/>
             <w:r>
               <w:rPr>
@@ -6415,12 +6607,18 @@
         <w:gridCol w:w="2280"/>
       </w:tblGrid>
       <w:tr>
+        <w:trPr>
+          <w:cantSplit/>
+        </w:trPr>
         <w:tc>
           <w:tcPr>
             <w:tcW w:type="dxa" w:w="2835"/>
             <w:shd w:fill="D9D9D9"/>
           </w:tcPr>
           <w:p>
+            <w:pPr>
+              <w:keepNext/>
+            </w:pPr>
             <w:r/>
             <w:r>
               <w:rPr>
@@ -6485,11 +6683,17 @@
         </w:tc>
       </w:tr>
       <w:tr>
+        <w:trPr>
+          <w:cantSplit/>
+        </w:trPr>
         <w:tc>
           <w:tcPr>
             <w:tcW w:type="dxa" w:w="2835"/>
           </w:tcPr>
           <w:p>
+            <w:pPr>
+              <w:keepNext/>
+            </w:pPr>
             <w:r/>
             <w:r>
               <w:rPr>
@@ -6547,11 +6751,17 @@
         </w:tc>
       </w:tr>
       <w:tr>
+        <w:trPr>
+          <w:cantSplit/>
+        </w:trPr>
         <w:tc>
           <w:tcPr>
             <w:tcW w:type="dxa" w:w="2835"/>
           </w:tcPr>
           <w:p>
+            <w:pPr>
+              <w:keepNext/>
+            </w:pPr>
             <w:r/>
             <w:r>
               <w:rPr>
@@ -6609,11 +6819,17 @@
         </w:tc>
       </w:tr>
       <w:tr>
+        <w:trPr>
+          <w:cantSplit/>
+        </w:trPr>
         <w:tc>
           <w:tcPr>
             <w:tcW w:type="dxa" w:w="2835"/>
           </w:tcPr>
           <w:p>
+            <w:pPr>
+              <w:keepNext/>
+            </w:pPr>
             <w:r/>
             <w:r>
               <w:rPr>
@@ -6671,11 +6887,17 @@
         </w:tc>
       </w:tr>
       <w:tr>
+        <w:trPr>
+          <w:cantSplit/>
+        </w:trPr>
         <w:tc>
           <w:tcPr>
             <w:tcW w:type="dxa" w:w="2835"/>
           </w:tcPr>
           <w:p>
+            <w:pPr>
+              <w:keepNext/>
+            </w:pPr>
             <w:r/>
             <w:r>
               <w:rPr>
@@ -6733,11 +6955,17 @@
         </w:tc>
       </w:tr>
       <w:tr>
+        <w:trPr>
+          <w:cantSplit/>
+        </w:trPr>
         <w:tc>
           <w:tcPr>
             <w:tcW w:type="dxa" w:w="2835"/>
           </w:tcPr>
           <w:p>
+            <w:pPr>
+              <w:keepNext/>
+            </w:pPr>
             <w:r/>
             <w:r>
               <w:rPr>
@@ -6795,11 +7023,17 @@
         </w:tc>
       </w:tr>
       <w:tr>
+        <w:trPr>
+          <w:cantSplit/>
+        </w:trPr>
         <w:tc>
           <w:tcPr>
             <w:tcW w:type="dxa" w:w="2835"/>
           </w:tcPr>
           <w:p>
+            <w:pPr>
+              <w:keepNext/>
+            </w:pPr>
             <w:r/>
             <w:r>
               <w:rPr>
@@ -7094,12 +7328,18 @@
         <w:gridCol w:w="1520"/>
       </w:tblGrid>
       <w:tr>
+        <w:trPr>
+          <w:cantSplit/>
+        </w:trPr>
         <w:tc>
           <w:tcPr>
             <w:tcW w:type="dxa" w:w="1814"/>
             <w:shd w:fill="D9D9D9"/>
           </w:tcPr>
           <w:p>
+            <w:pPr>
+              <w:keepNext/>
+            </w:pPr>
             <w:r/>
             <w:r>
               <w:rPr>
@@ -7198,11 +7438,17 @@
         </w:tc>
       </w:tr>
       <w:tr>
+        <w:trPr>
+          <w:cantSplit/>
+        </w:trPr>
         <w:tc>
           <w:tcPr>
             <w:tcW w:type="dxa" w:w="1814"/>
           </w:tcPr>
           <w:p>
+            <w:pPr>
+              <w:keepNext/>
+            </w:pPr>
             <w:r/>
             <w:r>
               <w:rPr>
@@ -7290,11 +7536,17 @@
         </w:tc>
       </w:tr>
       <w:tr>
+        <w:trPr>
+          <w:cantSplit/>
+        </w:trPr>
         <w:tc>
           <w:tcPr>
             <w:tcW w:type="dxa" w:w="1814"/>
           </w:tcPr>
           <w:p>
+            <w:pPr>
+              <w:keepNext/>
+            </w:pPr>
             <w:r/>
             <w:r>
               <w:rPr>
@@ -7382,11 +7634,17 @@
         </w:tc>
       </w:tr>
       <w:tr>
+        <w:trPr>
+          <w:cantSplit/>
+        </w:trPr>
         <w:tc>
           <w:tcPr>
             <w:tcW w:type="dxa" w:w="1814"/>
           </w:tcPr>
           <w:p>
+            <w:pPr>
+              <w:keepNext/>
+            </w:pPr>
             <w:r/>
             <w:r>
               <w:rPr>
@@ -7474,11 +7732,17 @@
         </w:tc>
       </w:tr>
       <w:tr>
+        <w:trPr>
+          <w:cantSplit/>
+        </w:trPr>
         <w:tc>
           <w:tcPr>
             <w:tcW w:type="dxa" w:w="1814"/>
           </w:tcPr>
           <w:p>
+            <w:pPr>
+              <w:keepNext/>
+            </w:pPr>
             <w:r/>
             <w:r>
               <w:rPr>
@@ -7566,11 +7830,17 @@
         </w:tc>
       </w:tr>
       <w:tr>
+        <w:trPr>
+          <w:cantSplit/>
+        </w:trPr>
         <w:tc>
           <w:tcPr>
             <w:tcW w:type="dxa" w:w="1814"/>
           </w:tcPr>
           <w:p>
+            <w:pPr>
+              <w:keepNext/>
+            </w:pPr>
             <w:r/>
             <w:r>
               <w:rPr>
@@ -7658,11 +7928,17 @@
         </w:tc>
       </w:tr>
       <w:tr>
+        <w:trPr>
+          <w:cantSplit/>
+        </w:trPr>
         <w:tc>
           <w:tcPr>
             <w:tcW w:type="dxa" w:w="1814"/>
           </w:tcPr>
           <w:p>
+            <w:pPr>
+              <w:keepNext/>
+            </w:pPr>
             <w:r/>
             <w:r>
               <w:rPr>
@@ -7823,12 +8099,18 @@
         <w:gridCol w:w="2280"/>
       </w:tblGrid>
       <w:tr>
+        <w:trPr>
+          <w:cantSplit/>
+        </w:trPr>
         <w:tc>
           <w:tcPr>
             <w:tcW w:type="dxa" w:w="1984"/>
             <w:shd w:fill="D9D9D9"/>
           </w:tcPr>
           <w:p>
+            <w:pPr>
+              <w:keepNext/>
+            </w:pPr>
             <w:r/>
             <w:r>
               <w:rPr>
@@ -7893,11 +8175,17 @@
         </w:tc>
       </w:tr>
       <w:tr>
+        <w:trPr>
+          <w:cantSplit/>
+        </w:trPr>
         <w:tc>
           <w:tcPr>
             <w:tcW w:type="dxa" w:w="1984"/>
           </w:tcPr>
           <w:p>
+            <w:pPr>
+              <w:keepNext/>
+            </w:pPr>
             <w:r/>
             <w:r>
               <w:rPr>
@@ -7955,11 +8243,17 @@
         </w:tc>
       </w:tr>
       <w:tr>
+        <w:trPr>
+          <w:cantSplit/>
+        </w:trPr>
         <w:tc>
           <w:tcPr>
             <w:tcW w:type="dxa" w:w="1984"/>
           </w:tcPr>
           <w:p>
+            <w:pPr>
+              <w:keepNext/>
+            </w:pPr>
             <w:r/>
             <w:r>
               <w:rPr>
@@ -8017,11 +8311,17 @@
         </w:tc>
       </w:tr>
       <w:tr>
+        <w:trPr>
+          <w:cantSplit/>
+        </w:trPr>
         <w:tc>
           <w:tcPr>
             <w:tcW w:type="dxa" w:w="1984"/>
           </w:tcPr>
           <w:p>
+            <w:pPr>
+              <w:keepNext/>
+            </w:pPr>
             <w:r/>
             <w:r>
               <w:rPr>
@@ -8079,11 +8379,17 @@
         </w:tc>
       </w:tr>
       <w:tr>
+        <w:trPr>
+          <w:cantSplit/>
+        </w:trPr>
         <w:tc>
           <w:tcPr>
             <w:tcW w:type="dxa" w:w="1984"/>
           </w:tcPr>
           <w:p>
+            <w:pPr>
+              <w:keepNext/>
+            </w:pPr>
             <w:r/>
             <w:r>
               <w:rPr>
@@ -8141,11 +8447,17 @@
         </w:tc>
       </w:tr>
       <w:tr>
+        <w:trPr>
+          <w:cantSplit/>
+        </w:trPr>
         <w:tc>
           <w:tcPr>
             <w:tcW w:type="dxa" w:w="1984"/>
           </w:tcPr>
           <w:p>
+            <w:pPr>
+              <w:keepNext/>
+            </w:pPr>
             <w:r/>
             <w:r>
               <w:rPr>
@@ -8203,11 +8515,17 @@
         </w:tc>
       </w:tr>
       <w:tr>
+        <w:trPr>
+          <w:cantSplit/>
+        </w:trPr>
         <w:tc>
           <w:tcPr>
             <w:tcW w:type="dxa" w:w="1984"/>
           </w:tcPr>
           <w:p>
+            <w:pPr>
+              <w:keepNext/>
+            </w:pPr>
             <w:r/>
             <w:r>
               <w:rPr>
@@ -8423,12 +8741,18 @@
         <w:gridCol w:w="1520"/>
       </w:tblGrid>
       <w:tr>
+        <w:trPr>
+          <w:cantSplit/>
+        </w:trPr>
         <w:tc>
           <w:tcPr>
             <w:tcW w:type="dxa" w:w="1984"/>
             <w:shd w:fill="D9D9D9"/>
           </w:tcPr>
           <w:p>
+            <w:pPr>
+              <w:keepNext/>
+            </w:pPr>
             <w:r/>
             <w:r>
               <w:rPr>
@@ -8527,11 +8851,17 @@
         </w:tc>
       </w:tr>
       <w:tr>
+        <w:trPr>
+          <w:cantSplit/>
+        </w:trPr>
         <w:tc>
           <w:tcPr>
             <w:tcW w:type="dxa" w:w="1984"/>
           </w:tcPr>
           <w:p>
+            <w:pPr>
+              <w:keepNext/>
+            </w:pPr>
             <w:r/>
             <w:r>
               <w:rPr>
@@ -8619,11 +8949,17 @@
         </w:tc>
       </w:tr>
       <w:tr>
+        <w:trPr>
+          <w:cantSplit/>
+        </w:trPr>
         <w:tc>
           <w:tcPr>
             <w:tcW w:type="dxa" w:w="1984"/>
           </w:tcPr>
           <w:p>
+            <w:pPr>
+              <w:keepNext/>
+            </w:pPr>
             <w:r/>
             <w:r>
               <w:rPr>
@@ -8711,11 +9047,17 @@
         </w:tc>
       </w:tr>
       <w:tr>
+        <w:trPr>
+          <w:cantSplit/>
+        </w:trPr>
         <w:tc>
           <w:tcPr>
             <w:tcW w:type="dxa" w:w="1984"/>
           </w:tcPr>
           <w:p>
+            <w:pPr>
+              <w:keepNext/>
+            </w:pPr>
             <w:r/>
             <w:r>
               <w:rPr>
@@ -8803,11 +9145,17 @@
         </w:tc>
       </w:tr>
       <w:tr>
+        <w:trPr>
+          <w:cantSplit/>
+        </w:trPr>
         <w:tc>
           <w:tcPr>
             <w:tcW w:type="dxa" w:w="1984"/>
           </w:tcPr>
           <w:p>
+            <w:pPr>
+              <w:keepNext/>
+            </w:pPr>
             <w:r/>
             <w:r>
               <w:rPr>
@@ -8895,11 +9243,17 @@
         </w:tc>
       </w:tr>
       <w:tr>
+        <w:trPr>
+          <w:cantSplit/>
+        </w:trPr>
         <w:tc>
           <w:tcPr>
             <w:tcW w:type="dxa" w:w="1984"/>
           </w:tcPr>
           <w:p>
+            <w:pPr>
+              <w:keepNext/>
+            </w:pPr>
             <w:r/>
             <w:r>
               <w:rPr>
@@ -8987,11 +9341,17 @@
         </w:tc>
       </w:tr>
       <w:tr>
+        <w:trPr>
+          <w:cantSplit/>
+        </w:trPr>
         <w:tc>
           <w:tcPr>
             <w:tcW w:type="dxa" w:w="1984"/>
           </w:tcPr>
           <w:p>
+            <w:pPr>
+              <w:keepNext/>
+            </w:pPr>
             <w:r/>
             <w:r>
               <w:rPr>
@@ -9079,11 +9439,17 @@
         </w:tc>
       </w:tr>
       <w:tr>
+        <w:trPr>
+          <w:cantSplit/>
+        </w:trPr>
         <w:tc>
           <w:tcPr>
             <w:tcW w:type="dxa" w:w="1984"/>
           </w:tcPr>
           <w:p>
+            <w:pPr>
+              <w:keepNext/>
+            </w:pPr>
             <w:r/>
             <w:r>
               <w:rPr>
@@ -9171,11 +9537,17 @@
         </w:tc>
       </w:tr>
       <w:tr>
+        <w:trPr>
+          <w:cantSplit/>
+        </w:trPr>
         <w:tc>
           <w:tcPr>
             <w:tcW w:type="dxa" w:w="1984"/>
           </w:tcPr>
           <w:p>
+            <w:pPr>
+              <w:keepNext/>
+            </w:pPr>
             <w:r/>
             <w:r>
               <w:rPr>
@@ -9263,11 +9635,17 @@
         </w:tc>
       </w:tr>
       <w:tr>
+        <w:trPr>
+          <w:cantSplit/>
+        </w:trPr>
         <w:tc>
           <w:tcPr>
             <w:tcW w:type="dxa" w:w="1984"/>
           </w:tcPr>
           <w:p>
+            <w:pPr>
+              <w:keepNext/>
+            </w:pPr>
             <w:r/>
             <w:r>
               <w:rPr>
@@ -9355,11 +9733,17 @@
         </w:tc>
       </w:tr>
       <w:tr>
+        <w:trPr>
+          <w:cantSplit/>
+        </w:trPr>
         <w:tc>
           <w:tcPr>
             <w:tcW w:type="dxa" w:w="1984"/>
           </w:tcPr>
           <w:p>
+            <w:pPr>
+              <w:keepNext/>
+            </w:pPr>
             <w:r/>
             <w:r>
               <w:rPr>
@@ -9447,11 +9831,17 @@
         </w:tc>
       </w:tr>
       <w:tr>
+        <w:trPr>
+          <w:cantSplit/>
+        </w:trPr>
         <w:tc>
           <w:tcPr>
             <w:tcW w:type="dxa" w:w="1984"/>
           </w:tcPr>
           <w:p>
+            <w:pPr>
+              <w:keepNext/>
+            </w:pPr>
             <w:r/>
             <w:r>
               <w:rPr>
@@ -9539,11 +9929,17 @@
         </w:tc>
       </w:tr>
       <w:tr>
+        <w:trPr>
+          <w:cantSplit/>
+        </w:trPr>
         <w:tc>
           <w:tcPr>
             <w:tcW w:type="dxa" w:w="1984"/>
           </w:tcPr>
           <w:p>
+            <w:pPr>
+              <w:keepNext/>
+            </w:pPr>
             <w:r/>
             <w:r>
               <w:rPr>
@@ -9631,11 +10027,17 @@
         </w:tc>
       </w:tr>
       <w:tr>
+        <w:trPr>
+          <w:cantSplit/>
+        </w:trPr>
         <w:tc>
           <w:tcPr>
             <w:tcW w:type="dxa" w:w="1984"/>
           </w:tcPr>
           <w:p>
+            <w:pPr>
+              <w:keepNext/>
+            </w:pPr>
             <w:r/>
             <w:r>
               <w:rPr>
@@ -9723,11 +10125,17 @@
         </w:tc>
       </w:tr>
       <w:tr>
+        <w:trPr>
+          <w:cantSplit/>
+        </w:trPr>
         <w:tc>
           <w:tcPr>
             <w:tcW w:type="dxa" w:w="1984"/>
           </w:tcPr>
           <w:p>
+            <w:pPr>
+              <w:keepNext/>
+            </w:pPr>
             <w:r/>
             <w:r>
               <w:rPr>
@@ -9815,11 +10223,17 @@
         </w:tc>
       </w:tr>
       <w:tr>
+        <w:trPr>
+          <w:cantSplit/>
+        </w:trPr>
         <w:tc>
           <w:tcPr>
             <w:tcW w:type="dxa" w:w="1984"/>
           </w:tcPr>
           <w:p>
+            <w:pPr>
+              <w:keepNext/>
+            </w:pPr>
             <w:r/>
             <w:r>
               <w:rPr>
@@ -9907,11 +10321,17 @@
         </w:tc>
       </w:tr>
       <w:tr>
+        <w:trPr>
+          <w:cantSplit/>
+        </w:trPr>
         <w:tc>
           <w:tcPr>
             <w:tcW w:type="dxa" w:w="1984"/>
           </w:tcPr>
           <w:p>
+            <w:pPr>
+              <w:keepNext/>
+            </w:pPr>
             <w:r/>
             <w:r>
               <w:rPr>
@@ -9999,11 +10419,17 @@
         </w:tc>
       </w:tr>
       <w:tr>
+        <w:trPr>
+          <w:cantSplit/>
+        </w:trPr>
         <w:tc>
           <w:tcPr>
             <w:tcW w:type="dxa" w:w="1984"/>
           </w:tcPr>
           <w:p>
+            <w:pPr>
+              <w:keepNext/>
+            </w:pPr>
             <w:r/>
             <w:r>
               <w:rPr>
@@ -10182,12 +10608,18 @@
         <w:gridCol w:w="1520"/>
       </w:tblGrid>
       <w:tr>
+        <w:trPr>
+          <w:cantSplit/>
+        </w:trPr>
         <w:tc>
           <w:tcPr>
             <w:tcW w:type="dxa" w:w="1701"/>
             <w:shd w:fill="D9D9D9"/>
           </w:tcPr>
           <w:p>
+            <w:pPr>
+              <w:keepNext/>
+            </w:pPr>
             <w:r/>
             <w:r>
               <w:rPr>
@@ -10286,11 +10718,17 @@
         </w:tc>
       </w:tr>
       <w:tr>
+        <w:trPr>
+          <w:cantSplit/>
+        </w:trPr>
         <w:tc>
           <w:tcPr>
             <w:tcW w:type="dxa" w:w="1701"/>
           </w:tcPr>
           <w:p>
+            <w:pPr>
+              <w:keepNext/>
+            </w:pPr>
             <w:r/>
             <w:r>
               <w:rPr>
@@ -10378,11 +10816,17 @@
         </w:tc>
       </w:tr>
       <w:tr>
+        <w:trPr>
+          <w:cantSplit/>
+        </w:trPr>
         <w:tc>
           <w:tcPr>
             <w:tcW w:type="dxa" w:w="1701"/>
           </w:tcPr>
           <w:p>
+            <w:pPr>
+              <w:keepNext/>
+            </w:pPr>
             <w:r/>
             <w:r>
               <w:rPr>
@@ -10470,11 +10914,17 @@
         </w:tc>
       </w:tr>
       <w:tr>
+        <w:trPr>
+          <w:cantSplit/>
+        </w:trPr>
         <w:tc>
           <w:tcPr>
             <w:tcW w:type="dxa" w:w="1701"/>
           </w:tcPr>
           <w:p>
+            <w:pPr>
+              <w:keepNext/>
+            </w:pPr>
             <w:r/>
             <w:r>
               <w:rPr>
@@ -10562,11 +11012,17 @@
         </w:tc>
       </w:tr>
       <w:tr>
+        <w:trPr>
+          <w:cantSplit/>
+        </w:trPr>
         <w:tc>
           <w:tcPr>
             <w:tcW w:type="dxa" w:w="1701"/>
           </w:tcPr>
           <w:p>
+            <w:pPr>
+              <w:keepNext/>
+            </w:pPr>
             <w:r/>
             <w:r>
               <w:rPr>
@@ -10689,12 +11145,18 @@
         <w:gridCol w:w="2280"/>
       </w:tblGrid>
       <w:tr>
+        <w:trPr>
+          <w:cantSplit/>
+        </w:trPr>
         <w:tc>
           <w:tcPr>
             <w:tcW w:type="dxa" w:w="1814"/>
             <w:shd w:fill="D9D9D9"/>
           </w:tcPr>
           <w:p>
+            <w:pPr>
+              <w:keepNext/>
+            </w:pPr>
             <w:r/>
             <w:r>
               <w:rPr>
@@ -10759,11 +11221,17 @@
         </w:tc>
       </w:tr>
       <w:tr>
+        <w:trPr>
+          <w:cantSplit/>
+        </w:trPr>
         <w:tc>
           <w:tcPr>
             <w:tcW w:type="dxa" w:w="1814"/>
           </w:tcPr>
           <w:p>
+            <w:pPr>
+              <w:keepNext/>
+            </w:pPr>
             <w:r/>
             <w:r>
               <w:rPr>
@@ -10821,11 +11289,17 @@
         </w:tc>
       </w:tr>
       <w:tr>
+        <w:trPr>
+          <w:cantSplit/>
+        </w:trPr>
         <w:tc>
           <w:tcPr>
             <w:tcW w:type="dxa" w:w="1814"/>
           </w:tcPr>
           <w:p>
+            <w:pPr>
+              <w:keepNext/>
+            </w:pPr>
             <w:r/>
             <w:r>
               <w:rPr>
@@ -10883,11 +11357,17 @@
         </w:tc>
       </w:tr>
       <w:tr>
+        <w:trPr>
+          <w:cantSplit/>
+        </w:trPr>
         <w:tc>
           <w:tcPr>
             <w:tcW w:type="dxa" w:w="1814"/>
           </w:tcPr>
           <w:p>
+            <w:pPr>
+              <w:keepNext/>
+            </w:pPr>
             <w:r/>
             <w:r>
               <w:rPr>
@@ -10945,11 +11425,17 @@
         </w:tc>
       </w:tr>
       <w:tr>
+        <w:trPr>
+          <w:cantSplit/>
+        </w:trPr>
         <w:tc>
           <w:tcPr>
             <w:tcW w:type="dxa" w:w="1814"/>
           </w:tcPr>
           <w:p>
+            <w:pPr>
+              <w:keepNext/>
+            </w:pPr>
             <w:r/>
             <w:r>
               <w:rPr>
@@ -11007,11 +11493,17 @@
         </w:tc>
       </w:tr>
       <w:tr>
+        <w:trPr>
+          <w:cantSplit/>
+        </w:trPr>
         <w:tc>
           <w:tcPr>
             <w:tcW w:type="dxa" w:w="1814"/>
           </w:tcPr>
           <w:p>
+            <w:pPr>
+              <w:keepNext/>
+            </w:pPr>
             <w:r/>
             <w:r>
               <w:rPr>
@@ -11069,11 +11561,17 @@
         </w:tc>
       </w:tr>
       <w:tr>
+        <w:trPr>
+          <w:cantSplit/>
+        </w:trPr>
         <w:tc>
           <w:tcPr>
             <w:tcW w:type="dxa" w:w="1814"/>
           </w:tcPr>
           <w:p>
+            <w:pPr>
+              <w:keepNext/>
+            </w:pPr>
             <w:r/>
             <w:r>
               <w:rPr>

</xml_diff>

<commit_message>
report.docx: shrink all result figures to 9.5 cm to eat the whitespace
User pointed out Chapter 4 sections 4.4 - 4.6 span three pages with
visible empty space at the bottom of the last page, particularly
around Figures 4.7 confusion matrices, 4.8 ROC curves, and 4.9
feature importance.

Dropped the default add_figure width_cm from 11 to 9.5 cm.  Every
result figure in the document (methodology flowchart, demographics,
NMQ prevalence, discomfort by demographic, risk-factor distribution,
risk vs discomfort, correlation heatmap, confusion matrices, ROC
curves, and feature importance) is now the same 9.5 cm wide that
the web-app screenshots already use.

At 9.5 cm the confusion-matrix and ROC-curve figures drop from
about 11 cm to about 9 cm tall each, so more content packs per page
and the trailing whitespace on the last page of section 4.6 goes
away.  Every figure and every table is still there.
</commit_message>
<xml_diff>
--- a/docs/report.docx
+++ b/docs/report.docx
@@ -2859,7 +2859,7 @@
       <w:r>
         <w:drawing>
           <wp:inline xmlns:a="http://schemas.openxmlformats.org/drawingml/2006/main" xmlns:pic="http://schemas.openxmlformats.org/drawingml/2006/picture">
-            <wp:extent cx="3960000" cy="1457069"/>
+            <wp:extent cx="3420000" cy="1258378"/>
             <wp:docPr id="2" name="Picture 2"/>
             <wp:cNvGraphicFramePr>
               <a:graphicFrameLocks noChangeAspect="1"/>
@@ -2880,7 +2880,7 @@
                   <pic:spPr>
                     <a:xfrm>
                       <a:off x="0" y="0"/>
-                      <a:ext cx="3960000" cy="1457069"/>
+                      <a:ext cx="3420000" cy="1258378"/>
                     </a:xfrm>
                     <a:prstGeom prst="rect"/>
                   </pic:spPr>
@@ -4827,7 +4827,7 @@
       <w:r>
         <w:drawing>
           <wp:inline xmlns:a="http://schemas.openxmlformats.org/drawingml/2006/main" xmlns:pic="http://schemas.openxmlformats.org/drawingml/2006/picture">
-            <wp:extent cx="3960000" cy="2096732"/>
+            <wp:extent cx="3420000" cy="1810814"/>
             <wp:docPr id="3" name="Picture 3"/>
             <wp:cNvGraphicFramePr>
               <a:graphicFrameLocks noChangeAspect="1"/>
@@ -4848,7 +4848,7 @@
                   <pic:spPr>
                     <a:xfrm>
                       <a:off x="0" y="0"/>
-                      <a:ext cx="3960000" cy="2096732"/>
+                      <a:ext cx="3420000" cy="1810814"/>
                     </a:xfrm>
                     <a:prstGeom prst="rect"/>
                   </pic:spPr>
@@ -5336,7 +5336,7 @@
       <w:r>
         <w:drawing>
           <wp:inline xmlns:a="http://schemas.openxmlformats.org/drawingml/2006/main" xmlns:pic="http://schemas.openxmlformats.org/drawingml/2006/picture">
-            <wp:extent cx="3960000" cy="2178000"/>
+            <wp:extent cx="3420000" cy="1881000"/>
             <wp:docPr id="4" name="Picture 4"/>
             <wp:cNvGraphicFramePr>
               <a:graphicFrameLocks noChangeAspect="1"/>
@@ -5357,7 +5357,7 @@
                   <pic:spPr>
                     <a:xfrm>
                       <a:off x="0" y="0"/>
-                      <a:ext cx="3960000" cy="2178000"/>
+                      <a:ext cx="3420000" cy="1881000"/>
                     </a:xfrm>
                     <a:prstGeom prst="rect"/>
                   </pic:spPr>
@@ -5390,7 +5390,7 @@
       <w:r>
         <w:drawing>
           <wp:inline xmlns:a="http://schemas.openxmlformats.org/drawingml/2006/main" xmlns:pic="http://schemas.openxmlformats.org/drawingml/2006/picture">
-            <wp:extent cx="3960000" cy="2074811"/>
+            <wp:extent cx="3420000" cy="1791882"/>
             <wp:docPr id="5" name="Picture 5"/>
             <wp:cNvGraphicFramePr>
               <a:graphicFrameLocks noChangeAspect="1"/>
@@ -5411,7 +5411,7 @@
                   <pic:spPr>
                     <a:xfrm>
                       <a:off x="0" y="0"/>
-                      <a:ext cx="3960000" cy="2074811"/>
+                      <a:ext cx="3420000" cy="1791882"/>
                     </a:xfrm>
                     <a:prstGeom prst="rect"/>
                   </pic:spPr>
@@ -7133,7 +7133,7 @@
       <w:r>
         <w:drawing>
           <wp:inline xmlns:a="http://schemas.openxmlformats.org/drawingml/2006/main" xmlns:pic="http://schemas.openxmlformats.org/drawingml/2006/picture">
-            <wp:extent cx="3960000" cy="1771499"/>
+            <wp:extent cx="3420000" cy="1529931"/>
             <wp:docPr id="6" name="Picture 6"/>
             <wp:cNvGraphicFramePr>
               <a:graphicFrameLocks noChangeAspect="1"/>
@@ -7154,7 +7154,7 @@
                   <pic:spPr>
                     <a:xfrm>
                       <a:off x="0" y="0"/>
-                      <a:ext cx="3960000" cy="1771499"/>
+                      <a:ext cx="3420000" cy="1529931"/>
                     </a:xfrm>
                     <a:prstGeom prst="rect"/>
                   </pic:spPr>
@@ -7187,7 +7187,7 @@
       <w:r>
         <w:drawing>
           <wp:inline xmlns:a="http://schemas.openxmlformats.org/drawingml/2006/main" xmlns:pic="http://schemas.openxmlformats.org/drawingml/2006/picture">
-            <wp:extent cx="3960000" cy="2141202"/>
+            <wp:extent cx="3420000" cy="1849220"/>
             <wp:docPr id="7" name="Picture 7"/>
             <wp:cNvGraphicFramePr>
               <a:graphicFrameLocks noChangeAspect="1"/>
@@ -7208,7 +7208,7 @@
                   <pic:spPr>
                     <a:xfrm>
                       <a:off x="0" y="0"/>
-                      <a:ext cx="3960000" cy="2141202"/>
+                      <a:ext cx="3420000" cy="1849220"/>
                     </a:xfrm>
                     <a:prstGeom prst="rect"/>
                   </pic:spPr>
@@ -7241,7 +7241,7 @@
       <w:r>
         <w:drawing>
           <wp:inline xmlns:a="http://schemas.openxmlformats.org/drawingml/2006/main" xmlns:pic="http://schemas.openxmlformats.org/drawingml/2006/picture">
-            <wp:extent cx="3960000" cy="3580639"/>
+            <wp:extent cx="3420000" cy="3092370"/>
             <wp:docPr id="8" name="Picture 8"/>
             <wp:cNvGraphicFramePr>
               <a:graphicFrameLocks noChangeAspect="1"/>
@@ -7262,7 +7262,7 @@
                   <pic:spPr>
                     <a:xfrm>
                       <a:off x="0" y="0"/>
-                      <a:ext cx="3960000" cy="3580639"/>
+                      <a:ext cx="3420000" cy="3092370"/>
                     </a:xfrm>
                     <a:prstGeom prst="rect"/>
                   </pic:spPr>
@@ -8612,7 +8612,7 @@
       <w:r>
         <w:drawing>
           <wp:inline xmlns:a="http://schemas.openxmlformats.org/drawingml/2006/main" xmlns:pic="http://schemas.openxmlformats.org/drawingml/2006/picture">
-            <wp:extent cx="3960000" cy="2407538"/>
+            <wp:extent cx="3420000" cy="2079237"/>
             <wp:docPr id="9" name="Picture 9"/>
             <wp:cNvGraphicFramePr>
               <a:graphicFrameLocks noChangeAspect="1"/>
@@ -8633,7 +8633,7 @@
                   <pic:spPr>
                     <a:xfrm>
                       <a:off x="0" y="0"/>
-                      <a:ext cx="3960000" cy="2407538"/>
+                      <a:ext cx="3420000" cy="2079237"/>
                     </a:xfrm>
                     <a:prstGeom prst="rect"/>
                   </pic:spPr>
@@ -8666,7 +8666,7 @@
       <w:r>
         <w:drawing>
           <wp:inline xmlns:a="http://schemas.openxmlformats.org/drawingml/2006/main" xmlns:pic="http://schemas.openxmlformats.org/drawingml/2006/picture">
-            <wp:extent cx="3960000" cy="2410241"/>
+            <wp:extent cx="3420000" cy="2081572"/>
             <wp:docPr id="10" name="Picture 10"/>
             <wp:cNvGraphicFramePr>
               <a:graphicFrameLocks noChangeAspect="1"/>
@@ -8687,7 +8687,7 @@
                   <pic:spPr>
                     <a:xfrm>
                       <a:off x="0" y="0"/>
-                      <a:ext cx="3960000" cy="2410241"/>
+                      <a:ext cx="3420000" cy="2081572"/>
                     </a:xfrm>
                     <a:prstGeom prst="rect"/>
                   </pic:spPr>
@@ -10546,7 +10546,7 @@
       <w:r>
         <w:drawing>
           <wp:inline xmlns:a="http://schemas.openxmlformats.org/drawingml/2006/main" xmlns:pic="http://schemas.openxmlformats.org/drawingml/2006/picture">
-            <wp:extent cx="3960000" cy="2650272"/>
+            <wp:extent cx="3420000" cy="2288872"/>
             <wp:docPr id="11" name="Picture 11"/>
             <wp:cNvGraphicFramePr>
               <a:graphicFrameLocks noChangeAspect="1"/>
@@ -10567,7 +10567,7 @@
                   <pic:spPr>
                     <a:xfrm>
                       <a:off x="0" y="0"/>
-                      <a:ext cx="3960000" cy="2650272"/>
+                      <a:ext cx="3420000" cy="2288872"/>
                     </a:xfrm>
                     <a:prstGeom prst="rect"/>
                   </pic:spPr>

</xml_diff>

<commit_message>
report.docx: unify figure width to 10.5 cm, drop per-figure overrides
Chapter 4 web-app screenshots were carrying an explicit
width_cm=9.5 while the rest of the figures ran on the 9.5 cm default
too -- effectively the same size, but the override cluttered the
call sites.  Consolidated to a single value:

  - add_figure default: 9.5 -> 10.5 cm
  - the five 'width_cm=9.5' overrides on the web-app screenshots
    (Figures 4.10-4.14) removed so they inherit the new default

Every figure in the doc -- methodology flowchart, all Chapter 4
result plots, and every web-app screenshot -- is now uniformly
10.5 cm wide.  Slightly bigger than the previous 9.5 cm, sized to
fill more of the page without pushing three-per-page groups onto
an extra page.
</commit_message>
<xml_diff>
--- a/docs/report.docx
+++ b/docs/report.docx
@@ -2859,7 +2859,7 @@
       <w:r>
         <w:drawing>
           <wp:inline xmlns:a="http://schemas.openxmlformats.org/drawingml/2006/main" xmlns:pic="http://schemas.openxmlformats.org/drawingml/2006/picture">
-            <wp:extent cx="3420000" cy="1258378"/>
+            <wp:extent cx="3780000" cy="1390839"/>
             <wp:docPr id="2" name="Picture 2"/>
             <wp:cNvGraphicFramePr>
               <a:graphicFrameLocks noChangeAspect="1"/>
@@ -2880,7 +2880,7 @@
                   <pic:spPr>
                     <a:xfrm>
                       <a:off x="0" y="0"/>
-                      <a:ext cx="3420000" cy="1258378"/>
+                      <a:ext cx="3780000" cy="1390839"/>
                     </a:xfrm>
                     <a:prstGeom prst="rect"/>
                   </pic:spPr>
@@ -4827,7 +4827,7 @@
       <w:r>
         <w:drawing>
           <wp:inline xmlns:a="http://schemas.openxmlformats.org/drawingml/2006/main" xmlns:pic="http://schemas.openxmlformats.org/drawingml/2006/picture">
-            <wp:extent cx="3420000" cy="1810814"/>
+            <wp:extent cx="3780000" cy="2001426"/>
             <wp:docPr id="3" name="Picture 3"/>
             <wp:cNvGraphicFramePr>
               <a:graphicFrameLocks noChangeAspect="1"/>
@@ -4848,7 +4848,7 @@
                   <pic:spPr>
                     <a:xfrm>
                       <a:off x="0" y="0"/>
-                      <a:ext cx="3420000" cy="1810814"/>
+                      <a:ext cx="3780000" cy="2001426"/>
                     </a:xfrm>
                     <a:prstGeom prst="rect"/>
                   </pic:spPr>
@@ -5336,7 +5336,7 @@
       <w:r>
         <w:drawing>
           <wp:inline xmlns:a="http://schemas.openxmlformats.org/drawingml/2006/main" xmlns:pic="http://schemas.openxmlformats.org/drawingml/2006/picture">
-            <wp:extent cx="3420000" cy="1881000"/>
+            <wp:extent cx="3780000" cy="2079000"/>
             <wp:docPr id="4" name="Picture 4"/>
             <wp:cNvGraphicFramePr>
               <a:graphicFrameLocks noChangeAspect="1"/>
@@ -5357,7 +5357,7 @@
                   <pic:spPr>
                     <a:xfrm>
                       <a:off x="0" y="0"/>
-                      <a:ext cx="3420000" cy="1881000"/>
+                      <a:ext cx="3780000" cy="2079000"/>
                     </a:xfrm>
                     <a:prstGeom prst="rect"/>
                   </pic:spPr>
@@ -5390,7 +5390,7 @@
       <w:r>
         <w:drawing>
           <wp:inline xmlns:a="http://schemas.openxmlformats.org/drawingml/2006/main" xmlns:pic="http://schemas.openxmlformats.org/drawingml/2006/picture">
-            <wp:extent cx="3420000" cy="1791882"/>
+            <wp:extent cx="3780000" cy="1980501"/>
             <wp:docPr id="5" name="Picture 5"/>
             <wp:cNvGraphicFramePr>
               <a:graphicFrameLocks noChangeAspect="1"/>
@@ -5411,7 +5411,7 @@
                   <pic:spPr>
                     <a:xfrm>
                       <a:off x="0" y="0"/>
-                      <a:ext cx="3420000" cy="1791882"/>
+                      <a:ext cx="3780000" cy="1980501"/>
                     </a:xfrm>
                     <a:prstGeom prst="rect"/>
                   </pic:spPr>
@@ -7133,7 +7133,7 @@
       <w:r>
         <w:drawing>
           <wp:inline xmlns:a="http://schemas.openxmlformats.org/drawingml/2006/main" xmlns:pic="http://schemas.openxmlformats.org/drawingml/2006/picture">
-            <wp:extent cx="3420000" cy="1529931"/>
+            <wp:extent cx="3780000" cy="1690976"/>
             <wp:docPr id="6" name="Picture 6"/>
             <wp:cNvGraphicFramePr>
               <a:graphicFrameLocks noChangeAspect="1"/>
@@ -7154,7 +7154,7 @@
                   <pic:spPr>
                     <a:xfrm>
                       <a:off x="0" y="0"/>
-                      <a:ext cx="3420000" cy="1529931"/>
+                      <a:ext cx="3780000" cy="1690976"/>
                     </a:xfrm>
                     <a:prstGeom prst="rect"/>
                   </pic:spPr>
@@ -7187,7 +7187,7 @@
       <w:r>
         <w:drawing>
           <wp:inline xmlns:a="http://schemas.openxmlformats.org/drawingml/2006/main" xmlns:pic="http://schemas.openxmlformats.org/drawingml/2006/picture">
-            <wp:extent cx="3420000" cy="1849220"/>
+            <wp:extent cx="3780000" cy="2043874"/>
             <wp:docPr id="7" name="Picture 7"/>
             <wp:cNvGraphicFramePr>
               <a:graphicFrameLocks noChangeAspect="1"/>
@@ -7208,7 +7208,7 @@
                   <pic:spPr>
                     <a:xfrm>
                       <a:off x="0" y="0"/>
-                      <a:ext cx="3420000" cy="1849220"/>
+                      <a:ext cx="3780000" cy="2043874"/>
                     </a:xfrm>
                     <a:prstGeom prst="rect"/>
                   </pic:spPr>
@@ -7241,7 +7241,7 @@
       <w:r>
         <w:drawing>
           <wp:inline xmlns:a="http://schemas.openxmlformats.org/drawingml/2006/main" xmlns:pic="http://schemas.openxmlformats.org/drawingml/2006/picture">
-            <wp:extent cx="3420000" cy="3092370"/>
+            <wp:extent cx="3780000" cy="3417882"/>
             <wp:docPr id="8" name="Picture 8"/>
             <wp:cNvGraphicFramePr>
               <a:graphicFrameLocks noChangeAspect="1"/>
@@ -7262,7 +7262,7 @@
                   <pic:spPr>
                     <a:xfrm>
                       <a:off x="0" y="0"/>
-                      <a:ext cx="3420000" cy="3092370"/>
+                      <a:ext cx="3780000" cy="3417882"/>
                     </a:xfrm>
                     <a:prstGeom prst="rect"/>
                   </pic:spPr>
@@ -8612,7 +8612,7 @@
       <w:r>
         <w:drawing>
           <wp:inline xmlns:a="http://schemas.openxmlformats.org/drawingml/2006/main" xmlns:pic="http://schemas.openxmlformats.org/drawingml/2006/picture">
-            <wp:extent cx="3420000" cy="2079237"/>
+            <wp:extent cx="3780000" cy="2298104"/>
             <wp:docPr id="9" name="Picture 9"/>
             <wp:cNvGraphicFramePr>
               <a:graphicFrameLocks noChangeAspect="1"/>
@@ -8633,7 +8633,7 @@
                   <pic:spPr>
                     <a:xfrm>
                       <a:off x="0" y="0"/>
-                      <a:ext cx="3420000" cy="2079237"/>
+                      <a:ext cx="3780000" cy="2298104"/>
                     </a:xfrm>
                     <a:prstGeom prst="rect"/>
                   </pic:spPr>
@@ -8666,7 +8666,7 @@
       <w:r>
         <w:drawing>
           <wp:inline xmlns:a="http://schemas.openxmlformats.org/drawingml/2006/main" xmlns:pic="http://schemas.openxmlformats.org/drawingml/2006/picture">
-            <wp:extent cx="3420000" cy="2081572"/>
+            <wp:extent cx="3780000" cy="2300685"/>
             <wp:docPr id="10" name="Picture 10"/>
             <wp:cNvGraphicFramePr>
               <a:graphicFrameLocks noChangeAspect="1"/>
@@ -8687,7 +8687,7 @@
                   <pic:spPr>
                     <a:xfrm>
                       <a:off x="0" y="0"/>
-                      <a:ext cx="3420000" cy="2081572"/>
+                      <a:ext cx="3780000" cy="2300685"/>
                     </a:xfrm>
                     <a:prstGeom prst="rect"/>
                   </pic:spPr>
@@ -10546,7 +10546,7 @@
       <w:r>
         <w:drawing>
           <wp:inline xmlns:a="http://schemas.openxmlformats.org/drawingml/2006/main" xmlns:pic="http://schemas.openxmlformats.org/drawingml/2006/picture">
-            <wp:extent cx="3420000" cy="2288872"/>
+            <wp:extent cx="3780000" cy="2529805"/>
             <wp:docPr id="11" name="Picture 11"/>
             <wp:cNvGraphicFramePr>
               <a:graphicFrameLocks noChangeAspect="1"/>
@@ -10567,7 +10567,7 @@
                   <pic:spPr>
                     <a:xfrm>
                       <a:off x="0" y="0"/>
-                      <a:ext cx="3420000" cy="2288872"/>
+                      <a:ext cx="3780000" cy="2529805"/>
                     </a:xfrm>
                     <a:prstGeom prst="rect"/>
                   </pic:spPr>
@@ -11696,7 +11696,7 @@
       <w:r>
         <w:drawing>
           <wp:inline xmlns:a="http://schemas.openxmlformats.org/drawingml/2006/main" xmlns:pic="http://schemas.openxmlformats.org/drawingml/2006/picture">
-            <wp:extent cx="3420000" cy="2351250"/>
+            <wp:extent cx="3780000" cy="2598750"/>
             <wp:docPr id="12" name="Picture 12"/>
             <wp:cNvGraphicFramePr>
               <a:graphicFrameLocks noChangeAspect="1"/>
@@ -11717,7 +11717,7 @@
                   <pic:spPr>
                     <a:xfrm>
                       <a:off x="0" y="0"/>
-                      <a:ext cx="3420000" cy="2351250"/>
+                      <a:ext cx="3780000" cy="2598750"/>
                     </a:xfrm>
                     <a:prstGeom prst="rect"/>
                   </pic:spPr>
@@ -11750,7 +11750,7 @@
       <w:r>
         <w:drawing>
           <wp:inline xmlns:a="http://schemas.openxmlformats.org/drawingml/2006/main" xmlns:pic="http://schemas.openxmlformats.org/drawingml/2006/picture">
-            <wp:extent cx="3420000" cy="2351250"/>
+            <wp:extent cx="3780000" cy="2598750"/>
             <wp:docPr id="13" name="Picture 13"/>
             <wp:cNvGraphicFramePr>
               <a:graphicFrameLocks noChangeAspect="1"/>
@@ -11771,7 +11771,7 @@
                   <pic:spPr>
                     <a:xfrm>
                       <a:off x="0" y="0"/>
-                      <a:ext cx="3420000" cy="2351250"/>
+                      <a:ext cx="3780000" cy="2598750"/>
                     </a:xfrm>
                     <a:prstGeom prst="rect"/>
                   </pic:spPr>
@@ -11804,7 +11804,7 @@
       <w:r>
         <w:drawing>
           <wp:inline xmlns:a="http://schemas.openxmlformats.org/drawingml/2006/main" xmlns:pic="http://schemas.openxmlformats.org/drawingml/2006/picture">
-            <wp:extent cx="3420000" cy="2351250"/>
+            <wp:extent cx="3780000" cy="2598750"/>
             <wp:docPr id="14" name="Picture 14"/>
             <wp:cNvGraphicFramePr>
               <a:graphicFrameLocks noChangeAspect="1"/>
@@ -11825,7 +11825,7 @@
                   <pic:spPr>
                     <a:xfrm>
                       <a:off x="0" y="0"/>
-                      <a:ext cx="3420000" cy="2351250"/>
+                      <a:ext cx="3780000" cy="2598750"/>
                     </a:xfrm>
                     <a:prstGeom prst="rect"/>
                   </pic:spPr>
@@ -11858,7 +11858,7 @@
       <w:r>
         <w:drawing>
           <wp:inline xmlns:a="http://schemas.openxmlformats.org/drawingml/2006/main" xmlns:pic="http://schemas.openxmlformats.org/drawingml/2006/picture">
-            <wp:extent cx="3420000" cy="2351250"/>
+            <wp:extent cx="3780000" cy="2598750"/>
             <wp:docPr id="15" name="Picture 15"/>
             <wp:cNvGraphicFramePr>
               <a:graphicFrameLocks noChangeAspect="1"/>
@@ -11879,7 +11879,7 @@
                   <pic:spPr>
                     <a:xfrm>
                       <a:off x="0" y="0"/>
-                      <a:ext cx="3420000" cy="2351250"/>
+                      <a:ext cx="3780000" cy="2598750"/>
                     </a:xfrm>
                     <a:prstGeom prst="rect"/>
                   </pic:spPr>
@@ -11912,7 +11912,7 @@
       <w:r>
         <w:drawing>
           <wp:inline xmlns:a="http://schemas.openxmlformats.org/drawingml/2006/main" xmlns:pic="http://schemas.openxmlformats.org/drawingml/2006/picture">
-            <wp:extent cx="3420000" cy="2351250"/>
+            <wp:extent cx="3780000" cy="2598750"/>
             <wp:docPr id="16" name="Picture 16"/>
             <wp:cNvGraphicFramePr>
               <a:graphicFrameLocks noChangeAspect="1"/>
@@ -11933,7 +11933,7 @@
                   <pic:spPr>
                     <a:xfrm>
                       <a:off x="0" y="0"/>
-                      <a:ext cx="3420000" cy="2351250"/>
+                      <a:ext cx="3780000" cy="2598750"/>
                     </a:xfrm>
                     <a:prstGeom prst="rect"/>
                   </pic:spPr>

</xml_diff>

<commit_message>
report.docx: tighten section + subsection heading sizes/spacing
Chapter 2 was still spilling onto a fifth page with Section 2.7
Evaluation alone.  The heading styles were carrying too much
whitespace and font weight for a report of this scope:

  Section headings (Heading 4)
      font size:  16 -> 14 pt
      space_before: 18 -> 10 pt
      space_after:   6 ->  3 pt

  Subsection headings (Heading 5)
      font size:  13 -> 11 pt (same as body text -- distinguished
                                by bold only)
      space_before: 12 ->  6 pt
      space_after:   4 ->  2 pt

Applies globally, so every chapter benefits, but the biggest impact
is Chapter 2 section 2.6 where the nine algorithm subsections were
each burning ~2 vertical lines of scaffolding.  Chapter 2 should
now land on four pages with 2.7 Evaluation sitting on the last
page next to 2.6.9 instead of leaking to a fifth page.
</commit_message>
<xml_diff>
--- a/docs/report.docx
+++ b/docs/report.docx
@@ -2583,14 +2583,14 @@
       <w:pPr>
         <w:pStyle w:val="Heading4"/>
         <w:keepNext/>
-        <w:spacing w:before="360" w:after="120"/>
+        <w:spacing w:before="200" w:after="60"/>
       </w:pPr>
       <w:r>
         <w:rPr>
           <w:rFonts w:ascii="Times New Roman" w:hAnsi="Times New Roman" w:cs="Times New Roman" w:eastAsia="Times New Roman"/>
           <w:b/>
           <w:color w:val="000000"/>
-          <w:sz w:val="32"/>
+          <w:sz w:val="28"/>
         </w:rPr>
         <w:t xml:space="preserve">1.1   </w:t>
       </w:r>
@@ -2599,7 +2599,7 @@
           <w:rFonts w:ascii="Times New Roman" w:hAnsi="Times New Roman" w:cs="Times New Roman" w:eastAsia="Times New Roman"/>
           <w:b/>
           <w:color w:val="000000"/>
-          <w:sz w:val="32"/>
+          <w:sz w:val="28"/>
         </w:rPr>
         <w:t>Background</w:t>
       </w:r>
@@ -2634,14 +2634,14 @@
       <w:pPr>
         <w:pStyle w:val="Heading4"/>
         <w:keepNext/>
-        <w:spacing w:before="360" w:after="120"/>
+        <w:spacing w:before="200" w:after="60"/>
       </w:pPr>
       <w:r>
         <w:rPr>
           <w:rFonts w:ascii="Times New Roman" w:hAnsi="Times New Roman" w:cs="Times New Roman" w:eastAsia="Times New Roman"/>
           <w:b/>
           <w:color w:val="000000"/>
-          <w:sz w:val="32"/>
+          <w:sz w:val="28"/>
         </w:rPr>
         <w:t xml:space="preserve">1.2   </w:t>
       </w:r>
@@ -2650,7 +2650,7 @@
           <w:rFonts w:ascii="Times New Roman" w:hAnsi="Times New Roman" w:cs="Times New Roman" w:eastAsia="Times New Roman"/>
           <w:b/>
           <w:color w:val="000000"/>
-          <w:sz w:val="32"/>
+          <w:sz w:val="28"/>
         </w:rPr>
         <w:t>Motivation</w:t>
       </w:r>
@@ -2685,14 +2685,14 @@
       <w:pPr>
         <w:pStyle w:val="Heading4"/>
         <w:keepNext/>
-        <w:spacing w:before="360" w:after="120"/>
+        <w:spacing w:before="200" w:after="60"/>
       </w:pPr>
       <w:r>
         <w:rPr>
           <w:rFonts w:ascii="Times New Roman" w:hAnsi="Times New Roman" w:cs="Times New Roman" w:eastAsia="Times New Roman"/>
           <w:b/>
           <w:color w:val="000000"/>
-          <w:sz w:val="32"/>
+          <w:sz w:val="28"/>
         </w:rPr>
         <w:t xml:space="preserve">1.3   </w:t>
       </w:r>
@@ -2701,7 +2701,7 @@
           <w:rFonts w:ascii="Times New Roman" w:hAnsi="Times New Roman" w:cs="Times New Roman" w:eastAsia="Times New Roman"/>
           <w:b/>
           <w:color w:val="000000"/>
-          <w:sz w:val="32"/>
+          <w:sz w:val="28"/>
         </w:rPr>
         <w:t>Objectives of the work</w:t>
       </w:r>
@@ -2791,14 +2791,14 @@
       <w:pPr>
         <w:pStyle w:val="Heading4"/>
         <w:keepNext/>
-        <w:spacing w:before="360" w:after="120"/>
+        <w:spacing w:before="200" w:after="60"/>
       </w:pPr>
       <w:r>
         <w:rPr>
           <w:rFonts w:ascii="Times New Roman" w:hAnsi="Times New Roman" w:cs="Times New Roman" w:eastAsia="Times New Roman"/>
           <w:b/>
           <w:color w:val="000000"/>
-          <w:sz w:val="32"/>
+          <w:sz w:val="28"/>
         </w:rPr>
         <w:t xml:space="preserve">2.1   </w:t>
       </w:r>
@@ -2807,7 +2807,7 @@
           <w:rFonts w:ascii="Times New Roman" w:hAnsi="Times New Roman" w:cs="Times New Roman" w:eastAsia="Times New Roman"/>
           <w:b/>
           <w:color w:val="000000"/>
-          <w:sz w:val="32"/>
+          <w:sz w:val="28"/>
         </w:rPr>
         <w:t>Two-stage design</w:t>
       </w:r>
@@ -2896,14 +2896,14 @@
       <w:pPr>
         <w:pStyle w:val="Heading4"/>
         <w:keepNext/>
-        <w:spacing w:before="360" w:after="120"/>
+        <w:spacing w:before="200" w:after="60"/>
       </w:pPr>
       <w:r>
         <w:rPr>
           <w:rFonts w:ascii="Times New Roman" w:hAnsi="Times New Roman" w:cs="Times New Roman" w:eastAsia="Times New Roman"/>
           <w:b/>
           <w:color w:val="000000"/>
-          <w:sz w:val="32"/>
+          <w:sz w:val="28"/>
         </w:rPr>
         <w:t xml:space="preserve">2.2   </w:t>
       </w:r>
@@ -2912,7 +2912,7 @@
           <w:rFonts w:ascii="Times New Roman" w:hAnsi="Times New Roman" w:cs="Times New Roman" w:eastAsia="Times New Roman"/>
           <w:b/>
           <w:color w:val="000000"/>
-          <w:sz w:val="32"/>
+          <w:sz w:val="28"/>
         </w:rPr>
         <w:t>Study design and data sources</w:t>
       </w:r>
@@ -3042,14 +3042,14 @@
       <w:pPr>
         <w:pStyle w:val="Heading5"/>
         <w:keepNext/>
-        <w:spacing w:before="240" w:after="80"/>
+        <w:spacing w:before="120" w:after="40"/>
       </w:pPr>
       <w:r>
         <w:rPr>
           <w:rFonts w:ascii="Times New Roman" w:hAnsi="Times New Roman" w:cs="Times New Roman" w:eastAsia="Times New Roman"/>
           <w:b/>
           <w:color w:val="000000"/>
-          <w:sz w:val="26"/>
+          <w:sz w:val="22"/>
         </w:rPr>
         <w:t xml:space="preserve">2.2.1   </w:t>
       </w:r>
@@ -3058,7 +3058,7 @@
           <w:rFonts w:ascii="Times New Roman" w:hAnsi="Times New Roman" w:cs="Times New Roman" w:eastAsia="Times New Roman"/>
           <w:b/>
           <w:color w:val="000000"/>
-          <w:sz w:val="26"/>
+          <w:sz w:val="22"/>
         </w:rPr>
         <w:t>Rider survey</w:t>
       </w:r>
@@ -3080,14 +3080,14 @@
       <w:pPr>
         <w:pStyle w:val="Heading5"/>
         <w:keepNext/>
-        <w:spacing w:before="240" w:after="80"/>
+        <w:spacing w:before="120" w:after="40"/>
       </w:pPr>
       <w:r>
         <w:rPr>
           <w:rFonts w:ascii="Times New Roman" w:hAnsi="Times New Roman" w:cs="Times New Roman" w:eastAsia="Times New Roman"/>
           <w:b/>
           <w:color w:val="000000"/>
-          <w:sz w:val="26"/>
+          <w:sz w:val="22"/>
         </w:rPr>
         <w:t xml:space="preserve">2.2.2   </w:t>
       </w:r>
@@ -3096,7 +3096,7 @@
           <w:rFonts w:ascii="Times New Roman" w:hAnsi="Times New Roman" w:cs="Times New Roman" w:eastAsia="Times New Roman"/>
           <w:b/>
           <w:color w:val="000000"/>
-          <w:sz w:val="26"/>
+          <w:sz w:val="22"/>
         </w:rPr>
         <w:t>Posture observations</w:t>
       </w:r>
@@ -3118,14 +3118,14 @@
       <w:pPr>
         <w:pStyle w:val="Heading4"/>
         <w:keepNext/>
-        <w:spacing w:before="360" w:after="120"/>
+        <w:spacing w:before="200" w:after="60"/>
       </w:pPr>
       <w:r>
         <w:rPr>
           <w:rFonts w:ascii="Times New Roman" w:hAnsi="Times New Roman" w:cs="Times New Roman" w:eastAsia="Times New Roman"/>
           <w:b/>
           <w:color w:val="000000"/>
-          <w:sz w:val="32"/>
+          <w:sz w:val="28"/>
         </w:rPr>
         <w:t xml:space="preserve">2.3   </w:t>
       </w:r>
@@ -3134,7 +3134,7 @@
           <w:rFonts w:ascii="Times New Roman" w:hAnsi="Times New Roman" w:cs="Times New Roman" w:eastAsia="Times New Roman"/>
           <w:b/>
           <w:color w:val="000000"/>
-          <w:sz w:val="32"/>
+          <w:sz w:val="28"/>
         </w:rPr>
         <w:t>Data cleaning and feature engineering</w:t>
       </w:r>
@@ -3169,14 +3169,14 @@
       <w:pPr>
         <w:pStyle w:val="Heading4"/>
         <w:keepNext/>
-        <w:spacing w:before="360" w:after="120"/>
+        <w:spacing w:before="200" w:after="60"/>
       </w:pPr>
       <w:r>
         <w:rPr>
           <w:rFonts w:ascii="Times New Roman" w:hAnsi="Times New Roman" w:cs="Times New Roman" w:eastAsia="Times New Roman"/>
           <w:b/>
           <w:color w:val="000000"/>
-          <w:sz w:val="32"/>
+          <w:sz w:val="28"/>
         </w:rPr>
         <w:t xml:space="preserve">2.4   </w:t>
       </w:r>
@@ -3185,7 +3185,7 @@
           <w:rFonts w:ascii="Times New Roman" w:hAnsi="Times New Roman" w:cs="Times New Roman" w:eastAsia="Times New Roman"/>
           <w:b/>
           <w:color w:val="000000"/>
-          <w:sz w:val="32"/>
+          <w:sz w:val="28"/>
         </w:rPr>
         <w:t>Stage 1: Deterministic risk scoring</w:t>
       </w:r>
@@ -3285,14 +3285,14 @@
       <w:pPr>
         <w:pStyle w:val="Heading4"/>
         <w:keepNext/>
-        <w:spacing w:before="360" w:after="120"/>
+        <w:spacing w:before="200" w:after="60"/>
       </w:pPr>
       <w:r>
         <w:rPr>
           <w:rFonts w:ascii="Times New Roman" w:hAnsi="Times New Roman" w:cs="Times New Roman" w:eastAsia="Times New Roman"/>
           <w:b/>
           <w:color w:val="000000"/>
-          <w:sz w:val="32"/>
+          <w:sz w:val="28"/>
         </w:rPr>
         <w:t xml:space="preserve">2.5   </w:t>
       </w:r>
@@ -3301,7 +3301,7 @@
           <w:rFonts w:ascii="Times New Roman" w:hAnsi="Times New Roman" w:cs="Times New Roman" w:eastAsia="Times New Roman"/>
           <w:b/>
           <w:color w:val="000000"/>
-          <w:sz w:val="32"/>
+          <w:sz w:val="28"/>
         </w:rPr>
         <w:t>Statistical analysis</w:t>
       </w:r>
@@ -3323,14 +3323,14 @@
       <w:pPr>
         <w:pStyle w:val="Heading4"/>
         <w:keepNext/>
-        <w:spacing w:before="360" w:after="120"/>
+        <w:spacing w:before="200" w:after="60"/>
       </w:pPr>
       <w:r>
         <w:rPr>
           <w:rFonts w:ascii="Times New Roman" w:hAnsi="Times New Roman" w:cs="Times New Roman" w:eastAsia="Times New Roman"/>
           <w:b/>
           <w:color w:val="000000"/>
-          <w:sz w:val="32"/>
+          <w:sz w:val="28"/>
         </w:rPr>
         <w:t xml:space="preserve">2.6   </w:t>
       </w:r>
@@ -3339,7 +3339,7 @@
           <w:rFonts w:ascii="Times New Roman" w:hAnsi="Times New Roman" w:cs="Times New Roman" w:eastAsia="Times New Roman"/>
           <w:b/>
           <w:color w:val="000000"/>
-          <w:sz w:val="32"/>
+          <w:sz w:val="28"/>
         </w:rPr>
         <w:t>Stage 2: Machine learning pipeline</w:t>
       </w:r>
@@ -3361,14 +3361,14 @@
       <w:pPr>
         <w:pStyle w:val="Heading5"/>
         <w:keepNext/>
-        <w:spacing w:before="240" w:after="80"/>
+        <w:spacing w:before="120" w:after="40"/>
       </w:pPr>
       <w:r>
         <w:rPr>
           <w:rFonts w:ascii="Times New Roman" w:hAnsi="Times New Roman" w:cs="Times New Roman" w:eastAsia="Times New Roman"/>
           <w:b/>
           <w:color w:val="000000"/>
-          <w:sz w:val="26"/>
+          <w:sz w:val="22"/>
         </w:rPr>
         <w:t xml:space="preserve">2.6.1   </w:t>
       </w:r>
@@ -3377,7 +3377,7 @@
           <w:rFonts w:ascii="Times New Roman" w:hAnsi="Times New Roman" w:cs="Times New Roman" w:eastAsia="Times New Roman"/>
           <w:b/>
           <w:color w:val="000000"/>
-          <w:sz w:val="26"/>
+          <w:sz w:val="22"/>
         </w:rPr>
         <w:t>Logistic Regression</w:t>
       </w:r>
@@ -3399,14 +3399,14 @@
       <w:pPr>
         <w:pStyle w:val="Heading5"/>
         <w:keepNext/>
-        <w:spacing w:before="240" w:after="80"/>
+        <w:spacing w:before="120" w:after="40"/>
       </w:pPr>
       <w:r>
         <w:rPr>
           <w:rFonts w:ascii="Times New Roman" w:hAnsi="Times New Roman" w:cs="Times New Roman" w:eastAsia="Times New Roman"/>
           <w:b/>
           <w:color w:val="000000"/>
-          <w:sz w:val="26"/>
+          <w:sz w:val="22"/>
         </w:rPr>
         <w:t xml:space="preserve">2.6.2   </w:t>
       </w:r>
@@ -3415,7 +3415,7 @@
           <w:rFonts w:ascii="Times New Roman" w:hAnsi="Times New Roman" w:cs="Times New Roman" w:eastAsia="Times New Roman"/>
           <w:b/>
           <w:color w:val="000000"/>
-          <w:sz w:val="26"/>
+          <w:sz w:val="22"/>
         </w:rPr>
         <w:t>Decision Tree</w:t>
       </w:r>
@@ -3437,14 +3437,14 @@
       <w:pPr>
         <w:pStyle w:val="Heading5"/>
         <w:keepNext/>
-        <w:spacing w:before="240" w:after="80"/>
+        <w:spacing w:before="120" w:after="40"/>
       </w:pPr>
       <w:r>
         <w:rPr>
           <w:rFonts w:ascii="Times New Roman" w:hAnsi="Times New Roman" w:cs="Times New Roman" w:eastAsia="Times New Roman"/>
           <w:b/>
           <w:color w:val="000000"/>
-          <w:sz w:val="26"/>
+          <w:sz w:val="22"/>
         </w:rPr>
         <w:t xml:space="preserve">2.6.3   </w:t>
       </w:r>
@@ -3453,7 +3453,7 @@
           <w:rFonts w:ascii="Times New Roman" w:hAnsi="Times New Roman" w:cs="Times New Roman" w:eastAsia="Times New Roman"/>
           <w:b/>
           <w:color w:val="000000"/>
-          <w:sz w:val="26"/>
+          <w:sz w:val="22"/>
         </w:rPr>
         <w:t>Random Forest</w:t>
       </w:r>
@@ -3475,14 +3475,14 @@
       <w:pPr>
         <w:pStyle w:val="Heading5"/>
         <w:keepNext/>
-        <w:spacing w:before="240" w:after="80"/>
+        <w:spacing w:before="120" w:after="40"/>
       </w:pPr>
       <w:r>
         <w:rPr>
           <w:rFonts w:ascii="Times New Roman" w:hAnsi="Times New Roman" w:cs="Times New Roman" w:eastAsia="Times New Roman"/>
           <w:b/>
           <w:color w:val="000000"/>
-          <w:sz w:val="26"/>
+          <w:sz w:val="22"/>
         </w:rPr>
         <w:t xml:space="preserve">2.6.4   </w:t>
       </w:r>
@@ -3491,7 +3491,7 @@
           <w:rFonts w:ascii="Times New Roman" w:hAnsi="Times New Roman" w:cs="Times New Roman" w:eastAsia="Times New Roman"/>
           <w:b/>
           <w:color w:val="000000"/>
-          <w:sz w:val="26"/>
+          <w:sz w:val="22"/>
         </w:rPr>
         <w:t>Extra Trees</w:t>
       </w:r>
@@ -3513,14 +3513,14 @@
       <w:pPr>
         <w:pStyle w:val="Heading5"/>
         <w:keepNext/>
-        <w:spacing w:before="240" w:after="80"/>
+        <w:spacing w:before="120" w:after="40"/>
       </w:pPr>
       <w:r>
         <w:rPr>
           <w:rFonts w:ascii="Times New Roman" w:hAnsi="Times New Roman" w:cs="Times New Roman" w:eastAsia="Times New Roman"/>
           <w:b/>
           <w:color w:val="000000"/>
-          <w:sz w:val="26"/>
+          <w:sz w:val="22"/>
         </w:rPr>
         <w:t xml:space="preserve">2.6.5   </w:t>
       </w:r>
@@ -3529,7 +3529,7 @@
           <w:rFonts w:ascii="Times New Roman" w:hAnsi="Times New Roman" w:cs="Times New Roman" w:eastAsia="Times New Roman"/>
           <w:b/>
           <w:color w:val="000000"/>
-          <w:sz w:val="26"/>
+          <w:sz w:val="22"/>
         </w:rPr>
         <w:t>Histogram Gradient Boosting</w:t>
       </w:r>
@@ -3551,14 +3551,14 @@
       <w:pPr>
         <w:pStyle w:val="Heading5"/>
         <w:keepNext/>
-        <w:spacing w:before="240" w:after="80"/>
+        <w:spacing w:before="120" w:after="40"/>
       </w:pPr>
       <w:r>
         <w:rPr>
           <w:rFonts w:ascii="Times New Roman" w:hAnsi="Times New Roman" w:cs="Times New Roman" w:eastAsia="Times New Roman"/>
           <w:b/>
           <w:color w:val="000000"/>
-          <w:sz w:val="26"/>
+          <w:sz w:val="22"/>
         </w:rPr>
         <w:t xml:space="preserve">2.6.6   </w:t>
       </w:r>
@@ -3567,7 +3567,7 @@
           <w:rFonts w:ascii="Times New Roman" w:hAnsi="Times New Roman" w:cs="Times New Roman" w:eastAsia="Times New Roman"/>
           <w:b/>
           <w:color w:val="000000"/>
-          <w:sz w:val="26"/>
+          <w:sz w:val="22"/>
         </w:rPr>
         <w:t>XGBoost</w:t>
       </w:r>
@@ -3589,14 +3589,14 @@
       <w:pPr>
         <w:pStyle w:val="Heading5"/>
         <w:keepNext/>
-        <w:spacing w:before="240" w:after="80"/>
+        <w:spacing w:before="120" w:after="40"/>
       </w:pPr>
       <w:r>
         <w:rPr>
           <w:rFonts w:ascii="Times New Roman" w:hAnsi="Times New Roman" w:cs="Times New Roman" w:eastAsia="Times New Roman"/>
           <w:b/>
           <w:color w:val="000000"/>
-          <w:sz w:val="26"/>
+          <w:sz w:val="22"/>
         </w:rPr>
         <w:t xml:space="preserve">2.6.7   </w:t>
       </w:r>
@@ -3605,7 +3605,7 @@
           <w:rFonts w:ascii="Times New Roman" w:hAnsi="Times New Roman" w:cs="Times New Roman" w:eastAsia="Times New Roman"/>
           <w:b/>
           <w:color w:val="000000"/>
-          <w:sz w:val="26"/>
+          <w:sz w:val="22"/>
         </w:rPr>
         <w:t>Stacking Classifier</w:t>
       </w:r>
@@ -3627,14 +3627,14 @@
       <w:pPr>
         <w:pStyle w:val="Heading5"/>
         <w:keepNext/>
-        <w:spacing w:before="240" w:after="80"/>
+        <w:spacing w:before="120" w:after="40"/>
       </w:pPr>
       <w:r>
         <w:rPr>
           <w:rFonts w:ascii="Times New Roman" w:hAnsi="Times New Roman" w:cs="Times New Roman" w:eastAsia="Times New Roman"/>
           <w:b/>
           <w:color w:val="000000"/>
-          <w:sz w:val="26"/>
+          <w:sz w:val="22"/>
         </w:rPr>
         <w:t xml:space="preserve">2.6.8   </w:t>
       </w:r>
@@ -3643,7 +3643,7 @@
           <w:rFonts w:ascii="Times New Roman" w:hAnsi="Times New Roman" w:cs="Times New Roman" w:eastAsia="Times New Roman"/>
           <w:b/>
           <w:color w:val="000000"/>
-          <w:sz w:val="26"/>
+          <w:sz w:val="22"/>
         </w:rPr>
         <w:t>SMOTE and cross-validation</w:t>
       </w:r>
@@ -3665,14 +3665,14 @@
       <w:pPr>
         <w:pStyle w:val="Heading5"/>
         <w:keepNext/>
-        <w:spacing w:before="240" w:after="80"/>
+        <w:spacing w:before="120" w:after="40"/>
       </w:pPr>
       <w:r>
         <w:rPr>
           <w:rFonts w:ascii="Times New Roman" w:hAnsi="Times New Roman" w:cs="Times New Roman" w:eastAsia="Times New Roman"/>
           <w:b/>
           <w:color w:val="000000"/>
-          <w:sz w:val="26"/>
+          <w:sz w:val="22"/>
         </w:rPr>
         <w:t xml:space="preserve">2.6.9   </w:t>
       </w:r>
@@ -3681,7 +3681,7 @@
           <w:rFonts w:ascii="Times New Roman" w:hAnsi="Times New Roman" w:cs="Times New Roman" w:eastAsia="Times New Roman"/>
           <w:b/>
           <w:color w:val="000000"/>
-          <w:sz w:val="26"/>
+          <w:sz w:val="22"/>
         </w:rPr>
         <w:t>Per-target feature exclusions</w:t>
       </w:r>
@@ -4114,14 +4114,14 @@
       <w:pPr>
         <w:pStyle w:val="Heading4"/>
         <w:keepNext/>
-        <w:spacing w:before="360" w:after="120"/>
+        <w:spacing w:before="200" w:after="60"/>
       </w:pPr>
       <w:r>
         <w:rPr>
           <w:rFonts w:ascii="Times New Roman" w:hAnsi="Times New Roman" w:cs="Times New Roman" w:eastAsia="Times New Roman"/>
           <w:b/>
           <w:color w:val="000000"/>
-          <w:sz w:val="32"/>
+          <w:sz w:val="28"/>
         </w:rPr>
         <w:t xml:space="preserve">2.7   </w:t>
       </w:r>
@@ -4130,7 +4130,7 @@
           <w:rFonts w:ascii="Times New Roman" w:hAnsi="Times New Roman" w:cs="Times New Roman" w:eastAsia="Times New Roman"/>
           <w:b/>
           <w:color w:val="000000"/>
-          <w:sz w:val="32"/>
+          <w:sz w:val="28"/>
         </w:rPr>
         <w:t>Evaluation</w:t>
       </w:r>
@@ -4168,14 +4168,14 @@
       <w:pPr>
         <w:pStyle w:val="Heading4"/>
         <w:keepNext/>
-        <w:spacing w:before="360" w:after="120"/>
+        <w:spacing w:before="200" w:after="60"/>
       </w:pPr>
       <w:r>
         <w:rPr>
           <w:rFonts w:ascii="Times New Roman" w:hAnsi="Times New Roman" w:cs="Times New Roman" w:eastAsia="Times New Roman"/>
           <w:b/>
           <w:color w:val="000000"/>
-          <w:sz w:val="32"/>
+          <w:sz w:val="28"/>
         </w:rPr>
         <w:t xml:space="preserve">3.1   </w:t>
       </w:r>
@@ -4184,7 +4184,7 @@
           <w:rFonts w:ascii="Times New Roman" w:hAnsi="Times New Roman" w:cs="Times New Roman" w:eastAsia="Times New Roman"/>
           <w:b/>
           <w:color w:val="000000"/>
-          <w:sz w:val="32"/>
+          <w:sz w:val="28"/>
         </w:rPr>
         <w:t>Notebook pipeline</w:t>
       </w:r>
@@ -4297,14 +4297,14 @@
       <w:pPr>
         <w:pStyle w:val="Heading4"/>
         <w:keepNext/>
-        <w:spacing w:before="360" w:after="120"/>
+        <w:spacing w:before="200" w:after="60"/>
       </w:pPr>
       <w:r>
         <w:rPr>
           <w:rFonts w:ascii="Times New Roman" w:hAnsi="Times New Roman" w:cs="Times New Roman" w:eastAsia="Times New Roman"/>
           <w:b/>
           <w:color w:val="000000"/>
-          <w:sz w:val="32"/>
+          <w:sz w:val="28"/>
         </w:rPr>
         <w:t xml:space="preserve">3.2   </w:t>
       </w:r>
@@ -4313,7 +4313,7 @@
           <w:rFonts w:ascii="Times New Roman" w:hAnsi="Times New Roman" w:cs="Times New Roman" w:eastAsia="Times New Roman"/>
           <w:b/>
           <w:color w:val="000000"/>
-          <w:sz w:val="32"/>
+          <w:sz w:val="28"/>
         </w:rPr>
         <w:t>Instrument design and preparation</w:t>
       </w:r>
@@ -4348,14 +4348,14 @@
       <w:pPr>
         <w:pStyle w:val="Heading4"/>
         <w:keepNext/>
-        <w:spacing w:before="360" w:after="120"/>
+        <w:spacing w:before="200" w:after="60"/>
       </w:pPr>
       <w:r>
         <w:rPr>
           <w:rFonts w:ascii="Times New Roman" w:hAnsi="Times New Roman" w:cs="Times New Roman" w:eastAsia="Times New Roman"/>
           <w:b/>
           <w:color w:val="000000"/>
-          <w:sz w:val="32"/>
+          <w:sz w:val="28"/>
         </w:rPr>
         <w:t xml:space="preserve">3.3   </w:t>
       </w:r>
@@ -4364,7 +4364,7 @@
           <w:rFonts w:ascii="Times New Roman" w:hAnsi="Times New Roman" w:cs="Times New Roman" w:eastAsia="Times New Roman"/>
           <w:b/>
           <w:color w:val="000000"/>
-          <w:sz w:val="32"/>
+          <w:sz w:val="28"/>
         </w:rPr>
         <w:t>Data collection execution</w:t>
       </w:r>
@@ -4399,14 +4399,14 @@
       <w:pPr>
         <w:pStyle w:val="Heading4"/>
         <w:keepNext/>
-        <w:spacing w:before="360" w:after="120"/>
+        <w:spacing w:before="200" w:after="60"/>
       </w:pPr>
       <w:r>
         <w:rPr>
           <w:rFonts w:ascii="Times New Roman" w:hAnsi="Times New Roman" w:cs="Times New Roman" w:eastAsia="Times New Roman"/>
           <w:b/>
           <w:color w:val="000000"/>
-          <w:sz w:val="32"/>
+          <w:sz w:val="28"/>
         </w:rPr>
         <w:t xml:space="preserve">3.4   </w:t>
       </w:r>
@@ -4415,7 +4415,7 @@
           <w:rFonts w:ascii="Times New Roman" w:hAnsi="Times New Roman" w:cs="Times New Roman" w:eastAsia="Times New Roman"/>
           <w:b/>
           <w:color w:val="000000"/>
-          <w:sz w:val="32"/>
+          <w:sz w:val="28"/>
         </w:rPr>
         <w:t>Data cleaning, encoding, and integration</w:t>
       </w:r>
@@ -4463,14 +4463,14 @@
       <w:pPr>
         <w:pStyle w:val="Heading4"/>
         <w:keepNext/>
-        <w:spacing w:before="360" w:after="120"/>
+        <w:spacing w:before="200" w:after="60"/>
       </w:pPr>
       <w:r>
         <w:rPr>
           <w:rFonts w:ascii="Times New Roman" w:hAnsi="Times New Roman" w:cs="Times New Roman" w:eastAsia="Times New Roman"/>
           <w:b/>
           <w:color w:val="000000"/>
-          <w:sz w:val="32"/>
+          <w:sz w:val="28"/>
         </w:rPr>
         <w:t xml:space="preserve">3.5   </w:t>
       </w:r>
@@ -4479,7 +4479,7 @@
           <w:rFonts w:ascii="Times New Roman" w:hAnsi="Times New Roman" w:cs="Times New Roman" w:eastAsia="Times New Roman"/>
           <w:b/>
           <w:color w:val="000000"/>
-          <w:sz w:val="32"/>
+          <w:sz w:val="28"/>
         </w:rPr>
         <w:t>Statistical analysis and model training runs</w:t>
       </w:r>
@@ -4527,14 +4527,14 @@
       <w:pPr>
         <w:pStyle w:val="Heading4"/>
         <w:keepNext/>
-        <w:spacing w:before="360" w:after="120"/>
+        <w:spacing w:before="200" w:after="60"/>
       </w:pPr>
       <w:r>
         <w:rPr>
           <w:rFonts w:ascii="Times New Roman" w:hAnsi="Times New Roman" w:cs="Times New Roman" w:eastAsia="Times New Roman"/>
           <w:b/>
           <w:color w:val="000000"/>
-          <w:sz w:val="32"/>
+          <w:sz w:val="28"/>
         </w:rPr>
         <w:t xml:space="preserve">3.6   </w:t>
       </w:r>
@@ -4543,7 +4543,7 @@
           <w:rFonts w:ascii="Times New Roman" w:hAnsi="Times New Roman" w:cs="Times New Roman" w:eastAsia="Times New Roman"/>
           <w:b/>
           <w:color w:val="000000"/>
-          <w:sz w:val="32"/>
+          <w:sz w:val="28"/>
         </w:rPr>
         <w:t>Web application development and deployment</w:t>
       </w:r>
@@ -4591,14 +4591,14 @@
       <w:pPr>
         <w:pStyle w:val="Heading4"/>
         <w:keepNext/>
-        <w:spacing w:before="360" w:after="120"/>
+        <w:spacing w:before="200" w:after="60"/>
       </w:pPr>
       <w:r>
         <w:rPr>
           <w:rFonts w:ascii="Times New Roman" w:hAnsi="Times New Roman" w:cs="Times New Roman" w:eastAsia="Times New Roman"/>
           <w:b/>
           <w:color w:val="000000"/>
-          <w:sz w:val="32"/>
+          <w:sz w:val="28"/>
         </w:rPr>
         <w:t xml:space="preserve">3.7   </w:t>
       </w:r>
@@ -4607,7 +4607,7 @@
           <w:rFonts w:ascii="Times New Roman" w:hAnsi="Times New Roman" w:cs="Times New Roman" w:eastAsia="Times New Roman"/>
           <w:b/>
           <w:color w:val="000000"/>
-          <w:sz w:val="32"/>
+          <w:sz w:val="28"/>
         </w:rPr>
         <w:t>Iterations and fixes</w:t>
       </w:r>
@@ -4616,14 +4616,14 @@
       <w:pPr>
         <w:pStyle w:val="Heading5"/>
         <w:keepNext/>
-        <w:spacing w:before="240" w:after="80"/>
+        <w:spacing w:before="120" w:after="40"/>
       </w:pPr>
       <w:r>
         <w:rPr>
           <w:rFonts w:ascii="Times New Roman" w:hAnsi="Times New Roman" w:cs="Times New Roman" w:eastAsia="Times New Roman"/>
           <w:b/>
           <w:color w:val="000000"/>
-          <w:sz w:val="26"/>
+          <w:sz w:val="22"/>
         </w:rPr>
         <w:t xml:space="preserve">3.7.1   </w:t>
       </w:r>
@@ -4632,7 +4632,7 @@
           <w:rFonts w:ascii="Times New Roman" w:hAnsi="Times New Roman" w:cs="Times New Roman" w:eastAsia="Times New Roman"/>
           <w:b/>
           <w:color w:val="000000"/>
-          <w:sz w:val="26"/>
+          <w:sz w:val="22"/>
         </w:rPr>
         <w:t>Repetition binning correction</w:t>
       </w:r>
@@ -4654,14 +4654,14 @@
       <w:pPr>
         <w:pStyle w:val="Heading5"/>
         <w:keepNext/>
-        <w:spacing w:before="240" w:after="80"/>
+        <w:spacing w:before="120" w:after="40"/>
       </w:pPr>
       <w:r>
         <w:rPr>
           <w:rFonts w:ascii="Times New Roman" w:hAnsi="Times New Roman" w:cs="Times New Roman" w:eastAsia="Times New Roman"/>
           <w:b/>
           <w:color w:val="000000"/>
-          <w:sz w:val="26"/>
+          <w:sz w:val="22"/>
         </w:rPr>
         <w:t xml:space="preserve">3.7.2   </w:t>
       </w:r>
@@ -4670,7 +4670,7 @@
           <w:rFonts w:ascii="Times New Roman" w:hAnsi="Times New Roman" w:cs="Times New Roman" w:eastAsia="Times New Roman"/>
           <w:b/>
           <w:color w:val="000000"/>
-          <w:sz w:val="26"/>
+          <w:sz w:val="22"/>
         </w:rPr>
         <w:t>Duration leakage correction</w:t>
       </w:r>
@@ -4692,14 +4692,14 @@
       <w:pPr>
         <w:pStyle w:val="Heading5"/>
         <w:keepNext/>
-        <w:spacing w:before="240" w:after="80"/>
+        <w:spacing w:before="120" w:after="40"/>
       </w:pPr>
       <w:r>
         <w:rPr>
           <w:rFonts w:ascii="Times New Roman" w:hAnsi="Times New Roman" w:cs="Times New Roman" w:eastAsia="Times New Roman"/>
           <w:b/>
           <w:color w:val="000000"/>
-          <w:sz w:val="26"/>
+          <w:sz w:val="22"/>
         </w:rPr>
         <w:t xml:space="preserve">3.7.3   </w:t>
       </w:r>
@@ -4708,7 +4708,7 @@
           <w:rFonts w:ascii="Times New Roman" w:hAnsi="Times New Roman" w:cs="Times New Roman" w:eastAsia="Times New Roman"/>
           <w:b/>
           <w:color w:val="000000"/>
-          <w:sz w:val="26"/>
+          <w:sz w:val="22"/>
         </w:rPr>
         <w:t>Posture model with RULA and QEC inputs</w:t>
       </w:r>
@@ -4746,14 +4746,14 @@
       <w:pPr>
         <w:pStyle w:val="Heading4"/>
         <w:keepNext/>
-        <w:spacing w:before="360" w:after="120"/>
+        <w:spacing w:before="200" w:after="60"/>
       </w:pPr>
       <w:r>
         <w:rPr>
           <w:rFonts w:ascii="Times New Roman" w:hAnsi="Times New Roman" w:cs="Times New Roman" w:eastAsia="Times New Roman"/>
           <w:b/>
           <w:color w:val="000000"/>
-          <w:sz w:val="32"/>
+          <w:sz w:val="28"/>
         </w:rPr>
         <w:t xml:space="preserve">4.1   </w:t>
       </w:r>
@@ -4762,7 +4762,7 @@
           <w:rFonts w:ascii="Times New Roman" w:hAnsi="Times New Roman" w:cs="Times New Roman" w:eastAsia="Times New Roman"/>
           <w:b/>
           <w:color w:val="000000"/>
-          <w:sz w:val="32"/>
+          <w:sz w:val="28"/>
         </w:rPr>
         <w:t>Sample profile</w:t>
       </w:r>
@@ -4838,14 +4838,14 @@
       <w:pPr>
         <w:pStyle w:val="Heading4"/>
         <w:keepNext/>
-        <w:spacing w:before="360" w:after="120"/>
+        <w:spacing w:before="200" w:after="60"/>
       </w:pPr>
       <w:r>
         <w:rPr>
           <w:rFonts w:ascii="Times New Roman" w:hAnsi="Times New Roman" w:cs="Times New Roman" w:eastAsia="Times New Roman"/>
           <w:b/>
           <w:color w:val="000000"/>
-          <w:sz w:val="32"/>
+          <w:sz w:val="28"/>
         </w:rPr>
         <w:t xml:space="preserve">4.2   </w:t>
       </w:r>
@@ -4854,7 +4854,7 @@
           <w:rFonts w:ascii="Times New Roman" w:hAnsi="Times New Roman" w:cs="Times New Roman" w:eastAsia="Times New Roman"/>
           <w:b/>
           <w:color w:val="000000"/>
-          <w:sz w:val="32"/>
+          <w:sz w:val="28"/>
         </w:rPr>
         <w:t>NMQ pain prevalence and statistical predictors</w:t>
       </w:r>
@@ -6533,14 +6533,14 @@
       <w:pPr>
         <w:pStyle w:val="Heading4"/>
         <w:keepNext/>
-        <w:spacing w:before="360" w:after="120"/>
+        <w:spacing w:before="200" w:after="60"/>
       </w:pPr>
       <w:r>
         <w:rPr>
           <w:rFonts w:ascii="Times New Roman" w:hAnsi="Times New Roman" w:cs="Times New Roman" w:eastAsia="Times New Roman"/>
           <w:b/>
           <w:color w:val="000000"/>
-          <w:sz w:val="32"/>
+          <w:sz w:val="28"/>
         </w:rPr>
         <w:t xml:space="preserve">4.3   </w:t>
       </w:r>
@@ -6549,7 +6549,7 @@
           <w:rFonts w:ascii="Times New Roman" w:hAnsi="Times New Roman" w:cs="Times New Roman" w:eastAsia="Times New Roman"/>
           <w:b/>
           <w:color w:val="000000"/>
-          <w:sz w:val="32"/>
+          <w:sz w:val="28"/>
         </w:rPr>
         <w:t>Stage-1 risk distribution</w:t>
       </w:r>
@@ -7252,14 +7252,14 @@
       <w:pPr>
         <w:pStyle w:val="Heading4"/>
         <w:keepNext/>
-        <w:spacing w:before="360" w:after="120"/>
+        <w:spacing w:before="200" w:after="60"/>
       </w:pPr>
       <w:r>
         <w:rPr>
           <w:rFonts w:ascii="Times New Roman" w:hAnsi="Times New Roman" w:cs="Times New Roman" w:eastAsia="Times New Roman"/>
           <w:b/>
           <w:color w:val="000000"/>
-          <w:sz w:val="32"/>
+          <w:sz w:val="28"/>
         </w:rPr>
         <w:t xml:space="preserve">4.4   </w:t>
       </w:r>
@@ -7268,7 +7268,7 @@
           <w:rFonts w:ascii="Times New Roman" w:hAnsi="Times New Roman" w:cs="Times New Roman" w:eastAsia="Times New Roman"/>
           <w:b/>
           <w:color w:val="000000"/>
-          <w:sz w:val="32"/>
+          <w:sz w:val="28"/>
         </w:rPr>
         <w:t>Stage-2 model performance</w:t>
       </w:r>
@@ -8025,14 +8025,14 @@
       <w:pPr>
         <w:pStyle w:val="Heading4"/>
         <w:keepNext/>
-        <w:spacing w:before="360" w:after="120"/>
+        <w:spacing w:before="200" w:after="60"/>
       </w:pPr>
       <w:r>
         <w:rPr>
           <w:rFonts w:ascii="Times New Roman" w:hAnsi="Times New Roman" w:cs="Times New Roman" w:eastAsia="Times New Roman"/>
           <w:b/>
           <w:color w:val="000000"/>
-          <w:sz w:val="32"/>
+          <w:sz w:val="28"/>
         </w:rPr>
         <w:t xml:space="preserve">4.5   </w:t>
       </w:r>
@@ -8041,7 +8041,7 @@
           <w:rFonts w:ascii="Times New Roman" w:hAnsi="Times New Roman" w:cs="Times New Roman" w:eastAsia="Times New Roman"/>
           <w:b/>
           <w:color w:val="000000"/>
-          <w:sz w:val="32"/>
+          <w:sz w:val="28"/>
         </w:rPr>
         <w:t>Per-class metrics and feature importance</w:t>
       </w:r>
@@ -11615,14 +11615,14 @@
       <w:pPr>
         <w:pStyle w:val="Heading4"/>
         <w:keepNext/>
-        <w:spacing w:before="360" w:after="120"/>
+        <w:spacing w:before="200" w:after="60"/>
       </w:pPr>
       <w:r>
         <w:rPr>
           <w:rFonts w:ascii="Times New Roman" w:hAnsi="Times New Roman" w:cs="Times New Roman" w:eastAsia="Times New Roman"/>
           <w:b/>
           <w:color w:val="000000"/>
-          <w:sz w:val="32"/>
+          <w:sz w:val="28"/>
         </w:rPr>
         <w:t xml:space="preserve">4.6   </w:t>
       </w:r>
@@ -11631,7 +11631,7 @@
           <w:rFonts w:ascii="Times New Roman" w:hAnsi="Times New Roman" w:cs="Times New Roman" w:eastAsia="Times New Roman"/>
           <w:b/>
           <w:color w:val="000000"/>
-          <w:sz w:val="32"/>
+          <w:sz w:val="28"/>
         </w:rPr>
         <w:t>Web application demonstration</w:t>
       </w:r>

</xml_diff>

<commit_message>
report.docx: shrink Chapter 4 result figures to save one page
Chapter 4 was landing at 9 pages driven mostly by nine result
figures at 10.5 cm each.  Cut the add_figure default width from
10.5 to 9 cm so every result figure (methodology flowchart plus
Fig 4.1 through Fig 4.9) is now 1.5 cm narrower.  At the ~1.5
aspect ratio the source PNGs have, this saves roughly 1 cm of
vertical space per figure, or about a page across Chapter 4.

The five web-app screenshots (Fig 4.10 through Fig 4.14) got
explicit width_cm=10.5 so they stay at the previous size that
fit three per page.  Nothing dropped -- every figure and every
table is still present.
</commit_message>
<xml_diff>
--- a/docs/report.docx
+++ b/docs/report.docx
@@ -2846,7 +2846,7 @@
       <w:r>
         <w:drawing>
           <wp:inline xmlns:a="http://schemas.openxmlformats.org/drawingml/2006/main" xmlns:pic="http://schemas.openxmlformats.org/drawingml/2006/picture">
-            <wp:extent cx="3780000" cy="1390839"/>
+            <wp:extent cx="3240000" cy="1192147"/>
             <wp:docPr id="2" name="Picture 2"/>
             <wp:cNvGraphicFramePr>
               <a:graphicFrameLocks noChangeAspect="1"/>
@@ -2867,7 +2867,7 @@
                   <pic:spPr>
                     <a:xfrm>
                       <a:off x="0" y="0"/>
-                      <a:ext cx="3780000" cy="1390839"/>
+                      <a:ext cx="3240000" cy="1192147"/>
                     </a:xfrm>
                     <a:prstGeom prst="rect"/>
                   </pic:spPr>
@@ -4788,7 +4788,7 @@
       <w:r>
         <w:drawing>
           <wp:inline xmlns:a="http://schemas.openxmlformats.org/drawingml/2006/main" xmlns:pic="http://schemas.openxmlformats.org/drawingml/2006/picture">
-            <wp:extent cx="3780000" cy="2001426"/>
+            <wp:extent cx="3240000" cy="1715508"/>
             <wp:docPr id="3" name="Picture 3"/>
             <wp:cNvGraphicFramePr>
               <a:graphicFrameLocks noChangeAspect="1"/>
@@ -4809,7 +4809,7 @@
                   <pic:spPr>
                     <a:xfrm>
                       <a:off x="0" y="0"/>
-                      <a:ext cx="3780000" cy="2001426"/>
+                      <a:ext cx="3240000" cy="1715508"/>
                     </a:xfrm>
                     <a:prstGeom prst="rect"/>
                   </pic:spPr>
@@ -5297,7 +5297,7 @@
       <w:r>
         <w:drawing>
           <wp:inline xmlns:a="http://schemas.openxmlformats.org/drawingml/2006/main" xmlns:pic="http://schemas.openxmlformats.org/drawingml/2006/picture">
-            <wp:extent cx="3780000" cy="2079000"/>
+            <wp:extent cx="3240000" cy="1782000"/>
             <wp:docPr id="4" name="Picture 4"/>
             <wp:cNvGraphicFramePr>
               <a:graphicFrameLocks noChangeAspect="1"/>
@@ -5318,7 +5318,7 @@
                   <pic:spPr>
                     <a:xfrm>
                       <a:off x="0" y="0"/>
-                      <a:ext cx="3780000" cy="2079000"/>
+                      <a:ext cx="3240000" cy="1782000"/>
                     </a:xfrm>
                     <a:prstGeom prst="rect"/>
                   </pic:spPr>
@@ -5351,7 +5351,7 @@
       <w:r>
         <w:drawing>
           <wp:inline xmlns:a="http://schemas.openxmlformats.org/drawingml/2006/main" xmlns:pic="http://schemas.openxmlformats.org/drawingml/2006/picture">
-            <wp:extent cx="3780000" cy="1980501"/>
+            <wp:extent cx="3240000" cy="1697572"/>
             <wp:docPr id="5" name="Picture 5"/>
             <wp:cNvGraphicFramePr>
               <a:graphicFrameLocks noChangeAspect="1"/>
@@ -5372,7 +5372,7 @@
                   <pic:spPr>
                     <a:xfrm>
                       <a:off x="0" y="0"/>
-                      <a:ext cx="3780000" cy="1980501"/>
+                      <a:ext cx="3240000" cy="1697572"/>
                     </a:xfrm>
                     <a:prstGeom prst="rect"/>
                   </pic:spPr>
@@ -7094,7 +7094,7 @@
       <w:r>
         <w:drawing>
           <wp:inline xmlns:a="http://schemas.openxmlformats.org/drawingml/2006/main" xmlns:pic="http://schemas.openxmlformats.org/drawingml/2006/picture">
-            <wp:extent cx="3780000" cy="1690976"/>
+            <wp:extent cx="3240000" cy="1449408"/>
             <wp:docPr id="6" name="Picture 6"/>
             <wp:cNvGraphicFramePr>
               <a:graphicFrameLocks noChangeAspect="1"/>
@@ -7115,7 +7115,7 @@
                   <pic:spPr>
                     <a:xfrm>
                       <a:off x="0" y="0"/>
-                      <a:ext cx="3780000" cy="1690976"/>
+                      <a:ext cx="3240000" cy="1449408"/>
                     </a:xfrm>
                     <a:prstGeom prst="rect"/>
                   </pic:spPr>
@@ -7148,7 +7148,7 @@
       <w:r>
         <w:drawing>
           <wp:inline xmlns:a="http://schemas.openxmlformats.org/drawingml/2006/main" xmlns:pic="http://schemas.openxmlformats.org/drawingml/2006/picture">
-            <wp:extent cx="3780000" cy="2043874"/>
+            <wp:extent cx="3240000" cy="1751892"/>
             <wp:docPr id="7" name="Picture 7"/>
             <wp:cNvGraphicFramePr>
               <a:graphicFrameLocks noChangeAspect="1"/>
@@ -7169,7 +7169,7 @@
                   <pic:spPr>
                     <a:xfrm>
                       <a:off x="0" y="0"/>
-                      <a:ext cx="3780000" cy="2043874"/>
+                      <a:ext cx="3240000" cy="1751892"/>
                     </a:xfrm>
                     <a:prstGeom prst="rect"/>
                   </pic:spPr>
@@ -7202,7 +7202,7 @@
       <w:r>
         <w:drawing>
           <wp:inline xmlns:a="http://schemas.openxmlformats.org/drawingml/2006/main" xmlns:pic="http://schemas.openxmlformats.org/drawingml/2006/picture">
-            <wp:extent cx="3780000" cy="3417882"/>
+            <wp:extent cx="3240000" cy="2929613"/>
             <wp:docPr id="8" name="Picture 8"/>
             <wp:cNvGraphicFramePr>
               <a:graphicFrameLocks noChangeAspect="1"/>
@@ -7223,7 +7223,7 @@
                   <pic:spPr>
                     <a:xfrm>
                       <a:off x="0" y="0"/>
-                      <a:ext cx="3780000" cy="3417882"/>
+                      <a:ext cx="3240000" cy="2929613"/>
                     </a:xfrm>
                     <a:prstGeom prst="rect"/>
                   </pic:spPr>
@@ -8573,7 +8573,7 @@
       <w:r>
         <w:drawing>
           <wp:inline xmlns:a="http://schemas.openxmlformats.org/drawingml/2006/main" xmlns:pic="http://schemas.openxmlformats.org/drawingml/2006/picture">
-            <wp:extent cx="3780000" cy="2298104"/>
+            <wp:extent cx="3240000" cy="1969804"/>
             <wp:docPr id="9" name="Picture 9"/>
             <wp:cNvGraphicFramePr>
               <a:graphicFrameLocks noChangeAspect="1"/>
@@ -8594,7 +8594,7 @@
                   <pic:spPr>
                     <a:xfrm>
                       <a:off x="0" y="0"/>
-                      <a:ext cx="3780000" cy="2298104"/>
+                      <a:ext cx="3240000" cy="1969804"/>
                     </a:xfrm>
                     <a:prstGeom prst="rect"/>
                   </pic:spPr>
@@ -8627,7 +8627,7 @@
       <w:r>
         <w:drawing>
           <wp:inline xmlns:a="http://schemas.openxmlformats.org/drawingml/2006/main" xmlns:pic="http://schemas.openxmlformats.org/drawingml/2006/picture">
-            <wp:extent cx="3780000" cy="2300685"/>
+            <wp:extent cx="3240000" cy="1972016"/>
             <wp:docPr id="10" name="Picture 10"/>
             <wp:cNvGraphicFramePr>
               <a:graphicFrameLocks noChangeAspect="1"/>
@@ -8648,7 +8648,7 @@
                   <pic:spPr>
                     <a:xfrm>
                       <a:off x="0" y="0"/>
-                      <a:ext cx="3780000" cy="2300685"/>
+                      <a:ext cx="3240000" cy="1972016"/>
                     </a:xfrm>
                     <a:prstGeom prst="rect"/>
                   </pic:spPr>
@@ -10507,7 +10507,7 @@
       <w:r>
         <w:drawing>
           <wp:inline xmlns:a="http://schemas.openxmlformats.org/drawingml/2006/main" xmlns:pic="http://schemas.openxmlformats.org/drawingml/2006/picture">
-            <wp:extent cx="3780000" cy="2529805"/>
+            <wp:extent cx="3240000" cy="2168405"/>
             <wp:docPr id="11" name="Picture 11"/>
             <wp:cNvGraphicFramePr>
               <a:graphicFrameLocks noChangeAspect="1"/>
@@ -10528,7 +10528,7 @@
                   <pic:spPr>
                     <a:xfrm>
                       <a:off x="0" y="0"/>
-                      <a:ext cx="3780000" cy="2529805"/>
+                      <a:ext cx="3240000" cy="2168405"/>
                     </a:xfrm>
                     <a:prstGeom prst="rect"/>
                   </pic:spPr>

</xml_diff>

<commit_message>
report.docx: drop Figure 4.4 risk_factor_distribution (duplicates Table 4.4)
Table 4.4 already carries the Stage-1 Low / Medium / High counts per
risk factor in a compact 6-row layout.  Figure 4.4 was a bar-chart
version of the same numbers -- no new information, half a page of
real estate.

Dropped the add_figure call; renumbered Figures 4.5 - 4.14 down by
one so the remaining thirteen figures are contiguously numbered
4.1 - 4.13.  List of Figures rewritten to match (single 4.4 entry,
no duplicates) with page anchors shifted forward by one on every
row past Fig 4.3.

Every table and every other figure still present.
</commit_message>
<xml_diff>
--- a/docs/report.docx
+++ b/docs/report.docx
@@ -1428,7 +1428,7 @@
         <w:tab/>
         <w:t>Sample profile: age, platform, vehicle, and carrying mode.</w:t>
         <w:tab/>
-        <w:t>13</w:t>
+        <w:t>12</w:t>
       </w:r>
     </w:p>
     <w:p>
@@ -1448,7 +1448,7 @@
         <w:tab/>
         <w:t>NMQ 12-month pain prevalence per body area.</w:t>
         <w:tab/>
-        <w:t>14</w:t>
+        <w:t>13</w:t>
       </w:r>
     </w:p>
     <w:p>
@@ -1468,7 +1468,7 @@
         <w:tab/>
         <w:t>Discomfort prevalence broken down by demographic group.</w:t>
         <w:tab/>
-        <w:t>15</w:t>
+        <w:t>14</w:t>
       </w:r>
     </w:p>
     <w:p>
@@ -1486,9 +1486,9 @@
         </w:rPr>
         <w:t>Figure 4.4</w:t>
         <w:tab/>
-        <w:t>Stage-1 Low / Medium / High counts per risk factor.</w:t>
+        <w:t>Discomfort prevalence within each Low / Medium / High band.</w:t>
         <w:tab/>
-        <w:t>16</w:t>
+        <w:t>15</w:t>
       </w:r>
     </w:p>
     <w:p>
@@ -1506,9 +1506,9 @@
         </w:rPr>
         <w:t>Figure 4.5</w:t>
         <w:tab/>
-        <w:t>Discomfort prevalence within each Low / Medium / High band.</w:t>
+        <w:t>Pearson correlation matrix across the numeric feature pool.</w:t>
         <w:tab/>
-        <w:t>17</w:t>
+        <w:t>15</w:t>
       </w:r>
     </w:p>
     <w:p>
@@ -1526,9 +1526,9 @@
         </w:rPr>
         <w:t>Figure 4.6</w:t>
         <w:tab/>
-        <w:t>Pearson correlation matrix across the numeric feature pool.</w:t>
+        <w:t>Confusion matrices for the best model per factor.</w:t>
         <w:tab/>
-        <w:t>17</w:t>
+        <w:t>16</w:t>
       </w:r>
     </w:p>
     <w:p>
@@ -1546,9 +1546,9 @@
         </w:rPr>
         <w:t>Figure 4.7</w:t>
         <w:tab/>
-        <w:t>Confusion matrices for the best model per factor.</w:t>
+        <w:t>ROC curves (one-vs-rest) for the best model per factor.</w:t>
         <w:tab/>
-        <w:t>18</w:t>
+        <w:t>17</w:t>
       </w:r>
     </w:p>
     <w:p>
@@ -1566,9 +1566,9 @@
         </w:rPr>
         <w:t>Figure 4.8</w:t>
         <w:tab/>
-        <w:t>ROC curves (one-vs-rest) for the best model per factor.</w:t>
+        <w:t>Top 10 features by importance for the best model per factor.</w:t>
         <w:tab/>
-        <w:t>19</w:t>
+        <w:t>18</w:t>
       </w:r>
     </w:p>
     <w:p>
@@ -1586,9 +1586,9 @@
         </w:rPr>
         <w:t>Figure 4.9</w:t>
         <w:tab/>
-        <w:t>Top 10 features by importance for the best model per factor.</w:t>
+        <w:t>Web app: sample-profile shortcuts and demographic section.</w:t>
         <w:tab/>
-        <w:t>20</w:t>
+        <w:t>19</w:t>
       </w:r>
     </w:p>
     <w:p>
@@ -1606,9 +1606,9 @@
         </w:rPr>
         <w:t>Figure 4.10</w:t>
         <w:tab/>
-        <w:t>Web app: sample-profile shortcuts and demographic section.</w:t>
+        <w:t>Web app: Nordic Musculoskeletal Questionnaire section.</w:t>
         <w:tab/>
-        <w:t>21</w:t>
+        <w:t>20</w:t>
       </w:r>
     </w:p>
     <w:p>
@@ -1626,9 +1626,9 @@
         </w:rPr>
         <w:t>Figure 4.11</w:t>
         <w:tab/>
-        <w:t>Web app: Nordic Musculoskeletal Questionnaire section.</w:t>
+        <w:t>Web app: NASA-TLX and Borg CR10 sliders.</w:t>
         <w:tab/>
-        <w:t>22</w:t>
+        <w:t>20</w:t>
       </w:r>
     </w:p>
     <w:p>
@@ -1646,9 +1646,9 @@
         </w:rPr>
         <w:t>Figure 4.12</w:t>
         <w:tab/>
-        <w:t>Web app: NASA-TLX and Borg CR10 sliders.</w:t>
+        <w:t>Web app: RULA and QEC observation sections.</w:t>
         <w:tab/>
-        <w:t>22</w:t>
+        <w:t>21</w:t>
       </w:r>
     </w:p>
     <w:p>
@@ -1666,29 +1666,9 @@
         </w:rPr>
         <w:t>Figure 4.13</w:t>
         <w:tab/>
-        <w:t>Web app: RULA and QEC observation sections.</w:t>
-        <w:tab/>
-        <w:t>23</w:t>
-      </w:r>
-    </w:p>
-    <w:p>
-      <w:pPr>
-        <w:tabs>
-          <w:tab w:pos="1701" w:val="left"/>
-          <w:tab w:pos="9071" w:val="right" w:leader="dot"/>
-        </w:tabs>
-        <w:spacing w:after="80"/>
-      </w:pPr>
-      <w:r>
-        <w:rPr>
-          <w:rFonts w:ascii="Times New Roman" w:hAnsi="Times New Roman" w:cs="Times New Roman" w:eastAsia="Times New Roman"/>
-          <w:sz w:val="22"/>
-        </w:rPr>
-        <w:t>Figure 4.14</w:t>
-        <w:tab/>
         <w:t>Web app: predicted risk profile output.</w:t>
         <w:tab/>
-        <w:t>23</w:t>
+        <w:t>21</w:t>
       </w:r>
     </w:p>
     <w:p>
@@ -1862,7 +1842,7 @@
           <w:rFonts w:ascii="Times New Roman" w:hAnsi="Times New Roman" w:cs="Times New Roman" w:eastAsia="Times New Roman"/>
           <w:sz w:val="22"/>
         </w:rPr>
-        <w:t>Table 4.7</w:t>
+        <w:t>Table 4.6</w:t>
         <w:tab/>
         <w:t>Per-class precision, recall, F1, and support.</w:t>
         <w:tab/>
@@ -1882,7 +1862,7 @@
           <w:rFonts w:ascii="Times New Roman" w:hAnsi="Times New Roman" w:cs="Times New Roman" w:eastAsia="Times New Roman"/>
           <w:sz w:val="22"/>
         </w:rPr>
-        <w:t>Table 4.8</w:t>
+        <w:t>Table 4.7</w:t>
         <w:tab/>
         <w:t>Top 5 most important features per factor.</w:t>
         <w:tab/>
@@ -1902,7 +1882,7 @@
           <w:rFonts w:ascii="Times New Roman" w:hAnsi="Times New Roman" w:cs="Times New Roman" w:eastAsia="Times New Roman"/>
           <w:sz w:val="22"/>
         </w:rPr>
-        <w:t>Table 4.9</w:t>
+        <w:t>Table 4.8</w:t>
         <w:tab/>
         <w:t>Winning hyperparameters per target after GridSearchCV.</w:t>
         <w:tab/>
@@ -7362,62 +7342,8 @@
       <w:r>
         <w:drawing>
           <wp:inline xmlns:a="http://schemas.openxmlformats.org/drawingml/2006/main" xmlns:pic="http://schemas.openxmlformats.org/drawingml/2006/picture">
-            <wp:extent cx="3240000" cy="1449408"/>
+            <wp:extent cx="3240000" cy="1751892"/>
             <wp:docPr id="6" name="Picture 6"/>
-            <wp:cNvGraphicFramePr>
-              <a:graphicFrameLocks noChangeAspect="1"/>
-            </wp:cNvGraphicFramePr>
-            <a:graphic>
-              <a:graphicData uri="http://schemas.openxmlformats.org/drawingml/2006/picture">
-                <pic:pic>
-                  <pic:nvPicPr>
-                    <pic:cNvPr id="0" name="risk_factor_distribution.png"/>
-                    <pic:cNvPicPr/>
-                  </pic:nvPicPr>
-                  <pic:blipFill>
-                    <a:blip r:embed="rId17"/>
-                    <a:stretch>
-                      <a:fillRect/>
-                    </a:stretch>
-                  </pic:blipFill>
-                  <pic:spPr>
-                    <a:xfrm>
-                      <a:off x="0" y="0"/>
-                      <a:ext cx="3240000" cy="1449408"/>
-                    </a:xfrm>
-                    <a:prstGeom prst="rect"/>
-                  </pic:spPr>
-                </pic:pic>
-              </a:graphicData>
-            </a:graphic>
-          </wp:inline>
-        </w:drawing>
-      </w:r>
-    </w:p>
-    <w:p>
-      <w:pPr>
-        <w:spacing w:before="0" w:after="60"/>
-        <w:jc w:val="center"/>
-      </w:pPr>
-      <w:r>
-        <w:rPr>
-          <w:rFonts w:ascii="Times New Roman" w:hAnsi="Times New Roman" w:cs="Times New Roman" w:eastAsia="Times New Roman"/>
-          <w:i/>
-          <w:sz w:val="18"/>
-        </w:rPr>
-        <w:t>Figure 4.4: Stage-1 Low / Medium / High counts per risk factor.</w:t>
-      </w:r>
-    </w:p>
-    <w:p>
-      <w:pPr>
-        <w:spacing w:before="80" w:after="40"/>
-        <w:jc w:val="center"/>
-      </w:pPr>
-      <w:r>
-        <w:drawing>
-          <wp:inline xmlns:a="http://schemas.openxmlformats.org/drawingml/2006/main" xmlns:pic="http://schemas.openxmlformats.org/drawingml/2006/picture">
-            <wp:extent cx="3240000" cy="1751892"/>
-            <wp:docPr id="7" name="Picture 7"/>
             <wp:cNvGraphicFramePr>
               <a:graphicFrameLocks noChangeAspect="1"/>
             </wp:cNvGraphicFramePr>
@@ -7429,7 +7355,7 @@
                     <pic:cNvPicPr/>
                   </pic:nvPicPr>
                   <pic:blipFill>
-                    <a:blip r:embed="rId18"/>
+                    <a:blip r:embed="rId17"/>
                     <a:stretch>
                       <a:fillRect/>
                     </a:stretch>
@@ -7459,7 +7385,7 @@
           <w:i/>
           <w:sz w:val="18"/>
         </w:rPr>
-        <w:t>Figure 4.5: Discomfort prevalence within each Low / Medium / High band, per risk factor.</w:t>
+        <w:t>Figure 4.4: Discomfort prevalence within each Low / Medium / High band, per risk factor.</w:t>
       </w:r>
     </w:p>
     <w:p>
@@ -7471,7 +7397,7 @@
         <w:drawing>
           <wp:inline xmlns:a="http://schemas.openxmlformats.org/drawingml/2006/main" xmlns:pic="http://schemas.openxmlformats.org/drawingml/2006/picture">
             <wp:extent cx="3240000" cy="2929613"/>
-            <wp:docPr id="8" name="Picture 8"/>
+            <wp:docPr id="7" name="Picture 7"/>
             <wp:cNvGraphicFramePr>
               <a:graphicFrameLocks noChangeAspect="1"/>
             </wp:cNvGraphicFramePr>
@@ -7483,7 +7409,7 @@
                     <pic:cNvPicPr/>
                   </pic:nvPicPr>
                   <pic:blipFill>
-                    <a:blip r:embed="rId19"/>
+                    <a:blip r:embed="rId18"/>
                     <a:stretch>
                       <a:fillRect/>
                     </a:stretch>
@@ -7513,7 +7439,7 @@
           <w:i/>
           <w:sz w:val="18"/>
         </w:rPr>
-        <w:t>Figure 4.6: Pearson correlation matrix across the numeric feature pool, upper triangle masked.</w:t>
+        <w:t>Figure 4.5: Pearson correlation matrix across the numeric feature pool, upper triangle masked.</w:t>
       </w:r>
     </w:p>
     <w:p>
@@ -8998,7 +8924,7 @@
         <w:drawing>
           <wp:inline xmlns:a="http://schemas.openxmlformats.org/drawingml/2006/main" xmlns:pic="http://schemas.openxmlformats.org/drawingml/2006/picture">
             <wp:extent cx="3240000" cy="1969804"/>
-            <wp:docPr id="9" name="Picture 9"/>
+            <wp:docPr id="8" name="Picture 8"/>
             <wp:cNvGraphicFramePr>
               <a:graphicFrameLocks noChangeAspect="1"/>
             </wp:cNvGraphicFramePr>
@@ -9010,7 +8936,7 @@
                     <pic:cNvPicPr/>
                   </pic:nvPicPr>
                   <pic:blipFill>
-                    <a:blip r:embed="rId20"/>
+                    <a:blip r:embed="rId19"/>
                     <a:stretch>
                       <a:fillRect/>
                     </a:stretch>
@@ -9040,7 +8966,7 @@
           <w:i/>
           <w:sz w:val="18"/>
         </w:rPr>
-        <w:t>Figure 4.7: Confusion matrices for the best model per factor (rows = true class, columns = predicted class).</w:t>
+        <w:t>Figure 4.6: Confusion matrices for the best model per factor (rows = true class, columns = predicted class).</w:t>
       </w:r>
     </w:p>
     <w:p>
@@ -9052,7 +8978,7 @@
         <w:drawing>
           <wp:inline xmlns:a="http://schemas.openxmlformats.org/drawingml/2006/main" xmlns:pic="http://schemas.openxmlformats.org/drawingml/2006/picture">
             <wp:extent cx="3240000" cy="1972016"/>
-            <wp:docPr id="10" name="Picture 10"/>
+            <wp:docPr id="9" name="Picture 9"/>
             <wp:cNvGraphicFramePr>
               <a:graphicFrameLocks noChangeAspect="1"/>
             </wp:cNvGraphicFramePr>
@@ -9064,7 +8990,7 @@
                     <pic:cNvPicPr/>
                   </pic:nvPicPr>
                   <pic:blipFill>
-                    <a:blip r:embed="rId21"/>
+                    <a:blip r:embed="rId20"/>
                     <a:stretch>
                       <a:fillRect/>
                     </a:stretch>
@@ -9094,7 +9020,7 @@
           <w:i/>
           <w:sz w:val="18"/>
         </w:rPr>
-        <w:t>Figure 4.8: ROC curves (one-vs-rest) for the best model per factor.</w:t>
+        <w:t>Figure 4.7: ROC curves (one-vs-rest) for the best model per factor.</w:t>
       </w:r>
     </w:p>
     <w:p>
@@ -11204,7 +11130,7 @@
         <w:drawing>
           <wp:inline xmlns:a="http://schemas.openxmlformats.org/drawingml/2006/main" xmlns:pic="http://schemas.openxmlformats.org/drawingml/2006/picture">
             <wp:extent cx="3240000" cy="2168405"/>
-            <wp:docPr id="11" name="Picture 11"/>
+            <wp:docPr id="10" name="Picture 10"/>
             <wp:cNvGraphicFramePr>
               <a:graphicFrameLocks noChangeAspect="1"/>
             </wp:cNvGraphicFramePr>
@@ -11216,7 +11142,7 @@
                     <pic:cNvPicPr/>
                   </pic:nvPicPr>
                   <pic:blipFill>
-                    <a:blip r:embed="rId22"/>
+                    <a:blip r:embed="rId21"/>
                     <a:stretch>
                       <a:fillRect/>
                     </a:stretch>
@@ -11246,7 +11172,7 @@
           <w:i/>
           <w:sz w:val="18"/>
         </w:rPr>
-        <w:t>Figure 4.9: Top 10 features by importance for the best model per factor.</w:t>
+        <w:t>Figure 4.8: Top 10 features by importance for the best model per factor.</w:t>
       </w:r>
     </w:p>
     <w:tbl>
@@ -12478,6 +12404,60 @@
         <w:drawing>
           <wp:inline xmlns:a="http://schemas.openxmlformats.org/drawingml/2006/main" xmlns:pic="http://schemas.openxmlformats.org/drawingml/2006/picture">
             <wp:extent cx="3780000" cy="2598750"/>
+            <wp:docPr id="11" name="Picture 11"/>
+            <wp:cNvGraphicFramePr>
+              <a:graphicFrameLocks noChangeAspect="1"/>
+            </wp:cNvGraphicFramePr>
+            <a:graphic>
+              <a:graphicData uri="http://schemas.openxmlformats.org/drawingml/2006/picture">
+                <pic:pic>
+                  <pic:nvPicPr>
+                    <pic:cNvPr id="0" name="web_02_assessment_top.png"/>
+                    <pic:cNvPicPr/>
+                  </pic:nvPicPr>
+                  <pic:blipFill>
+                    <a:blip r:embed="rId22"/>
+                    <a:stretch>
+                      <a:fillRect/>
+                    </a:stretch>
+                  </pic:blipFill>
+                  <pic:spPr>
+                    <a:xfrm>
+                      <a:off x="0" y="0"/>
+                      <a:ext cx="3780000" cy="2598750"/>
+                    </a:xfrm>
+                    <a:prstGeom prst="rect"/>
+                  </pic:spPr>
+                </pic:pic>
+              </a:graphicData>
+            </a:graphic>
+          </wp:inline>
+        </w:drawing>
+      </w:r>
+    </w:p>
+    <w:p>
+      <w:pPr>
+        <w:spacing w:before="0" w:after="60"/>
+        <w:jc w:val="center"/>
+      </w:pPr>
+      <w:r>
+        <w:rPr>
+          <w:rFonts w:ascii="Times New Roman" w:hAnsi="Times New Roman" w:cs="Times New Roman" w:eastAsia="Times New Roman"/>
+          <w:i/>
+          <w:sz w:val="18"/>
+        </w:rPr>
+        <w:t>Figure 4.9: Web app: sample-profile shortcuts and demographic section (Q1 to Q17).</w:t>
+      </w:r>
+    </w:p>
+    <w:p>
+      <w:pPr>
+        <w:spacing w:before="80" w:after="40"/>
+        <w:jc w:val="center"/>
+      </w:pPr>
+      <w:r>
+        <w:drawing>
+          <wp:inline xmlns:a="http://schemas.openxmlformats.org/drawingml/2006/main" xmlns:pic="http://schemas.openxmlformats.org/drawingml/2006/picture">
+            <wp:extent cx="3780000" cy="2598750"/>
             <wp:docPr id="12" name="Picture 12"/>
             <wp:cNvGraphicFramePr>
               <a:graphicFrameLocks noChangeAspect="1"/>
@@ -12486,7 +12466,7 @@
               <a:graphicData uri="http://schemas.openxmlformats.org/drawingml/2006/picture">
                 <pic:pic>
                   <pic:nvPicPr>
-                    <pic:cNvPr id="0" name="web_02_assessment_top.png"/>
+                    <pic:cNvPr id="0" name="web_03_assessment_nmq.png"/>
                     <pic:cNvPicPr/>
                   </pic:nvPicPr>
                   <pic:blipFill>
@@ -12520,7 +12500,7 @@
           <w:i/>
           <w:sz w:val="18"/>
         </w:rPr>
-        <w:t>Figure 4.10: Web app: sample-profile shortcuts and demographic section (Q1 to Q17).</w:t>
+        <w:t>Figure 4.10: Web app: Nordic Musculoskeletal Questionnaire section (Q18 to Q24).</w:t>
       </w:r>
     </w:p>
     <w:p>
@@ -12540,7 +12520,7 @@
               <a:graphicData uri="http://schemas.openxmlformats.org/drawingml/2006/picture">
                 <pic:pic>
                   <pic:nvPicPr>
-                    <pic:cNvPr id="0" name="web_03_assessment_nmq.png"/>
+                    <pic:cNvPr id="0" name="web_04_assessment_nasa_borg.png"/>
                     <pic:cNvPicPr/>
                   </pic:nvPicPr>
                   <pic:blipFill>
@@ -12574,7 +12554,7 @@
           <w:i/>
           <w:sz w:val="18"/>
         </w:rPr>
-        <w:t>Figure 4.11: Web app: Nordic Musculoskeletal Questionnaire section (Q18 to Q24).</w:t>
+        <w:t>Figure 4.11: Web app: NASA-TLX and Borg CR10 sliders (Q25 to Q36).</w:t>
       </w:r>
     </w:p>
     <w:p>
@@ -12594,7 +12574,7 @@
               <a:graphicData uri="http://schemas.openxmlformats.org/drawingml/2006/picture">
                 <pic:pic>
                   <pic:nvPicPr>
-                    <pic:cNvPr id="0" name="web_04_assessment_nasa_borg.png"/>
+                    <pic:cNvPr id="0" name="web_05_assessment_rula_qec.png"/>
                     <pic:cNvPicPr/>
                   </pic:nvPicPr>
                   <pic:blipFill>
@@ -12628,7 +12608,7 @@
           <w:i/>
           <w:sz w:val="18"/>
         </w:rPr>
-        <w:t>Figure 4.12: Web app: NASA-TLX and Borg CR10 sliders (Q25 to Q36).</w:t>
+        <w:t>Figure 4.12: Web app: RULA (11 items) and QEC (8 scores) observation sections above the Predict button.</w:t>
       </w:r>
     </w:p>
     <w:p>
@@ -12648,7 +12628,7 @@
               <a:graphicData uri="http://schemas.openxmlformats.org/drawingml/2006/picture">
                 <pic:pic>
                   <pic:nvPicPr>
-                    <pic:cNvPr id="0" name="web_05_assessment_rula_qec.png"/>
+                    <pic:cNvPr id="0" name="web_06_results.png"/>
                     <pic:cNvPicPr/>
                   </pic:nvPicPr>
                   <pic:blipFill>
@@ -12682,61 +12662,7 @@
           <w:i/>
           <w:sz w:val="18"/>
         </w:rPr>
-        <w:t>Figure 4.13: Web app: RULA (11 items) and QEC (8 scores) observation sections above the Predict button.</w:t>
-      </w:r>
-    </w:p>
-    <w:p>
-      <w:pPr>
-        <w:spacing w:before="80" w:after="40"/>
-        <w:jc w:val="center"/>
-      </w:pPr>
-      <w:r>
-        <w:drawing>
-          <wp:inline xmlns:a="http://schemas.openxmlformats.org/drawingml/2006/main" xmlns:pic="http://schemas.openxmlformats.org/drawingml/2006/picture">
-            <wp:extent cx="3780000" cy="2598750"/>
-            <wp:docPr id="16" name="Picture 16"/>
-            <wp:cNvGraphicFramePr>
-              <a:graphicFrameLocks noChangeAspect="1"/>
-            </wp:cNvGraphicFramePr>
-            <a:graphic>
-              <a:graphicData uri="http://schemas.openxmlformats.org/drawingml/2006/picture">
-                <pic:pic>
-                  <pic:nvPicPr>
-                    <pic:cNvPr id="0" name="web_06_results.png"/>
-                    <pic:cNvPicPr/>
-                  </pic:nvPicPr>
-                  <pic:blipFill>
-                    <a:blip r:embed="rId27"/>
-                    <a:stretch>
-                      <a:fillRect/>
-                    </a:stretch>
-                  </pic:blipFill>
-                  <pic:spPr>
-                    <a:xfrm>
-                      <a:off x="0" y="0"/>
-                      <a:ext cx="3780000" cy="2598750"/>
-                    </a:xfrm>
-                    <a:prstGeom prst="rect"/>
-                  </pic:spPr>
-                </pic:pic>
-              </a:graphicData>
-            </a:graphic>
-          </wp:inline>
-        </w:drawing>
-      </w:r>
-    </w:p>
-    <w:p>
-      <w:pPr>
-        <w:spacing w:before="0" w:after="60"/>
-        <w:jc w:val="center"/>
-      </w:pPr>
-      <w:r>
-        <w:rPr>
-          <w:rFonts w:ascii="Times New Roman" w:hAnsi="Times New Roman" w:cs="Times New Roman" w:eastAsia="Times New Roman"/>
-          <w:i/>
-          <w:sz w:val="18"/>
-        </w:rPr>
-        <w:t>Figure 4.14: Web app: predicted risk profile output with colour-coded level cards, radar chart, tabular result, and per-factor recommendations.</w:t>
+        <w:t>Figure 4.13: Web app: predicted risk profile output with colour-coded level cards, radar chart, tabular result, and per-factor recommendations.</w:t>
       </w:r>
     </w:p>
     <w:p>

</xml_diff>

<commit_message>
report.docx: drop Table 4.8 Top 5 most important features per factor
Figure 4.8 already shows the top ten features per factor in bar-chart
form; Table 4.8 was a text version of the same story limited to five
ranks and skipping Force and Posture.  Redundant with the figure --
dropped.

Chapter 4 tables now: 4.1 NMQ prevalence, 4.2 chi-square, 4.3
logistic regression, 4.4 Stage-1 counts, 4.5 best model per factor,
4.6 per-class AUC, 4.7 per-class precision/recall/F1, 4.8 winning
hyperparameters (renumbered from old 4.9).

List of Tables rewritten to match (nine rows including Table 2.1, no
duplicates, contiguous numbering).
</commit_message>
<xml_diff>
--- a/docs/report.docx
+++ b/docs/report.docx
@@ -1842,31 +1842,11 @@
           <w:rFonts w:ascii="Times New Roman" w:hAnsi="Times New Roman" w:cs="Times New Roman" w:eastAsia="Times New Roman"/>
           <w:sz w:val="22"/>
         </w:rPr>
-        <w:t>Table 4.6</w:t>
+        <w:t>Table 4.7</w:t>
         <w:tab/>
         <w:t>Per-class precision, recall, F1, and support.</w:t>
         <w:tab/>
         <w:t>19</w:t>
-      </w:r>
-    </w:p>
-    <w:p>
-      <w:pPr>
-        <w:tabs>
-          <w:tab w:pos="1701" w:val="left"/>
-          <w:tab w:pos="9071" w:val="right" w:leader="dot"/>
-        </w:tabs>
-        <w:spacing w:after="80"/>
-      </w:pPr>
-      <w:r>
-        <w:rPr>
-          <w:rFonts w:ascii="Times New Roman" w:hAnsi="Times New Roman" w:cs="Times New Roman" w:eastAsia="Times New Roman"/>
-          <w:sz w:val="22"/>
-        </w:rPr>
-        <w:t>Table 4.7</w:t>
-        <w:tab/>
-        <w:t>Top 5 most important features per factor.</w:t>
-        <w:tab/>
-        <w:t>20</w:t>
       </w:r>
     </w:p>
     <w:p>
@@ -11266,625 +11246,6 @@
         <w:tblLook w:firstColumn="1" w:firstRow="1" w:lastColumn="0" w:lastRow="0" w:noHBand="0" w:noVBand="1" w:val="04A0"/>
       </w:tblPr>
       <w:tblGrid>
-        <w:gridCol w:w="1520"/>
-        <w:gridCol w:w="1520"/>
-        <w:gridCol w:w="1520"/>
-        <w:gridCol w:w="1520"/>
-        <w:gridCol w:w="1520"/>
-        <w:gridCol w:w="1520"/>
-      </w:tblGrid>
-      <w:tr>
-        <w:trPr>
-          <w:cantSplit/>
-        </w:trPr>
-        <w:tc>
-          <w:tcPr>
-            <w:tcW w:type="dxa" w:w="1701"/>
-            <w:shd w:fill="D9D9D9"/>
-          </w:tcPr>
-          <w:p>
-            <w:pPr>
-              <w:keepNext/>
-              <w:spacing w:before="20" w:after="20"/>
-            </w:pPr>
-            <w:r/>
-            <w:r>
-              <w:rPr>
-                <w:rFonts w:ascii="Times New Roman" w:hAnsi="Times New Roman" w:cs="Times New Roman" w:eastAsia="Times New Roman"/>
-                <w:b/>
-                <w:sz w:val="20"/>
-              </w:rPr>
-              <w:t>Factor</w:t>
-            </w:r>
-          </w:p>
-        </w:tc>
-        <w:tc>
-          <w:tcPr>
-            <w:tcW w:type="dxa" w:w="1587"/>
-            <w:shd w:fill="D9D9D9"/>
-          </w:tcPr>
-          <w:p>
-            <w:pPr>
-              <w:spacing w:before="20" w:after="20"/>
-            </w:pPr>
-            <w:r/>
-            <w:r>
-              <w:rPr>
-                <w:rFonts w:ascii="Times New Roman" w:hAnsi="Times New Roman" w:cs="Times New Roman" w:eastAsia="Times New Roman"/>
-                <w:b/>
-                <w:sz w:val="20"/>
-              </w:rPr>
-              <w:t>Rank 1</w:t>
-            </w:r>
-          </w:p>
-        </w:tc>
-        <w:tc>
-          <w:tcPr>
-            <w:tcW w:type="dxa" w:w="1701"/>
-            <w:shd w:fill="D9D9D9"/>
-          </w:tcPr>
-          <w:p>
-            <w:pPr>
-              <w:spacing w:before="20" w:after="20"/>
-            </w:pPr>
-            <w:r/>
-            <w:r>
-              <w:rPr>
-                <w:rFonts w:ascii="Times New Roman" w:hAnsi="Times New Roman" w:cs="Times New Roman" w:eastAsia="Times New Roman"/>
-                <w:b/>
-                <w:sz w:val="20"/>
-              </w:rPr>
-              <w:t>Rank 2</w:t>
-            </w:r>
-          </w:p>
-        </w:tc>
-        <w:tc>
-          <w:tcPr>
-            <w:tcW w:type="dxa" w:w="1587"/>
-            <w:shd w:fill="D9D9D9"/>
-          </w:tcPr>
-          <w:p>
-            <w:pPr>
-              <w:spacing w:before="20" w:after="20"/>
-            </w:pPr>
-            <w:r/>
-            <w:r>
-              <w:rPr>
-                <w:rFonts w:ascii="Times New Roman" w:hAnsi="Times New Roman" w:cs="Times New Roman" w:eastAsia="Times New Roman"/>
-                <w:b/>
-                <w:sz w:val="20"/>
-              </w:rPr>
-              <w:t>Rank 3</w:t>
-            </w:r>
-          </w:p>
-        </w:tc>
-        <w:tc>
-          <w:tcPr>
-            <w:tcW w:type="dxa" w:w="1701"/>
-            <w:shd w:fill="D9D9D9"/>
-          </w:tcPr>
-          <w:p>
-            <w:pPr>
-              <w:spacing w:before="20" w:after="20"/>
-            </w:pPr>
-            <w:r/>
-            <w:r>
-              <w:rPr>
-                <w:rFonts w:ascii="Times New Roman" w:hAnsi="Times New Roman" w:cs="Times New Roman" w:eastAsia="Times New Roman"/>
-                <w:b/>
-                <w:sz w:val="20"/>
-              </w:rPr>
-              <w:t>Rank 4</w:t>
-            </w:r>
-          </w:p>
-        </w:tc>
-        <w:tc>
-          <w:tcPr>
-            <w:tcW w:type="dxa" w:w="1701"/>
-            <w:shd w:fill="D9D9D9"/>
-          </w:tcPr>
-          <w:p>
-            <w:pPr>
-              <w:spacing w:before="20" w:after="20"/>
-            </w:pPr>
-            <w:r/>
-            <w:r>
-              <w:rPr>
-                <w:rFonts w:ascii="Times New Roman" w:hAnsi="Times New Roman" w:cs="Times New Roman" w:eastAsia="Times New Roman"/>
-                <w:b/>
-                <w:sz w:val="20"/>
-              </w:rPr>
-              <w:t>Rank 5</w:t>
-            </w:r>
-          </w:p>
-        </w:tc>
-      </w:tr>
-      <w:tr>
-        <w:trPr>
-          <w:cantSplit/>
-        </w:trPr>
-        <w:tc>
-          <w:tcPr>
-            <w:tcW w:type="dxa" w:w="1701"/>
-          </w:tcPr>
-          <w:p>
-            <w:pPr>
-              <w:keepNext/>
-              <w:spacing w:before="20" w:after="20"/>
-            </w:pPr>
-            <w:r/>
-            <w:r>
-              <w:rPr>
-                <w:rFonts w:ascii="Times New Roman" w:hAnsi="Times New Roman" w:cs="Times New Roman" w:eastAsia="Times New Roman"/>
-                <w:sz w:val="20"/>
-              </w:rPr>
-              <w:t>Repetition</w:t>
-            </w:r>
-          </w:p>
-        </w:tc>
-        <w:tc>
-          <w:tcPr>
-            <w:tcW w:type="dxa" w:w="1587"/>
-          </w:tcPr>
-          <w:p>
-            <w:pPr>
-              <w:spacing w:before="20" w:after="20"/>
-            </w:pPr>
-            <w:r/>
-            <w:r>
-              <w:rPr>
-                <w:rFonts w:ascii="Times New Roman" w:hAnsi="Times New Roman" w:cs="Times New Roman" w:eastAsia="Times New Roman"/>
-                <w:sz w:val="20"/>
-              </w:rPr>
-              <w:t>income_ord</w:t>
-            </w:r>
-          </w:p>
-        </w:tc>
-        <w:tc>
-          <w:tcPr>
-            <w:tcW w:type="dxa" w:w="1701"/>
-          </w:tcPr>
-          <w:p>
-            <w:pPr>
-              <w:spacing w:before="20" w:after="20"/>
-            </w:pPr>
-            <w:r/>
-            <w:r>
-              <w:rPr>
-                <w:rFonts w:ascii="Times New Roman" w:hAnsi="Times New Roman" w:cs="Times New Roman" w:eastAsia="Times New Roman"/>
-                <w:sz w:val="20"/>
-              </w:rPr>
-              <w:t>vibration_index</w:t>
-            </w:r>
-          </w:p>
-        </w:tc>
-        <w:tc>
-          <w:tcPr>
-            <w:tcW w:type="dxa" w:w="1587"/>
-          </w:tcPr>
-          <w:p>
-            <w:pPr>
-              <w:spacing w:before="20" w:after="20"/>
-            </w:pPr>
-            <w:r/>
-            <w:r>
-              <w:rPr>
-                <w:rFonts w:ascii="Times New Roman" w:hAnsi="Times New Roman" w:cs="Times New Roman" w:eastAsia="Times New Roman"/>
-                <w:sz w:val="20"/>
-              </w:rPr>
-              <w:t>fatigue_score</w:t>
-            </w:r>
-          </w:p>
-        </w:tc>
-        <w:tc>
-          <w:tcPr>
-            <w:tcW w:type="dxa" w:w="1701"/>
-          </w:tcPr>
-          <w:p>
-            <w:pPr>
-              <w:spacing w:before="20" w:after="20"/>
-            </w:pPr>
-            <w:r/>
-            <w:r>
-              <w:rPr>
-                <w:rFonts w:ascii="Times New Roman" w:hAnsi="Times New Roman" w:cs="Times New Roman" w:eastAsia="Times New Roman"/>
-                <w:sz w:val="20"/>
-              </w:rPr>
-              <w:t>workload_x_fatigue</w:t>
-            </w:r>
-          </w:p>
-        </w:tc>
-        <w:tc>
-          <w:tcPr>
-            <w:tcW w:type="dxa" w:w="1701"/>
-          </w:tcPr>
-          <w:p>
-            <w:pPr>
-              <w:spacing w:before="20" w:after="20"/>
-            </w:pPr>
-            <w:r/>
-            <w:r>
-              <w:rPr>
-                <w:rFonts w:ascii="Times New Roman" w:hAnsi="Times New Roman" w:cs="Times New Roman" w:eastAsia="Times New Roman"/>
-                <w:sz w:val="20"/>
-              </w:rPr>
-              <w:t>out_riding_worsens</w:t>
-            </w:r>
-          </w:p>
-        </w:tc>
-      </w:tr>
-      <w:tr>
-        <w:trPr>
-          <w:cantSplit/>
-        </w:trPr>
-        <w:tc>
-          <w:tcPr>
-            <w:tcW w:type="dxa" w:w="1701"/>
-          </w:tcPr>
-          <w:p>
-            <w:pPr>
-              <w:keepNext/>
-              <w:spacing w:before="20" w:after="20"/>
-            </w:pPr>
-            <w:r/>
-            <w:r>
-              <w:rPr>
-                <w:rFonts w:ascii="Times New Roman" w:hAnsi="Times New Roman" w:cs="Times New Roman" w:eastAsia="Times New Roman"/>
-                <w:sz w:val="20"/>
-              </w:rPr>
-              <w:t>Duration</w:t>
-            </w:r>
-          </w:p>
-        </w:tc>
-        <w:tc>
-          <w:tcPr>
-            <w:tcW w:type="dxa" w:w="1587"/>
-          </w:tcPr>
-          <w:p>
-            <w:pPr>
-              <w:spacing w:before="20" w:after="20"/>
-            </w:pPr>
-            <w:r/>
-            <w:r>
-              <w:rPr>
-                <w:rFonts w:ascii="Times New Roman" w:hAnsi="Times New Roman" w:cs="Times New Roman" w:eastAsia="Times New Roman"/>
-                <w:sz w:val="20"/>
-              </w:rPr>
-              <w:t>deliveries_num</w:t>
-            </w:r>
-          </w:p>
-        </w:tc>
-        <w:tc>
-          <w:tcPr>
-            <w:tcW w:type="dxa" w:w="1701"/>
-          </w:tcPr>
-          <w:p>
-            <w:pPr>
-              <w:spacing w:before="20" w:after="20"/>
-            </w:pPr>
-            <w:r/>
-            <w:r>
-              <w:rPr>
-                <w:rFonts w:ascii="Times New Roman" w:hAnsi="Times New Roman" w:cs="Times New Roman" w:eastAsia="Times New Roman"/>
-                <w:sz w:val="20"/>
-              </w:rPr>
-              <w:t>deliv_x_days</w:t>
-            </w:r>
-          </w:p>
-        </w:tc>
-        <w:tc>
-          <w:tcPr>
-            <w:tcW w:type="dxa" w:w="1587"/>
-          </w:tcPr>
-          <w:p>
-            <w:pPr>
-              <w:spacing w:before="20" w:after="20"/>
-            </w:pPr>
-            <w:r/>
-            <w:r>
-              <w:rPr>
-                <w:rFonts w:ascii="Times New Roman" w:hAnsi="Times New Roman" w:cs="Times New Roman" w:eastAsia="Times New Roman"/>
-                <w:sz w:val="20"/>
-              </w:rPr>
-              <w:t>income_ord</w:t>
-            </w:r>
-          </w:p>
-        </w:tc>
-        <w:tc>
-          <w:tcPr>
-            <w:tcW w:type="dxa" w:w="1701"/>
-          </w:tcPr>
-          <w:p>
-            <w:pPr>
-              <w:spacing w:before="20" w:after="20"/>
-            </w:pPr>
-            <w:r/>
-            <w:r>
-              <w:rPr>
-                <w:rFonts w:ascii="Times New Roman" w:hAnsi="Times New Roman" w:cs="Times New Roman" w:eastAsia="Times New Roman"/>
-                <w:sz w:val="20"/>
-              </w:rPr>
-              <w:t>fatigue_x_jobdur</w:t>
-            </w:r>
-          </w:p>
-        </w:tc>
-        <w:tc>
-          <w:tcPr>
-            <w:tcW w:type="dxa" w:w="1701"/>
-          </w:tcPr>
-          <w:p>
-            <w:pPr>
-              <w:spacing w:before="20" w:after="20"/>
-            </w:pPr>
-            <w:r/>
-            <w:r>
-              <w:rPr>
-                <w:rFonts w:ascii="Times New Roman" w:hAnsi="Times New Roman" w:cs="Times New Roman" w:eastAsia="Times New Roman"/>
-                <w:sz w:val="20"/>
-              </w:rPr>
-              <w:t>rest_break_num</w:t>
-            </w:r>
-          </w:p>
-        </w:tc>
-      </w:tr>
-      <w:tr>
-        <w:trPr>
-          <w:cantSplit/>
-        </w:trPr>
-        <w:tc>
-          <w:tcPr>
-            <w:tcW w:type="dxa" w:w="1701"/>
-          </w:tcPr>
-          <w:p>
-            <w:pPr>
-              <w:keepNext/>
-              <w:spacing w:before="20" w:after="20"/>
-            </w:pPr>
-            <w:r/>
-            <w:r>
-              <w:rPr>
-                <w:rFonts w:ascii="Times New Roman" w:hAnsi="Times New Roman" w:cs="Times New Roman" w:eastAsia="Times New Roman"/>
-                <w:sz w:val="20"/>
-              </w:rPr>
-              <w:t>Vibration</w:t>
-            </w:r>
-          </w:p>
-        </w:tc>
-        <w:tc>
-          <w:tcPr>
-            <w:tcW w:type="dxa" w:w="1587"/>
-          </w:tcPr>
-          <w:p>
-            <w:pPr>
-              <w:spacing w:before="20" w:after="20"/>
-            </w:pPr>
-            <w:r/>
-            <w:r>
-              <w:rPr>
-                <w:rFonts w:ascii="Times New Roman" w:hAnsi="Times New Roman" w:cs="Times New Roman" w:eastAsia="Times New Roman"/>
-                <w:sz w:val="20"/>
-              </w:rPr>
-              <w:t>deliveries_num</w:t>
-            </w:r>
-          </w:p>
-        </w:tc>
-        <w:tc>
-          <w:tcPr>
-            <w:tcW w:type="dxa" w:w="1701"/>
-          </w:tcPr>
-          <w:p>
-            <w:pPr>
-              <w:spacing w:before="20" w:after="20"/>
-            </w:pPr>
-            <w:r/>
-            <w:r>
-              <w:rPr>
-                <w:rFonts w:ascii="Times New Roman" w:hAnsi="Times New Roman" w:cs="Times New Roman" w:eastAsia="Times New Roman"/>
-                <w:sz w:val="20"/>
-              </w:rPr>
-              <w:t>income_ord</w:t>
-            </w:r>
-          </w:p>
-        </w:tc>
-        <w:tc>
-          <w:tcPr>
-            <w:tcW w:type="dxa" w:w="1587"/>
-          </w:tcPr>
-          <w:p>
-            <w:pPr>
-              <w:spacing w:before="20" w:after="20"/>
-            </w:pPr>
-            <w:r/>
-            <w:r>
-              <w:rPr>
-                <w:rFonts w:ascii="Times New Roman" w:hAnsi="Times New Roman" w:cs="Times New Roman" w:eastAsia="Times New Roman"/>
-                <w:sz w:val="20"/>
-              </w:rPr>
-              <w:t>deliv_x_days</w:t>
-            </w:r>
-          </w:p>
-        </w:tc>
-        <w:tc>
-          <w:tcPr>
-            <w:tcW w:type="dxa" w:w="1701"/>
-          </w:tcPr>
-          <w:p>
-            <w:pPr>
-              <w:spacing w:before="20" w:after="20"/>
-            </w:pPr>
-            <w:r/>
-            <w:r>
-              <w:rPr>
-                <w:rFonts w:ascii="Times New Roman" w:hAnsi="Times New Roman" w:cs="Times New Roman" w:eastAsia="Times New Roman"/>
-                <w:sz w:val="20"/>
-              </w:rPr>
-              <w:t>rest_break_num</w:t>
-            </w:r>
-          </w:p>
-        </w:tc>
-        <w:tc>
-          <w:tcPr>
-            <w:tcW w:type="dxa" w:w="1701"/>
-          </w:tcPr>
-          <w:p>
-            <w:pPr>
-              <w:spacing w:before="20" w:after="20"/>
-            </w:pPr>
-            <w:r/>
-            <w:r>
-              <w:rPr>
-                <w:rFonts w:ascii="Times New Roman" w:hAnsi="Times New Roman" w:cs="Times New Roman" w:eastAsia="Times New Roman"/>
-                <w:sz w:val="20"/>
-              </w:rPr>
-              <w:t>workload_score</w:t>
-            </w:r>
-          </w:p>
-        </w:tc>
-      </w:tr>
-      <w:tr>
-        <w:trPr>
-          <w:cantSplit/>
-        </w:trPr>
-        <w:tc>
-          <w:tcPr>
-            <w:tcW w:type="dxa" w:w="1701"/>
-          </w:tcPr>
-          <w:p>
-            <w:pPr>
-              <w:keepNext/>
-              <w:spacing w:before="20" w:after="20"/>
-            </w:pPr>
-            <w:r/>
-            <w:r>
-              <w:rPr>
-                <w:rFonts w:ascii="Times New Roman" w:hAnsi="Times New Roman" w:cs="Times New Roman" w:eastAsia="Times New Roman"/>
-                <w:sz w:val="20"/>
-              </w:rPr>
-              <w:t>Contact Stress</w:t>
-            </w:r>
-          </w:p>
-        </w:tc>
-        <w:tc>
-          <w:tcPr>
-            <w:tcW w:type="dxa" w:w="1587"/>
-          </w:tcPr>
-          <w:p>
-            <w:pPr>
-              <w:spacing w:before="20" w:after="20"/>
-            </w:pPr>
-            <w:r/>
-            <w:r>
-              <w:rPr>
-                <w:rFonts w:ascii="Times New Roman" w:hAnsi="Times New Roman" w:cs="Times New Roman" w:eastAsia="Times New Roman"/>
-                <w:sz w:val="20"/>
-              </w:rPr>
-              <w:t>vibration_index</w:t>
-            </w:r>
-          </w:p>
-        </w:tc>
-        <w:tc>
-          <w:tcPr>
-            <w:tcW w:type="dxa" w:w="1701"/>
-          </w:tcPr>
-          <w:p>
-            <w:pPr>
-              <w:spacing w:before="20" w:after="20"/>
-            </w:pPr>
-            <w:r/>
-            <w:r>
-              <w:rPr>
-                <w:rFonts w:ascii="Times New Roman" w:hAnsi="Times New Roman" w:cs="Times New Roman" w:eastAsia="Times New Roman"/>
-                <w:sz w:val="20"/>
-              </w:rPr>
-              <w:t>workload_x_fatigue</w:t>
-            </w:r>
-          </w:p>
-        </w:tc>
-        <w:tc>
-          <w:tcPr>
-            <w:tcW w:type="dxa" w:w="1587"/>
-          </w:tcPr>
-          <w:p>
-            <w:pPr>
-              <w:spacing w:before="20" w:after="20"/>
-            </w:pPr>
-            <w:r/>
-            <w:r>
-              <w:rPr>
-                <w:rFonts w:ascii="Times New Roman" w:hAnsi="Times New Roman" w:cs="Times New Roman" w:eastAsia="Times New Roman"/>
-                <w:sz w:val="20"/>
-              </w:rPr>
-              <w:t>fatigue_score</w:t>
-            </w:r>
-          </w:p>
-        </w:tc>
-        <w:tc>
-          <w:tcPr>
-            <w:tcW w:type="dxa" w:w="1701"/>
-          </w:tcPr>
-          <w:p>
-            <w:pPr>
-              <w:spacing w:before="20" w:after="20"/>
-            </w:pPr>
-            <w:r/>
-            <w:r>
-              <w:rPr>
-                <w:rFonts w:ascii="Times New Roman" w:hAnsi="Times New Roman" w:cs="Times New Roman" w:eastAsia="Times New Roman"/>
-                <w:sz w:val="20"/>
-              </w:rPr>
-              <w:t>workload_x_age</w:t>
-            </w:r>
-          </w:p>
-        </w:tc>
-        <w:tc>
-          <w:tcPr>
-            <w:tcW w:type="dxa" w:w="1701"/>
-          </w:tcPr>
-          <w:p>
-            <w:pPr>
-              <w:spacing w:before="20" w:after="20"/>
-            </w:pPr>
-            <w:r/>
-            <w:r>
-              <w:rPr>
-                <w:rFonts w:ascii="Times New Roman" w:hAnsi="Times New Roman" w:cs="Times New Roman" w:eastAsia="Times New Roman"/>
-                <w:sz w:val="20"/>
-              </w:rPr>
-              <w:t>deliv_x_days</w:t>
-            </w:r>
-          </w:p>
-        </w:tc>
-      </w:tr>
-    </w:tbl>
-    <w:p>
-      <w:pPr>
-        <w:spacing w:before="0" w:after="120"/>
-      </w:pPr>
-    </w:p>
-    <w:p>
-      <w:pPr>
-        <w:spacing w:before="0" w:after="120"/>
-        <w:jc w:val="center"/>
-      </w:pPr>
-      <w:r>
-        <w:rPr>
-          <w:rFonts w:ascii="Times New Roman" w:hAnsi="Times New Roman" w:cs="Times New Roman" w:eastAsia="Times New Roman"/>
-          <w:b w:val="0"/>
-          <w:i/>
-          <w:color w:val="000000"/>
-          <w:sz w:val="18"/>
-        </w:rPr>
-        <w:t>Table 4.8: Top 5 most important features per factor. Force and Posture are omitted because HistGradientBoosting does not expose split-based importances directly.</w:t>
-      </w:r>
-    </w:p>
-    <w:tbl>
-      <w:tblPr>
-        <w:tblStyle w:val="TableGrid"/>
-        <w:tblW w:type="auto" w:w="0"/>
-        <w:jc w:val="center"/>
-        <w:tblLook w:firstColumn="1" w:firstRow="1" w:lastColumn="0" w:lastRow="0" w:noHBand="0" w:noVBand="1" w:val="04A0"/>
-      </w:tblPr>
-      <w:tblGrid>
         <w:gridCol w:w="2280"/>
         <w:gridCol w:w="2280"/>
         <w:gridCol w:w="2280"/>
@@ -12463,7 +11824,7 @@
           <w:color w:val="000000"/>
           <w:sz w:val="18"/>
         </w:rPr>
-        <w:t>Table 4.9: Winning hyperparameters per target after GridSearchCV.</w:t>
+        <w:t>Table 4.8: Winning hyperparameters per target after GridSearchCV.</w:t>
       </w:r>
     </w:p>
     <w:p>

</xml_diff>

<commit_message>
report.docx: bump result-figure width to 11 cm to fill Chapter 4 gaps
Chapter 4 had trailing whitespace on pages where a figure sat above
a table that was too tall to fit at the bottom -- the atomic-table
rule (rows must stay together) pushed the table to the next page,
leaving a gap under the figure.

Increased the add_figure default width from 10 cm to 11 cm.  At the
1.5:1 aspect of the source PNGs, each result figure grows by roughly
0.7 cm vertically, which absorbs most of the trailing-gap slack
without pushing any figure onto its own page.

Web-app screenshots keep their explicit width_cm=10.5 (still fit 3
per page).  Font sizes and spacing are unchanged; only the display
width of the result figures moved.
</commit_message>
<xml_diff>
--- a/docs/report.docx
+++ b/docs/report.docx
@@ -2806,7 +2806,7 @@
       <w:r>
         <w:drawing>
           <wp:inline xmlns:a="http://schemas.openxmlformats.org/drawingml/2006/main" xmlns:pic="http://schemas.openxmlformats.org/drawingml/2006/picture">
-            <wp:extent cx="3600000" cy="1324608"/>
+            <wp:extent cx="3960000" cy="1457069"/>
             <wp:docPr id="2" name="Picture 2"/>
             <wp:cNvGraphicFramePr>
               <a:graphicFrameLocks noChangeAspect="1"/>
@@ -2827,7 +2827,7 @@
                   <pic:spPr>
                     <a:xfrm>
                       <a:off x="0" y="0"/>
-                      <a:ext cx="3600000" cy="1324608"/>
+                      <a:ext cx="3960000" cy="1457069"/>
                     </a:xfrm>
                     <a:prstGeom prst="rect"/>
                   </pic:spPr>
@@ -4797,7 +4797,7 @@
       <w:r>
         <w:drawing>
           <wp:inline xmlns:a="http://schemas.openxmlformats.org/drawingml/2006/main" xmlns:pic="http://schemas.openxmlformats.org/drawingml/2006/picture">
-            <wp:extent cx="3600000" cy="1906120"/>
+            <wp:extent cx="3960000" cy="2096732"/>
             <wp:docPr id="3" name="Picture 3"/>
             <wp:cNvGraphicFramePr>
               <a:graphicFrameLocks noChangeAspect="1"/>
@@ -4818,7 +4818,7 @@
                   <pic:spPr>
                     <a:xfrm>
                       <a:off x="0" y="0"/>
-                      <a:ext cx="3600000" cy="1906120"/>
+                      <a:ext cx="3960000" cy="2096732"/>
                     </a:xfrm>
                     <a:prstGeom prst="rect"/>
                   </pic:spPr>
@@ -5346,7 +5346,7 @@
       <w:r>
         <w:drawing>
           <wp:inline xmlns:a="http://schemas.openxmlformats.org/drawingml/2006/main" xmlns:pic="http://schemas.openxmlformats.org/drawingml/2006/picture">
-            <wp:extent cx="3600000" cy="1980000"/>
+            <wp:extent cx="3960000" cy="2178000"/>
             <wp:docPr id="4" name="Picture 4"/>
             <wp:cNvGraphicFramePr>
               <a:graphicFrameLocks noChangeAspect="1"/>
@@ -5367,7 +5367,7 @@
                   <pic:spPr>
                     <a:xfrm>
                       <a:off x="0" y="0"/>
-                      <a:ext cx="3600000" cy="1980000"/>
+                      <a:ext cx="3960000" cy="2178000"/>
                     </a:xfrm>
                     <a:prstGeom prst="rect"/>
                   </pic:spPr>
@@ -5400,7 +5400,7 @@
       <w:r>
         <w:drawing>
           <wp:inline xmlns:a="http://schemas.openxmlformats.org/drawingml/2006/main" xmlns:pic="http://schemas.openxmlformats.org/drawingml/2006/picture">
-            <wp:extent cx="3600000" cy="1886192"/>
+            <wp:extent cx="3960000" cy="2074811"/>
             <wp:docPr id="5" name="Picture 5"/>
             <wp:cNvGraphicFramePr>
               <a:graphicFrameLocks noChangeAspect="1"/>
@@ -5421,7 +5421,7 @@
                   <pic:spPr>
                     <a:xfrm>
                       <a:off x="0" y="0"/>
-                      <a:ext cx="3600000" cy="1886192"/>
+                      <a:ext cx="3960000" cy="2074811"/>
                     </a:xfrm>
                     <a:prstGeom prst="rect"/>
                   </pic:spPr>
@@ -7363,7 +7363,7 @@
       <w:r>
         <w:drawing>
           <wp:inline xmlns:a="http://schemas.openxmlformats.org/drawingml/2006/main" xmlns:pic="http://schemas.openxmlformats.org/drawingml/2006/picture">
-            <wp:extent cx="3600000" cy="1946547"/>
+            <wp:extent cx="3960000" cy="2141202"/>
             <wp:docPr id="6" name="Picture 6"/>
             <wp:cNvGraphicFramePr>
               <a:graphicFrameLocks noChangeAspect="1"/>
@@ -7384,7 +7384,7 @@
                   <pic:spPr>
                     <a:xfrm>
                       <a:off x="0" y="0"/>
-                      <a:ext cx="3600000" cy="1946547"/>
+                      <a:ext cx="3960000" cy="2141202"/>
                     </a:xfrm>
                     <a:prstGeom prst="rect"/>
                   </pic:spPr>
@@ -7417,7 +7417,7 @@
       <w:r>
         <w:drawing>
           <wp:inline xmlns:a="http://schemas.openxmlformats.org/drawingml/2006/main" xmlns:pic="http://schemas.openxmlformats.org/drawingml/2006/picture">
-            <wp:extent cx="3600000" cy="3255126"/>
+            <wp:extent cx="3960000" cy="3580639"/>
             <wp:docPr id="7" name="Picture 7"/>
             <wp:cNvGraphicFramePr>
               <a:graphicFrameLocks noChangeAspect="1"/>
@@ -7438,7 +7438,7 @@
                   <pic:spPr>
                     <a:xfrm>
                       <a:off x="0" y="0"/>
-                      <a:ext cx="3600000" cy="3255126"/>
+                      <a:ext cx="3960000" cy="3580639"/>
                     </a:xfrm>
                     <a:prstGeom prst="rect"/>
                   </pic:spPr>
@@ -8970,7 +8970,7 @@
       <w:r>
         <w:drawing>
           <wp:inline xmlns:a="http://schemas.openxmlformats.org/drawingml/2006/main" xmlns:pic="http://schemas.openxmlformats.org/drawingml/2006/picture">
-            <wp:extent cx="3600000" cy="2188671"/>
+            <wp:extent cx="3960000" cy="2407538"/>
             <wp:docPr id="8" name="Picture 8"/>
             <wp:cNvGraphicFramePr>
               <a:graphicFrameLocks noChangeAspect="1"/>
@@ -8991,7 +8991,7 @@
                   <pic:spPr>
                     <a:xfrm>
                       <a:off x="0" y="0"/>
-                      <a:ext cx="3600000" cy="2188671"/>
+                      <a:ext cx="3960000" cy="2407538"/>
                     </a:xfrm>
                     <a:prstGeom prst="rect"/>
                   </pic:spPr>
@@ -9024,7 +9024,7 @@
       <w:r>
         <w:drawing>
           <wp:inline xmlns:a="http://schemas.openxmlformats.org/drawingml/2006/main" xmlns:pic="http://schemas.openxmlformats.org/drawingml/2006/picture">
-            <wp:extent cx="3600000" cy="2191129"/>
+            <wp:extent cx="3960000" cy="2410241"/>
             <wp:docPr id="9" name="Picture 9"/>
             <wp:cNvGraphicFramePr>
               <a:graphicFrameLocks noChangeAspect="1"/>
@@ -9045,7 +9045,7 @@
                   <pic:spPr>
                     <a:xfrm>
                       <a:off x="0" y="0"/>
-                      <a:ext cx="3600000" cy="2191129"/>
+                      <a:ext cx="3960000" cy="2410241"/>
                     </a:xfrm>
                     <a:prstGeom prst="rect"/>
                   </pic:spPr>
@@ -11192,7 +11192,7 @@
       <w:r>
         <w:drawing>
           <wp:inline xmlns:a="http://schemas.openxmlformats.org/drawingml/2006/main" xmlns:pic="http://schemas.openxmlformats.org/drawingml/2006/picture">
-            <wp:extent cx="3600000" cy="2409339"/>
+            <wp:extent cx="3960000" cy="2650272"/>
             <wp:docPr id="10" name="Picture 10"/>
             <wp:cNvGraphicFramePr>
               <a:graphicFrameLocks noChangeAspect="1"/>
@@ -11213,7 +11213,7 @@
                   <pic:spPr>
                     <a:xfrm>
                       <a:off x="0" y="0"/>
-                      <a:ext cx="3600000" cy="2409339"/>
+                      <a:ext cx="3960000" cy="2650272"/>
                     </a:xfrm>
                     <a:prstGeom prst="rect"/>
                   </pic:spPr>

</xml_diff>

<commit_message>
report.docx: web screenshots back to 9.5 cm so section 4.6 fits on 2 pages
At 10.5 cm the five web-app screenshots ran across three pages
(1 + 3 + 1 layout after the intro paragraph was trimmed).  9.5 cm
is the width that fits three per page comfortably even with the
section-4.6 heading + intro sitting above the first one.

Dropped Figures 4.9-4.13 explicit width_cm from 10.5 back to 9.5.
Result figures (Figs 4.1-4.8 and the methodology flowchart) keep
their 11 cm default -- the change is scoped to the web-app
screenshots only.
</commit_message>
<xml_diff>
--- a/docs/report.docx
+++ b/docs/report.docx
@@ -11873,7 +11873,7 @@
       <w:r>
         <w:drawing>
           <wp:inline xmlns:a="http://schemas.openxmlformats.org/drawingml/2006/main" xmlns:pic="http://schemas.openxmlformats.org/drawingml/2006/picture">
-            <wp:extent cx="3780000" cy="2598750"/>
+            <wp:extent cx="3420000" cy="2351250"/>
             <wp:docPr id="11" name="Picture 11"/>
             <wp:cNvGraphicFramePr>
               <a:graphicFrameLocks noChangeAspect="1"/>
@@ -11894,7 +11894,7 @@
                   <pic:spPr>
                     <a:xfrm>
                       <a:off x="0" y="0"/>
-                      <a:ext cx="3780000" cy="2598750"/>
+                      <a:ext cx="3420000" cy="2351250"/>
                     </a:xfrm>
                     <a:prstGeom prst="rect"/>
                   </pic:spPr>
@@ -11927,7 +11927,7 @@
       <w:r>
         <w:drawing>
           <wp:inline xmlns:a="http://schemas.openxmlformats.org/drawingml/2006/main" xmlns:pic="http://schemas.openxmlformats.org/drawingml/2006/picture">
-            <wp:extent cx="3780000" cy="2598750"/>
+            <wp:extent cx="3420000" cy="2351250"/>
             <wp:docPr id="12" name="Picture 12"/>
             <wp:cNvGraphicFramePr>
               <a:graphicFrameLocks noChangeAspect="1"/>
@@ -11948,7 +11948,7 @@
                   <pic:spPr>
                     <a:xfrm>
                       <a:off x="0" y="0"/>
-                      <a:ext cx="3780000" cy="2598750"/>
+                      <a:ext cx="3420000" cy="2351250"/>
                     </a:xfrm>
                     <a:prstGeom prst="rect"/>
                   </pic:spPr>
@@ -11981,7 +11981,7 @@
       <w:r>
         <w:drawing>
           <wp:inline xmlns:a="http://schemas.openxmlformats.org/drawingml/2006/main" xmlns:pic="http://schemas.openxmlformats.org/drawingml/2006/picture">
-            <wp:extent cx="3780000" cy="2598750"/>
+            <wp:extent cx="3420000" cy="2351250"/>
             <wp:docPr id="13" name="Picture 13"/>
             <wp:cNvGraphicFramePr>
               <a:graphicFrameLocks noChangeAspect="1"/>
@@ -12002,7 +12002,7 @@
                   <pic:spPr>
                     <a:xfrm>
                       <a:off x="0" y="0"/>
-                      <a:ext cx="3780000" cy="2598750"/>
+                      <a:ext cx="3420000" cy="2351250"/>
                     </a:xfrm>
                     <a:prstGeom prst="rect"/>
                   </pic:spPr>
@@ -12035,7 +12035,7 @@
       <w:r>
         <w:drawing>
           <wp:inline xmlns:a="http://schemas.openxmlformats.org/drawingml/2006/main" xmlns:pic="http://schemas.openxmlformats.org/drawingml/2006/picture">
-            <wp:extent cx="3780000" cy="2598750"/>
+            <wp:extent cx="3420000" cy="2351250"/>
             <wp:docPr id="14" name="Picture 14"/>
             <wp:cNvGraphicFramePr>
               <a:graphicFrameLocks noChangeAspect="1"/>
@@ -12056,7 +12056,7 @@
                   <pic:spPr>
                     <a:xfrm>
                       <a:off x="0" y="0"/>
-                      <a:ext cx="3780000" cy="2598750"/>
+                      <a:ext cx="3420000" cy="2351250"/>
                     </a:xfrm>
                     <a:prstGeom prst="rect"/>
                   </pic:spPr>
@@ -12089,7 +12089,7 @@
       <w:r>
         <w:drawing>
           <wp:inline xmlns:a="http://schemas.openxmlformats.org/drawingml/2006/main" xmlns:pic="http://schemas.openxmlformats.org/drawingml/2006/picture">
-            <wp:extent cx="3780000" cy="2598750"/>
+            <wp:extent cx="3420000" cy="2351250"/>
             <wp:docPr id="15" name="Picture 15"/>
             <wp:cNvGraphicFramePr>
               <a:graphicFrameLocks noChangeAspect="1"/>
@@ -12110,7 +12110,7 @@
                   <pic:spPr>
                     <a:xfrm>
                       <a:off x="0" y="0"/>
-                      <a:ext cx="3780000" cy="2598750"/>
+                      <a:ext cx="3420000" cy="2351250"/>
                     </a:xfrm>
                     <a:prstGeom prst="rect"/>
                   </pic:spPr>

</xml_diff>

<commit_message>
report.docx: add two more food-delivery ergonomics refs (Cagayan, Daud)
Added to the domain-relevant cluster at the top of the bibliography:
  [5] Cagayan BJT, Medrana MM, Ocampo AMT (2025-2026). Ergonomic risk
      analysis of food delivery riders using the Rapid Upper Limb
      Assessment [Capstone project proposal]. College of Engineering
      and Computer Studies, BS Industrial Engineering.
  [6] Daud A, Mohd Basri IS, Ahmad E, Mohd Hairon S, Nordin R, Azali
      Azmir N, Md Jalil MAS (2023). Assessing ergonomic risks: REBA
      analysis of food delivery riders in Eastern Peninsular Malaysia.
      Industrial Health, 61(4), 282-291.

Existing refs [5]-[18] shifted down to [7]-[20].  Final bibliography:
20 refs, contiguously numbered.  Source script's refs list updated
so subsequent full rebuilds stay consistent.

Patched docx directly rather than rebuilding from source; user's
manual image-size adjustments in Word are preserved.
</commit_message>
<xml_diff>
--- a/docs/report.docx
+++ b/docs/report.docx
@@ -12000,7 +12000,7 @@
         <w:t xml:space="preserve">[5] </w:t>
       </w:r>
       <w:r>
-        <w:t>McAtamney L, Corlett EN (1993). RULA: a survey method for the investigation of work-related upper limb disorders. Applied Ergonomics, 24(2), 91-99.</w:t>
+        <w:t>Cagayan BJT, Medrana MM, Ocampo AMT (2025-2026). Ergonomic risk analysis of food delivery riders using the Rapid Upper Limb Assessment [Capstone project proposal]. College of Engineering and Computer Studies, Bachelor of Science in Industrial Engineering.</w:t>
       </w:r>
     </w:p>
     <w:p>
@@ -12013,7 +12013,7 @@
         <w:t xml:space="preserve">[6] </w:t>
       </w:r>
       <w:r>
-        <w:t>David G, Woods V, Li G, Buckle P (2008). The development of the Quick Exposure Check (QEC) for assessing exposure to risk factors for work-related musculoskeletal disorders. Applied Ergonomics, 39(1), 57-69.</w:t>
+        <w:t>Daud A, Mohd Basri IS, Ahmad E, Mohd Hairon S, Nordin R, Azali Azmir N, Md Jalil MAS (2023). Assessing ergonomic risks: REBA analysis of food delivery riders in Eastern Peninsular Malaysia. Industrial Health, 61(4), 282-291.</w:t>
       </w:r>
     </w:p>
     <w:p>
@@ -12026,7 +12026,7 @@
         <w:t xml:space="preserve">[7] </w:t>
       </w:r>
       <w:r>
-        <w:t>Kuorinka I, Jonsson B, Kilbom A, Vinterberg H, Biering-Sorensen F, Andersson G, Jorgensen K (1987). Standardised Nordic questionnaires for the analysis of musculoskeletal symptoms. Applied Ergonomics, 18(3), 233-237.</w:t>
+        <w:t>McAtamney L, Corlett EN (1993). RULA: a survey method for the investigation of work-related upper limb disorders. Applied Ergonomics, 24(2), 91-99.</w:t>
       </w:r>
     </w:p>
     <w:p>
@@ -12039,7 +12039,7 @@
         <w:t xml:space="preserve">[8] </w:t>
       </w:r>
       <w:r>
-        <w:t>Hart SG, Staveland LE (1988). Development of NASA-TLX (Task Load Index): Results of empirical and theoretical research. Advances in Psychology, 52, 139-183.</w:t>
+        <w:t>David G, Woods V, Li G, Buckle P (2008). The development of the Quick Exposure Check (QEC) for assessing exposure to risk factors for work-related musculoskeletal disorders. Applied Ergonomics, 39(1), 57-69.</w:t>
       </w:r>
     </w:p>
     <w:p>
@@ -12052,7 +12052,7 @@
         <w:t xml:space="preserve">[9] </w:t>
       </w:r>
       <w:r>
-        <w:t>Borg G (1998). Borg's Perceived Exertion and Pain Scales. Human Kinetics Publishers, Champaign, Illinois.</w:t>
+        <w:t>Kuorinka I, Jonsson B, Kilbom A, Vinterberg H, Biering-Sorensen F, Andersson G, Jorgensen K (1987). Standardised Nordic questionnaires for the analysis of musculoskeletal symptoms. Applied Ergonomics, 18(3), 233-237.</w:t>
       </w:r>
     </w:p>
     <w:p>
@@ -12065,7 +12065,7 @@
         <w:t xml:space="preserve">[10] </w:t>
       </w:r>
       <w:r>
-        <w:t>Chawla NV, Bowyer KW, Hall LO, Kegelmeyer WP (2002). SMOTE: Synthetic Minority Over-sampling Technique. Journal of Artificial Intelligence Research, 16, 321-357.</w:t>
+        <w:t>Hart SG, Staveland LE (1988). Development of NASA-TLX (Task Load Index): Results of empirical and theoretical research. Advances in Psychology, 52, 139-183.</w:t>
       </w:r>
     </w:p>
     <w:p>
@@ -12078,7 +12078,7 @@
         <w:t xml:space="preserve">[11] </w:t>
       </w:r>
       <w:r>
-        <w:t>Breiman L (2001). Random Forests. Machine Learning, 45(1), 5-32.</w:t>
+        <w:t>Borg G (1998). Borg's Perceived Exertion and Pain Scales. Human Kinetics Publishers, Champaign, Illinois.</w:t>
       </w:r>
     </w:p>
     <w:p>
@@ -12091,7 +12091,7 @@
         <w:t xml:space="preserve">[12] </w:t>
       </w:r>
       <w:r>
-        <w:t>Geurts P, Ernst D, Wehenkel L (2006). Extremely randomized trees. Machine Learning, 63(1), 3-42.</w:t>
+        <w:t>Chawla NV, Bowyer KW, Hall LO, Kegelmeyer WP (2002). SMOTE: Synthetic Minority Over-sampling Technique. Journal of Artificial Intelligence Research, 16, 321-357.</w:t>
       </w:r>
     </w:p>
     <w:p>
@@ -12104,7 +12104,7 @@
         <w:t xml:space="preserve">[13] </w:t>
       </w:r>
       <w:r>
-        <w:t>Chen T, Guestrin C (2016). XGBoost: A Scalable Tree Boosting System. Proceedings of the 22nd ACM SIGKDD International Conference on Knowledge Discovery and Data Mining, 785-794.</w:t>
+        <w:t>Breiman L (2001). Random Forests. Machine Learning, 45(1), 5-32.</w:t>
       </w:r>
     </w:p>
     <w:p>
@@ -12117,7 +12117,7 @@
         <w:t xml:space="preserve">[14] </w:t>
       </w:r>
       <w:r>
-        <w:t>Friedman JH (2001). Greedy function approximation: A gradient boosting machine. Annals of Statistics, 29(5), 1189-1232.</w:t>
+        <w:t>Geurts P, Ernst D, Wehenkel L (2006). Extremely randomized trees. Machine Learning, 63(1), 3-42.</w:t>
       </w:r>
     </w:p>
     <w:p>
@@ -12130,7 +12130,7 @@
         <w:t xml:space="preserve">[15] </w:t>
       </w:r>
       <w:r>
-        <w:t>Wolpert DH (1992). Stacked generalization. Neural Networks, 5(2), 241-259.</w:t>
+        <w:t>Chen T, Guestrin C (2016). XGBoost: A Scalable Tree Boosting System. Proceedings of the 22nd ACM SIGKDD International Conference on Knowledge Discovery and Data Mining, 785-794.</w:t>
       </w:r>
     </w:p>
     <w:p>
@@ -12143,7 +12143,7 @@
         <w:t xml:space="preserve">[16] </w:t>
       </w:r>
       <w:r>
-        <w:t>Pedregosa F, Varoquaux G, Gramfort A, et al. (2011). Scikit-learn: Machine Learning in Python. Journal of Machine Learning Research, 12, 2825-2830.</w:t>
+        <w:t>Friedman JH (2001). Greedy function approximation: A gradient boosting machine. Annals of Statistics, 29(5), 1189-1232.</w:t>
       </w:r>
     </w:p>
     <w:p>
@@ -12156,7 +12156,7 @@
         <w:t xml:space="preserve">[17] </w:t>
       </w:r>
       <w:r>
-        <w:t>Lemaitre G, Nogueira F, Aridas CK (2017). Imbalanced-learn: A Python toolbox to tackle the curse of imbalanced datasets in machine learning. Journal of Machine Learning Research, 18(17), 1-5.</w:t>
+        <w:t>Wolpert DH (1992). Stacked generalization. Neural Networks, 5(2), 241-259.</w:t>
       </w:r>
     </w:p>
     <w:p>
@@ -12167,6 +12167,32 @@
       </w:pPr>
       <w:r>
         <w:t xml:space="preserve">[18] </w:t>
+      </w:r>
+      <w:r>
+        <w:t>Pedregosa F, Varoquaux G, Gramfort A, et al. (2011). Scikit-learn: Machine Learning in Python. Journal of Machine Learning Research, 12, 2825-2830.</w:t>
+      </w:r>
+    </w:p>
+    <w:p>
+      <w:pPr>
+        <w:spacing w:after="160"/>
+        <w:ind w:left="454" w:hanging="454"/>
+        <w:jc w:val="both"/>
+      </w:pPr>
+      <w:r>
+        <w:t xml:space="preserve">[19] </w:t>
+      </w:r>
+      <w:r>
+        <w:t>Lemaitre G, Nogueira F, Aridas CK (2017). Imbalanced-learn: A Python toolbox to tackle the curse of imbalanced datasets in machine learning. Journal of Machine Learning Research, 18(17), 1-5.</w:t>
+      </w:r>
+    </w:p>
+    <w:p>
+      <w:pPr>
+        <w:spacing w:after="160"/>
+        <w:ind w:left="454" w:hanging="454"/>
+        <w:jc w:val="both"/>
+      </w:pPr>
+      <w:r>
+        <w:t xml:space="preserve">[20] </w:t>
       </w:r>
       <w:r>
         <w:t>Kohavi R (1995). A study of cross-validation and bootstrap for accuracy estimation and model selection. Proceedings of the 14th International Joint Conference on Artificial Intelligence, 1137-1145.</w:t>

</xml_diff>

<commit_message>
report.docx: drop [15] Lemaitre imbalanced-learn, final bibliography 14 refs
Dropped Lemaitre (2017) 'Imbalanced-learn' library citation.  The
SMOTE technique is fully covered by [9] Chawla (2002), which is the
theoretical paper users need to justify the resampling choice.  The
library citation was optional and Section 2.6.8 SMOTE's caption
already leans on Chawla.

Final bibliography = 14 refs:
  Domain (3):    Benson, Pandit & Adhikari, Daud
  Methods (5):   McAtamney (RULA), David (QEC), Kuorinka (NMQ),
                 Hart (NASA-TLX), Borg (CR10)
  ML (5):        Chawla (SMOTE), Breiman (RF), Geurts (ET),
                 Chen & Guestrin (XGBoost), Friedman (HistGBM)
  Libraries (1): Pedregosa (scikit-learn)

Every subsection with a dedicated algorithm still has a citation.
Patched docx directly; user's manual image-size adjustments in Word
are preserved.  Source refs list updated to match so future full
rebuilds stay consistent.
</commit_message>
<xml_diff>
--- a/docs/report.docx
+++ b/docs/report.docx
@@ -44,8 +44,19 @@
           <w:color w:val="000000"/>
           <w:sz w:val="26"/>
         </w:rPr>
-        <w:t>IIITDM-SIES Programme</w:t>
-      </w:r>
+        <w:t xml:space="preserve">IIITDM-SIES </w:t>
+      </w:r>
+      <w:proofErr w:type="spellStart"/>
+      <w:r>
+        <w:rPr>
+          <w:rFonts w:eastAsia="Times New Roman" w:cs="Times New Roman"/>
+          <w:b/>
+          <w:color w:val="000000"/>
+          <w:sz w:val="26"/>
+        </w:rPr>
+        <w:t>Programme</w:t>
+      </w:r>
+      <w:proofErr w:type="spellEnd"/>
     </w:p>
     <w:p>
       <w:pPr>
@@ -314,7 +325,21 @@
         <w:rPr>
           <w:rFonts w:eastAsia="Times New Roman" w:cs="Times New Roman"/>
         </w:rPr>
-        <w:t>In my capacity as supervisor of the above-mentioned work, I certify that the work presented in this Report is carried out under my supervision, and is worthy of consideration for the requirements of internship under IIITDM-SIES programme during the period May 2026 to July 2026.</w:t>
+        <w:t xml:space="preserve">In my capacity as supervisor of the above-mentioned work, I certify that the work presented in this Report is carried out under my supervision, and is worthy of consideration for the requirements of internship under IIITDM-SIES </w:t>
+      </w:r>
+      <w:proofErr w:type="spellStart"/>
+      <w:r>
+        <w:rPr>
+          <w:rFonts w:eastAsia="Times New Roman" w:cs="Times New Roman"/>
+        </w:rPr>
+        <w:t>programme</w:t>
+      </w:r>
+      <w:proofErr w:type="spellEnd"/>
+      <w:r>
+        <w:rPr>
+          <w:rFonts w:eastAsia="Times New Roman" w:cs="Times New Roman"/>
+        </w:rPr>
+        <w:t xml:space="preserve"> during the period May 2026 to July 2026.</w:t>
       </w:r>
     </w:p>
     <w:p>
@@ -367,7 +392,35 @@
         <w:rPr>
           <w:rFonts w:eastAsia="Times New Roman" w:cs="Times New Roman"/>
         </w:rPr>
-        <w:t>Last-mile quick-commerce delivery riders (Blinkit, Zepto) face prolonged awkward postures, high delivery rates, heavy carrying loads and vehicle vibration, leading to musculoskeletal disorders (MSDs). Risk is not uniform across the workforce: age, tenure, daily hours, vehicle type, and carrying mode all shape the exposure profile, but this variation stays invisible to the platform. Standard ergonomic methods each cover part of the picture (RULA and QEC on the observation side, NMQ, NASA-TLX and Borg CR10 on self-report), and no single tool combines the six standard ergonomic risk factors into an automated per-rider screening. This work builds that screening on a cross-sectional sample of 182 riders from the Chengalpattu and Chennai regions collected in March and April 2026.</w:t>
+        <w:t>Last-mile quick-commerce delivery riders (</w:t>
+      </w:r>
+      <w:proofErr w:type="spellStart"/>
+      <w:r>
+        <w:rPr>
+          <w:rFonts w:eastAsia="Times New Roman" w:cs="Times New Roman"/>
+        </w:rPr>
+        <w:t>Blinkit</w:t>
+      </w:r>
+      <w:proofErr w:type="spellEnd"/>
+      <w:r>
+        <w:rPr>
+          <w:rFonts w:eastAsia="Times New Roman" w:cs="Times New Roman"/>
+        </w:rPr>
+        <w:t xml:space="preserve">, </w:t>
+      </w:r>
+      <w:proofErr w:type="spellStart"/>
+      <w:r>
+        <w:rPr>
+          <w:rFonts w:eastAsia="Times New Roman" w:cs="Times New Roman"/>
+        </w:rPr>
+        <w:t>Zepto</w:t>
+      </w:r>
+      <w:proofErr w:type="spellEnd"/>
+      <w:r>
+        <w:rPr>
+          <w:rFonts w:eastAsia="Times New Roman" w:cs="Times New Roman"/>
+        </w:rPr>
+        <w:t>) face prolonged awkward postures, high delivery rates, heavy carrying loads and vehicle vibration, leading to musculoskeletal disorders (MSDs). Risk is not uniform across the workforce: age, tenure, daily hours, vehicle type, and carrying mode all shape the exposure profile, but this variation stays invisible to the platform. Standard ergonomic methods each cover part of the picture (RULA and QEC on the observation side, NMQ, NASA-TLX and Borg CR10 on self-report), and no single tool combines the six standard ergonomic risk factors into an automated per-rider screening. This work builds that screening on a cross-sectional sample of 182 riders from the Chengalpattu and Chennai regions collected in March and April 2026.</w:t>
       </w:r>
     </w:p>
     <w:p>
@@ -379,7 +432,35 @@
         <w:rPr>
           <w:rFonts w:eastAsia="Times New Roman" w:cs="Times New Roman"/>
         </w:rPr>
-        <w:t>The pipeline runs in two stages. Stage 1 applies standard ergonomic methods (Borg CR10 action levels, RULA Table C thresholds, and sample-based cuts) to compute Low, Medium, or High risk labels for each factor from a 182-rider survey combined with 182 RULA and QEC observation records. Stage 2 trains supervised classifiers per factor using seven candidate algorithms (Logistic Regression, Decision Tree, Random Forest, Extra Trees, Hist Gradient Boosting, XGBoost, and Stacking) tuned via GridSearchCV with SMOTE inside 5-fold stratified cross-validation.</w:t>
+        <w:t xml:space="preserve">The pipeline runs in two stages. Stage 1 applies standard ergonomic methods (Borg CR10 action levels, RULA Table C thresholds, and sample-based cuts) to compute Low, Medium, or High risk labels for each factor from a 182-rider survey combined with 182 RULA and QEC observation records. Stage 2 trains supervised classifiers per factor using seven candidate algorithms (Logistic Regression, Decision Tree, Random Forest, Extra Trees, Hist Gradient Boosting, </w:t>
+      </w:r>
+      <w:proofErr w:type="spellStart"/>
+      <w:r>
+        <w:rPr>
+          <w:rFonts w:eastAsia="Times New Roman" w:cs="Times New Roman"/>
+        </w:rPr>
+        <w:t>XGBoost</w:t>
+      </w:r>
+      <w:proofErr w:type="spellEnd"/>
+      <w:r>
+        <w:rPr>
+          <w:rFonts w:eastAsia="Times New Roman" w:cs="Times New Roman"/>
+        </w:rPr>
+        <w:t xml:space="preserve">, and Stacking) tuned via </w:t>
+      </w:r>
+      <w:proofErr w:type="spellStart"/>
+      <w:r>
+        <w:rPr>
+          <w:rFonts w:eastAsia="Times New Roman" w:cs="Times New Roman"/>
+        </w:rPr>
+        <w:t>GridSearchCV</w:t>
+      </w:r>
+      <w:proofErr w:type="spellEnd"/>
+      <w:r>
+        <w:rPr>
+          <w:rFonts w:eastAsia="Times New Roman" w:cs="Times New Roman"/>
+        </w:rPr>
+        <w:t xml:space="preserve"> with SMOTE inside 5-fold stratified cross-validation.</w:t>
       </w:r>
     </w:p>
     <w:p>
@@ -391,7 +472,35 @@
         <w:rPr>
           <w:rFonts w:eastAsia="Times New Roman" w:cs="Times New Roman"/>
         </w:rPr>
-        <w:t>The five survey-derived factors achieved 58 to 62 percent cross-validation accuracy with macro AUC between 71 and 76 percent. The Posture model, which uses the 11 RULA components and 8 QEC scores in addition to the survey features, reached 97 percent accuracy and 98 percent AUC. Statistical analysis (chi-square and multivariable logistic regression) identified age, job duration, workload score, and fatigue score as the strongest individual predictors of self-reported discomfort. The final deliverable is a Streamlit web application that accepts the full 36-item questionnaire plus RULA and QEC observations and returns the six colour-coded risk levels along with per-factor recommendations.</w:t>
+        <w:t xml:space="preserve">The five survey-derived factors achieved 58 to 62 percent cross-validation accuracy with macro AUC between 71 and 76 percent. The Posture model, which uses the 11 RULA components and 8 QEC scores in addition to the survey features, reached 97 percent accuracy and 98 percent AUC. Statistical analysis (chi-square and multivariable logistic regression) identified age, job duration, workload score, and fatigue score as the strongest individual predictors of self-reported discomfort. The final deliverable is a </w:t>
+      </w:r>
+      <w:proofErr w:type="spellStart"/>
+      <w:r>
+        <w:rPr>
+          <w:rFonts w:eastAsia="Times New Roman" w:cs="Times New Roman"/>
+        </w:rPr>
+        <w:t>Streamlit</w:t>
+      </w:r>
+      <w:proofErr w:type="spellEnd"/>
+      <w:r>
+        <w:rPr>
+          <w:rFonts w:eastAsia="Times New Roman" w:cs="Times New Roman"/>
+        </w:rPr>
+        <w:t xml:space="preserve"> web application that accepts the full 36-item questionnaire plus RULA and QEC observations and returns the six </w:t>
+      </w:r>
+      <w:proofErr w:type="spellStart"/>
+      <w:r>
+        <w:rPr>
+          <w:rFonts w:eastAsia="Times New Roman" w:cs="Times New Roman"/>
+        </w:rPr>
+        <w:t>colour</w:t>
+      </w:r>
+      <w:proofErr w:type="spellEnd"/>
+      <w:r>
+        <w:rPr>
+          <w:rFonts w:eastAsia="Times New Roman" w:cs="Times New Roman"/>
+        </w:rPr>
+        <w:t>-coded risk levels along with per-factor recommendations.</w:t>
       </w:r>
     </w:p>
     <w:p>
@@ -495,8 +604,15 @@
           <w:rFonts w:eastAsia="Times New Roman" w:cs="Times New Roman"/>
         </w:rPr>
         <w:tab/>
+      </w:r>
+      <w:proofErr w:type="spellStart"/>
+      <w:r>
+        <w:rPr>
+          <w:rFonts w:eastAsia="Times New Roman" w:cs="Times New Roman"/>
+        </w:rPr>
         <w:t>i</w:t>
       </w:r>
+      <w:proofErr w:type="spellEnd"/>
     </w:p>
     <w:p>
       <w:pPr>
@@ -1038,8 +1154,16 @@
         <w:rPr>
           <w:rFonts w:eastAsia="Times New Roman" w:cs="Times New Roman"/>
         </w:rPr>
-        <w:t xml:space="preserve">        2.6.6   XGBoost</w:t>
-      </w:r>
+        <w:t xml:space="preserve">        2.6.6   </w:t>
+      </w:r>
+      <w:proofErr w:type="spellStart"/>
+      <w:r>
+        <w:rPr>
+          <w:rFonts w:eastAsia="Times New Roman" w:cs="Times New Roman"/>
+        </w:rPr>
+        <w:t>XGBoost</w:t>
+      </w:r>
+      <w:proofErr w:type="spellEnd"/>
       <w:r>
         <w:rPr>
           <w:rFonts w:eastAsia="Times New Roman" w:cs="Times New Roman"/>
@@ -2252,7 +2376,21 @@
           <w:rFonts w:eastAsia="Times New Roman" w:cs="Times New Roman"/>
         </w:rPr>
         <w:tab/>
-        <w:t>Winning hyperparameters per target after GridSearchCV.</w:t>
+        <w:t xml:space="preserve">Winning hyperparameters per target after </w:t>
+      </w:r>
+      <w:proofErr w:type="spellStart"/>
+      <w:r>
+        <w:rPr>
+          <w:rFonts w:eastAsia="Times New Roman" w:cs="Times New Roman"/>
+        </w:rPr>
+        <w:t>GridSearchCV</w:t>
+      </w:r>
+      <w:proofErr w:type="spellEnd"/>
+      <w:r>
+        <w:rPr>
+          <w:rFonts w:eastAsia="Times New Roman" w:cs="Times New Roman"/>
+        </w:rPr>
+        <w:t>.</w:t>
       </w:r>
       <w:r>
         <w:rPr>
@@ -2572,6 +2710,7 @@
         </w:tabs>
         <w:spacing w:after="60"/>
       </w:pPr>
+      <w:proofErr w:type="spellStart"/>
       <w:r>
         <w:rPr>
           <w:rFonts w:eastAsia="Times New Roman" w:cs="Times New Roman"/>
@@ -2579,6 +2718,7 @@
         </w:rPr>
         <w:t>HistGBM</w:t>
       </w:r>
+      <w:proofErr w:type="spellEnd"/>
       <w:r>
         <w:rPr>
           <w:rFonts w:eastAsia="Times New Roman" w:cs="Times New Roman"/>
@@ -2594,6 +2734,7 @@
         </w:tabs>
         <w:spacing w:after="60"/>
       </w:pPr>
+      <w:proofErr w:type="spellStart"/>
       <w:r>
         <w:rPr>
           <w:rFonts w:eastAsia="Times New Roman" w:cs="Times New Roman"/>
@@ -2601,12 +2742,26 @@
         </w:rPr>
         <w:t>XGBoost</w:t>
       </w:r>
+      <w:proofErr w:type="spellEnd"/>
       <w:r>
         <w:rPr>
           <w:rFonts w:eastAsia="Times New Roman" w:cs="Times New Roman"/>
         </w:rPr>
         <w:tab/>
-        <w:t>eXtreme Gradient Boosting</w:t>
+      </w:r>
+      <w:proofErr w:type="spellStart"/>
+      <w:r>
+        <w:rPr>
+          <w:rFonts w:eastAsia="Times New Roman" w:cs="Times New Roman"/>
+        </w:rPr>
+        <w:t>eXtreme</w:t>
+      </w:r>
+      <w:proofErr w:type="spellEnd"/>
+      <w:r>
+        <w:rPr>
+          <w:rFonts w:eastAsia="Times New Roman" w:cs="Times New Roman"/>
+        </w:rPr>
+        <w:t xml:space="preserve"> Gradient Boosting</w:t>
       </w:r>
     </w:p>
     <w:p>
@@ -2638,6 +2793,7 @@
         </w:tabs>
         <w:spacing w:after="60"/>
       </w:pPr>
+      <w:proofErr w:type="spellStart"/>
       <w:r>
         <w:rPr>
           <w:rFonts w:eastAsia="Times New Roman" w:cs="Times New Roman"/>
@@ -2645,6 +2801,7 @@
         </w:rPr>
         <w:t>dph</w:t>
       </w:r>
+      <w:proofErr w:type="spellEnd"/>
       <w:r>
         <w:rPr>
           <w:rFonts w:eastAsia="Times New Roman" w:cs="Times New Roman"/>
@@ -2735,7 +2892,21 @@
           <w:rFonts w:eastAsia="Times New Roman" w:cs="Times New Roman"/>
         </w:rPr>
         <w:tab/>
-        <w:t>number of nearest minority neighbours used by SMOTE</w:t>
+        <w:t xml:space="preserve">number of nearest minority </w:t>
+      </w:r>
+      <w:proofErr w:type="spellStart"/>
+      <w:r>
+        <w:rPr>
+          <w:rFonts w:eastAsia="Times New Roman" w:cs="Times New Roman"/>
+        </w:rPr>
+        <w:t>neighbours</w:t>
+      </w:r>
+      <w:proofErr w:type="spellEnd"/>
+      <w:r>
+        <w:rPr>
+          <w:rFonts w:eastAsia="Times New Roman" w:cs="Times New Roman"/>
+        </w:rPr>
+        <w:t xml:space="preserve"> used by SMOTE</w:t>
       </w:r>
     </w:p>
     <w:p>
@@ -2837,6 +3008,7 @@
         </w:tabs>
         <w:spacing w:after="60"/>
       </w:pPr>
+      <w:proofErr w:type="spellStart"/>
       <w:r>
         <w:rPr>
           <w:rFonts w:eastAsia="Times New Roman" w:cs="Times New Roman"/>
@@ -2845,13 +3017,36 @@
         </w:rPr>
         <w:t>dph</w:t>
       </w:r>
+      <w:proofErr w:type="spellEnd"/>
       <w:r>
         <w:rPr>
           <w:rFonts w:eastAsia="Times New Roman" w:cs="Times New Roman"/>
         </w:rPr>
         <w:tab/>
-        <w:t>deliveries per hour, deliveries_num / work_hours_num</w:t>
-      </w:r>
+        <w:t xml:space="preserve">deliveries per hour, </w:t>
+      </w:r>
+      <w:proofErr w:type="spellStart"/>
+      <w:r>
+        <w:rPr>
+          <w:rFonts w:eastAsia="Times New Roman" w:cs="Times New Roman"/>
+        </w:rPr>
+        <w:t>deliveries_num</w:t>
+      </w:r>
+      <w:proofErr w:type="spellEnd"/>
+      <w:r>
+        <w:rPr>
+          <w:rFonts w:eastAsia="Times New Roman" w:cs="Times New Roman"/>
+        </w:rPr>
+        <w:t xml:space="preserve"> / </w:t>
+      </w:r>
+      <w:proofErr w:type="spellStart"/>
+      <w:r>
+        <w:rPr>
+          <w:rFonts w:eastAsia="Times New Roman" w:cs="Times New Roman"/>
+        </w:rPr>
+        <w:t>work_hours_num</w:t>
+      </w:r>
+      <w:proofErr w:type="spellEnd"/>
     </w:p>
     <w:p>
       <w:pPr>
@@ -2903,7 +3098,35 @@
         <w:rPr>
           <w:rFonts w:eastAsia="Times New Roman" w:cs="Times New Roman"/>
         </w:rPr>
-        <w:t>Last-mile quick-commerce delivery riders for platforms like Blinkit and Zepto spend long hours on bikes, climb stairs, carry packages, and ride in heavy traffic. Over time this kind of work causes musculoskeletal disorders (MSDs): back pain, shoulder pain, wrist injuries, knee problems. The risk is not the same for every rider. Someone who is 22 and works 4 hours a day on a scooter is in a very different situation from a 45-year-old who works 10 hours a day on a motorbike with a handheld bag.</w:t>
+        <w:t xml:space="preserve">Last-mile quick-commerce delivery riders for platforms like </w:t>
+      </w:r>
+      <w:proofErr w:type="spellStart"/>
+      <w:r>
+        <w:rPr>
+          <w:rFonts w:eastAsia="Times New Roman" w:cs="Times New Roman"/>
+        </w:rPr>
+        <w:t>Blinkit</w:t>
+      </w:r>
+      <w:proofErr w:type="spellEnd"/>
+      <w:r>
+        <w:rPr>
+          <w:rFonts w:eastAsia="Times New Roman" w:cs="Times New Roman"/>
+        </w:rPr>
+        <w:t xml:space="preserve"> and </w:t>
+      </w:r>
+      <w:proofErr w:type="spellStart"/>
+      <w:r>
+        <w:rPr>
+          <w:rFonts w:eastAsia="Times New Roman" w:cs="Times New Roman"/>
+        </w:rPr>
+        <w:t>Zepto</w:t>
+      </w:r>
+      <w:proofErr w:type="spellEnd"/>
+      <w:r>
+        <w:rPr>
+          <w:rFonts w:eastAsia="Times New Roman" w:cs="Times New Roman"/>
+        </w:rPr>
+        <w:t xml:space="preserve"> spend long hours on bikes, climb stairs, carry packages, and ride in heavy traffic. Over time this kind of work causes musculoskeletal disorders (MSDs): back pain, shoulder pain, wrist injuries, knee problems. The risk is not the same for every rider. Someone who is 22 and works 4 hours a day on a scooter is in a very different situation from a 45-year-old who works 10 hours a day on a motorbike with a handheld bag.</w:t>
       </w:r>
     </w:p>
     <w:p>
@@ -2992,7 +3215,35 @@
           <w:rFonts w:eastAsia="Times New Roman" w:cs="Times New Roman"/>
         </w:rPr>
         <w:lastRenderedPageBreak/>
-        <w:t>Implement the pipeline reproducibly in Python (Jupyter notebooks, scikit-learn, XGBoost, imbalanced-learn, statsmodels) with a fixed random seed and end-to-end regeneration of every intermediate artefact.</w:t>
+        <w:t xml:space="preserve">Implement the pipeline reproducibly in Python (Jupyter notebooks, scikit-learn, </w:t>
+      </w:r>
+      <w:proofErr w:type="spellStart"/>
+      <w:r>
+        <w:rPr>
+          <w:rFonts w:eastAsia="Times New Roman" w:cs="Times New Roman"/>
+        </w:rPr>
+        <w:t>XGBoost</w:t>
+      </w:r>
+      <w:proofErr w:type="spellEnd"/>
+      <w:r>
+        <w:rPr>
+          <w:rFonts w:eastAsia="Times New Roman" w:cs="Times New Roman"/>
+        </w:rPr>
+        <w:t xml:space="preserve">, imbalanced-learn, </w:t>
+      </w:r>
+      <w:proofErr w:type="spellStart"/>
+      <w:r>
+        <w:rPr>
+          <w:rFonts w:eastAsia="Times New Roman" w:cs="Times New Roman"/>
+        </w:rPr>
+        <w:t>statsmodels</w:t>
+      </w:r>
+      <w:proofErr w:type="spellEnd"/>
+      <w:r>
+        <w:rPr>
+          <w:rFonts w:eastAsia="Times New Roman" w:cs="Times New Roman"/>
+        </w:rPr>
+        <w:t>) with a fixed random seed and end-to-end regeneration of every intermediate artefact.</w:t>
       </w:r>
     </w:p>
     <w:p>
@@ -3028,7 +3279,35 @@
         <w:rPr>
           <w:rFonts w:eastAsia="Times New Roman" w:cs="Times New Roman"/>
         </w:rPr>
-        <w:t>Deploy the trained models behind a Streamlit web application that accepts the full 36-item questionnaire plus the 11 RULA components and 8 QEC scores, and returns the six colour-coded risk levels with per-factor recommendations.</w:t>
+        <w:t xml:space="preserve">Deploy the trained models behind a </w:t>
+      </w:r>
+      <w:proofErr w:type="spellStart"/>
+      <w:r>
+        <w:rPr>
+          <w:rFonts w:eastAsia="Times New Roman" w:cs="Times New Roman"/>
+        </w:rPr>
+        <w:t>Streamlit</w:t>
+      </w:r>
+      <w:proofErr w:type="spellEnd"/>
+      <w:r>
+        <w:rPr>
+          <w:rFonts w:eastAsia="Times New Roman" w:cs="Times New Roman"/>
+        </w:rPr>
+        <w:t xml:space="preserve"> web application that accepts the full 36-item questionnaire plus the 11 RULA components and 8 QEC scores, and returns the six </w:t>
+      </w:r>
+      <w:proofErr w:type="spellStart"/>
+      <w:r>
+        <w:rPr>
+          <w:rFonts w:eastAsia="Times New Roman" w:cs="Times New Roman"/>
+        </w:rPr>
+        <w:t>colour</w:t>
+      </w:r>
+      <w:proofErr w:type="spellEnd"/>
+      <w:r>
+        <w:rPr>
+          <w:rFonts w:eastAsia="Times New Roman" w:cs="Times New Roman"/>
+        </w:rPr>
+        <w:t>-coded risk levels with per-factor recommendations.</w:t>
       </w:r>
     </w:p>
     <w:p>
@@ -3168,7 +3447,35 @@
         <w:rPr>
           <w:rFonts w:eastAsia="Times New Roman" w:cs="Times New Roman"/>
         </w:rPr>
-        <w:t>This is a cross-sectional study of Blinkit and Zepto quick-commerce delivery partners conducted in the Chengalpattu and Chennai regions in March-April 2026 using convenience sampling. The same 182 participants supplied both data streams: rider self-report through a Google Form and posture recorded during a delivery task by a trained observer. Eligibility was applied at the person level before either instrument.</w:t>
+        <w:t xml:space="preserve">This is a cross-sectional study of </w:t>
+      </w:r>
+      <w:proofErr w:type="spellStart"/>
+      <w:r>
+        <w:rPr>
+          <w:rFonts w:eastAsia="Times New Roman" w:cs="Times New Roman"/>
+        </w:rPr>
+        <w:t>Blinkit</w:t>
+      </w:r>
+      <w:proofErr w:type="spellEnd"/>
+      <w:r>
+        <w:rPr>
+          <w:rFonts w:eastAsia="Times New Roman" w:cs="Times New Roman"/>
+        </w:rPr>
+        <w:t xml:space="preserve"> and </w:t>
+      </w:r>
+      <w:proofErr w:type="spellStart"/>
+      <w:r>
+        <w:rPr>
+          <w:rFonts w:eastAsia="Times New Roman" w:cs="Times New Roman"/>
+        </w:rPr>
+        <w:t>Zepto</w:t>
+      </w:r>
+      <w:proofErr w:type="spellEnd"/>
+      <w:r>
+        <w:rPr>
+          <w:rFonts w:eastAsia="Times New Roman" w:cs="Times New Roman"/>
+        </w:rPr>
+        <w:t xml:space="preserve"> quick-commerce delivery partners conducted in the Chengalpattu and Chennai regions in March-April 2026 using convenience sampling. The same 182 participants supplied both data streams: rider self-report through a Google Form and posture recorded during a delivery task by a trained observer. Eligibility was applied at the person level before either instrument.</w:t>
       </w:r>
     </w:p>
     <w:p>
@@ -3194,7 +3501,35 @@
         <w:rPr>
           <w:rFonts w:eastAsia="Times New Roman" w:cs="Times New Roman"/>
         </w:rPr>
-        <w:t>Full-time delivery partners working on either the Blinkit or the Zepto platform.</w:t>
+        <w:t xml:space="preserve">Full-time delivery partners working on either the </w:t>
+      </w:r>
+      <w:proofErr w:type="spellStart"/>
+      <w:r>
+        <w:rPr>
+          <w:rFonts w:eastAsia="Times New Roman" w:cs="Times New Roman"/>
+        </w:rPr>
+        <w:t>Blinkit</w:t>
+      </w:r>
+      <w:proofErr w:type="spellEnd"/>
+      <w:r>
+        <w:rPr>
+          <w:rFonts w:eastAsia="Times New Roman" w:cs="Times New Roman"/>
+        </w:rPr>
+        <w:t xml:space="preserve"> or the </w:t>
+      </w:r>
+      <w:proofErr w:type="spellStart"/>
+      <w:r>
+        <w:rPr>
+          <w:rFonts w:eastAsia="Times New Roman" w:cs="Times New Roman"/>
+        </w:rPr>
+        <w:t>Zepto</w:t>
+      </w:r>
+      <w:proofErr w:type="spellEnd"/>
+      <w:r>
+        <w:rPr>
+          <w:rFonts w:eastAsia="Times New Roman" w:cs="Times New Roman"/>
+        </w:rPr>
+        <w:t xml:space="preserve"> platform.</w:t>
       </w:r>
     </w:p>
     <w:p>
@@ -3349,7 +3684,119 @@
         <w:rPr>
           <w:rFonts w:eastAsia="Times New Roman" w:cs="Times New Roman"/>
         </w:rPr>
-        <w:t>Phase 1 (01_data_cleaning.ipynb) normalises the raw CSV, standardises Yes/No answers, and validates row counts. Phase 2 (02_feature_engineering.ipynb) encodes ordered categorical bins to integers, assigns numeric midpoints to bin ranges, ranks vehicle type and carrying mode, aliases the 18 Yes/No items, and derives four composite features -- workload_score (mean of the six NASA-TLX items with satisfaction reversed), fatigue_score (mean of the six Borg CR10 items), force_exertion (the Borg lifting item), and vibration_index (vehicle_rank x work_hours_num) -- plus five product-form interactions so tree-based models can pick up combined effects.</w:t>
+        <w:t xml:space="preserve">Phase 1 (01_data_cleaning.ipynb) </w:t>
+      </w:r>
+      <w:proofErr w:type="spellStart"/>
+      <w:r>
+        <w:rPr>
+          <w:rFonts w:eastAsia="Times New Roman" w:cs="Times New Roman"/>
+        </w:rPr>
+        <w:t>normalises</w:t>
+      </w:r>
+      <w:proofErr w:type="spellEnd"/>
+      <w:r>
+        <w:rPr>
+          <w:rFonts w:eastAsia="Times New Roman" w:cs="Times New Roman"/>
+        </w:rPr>
+        <w:t xml:space="preserve"> the raw CSV, </w:t>
+      </w:r>
+      <w:proofErr w:type="spellStart"/>
+      <w:r>
+        <w:rPr>
+          <w:rFonts w:eastAsia="Times New Roman" w:cs="Times New Roman"/>
+        </w:rPr>
+        <w:t>standardises</w:t>
+      </w:r>
+      <w:proofErr w:type="spellEnd"/>
+      <w:r>
+        <w:rPr>
+          <w:rFonts w:eastAsia="Times New Roman" w:cs="Times New Roman"/>
+        </w:rPr>
+        <w:t xml:space="preserve"> Yes/No answers, and validates row counts. Phase 2 (02_feature_engineering.ipynb) encodes ordered categorical bins to integers, assigns numeric midpoints to bin ranges, ranks vehicle type and carrying mode, aliases the 18 Yes/No items, and derives four composite features -- </w:t>
+      </w:r>
+      <w:proofErr w:type="spellStart"/>
+      <w:r>
+        <w:rPr>
+          <w:rFonts w:eastAsia="Times New Roman" w:cs="Times New Roman"/>
+        </w:rPr>
+        <w:t>workload_score</w:t>
+      </w:r>
+      <w:proofErr w:type="spellEnd"/>
+      <w:r>
+        <w:rPr>
+          <w:rFonts w:eastAsia="Times New Roman" w:cs="Times New Roman"/>
+        </w:rPr>
+        <w:t xml:space="preserve"> (mean of the six NASA-TLX items with satisfaction reversed), </w:t>
+      </w:r>
+      <w:proofErr w:type="spellStart"/>
+      <w:r>
+        <w:rPr>
+          <w:rFonts w:eastAsia="Times New Roman" w:cs="Times New Roman"/>
+        </w:rPr>
+        <w:t>fatigue_score</w:t>
+      </w:r>
+      <w:proofErr w:type="spellEnd"/>
+      <w:r>
+        <w:rPr>
+          <w:rFonts w:eastAsia="Times New Roman" w:cs="Times New Roman"/>
+        </w:rPr>
+        <w:t xml:space="preserve"> (mean of the six Borg CR10 items), </w:t>
+      </w:r>
+      <w:proofErr w:type="spellStart"/>
+      <w:r>
+        <w:rPr>
+          <w:rFonts w:eastAsia="Times New Roman" w:cs="Times New Roman"/>
+        </w:rPr>
+        <w:t>force_exertion</w:t>
+      </w:r>
+      <w:proofErr w:type="spellEnd"/>
+      <w:r>
+        <w:rPr>
+          <w:rFonts w:eastAsia="Times New Roman" w:cs="Times New Roman"/>
+        </w:rPr>
+        <w:t xml:space="preserve"> (the Borg lifting item), and </w:t>
+      </w:r>
+      <w:proofErr w:type="spellStart"/>
+      <w:r>
+        <w:rPr>
+          <w:rFonts w:eastAsia="Times New Roman" w:cs="Times New Roman"/>
+        </w:rPr>
+        <w:t>vibration_index</w:t>
+      </w:r>
+      <w:proofErr w:type="spellEnd"/>
+      <w:r>
+        <w:rPr>
+          <w:rFonts w:eastAsia="Times New Roman" w:cs="Times New Roman"/>
+        </w:rPr>
+        <w:t xml:space="preserve"> (</w:t>
+      </w:r>
+      <w:proofErr w:type="spellStart"/>
+      <w:r>
+        <w:rPr>
+          <w:rFonts w:eastAsia="Times New Roman" w:cs="Times New Roman"/>
+        </w:rPr>
+        <w:t>vehicle_rank</w:t>
+      </w:r>
+      <w:proofErr w:type="spellEnd"/>
+      <w:r>
+        <w:rPr>
+          <w:rFonts w:eastAsia="Times New Roman" w:cs="Times New Roman"/>
+        </w:rPr>
+        <w:t xml:space="preserve"> x </w:t>
+      </w:r>
+      <w:proofErr w:type="spellStart"/>
+      <w:r>
+        <w:rPr>
+          <w:rFonts w:eastAsia="Times New Roman" w:cs="Times New Roman"/>
+        </w:rPr>
+        <w:t>work_hours_num</w:t>
+      </w:r>
+      <w:proofErr w:type="spellEnd"/>
+      <w:r>
+        <w:rPr>
+          <w:rFonts w:eastAsia="Times New Roman" w:cs="Times New Roman"/>
+        </w:rPr>
+        <w:t>) -- plus five product-form interactions so tree-based models can pick up combined effects.</w:t>
       </w:r>
     </w:p>
     <w:p>
@@ -3361,7 +3808,35 @@
         <w:rPr>
           <w:rFonts w:eastAsia="Times New Roman" w:cs="Times New Roman"/>
         </w:rPr>
-        <w:t>The posture observations are merged into the survey via a severity-rank merge: riders are ranked by an exposure_severity index (normalised NMQ pain count + fatigue score + hours), posture rows by RULA Table C, and the two ranked lists are joined one-to-one. Caveats are noted in Chapter 5.</w:t>
+        <w:t xml:space="preserve">The posture observations are merged into the survey via a severity-rank merge: riders are ranked by an </w:t>
+      </w:r>
+      <w:proofErr w:type="spellStart"/>
+      <w:r>
+        <w:rPr>
+          <w:rFonts w:eastAsia="Times New Roman" w:cs="Times New Roman"/>
+        </w:rPr>
+        <w:t>exposure_severity</w:t>
+      </w:r>
+      <w:proofErr w:type="spellEnd"/>
+      <w:r>
+        <w:rPr>
+          <w:rFonts w:eastAsia="Times New Roman" w:cs="Times New Roman"/>
+        </w:rPr>
+        <w:t xml:space="preserve"> index (</w:t>
+      </w:r>
+      <w:proofErr w:type="spellStart"/>
+      <w:r>
+        <w:rPr>
+          <w:rFonts w:eastAsia="Times New Roman" w:cs="Times New Roman"/>
+        </w:rPr>
+        <w:t>normalised</w:t>
+      </w:r>
+      <w:proofErr w:type="spellEnd"/>
+      <w:r>
+        <w:rPr>
+          <w:rFonts w:eastAsia="Times New Roman" w:cs="Times New Roman"/>
+        </w:rPr>
+        <w:t xml:space="preserve"> NMQ pain count + fatigue score + hours), posture rows by RULA Table C, and the two ranked lists are joined one-to-one. Caveats are noted in Chapter 5.</w:t>
       </w:r>
     </w:p>
     <w:p>
@@ -3435,7 +3910,21 @@
         <w:rPr>
           <w:rFonts w:eastAsia="Times New Roman" w:cs="Times New Roman"/>
         </w:rPr>
-        <w:t>Vibration: vibration_index binned by sample tercile.</w:t>
+        <w:t xml:space="preserve">Vibration: </w:t>
+      </w:r>
+      <w:proofErr w:type="spellStart"/>
+      <w:r>
+        <w:rPr>
+          <w:rFonts w:eastAsia="Times New Roman" w:cs="Times New Roman"/>
+        </w:rPr>
+        <w:t>vibration_index</w:t>
+      </w:r>
+      <w:proofErr w:type="spellEnd"/>
+      <w:r>
+        <w:rPr>
+          <w:rFonts w:eastAsia="Times New Roman" w:cs="Times New Roman"/>
+        </w:rPr>
+        <w:t xml:space="preserve"> binned by sample tercile.</w:t>
       </w:r>
     </w:p>
     <w:p>
@@ -3447,7 +3936,35 @@
         <w:rPr>
           <w:rFonts w:eastAsia="Times New Roman" w:cs="Times New Roman"/>
         </w:rPr>
-        <w:t>Contact Stress: carrying_contact_rank x work_hours_num x age multiplier, sample tercile.</w:t>
+        <w:t xml:space="preserve">Contact Stress: </w:t>
+      </w:r>
+      <w:proofErr w:type="spellStart"/>
+      <w:r>
+        <w:rPr>
+          <w:rFonts w:eastAsia="Times New Roman" w:cs="Times New Roman"/>
+        </w:rPr>
+        <w:t>carrying_contact_rank</w:t>
+      </w:r>
+      <w:proofErr w:type="spellEnd"/>
+      <w:r>
+        <w:rPr>
+          <w:rFonts w:eastAsia="Times New Roman" w:cs="Times New Roman"/>
+        </w:rPr>
+        <w:t xml:space="preserve"> x </w:t>
+      </w:r>
+      <w:proofErr w:type="spellStart"/>
+      <w:r>
+        <w:rPr>
+          <w:rFonts w:eastAsia="Times New Roman" w:cs="Times New Roman"/>
+        </w:rPr>
+        <w:t>work_hours_num</w:t>
+      </w:r>
+      <w:proofErr w:type="spellEnd"/>
+      <w:r>
+        <w:rPr>
+          <w:rFonts w:eastAsia="Times New Roman" w:cs="Times New Roman"/>
+        </w:rPr>
+        <w:t xml:space="preserve"> x age multiplier, sample tercile.</w:t>
       </w:r>
     </w:p>
     <w:p>
@@ -3486,7 +4003,21 @@
         <w:rPr>
           <w:rFonts w:eastAsia="Times New Roman" w:cs="Times New Roman"/>
         </w:rPr>
-        <w:t>Phase 5 (05_stats.ipynb) runs two analyses on discomfort (binary: any NMQ 12-month pain). A chi-square test of independence (scipy.stats.chi2_contingency) checks whether each risk factor is associated with discomfort at p less than 0.05. Second, a multivariable logistic regression (statsmodels.api.Logit) estimates the effect of eleven predictors while controlling for the others; results are reported as odds ratios with 95 percent confidence intervals.</w:t>
+        <w:t>Phase 5 (05_stats.ipynb) runs two analyses on discomfort (binary: any NMQ 12-month pain). A chi-square test of independence (scipy.stats.chi2_contingency) checks whether each risk factor is associated with discomfort at p less than 0.05. Second, a multivariable logistic regression (</w:t>
+      </w:r>
+      <w:proofErr w:type="spellStart"/>
+      <w:r>
+        <w:rPr>
+          <w:rFonts w:eastAsia="Times New Roman" w:cs="Times New Roman"/>
+        </w:rPr>
+        <w:t>statsmodels.api.Logit</w:t>
+      </w:r>
+      <w:proofErr w:type="spellEnd"/>
+      <w:r>
+        <w:rPr>
+          <w:rFonts w:eastAsia="Times New Roman" w:cs="Times New Roman"/>
+        </w:rPr>
+        <w:t>) estimates the effect of eleven predictors while controlling for the others; results are reported as odds ratios with 95 percent confidence intervals.</w:t>
       </w:r>
     </w:p>
     <w:p>
@@ -3512,7 +4043,49 @@
         <w:rPr>
           <w:rFonts w:eastAsia="Times New Roman" w:cs="Times New Roman"/>
         </w:rPr>
-        <w:t>Phase 6 (06_modeling.ipynb) trains a classifier per target from seven candidate algorithms.  Each sits inside an imblearn.Pipeline with SMOTE upstream so resampling only touches training folds. GridSearchCV tunes hyperparameters on macro-F1 inside 5-fold stratified CV, and the best model per target is refit on the full sample and saved as outputs/models/best_&lt;factor&gt;.pkl.</w:t>
+        <w:t xml:space="preserve">Phase 6 (06_modeling.ipynb) trains a classifier per target from seven candidate algorithms.  Each sits inside an </w:t>
+      </w:r>
+      <w:proofErr w:type="spellStart"/>
+      <w:r>
+        <w:rPr>
+          <w:rFonts w:eastAsia="Times New Roman" w:cs="Times New Roman"/>
+        </w:rPr>
+        <w:t>imblearn.Pipeline</w:t>
+      </w:r>
+      <w:proofErr w:type="spellEnd"/>
+      <w:r>
+        <w:rPr>
+          <w:rFonts w:eastAsia="Times New Roman" w:cs="Times New Roman"/>
+        </w:rPr>
+        <w:t xml:space="preserve"> with SMOTE upstream so resampling only touches training folds. </w:t>
+      </w:r>
+      <w:proofErr w:type="spellStart"/>
+      <w:r>
+        <w:rPr>
+          <w:rFonts w:eastAsia="Times New Roman" w:cs="Times New Roman"/>
+        </w:rPr>
+        <w:t>GridSearchCV</w:t>
+      </w:r>
+      <w:proofErr w:type="spellEnd"/>
+      <w:r>
+        <w:rPr>
+          <w:rFonts w:eastAsia="Times New Roman" w:cs="Times New Roman"/>
+        </w:rPr>
+        <w:t xml:space="preserve"> tunes hyperparameters on macro-F1 inside 5-fold stratified CV, and the best model per target is refit on the full sample and saved as outputs/models/best_&lt;factor&gt;.</w:t>
+      </w:r>
+      <w:proofErr w:type="spellStart"/>
+      <w:r>
+        <w:rPr>
+          <w:rFonts w:eastAsia="Times New Roman" w:cs="Times New Roman"/>
+        </w:rPr>
+        <w:t>pkl</w:t>
+      </w:r>
+      <w:proofErr w:type="spellEnd"/>
+      <w:r>
+        <w:rPr>
+          <w:rFonts w:eastAsia="Times New Roman" w:cs="Times New Roman"/>
+        </w:rPr>
+        <w:t>.</w:t>
       </w:r>
     </w:p>
     <w:p>
@@ -3535,11 +4108,33 @@
         <w:spacing w:after="160" w:line="336" w:lineRule="auto"/>
         <w:jc w:val="both"/>
       </w:pPr>
-      <w:r>
-        <w:rPr>
-          <w:rFonts w:eastAsia="Times New Roman" w:cs="Times New Roman"/>
-        </w:rPr>
-        <w:t>Regularised linear classifier used as the baseline (L2 penalty, class_weight balanced).  Any tree-based method that fails to beat it on a factor is either overfitting or getting nothing from feature interactions.</w:t>
+      <w:proofErr w:type="spellStart"/>
+      <w:r>
+        <w:rPr>
+          <w:rFonts w:eastAsia="Times New Roman" w:cs="Times New Roman"/>
+        </w:rPr>
+        <w:t>Regularised</w:t>
+      </w:r>
+      <w:proofErr w:type="spellEnd"/>
+      <w:r>
+        <w:rPr>
+          <w:rFonts w:eastAsia="Times New Roman" w:cs="Times New Roman"/>
+        </w:rPr>
+        <w:t xml:space="preserve"> linear classifier used as the baseline (L2 penalty, </w:t>
+      </w:r>
+      <w:proofErr w:type="spellStart"/>
+      <w:r>
+        <w:rPr>
+          <w:rFonts w:eastAsia="Times New Roman" w:cs="Times New Roman"/>
+        </w:rPr>
+        <w:t>class_weight</w:t>
+      </w:r>
+      <w:proofErr w:type="spellEnd"/>
+      <w:r>
+        <w:rPr>
+          <w:rFonts w:eastAsia="Times New Roman" w:cs="Times New Roman"/>
+        </w:rPr>
+        <w:t xml:space="preserve"> balanced).  Any tree-based method that fails to beat it on a factor is either overfitting or getting nothing from feature interactions.</w:t>
       </w:r>
     </w:p>
     <w:p>
@@ -3566,7 +4161,49 @@
         <w:rPr>
           <w:rFonts w:eastAsia="Times New Roman" w:cs="Times New Roman"/>
         </w:rPr>
-        <w:t>Single CART tree with max_depth (3-10) and min_samples_leaf (2-10) tuned via grid search.  Included as the ensembling floor; not competitive on its own for any of the six targets.</w:t>
+        <w:t xml:space="preserve">Single CART tree with </w:t>
+      </w:r>
+      <w:proofErr w:type="spellStart"/>
+      <w:r>
+        <w:rPr>
+          <w:rFonts w:eastAsia="Times New Roman" w:cs="Times New Roman"/>
+        </w:rPr>
+        <w:t>max_depth</w:t>
+      </w:r>
+      <w:proofErr w:type="spellEnd"/>
+      <w:r>
+        <w:rPr>
+          <w:rFonts w:eastAsia="Times New Roman" w:cs="Times New Roman"/>
+        </w:rPr>
+        <w:t xml:space="preserve"> (3-10) and </w:t>
+      </w:r>
+      <w:proofErr w:type="spellStart"/>
+      <w:r>
+        <w:rPr>
+          <w:rFonts w:eastAsia="Times New Roman" w:cs="Times New Roman"/>
+        </w:rPr>
+        <w:t>min_samples_leaf</w:t>
+      </w:r>
+      <w:proofErr w:type="spellEnd"/>
+      <w:r>
+        <w:rPr>
+          <w:rFonts w:eastAsia="Times New Roman" w:cs="Times New Roman"/>
+        </w:rPr>
+        <w:t xml:space="preserve"> (2-10) tuned via grid search.  Included as the </w:t>
+      </w:r>
+      <w:proofErr w:type="spellStart"/>
+      <w:r>
+        <w:rPr>
+          <w:rFonts w:eastAsia="Times New Roman" w:cs="Times New Roman"/>
+        </w:rPr>
+        <w:t>ensembling</w:t>
+      </w:r>
+      <w:proofErr w:type="spellEnd"/>
+      <w:r>
+        <w:rPr>
+          <w:rFonts w:eastAsia="Times New Roman" w:cs="Times New Roman"/>
+        </w:rPr>
+        <w:t xml:space="preserve"> floor; not competitive on its own for any of the six targets.</w:t>
       </w:r>
     </w:p>
     <w:p>
@@ -3620,7 +4257,21 @@
         <w:rPr>
           <w:rFonts w:eastAsia="Times New Roman" w:cs="Times New Roman"/>
         </w:rPr>
-        <w:t>Like Random Forest but with fully random splits per node.  The extra randomisation lowers between-tree correlation and helped it win on Vibration.</w:t>
+        <w:t xml:space="preserve">Like Random Forest but with fully random splits per node.  The extra </w:t>
+      </w:r>
+      <w:proofErr w:type="spellStart"/>
+      <w:r>
+        <w:rPr>
+          <w:rFonts w:eastAsia="Times New Roman" w:cs="Times New Roman"/>
+        </w:rPr>
+        <w:t>randomisation</w:t>
+      </w:r>
+      <w:proofErr w:type="spellEnd"/>
+      <w:r>
+        <w:rPr>
+          <w:rFonts w:eastAsia="Times New Roman" w:cs="Times New Roman"/>
+        </w:rPr>
+        <w:t xml:space="preserve"> lowers between-tree correlation and helped it win on Vibration.</w:t>
       </w:r>
     </w:p>
     <w:p>
@@ -3663,26 +4314,9 @@
           <w:sz w:val="24"/>
         </w:rPr>
         <w:lastRenderedPageBreak/>
-        <w:t>2.6.6   XGBoost</w:t>
-      </w:r>
-    </w:p>
-    <w:p>
-      <w:pPr>
-        <w:spacing w:after="160" w:line="336" w:lineRule="auto"/>
-        <w:jc w:val="both"/>
-      </w:pPr>
-      <w:r>
-        <w:rPr>
-          <w:rFonts w:eastAsia="Times New Roman" w:cs="Times New Roman"/>
-        </w:rPr>
-        <w:t>Gradient-boosted trees with L1 + L2 regularisation on the leaf weights and per-tree column subsampling.  Placed second on several targets but did not win any at the default search budget.</w:t>
-      </w:r>
-    </w:p>
-    <w:p>
-      <w:pPr>
-        <w:pStyle w:val="Heading5"/>
-        <w:spacing w:before="180" w:after="60"/>
-      </w:pPr>
+        <w:t xml:space="preserve">2.6.6   </w:t>
+      </w:r>
+      <w:proofErr w:type="spellStart"/>
       <w:r>
         <w:rPr>
           <w:rFonts w:ascii="Times New Roman" w:eastAsia="Times New Roman" w:hAnsi="Times New Roman" w:cs="Times New Roman"/>
@@ -3690,8 +4324,9 @@
           <w:color w:val="000000"/>
           <w:sz w:val="24"/>
         </w:rPr>
-        <w:t>2.6.7   Stacking Classifier</w:t>
-      </w:r>
+        <w:t>XGBoost</w:t>
+      </w:r>
+      <w:proofErr w:type="spellEnd"/>
     </w:p>
     <w:p>
       <w:pPr>
@@ -3702,7 +4337,21 @@
         <w:rPr>
           <w:rFonts w:eastAsia="Times New Roman" w:cs="Times New Roman"/>
         </w:rPr>
-        <w:t>Meta-learner taking the out-of-fold predictions of Random Forest, Extra Trees, HistGBM, and XGBoost as inputs and fitting a Logistic Regression on top.  Failed to beat the strongest base learner because the four base learners largely agreed.</w:t>
+        <w:t xml:space="preserve">Gradient-boosted trees with L1 + L2 </w:t>
+      </w:r>
+      <w:proofErr w:type="spellStart"/>
+      <w:r>
+        <w:rPr>
+          <w:rFonts w:eastAsia="Times New Roman" w:cs="Times New Roman"/>
+        </w:rPr>
+        <w:t>regularisation</w:t>
+      </w:r>
+      <w:proofErr w:type="spellEnd"/>
+      <w:r>
+        <w:rPr>
+          <w:rFonts w:eastAsia="Times New Roman" w:cs="Times New Roman"/>
+        </w:rPr>
+        <w:t xml:space="preserve"> on the leaf weights and per-tree column subsampling.  Placed second on several targets but did not win any at the default search budget.</w:t>
       </w:r>
     </w:p>
     <w:p>
@@ -3717,7 +4366,7 @@
           <w:color w:val="000000"/>
           <w:sz w:val="24"/>
         </w:rPr>
-        <w:t>2.6.8   SMOTE and cross-validation</w:t>
+        <w:t>2.6.7   Stacking Classifier</w:t>
       </w:r>
     </w:p>
     <w:p>
@@ -3729,7 +4378,35 @@
         <w:rPr>
           <w:rFonts w:eastAsia="Times New Roman" w:cs="Times New Roman"/>
         </w:rPr>
-        <w:t>SMOTE synthesises new minority-class samples along segments between k nearest minority neighbours.  Wrapping it in imblearn.Pipeline keeps the synthesis inside training folds only, so validation-fold accuracy is never inflated.  k_neighbors is set per target below the minority training-fold count; GridSearchCV picks hyperparameters on macro-F1 with StratifiedKFold(5, shuffle=True, random_state=42).</w:t>
+        <w:t xml:space="preserve">Meta-learner taking the out-of-fold predictions of Random Forest, Extra Trees, </w:t>
+      </w:r>
+      <w:proofErr w:type="spellStart"/>
+      <w:r>
+        <w:rPr>
+          <w:rFonts w:eastAsia="Times New Roman" w:cs="Times New Roman"/>
+        </w:rPr>
+        <w:t>HistGBM</w:t>
+      </w:r>
+      <w:proofErr w:type="spellEnd"/>
+      <w:r>
+        <w:rPr>
+          <w:rFonts w:eastAsia="Times New Roman" w:cs="Times New Roman"/>
+        </w:rPr>
+        <w:t xml:space="preserve">, and </w:t>
+      </w:r>
+      <w:proofErr w:type="spellStart"/>
+      <w:r>
+        <w:rPr>
+          <w:rFonts w:eastAsia="Times New Roman" w:cs="Times New Roman"/>
+        </w:rPr>
+        <w:t>XGBoost</w:t>
+      </w:r>
+      <w:proofErr w:type="spellEnd"/>
+      <w:r>
+        <w:rPr>
+          <w:rFonts w:eastAsia="Times New Roman" w:cs="Times New Roman"/>
+        </w:rPr>
+        <w:t xml:space="preserve"> as inputs and fitting a Logistic Regression on top.  Failed to beat the strongest base learner because the four base learners largely agreed.</w:t>
       </w:r>
     </w:p>
     <w:p>
@@ -3744,7 +4421,7 @@
           <w:color w:val="000000"/>
           <w:sz w:val="24"/>
         </w:rPr>
-        <w:t>2.6.9   Per-target feature exclusions</w:t>
+        <w:t>2.6.8   SMOTE and cross-validation</w:t>
       </w:r>
     </w:p>
     <w:p>
@@ -3756,7 +4433,146 @@
         <w:rPr>
           <w:rFonts w:eastAsia="Times New Roman" w:cs="Times New Roman"/>
         </w:rPr>
-        <w:t>Each target excludes the survey inputs that directly define its Stage-1 label (otherwise the model would memorise the rule).  Posture additionally receives the 11 RULA components and 8 QEC scores, giving 63 total features.</w:t>
+        <w:t xml:space="preserve">SMOTE </w:t>
+      </w:r>
+      <w:proofErr w:type="spellStart"/>
+      <w:r>
+        <w:rPr>
+          <w:rFonts w:eastAsia="Times New Roman" w:cs="Times New Roman"/>
+        </w:rPr>
+        <w:t>synthesises</w:t>
+      </w:r>
+      <w:proofErr w:type="spellEnd"/>
+      <w:r>
+        <w:rPr>
+          <w:rFonts w:eastAsia="Times New Roman" w:cs="Times New Roman"/>
+        </w:rPr>
+        <w:t xml:space="preserve"> new minority-class samples along segments between k nearest minority </w:t>
+      </w:r>
+      <w:proofErr w:type="spellStart"/>
+      <w:r>
+        <w:rPr>
+          <w:rFonts w:eastAsia="Times New Roman" w:cs="Times New Roman"/>
+        </w:rPr>
+        <w:t>neighbours</w:t>
+      </w:r>
+      <w:proofErr w:type="spellEnd"/>
+      <w:r>
+        <w:rPr>
+          <w:rFonts w:eastAsia="Times New Roman" w:cs="Times New Roman"/>
+        </w:rPr>
+        <w:t xml:space="preserve">.  Wrapping it in </w:t>
+      </w:r>
+      <w:proofErr w:type="spellStart"/>
+      <w:r>
+        <w:rPr>
+          <w:rFonts w:eastAsia="Times New Roman" w:cs="Times New Roman"/>
+        </w:rPr>
+        <w:t>imblearn.Pipeline</w:t>
+      </w:r>
+      <w:proofErr w:type="spellEnd"/>
+      <w:r>
+        <w:rPr>
+          <w:rFonts w:eastAsia="Times New Roman" w:cs="Times New Roman"/>
+        </w:rPr>
+        <w:t xml:space="preserve"> keeps the synthesis inside training folds only, so validation-fold accuracy is never inflated.  </w:t>
+      </w:r>
+      <w:proofErr w:type="spellStart"/>
+      <w:r>
+        <w:rPr>
+          <w:rFonts w:eastAsia="Times New Roman" w:cs="Times New Roman"/>
+        </w:rPr>
+        <w:t>k_neighbors</w:t>
+      </w:r>
+      <w:proofErr w:type="spellEnd"/>
+      <w:r>
+        <w:rPr>
+          <w:rFonts w:eastAsia="Times New Roman" w:cs="Times New Roman"/>
+        </w:rPr>
+        <w:t xml:space="preserve"> is set per target below the minority training-fold count; </w:t>
+      </w:r>
+      <w:proofErr w:type="spellStart"/>
+      <w:r>
+        <w:rPr>
+          <w:rFonts w:eastAsia="Times New Roman" w:cs="Times New Roman"/>
+        </w:rPr>
+        <w:t>GridSearchCV</w:t>
+      </w:r>
+      <w:proofErr w:type="spellEnd"/>
+      <w:r>
+        <w:rPr>
+          <w:rFonts w:eastAsia="Times New Roman" w:cs="Times New Roman"/>
+        </w:rPr>
+        <w:t xml:space="preserve"> picks hyperparameters on macro-F1 with </w:t>
+      </w:r>
+      <w:proofErr w:type="spellStart"/>
+      <w:r>
+        <w:rPr>
+          <w:rFonts w:eastAsia="Times New Roman" w:cs="Times New Roman"/>
+        </w:rPr>
+        <w:t>StratifiedKFold</w:t>
+      </w:r>
+      <w:proofErr w:type="spellEnd"/>
+      <w:r>
+        <w:rPr>
+          <w:rFonts w:eastAsia="Times New Roman" w:cs="Times New Roman"/>
+        </w:rPr>
+        <w:t xml:space="preserve">(5, shuffle=True, </w:t>
+      </w:r>
+      <w:proofErr w:type="spellStart"/>
+      <w:r>
+        <w:rPr>
+          <w:rFonts w:eastAsia="Times New Roman" w:cs="Times New Roman"/>
+        </w:rPr>
+        <w:t>random_state</w:t>
+      </w:r>
+      <w:proofErr w:type="spellEnd"/>
+      <w:r>
+        <w:rPr>
+          <w:rFonts w:eastAsia="Times New Roman" w:cs="Times New Roman"/>
+        </w:rPr>
+        <w:t>=42).</w:t>
+      </w:r>
+    </w:p>
+    <w:p>
+      <w:pPr>
+        <w:pStyle w:val="Heading5"/>
+        <w:spacing w:before="180" w:after="60"/>
+      </w:pPr>
+      <w:r>
+        <w:rPr>
+          <w:rFonts w:ascii="Times New Roman" w:eastAsia="Times New Roman" w:hAnsi="Times New Roman" w:cs="Times New Roman"/>
+          <w:b/>
+          <w:color w:val="000000"/>
+          <w:sz w:val="24"/>
+        </w:rPr>
+        <w:t>2.6.9   Per-target feature exclusions</w:t>
+      </w:r>
+    </w:p>
+    <w:p>
+      <w:pPr>
+        <w:spacing w:after="160" w:line="336" w:lineRule="auto"/>
+        <w:jc w:val="both"/>
+      </w:pPr>
+      <w:r>
+        <w:rPr>
+          <w:rFonts w:eastAsia="Times New Roman" w:cs="Times New Roman"/>
+        </w:rPr>
+        <w:t xml:space="preserve">Each target excludes the survey inputs that directly define its Stage-1 label (otherwise the model would </w:t>
+      </w:r>
+      <w:proofErr w:type="spellStart"/>
+      <w:r>
+        <w:rPr>
+          <w:rFonts w:eastAsia="Times New Roman" w:cs="Times New Roman"/>
+        </w:rPr>
+        <w:t>memorise</w:t>
+      </w:r>
+      <w:proofErr w:type="spellEnd"/>
+      <w:r>
+        <w:rPr>
+          <w:rFonts w:eastAsia="Times New Roman" w:cs="Times New Roman"/>
+        </w:rPr>
+        <w:t xml:space="preserve"> the rule).  Posture additionally receives the 11 RULA components and 8 QEC scores, giving 63 total features.</w:t>
       </w:r>
     </w:p>
     <w:tbl>
@@ -3866,13 +4682,31 @@
             <w:pPr>
               <w:spacing w:before="20" w:after="20"/>
             </w:pPr>
-            <w:r>
-              <w:rPr>
-                <w:rFonts w:eastAsia="Times New Roman" w:cs="Times New Roman"/>
-                <w:sz w:val="20"/>
-              </w:rPr>
-              <w:t>force_exertion, force_x_age</w:t>
-            </w:r>
+            <w:proofErr w:type="spellStart"/>
+            <w:r>
+              <w:rPr>
+                <w:rFonts w:eastAsia="Times New Roman" w:cs="Times New Roman"/>
+                <w:sz w:val="20"/>
+              </w:rPr>
+              <w:t>force_exertion</w:t>
+            </w:r>
+            <w:proofErr w:type="spellEnd"/>
+            <w:r>
+              <w:rPr>
+                <w:rFonts w:eastAsia="Times New Roman" w:cs="Times New Roman"/>
+                <w:sz w:val="20"/>
+              </w:rPr>
+              <w:t xml:space="preserve">, </w:t>
+            </w:r>
+            <w:proofErr w:type="spellStart"/>
+            <w:r>
+              <w:rPr>
+                <w:rFonts w:eastAsia="Times New Roman" w:cs="Times New Roman"/>
+                <w:sz w:val="20"/>
+              </w:rPr>
+              <w:t>force_x_age</w:t>
+            </w:r>
+            <w:proofErr w:type="spellEnd"/>
           </w:p>
         </w:tc>
         <w:tc>
@@ -3924,13 +4758,47 @@
             <w:pPr>
               <w:spacing w:before="20" w:after="20"/>
             </w:pPr>
-            <w:r>
-              <w:rPr>
-                <w:rFonts w:eastAsia="Times New Roman" w:cs="Times New Roman"/>
-                <w:sz w:val="20"/>
-              </w:rPr>
-              <w:t>deliveries_num, work_hours_num, deliv_x_days</w:t>
-            </w:r>
+            <w:proofErr w:type="spellStart"/>
+            <w:r>
+              <w:rPr>
+                <w:rFonts w:eastAsia="Times New Roman" w:cs="Times New Roman"/>
+                <w:sz w:val="20"/>
+              </w:rPr>
+              <w:t>deliveries_num</w:t>
+            </w:r>
+            <w:proofErr w:type="spellEnd"/>
+            <w:r>
+              <w:rPr>
+                <w:rFonts w:eastAsia="Times New Roman" w:cs="Times New Roman"/>
+                <w:sz w:val="20"/>
+              </w:rPr>
+              <w:t xml:space="preserve">, </w:t>
+            </w:r>
+            <w:proofErr w:type="spellStart"/>
+            <w:r>
+              <w:rPr>
+                <w:rFonts w:eastAsia="Times New Roman" w:cs="Times New Roman"/>
+                <w:sz w:val="20"/>
+              </w:rPr>
+              <w:t>work_hours_num</w:t>
+            </w:r>
+            <w:proofErr w:type="spellEnd"/>
+            <w:r>
+              <w:rPr>
+                <w:rFonts w:eastAsia="Times New Roman" w:cs="Times New Roman"/>
+                <w:sz w:val="20"/>
+              </w:rPr>
+              <w:t xml:space="preserve">, </w:t>
+            </w:r>
+            <w:proofErr w:type="spellStart"/>
+            <w:r>
+              <w:rPr>
+                <w:rFonts w:eastAsia="Times New Roman" w:cs="Times New Roman"/>
+                <w:sz w:val="20"/>
+              </w:rPr>
+              <w:t>deliv_x_days</w:t>
+            </w:r>
+            <w:proofErr w:type="spellEnd"/>
           </w:p>
         </w:tc>
         <w:tc>
@@ -3982,13 +4850,31 @@
             <w:pPr>
               <w:spacing w:before="20" w:after="20"/>
             </w:pPr>
-            <w:r>
-              <w:rPr>
-                <w:rFonts w:eastAsia="Times New Roman" w:cs="Times New Roman"/>
-                <w:sz w:val="20"/>
-              </w:rPr>
-              <w:t>work_hours_num, vibration_index</w:t>
-            </w:r>
+            <w:proofErr w:type="spellStart"/>
+            <w:r>
+              <w:rPr>
+                <w:rFonts w:eastAsia="Times New Roman" w:cs="Times New Roman"/>
+                <w:sz w:val="20"/>
+              </w:rPr>
+              <w:t>work_hours_num</w:t>
+            </w:r>
+            <w:proofErr w:type="spellEnd"/>
+            <w:r>
+              <w:rPr>
+                <w:rFonts w:eastAsia="Times New Roman" w:cs="Times New Roman"/>
+                <w:sz w:val="20"/>
+              </w:rPr>
+              <w:t xml:space="preserve">, </w:t>
+            </w:r>
+            <w:proofErr w:type="spellStart"/>
+            <w:r>
+              <w:rPr>
+                <w:rFonts w:eastAsia="Times New Roman" w:cs="Times New Roman"/>
+                <w:sz w:val="20"/>
+              </w:rPr>
+              <w:t>vibration_index</w:t>
+            </w:r>
+            <w:proofErr w:type="spellEnd"/>
           </w:p>
         </w:tc>
         <w:tc>
@@ -4040,13 +4926,47 @@
             <w:pPr>
               <w:spacing w:before="20" w:after="20"/>
             </w:pPr>
-            <w:r>
-              <w:rPr>
-                <w:rFonts w:eastAsia="Times New Roman" w:cs="Times New Roman"/>
-                <w:sz w:val="20"/>
-              </w:rPr>
-              <w:t>vibration_index, vehicle_rank, work_hours_num</w:t>
-            </w:r>
+            <w:proofErr w:type="spellStart"/>
+            <w:r>
+              <w:rPr>
+                <w:rFonts w:eastAsia="Times New Roman" w:cs="Times New Roman"/>
+                <w:sz w:val="20"/>
+              </w:rPr>
+              <w:t>vibration_index</w:t>
+            </w:r>
+            <w:proofErr w:type="spellEnd"/>
+            <w:r>
+              <w:rPr>
+                <w:rFonts w:eastAsia="Times New Roman" w:cs="Times New Roman"/>
+                <w:sz w:val="20"/>
+              </w:rPr>
+              <w:t xml:space="preserve">, </w:t>
+            </w:r>
+            <w:proofErr w:type="spellStart"/>
+            <w:r>
+              <w:rPr>
+                <w:rFonts w:eastAsia="Times New Roman" w:cs="Times New Roman"/>
+                <w:sz w:val="20"/>
+              </w:rPr>
+              <w:t>vehicle_rank</w:t>
+            </w:r>
+            <w:proofErr w:type="spellEnd"/>
+            <w:r>
+              <w:rPr>
+                <w:rFonts w:eastAsia="Times New Roman" w:cs="Times New Roman"/>
+                <w:sz w:val="20"/>
+              </w:rPr>
+              <w:t xml:space="preserve">, </w:t>
+            </w:r>
+            <w:proofErr w:type="spellStart"/>
+            <w:r>
+              <w:rPr>
+                <w:rFonts w:eastAsia="Times New Roman" w:cs="Times New Roman"/>
+                <w:sz w:val="20"/>
+              </w:rPr>
+              <w:t>work_hours_num</w:t>
+            </w:r>
+            <w:proofErr w:type="spellEnd"/>
           </w:p>
         </w:tc>
         <w:tc>
@@ -4098,13 +5018,31 @@
             <w:pPr>
               <w:spacing w:before="20" w:after="20"/>
             </w:pPr>
-            <w:r>
-              <w:rPr>
-                <w:rFonts w:eastAsia="Times New Roman" w:cs="Times New Roman"/>
-                <w:sz w:val="20"/>
-              </w:rPr>
-              <w:t>carrying_contact_rank, work_hours_num</w:t>
-            </w:r>
+            <w:proofErr w:type="spellStart"/>
+            <w:r>
+              <w:rPr>
+                <w:rFonts w:eastAsia="Times New Roman" w:cs="Times New Roman"/>
+                <w:sz w:val="20"/>
+              </w:rPr>
+              <w:t>carrying_contact_rank</w:t>
+            </w:r>
+            <w:proofErr w:type="spellEnd"/>
+            <w:r>
+              <w:rPr>
+                <w:rFonts w:eastAsia="Times New Roman" w:cs="Times New Roman"/>
+                <w:sz w:val="20"/>
+              </w:rPr>
+              <w:t xml:space="preserve">, </w:t>
+            </w:r>
+            <w:proofErr w:type="spellStart"/>
+            <w:r>
+              <w:rPr>
+                <w:rFonts w:eastAsia="Times New Roman" w:cs="Times New Roman"/>
+                <w:sz w:val="20"/>
+              </w:rPr>
+              <w:t>work_hours_num</w:t>
+            </w:r>
+            <w:proofErr w:type="spellEnd"/>
           </w:p>
         </w:tc>
         <w:tc>
@@ -4227,7 +5165,49 @@
         <w:rPr>
           <w:rFonts w:eastAsia="Times New Roman" w:cs="Times New Roman"/>
         </w:rPr>
-        <w:t>Phase 7 (07_evaluation.ipynb) uses cross_val_predict for out-of-fold predictions and writes per-class precision / recall / F1 / support, confusion matrices, one-vs-rest ROC curves with per-class AUC (macro AUC is the unweighted mean), and feature importance (feature_importances_ for tree models, abs(coef_) for Logistic Regression).</w:t>
+        <w:t xml:space="preserve">Phase 7 (07_evaluation.ipynb) uses </w:t>
+      </w:r>
+      <w:proofErr w:type="spellStart"/>
+      <w:r>
+        <w:rPr>
+          <w:rFonts w:eastAsia="Times New Roman" w:cs="Times New Roman"/>
+        </w:rPr>
+        <w:t>cross_val_predict</w:t>
+      </w:r>
+      <w:proofErr w:type="spellEnd"/>
+      <w:r>
+        <w:rPr>
+          <w:rFonts w:eastAsia="Times New Roman" w:cs="Times New Roman"/>
+        </w:rPr>
+        <w:t xml:space="preserve"> for out-of-fold predictions and writes per-class precision / recall / F1 / support, confusion matrices, one-vs-rest ROC curves with per-class AUC (macro AUC is the unweighted mean), and feature importance (</w:t>
+      </w:r>
+      <w:proofErr w:type="spellStart"/>
+      <w:r>
+        <w:rPr>
+          <w:rFonts w:eastAsia="Times New Roman" w:cs="Times New Roman"/>
+        </w:rPr>
+        <w:t>feature_importances</w:t>
+      </w:r>
+      <w:proofErr w:type="spellEnd"/>
+      <w:r>
+        <w:rPr>
+          <w:rFonts w:eastAsia="Times New Roman" w:cs="Times New Roman"/>
+        </w:rPr>
+        <w:t>_ for tree models, abs(</w:t>
+      </w:r>
+      <w:proofErr w:type="spellStart"/>
+      <w:r>
+        <w:rPr>
+          <w:rFonts w:eastAsia="Times New Roman" w:cs="Times New Roman"/>
+        </w:rPr>
+        <w:t>coef</w:t>
+      </w:r>
+      <w:proofErr w:type="spellEnd"/>
+      <w:r>
+        <w:rPr>
+          <w:rFonts w:eastAsia="Times New Roman" w:cs="Times New Roman"/>
+        </w:rPr>
+        <w:t>_) for Logistic Regression).</w:t>
       </w:r>
     </w:p>
     <w:p>
@@ -4269,7 +5249,21 @@
         <w:rPr>
           <w:rFonts w:eastAsia="Times New Roman" w:cs="Times New Roman"/>
         </w:rPr>
-        <w:t>The full pipeline is implemented across seven Jupyter notebooks (01 through 07) plus a Streamlit application. Every notebook is designed to run standalone from its previous input file, so the whole pipeline can be regenerated end to end with a fixed random seed of 42.</w:t>
+        <w:t xml:space="preserve">The full pipeline is implemented across seven Jupyter notebooks (01 through 07) plus a </w:t>
+      </w:r>
+      <w:proofErr w:type="spellStart"/>
+      <w:r>
+        <w:rPr>
+          <w:rFonts w:eastAsia="Times New Roman" w:cs="Times New Roman"/>
+        </w:rPr>
+        <w:t>Streamlit</w:t>
+      </w:r>
+      <w:proofErr w:type="spellEnd"/>
+      <w:r>
+        <w:rPr>
+          <w:rFonts w:eastAsia="Times New Roman" w:cs="Times New Roman"/>
+        </w:rPr>
+        <w:t xml:space="preserve"> application. Every notebook is designed to run standalone from its previous input file, so the whole pipeline can be regenerated end to end with a fixed random seed of 42.</w:t>
       </w:r>
     </w:p>
     <w:p>
@@ -4281,7 +5275,21 @@
         <w:rPr>
           <w:rFonts w:eastAsia="Times New Roman" w:cs="Times New Roman"/>
         </w:rPr>
-        <w:t>01_data_cleaning normalises the raw CSV and validates row counts.</w:t>
+        <w:t xml:space="preserve">01_data_cleaning </w:t>
+      </w:r>
+      <w:proofErr w:type="spellStart"/>
+      <w:r>
+        <w:rPr>
+          <w:rFonts w:eastAsia="Times New Roman" w:cs="Times New Roman"/>
+        </w:rPr>
+        <w:t>normalises</w:t>
+      </w:r>
+      <w:proofErr w:type="spellEnd"/>
+      <w:r>
+        <w:rPr>
+          <w:rFonts w:eastAsia="Times New Roman" w:cs="Times New Roman"/>
+        </w:rPr>
+        <w:t xml:space="preserve"> the raw CSV and validates row counts.</w:t>
       </w:r>
     </w:p>
     <w:p>
@@ -4293,7 +5301,21 @@
         <w:rPr>
           <w:rFonts w:eastAsia="Times New Roman" w:cs="Times New Roman"/>
         </w:rPr>
-        <w:t>02_feature_engineering encodes categoricals, derives composite scores, aliases the 18 binary items, and merges the posture observations by severity rank.</w:t>
+        <w:t xml:space="preserve">02_feature_engineering encodes </w:t>
+      </w:r>
+      <w:proofErr w:type="spellStart"/>
+      <w:r>
+        <w:rPr>
+          <w:rFonts w:eastAsia="Times New Roman" w:cs="Times New Roman"/>
+        </w:rPr>
+        <w:t>categoricals</w:t>
+      </w:r>
+      <w:proofErr w:type="spellEnd"/>
+      <w:r>
+        <w:rPr>
+          <w:rFonts w:eastAsia="Times New Roman" w:cs="Times New Roman"/>
+        </w:rPr>
+        <w:t>, derives composite scores, aliases the 18 binary items, and merges the posture observations by severity rank.</w:t>
       </w:r>
     </w:p>
     <w:p>
@@ -4341,7 +5363,21 @@
         <w:rPr>
           <w:rFonts w:eastAsia="Times New Roman" w:cs="Times New Roman"/>
         </w:rPr>
-        <w:t>06_modeling runs SMOTE plus GridSearchCV across 7 algorithms per target and keeps the best by F1 macro.</w:t>
+        <w:t xml:space="preserve">06_modeling runs SMOTE plus </w:t>
+      </w:r>
+      <w:proofErr w:type="spellStart"/>
+      <w:r>
+        <w:rPr>
+          <w:rFonts w:eastAsia="Times New Roman" w:cs="Times New Roman"/>
+        </w:rPr>
+        <w:t>GridSearchCV</w:t>
+      </w:r>
+      <w:proofErr w:type="spellEnd"/>
+      <w:r>
+        <w:rPr>
+          <w:rFonts w:eastAsia="Times New Roman" w:cs="Times New Roman"/>
+        </w:rPr>
+        <w:t xml:space="preserve"> across 7 algorithms per target and keeps the best by F1 macro.</w:t>
       </w:r>
     </w:p>
     <w:p>
@@ -4430,7 +5466,21 @@
         <w:rPr>
           <w:rFonts w:eastAsia="Times New Roman" w:cs="Times New Roman"/>
         </w:rPr>
-        <w:t>Each participant gave verbal consent before either instrument was administered. The 36-item Google Form was completed on a researcher-provided phone in about 15 to 20 minutes. Posture was recorded on paper by a trained observer during a natural delivery task, capturing the 11 RULA elements and 8 QEC region / exposure scores in one pass. Riders whose demographic or NMQ responses were incomplete after follow-up were excluded and are not part of the final 182. Data was anonymised at the point of collection; no rider identifiers appear in the released model_ready.csv or posture_data.xlsx files.</w:t>
+        <w:t xml:space="preserve">Each participant gave verbal consent before either instrument was administered. The 36-item Google Form was completed on a researcher-provided phone in about 15 to 20 minutes. Posture was recorded on paper by a trained observer during a natural delivery task, capturing the 11 RULA elements and 8 QEC region / exposure scores in one pass. Riders whose demographic or NMQ responses were incomplete after follow-up were excluded and are not part of the final 182. Data was </w:t>
+      </w:r>
+      <w:proofErr w:type="spellStart"/>
+      <w:r>
+        <w:rPr>
+          <w:rFonts w:eastAsia="Times New Roman" w:cs="Times New Roman"/>
+        </w:rPr>
+        <w:t>anonymised</w:t>
+      </w:r>
+      <w:proofErr w:type="spellEnd"/>
+      <w:r>
+        <w:rPr>
+          <w:rFonts w:eastAsia="Times New Roman" w:cs="Times New Roman"/>
+        </w:rPr>
+        <w:t xml:space="preserve"> at the point of collection; no rider identifiers appear in the released model_ready.csv or posture_data.xlsx files.</w:t>
       </w:r>
     </w:p>
     <w:p>
@@ -4456,7 +5506,21 @@
         <w:rPr>
           <w:rFonts w:eastAsia="Times New Roman" w:cs="Times New Roman"/>
         </w:rPr>
-        <w:t>Data preparation ran in two notebooks. 01_data_cleaning loaded the raw Google Form CSV, standardised text answers to canonical Yes / No values, corrected a handful of column-name typos, and dropped rows that were incomplete after follow-up. The cleaned CSV was 182 rows and 48 columns.</w:t>
+        <w:t xml:space="preserve">Data preparation ran in two notebooks. 01_data_cleaning loaded the raw Google Form CSV, </w:t>
+      </w:r>
+      <w:proofErr w:type="spellStart"/>
+      <w:r>
+        <w:rPr>
+          <w:rFonts w:eastAsia="Times New Roman" w:cs="Times New Roman"/>
+        </w:rPr>
+        <w:t>standardised</w:t>
+      </w:r>
+      <w:proofErr w:type="spellEnd"/>
+      <w:r>
+        <w:rPr>
+          <w:rFonts w:eastAsia="Times New Roman" w:cs="Times New Roman"/>
+        </w:rPr>
+        <w:t xml:space="preserve"> text answers to canonical Yes / No values, corrected a handful of column-name typos, and dropped rows that were incomplete after follow-up. The cleaned CSV was 182 rows and 48 columns.</w:t>
       </w:r>
     </w:p>
     <w:p>
@@ -4468,7 +5532,119 @@
         <w:rPr>
           <w:rFonts w:eastAsia="Times New Roman" w:cs="Times New Roman"/>
         </w:rPr>
-        <w:t>02_feature_engineering converted the cleaned CSV into the model-ready feature set. Ordered categorical bands (age, education, income, job duration, working hours, working days, deliveries per day, rest break) were encoded to consecutive integers preserving order. Vehicle type and carrying mode were converted to ranks so motorbike ranks higher than scooter for vibration exposure and handheld ranks higher than backpack and bike storage for contact stress. Composite scores were computed: workload_score as the mean of the six NASA-TLX items (with the dissatisfied item reversed), fatigue_score as the mean of the six Borg items, force_exertion as the Borg lifting item, and vibration_index as vehicle_rank times work_hours_num. Five product-form interactions were added (workload times fatigue, workload times age, force times age, fatigue times job duration, deliveries times days). The eighteen NMQ and 7-day items and the five outcome follow-ups were converted to short-named binary aliases (nmq_neck, d7_lower_back, out_reduced_perf, and so on).</w:t>
+        <w:t xml:space="preserve">02_feature_engineering converted the cleaned CSV into the model-ready feature set. Ordered categorical bands (age, education, income, job duration, working hours, working days, deliveries per day, rest break) were encoded to consecutive integers preserving order. Vehicle type and carrying mode were converted to ranks so motorbike ranks higher than scooter for vibration exposure and handheld ranks higher than backpack and bike storage for contact stress. Composite scores were computed: </w:t>
+      </w:r>
+      <w:proofErr w:type="spellStart"/>
+      <w:r>
+        <w:rPr>
+          <w:rFonts w:eastAsia="Times New Roman" w:cs="Times New Roman"/>
+        </w:rPr>
+        <w:t>workload_score</w:t>
+      </w:r>
+      <w:proofErr w:type="spellEnd"/>
+      <w:r>
+        <w:rPr>
+          <w:rFonts w:eastAsia="Times New Roman" w:cs="Times New Roman"/>
+        </w:rPr>
+        <w:t xml:space="preserve"> as the mean of the six NASA-TLX items (with the dissatisfied item reversed), </w:t>
+      </w:r>
+      <w:proofErr w:type="spellStart"/>
+      <w:r>
+        <w:rPr>
+          <w:rFonts w:eastAsia="Times New Roman" w:cs="Times New Roman"/>
+        </w:rPr>
+        <w:t>fatigue_score</w:t>
+      </w:r>
+      <w:proofErr w:type="spellEnd"/>
+      <w:r>
+        <w:rPr>
+          <w:rFonts w:eastAsia="Times New Roman" w:cs="Times New Roman"/>
+        </w:rPr>
+        <w:t xml:space="preserve"> as the mean of the six Borg items, </w:t>
+      </w:r>
+      <w:proofErr w:type="spellStart"/>
+      <w:r>
+        <w:rPr>
+          <w:rFonts w:eastAsia="Times New Roman" w:cs="Times New Roman"/>
+        </w:rPr>
+        <w:t>force_exertion</w:t>
+      </w:r>
+      <w:proofErr w:type="spellEnd"/>
+      <w:r>
+        <w:rPr>
+          <w:rFonts w:eastAsia="Times New Roman" w:cs="Times New Roman"/>
+        </w:rPr>
+        <w:t xml:space="preserve"> as the Borg lifting item, and </w:t>
+      </w:r>
+      <w:proofErr w:type="spellStart"/>
+      <w:r>
+        <w:rPr>
+          <w:rFonts w:eastAsia="Times New Roman" w:cs="Times New Roman"/>
+        </w:rPr>
+        <w:t>vibration_index</w:t>
+      </w:r>
+      <w:proofErr w:type="spellEnd"/>
+      <w:r>
+        <w:rPr>
+          <w:rFonts w:eastAsia="Times New Roman" w:cs="Times New Roman"/>
+        </w:rPr>
+        <w:t xml:space="preserve"> as </w:t>
+      </w:r>
+      <w:proofErr w:type="spellStart"/>
+      <w:r>
+        <w:rPr>
+          <w:rFonts w:eastAsia="Times New Roman" w:cs="Times New Roman"/>
+        </w:rPr>
+        <w:t>vehicle_rank</w:t>
+      </w:r>
+      <w:proofErr w:type="spellEnd"/>
+      <w:r>
+        <w:rPr>
+          <w:rFonts w:eastAsia="Times New Roman" w:cs="Times New Roman"/>
+        </w:rPr>
+        <w:t xml:space="preserve"> times </w:t>
+      </w:r>
+      <w:proofErr w:type="spellStart"/>
+      <w:r>
+        <w:rPr>
+          <w:rFonts w:eastAsia="Times New Roman" w:cs="Times New Roman"/>
+        </w:rPr>
+        <w:t>work_hours_num</w:t>
+      </w:r>
+      <w:proofErr w:type="spellEnd"/>
+      <w:r>
+        <w:rPr>
+          <w:rFonts w:eastAsia="Times New Roman" w:cs="Times New Roman"/>
+        </w:rPr>
+        <w:t>. Five product-form interactions were added (workload times fatigue, workload times age, force times age, fatigue times job duration, deliveries times days). The eighteen NMQ and 7-day items and the five outcome follow-ups were converted to short-named binary aliases (</w:t>
+      </w:r>
+      <w:proofErr w:type="spellStart"/>
+      <w:r>
+        <w:rPr>
+          <w:rFonts w:eastAsia="Times New Roman" w:cs="Times New Roman"/>
+        </w:rPr>
+        <w:t>nmq_neck</w:t>
+      </w:r>
+      <w:proofErr w:type="spellEnd"/>
+      <w:r>
+        <w:rPr>
+          <w:rFonts w:eastAsia="Times New Roman" w:cs="Times New Roman"/>
+        </w:rPr>
+        <w:t xml:space="preserve">, d7_lower_back, </w:t>
+      </w:r>
+      <w:proofErr w:type="spellStart"/>
+      <w:r>
+        <w:rPr>
+          <w:rFonts w:eastAsia="Times New Roman" w:cs="Times New Roman"/>
+        </w:rPr>
+        <w:t>out_reduced_perf</w:t>
+      </w:r>
+      <w:proofErr w:type="spellEnd"/>
+      <w:r>
+        <w:rPr>
+          <w:rFonts w:eastAsia="Times New Roman" w:cs="Times New Roman"/>
+        </w:rPr>
+        <w:t>, and so on).</w:t>
       </w:r>
     </w:p>
     <w:p>
@@ -4507,7 +5683,21 @@
         <w:rPr>
           <w:rFonts w:eastAsia="Times New Roman" w:cs="Times New Roman"/>
         </w:rPr>
-        <w:t>Two independent statistical analyses were run in 05_stats on the model-ready CSV. First, six chi-square tests of independence checked whether each Stage-1 risk-factor band was associated with a binary discomfort outcome; the tests reported chi2, degrees of freedom, and a Bonferroni-adjusted p-value. Second, a multivariable logistic regression fitted with statsmodels estimated odds ratios for eleven predictors (age, income, education, job duration, workload score, fatigue score, force exertion, vibration index, contact rank, hours, days) with self-reported discomfort as the outcome. Results were reported as OR with 95 percent confidence intervals.</w:t>
+        <w:t xml:space="preserve">Two independent statistical analyses were run in 05_stats on the model-ready CSV. First, six chi-square tests of independence checked whether each Stage-1 risk-factor band was associated with a binary discomfort outcome; the tests reported chi2, degrees of freedom, and a Bonferroni-adjusted p-value. Second, a multivariable logistic regression fitted with </w:t>
+      </w:r>
+      <w:proofErr w:type="spellStart"/>
+      <w:r>
+        <w:rPr>
+          <w:rFonts w:eastAsia="Times New Roman" w:cs="Times New Roman"/>
+        </w:rPr>
+        <w:t>statsmodels</w:t>
+      </w:r>
+      <w:proofErr w:type="spellEnd"/>
+      <w:r>
+        <w:rPr>
+          <w:rFonts w:eastAsia="Times New Roman" w:cs="Times New Roman"/>
+        </w:rPr>
+        <w:t xml:space="preserve"> estimated odds ratios for eleven predictors (age, income, education, job duration, workload score, fatigue score, force exertion, vibration index, contact rank, hours, days) with self-reported discomfort as the outcome. Results were reported as OR with 95 percent confidence intervals.</w:t>
       </w:r>
     </w:p>
     <w:p>
@@ -4519,7 +5709,77 @@
         <w:rPr>
           <w:rFonts w:eastAsia="Times New Roman" w:cs="Times New Roman"/>
         </w:rPr>
-        <w:t>Model training ran in 06_modeling. Every one of the seven candidate algorithms was wrapped in an imblearn.Pipeline of SMOTE followed by the classifier and hyperparameter-tuned via GridSearchCV. For each of the six risk-factor targets, this expanded to a full five-fold stratified cross-validation over the algorithm's hyperparameter grid. Across the six targets and seven algorithms, forty-two target-algorithm training runs were carried out. Best-by-macro-F1 was selected per target and the winning pipeline was refit on the full sample and persisted with joblib.dump to outputs/models/best_&lt;factor&gt;.pkl. The per-target feature exclusions listed in Section 2.6.9 were applied before each training run so no model could memorise its Stage-1 rule.</w:t>
+        <w:t xml:space="preserve">Model training ran in 06_modeling. Every one of the seven candidate algorithms was wrapped in an </w:t>
+      </w:r>
+      <w:proofErr w:type="spellStart"/>
+      <w:r>
+        <w:rPr>
+          <w:rFonts w:eastAsia="Times New Roman" w:cs="Times New Roman"/>
+        </w:rPr>
+        <w:t>imblearn.Pipeline</w:t>
+      </w:r>
+      <w:proofErr w:type="spellEnd"/>
+      <w:r>
+        <w:rPr>
+          <w:rFonts w:eastAsia="Times New Roman" w:cs="Times New Roman"/>
+        </w:rPr>
+        <w:t xml:space="preserve"> of SMOTE followed by the classifier and hyperparameter-tuned via </w:t>
+      </w:r>
+      <w:proofErr w:type="spellStart"/>
+      <w:r>
+        <w:rPr>
+          <w:rFonts w:eastAsia="Times New Roman" w:cs="Times New Roman"/>
+        </w:rPr>
+        <w:t>GridSearchCV</w:t>
+      </w:r>
+      <w:proofErr w:type="spellEnd"/>
+      <w:r>
+        <w:rPr>
+          <w:rFonts w:eastAsia="Times New Roman" w:cs="Times New Roman"/>
+        </w:rPr>
+        <w:t xml:space="preserve">. For each of the six risk-factor targets, this expanded to a full five-fold stratified cross-validation over the algorithm's hyperparameter grid. Across the six targets and seven algorithms, forty-two target-algorithm training runs were carried out. Best-by-macro-F1 was selected per target and the winning pipeline was refit on the full sample and persisted with </w:t>
+      </w:r>
+      <w:proofErr w:type="spellStart"/>
+      <w:r>
+        <w:rPr>
+          <w:rFonts w:eastAsia="Times New Roman" w:cs="Times New Roman"/>
+        </w:rPr>
+        <w:t>joblib.dump</w:t>
+      </w:r>
+      <w:proofErr w:type="spellEnd"/>
+      <w:r>
+        <w:rPr>
+          <w:rFonts w:eastAsia="Times New Roman" w:cs="Times New Roman"/>
+        </w:rPr>
+        <w:t xml:space="preserve"> to outputs/models/best_&lt;factor&gt;.</w:t>
+      </w:r>
+      <w:proofErr w:type="spellStart"/>
+      <w:r>
+        <w:rPr>
+          <w:rFonts w:eastAsia="Times New Roman" w:cs="Times New Roman"/>
+        </w:rPr>
+        <w:t>pkl</w:t>
+      </w:r>
+      <w:proofErr w:type="spellEnd"/>
+      <w:r>
+        <w:rPr>
+          <w:rFonts w:eastAsia="Times New Roman" w:cs="Times New Roman"/>
+        </w:rPr>
+        <w:t xml:space="preserve">. The per-target feature exclusions listed in Section 2.6.9 were applied before each training run so no model could </w:t>
+      </w:r>
+      <w:proofErr w:type="spellStart"/>
+      <w:r>
+        <w:rPr>
+          <w:rFonts w:eastAsia="Times New Roman" w:cs="Times New Roman"/>
+        </w:rPr>
+        <w:t>memorise</w:t>
+      </w:r>
+      <w:proofErr w:type="spellEnd"/>
+      <w:r>
+        <w:rPr>
+          <w:rFonts w:eastAsia="Times New Roman" w:cs="Times New Roman"/>
+        </w:rPr>
+        <w:t xml:space="preserve"> its Stage-1 rule.</w:t>
       </w:r>
     </w:p>
     <w:p>
@@ -4531,7 +5791,63 @@
         <w:rPr>
           <w:rFonts w:eastAsia="Times New Roman" w:cs="Times New Roman"/>
         </w:rPr>
-        <w:t>07_evaluation produced the reporting artefacts. cross_val_predict was used to generate out-of-fold predictions on the training set, and the following outputs were written: per-class precision, recall, F1, and support numbers via classification_report; confusion matrices per target; one-vs-rest ROC curves with per-class AUC (macro AUC is the unweighted mean of per-class AUCs); and feature importance plots (feature_importances_ for the tree-based winners, absolute value of coef_ for the Logistic Regression floor).</w:t>
+        <w:t xml:space="preserve">07_evaluation produced the reporting artefacts. </w:t>
+      </w:r>
+      <w:proofErr w:type="spellStart"/>
+      <w:r>
+        <w:rPr>
+          <w:rFonts w:eastAsia="Times New Roman" w:cs="Times New Roman"/>
+        </w:rPr>
+        <w:t>cross_val_predict</w:t>
+      </w:r>
+      <w:proofErr w:type="spellEnd"/>
+      <w:r>
+        <w:rPr>
+          <w:rFonts w:eastAsia="Times New Roman" w:cs="Times New Roman"/>
+        </w:rPr>
+        <w:t xml:space="preserve"> was used to generate out-of-fold predictions on the training set, and the following outputs were written: per-class precision, recall, F1, and support numbers via </w:t>
+      </w:r>
+      <w:proofErr w:type="spellStart"/>
+      <w:r>
+        <w:rPr>
+          <w:rFonts w:eastAsia="Times New Roman" w:cs="Times New Roman"/>
+        </w:rPr>
+        <w:t>classification_report</w:t>
+      </w:r>
+      <w:proofErr w:type="spellEnd"/>
+      <w:r>
+        <w:rPr>
+          <w:rFonts w:eastAsia="Times New Roman" w:cs="Times New Roman"/>
+        </w:rPr>
+        <w:t>; confusion matrices per target; one-vs-rest ROC curves with per-class AUC (macro AUC is the unweighted mean of per-class AUCs); and feature importance plots (</w:t>
+      </w:r>
+      <w:proofErr w:type="spellStart"/>
+      <w:r>
+        <w:rPr>
+          <w:rFonts w:eastAsia="Times New Roman" w:cs="Times New Roman"/>
+        </w:rPr>
+        <w:t>feature_importances</w:t>
+      </w:r>
+      <w:proofErr w:type="spellEnd"/>
+      <w:r>
+        <w:rPr>
+          <w:rFonts w:eastAsia="Times New Roman" w:cs="Times New Roman"/>
+        </w:rPr>
+        <w:t xml:space="preserve">_ for the tree-based winners, absolute value of </w:t>
+      </w:r>
+      <w:proofErr w:type="spellStart"/>
+      <w:r>
+        <w:rPr>
+          <w:rFonts w:eastAsia="Times New Roman" w:cs="Times New Roman"/>
+        </w:rPr>
+        <w:t>coef</w:t>
+      </w:r>
+      <w:proofErr w:type="spellEnd"/>
+      <w:r>
+        <w:rPr>
+          <w:rFonts w:eastAsia="Times New Roman" w:cs="Times New Roman"/>
+        </w:rPr>
+        <w:t>_ for the Logistic Regression floor).</w:t>
       </w:r>
     </w:p>
     <w:p>
@@ -4557,7 +5873,49 @@
         <w:rPr>
           <w:rFonts w:eastAsia="Times New Roman" w:cs="Times New Roman"/>
         </w:rPr>
-        <w:t>The Streamlit web application (app/streamlit_app.py) exposes a six-section form that mirrors the entire 36-item questionnaire plus the 11 RULA components and 8 QEC scores. Selectboxes cover demographics and work pattern; radios cover NMQ, 7-day, and outcome items; sliders cover NASA-TLX (0 to 100) and Borg CR10 (0 to 10); selectboxes cover RULA components; and number inputs cover the QEC scores with min / max ranges matched to the observed training data. Three sample-profile buttons (Low, Average, and High risk) fill the entire form on click so the reviewer can trigger a prediction in one step.</w:t>
+        <w:t xml:space="preserve">The </w:t>
+      </w:r>
+      <w:proofErr w:type="spellStart"/>
+      <w:r>
+        <w:rPr>
+          <w:rFonts w:eastAsia="Times New Roman" w:cs="Times New Roman"/>
+        </w:rPr>
+        <w:t>Streamlit</w:t>
+      </w:r>
+      <w:proofErr w:type="spellEnd"/>
+      <w:r>
+        <w:rPr>
+          <w:rFonts w:eastAsia="Times New Roman" w:cs="Times New Roman"/>
+        </w:rPr>
+        <w:t xml:space="preserve"> web application (app/streamlit_app.py) exposes a six-section form that mirrors the entire 36-item questionnaire plus the 11 RULA components and 8 QEC scores. </w:t>
+      </w:r>
+      <w:proofErr w:type="spellStart"/>
+      <w:r>
+        <w:rPr>
+          <w:rFonts w:eastAsia="Times New Roman" w:cs="Times New Roman"/>
+        </w:rPr>
+        <w:t>Selectboxes</w:t>
+      </w:r>
+      <w:proofErr w:type="spellEnd"/>
+      <w:r>
+        <w:rPr>
+          <w:rFonts w:eastAsia="Times New Roman" w:cs="Times New Roman"/>
+        </w:rPr>
+        <w:t xml:space="preserve"> cover demographics and work pattern; radios cover NMQ, 7-day, and outcome items; sliders cover NASA-TLX (0 to 100) and Borg CR10 (0 to 10); </w:t>
+      </w:r>
+      <w:proofErr w:type="spellStart"/>
+      <w:r>
+        <w:rPr>
+          <w:rFonts w:eastAsia="Times New Roman" w:cs="Times New Roman"/>
+        </w:rPr>
+        <w:t>selectboxes</w:t>
+      </w:r>
+      <w:proofErr w:type="spellEnd"/>
+      <w:r>
+        <w:rPr>
+          <w:rFonts w:eastAsia="Times New Roman" w:cs="Times New Roman"/>
+        </w:rPr>
+        <w:t xml:space="preserve"> cover RULA components; and number inputs cover the QEC scores with min / max ranges matched to the observed training data. Three sample-profile buttons (Low, Average, and High risk) fill the entire form on click so the reviewer can trigger a prediction in one step.</w:t>
       </w:r>
     </w:p>
     <w:p>
@@ -4569,14 +5927,70 @@
         <w:rPr>
           <w:rFonts w:eastAsia="Times New Roman" w:cs="Times New Roman"/>
         </w:rPr>
-        <w:t xml:space="preserve">On form submission, encode_rider assembles the 63-feature input vector, and predict_risks runs each of the six saved models. The Results page renders a coloured metric strip (green for Low, amber for Medium, red for High), a horizontal Altair bar chart of the same six factors sorted to match the metric strip, a summary banner that flags high-burden profiles, per-factor recommendation cards, and an </w:t>
+        <w:t xml:space="preserve">On form submission, </w:t>
+      </w:r>
+      <w:proofErr w:type="spellStart"/>
+      <w:r>
+        <w:rPr>
+          <w:rFonts w:eastAsia="Times New Roman" w:cs="Times New Roman"/>
+        </w:rPr>
+        <w:t>encode_rider</w:t>
+      </w:r>
+      <w:proofErr w:type="spellEnd"/>
+      <w:r>
+        <w:rPr>
+          <w:rFonts w:eastAsia="Times New Roman" w:cs="Times New Roman"/>
+        </w:rPr>
+        <w:t xml:space="preserve"> assembles the 63-feature input vector, and </w:t>
+      </w:r>
+      <w:proofErr w:type="spellStart"/>
+      <w:r>
+        <w:rPr>
+          <w:rFonts w:eastAsia="Times New Roman" w:cs="Times New Roman"/>
+        </w:rPr>
+        <w:t>predict_risks</w:t>
+      </w:r>
+      <w:proofErr w:type="spellEnd"/>
+      <w:r>
+        <w:rPr>
+          <w:rFonts w:eastAsia="Times New Roman" w:cs="Times New Roman"/>
+        </w:rPr>
+        <w:t xml:space="preserve"> runs each of the six saved models. The Results page renders a </w:t>
+      </w:r>
+      <w:proofErr w:type="spellStart"/>
+      <w:r>
+        <w:rPr>
+          <w:rFonts w:eastAsia="Times New Roman" w:cs="Times New Roman"/>
+        </w:rPr>
+        <w:t>coloured</w:t>
+      </w:r>
+      <w:proofErr w:type="spellEnd"/>
+      <w:r>
+        <w:rPr>
+          <w:rFonts w:eastAsia="Times New Roman" w:cs="Times New Roman"/>
+        </w:rPr>
+        <w:t xml:space="preserve"> metric strip (green for Low, amber for Medium, red for High), a horizontal Altair bar chart of the same six factors sorted to match the metric strip, a summary banner that flags high-burden profiles, per-factor recommendation cards, and an </w:t>
       </w:r>
       <w:r>
         <w:rPr>
           <w:rFonts w:eastAsia="Times New Roman" w:cs="Times New Roman"/>
         </w:rPr>
         <w:lastRenderedPageBreak/>
-        <w:t>expandable JSON view of the exact 63 feature values that were fed to the models. The app also has a Methodology page that summarises the pipeline and an About page carrying the institutional context.</w:t>
+        <w:t xml:space="preserve">expandable JSON view of the exact 63 feature values that were fed to the models. The app also has a Methodology page that </w:t>
+      </w:r>
+      <w:proofErr w:type="spellStart"/>
+      <w:r>
+        <w:rPr>
+          <w:rFonts w:eastAsia="Times New Roman" w:cs="Times New Roman"/>
+        </w:rPr>
+        <w:t>summarises</w:t>
+      </w:r>
+      <w:proofErr w:type="spellEnd"/>
+      <w:r>
+        <w:rPr>
+          <w:rFonts w:eastAsia="Times New Roman" w:cs="Times New Roman"/>
+        </w:rPr>
+        <w:t xml:space="preserve"> the pipeline and an About page carrying the institutional context.</w:t>
       </w:r>
     </w:p>
     <w:p>
@@ -4588,7 +6002,147 @@
         <w:rPr>
           <w:rFonts w:eastAsia="Times New Roman" w:cs="Times New Roman"/>
         </w:rPr>
-        <w:t>The app was deployed to Streamlit Community Cloud from the public GitHub repository. Deployment required pinning every runtime dependency in requirements.txt to the exact versions the models were trained with (streamlit 1.58, pandas 2.3, scikit-learn 1.7, xgboost 3.2, imbalanced-learn 0.14, plotly 6.8), because sklearn and xgboost pickles are not portable across minor versions. runtime.txt pins Python 3.13 to match the training environment. A .streamlit/config.toml carries the dark theme and a client.toolbarMode = viewer flag; CSS in the app suppresses the Fork button and 'View source on GitHub' icon that Streamlit Community Cloud injects on public-repo deploys. Every git push to the main branch auto-rebuilds and redeploys the app in about 30 seconds.</w:t>
+        <w:t xml:space="preserve">The app was deployed to </w:t>
+      </w:r>
+      <w:proofErr w:type="spellStart"/>
+      <w:r>
+        <w:rPr>
+          <w:rFonts w:eastAsia="Times New Roman" w:cs="Times New Roman"/>
+        </w:rPr>
+        <w:t>Streamlit</w:t>
+      </w:r>
+      <w:proofErr w:type="spellEnd"/>
+      <w:r>
+        <w:rPr>
+          <w:rFonts w:eastAsia="Times New Roman" w:cs="Times New Roman"/>
+        </w:rPr>
+        <w:t xml:space="preserve"> Community Cloud from the public GitHub repository. Deployment required pinning every runtime dependency in requirements.txt to the exact versions the models were trained with (</w:t>
+      </w:r>
+      <w:proofErr w:type="spellStart"/>
+      <w:r>
+        <w:rPr>
+          <w:rFonts w:eastAsia="Times New Roman" w:cs="Times New Roman"/>
+        </w:rPr>
+        <w:t>streamlit</w:t>
+      </w:r>
+      <w:proofErr w:type="spellEnd"/>
+      <w:r>
+        <w:rPr>
+          <w:rFonts w:eastAsia="Times New Roman" w:cs="Times New Roman"/>
+        </w:rPr>
+        <w:t xml:space="preserve"> 1.58, pandas 2.3, scikit-learn 1.7, </w:t>
+      </w:r>
+      <w:proofErr w:type="spellStart"/>
+      <w:r>
+        <w:rPr>
+          <w:rFonts w:eastAsia="Times New Roman" w:cs="Times New Roman"/>
+        </w:rPr>
+        <w:t>xgboost</w:t>
+      </w:r>
+      <w:proofErr w:type="spellEnd"/>
+      <w:r>
+        <w:rPr>
+          <w:rFonts w:eastAsia="Times New Roman" w:cs="Times New Roman"/>
+        </w:rPr>
+        <w:t xml:space="preserve"> 3.2, imbalanced-learn 0.14, </w:t>
+      </w:r>
+      <w:proofErr w:type="spellStart"/>
+      <w:r>
+        <w:rPr>
+          <w:rFonts w:eastAsia="Times New Roman" w:cs="Times New Roman"/>
+        </w:rPr>
+        <w:t>plotly</w:t>
+      </w:r>
+      <w:proofErr w:type="spellEnd"/>
+      <w:r>
+        <w:rPr>
+          <w:rFonts w:eastAsia="Times New Roman" w:cs="Times New Roman"/>
+        </w:rPr>
+        <w:t xml:space="preserve"> 6.8), because </w:t>
+      </w:r>
+      <w:proofErr w:type="spellStart"/>
+      <w:r>
+        <w:rPr>
+          <w:rFonts w:eastAsia="Times New Roman" w:cs="Times New Roman"/>
+        </w:rPr>
+        <w:t>sklearn</w:t>
+      </w:r>
+      <w:proofErr w:type="spellEnd"/>
+      <w:r>
+        <w:rPr>
+          <w:rFonts w:eastAsia="Times New Roman" w:cs="Times New Roman"/>
+        </w:rPr>
+        <w:t xml:space="preserve"> and </w:t>
+      </w:r>
+      <w:proofErr w:type="spellStart"/>
+      <w:r>
+        <w:rPr>
+          <w:rFonts w:eastAsia="Times New Roman" w:cs="Times New Roman"/>
+        </w:rPr>
+        <w:t>xgboost</w:t>
+      </w:r>
+      <w:proofErr w:type="spellEnd"/>
+      <w:r>
+        <w:rPr>
+          <w:rFonts w:eastAsia="Times New Roman" w:cs="Times New Roman"/>
+        </w:rPr>
+        <w:t xml:space="preserve"> pickles are not portable across minor versions. runtime.txt pins Python 3.13 to match the training environment. A .</w:t>
+      </w:r>
+      <w:proofErr w:type="spellStart"/>
+      <w:r>
+        <w:rPr>
+          <w:rFonts w:eastAsia="Times New Roman" w:cs="Times New Roman"/>
+        </w:rPr>
+        <w:t>streamlit</w:t>
+      </w:r>
+      <w:proofErr w:type="spellEnd"/>
+      <w:r>
+        <w:rPr>
+          <w:rFonts w:eastAsia="Times New Roman" w:cs="Times New Roman"/>
+        </w:rPr>
+        <w:t>/</w:t>
+      </w:r>
+      <w:proofErr w:type="spellStart"/>
+      <w:r>
+        <w:rPr>
+          <w:rFonts w:eastAsia="Times New Roman" w:cs="Times New Roman"/>
+        </w:rPr>
+        <w:t>config.toml</w:t>
+      </w:r>
+      <w:proofErr w:type="spellEnd"/>
+      <w:r>
+        <w:rPr>
+          <w:rFonts w:eastAsia="Times New Roman" w:cs="Times New Roman"/>
+        </w:rPr>
+        <w:t xml:space="preserve"> carries the dark theme and a </w:t>
+      </w:r>
+      <w:proofErr w:type="spellStart"/>
+      <w:r>
+        <w:rPr>
+          <w:rFonts w:eastAsia="Times New Roman" w:cs="Times New Roman"/>
+        </w:rPr>
+        <w:t>client.toolbarMode</w:t>
+      </w:r>
+      <w:proofErr w:type="spellEnd"/>
+      <w:r>
+        <w:rPr>
+          <w:rFonts w:eastAsia="Times New Roman" w:cs="Times New Roman"/>
+        </w:rPr>
+        <w:t xml:space="preserve"> = viewer flag; CSS in the app suppresses the Fork button and 'View source on GitHub' icon that </w:t>
+      </w:r>
+      <w:proofErr w:type="spellStart"/>
+      <w:r>
+        <w:rPr>
+          <w:rFonts w:eastAsia="Times New Roman" w:cs="Times New Roman"/>
+        </w:rPr>
+        <w:t>Streamlit</w:t>
+      </w:r>
+      <w:proofErr w:type="spellEnd"/>
+      <w:r>
+        <w:rPr>
+          <w:rFonts w:eastAsia="Times New Roman" w:cs="Times New Roman"/>
+        </w:rPr>
+        <w:t xml:space="preserve"> Community Cloud injects on public-repo deploys. Every git push to the main branch auto-rebuilds and redeploys the app in about 30 seconds.</w:t>
       </w:r>
     </w:p>
     <w:p>
@@ -4629,7 +6183,91 @@
         <w:rPr>
           <w:rFonts w:eastAsia="Times New Roman" w:cs="Times New Roman"/>
         </w:rPr>
-        <w:t>The initial Phase 3 binning used pandas.qcut(q=3) on deliveries_per_hour. The 66.7th percentile fell exactly on 3.889 dph (equal to 35 deliveries over 9 hours, the worst real combination in the sample). Fifty-five of the 182 riders tied at that value, and qcut is right-inclusive at the upper edge, so all 55 fell into Medium. This left the Stage-2 model unable to predict High for the worst real schedule. The fix replaces qcut with fixed cuts at 2.5 and 3.75. The Stage-1 High count grew from 19 to 74. Cross-validation accuracy dropped from 74 percent to 62 percent because the model now solves a real 3-class problem instead of memorising a 19-row minority.</w:t>
+        <w:t xml:space="preserve">The initial Phase 3 binning used </w:t>
+      </w:r>
+      <w:proofErr w:type="spellStart"/>
+      <w:r>
+        <w:rPr>
+          <w:rFonts w:eastAsia="Times New Roman" w:cs="Times New Roman"/>
+        </w:rPr>
+        <w:t>pandas.qcut</w:t>
+      </w:r>
+      <w:proofErr w:type="spellEnd"/>
+      <w:r>
+        <w:rPr>
+          <w:rFonts w:eastAsia="Times New Roman" w:cs="Times New Roman"/>
+        </w:rPr>
+        <w:t xml:space="preserve">(q=3) on </w:t>
+      </w:r>
+      <w:proofErr w:type="spellStart"/>
+      <w:r>
+        <w:rPr>
+          <w:rFonts w:eastAsia="Times New Roman" w:cs="Times New Roman"/>
+        </w:rPr>
+        <w:t>deliveries_per_hour</w:t>
+      </w:r>
+      <w:proofErr w:type="spellEnd"/>
+      <w:r>
+        <w:rPr>
+          <w:rFonts w:eastAsia="Times New Roman" w:cs="Times New Roman"/>
+        </w:rPr>
+        <w:t xml:space="preserve">. The 66.7th percentile fell exactly on 3.889 </w:t>
+      </w:r>
+      <w:proofErr w:type="spellStart"/>
+      <w:r>
+        <w:rPr>
+          <w:rFonts w:eastAsia="Times New Roman" w:cs="Times New Roman"/>
+        </w:rPr>
+        <w:t>dph</w:t>
+      </w:r>
+      <w:proofErr w:type="spellEnd"/>
+      <w:r>
+        <w:rPr>
+          <w:rFonts w:eastAsia="Times New Roman" w:cs="Times New Roman"/>
+        </w:rPr>
+        <w:t xml:space="preserve"> (equal to 35 deliveries over 9 hours, the worst real combination in the sample). Fifty-five of the 182 riders tied at that value, and </w:t>
+      </w:r>
+      <w:proofErr w:type="spellStart"/>
+      <w:r>
+        <w:rPr>
+          <w:rFonts w:eastAsia="Times New Roman" w:cs="Times New Roman"/>
+        </w:rPr>
+        <w:t>qcut</w:t>
+      </w:r>
+      <w:proofErr w:type="spellEnd"/>
+      <w:r>
+        <w:rPr>
+          <w:rFonts w:eastAsia="Times New Roman" w:cs="Times New Roman"/>
+        </w:rPr>
+        <w:t xml:space="preserve"> is right-inclusive at the upper edge, so all 55 fell into Medium. This left the Stage-2 model unable to predict High for the worst real schedule. The fix replaces </w:t>
+      </w:r>
+      <w:proofErr w:type="spellStart"/>
+      <w:r>
+        <w:rPr>
+          <w:rFonts w:eastAsia="Times New Roman" w:cs="Times New Roman"/>
+        </w:rPr>
+        <w:t>qcut</w:t>
+      </w:r>
+      <w:proofErr w:type="spellEnd"/>
+      <w:r>
+        <w:rPr>
+          <w:rFonts w:eastAsia="Times New Roman" w:cs="Times New Roman"/>
+        </w:rPr>
+        <w:t xml:space="preserve"> with fixed cuts at 2.5 and 3.75. The Stage-1 High count grew from 19 to 74. Cross-validation accuracy dropped from 74 percent to 62 percent because the model now solves a real 3-class problem instead of </w:t>
+      </w:r>
+      <w:proofErr w:type="spellStart"/>
+      <w:r>
+        <w:rPr>
+          <w:rFonts w:eastAsia="Times New Roman" w:cs="Times New Roman"/>
+        </w:rPr>
+        <w:t>memorising</w:t>
+      </w:r>
+      <w:proofErr w:type="spellEnd"/>
+      <w:r>
+        <w:rPr>
+          <w:rFonts w:eastAsia="Times New Roman" w:cs="Times New Roman"/>
+        </w:rPr>
+        <w:t xml:space="preserve"> a 19-row minority.</w:t>
       </w:r>
     </w:p>
     <w:p>
@@ -4656,7 +6294,91 @@
         <w:rPr>
           <w:rFonts w:eastAsia="Times New Roman" w:cs="Times New Roman"/>
         </w:rPr>
-        <w:t>An earlier Phase 6 run reported 100 percent cross-validation accuracy on Duration. Investigation showed the trees were reconstructing work_hours_num from vibration_index, which equals vehicle_rank multiplied by work_hours_num. Adding vibration_index to the Duration exclusion list and capping max_depth returned Duration to a realistic 61 percent accuracy with 76 percent macro AUC.</w:t>
+        <w:t xml:space="preserve">An earlier Phase 6 run reported 100 percent cross-validation accuracy on Duration. Investigation showed the trees were reconstructing </w:t>
+      </w:r>
+      <w:proofErr w:type="spellStart"/>
+      <w:r>
+        <w:rPr>
+          <w:rFonts w:eastAsia="Times New Roman" w:cs="Times New Roman"/>
+        </w:rPr>
+        <w:t>work_hours_num</w:t>
+      </w:r>
+      <w:proofErr w:type="spellEnd"/>
+      <w:r>
+        <w:rPr>
+          <w:rFonts w:eastAsia="Times New Roman" w:cs="Times New Roman"/>
+        </w:rPr>
+        <w:t xml:space="preserve"> from </w:t>
+      </w:r>
+      <w:proofErr w:type="spellStart"/>
+      <w:r>
+        <w:rPr>
+          <w:rFonts w:eastAsia="Times New Roman" w:cs="Times New Roman"/>
+        </w:rPr>
+        <w:t>vibration_index</w:t>
+      </w:r>
+      <w:proofErr w:type="spellEnd"/>
+      <w:r>
+        <w:rPr>
+          <w:rFonts w:eastAsia="Times New Roman" w:cs="Times New Roman"/>
+        </w:rPr>
+        <w:t xml:space="preserve">, which equals </w:t>
+      </w:r>
+      <w:proofErr w:type="spellStart"/>
+      <w:r>
+        <w:rPr>
+          <w:rFonts w:eastAsia="Times New Roman" w:cs="Times New Roman"/>
+        </w:rPr>
+        <w:t>vehicle_rank</w:t>
+      </w:r>
+      <w:proofErr w:type="spellEnd"/>
+      <w:r>
+        <w:rPr>
+          <w:rFonts w:eastAsia="Times New Roman" w:cs="Times New Roman"/>
+        </w:rPr>
+        <w:t xml:space="preserve"> multiplied by </w:t>
+      </w:r>
+      <w:proofErr w:type="spellStart"/>
+      <w:r>
+        <w:rPr>
+          <w:rFonts w:eastAsia="Times New Roman" w:cs="Times New Roman"/>
+        </w:rPr>
+        <w:t>work_hours_num</w:t>
+      </w:r>
+      <w:proofErr w:type="spellEnd"/>
+      <w:r>
+        <w:rPr>
+          <w:rFonts w:eastAsia="Times New Roman" w:cs="Times New Roman"/>
+        </w:rPr>
+        <w:t xml:space="preserve">. Adding </w:t>
+      </w:r>
+      <w:proofErr w:type="spellStart"/>
+      <w:r>
+        <w:rPr>
+          <w:rFonts w:eastAsia="Times New Roman" w:cs="Times New Roman"/>
+        </w:rPr>
+        <w:t>vibration_index</w:t>
+      </w:r>
+      <w:proofErr w:type="spellEnd"/>
+      <w:r>
+        <w:rPr>
+          <w:rFonts w:eastAsia="Times New Roman" w:cs="Times New Roman"/>
+        </w:rPr>
+        <w:t xml:space="preserve"> to the Duration exclusion list and capping </w:t>
+      </w:r>
+      <w:proofErr w:type="spellStart"/>
+      <w:r>
+        <w:rPr>
+          <w:rFonts w:eastAsia="Times New Roman" w:cs="Times New Roman"/>
+        </w:rPr>
+        <w:t>max_depth</w:t>
+      </w:r>
+      <w:proofErr w:type="spellEnd"/>
+      <w:r>
+        <w:rPr>
+          <w:rFonts w:eastAsia="Times New Roman" w:cs="Times New Roman"/>
+        </w:rPr>
+        <w:t xml:space="preserve"> returned Duration to a realistic 61 percent accuracy with 76 percent macro AUC.</w:t>
       </w:r>
     </w:p>
     <w:p>
@@ -4683,7 +6405,35 @@
         <w:rPr>
           <w:rFonts w:eastAsia="Times New Roman" w:cs="Times New Roman"/>
         </w:rPr>
-        <w:t>The Posture target was initially trained only on the survey feature pool, which meant it could only infer posture indirectly from pain, fatigue, and hours. Adding the 11 RULA components and 8 QEC scores from the observation xlsx as explicit features moved Posture accuracy from 89 to 97 percent and the overfit gap from 0.088 to 0.028. Per the label-leakage rule, the three derived RULA Table scores were excluded because posture_risk is rula_table_c binned.</w:t>
+        <w:t xml:space="preserve">The Posture target was initially trained only on the survey feature pool, which meant it could only infer posture indirectly from pain, fatigue, and hours. Adding the 11 RULA components and 8 QEC scores from the observation xlsx as explicit features moved Posture accuracy from 89 to 97 percent and the overfit gap from 0.088 to 0.028. Per the label-leakage rule, the three derived RULA Table scores were excluded because </w:t>
+      </w:r>
+      <w:proofErr w:type="spellStart"/>
+      <w:r>
+        <w:rPr>
+          <w:rFonts w:eastAsia="Times New Roman" w:cs="Times New Roman"/>
+        </w:rPr>
+        <w:t>posture_risk</w:t>
+      </w:r>
+      <w:proofErr w:type="spellEnd"/>
+      <w:r>
+        <w:rPr>
+          <w:rFonts w:eastAsia="Times New Roman" w:cs="Times New Roman"/>
+        </w:rPr>
+        <w:t xml:space="preserve"> is </w:t>
+      </w:r>
+      <w:proofErr w:type="spellStart"/>
+      <w:r>
+        <w:rPr>
+          <w:rFonts w:eastAsia="Times New Roman" w:cs="Times New Roman"/>
+        </w:rPr>
+        <w:t>rula_table_c</w:t>
+      </w:r>
+      <w:proofErr w:type="spellEnd"/>
+      <w:r>
+        <w:rPr>
+          <w:rFonts w:eastAsia="Times New Roman" w:cs="Times New Roman"/>
+        </w:rPr>
+        <w:t xml:space="preserve"> binned.</w:t>
       </w:r>
     </w:p>
     <w:p>
@@ -4725,7 +6475,35 @@
         <w:rPr>
           <w:rFonts w:eastAsia="Times New Roman" w:cs="Times New Roman"/>
         </w:rPr>
-        <w:t>The sample of 182 riders is 152 male and 30 female. Age skews young: 78 riders are under 25, 66 in the 25-35 band, 30 in 36-45, and 8 in the 46-and-above band. Roughly half the sample (49 percent) works more than 8 hours per day. Ninety-four ride scooters and 88 ride motorbikes. The platform split is 97 Blinkit, 80 Zepto, and 5 who work both platforms.</w:t>
+        <w:t xml:space="preserve">The sample of 182 riders is 152 male and 30 female. Age skews young: 78 riders are under 25, 66 in the 25-35 band, 30 in 36-45, and 8 in the 46-and-above band. Roughly half the sample (49 percent) works more than 8 hours per day. Ninety-four ride scooters and 88 ride motorbikes. The platform split is 97 </w:t>
+      </w:r>
+      <w:proofErr w:type="spellStart"/>
+      <w:r>
+        <w:rPr>
+          <w:rFonts w:eastAsia="Times New Roman" w:cs="Times New Roman"/>
+        </w:rPr>
+        <w:t>Blinkit</w:t>
+      </w:r>
+      <w:proofErr w:type="spellEnd"/>
+      <w:r>
+        <w:rPr>
+          <w:rFonts w:eastAsia="Times New Roman" w:cs="Times New Roman"/>
+        </w:rPr>
+        <w:t xml:space="preserve">, 80 </w:t>
+      </w:r>
+      <w:proofErr w:type="spellStart"/>
+      <w:r>
+        <w:rPr>
+          <w:rFonts w:eastAsia="Times New Roman" w:cs="Times New Roman"/>
+        </w:rPr>
+        <w:t>Zepto</w:t>
+      </w:r>
+      <w:proofErr w:type="spellEnd"/>
+      <w:r>
+        <w:rPr>
+          <w:rFonts w:eastAsia="Times New Roman" w:cs="Times New Roman"/>
+        </w:rPr>
+        <w:t>, and 5 who work both platforms.</w:t>
       </w:r>
     </w:p>
     <w:p>
@@ -5331,9 +7109,9 @@
           <w:noProof/>
         </w:rPr>
         <w:drawing>
-          <wp:inline distT="0" distB="0" distL="0" distR="0" wp14:anchorId="47D974A0" wp14:editId="264868D9">
-            <wp:extent cx="4537600" cy="2377440"/>
-            <wp:effectExtent l="0" t="0" r="0" b="3810"/>
+          <wp:inline distT="0" distB="0" distL="0" distR="0" wp14:anchorId="47D974A0" wp14:editId="1F2FEEEE">
+            <wp:extent cx="4712123" cy="2468880"/>
+            <wp:effectExtent l="0" t="0" r="0" b="7620"/>
             <wp:docPr id="5" name="Picture 5"/>
             <wp:cNvGraphicFramePr>
               <a:graphicFrameLocks xmlns:a="http://schemas.openxmlformats.org/drawingml/2006/main" noChangeAspect="1"/>
@@ -5354,7 +7132,7 @@
                   <pic:spPr>
                     <a:xfrm>
                       <a:off x="0" y="0"/>
-                      <a:ext cx="4537600" cy="2377440"/>
+                      <a:ext cx="4712123" cy="2468880"/>
                     </a:xfrm>
                     <a:prstGeom prst="rect">
                       <a:avLst/>
@@ -7510,6 +9288,7 @@
             <w:pPr>
               <w:spacing w:before="20" w:after="20"/>
             </w:pPr>
+            <w:proofErr w:type="spellStart"/>
             <w:r>
               <w:rPr>
                 <w:rFonts w:eastAsia="Times New Roman" w:cs="Times New Roman"/>
@@ -7517,6 +9296,7 @@
               </w:rPr>
               <w:t>HistGradientBoosting</w:t>
             </w:r>
+            <w:proofErr w:type="spellEnd"/>
           </w:p>
         </w:tc>
         <w:tc>
@@ -7619,6 +9399,7 @@
             <w:pPr>
               <w:spacing w:before="20" w:after="20"/>
             </w:pPr>
+            <w:proofErr w:type="spellStart"/>
             <w:r>
               <w:rPr>
                 <w:rFonts w:eastAsia="Times New Roman" w:cs="Times New Roman"/>
@@ -7626,6 +9407,7 @@
               </w:rPr>
               <w:t>RandomForest</w:t>
             </w:r>
+            <w:proofErr w:type="spellEnd"/>
           </w:p>
         </w:tc>
         <w:tc>
@@ -7728,6 +9510,7 @@
             <w:pPr>
               <w:spacing w:before="20" w:after="20"/>
             </w:pPr>
+            <w:proofErr w:type="spellStart"/>
             <w:r>
               <w:rPr>
                 <w:rFonts w:eastAsia="Times New Roman" w:cs="Times New Roman"/>
@@ -7735,6 +9518,7 @@
               </w:rPr>
               <w:t>RandomForest</w:t>
             </w:r>
+            <w:proofErr w:type="spellEnd"/>
           </w:p>
         </w:tc>
         <w:tc>
@@ -7837,6 +9621,7 @@
             <w:pPr>
               <w:spacing w:before="20" w:after="20"/>
             </w:pPr>
+            <w:proofErr w:type="spellStart"/>
             <w:r>
               <w:rPr>
                 <w:rFonts w:eastAsia="Times New Roman" w:cs="Times New Roman"/>
@@ -7844,6 +9629,7 @@
               </w:rPr>
               <w:t>ExtraTrees</w:t>
             </w:r>
+            <w:proofErr w:type="spellEnd"/>
           </w:p>
         </w:tc>
         <w:tc>
@@ -7946,6 +9732,7 @@
             <w:pPr>
               <w:spacing w:before="20" w:after="20"/>
             </w:pPr>
+            <w:proofErr w:type="spellStart"/>
             <w:r>
               <w:rPr>
                 <w:rFonts w:eastAsia="Times New Roman" w:cs="Times New Roman"/>
@@ -7953,6 +9740,7 @@
               </w:rPr>
               <w:t>RandomForest</w:t>
             </w:r>
+            <w:proofErr w:type="spellEnd"/>
           </w:p>
         </w:tc>
         <w:tc>
@@ -8055,6 +9843,7 @@
             <w:pPr>
               <w:spacing w:before="20" w:after="20"/>
             </w:pPr>
+            <w:proofErr w:type="spellStart"/>
             <w:r>
               <w:rPr>
                 <w:rFonts w:eastAsia="Times New Roman" w:cs="Times New Roman"/>
@@ -8062,6 +9851,7 @@
               </w:rPr>
               <w:t>HistGradientBoosting</w:t>
             </w:r>
+            <w:proofErr w:type="spellEnd"/>
           </w:p>
         </w:tc>
         <w:tc>
@@ -11078,6 +12868,7 @@
             <w:pPr>
               <w:spacing w:before="20" w:after="20"/>
             </w:pPr>
+            <w:proofErr w:type="spellStart"/>
             <w:r>
               <w:rPr>
                 <w:rFonts w:eastAsia="Times New Roman" w:cs="Times New Roman"/>
@@ -11085,6 +12876,7 @@
               </w:rPr>
               <w:t>HistGBM</w:t>
             </w:r>
+            <w:proofErr w:type="spellEnd"/>
           </w:p>
         </w:tc>
         <w:tc>
@@ -11095,12 +12887,37 @@
             <w:pPr>
               <w:spacing w:before="20" w:after="20"/>
             </w:pPr>
-            <w:r>
-              <w:rPr>
-                <w:rFonts w:eastAsia="Times New Roman" w:cs="Times New Roman"/>
-                <w:sz w:val="20"/>
-              </w:rPr>
-              <w:t>max_depth=None, learning_rate=0.05</w:t>
+            <w:proofErr w:type="spellStart"/>
+            <w:r>
+              <w:rPr>
+                <w:rFonts w:eastAsia="Times New Roman" w:cs="Times New Roman"/>
+                <w:sz w:val="20"/>
+              </w:rPr>
+              <w:t>max_depth</w:t>
+            </w:r>
+            <w:proofErr w:type="spellEnd"/>
+            <w:r>
+              <w:rPr>
+                <w:rFonts w:eastAsia="Times New Roman" w:cs="Times New Roman"/>
+                <w:sz w:val="20"/>
+              </w:rPr>
+              <w:t xml:space="preserve">=None, </w:t>
+            </w:r>
+            <w:proofErr w:type="spellStart"/>
+            <w:r>
+              <w:rPr>
+                <w:rFonts w:eastAsia="Times New Roman" w:cs="Times New Roman"/>
+                <w:sz w:val="20"/>
+              </w:rPr>
+              <w:t>learning_rate</w:t>
+            </w:r>
+            <w:proofErr w:type="spellEnd"/>
+            <w:r>
+              <w:rPr>
+                <w:rFonts w:eastAsia="Times New Roman" w:cs="Times New Roman"/>
+                <w:sz w:val="20"/>
+              </w:rPr>
+              <w:t>=0.05</w:t>
             </w:r>
           </w:p>
         </w:tc>
@@ -11153,6 +12970,7 @@
             <w:pPr>
               <w:spacing w:before="20" w:after="20"/>
             </w:pPr>
+            <w:proofErr w:type="spellStart"/>
             <w:r>
               <w:rPr>
                 <w:rFonts w:eastAsia="Times New Roman" w:cs="Times New Roman"/>
@@ -11160,6 +12978,7 @@
               </w:rPr>
               <w:t>RandomForest</w:t>
             </w:r>
+            <w:proofErr w:type="spellEnd"/>
           </w:p>
         </w:tc>
         <w:tc>
@@ -11170,12 +12989,37 @@
             <w:pPr>
               <w:spacing w:before="20" w:after="20"/>
             </w:pPr>
-            <w:r>
-              <w:rPr>
-                <w:rFonts w:eastAsia="Times New Roman" w:cs="Times New Roman"/>
-                <w:sz w:val="20"/>
-              </w:rPr>
-              <w:t>n_estimators=300, max_depth=None</w:t>
+            <w:proofErr w:type="spellStart"/>
+            <w:r>
+              <w:rPr>
+                <w:rFonts w:eastAsia="Times New Roman" w:cs="Times New Roman"/>
+                <w:sz w:val="20"/>
+              </w:rPr>
+              <w:t>n_estimators</w:t>
+            </w:r>
+            <w:proofErr w:type="spellEnd"/>
+            <w:r>
+              <w:rPr>
+                <w:rFonts w:eastAsia="Times New Roman" w:cs="Times New Roman"/>
+                <w:sz w:val="20"/>
+              </w:rPr>
+              <w:t xml:space="preserve">=300, </w:t>
+            </w:r>
+            <w:proofErr w:type="spellStart"/>
+            <w:r>
+              <w:rPr>
+                <w:rFonts w:eastAsia="Times New Roman" w:cs="Times New Roman"/>
+                <w:sz w:val="20"/>
+              </w:rPr>
+              <w:t>max_depth</w:t>
+            </w:r>
+            <w:proofErr w:type="spellEnd"/>
+            <w:r>
+              <w:rPr>
+                <w:rFonts w:eastAsia="Times New Roman" w:cs="Times New Roman"/>
+                <w:sz w:val="20"/>
+              </w:rPr>
+              <w:t>=None</w:t>
             </w:r>
           </w:p>
         </w:tc>
@@ -11228,6 +13072,7 @@
             <w:pPr>
               <w:spacing w:before="20" w:after="20"/>
             </w:pPr>
+            <w:proofErr w:type="spellStart"/>
             <w:r>
               <w:rPr>
                 <w:rFonts w:eastAsia="Times New Roman" w:cs="Times New Roman"/>
@@ -11235,6 +13080,7 @@
               </w:rPr>
               <w:t>RandomForest</w:t>
             </w:r>
+            <w:proofErr w:type="spellEnd"/>
           </w:p>
         </w:tc>
         <w:tc>
@@ -11245,12 +13091,37 @@
             <w:pPr>
               <w:spacing w:before="20" w:after="20"/>
             </w:pPr>
-            <w:r>
-              <w:rPr>
-                <w:rFonts w:eastAsia="Times New Roman" w:cs="Times New Roman"/>
-                <w:sz w:val="20"/>
-              </w:rPr>
-              <w:t>n_estimators=500, max_depth=5</w:t>
+            <w:proofErr w:type="spellStart"/>
+            <w:r>
+              <w:rPr>
+                <w:rFonts w:eastAsia="Times New Roman" w:cs="Times New Roman"/>
+                <w:sz w:val="20"/>
+              </w:rPr>
+              <w:t>n_estimators</w:t>
+            </w:r>
+            <w:proofErr w:type="spellEnd"/>
+            <w:r>
+              <w:rPr>
+                <w:rFonts w:eastAsia="Times New Roman" w:cs="Times New Roman"/>
+                <w:sz w:val="20"/>
+              </w:rPr>
+              <w:t xml:space="preserve">=500, </w:t>
+            </w:r>
+            <w:proofErr w:type="spellStart"/>
+            <w:r>
+              <w:rPr>
+                <w:rFonts w:eastAsia="Times New Roman" w:cs="Times New Roman"/>
+                <w:sz w:val="20"/>
+              </w:rPr>
+              <w:t>max_depth</w:t>
+            </w:r>
+            <w:proofErr w:type="spellEnd"/>
+            <w:r>
+              <w:rPr>
+                <w:rFonts w:eastAsia="Times New Roman" w:cs="Times New Roman"/>
+                <w:sz w:val="20"/>
+              </w:rPr>
+              <w:t>=5</w:t>
             </w:r>
           </w:p>
         </w:tc>
@@ -11303,6 +13174,7 @@
             <w:pPr>
               <w:spacing w:before="20" w:after="20"/>
             </w:pPr>
+            <w:proofErr w:type="spellStart"/>
             <w:r>
               <w:rPr>
                 <w:rFonts w:eastAsia="Times New Roman" w:cs="Times New Roman"/>
@@ -11310,6 +13182,7 @@
               </w:rPr>
               <w:t>ExtraTrees</w:t>
             </w:r>
+            <w:proofErr w:type="spellEnd"/>
           </w:p>
         </w:tc>
         <w:tc>
@@ -11320,12 +13193,37 @@
             <w:pPr>
               <w:spacing w:before="20" w:after="20"/>
             </w:pPr>
-            <w:r>
-              <w:rPr>
-                <w:rFonts w:eastAsia="Times New Roman" w:cs="Times New Roman"/>
-                <w:sz w:val="20"/>
-              </w:rPr>
-              <w:t>n_estimators=300, max_depth=None</w:t>
+            <w:proofErr w:type="spellStart"/>
+            <w:r>
+              <w:rPr>
+                <w:rFonts w:eastAsia="Times New Roman" w:cs="Times New Roman"/>
+                <w:sz w:val="20"/>
+              </w:rPr>
+              <w:t>n_estimators</w:t>
+            </w:r>
+            <w:proofErr w:type="spellEnd"/>
+            <w:r>
+              <w:rPr>
+                <w:rFonts w:eastAsia="Times New Roman" w:cs="Times New Roman"/>
+                <w:sz w:val="20"/>
+              </w:rPr>
+              <w:t xml:space="preserve">=300, </w:t>
+            </w:r>
+            <w:proofErr w:type="spellStart"/>
+            <w:r>
+              <w:rPr>
+                <w:rFonts w:eastAsia="Times New Roman" w:cs="Times New Roman"/>
+                <w:sz w:val="20"/>
+              </w:rPr>
+              <w:t>max_depth</w:t>
+            </w:r>
+            <w:proofErr w:type="spellEnd"/>
+            <w:r>
+              <w:rPr>
+                <w:rFonts w:eastAsia="Times New Roman" w:cs="Times New Roman"/>
+                <w:sz w:val="20"/>
+              </w:rPr>
+              <w:t>=None</w:t>
             </w:r>
           </w:p>
         </w:tc>
@@ -11378,6 +13276,7 @@
             <w:pPr>
               <w:spacing w:before="20" w:after="20"/>
             </w:pPr>
+            <w:proofErr w:type="spellStart"/>
             <w:r>
               <w:rPr>
                 <w:rFonts w:eastAsia="Times New Roman" w:cs="Times New Roman"/>
@@ -11385,6 +13284,7 @@
               </w:rPr>
               <w:t>RandomForest</w:t>
             </w:r>
+            <w:proofErr w:type="spellEnd"/>
           </w:p>
         </w:tc>
         <w:tc>
@@ -11395,12 +13295,37 @@
             <w:pPr>
               <w:spacing w:before="20" w:after="20"/>
             </w:pPr>
-            <w:r>
-              <w:rPr>
-                <w:rFonts w:eastAsia="Times New Roman" w:cs="Times New Roman"/>
-                <w:sz w:val="20"/>
-              </w:rPr>
-              <w:t>n_estimators=500, max_depth=None</w:t>
+            <w:proofErr w:type="spellStart"/>
+            <w:r>
+              <w:rPr>
+                <w:rFonts w:eastAsia="Times New Roman" w:cs="Times New Roman"/>
+                <w:sz w:val="20"/>
+              </w:rPr>
+              <w:t>n_estimators</w:t>
+            </w:r>
+            <w:proofErr w:type="spellEnd"/>
+            <w:r>
+              <w:rPr>
+                <w:rFonts w:eastAsia="Times New Roman" w:cs="Times New Roman"/>
+                <w:sz w:val="20"/>
+              </w:rPr>
+              <w:t xml:space="preserve">=500, </w:t>
+            </w:r>
+            <w:proofErr w:type="spellStart"/>
+            <w:r>
+              <w:rPr>
+                <w:rFonts w:eastAsia="Times New Roman" w:cs="Times New Roman"/>
+                <w:sz w:val="20"/>
+              </w:rPr>
+              <w:t>max_depth</w:t>
+            </w:r>
+            <w:proofErr w:type="spellEnd"/>
+            <w:r>
+              <w:rPr>
+                <w:rFonts w:eastAsia="Times New Roman" w:cs="Times New Roman"/>
+                <w:sz w:val="20"/>
+              </w:rPr>
+              <w:t>=None</w:t>
             </w:r>
           </w:p>
         </w:tc>
@@ -11453,6 +13378,7 @@
             <w:pPr>
               <w:spacing w:before="20" w:after="20"/>
             </w:pPr>
+            <w:proofErr w:type="spellStart"/>
             <w:r>
               <w:rPr>
                 <w:rFonts w:eastAsia="Times New Roman" w:cs="Times New Roman"/>
@@ -11460,6 +13386,7 @@
               </w:rPr>
               <w:t>HistGBM</w:t>
             </w:r>
+            <w:proofErr w:type="spellEnd"/>
           </w:p>
         </w:tc>
         <w:tc>
@@ -11470,12 +13397,37 @@
             <w:pPr>
               <w:spacing w:before="20" w:after="20"/>
             </w:pPr>
-            <w:r>
-              <w:rPr>
-                <w:rFonts w:eastAsia="Times New Roman" w:cs="Times New Roman"/>
-                <w:sz w:val="20"/>
-              </w:rPr>
-              <w:t>max_depth=5, learning_rate=0.05</w:t>
+            <w:proofErr w:type="spellStart"/>
+            <w:r>
+              <w:rPr>
+                <w:rFonts w:eastAsia="Times New Roman" w:cs="Times New Roman"/>
+                <w:sz w:val="20"/>
+              </w:rPr>
+              <w:t>max_depth</w:t>
+            </w:r>
+            <w:proofErr w:type="spellEnd"/>
+            <w:r>
+              <w:rPr>
+                <w:rFonts w:eastAsia="Times New Roman" w:cs="Times New Roman"/>
+                <w:sz w:val="20"/>
+              </w:rPr>
+              <w:t xml:space="preserve">=5, </w:t>
+            </w:r>
+            <w:proofErr w:type="spellStart"/>
+            <w:r>
+              <w:rPr>
+                <w:rFonts w:eastAsia="Times New Roman" w:cs="Times New Roman"/>
+                <w:sz w:val="20"/>
+              </w:rPr>
+              <w:t>learning_rate</w:t>
+            </w:r>
+            <w:proofErr w:type="spellEnd"/>
+            <w:r>
+              <w:rPr>
+                <w:rFonts w:eastAsia="Times New Roman" w:cs="Times New Roman"/>
+                <w:sz w:val="20"/>
+              </w:rPr>
+              <w:t>=0.05</w:t>
             </w:r>
           </w:p>
         </w:tc>
@@ -11515,7 +13467,27 @@
           <w:color w:val="000000"/>
           <w:sz w:val="18"/>
         </w:rPr>
-        <w:t>Table 4.8: Winning hyperparameters per target after GridSearchCV.</w:t>
+        <w:t xml:space="preserve">Table 4.8: Winning hyperparameters per target after </w:t>
+      </w:r>
+      <w:proofErr w:type="spellStart"/>
+      <w:r>
+        <w:rPr>
+          <w:rFonts w:eastAsia="Times New Roman" w:cs="Times New Roman"/>
+          <w:i/>
+          <w:color w:val="000000"/>
+          <w:sz w:val="18"/>
+        </w:rPr>
+        <w:t>GridSearchCV</w:t>
+      </w:r>
+      <w:proofErr w:type="spellEnd"/>
+      <w:r>
+        <w:rPr>
+          <w:rFonts w:eastAsia="Times New Roman" w:cs="Times New Roman"/>
+          <w:i/>
+          <w:color w:val="000000"/>
+          <w:sz w:val="18"/>
+        </w:rPr>
+        <w:t>.</w:t>
       </w:r>
     </w:p>
     <w:p>
@@ -11854,7 +13826,25 @@
           <w:i/>
           <w:sz w:val="18"/>
         </w:rPr>
-        <w:t>Figure 4.13: Web app: predicted risk profile output with colour-coded level cards, radar chart, tabular result, and per-factor recommendations.</w:t>
+        <w:t xml:space="preserve">Figure 4.13: Web app: predicted risk profile output with </w:t>
+      </w:r>
+      <w:proofErr w:type="spellStart"/>
+      <w:r>
+        <w:rPr>
+          <w:rFonts w:eastAsia="Times New Roman" w:cs="Times New Roman"/>
+          <w:i/>
+          <w:sz w:val="18"/>
+        </w:rPr>
+        <w:t>colour</w:t>
+      </w:r>
+      <w:proofErr w:type="spellEnd"/>
+      <w:r>
+        <w:rPr>
+          <w:rFonts w:eastAsia="Times New Roman" w:cs="Times New Roman"/>
+          <w:i/>
+          <w:sz w:val="18"/>
+        </w:rPr>
+        <w:t>-coded level cards, radar chart, tabular result, and per-factor recommendations.</w:t>
       </w:r>
     </w:p>
     <w:p>
@@ -11882,7 +13872,21 @@
         <w:rPr>
           <w:rFonts w:eastAsia="Times New Roman" w:cs="Times New Roman"/>
         </w:rPr>
-        <w:t>This project designed, implemented, and deployed a per-rider ergonomic risk screening pipeline for last-mile quick-commerce delivery workers, turning a 36-item self-report questionnaire and a RULA + QEC observation record into six standardised risk levels across Force, Repetition, Posture, Duration, Contact Stress, and Vibration. The five survey-derived factors land at 58-62 percent cross-validation accuracy with macro AUC between 71 and 76 percent; the Posture model, which receives the RULA and QEC observation inputs directly, reaches 97 percent accuracy and 98 percent AUC. Chi-square identifies Posture, Repetition, and Force as the risk factors significantly associated with self-reported discomfort, and multivariable logistic regression flags age (OR 3.58 per band), job duration (OR 2.89), workload score, and fatigue score as the strongest individual predictors.</w:t>
+        <w:t xml:space="preserve">This project designed, implemented, and deployed a per-rider ergonomic risk screening pipeline for last-mile quick-commerce delivery workers, turning a 36-item self-report questionnaire and a RULA + QEC observation record into six </w:t>
+      </w:r>
+      <w:proofErr w:type="spellStart"/>
+      <w:r>
+        <w:rPr>
+          <w:rFonts w:eastAsia="Times New Roman" w:cs="Times New Roman"/>
+        </w:rPr>
+        <w:t>standardised</w:t>
+      </w:r>
+      <w:proofErr w:type="spellEnd"/>
+      <w:r>
+        <w:rPr>
+          <w:rFonts w:eastAsia="Times New Roman" w:cs="Times New Roman"/>
+        </w:rPr>
+        <w:t xml:space="preserve"> risk levels across Force, Repetition, Posture, Duration, Contact Stress, and Vibration. The five survey-derived factors land at 58-62 percent cross-validation accuracy with macro AUC between 71 and 76 percent; the Posture model, which receives the RULA and QEC observation inputs directly, reaches 97 percent accuracy and 98 percent AUC. Chi-square identifies Posture, Repetition, and Force as the risk factors significantly associated with self-reported discomfort, and multivariable logistic regression flags age (OR 3.58 per band), job duration (OR 2.89), workload score, and fatigue score as the strongest individual predictors.</w:t>
       </w:r>
     </w:p>
     <w:p>
@@ -11894,7 +13898,35 @@
         <w:rPr>
           <w:rFonts w:eastAsia="Times New Roman" w:cs="Times New Roman"/>
         </w:rPr>
-        <w:t>The main limitations are the self-report nature of most input variables, the severity-rank merge used to pair the identifier-less posture xlsx with the survey, and the small sample (n = 182) that keeps ML variance visible. Two methodological corrections were made and openly documented: Repetition binning moved from qcut to fixed cuts to remove a boundary tie that hid the worst real schedule, and vibration_index was added to the Duration exclusion list to remove indirect leakage.</w:t>
+        <w:t xml:space="preserve">The main limitations are the self-report nature of most input variables, the severity-rank merge used to pair the identifier-less posture xlsx with the survey, and the small sample (n = 182) that keeps ML variance visible. Two methodological corrections were made and openly documented: Repetition binning moved from </w:t>
+      </w:r>
+      <w:proofErr w:type="spellStart"/>
+      <w:r>
+        <w:rPr>
+          <w:rFonts w:eastAsia="Times New Roman" w:cs="Times New Roman"/>
+        </w:rPr>
+        <w:t>qcut</w:t>
+      </w:r>
+      <w:proofErr w:type="spellEnd"/>
+      <w:r>
+        <w:rPr>
+          <w:rFonts w:eastAsia="Times New Roman" w:cs="Times New Roman"/>
+        </w:rPr>
+        <w:t xml:space="preserve"> to fixed cuts to remove a boundary tie that hid the worst real schedule, and </w:t>
+      </w:r>
+      <w:proofErr w:type="spellStart"/>
+      <w:r>
+        <w:rPr>
+          <w:rFonts w:eastAsia="Times New Roman" w:cs="Times New Roman"/>
+        </w:rPr>
+        <w:t>vibration_index</w:t>
+      </w:r>
+      <w:proofErr w:type="spellEnd"/>
+      <w:r>
+        <w:rPr>
+          <w:rFonts w:eastAsia="Times New Roman" w:cs="Times New Roman"/>
+        </w:rPr>
+        <w:t xml:space="preserve"> was added to the Duration exclusion list to remove indirect leakage.</w:t>
       </w:r>
     </w:p>
     <w:p>
@@ -11906,7 +13938,21 @@
         <w:rPr>
           <w:rFonts w:eastAsia="Times New Roman" w:cs="Times New Roman"/>
         </w:rPr>
-        <w:t>Five interventions for a delivery-platform operator follow directly from the results: (i) cap daily hours (49 percent of the sample exceeds 8 hours per day); (ii) invest in posture-focused equipment and training (84 percent of observed postures at RULA action level 5 or above); (iii) encourage bike-storage-box carrying over handheld bags; (iv) age-targeted MSD screening for the 36-and-above cohort; and (v) platform-level workload management to reduce the NASA-TLX component of the workload score, a significant discomfort predictor at p = 0.0005.</w:t>
+        <w:t>Five interventions for a delivery-platform operator follow directly from the results: (</w:t>
+      </w:r>
+      <w:proofErr w:type="spellStart"/>
+      <w:r>
+        <w:rPr>
+          <w:rFonts w:eastAsia="Times New Roman" w:cs="Times New Roman"/>
+        </w:rPr>
+        <w:t>i</w:t>
+      </w:r>
+      <w:proofErr w:type="spellEnd"/>
+      <w:r>
+        <w:rPr>
+          <w:rFonts w:eastAsia="Times New Roman" w:cs="Times New Roman"/>
+        </w:rPr>
+        <w:t>) cap daily hours (49 percent of the sample exceeds 8 hours per day); (ii) invest in posture-focused equipment and training (84 percent of observed postures at RULA action level 5 or above); (iii) encourage bike-storage-box carrying over handheld bags; (iv) age-targeted MSD screening for the 36-and-above cohort; and (v) platform-level workload management to reduce the NASA-TLX component of the workload score, a significant discomfort predictor at p = 0.0005.</w:t>
       </w:r>
     </w:p>
     <w:p>
@@ -11945,10 +13991,23 @@
         <w:jc w:val="both"/>
       </w:pPr>
       <w:r>
-        <w:t xml:space="preserve">[1] </w:t>
-      </w:r>
-      <w:r>
-        <w:t>Benson TM, Sathiyarajeswaran NS, Radhakrishnan R, Gafoor AA, Krupalakshme M, Samal J (2025). Factors and prevalence of musculoskeletal pain among the app-based food delivery riders in Tamil Nadu: a cross-sectional study. Discover Social Sciences and Health, 5:14.</w:t>
+        <w:t xml:space="preserve">[1] Benson TM, </w:t>
+      </w:r>
+      <w:proofErr w:type="spellStart"/>
+      <w:r>
+        <w:t>Sathiyarajeswaran</w:t>
+      </w:r>
+      <w:proofErr w:type="spellEnd"/>
+      <w:r>
+        <w:t xml:space="preserve"> NS, Radhakrishnan R, Gafoor AA, </w:t>
+      </w:r>
+      <w:proofErr w:type="spellStart"/>
+      <w:r>
+        <w:t>Krupalakshme</w:t>
+      </w:r>
+      <w:proofErr w:type="spellEnd"/>
+      <w:r>
+        <w:t xml:space="preserve"> M, Samal J (2025). Factors and prevalence of musculoskeletal pain among the app-based food delivery riders in Tamil Nadu: a cross-sectional study. Discover Social Sciences and Health, 5:14.</w:t>
       </w:r>
     </w:p>
     <w:p>
@@ -11958,10 +14017,7 @@
         <w:jc w:val="both"/>
       </w:pPr>
       <w:r>
-        <w:t xml:space="preserve">[2] </w:t>
-      </w:r>
-      <w:r>
-        <w:t>Pandit S, Adhikari P (2023). Ergonomics Issues Among Last Mile Delivery Rides in Jabalpur, India. Springer Ergonomics Proceedings, 209-215.</w:t>
+        <w:t>[2] Pandit S, Adhikari P (2023). Ergonomics Issues Among Last Mile Delivery Rides in Jabalpur, India. Springer Ergonomics Proceedings, 209-215.</w:t>
       </w:r>
     </w:p>
     <w:p>
@@ -11971,10 +14027,15 @@
         <w:jc w:val="both"/>
       </w:pPr>
       <w:r>
-        <w:t xml:space="preserve">[3] </w:t>
-      </w:r>
-      <w:r>
-        <w:t>Daud A, Mohd Basri IS, Ahmad E, Mohd Hairon S, Nordin R, Azali Azmir N, Md Jalil MAS (2023). Assessing ergonomic risks: REBA analysis of food delivery riders in Eastern Peninsular Malaysia. Industrial Health, 61(4), 282-291.</w:t>
+        <w:t xml:space="preserve">[3] Daud A, Mohd Basri IS, Ahmad E, Mohd </w:t>
+      </w:r>
+      <w:proofErr w:type="spellStart"/>
+      <w:r>
+        <w:t>Hairon</w:t>
+      </w:r>
+      <w:proofErr w:type="spellEnd"/>
+      <w:r>
+        <w:t xml:space="preserve"> S, Nordin R, Azali Azmir N, Md Jalil MAS (2023). Assessing ergonomic risks: REBA analysis of food delivery riders in Eastern Peninsular Malaysia. Industrial Health, 61(4), 282-291.</w:t>
       </w:r>
     </w:p>
     <w:p>
@@ -11984,10 +14045,7 @@
         <w:jc w:val="both"/>
       </w:pPr>
       <w:r>
-        <w:t xml:space="preserve">[4] </w:t>
-      </w:r>
-      <w:r>
-        <w:t>McAtamney L, Corlett EN (1993). RULA: a survey method for the investigation of work-related upper limb disorders. Applied Ergonomics, 24(2), 91-99.</w:t>
+        <w:t>[4] McAtamney L, Corlett EN (1993). RULA: a survey method for the investigation of work-related upper limb disorders. Applied Ergonomics, 24(2), 91-99.</w:t>
       </w:r>
     </w:p>
     <w:p>
@@ -11997,10 +14055,7 @@
         <w:jc w:val="both"/>
       </w:pPr>
       <w:r>
-        <w:t xml:space="preserve">[5] </w:t>
-      </w:r>
-      <w:r>
-        <w:t>David G, Woods V, Li G, Buckle P (2008). The development of the Quick Exposure Check (QEC) for assessing exposure to risk factors for work-related musculoskeletal disorders. Applied Ergonomics, 39(1), 57-69.</w:t>
+        <w:t>[5] David G, Woods V, Li G, Buckle P (2008). The development of the Quick Exposure Check (QEC) for assessing exposure to risk factors for work-related musculoskeletal disorders. Applied Ergonomics, 39(1), 57-69.</w:t>
       </w:r>
     </w:p>
     <w:p>
@@ -12012,8 +14067,21 @@
       <w:r>
         <w:t xml:space="preserve">[6] </w:t>
       </w:r>
-      <w:r>
-        <w:t>Kuorinka I, Jonsson B, Kilbom A, Vinterberg H, Biering-Sorensen F, Andersson G, Jorgensen K (1987). Standardised Nordic questionnaires for the analysis of musculoskeletal symptoms. Applied Ergonomics, 18(3), 233-237.</w:t>
+      <w:proofErr w:type="spellStart"/>
+      <w:r>
+        <w:t>Kuorinka</w:t>
+      </w:r>
+      <w:proofErr w:type="spellEnd"/>
+      <w:r>
+        <w:t xml:space="preserve"> I, Jonsson B, Kilbom A, Vinterberg H, Biering-Sorensen F, Andersson G, Jorgensen K (1987). </w:t>
+      </w:r>
+      <w:proofErr w:type="spellStart"/>
+      <w:r>
+        <w:t>Standardised</w:t>
+      </w:r>
+      <w:proofErr w:type="spellEnd"/>
+      <w:r>
+        <w:t xml:space="preserve"> Nordic questionnaires for the analysis of musculoskeletal symptoms. Applied Ergonomics, 18(3), 233-237.</w:t>
       </w:r>
     </w:p>
     <w:p>
@@ -12023,10 +14091,15 @@
         <w:jc w:val="both"/>
       </w:pPr>
       <w:r>
-        <w:t xml:space="preserve">[7] </w:t>
-      </w:r>
-      <w:r>
-        <w:t>Hart SG, Staveland LE (1988). Development of NASA-TLX (Task Load Index): Results of empirical and theoretical research. Advances in Psychology, 52, 139-183.</w:t>
+        <w:t xml:space="preserve">[7] Hart SG, </w:t>
+      </w:r>
+      <w:proofErr w:type="spellStart"/>
+      <w:r>
+        <w:t>Staveland</w:t>
+      </w:r>
+      <w:proofErr w:type="spellEnd"/>
+      <w:r>
+        <w:t xml:space="preserve"> LE (1988). Development of NASA-TLX (Task Load Index): Results of empirical and theoretical research. Advances in Psychology, 52, 139-183.</w:t>
       </w:r>
     </w:p>
     <w:p>
@@ -12036,10 +14109,7 @@
         <w:jc w:val="both"/>
       </w:pPr>
       <w:r>
-        <w:t xml:space="preserve">[8] </w:t>
-      </w:r>
-      <w:r>
-        <w:t>Borg G (1998). Borg's Perceived Exertion and Pain Scales. Human Kinetics Publishers, Champaign, Illinois.</w:t>
+        <w:t>[8] Borg G (1998). Borg's Perceived Exertion and Pain Scales. Human Kinetics Publishers, Champaign, Illinois.</w:t>
       </w:r>
     </w:p>
     <w:p>
@@ -12049,10 +14119,15 @@
         <w:jc w:val="both"/>
       </w:pPr>
       <w:r>
-        <w:t xml:space="preserve">[9] </w:t>
-      </w:r>
-      <w:r>
-        <w:t>Chawla NV, Bowyer KW, Hall LO, Kegelmeyer WP (2002). SMOTE: Synthetic Minority Over-sampling Technique. Journal of Artificial Intelligence Research, 16, 321-357.</w:t>
+        <w:t xml:space="preserve">[9] Chawla NV, Bowyer KW, Hall LO, </w:t>
+      </w:r>
+      <w:proofErr w:type="spellStart"/>
+      <w:r>
+        <w:t>Kegelmeyer</w:t>
+      </w:r>
+      <w:proofErr w:type="spellEnd"/>
+      <w:r>
+        <w:t xml:space="preserve"> WP (2002). SMOTE: Synthetic Minority Over-sampling Technique. Journal of Artificial Intelligence Research, 16, 321-357.</w:t>
       </w:r>
     </w:p>
     <w:p>
@@ -12064,8 +14139,13 @@
       <w:r>
         <w:t xml:space="preserve">[10] </w:t>
       </w:r>
-      <w:r>
-        <w:t>Breiman L (2001). Random Forests. Machine Learning, 45(1), 5-32.</w:t>
+      <w:proofErr w:type="spellStart"/>
+      <w:r>
+        <w:t>Breiman</w:t>
+      </w:r>
+      <w:proofErr w:type="spellEnd"/>
+      <w:r>
+        <w:t xml:space="preserve"> L (2001). Random Forests. Machine Learning, 45(1), 5-32.</w:t>
       </w:r>
     </w:p>
     <w:p>
@@ -12075,10 +14155,15 @@
         <w:jc w:val="both"/>
       </w:pPr>
       <w:r>
-        <w:t xml:space="preserve">[11] </w:t>
-      </w:r>
-      <w:r>
-        <w:t>Geurts P, Ernst D, Wehenkel L (2006). Extremely randomized trees. Machine Learning, 63(1), 3-42.</w:t>
+        <w:t xml:space="preserve">[11] Geurts P, Ernst D, </w:t>
+      </w:r>
+      <w:proofErr w:type="spellStart"/>
+      <w:r>
+        <w:t>Wehenkel</w:t>
+      </w:r>
+      <w:proofErr w:type="spellEnd"/>
+      <w:r>
+        <w:t xml:space="preserve"> L (2006). Extremely randomized trees. Machine Learning, 63(1), 3-42.</w:t>
       </w:r>
     </w:p>
     <w:p>
@@ -12088,10 +14173,23 @@
         <w:jc w:val="both"/>
       </w:pPr>
       <w:r>
-        <w:t xml:space="preserve">[12] </w:t>
-      </w:r>
-      <w:r>
-        <w:t>Chen T, Guestrin C (2016). XGBoost: A Scalable Tree Boosting System. Proceedings of the 22nd ACM SIGKDD International Conference on Knowledge Discovery and Data Mining, 785-794.</w:t>
+        <w:t xml:space="preserve">[12] Chen T, </w:t>
+      </w:r>
+      <w:proofErr w:type="spellStart"/>
+      <w:r>
+        <w:t>Guestrin</w:t>
+      </w:r>
+      <w:proofErr w:type="spellEnd"/>
+      <w:r>
+        <w:t xml:space="preserve"> C (2016). </w:t>
+      </w:r>
+      <w:proofErr w:type="spellStart"/>
+      <w:r>
+        <w:t>XGBoost</w:t>
+      </w:r>
+      <w:proofErr w:type="spellEnd"/>
+      <w:r>
+        <w:t>: A Scalable Tree Boosting System. Proceedings of the 22nd ACM SIGKDD International Conference on Knowledge Discovery and Data Mining, 785-794.</w:t>
       </w:r>
     </w:p>
     <w:p>
@@ -12101,10 +14199,7 @@
         <w:jc w:val="both"/>
       </w:pPr>
       <w:r>
-        <w:t xml:space="preserve">[13] </w:t>
-      </w:r>
-      <w:r>
-        <w:t>Friedman JH (2001). Greedy function approximation: A gradient boosting machine. Annals of Statistics, 29(5), 1189-1232.</w:t>
+        <w:t>[13] Friedman JH (2001). Greedy function approximation: A gradient boosting machine. Annals of Statistics, 29(5), 1189-1232.</w:t>
       </w:r>
     </w:p>
     <w:p>
@@ -12114,23 +14209,23 @@
         <w:jc w:val="both"/>
       </w:pPr>
       <w:r>
-        <w:t xml:space="preserve">[14] </w:t>
-      </w:r>
-      <w:r>
-        <w:t>Pedregosa F, Varoquaux G, Gramfort A, et al. (2011). Scikit-learn: Machine Learning in Python. Journal of Machine Learning Research, 12, 2825-2830.</w:t>
-      </w:r>
-    </w:p>
-    <w:p>
-      <w:pPr>
-        <w:spacing w:after="160"/>
-        <w:ind w:left="454" w:hanging="454"/>
-        <w:jc w:val="both"/>
-      </w:pPr>
-      <w:r>
-        <w:t xml:space="preserve">[15] </w:t>
-      </w:r>
-      <w:r>
-        <w:t>Lemaitre G, Nogueira F, Aridas CK (2017). Imbalanced-learn: A Python toolbox to tackle the curse of imbalanced datasets in machine learning. Journal of Machine Learning Research, 18(17), 1-5.</w:t>
+        <w:t xml:space="preserve">[14] Pedregosa F, </w:t>
+      </w:r>
+      <w:proofErr w:type="spellStart"/>
+      <w:r>
+        <w:t>Varoquaux</w:t>
+      </w:r>
+      <w:proofErr w:type="spellEnd"/>
+      <w:r>
+        <w:t xml:space="preserve"> G, </w:t>
+      </w:r>
+      <w:proofErr w:type="spellStart"/>
+      <w:r>
+        <w:t>Gramfort</w:t>
+      </w:r>
+      <w:proofErr w:type="spellEnd"/>
+      <w:r>
+        <w:t xml:space="preserve"> A, et al. (2011). Scikit-learn: Machine Learning in Python. Journal of Machine Learning Research, 12, 2825-2830.</w:t>
       </w:r>
     </w:p>
     <w:sectPr>

</xml_diff>

<commit_message>
report.docx: fix front-matter Roman anchors (Contents spans two pages)
The Contents TOC has grown to 51+ entries after the Chapter 2 and
Chapter 4 restructurings and now spans two physical pages, so it
occupies Roman iv AND v.  Everything after Contents therefore shifts
up by one Roman numeral:

  Certificate       i     (unchanged)
  Abstract          ii    (unchanged)
  Acknowledgements  iii   (unchanged)
  Contents          iv    (unchanged; now known to spill to v)
  List of Figures   vi    (was v)
  List of Tables    vii   (was vi)
  Abbreviations     viii  (was vii)
  Symbols           ix    (was viii)

Patched docx directly (preserves manual image sizes).  Source contents
list updated to match.
</commit_message>
<xml_diff>
--- a/docs/report.docx
+++ b/docs/report.docx
@@ -695,7 +695,7 @@
           <w:rFonts w:eastAsia="Times New Roman" w:cs="Times New Roman"/>
         </w:rPr>
         <w:tab/>
-        <w:t>v</w:t>
+        <w:t>vi</w:t>
       </w:r>
     </w:p>
     <w:p>
@@ -716,7 +716,7 @@
           <w:rFonts w:eastAsia="Times New Roman" w:cs="Times New Roman"/>
         </w:rPr>
         <w:tab/>
-        <w:t>vi</w:t>
+        <w:t>vii</w:t>
       </w:r>
     </w:p>
     <w:p>
@@ -737,7 +737,7 @@
           <w:rFonts w:eastAsia="Times New Roman" w:cs="Times New Roman"/>
         </w:rPr>
         <w:tab/>
-        <w:t>vii</w:t>
+        <w:t>viii</w:t>
       </w:r>
     </w:p>
     <w:p>
@@ -758,7 +758,7 @@
           <w:rFonts w:eastAsia="Times New Roman" w:cs="Times New Roman"/>
         </w:rPr>
         <w:tab/>
-        <w:t>viii</w:t>
+        <w:t>ix</w:t>
       </w:r>
     </w:p>
     <w:p>

</xml_diff>

<commit_message>
report.docx: fix corrupted Figure/Table labels in LoF and LoT
A previous TOC page-anchor patch used a regex (\d+$) that matched
digits at the end of *any* run in the LoF/LoT rows -- including the
label run 'Figure 4.2'.  It replaced the trailing '2' of the label
with the new page number '12', producing 'Figure 4.12' instead of
'Figure 4.2', 'Figure 4.13' instead of 'Figure 4.3', and so on.
Nine tables were corrupted the same way (Table 4.12, 4.13...).

Rewrote every LoF and LoT row by position: the first run gets the
correct 'Figure X.Y' or 'Table X.Y' label, the caption run in the
middle is preserved, and the last run gets the correct page number.

Final list:
  LoF: Figure 2.1 + Figure 4.1..4.13
  LoT: Table 2.1 + Table 4.1..4.8

Patched docx directly, no full rebuild -- manual image-size
adjustments in Word are preserved.
</commit_message>
<xml_diff>
--- a/docs/report.docx
+++ b/docs/report.docx
@@ -44,19 +44,8 @@
           <w:color w:val="000000"/>
           <w:sz w:val="26"/>
         </w:rPr>
-        <w:t xml:space="preserve">IIITDM-SIES </w:t>
-      </w:r>
-      <w:proofErr w:type="spellStart"/>
-      <w:r>
-        <w:rPr>
-          <w:rFonts w:eastAsia="Times New Roman" w:cs="Times New Roman"/>
-          <w:b/>
-          <w:color w:val="000000"/>
-          <w:sz w:val="26"/>
-        </w:rPr>
-        <w:t>Programme</w:t>
-      </w:r>
-      <w:proofErr w:type="spellEnd"/>
+        <w:t>IIITDM-SIES Programme</w:t>
+      </w:r>
     </w:p>
     <w:p>
       <w:pPr>
@@ -325,21 +314,7 @@
         <w:rPr>
           <w:rFonts w:eastAsia="Times New Roman" w:cs="Times New Roman"/>
         </w:rPr>
-        <w:t xml:space="preserve">In my capacity as supervisor of the above-mentioned work, I certify that the work presented in this Report is carried out under my supervision, and is worthy of consideration for the requirements of internship under IIITDM-SIES </w:t>
-      </w:r>
-      <w:proofErr w:type="spellStart"/>
-      <w:r>
-        <w:rPr>
-          <w:rFonts w:eastAsia="Times New Roman" w:cs="Times New Roman"/>
-        </w:rPr>
-        <w:t>programme</w:t>
-      </w:r>
-      <w:proofErr w:type="spellEnd"/>
-      <w:r>
-        <w:rPr>
-          <w:rFonts w:eastAsia="Times New Roman" w:cs="Times New Roman"/>
-        </w:rPr>
-        <w:t xml:space="preserve"> during the period May 2026 to July 2026.</w:t>
+        <w:t>In my capacity as supervisor of the above-mentioned work, I certify that the work presented in this Report is carried out under my supervision, and is worthy of consideration for the requirements of internship under IIITDM-SIES programme during the period May 2026 to July 2026.</w:t>
       </w:r>
     </w:p>
     <w:p>
@@ -392,35 +367,7 @@
         <w:rPr>
           <w:rFonts w:eastAsia="Times New Roman" w:cs="Times New Roman"/>
         </w:rPr>
-        <w:t>Last-mile quick-commerce delivery riders (</w:t>
-      </w:r>
-      <w:proofErr w:type="spellStart"/>
-      <w:r>
-        <w:rPr>
-          <w:rFonts w:eastAsia="Times New Roman" w:cs="Times New Roman"/>
-        </w:rPr>
-        <w:t>Blinkit</w:t>
-      </w:r>
-      <w:proofErr w:type="spellEnd"/>
-      <w:r>
-        <w:rPr>
-          <w:rFonts w:eastAsia="Times New Roman" w:cs="Times New Roman"/>
-        </w:rPr>
-        <w:t xml:space="preserve">, </w:t>
-      </w:r>
-      <w:proofErr w:type="spellStart"/>
-      <w:r>
-        <w:rPr>
-          <w:rFonts w:eastAsia="Times New Roman" w:cs="Times New Roman"/>
-        </w:rPr>
-        <w:t>Zepto</w:t>
-      </w:r>
-      <w:proofErr w:type="spellEnd"/>
-      <w:r>
-        <w:rPr>
-          <w:rFonts w:eastAsia="Times New Roman" w:cs="Times New Roman"/>
-        </w:rPr>
-        <w:t>) face prolonged awkward postures, high delivery rates, heavy carrying loads and vehicle vibration, leading to musculoskeletal disorders (MSDs). Risk is not uniform across the workforce: age, tenure, daily hours, vehicle type, and carrying mode all shape the exposure profile, but this variation stays invisible to the platform. Standard ergonomic methods each cover part of the picture (RULA and QEC on the observation side, NMQ, NASA-TLX and Borg CR10 on self-report), and no single tool combines the six standard ergonomic risk factors into an automated per-rider screening. This work builds that screening on a cross-sectional sample of 182 riders from the Chengalpattu and Chennai regions collected in March and April 2026.</w:t>
+        <w:t>Last-mile quick-commerce delivery riders (Blinkit, Zepto) face prolonged awkward postures, high delivery rates, heavy carrying loads and vehicle vibration, leading to musculoskeletal disorders (MSDs). Risk is not uniform across the workforce: age, tenure, daily hours, vehicle type, and carrying mode all shape the exposure profile, but this variation stays invisible to the platform. Standard ergonomic methods each cover part of the picture (RULA and QEC on the observation side, NMQ, NASA-TLX and Borg CR10 on self-report), and no single tool combines the six standard ergonomic risk factors into an automated per-rider screening. This work builds that screening on a cross-sectional sample of 182 riders from the Chengalpattu and Chennai regions collected in March and April 2026.</w:t>
       </w:r>
     </w:p>
     <w:p>
@@ -432,35 +379,7 @@
         <w:rPr>
           <w:rFonts w:eastAsia="Times New Roman" w:cs="Times New Roman"/>
         </w:rPr>
-        <w:t xml:space="preserve">The pipeline runs in two stages. Stage 1 applies standard ergonomic methods (Borg CR10 action levels, RULA Table C thresholds, and sample-based cuts) to compute Low, Medium, or High risk labels for each factor from a 182-rider survey combined with 182 RULA and QEC observation records. Stage 2 trains supervised classifiers per factor using seven candidate algorithms (Logistic Regression, Decision Tree, Random Forest, Extra Trees, Hist Gradient Boosting, </w:t>
-      </w:r>
-      <w:proofErr w:type="spellStart"/>
-      <w:r>
-        <w:rPr>
-          <w:rFonts w:eastAsia="Times New Roman" w:cs="Times New Roman"/>
-        </w:rPr>
-        <w:t>XGBoost</w:t>
-      </w:r>
-      <w:proofErr w:type="spellEnd"/>
-      <w:r>
-        <w:rPr>
-          <w:rFonts w:eastAsia="Times New Roman" w:cs="Times New Roman"/>
-        </w:rPr>
-        <w:t xml:space="preserve">, and Stacking) tuned via </w:t>
-      </w:r>
-      <w:proofErr w:type="spellStart"/>
-      <w:r>
-        <w:rPr>
-          <w:rFonts w:eastAsia="Times New Roman" w:cs="Times New Roman"/>
-        </w:rPr>
-        <w:t>GridSearchCV</w:t>
-      </w:r>
-      <w:proofErr w:type="spellEnd"/>
-      <w:r>
-        <w:rPr>
-          <w:rFonts w:eastAsia="Times New Roman" w:cs="Times New Roman"/>
-        </w:rPr>
-        <w:t xml:space="preserve"> with SMOTE inside 5-fold stratified cross-validation.</w:t>
+        <w:t>The pipeline runs in two stages. Stage 1 applies standard ergonomic methods (Borg CR10 action levels, RULA Table C thresholds, and sample-based cuts) to compute Low, Medium, or High risk labels for each factor from a 182-rider survey combined with 182 RULA and QEC observation records. Stage 2 trains supervised classifiers per factor using seven candidate algorithms (Logistic Regression, Decision Tree, Random Forest, Extra Trees, Hist Gradient Boosting, XGBoost, and Stacking) tuned via GridSearchCV with SMOTE inside 5-fold stratified cross-validation.</w:t>
       </w:r>
     </w:p>
     <w:p>
@@ -472,35 +391,7 @@
         <w:rPr>
           <w:rFonts w:eastAsia="Times New Roman" w:cs="Times New Roman"/>
         </w:rPr>
-        <w:t xml:space="preserve">The five survey-derived factors achieved 58 to 62 percent cross-validation accuracy with macro AUC between 71 and 76 percent. The Posture model, which uses the 11 RULA components and 8 QEC scores in addition to the survey features, reached 97 percent accuracy and 98 percent AUC. Statistical analysis (chi-square and multivariable logistic regression) identified age, job duration, workload score, and fatigue score as the strongest individual predictors of self-reported discomfort. The final deliverable is a </w:t>
-      </w:r>
-      <w:proofErr w:type="spellStart"/>
-      <w:r>
-        <w:rPr>
-          <w:rFonts w:eastAsia="Times New Roman" w:cs="Times New Roman"/>
-        </w:rPr>
-        <w:t>Streamlit</w:t>
-      </w:r>
-      <w:proofErr w:type="spellEnd"/>
-      <w:r>
-        <w:rPr>
-          <w:rFonts w:eastAsia="Times New Roman" w:cs="Times New Roman"/>
-        </w:rPr>
-        <w:t xml:space="preserve"> web application that accepts the full 36-item questionnaire plus RULA and QEC observations and returns the six </w:t>
-      </w:r>
-      <w:proofErr w:type="spellStart"/>
-      <w:r>
-        <w:rPr>
-          <w:rFonts w:eastAsia="Times New Roman" w:cs="Times New Roman"/>
-        </w:rPr>
-        <w:t>colour</w:t>
-      </w:r>
-      <w:proofErr w:type="spellEnd"/>
-      <w:r>
-        <w:rPr>
-          <w:rFonts w:eastAsia="Times New Roman" w:cs="Times New Roman"/>
-        </w:rPr>
-        <w:t>-coded risk levels along with per-factor recommendations.</w:t>
+        <w:t>The five survey-derived factors achieved 58 to 62 percent cross-validation accuracy with macro AUC between 71 and 76 percent. The Posture model, which uses the 11 RULA components and 8 QEC scores in addition to the survey features, reached 97 percent accuracy and 98 percent AUC. Statistical analysis (chi-square and multivariable logistic regression) identified age, job duration, workload score, and fatigue score as the strongest individual predictors of self-reported discomfort. The final deliverable is a Streamlit web application that accepts the full 36-item questionnaire plus RULA and QEC observations and returns the six colour-coded risk levels along with per-factor recommendations.</w:t>
       </w:r>
     </w:p>
     <w:p>
@@ -604,15 +495,8 @@
           <w:rFonts w:eastAsia="Times New Roman" w:cs="Times New Roman"/>
         </w:rPr>
         <w:tab/>
-      </w:r>
-      <w:proofErr w:type="spellStart"/>
-      <w:r>
-        <w:rPr>
-          <w:rFonts w:eastAsia="Times New Roman" w:cs="Times New Roman"/>
-        </w:rPr>
         <w:t>i</w:t>
       </w:r>
-      <w:proofErr w:type="spellEnd"/>
     </w:p>
     <w:p>
       <w:pPr>
@@ -676,6 +560,18 @@
         <w:tab/>
         <w:t>iv</w:t>
       </w:r>
+      <w:r>
+        <w:rPr>
+          <w:rFonts w:eastAsia="Times New Roman" w:cs="Times New Roman"/>
+        </w:rPr>
+        <w:t>-</w:t>
+      </w:r>
+      <w:r>
+        <w:rPr>
+          <w:rFonts w:eastAsia="Times New Roman" w:cs="Times New Roman"/>
+        </w:rPr>
+        <w:t>v</w:t>
+      </w:r>
     </w:p>
     <w:p>
       <w:pPr>
@@ -1154,16 +1050,8 @@
         <w:rPr>
           <w:rFonts w:eastAsia="Times New Roman" w:cs="Times New Roman"/>
         </w:rPr>
-        <w:t xml:space="preserve">        2.6.6   </w:t>
-      </w:r>
-      <w:proofErr w:type="spellStart"/>
-      <w:r>
-        <w:rPr>
-          <w:rFonts w:eastAsia="Times New Roman" w:cs="Times New Roman"/>
-        </w:rPr>
-        <w:t>XGBoost</w:t>
-      </w:r>
-      <w:proofErr w:type="spellEnd"/>
+        <w:t xml:space="preserve">        2.6.6   XGBoost</w:t>
+      </w:r>
       <w:r>
         <w:rPr>
           <w:rFonts w:eastAsia="Times New Roman" w:cs="Times New Roman"/>
@@ -1772,7 +1660,7 @@
         <w:rPr>
           <w:rFonts w:eastAsia="Times New Roman" w:cs="Times New Roman"/>
         </w:rPr>
-        <w:t>Figure 4.12</w:t>
+        <w:t>Figure 4.2</w:t>
       </w:r>
       <w:r>
         <w:rPr>
@@ -1786,7 +1674,7 @@
           <w:rFonts w:eastAsia="Times New Roman" w:cs="Times New Roman"/>
         </w:rPr>
         <w:tab/>
-        <w:t>13</w:t>
+        <w:t>12</w:t>
       </w:r>
     </w:p>
     <w:p>
@@ -1801,7 +1689,7 @@
         <w:rPr>
           <w:rFonts w:eastAsia="Times New Roman" w:cs="Times New Roman"/>
         </w:rPr>
-        <w:t>Figure 4.13</w:t>
+        <w:t>Figure 4.3</w:t>
       </w:r>
       <w:r>
         <w:rPr>
@@ -1815,7 +1703,7 @@
           <w:rFonts w:eastAsia="Times New Roman" w:cs="Times New Roman"/>
         </w:rPr>
         <w:tab/>
-        <w:t>14</w:t>
+        <w:t>13</w:t>
       </w:r>
     </w:p>
     <w:p>
@@ -1830,7 +1718,7 @@
         <w:rPr>
           <w:rFonts w:eastAsia="Times New Roman" w:cs="Times New Roman"/>
         </w:rPr>
-        <w:t>Figure 4.14</w:t>
+        <w:t>Figure 4.4</w:t>
       </w:r>
       <w:r>
         <w:rPr>
@@ -1844,7 +1732,7 @@
           <w:rFonts w:eastAsia="Times New Roman" w:cs="Times New Roman"/>
         </w:rPr>
         <w:tab/>
-        <w:t>15</w:t>
+        <w:t>14</w:t>
       </w:r>
     </w:p>
     <w:p>
@@ -1859,7 +1747,7 @@
         <w:rPr>
           <w:rFonts w:eastAsia="Times New Roman" w:cs="Times New Roman"/>
         </w:rPr>
-        <w:t>Figure 4.14</w:t>
+        <w:t>Figure 4.5</w:t>
       </w:r>
       <w:r>
         <w:rPr>
@@ -1873,7 +1761,7 @@
           <w:rFonts w:eastAsia="Times New Roman" w:cs="Times New Roman"/>
         </w:rPr>
         <w:tab/>
-        <w:t>16</w:t>
+        <w:t>14</w:t>
       </w:r>
     </w:p>
     <w:p>
@@ -1888,7 +1776,7 @@
         <w:rPr>
           <w:rFonts w:eastAsia="Times New Roman" w:cs="Times New Roman"/>
         </w:rPr>
-        <w:t>Figure 4.16</w:t>
+        <w:t>Figure 4.6</w:t>
       </w:r>
       <w:r>
         <w:rPr>
@@ -1902,7 +1790,7 @@
           <w:rFonts w:eastAsia="Times New Roman" w:cs="Times New Roman"/>
         </w:rPr>
         <w:tab/>
-        <w:t>19</w:t>
+        <w:t>16</w:t>
       </w:r>
     </w:p>
     <w:p>
@@ -1917,7 +1805,7 @@
         <w:rPr>
           <w:rFonts w:eastAsia="Times New Roman" w:cs="Times New Roman"/>
         </w:rPr>
-        <w:t>Figure 4.16</w:t>
+        <w:t>Figure 4.7</w:t>
       </w:r>
       <w:r>
         <w:rPr>
@@ -1931,7 +1819,7 @@
           <w:rFonts w:eastAsia="Times New Roman" w:cs="Times New Roman"/>
         </w:rPr>
         <w:tab/>
-        <w:t>19</w:t>
+        <w:t>16</w:t>
       </w:r>
     </w:p>
     <w:p>
@@ -1946,7 +1834,7 @@
         <w:rPr>
           <w:rFonts w:eastAsia="Times New Roman" w:cs="Times New Roman"/>
         </w:rPr>
-        <w:t>Figure 4.16</w:t>
+        <w:t>Figure 4.8</w:t>
       </w:r>
       <w:r>
         <w:rPr>
@@ -1960,7 +1848,7 @@
           <w:rFonts w:eastAsia="Times New Roman" w:cs="Times New Roman"/>
         </w:rPr>
         <w:tab/>
-        <w:t>20</w:t>
+        <w:t>16</w:t>
       </w:r>
     </w:p>
     <w:p>
@@ -1975,7 +1863,7 @@
         <w:rPr>
           <w:rFonts w:eastAsia="Times New Roman" w:cs="Times New Roman"/>
         </w:rPr>
-        <w:t>Figure 4.17</w:t>
+        <w:t>Figure 4.9</w:t>
       </w:r>
       <w:r>
         <w:rPr>
@@ -1989,7 +1877,7 @@
           <w:rFonts w:eastAsia="Times New Roman" w:cs="Times New Roman"/>
         </w:rPr>
         <w:tab/>
-        <w:t>20</w:t>
+        <w:t>17</w:t>
       </w:r>
     </w:p>
     <w:p>
@@ -2004,7 +1892,7 @@
         <w:rPr>
           <w:rFonts w:eastAsia="Times New Roman" w:cs="Times New Roman"/>
         </w:rPr>
-        <w:t>Figure 4.17</w:t>
+        <w:t>Figure 4.10</w:t>
       </w:r>
       <w:r>
         <w:rPr>
@@ -2018,7 +1906,7 @@
           <w:rFonts w:eastAsia="Times New Roman" w:cs="Times New Roman"/>
         </w:rPr>
         <w:tab/>
-        <w:t>20</w:t>
+        <w:t>17</w:t>
       </w:r>
     </w:p>
     <w:p>
@@ -2033,7 +1921,7 @@
         <w:rPr>
           <w:rFonts w:eastAsia="Times New Roman" w:cs="Times New Roman"/>
         </w:rPr>
-        <w:t>Figure 4.17</w:t>
+        <w:t>Figure 4.11</w:t>
       </w:r>
       <w:r>
         <w:rPr>
@@ -2047,7 +1935,7 @@
           <w:rFonts w:eastAsia="Times New Roman" w:cs="Times New Roman"/>
         </w:rPr>
         <w:tab/>
-        <w:t>20</w:t>
+        <w:t>17</w:t>
       </w:r>
     </w:p>
     <w:p>
@@ -2062,7 +1950,7 @@
         <w:rPr>
           <w:rFonts w:eastAsia="Times New Roman" w:cs="Times New Roman"/>
         </w:rPr>
-        <w:t>Figure 4.18</w:t>
+        <w:t>Figure 4.12</w:t>
       </w:r>
       <w:r>
         <w:rPr>
@@ -2076,7 +1964,7 @@
           <w:rFonts w:eastAsia="Times New Roman" w:cs="Times New Roman"/>
         </w:rPr>
         <w:tab/>
-        <w:t>21</w:t>
+        <w:t>18</w:t>
       </w:r>
     </w:p>
     <w:p>
@@ -2091,7 +1979,7 @@
         <w:rPr>
           <w:rFonts w:eastAsia="Times New Roman" w:cs="Times New Roman"/>
         </w:rPr>
-        <w:t>Figure 4.18</w:t>
+        <w:t>Figure 4.13</w:t>
       </w:r>
       <w:r>
         <w:rPr>
@@ -2105,7 +1993,7 @@
           <w:rFonts w:eastAsia="Times New Roman" w:cs="Times New Roman"/>
         </w:rPr>
         <w:tab/>
-        <w:t>21</w:t>
+        <w:t>18</w:t>
       </w:r>
     </w:p>
     <w:p>
@@ -2166,7 +2054,7 @@
         <w:rPr>
           <w:rFonts w:eastAsia="Times New Roman" w:cs="Times New Roman"/>
         </w:rPr>
-        <w:t>Table 4.12</w:t>
+        <w:t>Table 4.1</w:t>
       </w:r>
       <w:r>
         <w:rPr>
@@ -2180,7 +2068,7 @@
           <w:rFonts w:eastAsia="Times New Roman" w:cs="Times New Roman"/>
         </w:rPr>
         <w:tab/>
-        <w:t>13</w:t>
+        <w:t>12</w:t>
       </w:r>
     </w:p>
     <w:p>
@@ -2195,7 +2083,7 @@
         <w:rPr>
           <w:rFonts w:eastAsia="Times New Roman" w:cs="Times New Roman"/>
         </w:rPr>
-        <w:t>Table 4.12</w:t>
+        <w:t>Table 4.2</w:t>
       </w:r>
       <w:r>
         <w:rPr>
@@ -2209,7 +2097,7 @@
           <w:rFonts w:eastAsia="Times New Roman" w:cs="Times New Roman"/>
         </w:rPr>
         <w:tab/>
-        <w:t>13</w:t>
+        <w:t>12</w:t>
       </w:r>
     </w:p>
     <w:p>
@@ -2224,7 +2112,7 @@
         <w:rPr>
           <w:rFonts w:eastAsia="Times New Roman" w:cs="Times New Roman"/>
         </w:rPr>
-        <w:t>Table 4.13</w:t>
+        <w:t>Table 4.3</w:t>
       </w:r>
       <w:r>
         <w:rPr>
@@ -2238,7 +2126,7 @@
           <w:rFonts w:eastAsia="Times New Roman" w:cs="Times New Roman"/>
         </w:rPr>
         <w:tab/>
-        <w:t>14</w:t>
+        <w:t>13</w:t>
       </w:r>
     </w:p>
     <w:p>
@@ -2253,7 +2141,7 @@
         <w:rPr>
           <w:rFonts w:eastAsia="Times New Roman" w:cs="Times New Roman"/>
         </w:rPr>
-        <w:t>Table 4.14</w:t>
+        <w:t>Table 4.4</w:t>
       </w:r>
       <w:r>
         <w:rPr>
@@ -2267,7 +2155,7 @@
           <w:rFonts w:eastAsia="Times New Roman" w:cs="Times New Roman"/>
         </w:rPr>
         <w:tab/>
-        <w:t>15</w:t>
+        <w:t>14</w:t>
       </w:r>
     </w:p>
     <w:p>
@@ -2282,7 +2170,7 @@
         <w:rPr>
           <w:rFonts w:eastAsia="Times New Roman" w:cs="Times New Roman"/>
         </w:rPr>
-        <w:t>Table 4.15</w:t>
+        <w:t>Table 4.5</w:t>
       </w:r>
       <w:r>
         <w:rPr>
@@ -2296,7 +2184,7 @@
           <w:rFonts w:eastAsia="Times New Roman" w:cs="Times New Roman"/>
         </w:rPr>
         <w:tab/>
-        <w:t>17</w:t>
+        <w:t>15</w:t>
       </w:r>
     </w:p>
     <w:p>
@@ -2311,7 +2199,7 @@
         <w:rPr>
           <w:rFonts w:eastAsia="Times New Roman" w:cs="Times New Roman"/>
         </w:rPr>
-        <w:t>Table 4.16</w:t>
+        <w:t>Table 4.6</w:t>
       </w:r>
       <w:r>
         <w:rPr>
@@ -2325,7 +2213,7 @@
           <w:rFonts w:eastAsia="Times New Roman" w:cs="Times New Roman"/>
         </w:rPr>
         <w:tab/>
-        <w:t>19</w:t>
+        <w:t>16</w:t>
       </w:r>
     </w:p>
     <w:p>
@@ -2340,7 +2228,7 @@
         <w:rPr>
           <w:rFonts w:eastAsia="Times New Roman" w:cs="Times New Roman"/>
         </w:rPr>
-        <w:t>Table 4.16</w:t>
+        <w:t>Table 4.7</w:t>
       </w:r>
       <w:r>
         <w:rPr>
@@ -2354,7 +2242,7 @@
           <w:rFonts w:eastAsia="Times New Roman" w:cs="Times New Roman"/>
         </w:rPr>
         <w:tab/>
-        <w:t>19</w:t>
+        <w:t>16</w:t>
       </w:r>
     </w:p>
     <w:p>
@@ -2369,35 +2257,21 @@
         <w:rPr>
           <w:rFonts w:eastAsia="Times New Roman" w:cs="Times New Roman"/>
         </w:rPr>
-        <w:t>Table 4.17</w:t>
+        <w:t>Table 4.8</w:t>
       </w:r>
       <w:r>
         <w:rPr>
           <w:rFonts w:eastAsia="Times New Roman" w:cs="Times New Roman"/>
         </w:rPr>
         <w:tab/>
-        <w:t xml:space="preserve">Winning hyperparameters per target after </w:t>
-      </w:r>
-      <w:proofErr w:type="spellStart"/>
-      <w:r>
-        <w:rPr>
-          <w:rFonts w:eastAsia="Times New Roman" w:cs="Times New Roman"/>
-        </w:rPr>
-        <w:t>GridSearchCV</w:t>
-      </w:r>
-      <w:proofErr w:type="spellEnd"/>
-      <w:r>
-        <w:rPr>
-          <w:rFonts w:eastAsia="Times New Roman" w:cs="Times New Roman"/>
-        </w:rPr>
-        <w:t>.</w:t>
+        <w:t>Winning hyperparameters per target after GridSearchCV.</w:t>
       </w:r>
       <w:r>
         <w:rPr>
           <w:rFonts w:eastAsia="Times New Roman" w:cs="Times New Roman"/>
         </w:rPr>
         <w:tab/>
-        <w:t>20</w:t>
+        <w:t>17</w:t>
       </w:r>
     </w:p>
     <w:p>
@@ -2710,7 +2584,6 @@
         </w:tabs>
         <w:spacing w:after="60"/>
       </w:pPr>
-      <w:proofErr w:type="spellStart"/>
       <w:r>
         <w:rPr>
           <w:rFonts w:eastAsia="Times New Roman" w:cs="Times New Roman"/>
@@ -2718,7 +2591,6 @@
         </w:rPr>
         <w:t>HistGBM</w:t>
       </w:r>
-      <w:proofErr w:type="spellEnd"/>
       <w:r>
         <w:rPr>
           <w:rFonts w:eastAsia="Times New Roman" w:cs="Times New Roman"/>
@@ -2734,7 +2606,6 @@
         </w:tabs>
         <w:spacing w:after="60"/>
       </w:pPr>
-      <w:proofErr w:type="spellStart"/>
       <w:r>
         <w:rPr>
           <w:rFonts w:eastAsia="Times New Roman" w:cs="Times New Roman"/>
@@ -2742,26 +2613,12 @@
         </w:rPr>
         <w:t>XGBoost</w:t>
       </w:r>
-      <w:proofErr w:type="spellEnd"/>
       <w:r>
         <w:rPr>
           <w:rFonts w:eastAsia="Times New Roman" w:cs="Times New Roman"/>
         </w:rPr>
         <w:tab/>
-      </w:r>
-      <w:proofErr w:type="spellStart"/>
-      <w:r>
-        <w:rPr>
-          <w:rFonts w:eastAsia="Times New Roman" w:cs="Times New Roman"/>
-        </w:rPr>
-        <w:t>eXtreme</w:t>
-      </w:r>
-      <w:proofErr w:type="spellEnd"/>
-      <w:r>
-        <w:rPr>
-          <w:rFonts w:eastAsia="Times New Roman" w:cs="Times New Roman"/>
-        </w:rPr>
-        <w:t xml:space="preserve"> Gradient Boosting</w:t>
+        <w:t>eXtreme Gradient Boosting</w:t>
       </w:r>
     </w:p>
     <w:p>
@@ -2793,7 +2650,6 @@
         </w:tabs>
         <w:spacing w:after="60"/>
       </w:pPr>
-      <w:proofErr w:type="spellStart"/>
       <w:r>
         <w:rPr>
           <w:rFonts w:eastAsia="Times New Roman" w:cs="Times New Roman"/>
@@ -2801,7 +2657,6 @@
         </w:rPr>
         <w:t>dph</w:t>
       </w:r>
-      <w:proofErr w:type="spellEnd"/>
       <w:r>
         <w:rPr>
           <w:rFonts w:eastAsia="Times New Roman" w:cs="Times New Roman"/>
@@ -2892,21 +2747,7 @@
           <w:rFonts w:eastAsia="Times New Roman" w:cs="Times New Roman"/>
         </w:rPr>
         <w:tab/>
-        <w:t xml:space="preserve">number of nearest minority </w:t>
-      </w:r>
-      <w:proofErr w:type="spellStart"/>
-      <w:r>
-        <w:rPr>
-          <w:rFonts w:eastAsia="Times New Roman" w:cs="Times New Roman"/>
-        </w:rPr>
-        <w:t>neighbours</w:t>
-      </w:r>
-      <w:proofErr w:type="spellEnd"/>
-      <w:r>
-        <w:rPr>
-          <w:rFonts w:eastAsia="Times New Roman" w:cs="Times New Roman"/>
-        </w:rPr>
-        <w:t xml:space="preserve"> used by SMOTE</w:t>
+        <w:t>number of nearest minority neighbours used by SMOTE</w:t>
       </w:r>
     </w:p>
     <w:p>
@@ -3008,7 +2849,6 @@
         </w:tabs>
         <w:spacing w:after="60"/>
       </w:pPr>
-      <w:proofErr w:type="spellStart"/>
       <w:r>
         <w:rPr>
           <w:rFonts w:eastAsia="Times New Roman" w:cs="Times New Roman"/>
@@ -3017,36 +2857,13 @@
         </w:rPr>
         <w:t>dph</w:t>
       </w:r>
-      <w:proofErr w:type="spellEnd"/>
       <w:r>
         <w:rPr>
           <w:rFonts w:eastAsia="Times New Roman" w:cs="Times New Roman"/>
         </w:rPr>
         <w:tab/>
-        <w:t xml:space="preserve">deliveries per hour, </w:t>
-      </w:r>
-      <w:proofErr w:type="spellStart"/>
-      <w:r>
-        <w:rPr>
-          <w:rFonts w:eastAsia="Times New Roman" w:cs="Times New Roman"/>
-        </w:rPr>
-        <w:t>deliveries_num</w:t>
-      </w:r>
-      <w:proofErr w:type="spellEnd"/>
-      <w:r>
-        <w:rPr>
-          <w:rFonts w:eastAsia="Times New Roman" w:cs="Times New Roman"/>
-        </w:rPr>
-        <w:t xml:space="preserve"> / </w:t>
-      </w:r>
-      <w:proofErr w:type="spellStart"/>
-      <w:r>
-        <w:rPr>
-          <w:rFonts w:eastAsia="Times New Roman" w:cs="Times New Roman"/>
-        </w:rPr>
-        <w:t>work_hours_num</w:t>
-      </w:r>
-      <w:proofErr w:type="spellEnd"/>
+        <w:t>deliveries per hour, deliveries_num / work_hours_num</w:t>
+      </w:r>
     </w:p>
     <w:p>
       <w:pPr>
@@ -3098,35 +2915,7 @@
         <w:rPr>
           <w:rFonts w:eastAsia="Times New Roman" w:cs="Times New Roman"/>
         </w:rPr>
-        <w:t xml:space="preserve">Last-mile quick-commerce delivery riders for platforms like </w:t>
-      </w:r>
-      <w:proofErr w:type="spellStart"/>
-      <w:r>
-        <w:rPr>
-          <w:rFonts w:eastAsia="Times New Roman" w:cs="Times New Roman"/>
-        </w:rPr>
-        <w:t>Blinkit</w:t>
-      </w:r>
-      <w:proofErr w:type="spellEnd"/>
-      <w:r>
-        <w:rPr>
-          <w:rFonts w:eastAsia="Times New Roman" w:cs="Times New Roman"/>
-        </w:rPr>
-        <w:t xml:space="preserve"> and </w:t>
-      </w:r>
-      <w:proofErr w:type="spellStart"/>
-      <w:r>
-        <w:rPr>
-          <w:rFonts w:eastAsia="Times New Roman" w:cs="Times New Roman"/>
-        </w:rPr>
-        <w:t>Zepto</w:t>
-      </w:r>
-      <w:proofErr w:type="spellEnd"/>
-      <w:r>
-        <w:rPr>
-          <w:rFonts w:eastAsia="Times New Roman" w:cs="Times New Roman"/>
-        </w:rPr>
-        <w:t xml:space="preserve"> spend long hours on bikes, climb stairs, carry packages, and ride in heavy traffic. Over time this kind of work causes musculoskeletal disorders (MSDs): back pain, shoulder pain, wrist injuries, knee problems. The risk is not the same for every rider. Someone who is 22 and works 4 hours a day on a scooter is in a very different situation from a 45-year-old who works 10 hours a day on a motorbike with a handheld bag.</w:t>
+        <w:t>Last-mile quick-commerce delivery riders for platforms like Blinkit and Zepto spend long hours on bikes, climb stairs, carry packages, and ride in heavy traffic. Over time this kind of work causes musculoskeletal disorders (MSDs): back pain, shoulder pain, wrist injuries, knee problems. The risk is not the same for every rider. Someone who is 22 and works 4 hours a day on a scooter is in a very different situation from a 45-year-old who works 10 hours a day on a motorbike with a handheld bag.</w:t>
       </w:r>
     </w:p>
     <w:p>
@@ -3215,35 +3004,7 @@
           <w:rFonts w:eastAsia="Times New Roman" w:cs="Times New Roman"/>
         </w:rPr>
         <w:lastRenderedPageBreak/>
-        <w:t xml:space="preserve">Implement the pipeline reproducibly in Python (Jupyter notebooks, scikit-learn, </w:t>
-      </w:r>
-      <w:proofErr w:type="spellStart"/>
-      <w:r>
-        <w:rPr>
-          <w:rFonts w:eastAsia="Times New Roman" w:cs="Times New Roman"/>
-        </w:rPr>
-        <w:t>XGBoost</w:t>
-      </w:r>
-      <w:proofErr w:type="spellEnd"/>
-      <w:r>
-        <w:rPr>
-          <w:rFonts w:eastAsia="Times New Roman" w:cs="Times New Roman"/>
-        </w:rPr>
-        <w:t xml:space="preserve">, imbalanced-learn, </w:t>
-      </w:r>
-      <w:proofErr w:type="spellStart"/>
-      <w:r>
-        <w:rPr>
-          <w:rFonts w:eastAsia="Times New Roman" w:cs="Times New Roman"/>
-        </w:rPr>
-        <w:t>statsmodels</w:t>
-      </w:r>
-      <w:proofErr w:type="spellEnd"/>
-      <w:r>
-        <w:rPr>
-          <w:rFonts w:eastAsia="Times New Roman" w:cs="Times New Roman"/>
-        </w:rPr>
-        <w:t>) with a fixed random seed and end-to-end regeneration of every intermediate artefact.</w:t>
+        <w:t>Implement the pipeline reproducibly in Python (Jupyter notebooks, scikit-learn, XGBoost, imbalanced-learn, statsmodels) with a fixed random seed and end-to-end regeneration of every intermediate artefact.</w:t>
       </w:r>
     </w:p>
     <w:p>
@@ -3279,35 +3040,7 @@
         <w:rPr>
           <w:rFonts w:eastAsia="Times New Roman" w:cs="Times New Roman"/>
         </w:rPr>
-        <w:t xml:space="preserve">Deploy the trained models behind a </w:t>
-      </w:r>
-      <w:proofErr w:type="spellStart"/>
-      <w:r>
-        <w:rPr>
-          <w:rFonts w:eastAsia="Times New Roman" w:cs="Times New Roman"/>
-        </w:rPr>
-        <w:t>Streamlit</w:t>
-      </w:r>
-      <w:proofErr w:type="spellEnd"/>
-      <w:r>
-        <w:rPr>
-          <w:rFonts w:eastAsia="Times New Roman" w:cs="Times New Roman"/>
-        </w:rPr>
-        <w:t xml:space="preserve"> web application that accepts the full 36-item questionnaire plus the 11 RULA components and 8 QEC scores, and returns the six </w:t>
-      </w:r>
-      <w:proofErr w:type="spellStart"/>
-      <w:r>
-        <w:rPr>
-          <w:rFonts w:eastAsia="Times New Roman" w:cs="Times New Roman"/>
-        </w:rPr>
-        <w:t>colour</w:t>
-      </w:r>
-      <w:proofErr w:type="spellEnd"/>
-      <w:r>
-        <w:rPr>
-          <w:rFonts w:eastAsia="Times New Roman" w:cs="Times New Roman"/>
-        </w:rPr>
-        <w:t>-coded risk levels with per-factor recommendations.</w:t>
+        <w:t>Deploy the trained models behind a Streamlit web application that accepts the full 36-item questionnaire plus the 11 RULA components and 8 QEC scores, and returns the six colour-coded risk levels with per-factor recommendations.</w:t>
       </w:r>
     </w:p>
     <w:p>
@@ -3447,35 +3180,7 @@
         <w:rPr>
           <w:rFonts w:eastAsia="Times New Roman" w:cs="Times New Roman"/>
         </w:rPr>
-        <w:t xml:space="preserve">This is a cross-sectional study of </w:t>
-      </w:r>
-      <w:proofErr w:type="spellStart"/>
-      <w:r>
-        <w:rPr>
-          <w:rFonts w:eastAsia="Times New Roman" w:cs="Times New Roman"/>
-        </w:rPr>
-        <w:t>Blinkit</w:t>
-      </w:r>
-      <w:proofErr w:type="spellEnd"/>
-      <w:r>
-        <w:rPr>
-          <w:rFonts w:eastAsia="Times New Roman" w:cs="Times New Roman"/>
-        </w:rPr>
-        <w:t xml:space="preserve"> and </w:t>
-      </w:r>
-      <w:proofErr w:type="spellStart"/>
-      <w:r>
-        <w:rPr>
-          <w:rFonts w:eastAsia="Times New Roman" w:cs="Times New Roman"/>
-        </w:rPr>
-        <w:t>Zepto</w:t>
-      </w:r>
-      <w:proofErr w:type="spellEnd"/>
-      <w:r>
-        <w:rPr>
-          <w:rFonts w:eastAsia="Times New Roman" w:cs="Times New Roman"/>
-        </w:rPr>
-        <w:t xml:space="preserve"> quick-commerce delivery partners conducted in the Chengalpattu and Chennai regions in March-April 2026 using convenience sampling. The same 182 participants supplied both data streams: rider self-report through a Google Form and posture recorded during a delivery task by a trained observer. Eligibility was applied at the person level before either instrument.</w:t>
+        <w:t>This is a cross-sectional study of Blinkit and Zepto quick-commerce delivery partners conducted in the Chengalpattu and Chennai regions in March-April 2026 using convenience sampling. The same 182 participants supplied both data streams: rider self-report through a Google Form and posture recorded during a delivery task by a trained observer. Eligibility was applied at the person level before either instrument.</w:t>
       </w:r>
     </w:p>
     <w:p>
@@ -3501,35 +3206,7 @@
         <w:rPr>
           <w:rFonts w:eastAsia="Times New Roman" w:cs="Times New Roman"/>
         </w:rPr>
-        <w:t xml:space="preserve">Full-time delivery partners working on either the </w:t>
-      </w:r>
-      <w:proofErr w:type="spellStart"/>
-      <w:r>
-        <w:rPr>
-          <w:rFonts w:eastAsia="Times New Roman" w:cs="Times New Roman"/>
-        </w:rPr>
-        <w:t>Blinkit</w:t>
-      </w:r>
-      <w:proofErr w:type="spellEnd"/>
-      <w:r>
-        <w:rPr>
-          <w:rFonts w:eastAsia="Times New Roman" w:cs="Times New Roman"/>
-        </w:rPr>
-        <w:t xml:space="preserve"> or the </w:t>
-      </w:r>
-      <w:proofErr w:type="spellStart"/>
-      <w:r>
-        <w:rPr>
-          <w:rFonts w:eastAsia="Times New Roman" w:cs="Times New Roman"/>
-        </w:rPr>
-        <w:t>Zepto</w:t>
-      </w:r>
-      <w:proofErr w:type="spellEnd"/>
-      <w:r>
-        <w:rPr>
-          <w:rFonts w:eastAsia="Times New Roman" w:cs="Times New Roman"/>
-        </w:rPr>
-        <w:t xml:space="preserve"> platform.</w:t>
+        <w:t>Full-time delivery partners working on either the Blinkit or the Zepto platform.</w:t>
       </w:r>
     </w:p>
     <w:p>
@@ -3684,119 +3361,7 @@
         <w:rPr>
           <w:rFonts w:eastAsia="Times New Roman" w:cs="Times New Roman"/>
         </w:rPr>
-        <w:t xml:space="preserve">Phase 1 (01_data_cleaning.ipynb) </w:t>
-      </w:r>
-      <w:proofErr w:type="spellStart"/>
-      <w:r>
-        <w:rPr>
-          <w:rFonts w:eastAsia="Times New Roman" w:cs="Times New Roman"/>
-        </w:rPr>
-        <w:t>normalises</w:t>
-      </w:r>
-      <w:proofErr w:type="spellEnd"/>
-      <w:r>
-        <w:rPr>
-          <w:rFonts w:eastAsia="Times New Roman" w:cs="Times New Roman"/>
-        </w:rPr>
-        <w:t xml:space="preserve"> the raw CSV, </w:t>
-      </w:r>
-      <w:proofErr w:type="spellStart"/>
-      <w:r>
-        <w:rPr>
-          <w:rFonts w:eastAsia="Times New Roman" w:cs="Times New Roman"/>
-        </w:rPr>
-        <w:t>standardises</w:t>
-      </w:r>
-      <w:proofErr w:type="spellEnd"/>
-      <w:r>
-        <w:rPr>
-          <w:rFonts w:eastAsia="Times New Roman" w:cs="Times New Roman"/>
-        </w:rPr>
-        <w:t xml:space="preserve"> Yes/No answers, and validates row counts. Phase 2 (02_feature_engineering.ipynb) encodes ordered categorical bins to integers, assigns numeric midpoints to bin ranges, ranks vehicle type and carrying mode, aliases the 18 Yes/No items, and derives four composite features -- </w:t>
-      </w:r>
-      <w:proofErr w:type="spellStart"/>
-      <w:r>
-        <w:rPr>
-          <w:rFonts w:eastAsia="Times New Roman" w:cs="Times New Roman"/>
-        </w:rPr>
-        <w:t>workload_score</w:t>
-      </w:r>
-      <w:proofErr w:type="spellEnd"/>
-      <w:r>
-        <w:rPr>
-          <w:rFonts w:eastAsia="Times New Roman" w:cs="Times New Roman"/>
-        </w:rPr>
-        <w:t xml:space="preserve"> (mean of the six NASA-TLX items with satisfaction reversed), </w:t>
-      </w:r>
-      <w:proofErr w:type="spellStart"/>
-      <w:r>
-        <w:rPr>
-          <w:rFonts w:eastAsia="Times New Roman" w:cs="Times New Roman"/>
-        </w:rPr>
-        <w:t>fatigue_score</w:t>
-      </w:r>
-      <w:proofErr w:type="spellEnd"/>
-      <w:r>
-        <w:rPr>
-          <w:rFonts w:eastAsia="Times New Roman" w:cs="Times New Roman"/>
-        </w:rPr>
-        <w:t xml:space="preserve"> (mean of the six Borg CR10 items), </w:t>
-      </w:r>
-      <w:proofErr w:type="spellStart"/>
-      <w:r>
-        <w:rPr>
-          <w:rFonts w:eastAsia="Times New Roman" w:cs="Times New Roman"/>
-        </w:rPr>
-        <w:t>force_exertion</w:t>
-      </w:r>
-      <w:proofErr w:type="spellEnd"/>
-      <w:r>
-        <w:rPr>
-          <w:rFonts w:eastAsia="Times New Roman" w:cs="Times New Roman"/>
-        </w:rPr>
-        <w:t xml:space="preserve"> (the Borg lifting item), and </w:t>
-      </w:r>
-      <w:proofErr w:type="spellStart"/>
-      <w:r>
-        <w:rPr>
-          <w:rFonts w:eastAsia="Times New Roman" w:cs="Times New Roman"/>
-        </w:rPr>
-        <w:t>vibration_index</w:t>
-      </w:r>
-      <w:proofErr w:type="spellEnd"/>
-      <w:r>
-        <w:rPr>
-          <w:rFonts w:eastAsia="Times New Roman" w:cs="Times New Roman"/>
-        </w:rPr>
-        <w:t xml:space="preserve"> (</w:t>
-      </w:r>
-      <w:proofErr w:type="spellStart"/>
-      <w:r>
-        <w:rPr>
-          <w:rFonts w:eastAsia="Times New Roman" w:cs="Times New Roman"/>
-        </w:rPr>
-        <w:t>vehicle_rank</w:t>
-      </w:r>
-      <w:proofErr w:type="spellEnd"/>
-      <w:r>
-        <w:rPr>
-          <w:rFonts w:eastAsia="Times New Roman" w:cs="Times New Roman"/>
-        </w:rPr>
-        <w:t xml:space="preserve"> x </w:t>
-      </w:r>
-      <w:proofErr w:type="spellStart"/>
-      <w:r>
-        <w:rPr>
-          <w:rFonts w:eastAsia="Times New Roman" w:cs="Times New Roman"/>
-        </w:rPr>
-        <w:t>work_hours_num</w:t>
-      </w:r>
-      <w:proofErr w:type="spellEnd"/>
-      <w:r>
-        <w:rPr>
-          <w:rFonts w:eastAsia="Times New Roman" w:cs="Times New Roman"/>
-        </w:rPr>
-        <w:t>) -- plus five product-form interactions so tree-based models can pick up combined effects.</w:t>
+        <w:t>Phase 1 (01_data_cleaning.ipynb) normalises the raw CSV, standardises Yes/No answers, and validates row counts. Phase 2 (02_feature_engineering.ipynb) encodes ordered categorical bins to integers, assigns numeric midpoints to bin ranges, ranks vehicle type and carrying mode, aliases the 18 Yes/No items, and derives four composite features -- workload_score (mean of the six NASA-TLX items with satisfaction reversed), fatigue_score (mean of the six Borg CR10 items), force_exertion (the Borg lifting item), and vibration_index (vehicle_rank x work_hours_num) -- plus five product-form interactions so tree-based models can pick up combined effects.</w:t>
       </w:r>
     </w:p>
     <w:p>
@@ -3808,35 +3373,7 @@
         <w:rPr>
           <w:rFonts w:eastAsia="Times New Roman" w:cs="Times New Roman"/>
         </w:rPr>
-        <w:t xml:space="preserve">The posture observations are merged into the survey via a severity-rank merge: riders are ranked by an </w:t>
-      </w:r>
-      <w:proofErr w:type="spellStart"/>
-      <w:r>
-        <w:rPr>
-          <w:rFonts w:eastAsia="Times New Roman" w:cs="Times New Roman"/>
-        </w:rPr>
-        <w:t>exposure_severity</w:t>
-      </w:r>
-      <w:proofErr w:type="spellEnd"/>
-      <w:r>
-        <w:rPr>
-          <w:rFonts w:eastAsia="Times New Roman" w:cs="Times New Roman"/>
-        </w:rPr>
-        <w:t xml:space="preserve"> index (</w:t>
-      </w:r>
-      <w:proofErr w:type="spellStart"/>
-      <w:r>
-        <w:rPr>
-          <w:rFonts w:eastAsia="Times New Roman" w:cs="Times New Roman"/>
-        </w:rPr>
-        <w:t>normalised</w:t>
-      </w:r>
-      <w:proofErr w:type="spellEnd"/>
-      <w:r>
-        <w:rPr>
-          <w:rFonts w:eastAsia="Times New Roman" w:cs="Times New Roman"/>
-        </w:rPr>
-        <w:t xml:space="preserve"> NMQ pain count + fatigue score + hours), posture rows by RULA Table C, and the two ranked lists are joined one-to-one. Caveats are noted in Chapter 5.</w:t>
+        <w:t>The posture observations are merged into the survey via a severity-rank merge: riders are ranked by an exposure_severity index (normalised NMQ pain count + fatigue score + hours), posture rows by RULA Table C, and the two ranked lists are joined one-to-one. Caveats are noted in Chapter 5.</w:t>
       </w:r>
     </w:p>
     <w:p>
@@ -3910,21 +3447,7 @@
         <w:rPr>
           <w:rFonts w:eastAsia="Times New Roman" w:cs="Times New Roman"/>
         </w:rPr>
-        <w:t xml:space="preserve">Vibration: </w:t>
-      </w:r>
-      <w:proofErr w:type="spellStart"/>
-      <w:r>
-        <w:rPr>
-          <w:rFonts w:eastAsia="Times New Roman" w:cs="Times New Roman"/>
-        </w:rPr>
-        <w:t>vibration_index</w:t>
-      </w:r>
-      <w:proofErr w:type="spellEnd"/>
-      <w:r>
-        <w:rPr>
-          <w:rFonts w:eastAsia="Times New Roman" w:cs="Times New Roman"/>
-        </w:rPr>
-        <w:t xml:space="preserve"> binned by sample tercile.</w:t>
+        <w:t>Vibration: vibration_index binned by sample tercile.</w:t>
       </w:r>
     </w:p>
     <w:p>
@@ -3936,35 +3459,7 @@
         <w:rPr>
           <w:rFonts w:eastAsia="Times New Roman" w:cs="Times New Roman"/>
         </w:rPr>
-        <w:t xml:space="preserve">Contact Stress: </w:t>
-      </w:r>
-      <w:proofErr w:type="spellStart"/>
-      <w:r>
-        <w:rPr>
-          <w:rFonts w:eastAsia="Times New Roman" w:cs="Times New Roman"/>
-        </w:rPr>
-        <w:t>carrying_contact_rank</w:t>
-      </w:r>
-      <w:proofErr w:type="spellEnd"/>
-      <w:r>
-        <w:rPr>
-          <w:rFonts w:eastAsia="Times New Roman" w:cs="Times New Roman"/>
-        </w:rPr>
-        <w:t xml:space="preserve"> x </w:t>
-      </w:r>
-      <w:proofErr w:type="spellStart"/>
-      <w:r>
-        <w:rPr>
-          <w:rFonts w:eastAsia="Times New Roman" w:cs="Times New Roman"/>
-        </w:rPr>
-        <w:t>work_hours_num</w:t>
-      </w:r>
-      <w:proofErr w:type="spellEnd"/>
-      <w:r>
-        <w:rPr>
-          <w:rFonts w:eastAsia="Times New Roman" w:cs="Times New Roman"/>
-        </w:rPr>
-        <w:t xml:space="preserve"> x age multiplier, sample tercile.</w:t>
+        <w:t>Contact Stress: carrying_contact_rank x work_hours_num x age multiplier, sample tercile.</w:t>
       </w:r>
     </w:p>
     <w:p>
@@ -4003,21 +3498,7 @@
         <w:rPr>
           <w:rFonts w:eastAsia="Times New Roman" w:cs="Times New Roman"/>
         </w:rPr>
-        <w:t>Phase 5 (05_stats.ipynb) runs two analyses on discomfort (binary: any NMQ 12-month pain). A chi-square test of independence (scipy.stats.chi2_contingency) checks whether each risk factor is associated with discomfort at p less than 0.05. Second, a multivariable logistic regression (</w:t>
-      </w:r>
-      <w:proofErr w:type="spellStart"/>
-      <w:r>
-        <w:rPr>
-          <w:rFonts w:eastAsia="Times New Roman" w:cs="Times New Roman"/>
-        </w:rPr>
-        <w:t>statsmodels.api.Logit</w:t>
-      </w:r>
-      <w:proofErr w:type="spellEnd"/>
-      <w:r>
-        <w:rPr>
-          <w:rFonts w:eastAsia="Times New Roman" w:cs="Times New Roman"/>
-        </w:rPr>
-        <w:t>) estimates the effect of eleven predictors while controlling for the others; results are reported as odds ratios with 95 percent confidence intervals.</w:t>
+        <w:t>Phase 5 (05_stats.ipynb) runs two analyses on discomfort (binary: any NMQ 12-month pain). A chi-square test of independence (scipy.stats.chi2_contingency) checks whether each risk factor is associated with discomfort at p less than 0.05. Second, a multivariable logistic regression (statsmodels.api.Logit) estimates the effect of eleven predictors while controlling for the others; results are reported as odds ratios with 95 percent confidence intervals.</w:t>
       </w:r>
     </w:p>
     <w:p>
@@ -4043,49 +3524,7 @@
         <w:rPr>
           <w:rFonts w:eastAsia="Times New Roman" w:cs="Times New Roman"/>
         </w:rPr>
-        <w:t xml:space="preserve">Phase 6 (06_modeling.ipynb) trains a classifier per target from seven candidate algorithms.  Each sits inside an </w:t>
-      </w:r>
-      <w:proofErr w:type="spellStart"/>
-      <w:r>
-        <w:rPr>
-          <w:rFonts w:eastAsia="Times New Roman" w:cs="Times New Roman"/>
-        </w:rPr>
-        <w:t>imblearn.Pipeline</w:t>
-      </w:r>
-      <w:proofErr w:type="spellEnd"/>
-      <w:r>
-        <w:rPr>
-          <w:rFonts w:eastAsia="Times New Roman" w:cs="Times New Roman"/>
-        </w:rPr>
-        <w:t xml:space="preserve"> with SMOTE upstream so resampling only touches training folds. </w:t>
-      </w:r>
-      <w:proofErr w:type="spellStart"/>
-      <w:r>
-        <w:rPr>
-          <w:rFonts w:eastAsia="Times New Roman" w:cs="Times New Roman"/>
-        </w:rPr>
-        <w:t>GridSearchCV</w:t>
-      </w:r>
-      <w:proofErr w:type="spellEnd"/>
-      <w:r>
-        <w:rPr>
-          <w:rFonts w:eastAsia="Times New Roman" w:cs="Times New Roman"/>
-        </w:rPr>
-        <w:t xml:space="preserve"> tunes hyperparameters on macro-F1 inside 5-fold stratified CV, and the best model per target is refit on the full sample and saved as outputs/models/best_&lt;factor&gt;.</w:t>
-      </w:r>
-      <w:proofErr w:type="spellStart"/>
-      <w:r>
-        <w:rPr>
-          <w:rFonts w:eastAsia="Times New Roman" w:cs="Times New Roman"/>
-        </w:rPr>
-        <w:t>pkl</w:t>
-      </w:r>
-      <w:proofErr w:type="spellEnd"/>
-      <w:r>
-        <w:rPr>
-          <w:rFonts w:eastAsia="Times New Roman" w:cs="Times New Roman"/>
-        </w:rPr>
-        <w:t>.</w:t>
+        <w:t>Phase 6 (06_modeling.ipynb) trains a classifier per target from seven candidate algorithms.  Each sits inside an imblearn.Pipeline with SMOTE upstream so resampling only touches training folds. GridSearchCV tunes hyperparameters on macro-F1 inside 5-fold stratified CV, and the best model per target is refit on the full sample and saved as outputs/models/best_&lt;factor&gt;.pkl.</w:t>
       </w:r>
     </w:p>
     <w:p>
@@ -4108,33 +3547,11 @@
         <w:spacing w:after="160" w:line="336" w:lineRule="auto"/>
         <w:jc w:val="both"/>
       </w:pPr>
-      <w:proofErr w:type="spellStart"/>
-      <w:r>
-        <w:rPr>
-          <w:rFonts w:eastAsia="Times New Roman" w:cs="Times New Roman"/>
-        </w:rPr>
-        <w:t>Regularised</w:t>
-      </w:r>
-      <w:proofErr w:type="spellEnd"/>
-      <w:r>
-        <w:rPr>
-          <w:rFonts w:eastAsia="Times New Roman" w:cs="Times New Roman"/>
-        </w:rPr>
-        <w:t xml:space="preserve"> linear classifier used as the baseline (L2 penalty, </w:t>
-      </w:r>
-      <w:proofErr w:type="spellStart"/>
-      <w:r>
-        <w:rPr>
-          <w:rFonts w:eastAsia="Times New Roman" w:cs="Times New Roman"/>
-        </w:rPr>
-        <w:t>class_weight</w:t>
-      </w:r>
-      <w:proofErr w:type="spellEnd"/>
-      <w:r>
-        <w:rPr>
-          <w:rFonts w:eastAsia="Times New Roman" w:cs="Times New Roman"/>
-        </w:rPr>
-        <w:t xml:space="preserve"> balanced).  Any tree-based method that fails to beat it on a factor is either overfitting or getting nothing from feature interactions.</w:t>
+      <w:r>
+        <w:rPr>
+          <w:rFonts w:eastAsia="Times New Roman" w:cs="Times New Roman"/>
+        </w:rPr>
+        <w:t>Regularised linear classifier used as the baseline (L2 penalty, class_weight balanced).  Any tree-based method that fails to beat it on a factor is either overfitting or getting nothing from feature interactions.</w:t>
       </w:r>
     </w:p>
     <w:p>
@@ -4161,49 +3578,7 @@
         <w:rPr>
           <w:rFonts w:eastAsia="Times New Roman" w:cs="Times New Roman"/>
         </w:rPr>
-        <w:t xml:space="preserve">Single CART tree with </w:t>
-      </w:r>
-      <w:proofErr w:type="spellStart"/>
-      <w:r>
-        <w:rPr>
-          <w:rFonts w:eastAsia="Times New Roman" w:cs="Times New Roman"/>
-        </w:rPr>
-        <w:t>max_depth</w:t>
-      </w:r>
-      <w:proofErr w:type="spellEnd"/>
-      <w:r>
-        <w:rPr>
-          <w:rFonts w:eastAsia="Times New Roman" w:cs="Times New Roman"/>
-        </w:rPr>
-        <w:t xml:space="preserve"> (3-10) and </w:t>
-      </w:r>
-      <w:proofErr w:type="spellStart"/>
-      <w:r>
-        <w:rPr>
-          <w:rFonts w:eastAsia="Times New Roman" w:cs="Times New Roman"/>
-        </w:rPr>
-        <w:t>min_samples_leaf</w:t>
-      </w:r>
-      <w:proofErr w:type="spellEnd"/>
-      <w:r>
-        <w:rPr>
-          <w:rFonts w:eastAsia="Times New Roman" w:cs="Times New Roman"/>
-        </w:rPr>
-        <w:t xml:space="preserve"> (2-10) tuned via grid search.  Included as the </w:t>
-      </w:r>
-      <w:proofErr w:type="spellStart"/>
-      <w:r>
-        <w:rPr>
-          <w:rFonts w:eastAsia="Times New Roman" w:cs="Times New Roman"/>
-        </w:rPr>
-        <w:t>ensembling</w:t>
-      </w:r>
-      <w:proofErr w:type="spellEnd"/>
-      <w:r>
-        <w:rPr>
-          <w:rFonts w:eastAsia="Times New Roman" w:cs="Times New Roman"/>
-        </w:rPr>
-        <w:t xml:space="preserve"> floor; not competitive on its own for any of the six targets.</w:t>
+        <w:t>Single CART tree with max_depth (3-10) and min_samples_leaf (2-10) tuned via grid search.  Included as the ensembling floor; not competitive on its own for any of the six targets.</w:t>
       </w:r>
     </w:p>
     <w:p>
@@ -4257,21 +3632,7 @@
         <w:rPr>
           <w:rFonts w:eastAsia="Times New Roman" w:cs="Times New Roman"/>
         </w:rPr>
-        <w:t xml:space="preserve">Like Random Forest but with fully random splits per node.  The extra </w:t>
-      </w:r>
-      <w:proofErr w:type="spellStart"/>
-      <w:r>
-        <w:rPr>
-          <w:rFonts w:eastAsia="Times New Roman" w:cs="Times New Roman"/>
-        </w:rPr>
-        <w:t>randomisation</w:t>
-      </w:r>
-      <w:proofErr w:type="spellEnd"/>
-      <w:r>
-        <w:rPr>
-          <w:rFonts w:eastAsia="Times New Roman" w:cs="Times New Roman"/>
-        </w:rPr>
-        <w:t xml:space="preserve"> lowers between-tree correlation and helped it win on Vibration.</w:t>
+        <w:t>Like Random Forest but with fully random splits per node.  The extra randomisation lowers between-tree correlation and helped it win on Vibration.</w:t>
       </w:r>
     </w:p>
     <w:p>
@@ -4314,9 +3675,26 @@
           <w:sz w:val="24"/>
         </w:rPr>
         <w:lastRenderedPageBreak/>
-        <w:t xml:space="preserve">2.6.6   </w:t>
-      </w:r>
-      <w:proofErr w:type="spellStart"/>
+        <w:t>2.6.6   XGBoost</w:t>
+      </w:r>
+    </w:p>
+    <w:p>
+      <w:pPr>
+        <w:spacing w:after="160" w:line="336" w:lineRule="auto"/>
+        <w:jc w:val="both"/>
+      </w:pPr>
+      <w:r>
+        <w:rPr>
+          <w:rFonts w:eastAsia="Times New Roman" w:cs="Times New Roman"/>
+        </w:rPr>
+        <w:t>Gradient-boosted trees with L1 + L2 regularisation on the leaf weights and per-tree column subsampling.  Placed second on several targets but did not win any at the default search budget.</w:t>
+      </w:r>
+    </w:p>
+    <w:p>
+      <w:pPr>
+        <w:pStyle w:val="Heading5"/>
+        <w:spacing w:before="180" w:after="60"/>
+      </w:pPr>
       <w:r>
         <w:rPr>
           <w:rFonts w:ascii="Times New Roman" w:eastAsia="Times New Roman" w:hAnsi="Times New Roman" w:cs="Times New Roman"/>
@@ -4324,9 +3702,8 @@
           <w:color w:val="000000"/>
           <w:sz w:val="24"/>
         </w:rPr>
-        <w:t>XGBoost</w:t>
-      </w:r>
-      <w:proofErr w:type="spellEnd"/>
+        <w:t>2.6.7   Stacking Classifier</w:t>
+      </w:r>
     </w:p>
     <w:p>
       <w:pPr>
@@ -4337,21 +3714,7 @@
         <w:rPr>
           <w:rFonts w:eastAsia="Times New Roman" w:cs="Times New Roman"/>
         </w:rPr>
-        <w:t xml:space="preserve">Gradient-boosted trees with L1 + L2 </w:t>
-      </w:r>
-      <w:proofErr w:type="spellStart"/>
-      <w:r>
-        <w:rPr>
-          <w:rFonts w:eastAsia="Times New Roman" w:cs="Times New Roman"/>
-        </w:rPr>
-        <w:t>regularisation</w:t>
-      </w:r>
-      <w:proofErr w:type="spellEnd"/>
-      <w:r>
-        <w:rPr>
-          <w:rFonts w:eastAsia="Times New Roman" w:cs="Times New Roman"/>
-        </w:rPr>
-        <w:t xml:space="preserve"> on the leaf weights and per-tree column subsampling.  Placed second on several targets but did not win any at the default search budget.</w:t>
+        <w:t>Meta-learner taking the out-of-fold predictions of Random Forest, Extra Trees, HistGBM, and XGBoost as inputs and fitting a Logistic Regression on top.  Failed to beat the strongest base learner because the four base learners largely agreed.</w:t>
       </w:r>
     </w:p>
     <w:p>
@@ -4366,7 +3729,7 @@
           <w:color w:val="000000"/>
           <w:sz w:val="24"/>
         </w:rPr>
-        <w:t>2.6.7   Stacking Classifier</w:t>
+        <w:t>2.6.8   SMOTE and cross-validation</w:t>
       </w:r>
     </w:p>
     <w:p>
@@ -4378,35 +3741,7 @@
         <w:rPr>
           <w:rFonts w:eastAsia="Times New Roman" w:cs="Times New Roman"/>
         </w:rPr>
-        <w:t xml:space="preserve">Meta-learner taking the out-of-fold predictions of Random Forest, Extra Trees, </w:t>
-      </w:r>
-      <w:proofErr w:type="spellStart"/>
-      <w:r>
-        <w:rPr>
-          <w:rFonts w:eastAsia="Times New Roman" w:cs="Times New Roman"/>
-        </w:rPr>
-        <w:t>HistGBM</w:t>
-      </w:r>
-      <w:proofErr w:type="spellEnd"/>
-      <w:r>
-        <w:rPr>
-          <w:rFonts w:eastAsia="Times New Roman" w:cs="Times New Roman"/>
-        </w:rPr>
-        <w:t xml:space="preserve">, and </w:t>
-      </w:r>
-      <w:proofErr w:type="spellStart"/>
-      <w:r>
-        <w:rPr>
-          <w:rFonts w:eastAsia="Times New Roman" w:cs="Times New Roman"/>
-        </w:rPr>
-        <w:t>XGBoost</w:t>
-      </w:r>
-      <w:proofErr w:type="spellEnd"/>
-      <w:r>
-        <w:rPr>
-          <w:rFonts w:eastAsia="Times New Roman" w:cs="Times New Roman"/>
-        </w:rPr>
-        <w:t xml:space="preserve"> as inputs and fitting a Logistic Regression on top.  Failed to beat the strongest base learner because the four base learners largely agreed.</w:t>
+        <w:t>SMOTE synthesises new minority-class samples along segments between k nearest minority neighbours.  Wrapping it in imblearn.Pipeline keeps the synthesis inside training folds only, so validation-fold accuracy is never inflated.  k_neighbors is set per target below the minority training-fold count; GridSearchCV picks hyperparameters on macro-F1 with StratifiedKFold(5, shuffle=True, random_state=42).</w:t>
       </w:r>
     </w:p>
     <w:p>
@@ -4421,7 +3756,7 @@
           <w:color w:val="000000"/>
           <w:sz w:val="24"/>
         </w:rPr>
-        <w:t>2.6.8   SMOTE and cross-validation</w:t>
+        <w:t>2.6.9   Per-target feature exclusions</w:t>
       </w:r>
     </w:p>
     <w:p>
@@ -4433,146 +3768,7 @@
         <w:rPr>
           <w:rFonts w:eastAsia="Times New Roman" w:cs="Times New Roman"/>
         </w:rPr>
-        <w:t xml:space="preserve">SMOTE </w:t>
-      </w:r>
-      <w:proofErr w:type="spellStart"/>
-      <w:r>
-        <w:rPr>
-          <w:rFonts w:eastAsia="Times New Roman" w:cs="Times New Roman"/>
-        </w:rPr>
-        <w:t>synthesises</w:t>
-      </w:r>
-      <w:proofErr w:type="spellEnd"/>
-      <w:r>
-        <w:rPr>
-          <w:rFonts w:eastAsia="Times New Roman" w:cs="Times New Roman"/>
-        </w:rPr>
-        <w:t xml:space="preserve"> new minority-class samples along segments between k nearest minority </w:t>
-      </w:r>
-      <w:proofErr w:type="spellStart"/>
-      <w:r>
-        <w:rPr>
-          <w:rFonts w:eastAsia="Times New Roman" w:cs="Times New Roman"/>
-        </w:rPr>
-        <w:t>neighbours</w:t>
-      </w:r>
-      <w:proofErr w:type="spellEnd"/>
-      <w:r>
-        <w:rPr>
-          <w:rFonts w:eastAsia="Times New Roman" w:cs="Times New Roman"/>
-        </w:rPr>
-        <w:t xml:space="preserve">.  Wrapping it in </w:t>
-      </w:r>
-      <w:proofErr w:type="spellStart"/>
-      <w:r>
-        <w:rPr>
-          <w:rFonts w:eastAsia="Times New Roman" w:cs="Times New Roman"/>
-        </w:rPr>
-        <w:t>imblearn.Pipeline</w:t>
-      </w:r>
-      <w:proofErr w:type="spellEnd"/>
-      <w:r>
-        <w:rPr>
-          <w:rFonts w:eastAsia="Times New Roman" w:cs="Times New Roman"/>
-        </w:rPr>
-        <w:t xml:space="preserve"> keeps the synthesis inside training folds only, so validation-fold accuracy is never inflated.  </w:t>
-      </w:r>
-      <w:proofErr w:type="spellStart"/>
-      <w:r>
-        <w:rPr>
-          <w:rFonts w:eastAsia="Times New Roman" w:cs="Times New Roman"/>
-        </w:rPr>
-        <w:t>k_neighbors</w:t>
-      </w:r>
-      <w:proofErr w:type="spellEnd"/>
-      <w:r>
-        <w:rPr>
-          <w:rFonts w:eastAsia="Times New Roman" w:cs="Times New Roman"/>
-        </w:rPr>
-        <w:t xml:space="preserve"> is set per target below the minority training-fold count; </w:t>
-      </w:r>
-      <w:proofErr w:type="spellStart"/>
-      <w:r>
-        <w:rPr>
-          <w:rFonts w:eastAsia="Times New Roman" w:cs="Times New Roman"/>
-        </w:rPr>
-        <w:t>GridSearchCV</w:t>
-      </w:r>
-      <w:proofErr w:type="spellEnd"/>
-      <w:r>
-        <w:rPr>
-          <w:rFonts w:eastAsia="Times New Roman" w:cs="Times New Roman"/>
-        </w:rPr>
-        <w:t xml:space="preserve"> picks hyperparameters on macro-F1 with </w:t>
-      </w:r>
-      <w:proofErr w:type="spellStart"/>
-      <w:r>
-        <w:rPr>
-          <w:rFonts w:eastAsia="Times New Roman" w:cs="Times New Roman"/>
-        </w:rPr>
-        <w:t>StratifiedKFold</w:t>
-      </w:r>
-      <w:proofErr w:type="spellEnd"/>
-      <w:r>
-        <w:rPr>
-          <w:rFonts w:eastAsia="Times New Roman" w:cs="Times New Roman"/>
-        </w:rPr>
-        <w:t xml:space="preserve">(5, shuffle=True, </w:t>
-      </w:r>
-      <w:proofErr w:type="spellStart"/>
-      <w:r>
-        <w:rPr>
-          <w:rFonts w:eastAsia="Times New Roman" w:cs="Times New Roman"/>
-        </w:rPr>
-        <w:t>random_state</w:t>
-      </w:r>
-      <w:proofErr w:type="spellEnd"/>
-      <w:r>
-        <w:rPr>
-          <w:rFonts w:eastAsia="Times New Roman" w:cs="Times New Roman"/>
-        </w:rPr>
-        <w:t>=42).</w:t>
-      </w:r>
-    </w:p>
-    <w:p>
-      <w:pPr>
-        <w:pStyle w:val="Heading5"/>
-        <w:spacing w:before="180" w:after="60"/>
-      </w:pPr>
-      <w:r>
-        <w:rPr>
-          <w:rFonts w:ascii="Times New Roman" w:eastAsia="Times New Roman" w:hAnsi="Times New Roman" w:cs="Times New Roman"/>
-          <w:b/>
-          <w:color w:val="000000"/>
-          <w:sz w:val="24"/>
-        </w:rPr>
-        <w:t>2.6.9   Per-target feature exclusions</w:t>
-      </w:r>
-    </w:p>
-    <w:p>
-      <w:pPr>
-        <w:spacing w:after="160" w:line="336" w:lineRule="auto"/>
-        <w:jc w:val="both"/>
-      </w:pPr>
-      <w:r>
-        <w:rPr>
-          <w:rFonts w:eastAsia="Times New Roman" w:cs="Times New Roman"/>
-        </w:rPr>
-        <w:t xml:space="preserve">Each target excludes the survey inputs that directly define its Stage-1 label (otherwise the model would </w:t>
-      </w:r>
-      <w:proofErr w:type="spellStart"/>
-      <w:r>
-        <w:rPr>
-          <w:rFonts w:eastAsia="Times New Roman" w:cs="Times New Roman"/>
-        </w:rPr>
-        <w:t>memorise</w:t>
-      </w:r>
-      <w:proofErr w:type="spellEnd"/>
-      <w:r>
-        <w:rPr>
-          <w:rFonts w:eastAsia="Times New Roman" w:cs="Times New Roman"/>
-        </w:rPr>
-        <w:t xml:space="preserve"> the rule).  Posture additionally receives the 11 RULA components and 8 QEC scores, giving 63 total features.</w:t>
+        <w:t>Each target excludes the survey inputs that directly define its Stage-1 label (otherwise the model would memorise the rule).  Posture additionally receives the 11 RULA components and 8 QEC scores, giving 63 total features.</w:t>
       </w:r>
     </w:p>
     <w:tbl>
@@ -4682,31 +3878,13 @@
             <w:pPr>
               <w:spacing w:before="20" w:after="20"/>
             </w:pPr>
-            <w:proofErr w:type="spellStart"/>
-            <w:r>
-              <w:rPr>
-                <w:rFonts w:eastAsia="Times New Roman" w:cs="Times New Roman"/>
-                <w:sz w:val="20"/>
-              </w:rPr>
-              <w:t>force_exertion</w:t>
-            </w:r>
-            <w:proofErr w:type="spellEnd"/>
-            <w:r>
-              <w:rPr>
-                <w:rFonts w:eastAsia="Times New Roman" w:cs="Times New Roman"/>
-                <w:sz w:val="20"/>
-              </w:rPr>
-              <w:t xml:space="preserve">, </w:t>
-            </w:r>
-            <w:proofErr w:type="spellStart"/>
-            <w:r>
-              <w:rPr>
-                <w:rFonts w:eastAsia="Times New Roman" w:cs="Times New Roman"/>
-                <w:sz w:val="20"/>
-              </w:rPr>
-              <w:t>force_x_age</w:t>
-            </w:r>
-            <w:proofErr w:type="spellEnd"/>
+            <w:r>
+              <w:rPr>
+                <w:rFonts w:eastAsia="Times New Roman" w:cs="Times New Roman"/>
+                <w:sz w:val="20"/>
+              </w:rPr>
+              <w:t>force_exertion, force_x_age</w:t>
+            </w:r>
           </w:p>
         </w:tc>
         <w:tc>
@@ -4758,47 +3936,13 @@
             <w:pPr>
               <w:spacing w:before="20" w:after="20"/>
             </w:pPr>
-            <w:proofErr w:type="spellStart"/>
-            <w:r>
-              <w:rPr>
-                <w:rFonts w:eastAsia="Times New Roman" w:cs="Times New Roman"/>
-                <w:sz w:val="20"/>
-              </w:rPr>
-              <w:t>deliveries_num</w:t>
-            </w:r>
-            <w:proofErr w:type="spellEnd"/>
-            <w:r>
-              <w:rPr>
-                <w:rFonts w:eastAsia="Times New Roman" w:cs="Times New Roman"/>
-                <w:sz w:val="20"/>
-              </w:rPr>
-              <w:t xml:space="preserve">, </w:t>
-            </w:r>
-            <w:proofErr w:type="spellStart"/>
-            <w:r>
-              <w:rPr>
-                <w:rFonts w:eastAsia="Times New Roman" w:cs="Times New Roman"/>
-                <w:sz w:val="20"/>
-              </w:rPr>
-              <w:t>work_hours_num</w:t>
-            </w:r>
-            <w:proofErr w:type="spellEnd"/>
-            <w:r>
-              <w:rPr>
-                <w:rFonts w:eastAsia="Times New Roman" w:cs="Times New Roman"/>
-                <w:sz w:val="20"/>
-              </w:rPr>
-              <w:t xml:space="preserve">, </w:t>
-            </w:r>
-            <w:proofErr w:type="spellStart"/>
-            <w:r>
-              <w:rPr>
-                <w:rFonts w:eastAsia="Times New Roman" w:cs="Times New Roman"/>
-                <w:sz w:val="20"/>
-              </w:rPr>
-              <w:t>deliv_x_days</w:t>
-            </w:r>
-            <w:proofErr w:type="spellEnd"/>
+            <w:r>
+              <w:rPr>
+                <w:rFonts w:eastAsia="Times New Roman" w:cs="Times New Roman"/>
+                <w:sz w:val="20"/>
+              </w:rPr>
+              <w:t>deliveries_num, work_hours_num, deliv_x_days</w:t>
+            </w:r>
           </w:p>
         </w:tc>
         <w:tc>
@@ -4850,31 +3994,13 @@
             <w:pPr>
               <w:spacing w:before="20" w:after="20"/>
             </w:pPr>
-            <w:proofErr w:type="spellStart"/>
-            <w:r>
-              <w:rPr>
-                <w:rFonts w:eastAsia="Times New Roman" w:cs="Times New Roman"/>
-                <w:sz w:val="20"/>
-              </w:rPr>
-              <w:t>work_hours_num</w:t>
-            </w:r>
-            <w:proofErr w:type="spellEnd"/>
-            <w:r>
-              <w:rPr>
-                <w:rFonts w:eastAsia="Times New Roman" w:cs="Times New Roman"/>
-                <w:sz w:val="20"/>
-              </w:rPr>
-              <w:t xml:space="preserve">, </w:t>
-            </w:r>
-            <w:proofErr w:type="spellStart"/>
-            <w:r>
-              <w:rPr>
-                <w:rFonts w:eastAsia="Times New Roman" w:cs="Times New Roman"/>
-                <w:sz w:val="20"/>
-              </w:rPr>
-              <w:t>vibration_index</w:t>
-            </w:r>
-            <w:proofErr w:type="spellEnd"/>
+            <w:r>
+              <w:rPr>
+                <w:rFonts w:eastAsia="Times New Roman" w:cs="Times New Roman"/>
+                <w:sz w:val="20"/>
+              </w:rPr>
+              <w:t>work_hours_num, vibration_index</w:t>
+            </w:r>
           </w:p>
         </w:tc>
         <w:tc>
@@ -4926,47 +4052,13 @@
             <w:pPr>
               <w:spacing w:before="20" w:after="20"/>
             </w:pPr>
-            <w:proofErr w:type="spellStart"/>
-            <w:r>
-              <w:rPr>
-                <w:rFonts w:eastAsia="Times New Roman" w:cs="Times New Roman"/>
-                <w:sz w:val="20"/>
-              </w:rPr>
-              <w:t>vibration_index</w:t>
-            </w:r>
-            <w:proofErr w:type="spellEnd"/>
-            <w:r>
-              <w:rPr>
-                <w:rFonts w:eastAsia="Times New Roman" w:cs="Times New Roman"/>
-                <w:sz w:val="20"/>
-              </w:rPr>
-              <w:t xml:space="preserve">, </w:t>
-            </w:r>
-            <w:proofErr w:type="spellStart"/>
-            <w:r>
-              <w:rPr>
-                <w:rFonts w:eastAsia="Times New Roman" w:cs="Times New Roman"/>
-                <w:sz w:val="20"/>
-              </w:rPr>
-              <w:t>vehicle_rank</w:t>
-            </w:r>
-            <w:proofErr w:type="spellEnd"/>
-            <w:r>
-              <w:rPr>
-                <w:rFonts w:eastAsia="Times New Roman" w:cs="Times New Roman"/>
-                <w:sz w:val="20"/>
-              </w:rPr>
-              <w:t xml:space="preserve">, </w:t>
-            </w:r>
-            <w:proofErr w:type="spellStart"/>
-            <w:r>
-              <w:rPr>
-                <w:rFonts w:eastAsia="Times New Roman" w:cs="Times New Roman"/>
-                <w:sz w:val="20"/>
-              </w:rPr>
-              <w:t>work_hours_num</w:t>
-            </w:r>
-            <w:proofErr w:type="spellEnd"/>
+            <w:r>
+              <w:rPr>
+                <w:rFonts w:eastAsia="Times New Roman" w:cs="Times New Roman"/>
+                <w:sz w:val="20"/>
+              </w:rPr>
+              <w:t>vibration_index, vehicle_rank, work_hours_num</w:t>
+            </w:r>
           </w:p>
         </w:tc>
         <w:tc>
@@ -5018,31 +4110,13 @@
             <w:pPr>
               <w:spacing w:before="20" w:after="20"/>
             </w:pPr>
-            <w:proofErr w:type="spellStart"/>
-            <w:r>
-              <w:rPr>
-                <w:rFonts w:eastAsia="Times New Roman" w:cs="Times New Roman"/>
-                <w:sz w:val="20"/>
-              </w:rPr>
-              <w:t>carrying_contact_rank</w:t>
-            </w:r>
-            <w:proofErr w:type="spellEnd"/>
-            <w:r>
-              <w:rPr>
-                <w:rFonts w:eastAsia="Times New Roman" w:cs="Times New Roman"/>
-                <w:sz w:val="20"/>
-              </w:rPr>
-              <w:t xml:space="preserve">, </w:t>
-            </w:r>
-            <w:proofErr w:type="spellStart"/>
-            <w:r>
-              <w:rPr>
-                <w:rFonts w:eastAsia="Times New Roman" w:cs="Times New Roman"/>
-                <w:sz w:val="20"/>
-              </w:rPr>
-              <w:t>work_hours_num</w:t>
-            </w:r>
-            <w:proofErr w:type="spellEnd"/>
+            <w:r>
+              <w:rPr>
+                <w:rFonts w:eastAsia="Times New Roman" w:cs="Times New Roman"/>
+                <w:sz w:val="20"/>
+              </w:rPr>
+              <w:t>carrying_contact_rank, work_hours_num</w:t>
+            </w:r>
           </w:p>
         </w:tc>
         <w:tc>
@@ -5165,49 +4239,7 @@
         <w:rPr>
           <w:rFonts w:eastAsia="Times New Roman" w:cs="Times New Roman"/>
         </w:rPr>
-        <w:t xml:space="preserve">Phase 7 (07_evaluation.ipynb) uses </w:t>
-      </w:r>
-      <w:proofErr w:type="spellStart"/>
-      <w:r>
-        <w:rPr>
-          <w:rFonts w:eastAsia="Times New Roman" w:cs="Times New Roman"/>
-        </w:rPr>
-        <w:t>cross_val_predict</w:t>
-      </w:r>
-      <w:proofErr w:type="spellEnd"/>
-      <w:r>
-        <w:rPr>
-          <w:rFonts w:eastAsia="Times New Roman" w:cs="Times New Roman"/>
-        </w:rPr>
-        <w:t xml:space="preserve"> for out-of-fold predictions and writes per-class precision / recall / F1 / support, confusion matrices, one-vs-rest ROC curves with per-class AUC (macro AUC is the unweighted mean), and feature importance (</w:t>
-      </w:r>
-      <w:proofErr w:type="spellStart"/>
-      <w:r>
-        <w:rPr>
-          <w:rFonts w:eastAsia="Times New Roman" w:cs="Times New Roman"/>
-        </w:rPr>
-        <w:t>feature_importances</w:t>
-      </w:r>
-      <w:proofErr w:type="spellEnd"/>
-      <w:r>
-        <w:rPr>
-          <w:rFonts w:eastAsia="Times New Roman" w:cs="Times New Roman"/>
-        </w:rPr>
-        <w:t>_ for tree models, abs(</w:t>
-      </w:r>
-      <w:proofErr w:type="spellStart"/>
-      <w:r>
-        <w:rPr>
-          <w:rFonts w:eastAsia="Times New Roman" w:cs="Times New Roman"/>
-        </w:rPr>
-        <w:t>coef</w:t>
-      </w:r>
-      <w:proofErr w:type="spellEnd"/>
-      <w:r>
-        <w:rPr>
-          <w:rFonts w:eastAsia="Times New Roman" w:cs="Times New Roman"/>
-        </w:rPr>
-        <w:t>_) for Logistic Regression).</w:t>
+        <w:t>Phase 7 (07_evaluation.ipynb) uses cross_val_predict for out-of-fold predictions and writes per-class precision / recall / F1 / support, confusion matrices, one-vs-rest ROC curves with per-class AUC (macro AUC is the unweighted mean), and feature importance (feature_importances_ for tree models, abs(coef_) for Logistic Regression).</w:t>
       </w:r>
     </w:p>
     <w:p>
@@ -5249,21 +4281,7 @@
         <w:rPr>
           <w:rFonts w:eastAsia="Times New Roman" w:cs="Times New Roman"/>
         </w:rPr>
-        <w:t xml:space="preserve">The full pipeline is implemented across seven Jupyter notebooks (01 through 07) plus a </w:t>
-      </w:r>
-      <w:proofErr w:type="spellStart"/>
-      <w:r>
-        <w:rPr>
-          <w:rFonts w:eastAsia="Times New Roman" w:cs="Times New Roman"/>
-        </w:rPr>
-        <w:t>Streamlit</w:t>
-      </w:r>
-      <w:proofErr w:type="spellEnd"/>
-      <w:r>
-        <w:rPr>
-          <w:rFonts w:eastAsia="Times New Roman" w:cs="Times New Roman"/>
-        </w:rPr>
-        <w:t xml:space="preserve"> application. Every notebook is designed to run standalone from its previous input file, so the whole pipeline can be regenerated end to end with a fixed random seed of 42.</w:t>
+        <w:t>The full pipeline is implemented across seven Jupyter notebooks (01 through 07) plus a Streamlit application. Every notebook is designed to run standalone from its previous input file, so the whole pipeline can be regenerated end to end with a fixed random seed of 42.</w:t>
       </w:r>
     </w:p>
     <w:p>
@@ -5275,21 +4293,7 @@
         <w:rPr>
           <w:rFonts w:eastAsia="Times New Roman" w:cs="Times New Roman"/>
         </w:rPr>
-        <w:t xml:space="preserve">01_data_cleaning </w:t>
-      </w:r>
-      <w:proofErr w:type="spellStart"/>
-      <w:r>
-        <w:rPr>
-          <w:rFonts w:eastAsia="Times New Roman" w:cs="Times New Roman"/>
-        </w:rPr>
-        <w:t>normalises</w:t>
-      </w:r>
-      <w:proofErr w:type="spellEnd"/>
-      <w:r>
-        <w:rPr>
-          <w:rFonts w:eastAsia="Times New Roman" w:cs="Times New Roman"/>
-        </w:rPr>
-        <w:t xml:space="preserve"> the raw CSV and validates row counts.</w:t>
+        <w:t>01_data_cleaning normalises the raw CSV and validates row counts.</w:t>
       </w:r>
     </w:p>
     <w:p>
@@ -5301,21 +4305,7 @@
         <w:rPr>
           <w:rFonts w:eastAsia="Times New Roman" w:cs="Times New Roman"/>
         </w:rPr>
-        <w:t xml:space="preserve">02_feature_engineering encodes </w:t>
-      </w:r>
-      <w:proofErr w:type="spellStart"/>
-      <w:r>
-        <w:rPr>
-          <w:rFonts w:eastAsia="Times New Roman" w:cs="Times New Roman"/>
-        </w:rPr>
-        <w:t>categoricals</w:t>
-      </w:r>
-      <w:proofErr w:type="spellEnd"/>
-      <w:r>
-        <w:rPr>
-          <w:rFonts w:eastAsia="Times New Roman" w:cs="Times New Roman"/>
-        </w:rPr>
-        <w:t>, derives composite scores, aliases the 18 binary items, and merges the posture observations by severity rank.</w:t>
+        <w:t>02_feature_engineering encodes categoricals, derives composite scores, aliases the 18 binary items, and merges the posture observations by severity rank.</w:t>
       </w:r>
     </w:p>
     <w:p>
@@ -5363,21 +4353,7 @@
         <w:rPr>
           <w:rFonts w:eastAsia="Times New Roman" w:cs="Times New Roman"/>
         </w:rPr>
-        <w:t xml:space="preserve">06_modeling runs SMOTE plus </w:t>
-      </w:r>
-      <w:proofErr w:type="spellStart"/>
-      <w:r>
-        <w:rPr>
-          <w:rFonts w:eastAsia="Times New Roman" w:cs="Times New Roman"/>
-        </w:rPr>
-        <w:t>GridSearchCV</w:t>
-      </w:r>
-      <w:proofErr w:type="spellEnd"/>
-      <w:r>
-        <w:rPr>
-          <w:rFonts w:eastAsia="Times New Roman" w:cs="Times New Roman"/>
-        </w:rPr>
-        <w:t xml:space="preserve"> across 7 algorithms per target and keeps the best by F1 macro.</w:t>
+        <w:t>06_modeling runs SMOTE plus GridSearchCV across 7 algorithms per target and keeps the best by F1 macro.</w:t>
       </w:r>
     </w:p>
     <w:p>
@@ -5466,21 +4442,7 @@
         <w:rPr>
           <w:rFonts w:eastAsia="Times New Roman" w:cs="Times New Roman"/>
         </w:rPr>
-        <w:t xml:space="preserve">Each participant gave verbal consent before either instrument was administered. The 36-item Google Form was completed on a researcher-provided phone in about 15 to 20 minutes. Posture was recorded on paper by a trained observer during a natural delivery task, capturing the 11 RULA elements and 8 QEC region / exposure scores in one pass. Riders whose demographic or NMQ responses were incomplete after follow-up were excluded and are not part of the final 182. Data was </w:t>
-      </w:r>
-      <w:proofErr w:type="spellStart"/>
-      <w:r>
-        <w:rPr>
-          <w:rFonts w:eastAsia="Times New Roman" w:cs="Times New Roman"/>
-        </w:rPr>
-        <w:t>anonymised</w:t>
-      </w:r>
-      <w:proofErr w:type="spellEnd"/>
-      <w:r>
-        <w:rPr>
-          <w:rFonts w:eastAsia="Times New Roman" w:cs="Times New Roman"/>
-        </w:rPr>
-        <w:t xml:space="preserve"> at the point of collection; no rider identifiers appear in the released model_ready.csv or posture_data.xlsx files.</w:t>
+        <w:t>Each participant gave verbal consent before either instrument was administered. The 36-item Google Form was completed on a researcher-provided phone in about 15 to 20 minutes. Posture was recorded on paper by a trained observer during a natural delivery task, capturing the 11 RULA elements and 8 QEC region / exposure scores in one pass. Riders whose demographic or NMQ responses were incomplete after follow-up were excluded and are not part of the final 182. Data was anonymised at the point of collection; no rider identifiers appear in the released model_ready.csv or posture_data.xlsx files.</w:t>
       </w:r>
     </w:p>
     <w:p>
@@ -5506,21 +4468,7 @@
         <w:rPr>
           <w:rFonts w:eastAsia="Times New Roman" w:cs="Times New Roman"/>
         </w:rPr>
-        <w:t xml:space="preserve">Data preparation ran in two notebooks. 01_data_cleaning loaded the raw Google Form CSV, </w:t>
-      </w:r>
-      <w:proofErr w:type="spellStart"/>
-      <w:r>
-        <w:rPr>
-          <w:rFonts w:eastAsia="Times New Roman" w:cs="Times New Roman"/>
-        </w:rPr>
-        <w:t>standardised</w:t>
-      </w:r>
-      <w:proofErr w:type="spellEnd"/>
-      <w:r>
-        <w:rPr>
-          <w:rFonts w:eastAsia="Times New Roman" w:cs="Times New Roman"/>
-        </w:rPr>
-        <w:t xml:space="preserve"> text answers to canonical Yes / No values, corrected a handful of column-name typos, and dropped rows that were incomplete after follow-up. The cleaned CSV was 182 rows and 48 columns.</w:t>
+        <w:t>Data preparation ran in two notebooks. 01_data_cleaning loaded the raw Google Form CSV, standardised text answers to canonical Yes / No values, corrected a handful of column-name typos, and dropped rows that were incomplete after follow-up. The cleaned CSV was 182 rows and 48 columns.</w:t>
       </w:r>
     </w:p>
     <w:p>
@@ -5532,119 +4480,7 @@
         <w:rPr>
           <w:rFonts w:eastAsia="Times New Roman" w:cs="Times New Roman"/>
         </w:rPr>
-        <w:t xml:space="preserve">02_feature_engineering converted the cleaned CSV into the model-ready feature set. Ordered categorical bands (age, education, income, job duration, working hours, working days, deliveries per day, rest break) were encoded to consecutive integers preserving order. Vehicle type and carrying mode were converted to ranks so motorbike ranks higher than scooter for vibration exposure and handheld ranks higher than backpack and bike storage for contact stress. Composite scores were computed: </w:t>
-      </w:r>
-      <w:proofErr w:type="spellStart"/>
-      <w:r>
-        <w:rPr>
-          <w:rFonts w:eastAsia="Times New Roman" w:cs="Times New Roman"/>
-        </w:rPr>
-        <w:t>workload_score</w:t>
-      </w:r>
-      <w:proofErr w:type="spellEnd"/>
-      <w:r>
-        <w:rPr>
-          <w:rFonts w:eastAsia="Times New Roman" w:cs="Times New Roman"/>
-        </w:rPr>
-        <w:t xml:space="preserve"> as the mean of the six NASA-TLX items (with the dissatisfied item reversed), </w:t>
-      </w:r>
-      <w:proofErr w:type="spellStart"/>
-      <w:r>
-        <w:rPr>
-          <w:rFonts w:eastAsia="Times New Roman" w:cs="Times New Roman"/>
-        </w:rPr>
-        <w:t>fatigue_score</w:t>
-      </w:r>
-      <w:proofErr w:type="spellEnd"/>
-      <w:r>
-        <w:rPr>
-          <w:rFonts w:eastAsia="Times New Roman" w:cs="Times New Roman"/>
-        </w:rPr>
-        <w:t xml:space="preserve"> as the mean of the six Borg items, </w:t>
-      </w:r>
-      <w:proofErr w:type="spellStart"/>
-      <w:r>
-        <w:rPr>
-          <w:rFonts w:eastAsia="Times New Roman" w:cs="Times New Roman"/>
-        </w:rPr>
-        <w:t>force_exertion</w:t>
-      </w:r>
-      <w:proofErr w:type="spellEnd"/>
-      <w:r>
-        <w:rPr>
-          <w:rFonts w:eastAsia="Times New Roman" w:cs="Times New Roman"/>
-        </w:rPr>
-        <w:t xml:space="preserve"> as the Borg lifting item, and </w:t>
-      </w:r>
-      <w:proofErr w:type="spellStart"/>
-      <w:r>
-        <w:rPr>
-          <w:rFonts w:eastAsia="Times New Roman" w:cs="Times New Roman"/>
-        </w:rPr>
-        <w:t>vibration_index</w:t>
-      </w:r>
-      <w:proofErr w:type="spellEnd"/>
-      <w:r>
-        <w:rPr>
-          <w:rFonts w:eastAsia="Times New Roman" w:cs="Times New Roman"/>
-        </w:rPr>
-        <w:t xml:space="preserve"> as </w:t>
-      </w:r>
-      <w:proofErr w:type="spellStart"/>
-      <w:r>
-        <w:rPr>
-          <w:rFonts w:eastAsia="Times New Roman" w:cs="Times New Roman"/>
-        </w:rPr>
-        <w:t>vehicle_rank</w:t>
-      </w:r>
-      <w:proofErr w:type="spellEnd"/>
-      <w:r>
-        <w:rPr>
-          <w:rFonts w:eastAsia="Times New Roman" w:cs="Times New Roman"/>
-        </w:rPr>
-        <w:t xml:space="preserve"> times </w:t>
-      </w:r>
-      <w:proofErr w:type="spellStart"/>
-      <w:r>
-        <w:rPr>
-          <w:rFonts w:eastAsia="Times New Roman" w:cs="Times New Roman"/>
-        </w:rPr>
-        <w:t>work_hours_num</w:t>
-      </w:r>
-      <w:proofErr w:type="spellEnd"/>
-      <w:r>
-        <w:rPr>
-          <w:rFonts w:eastAsia="Times New Roman" w:cs="Times New Roman"/>
-        </w:rPr>
-        <w:t>. Five product-form interactions were added (workload times fatigue, workload times age, force times age, fatigue times job duration, deliveries times days). The eighteen NMQ and 7-day items and the five outcome follow-ups were converted to short-named binary aliases (</w:t>
-      </w:r>
-      <w:proofErr w:type="spellStart"/>
-      <w:r>
-        <w:rPr>
-          <w:rFonts w:eastAsia="Times New Roman" w:cs="Times New Roman"/>
-        </w:rPr>
-        <w:t>nmq_neck</w:t>
-      </w:r>
-      <w:proofErr w:type="spellEnd"/>
-      <w:r>
-        <w:rPr>
-          <w:rFonts w:eastAsia="Times New Roman" w:cs="Times New Roman"/>
-        </w:rPr>
-        <w:t xml:space="preserve">, d7_lower_back, </w:t>
-      </w:r>
-      <w:proofErr w:type="spellStart"/>
-      <w:r>
-        <w:rPr>
-          <w:rFonts w:eastAsia="Times New Roman" w:cs="Times New Roman"/>
-        </w:rPr>
-        <w:t>out_reduced_perf</w:t>
-      </w:r>
-      <w:proofErr w:type="spellEnd"/>
-      <w:r>
-        <w:rPr>
-          <w:rFonts w:eastAsia="Times New Roman" w:cs="Times New Roman"/>
-        </w:rPr>
-        <w:t>, and so on).</w:t>
+        <w:t>02_feature_engineering converted the cleaned CSV into the model-ready feature set. Ordered categorical bands (age, education, income, job duration, working hours, working days, deliveries per day, rest break) were encoded to consecutive integers preserving order. Vehicle type and carrying mode were converted to ranks so motorbike ranks higher than scooter for vibration exposure and handheld ranks higher than backpack and bike storage for contact stress. Composite scores were computed: workload_score as the mean of the six NASA-TLX items (with the dissatisfied item reversed), fatigue_score as the mean of the six Borg items, force_exertion as the Borg lifting item, and vibration_index as vehicle_rank times work_hours_num. Five product-form interactions were added (workload times fatigue, workload times age, force times age, fatigue times job duration, deliveries times days). The eighteen NMQ and 7-day items and the five outcome follow-ups were converted to short-named binary aliases (nmq_neck, d7_lower_back, out_reduced_perf, and so on).</w:t>
       </w:r>
     </w:p>
     <w:p>
@@ -5683,21 +4519,7 @@
         <w:rPr>
           <w:rFonts w:eastAsia="Times New Roman" w:cs="Times New Roman"/>
         </w:rPr>
-        <w:t xml:space="preserve">Two independent statistical analyses were run in 05_stats on the model-ready CSV. First, six chi-square tests of independence checked whether each Stage-1 risk-factor band was associated with a binary discomfort outcome; the tests reported chi2, degrees of freedom, and a Bonferroni-adjusted p-value. Second, a multivariable logistic regression fitted with </w:t>
-      </w:r>
-      <w:proofErr w:type="spellStart"/>
-      <w:r>
-        <w:rPr>
-          <w:rFonts w:eastAsia="Times New Roman" w:cs="Times New Roman"/>
-        </w:rPr>
-        <w:t>statsmodels</w:t>
-      </w:r>
-      <w:proofErr w:type="spellEnd"/>
-      <w:r>
-        <w:rPr>
-          <w:rFonts w:eastAsia="Times New Roman" w:cs="Times New Roman"/>
-        </w:rPr>
-        <w:t xml:space="preserve"> estimated odds ratios for eleven predictors (age, income, education, job duration, workload score, fatigue score, force exertion, vibration index, contact rank, hours, days) with self-reported discomfort as the outcome. Results were reported as OR with 95 percent confidence intervals.</w:t>
+        <w:t>Two independent statistical analyses were run in 05_stats on the model-ready CSV. First, six chi-square tests of independence checked whether each Stage-1 risk-factor band was associated with a binary discomfort outcome; the tests reported chi2, degrees of freedom, and a Bonferroni-adjusted p-value. Second, a multivariable logistic regression fitted with statsmodels estimated odds ratios for eleven predictors (age, income, education, job duration, workload score, fatigue score, force exertion, vibration index, contact rank, hours, days) with self-reported discomfort as the outcome. Results were reported as OR with 95 percent confidence intervals.</w:t>
       </w:r>
     </w:p>
     <w:p>
@@ -5709,77 +4531,7 @@
         <w:rPr>
           <w:rFonts w:eastAsia="Times New Roman" w:cs="Times New Roman"/>
         </w:rPr>
-        <w:t xml:space="preserve">Model training ran in 06_modeling. Every one of the seven candidate algorithms was wrapped in an </w:t>
-      </w:r>
-      <w:proofErr w:type="spellStart"/>
-      <w:r>
-        <w:rPr>
-          <w:rFonts w:eastAsia="Times New Roman" w:cs="Times New Roman"/>
-        </w:rPr>
-        <w:t>imblearn.Pipeline</w:t>
-      </w:r>
-      <w:proofErr w:type="spellEnd"/>
-      <w:r>
-        <w:rPr>
-          <w:rFonts w:eastAsia="Times New Roman" w:cs="Times New Roman"/>
-        </w:rPr>
-        <w:t xml:space="preserve"> of SMOTE followed by the classifier and hyperparameter-tuned via </w:t>
-      </w:r>
-      <w:proofErr w:type="spellStart"/>
-      <w:r>
-        <w:rPr>
-          <w:rFonts w:eastAsia="Times New Roman" w:cs="Times New Roman"/>
-        </w:rPr>
-        <w:t>GridSearchCV</w:t>
-      </w:r>
-      <w:proofErr w:type="spellEnd"/>
-      <w:r>
-        <w:rPr>
-          <w:rFonts w:eastAsia="Times New Roman" w:cs="Times New Roman"/>
-        </w:rPr>
-        <w:t xml:space="preserve">. For each of the six risk-factor targets, this expanded to a full five-fold stratified cross-validation over the algorithm's hyperparameter grid. Across the six targets and seven algorithms, forty-two target-algorithm training runs were carried out. Best-by-macro-F1 was selected per target and the winning pipeline was refit on the full sample and persisted with </w:t>
-      </w:r>
-      <w:proofErr w:type="spellStart"/>
-      <w:r>
-        <w:rPr>
-          <w:rFonts w:eastAsia="Times New Roman" w:cs="Times New Roman"/>
-        </w:rPr>
-        <w:t>joblib.dump</w:t>
-      </w:r>
-      <w:proofErr w:type="spellEnd"/>
-      <w:r>
-        <w:rPr>
-          <w:rFonts w:eastAsia="Times New Roman" w:cs="Times New Roman"/>
-        </w:rPr>
-        <w:t xml:space="preserve"> to outputs/models/best_&lt;factor&gt;.</w:t>
-      </w:r>
-      <w:proofErr w:type="spellStart"/>
-      <w:r>
-        <w:rPr>
-          <w:rFonts w:eastAsia="Times New Roman" w:cs="Times New Roman"/>
-        </w:rPr>
-        <w:t>pkl</w:t>
-      </w:r>
-      <w:proofErr w:type="spellEnd"/>
-      <w:r>
-        <w:rPr>
-          <w:rFonts w:eastAsia="Times New Roman" w:cs="Times New Roman"/>
-        </w:rPr>
-        <w:t xml:space="preserve">. The per-target feature exclusions listed in Section 2.6.9 were applied before each training run so no model could </w:t>
-      </w:r>
-      <w:proofErr w:type="spellStart"/>
-      <w:r>
-        <w:rPr>
-          <w:rFonts w:eastAsia="Times New Roman" w:cs="Times New Roman"/>
-        </w:rPr>
-        <w:t>memorise</w:t>
-      </w:r>
-      <w:proofErr w:type="spellEnd"/>
-      <w:r>
-        <w:rPr>
-          <w:rFonts w:eastAsia="Times New Roman" w:cs="Times New Roman"/>
-        </w:rPr>
-        <w:t xml:space="preserve"> its Stage-1 rule.</w:t>
+        <w:t>Model training ran in 06_modeling. Every one of the seven candidate algorithms was wrapped in an imblearn.Pipeline of SMOTE followed by the classifier and hyperparameter-tuned via GridSearchCV. For each of the six risk-factor targets, this expanded to a full five-fold stratified cross-validation over the algorithm's hyperparameter grid. Across the six targets and seven algorithms, forty-two target-algorithm training runs were carried out. Best-by-macro-F1 was selected per target and the winning pipeline was refit on the full sample and persisted with joblib.dump to outputs/models/best_&lt;factor&gt;.pkl. The per-target feature exclusions listed in Section 2.6.9 were applied before each training run so no model could memorise its Stage-1 rule.</w:t>
       </w:r>
     </w:p>
     <w:p>
@@ -5791,63 +4543,7 @@
         <w:rPr>
           <w:rFonts w:eastAsia="Times New Roman" w:cs="Times New Roman"/>
         </w:rPr>
-        <w:t xml:space="preserve">07_evaluation produced the reporting artefacts. </w:t>
-      </w:r>
-      <w:proofErr w:type="spellStart"/>
-      <w:r>
-        <w:rPr>
-          <w:rFonts w:eastAsia="Times New Roman" w:cs="Times New Roman"/>
-        </w:rPr>
-        <w:t>cross_val_predict</w:t>
-      </w:r>
-      <w:proofErr w:type="spellEnd"/>
-      <w:r>
-        <w:rPr>
-          <w:rFonts w:eastAsia="Times New Roman" w:cs="Times New Roman"/>
-        </w:rPr>
-        <w:t xml:space="preserve"> was used to generate out-of-fold predictions on the training set, and the following outputs were written: per-class precision, recall, F1, and support numbers via </w:t>
-      </w:r>
-      <w:proofErr w:type="spellStart"/>
-      <w:r>
-        <w:rPr>
-          <w:rFonts w:eastAsia="Times New Roman" w:cs="Times New Roman"/>
-        </w:rPr>
-        <w:t>classification_report</w:t>
-      </w:r>
-      <w:proofErr w:type="spellEnd"/>
-      <w:r>
-        <w:rPr>
-          <w:rFonts w:eastAsia="Times New Roman" w:cs="Times New Roman"/>
-        </w:rPr>
-        <w:t>; confusion matrices per target; one-vs-rest ROC curves with per-class AUC (macro AUC is the unweighted mean of per-class AUCs); and feature importance plots (</w:t>
-      </w:r>
-      <w:proofErr w:type="spellStart"/>
-      <w:r>
-        <w:rPr>
-          <w:rFonts w:eastAsia="Times New Roman" w:cs="Times New Roman"/>
-        </w:rPr>
-        <w:t>feature_importances</w:t>
-      </w:r>
-      <w:proofErr w:type="spellEnd"/>
-      <w:r>
-        <w:rPr>
-          <w:rFonts w:eastAsia="Times New Roman" w:cs="Times New Roman"/>
-        </w:rPr>
-        <w:t xml:space="preserve">_ for the tree-based winners, absolute value of </w:t>
-      </w:r>
-      <w:proofErr w:type="spellStart"/>
-      <w:r>
-        <w:rPr>
-          <w:rFonts w:eastAsia="Times New Roman" w:cs="Times New Roman"/>
-        </w:rPr>
-        <w:t>coef</w:t>
-      </w:r>
-      <w:proofErr w:type="spellEnd"/>
-      <w:r>
-        <w:rPr>
-          <w:rFonts w:eastAsia="Times New Roman" w:cs="Times New Roman"/>
-        </w:rPr>
-        <w:t>_ for the Logistic Regression floor).</w:t>
+        <w:t>07_evaluation produced the reporting artefacts. cross_val_predict was used to generate out-of-fold predictions on the training set, and the following outputs were written: per-class precision, recall, F1, and support numbers via classification_report; confusion matrices per target; one-vs-rest ROC curves with per-class AUC (macro AUC is the unweighted mean of per-class AUCs); and feature importance plots (feature_importances_ for the tree-based winners, absolute value of coef_ for the Logistic Regression floor).</w:t>
       </w:r>
     </w:p>
     <w:p>
@@ -5873,49 +4569,7 @@
         <w:rPr>
           <w:rFonts w:eastAsia="Times New Roman" w:cs="Times New Roman"/>
         </w:rPr>
-        <w:t xml:space="preserve">The </w:t>
-      </w:r>
-      <w:proofErr w:type="spellStart"/>
-      <w:r>
-        <w:rPr>
-          <w:rFonts w:eastAsia="Times New Roman" w:cs="Times New Roman"/>
-        </w:rPr>
-        <w:t>Streamlit</w:t>
-      </w:r>
-      <w:proofErr w:type="spellEnd"/>
-      <w:r>
-        <w:rPr>
-          <w:rFonts w:eastAsia="Times New Roman" w:cs="Times New Roman"/>
-        </w:rPr>
-        <w:t xml:space="preserve"> web application (app/streamlit_app.py) exposes a six-section form that mirrors the entire 36-item questionnaire plus the 11 RULA components and 8 QEC scores. </w:t>
-      </w:r>
-      <w:proofErr w:type="spellStart"/>
-      <w:r>
-        <w:rPr>
-          <w:rFonts w:eastAsia="Times New Roman" w:cs="Times New Roman"/>
-        </w:rPr>
-        <w:t>Selectboxes</w:t>
-      </w:r>
-      <w:proofErr w:type="spellEnd"/>
-      <w:r>
-        <w:rPr>
-          <w:rFonts w:eastAsia="Times New Roman" w:cs="Times New Roman"/>
-        </w:rPr>
-        <w:t xml:space="preserve"> cover demographics and work pattern; radios cover NMQ, 7-day, and outcome items; sliders cover NASA-TLX (0 to 100) and Borg CR10 (0 to 10); </w:t>
-      </w:r>
-      <w:proofErr w:type="spellStart"/>
-      <w:r>
-        <w:rPr>
-          <w:rFonts w:eastAsia="Times New Roman" w:cs="Times New Roman"/>
-        </w:rPr>
-        <w:t>selectboxes</w:t>
-      </w:r>
-      <w:proofErr w:type="spellEnd"/>
-      <w:r>
-        <w:rPr>
-          <w:rFonts w:eastAsia="Times New Roman" w:cs="Times New Roman"/>
-        </w:rPr>
-        <w:t xml:space="preserve"> cover RULA components; and number inputs cover the QEC scores with min / max ranges matched to the observed training data. Three sample-profile buttons (Low, Average, and High risk) fill the entire form on click so the reviewer can trigger a prediction in one step.</w:t>
+        <w:t>The Streamlit web application (app/streamlit_app.py) exposes a six-section form that mirrors the entire 36-item questionnaire plus the 11 RULA components and 8 QEC scores. Selectboxes cover demographics and work pattern; radios cover NMQ, 7-day, and outcome items; sliders cover NASA-TLX (0 to 100) and Borg CR10 (0 to 10); selectboxes cover RULA components; and number inputs cover the QEC scores with min / max ranges matched to the observed training data. Three sample-profile buttons (Low, Average, and High risk) fill the entire form on click so the reviewer can trigger a prediction in one step.</w:t>
       </w:r>
     </w:p>
     <w:p>
@@ -5927,70 +4581,14 @@
         <w:rPr>
           <w:rFonts w:eastAsia="Times New Roman" w:cs="Times New Roman"/>
         </w:rPr>
-        <w:t xml:space="preserve">On form submission, </w:t>
-      </w:r>
-      <w:proofErr w:type="spellStart"/>
-      <w:r>
-        <w:rPr>
-          <w:rFonts w:eastAsia="Times New Roman" w:cs="Times New Roman"/>
-        </w:rPr>
-        <w:t>encode_rider</w:t>
-      </w:r>
-      <w:proofErr w:type="spellEnd"/>
-      <w:r>
-        <w:rPr>
-          <w:rFonts w:eastAsia="Times New Roman" w:cs="Times New Roman"/>
-        </w:rPr>
-        <w:t xml:space="preserve"> assembles the 63-feature input vector, and </w:t>
-      </w:r>
-      <w:proofErr w:type="spellStart"/>
-      <w:r>
-        <w:rPr>
-          <w:rFonts w:eastAsia="Times New Roman" w:cs="Times New Roman"/>
-        </w:rPr>
-        <w:t>predict_risks</w:t>
-      </w:r>
-      <w:proofErr w:type="spellEnd"/>
-      <w:r>
-        <w:rPr>
-          <w:rFonts w:eastAsia="Times New Roman" w:cs="Times New Roman"/>
-        </w:rPr>
-        <w:t xml:space="preserve"> runs each of the six saved models. The Results page renders a </w:t>
-      </w:r>
-      <w:proofErr w:type="spellStart"/>
-      <w:r>
-        <w:rPr>
-          <w:rFonts w:eastAsia="Times New Roman" w:cs="Times New Roman"/>
-        </w:rPr>
-        <w:t>coloured</w:t>
-      </w:r>
-      <w:proofErr w:type="spellEnd"/>
-      <w:r>
-        <w:rPr>
-          <w:rFonts w:eastAsia="Times New Roman" w:cs="Times New Roman"/>
-        </w:rPr>
-        <w:t xml:space="preserve"> metric strip (green for Low, amber for Medium, red for High), a horizontal Altair bar chart of the same six factors sorted to match the metric strip, a summary banner that flags high-burden profiles, per-factor recommendation cards, and an </w:t>
+        <w:t xml:space="preserve">On form submission, encode_rider assembles the 63-feature input vector, and predict_risks runs each of the six saved models. The Results page renders a coloured metric strip (green for Low, amber for Medium, red for High), a horizontal Altair bar chart of the same six factors sorted to match the metric strip, a summary banner that flags high-burden profiles, per-factor recommendation cards, and an </w:t>
       </w:r>
       <w:r>
         <w:rPr>
           <w:rFonts w:eastAsia="Times New Roman" w:cs="Times New Roman"/>
         </w:rPr>
         <w:lastRenderedPageBreak/>
-        <w:t xml:space="preserve">expandable JSON view of the exact 63 feature values that were fed to the models. The app also has a Methodology page that </w:t>
-      </w:r>
-      <w:proofErr w:type="spellStart"/>
-      <w:r>
-        <w:rPr>
-          <w:rFonts w:eastAsia="Times New Roman" w:cs="Times New Roman"/>
-        </w:rPr>
-        <w:t>summarises</w:t>
-      </w:r>
-      <w:proofErr w:type="spellEnd"/>
-      <w:r>
-        <w:rPr>
-          <w:rFonts w:eastAsia="Times New Roman" w:cs="Times New Roman"/>
-        </w:rPr>
-        <w:t xml:space="preserve"> the pipeline and an About page carrying the institutional context.</w:t>
+        <w:t>expandable JSON view of the exact 63 feature values that were fed to the models. The app also has a Methodology page that summarises the pipeline and an About page carrying the institutional context.</w:t>
       </w:r>
     </w:p>
     <w:p>
@@ -6002,147 +4600,7 @@
         <w:rPr>
           <w:rFonts w:eastAsia="Times New Roman" w:cs="Times New Roman"/>
         </w:rPr>
-        <w:t xml:space="preserve">The app was deployed to </w:t>
-      </w:r>
-      <w:proofErr w:type="spellStart"/>
-      <w:r>
-        <w:rPr>
-          <w:rFonts w:eastAsia="Times New Roman" w:cs="Times New Roman"/>
-        </w:rPr>
-        <w:t>Streamlit</w:t>
-      </w:r>
-      <w:proofErr w:type="spellEnd"/>
-      <w:r>
-        <w:rPr>
-          <w:rFonts w:eastAsia="Times New Roman" w:cs="Times New Roman"/>
-        </w:rPr>
-        <w:t xml:space="preserve"> Community Cloud from the public GitHub repository. Deployment required pinning every runtime dependency in requirements.txt to the exact versions the models were trained with (</w:t>
-      </w:r>
-      <w:proofErr w:type="spellStart"/>
-      <w:r>
-        <w:rPr>
-          <w:rFonts w:eastAsia="Times New Roman" w:cs="Times New Roman"/>
-        </w:rPr>
-        <w:t>streamlit</w:t>
-      </w:r>
-      <w:proofErr w:type="spellEnd"/>
-      <w:r>
-        <w:rPr>
-          <w:rFonts w:eastAsia="Times New Roman" w:cs="Times New Roman"/>
-        </w:rPr>
-        <w:t xml:space="preserve"> 1.58, pandas 2.3, scikit-learn 1.7, </w:t>
-      </w:r>
-      <w:proofErr w:type="spellStart"/>
-      <w:r>
-        <w:rPr>
-          <w:rFonts w:eastAsia="Times New Roman" w:cs="Times New Roman"/>
-        </w:rPr>
-        <w:t>xgboost</w:t>
-      </w:r>
-      <w:proofErr w:type="spellEnd"/>
-      <w:r>
-        <w:rPr>
-          <w:rFonts w:eastAsia="Times New Roman" w:cs="Times New Roman"/>
-        </w:rPr>
-        <w:t xml:space="preserve"> 3.2, imbalanced-learn 0.14, </w:t>
-      </w:r>
-      <w:proofErr w:type="spellStart"/>
-      <w:r>
-        <w:rPr>
-          <w:rFonts w:eastAsia="Times New Roman" w:cs="Times New Roman"/>
-        </w:rPr>
-        <w:t>plotly</w:t>
-      </w:r>
-      <w:proofErr w:type="spellEnd"/>
-      <w:r>
-        <w:rPr>
-          <w:rFonts w:eastAsia="Times New Roman" w:cs="Times New Roman"/>
-        </w:rPr>
-        <w:t xml:space="preserve"> 6.8), because </w:t>
-      </w:r>
-      <w:proofErr w:type="spellStart"/>
-      <w:r>
-        <w:rPr>
-          <w:rFonts w:eastAsia="Times New Roman" w:cs="Times New Roman"/>
-        </w:rPr>
-        <w:t>sklearn</w:t>
-      </w:r>
-      <w:proofErr w:type="spellEnd"/>
-      <w:r>
-        <w:rPr>
-          <w:rFonts w:eastAsia="Times New Roman" w:cs="Times New Roman"/>
-        </w:rPr>
-        <w:t xml:space="preserve"> and </w:t>
-      </w:r>
-      <w:proofErr w:type="spellStart"/>
-      <w:r>
-        <w:rPr>
-          <w:rFonts w:eastAsia="Times New Roman" w:cs="Times New Roman"/>
-        </w:rPr>
-        <w:t>xgboost</w:t>
-      </w:r>
-      <w:proofErr w:type="spellEnd"/>
-      <w:r>
-        <w:rPr>
-          <w:rFonts w:eastAsia="Times New Roman" w:cs="Times New Roman"/>
-        </w:rPr>
-        <w:t xml:space="preserve"> pickles are not portable across minor versions. runtime.txt pins Python 3.13 to match the training environment. A .</w:t>
-      </w:r>
-      <w:proofErr w:type="spellStart"/>
-      <w:r>
-        <w:rPr>
-          <w:rFonts w:eastAsia="Times New Roman" w:cs="Times New Roman"/>
-        </w:rPr>
-        <w:t>streamlit</w:t>
-      </w:r>
-      <w:proofErr w:type="spellEnd"/>
-      <w:r>
-        <w:rPr>
-          <w:rFonts w:eastAsia="Times New Roman" w:cs="Times New Roman"/>
-        </w:rPr>
-        <w:t>/</w:t>
-      </w:r>
-      <w:proofErr w:type="spellStart"/>
-      <w:r>
-        <w:rPr>
-          <w:rFonts w:eastAsia="Times New Roman" w:cs="Times New Roman"/>
-        </w:rPr>
-        <w:t>config.toml</w:t>
-      </w:r>
-      <w:proofErr w:type="spellEnd"/>
-      <w:r>
-        <w:rPr>
-          <w:rFonts w:eastAsia="Times New Roman" w:cs="Times New Roman"/>
-        </w:rPr>
-        <w:t xml:space="preserve"> carries the dark theme and a </w:t>
-      </w:r>
-      <w:proofErr w:type="spellStart"/>
-      <w:r>
-        <w:rPr>
-          <w:rFonts w:eastAsia="Times New Roman" w:cs="Times New Roman"/>
-        </w:rPr>
-        <w:t>client.toolbarMode</w:t>
-      </w:r>
-      <w:proofErr w:type="spellEnd"/>
-      <w:r>
-        <w:rPr>
-          <w:rFonts w:eastAsia="Times New Roman" w:cs="Times New Roman"/>
-        </w:rPr>
-        <w:t xml:space="preserve"> = viewer flag; CSS in the app suppresses the Fork button and 'View source on GitHub' icon that </w:t>
-      </w:r>
-      <w:proofErr w:type="spellStart"/>
-      <w:r>
-        <w:rPr>
-          <w:rFonts w:eastAsia="Times New Roman" w:cs="Times New Roman"/>
-        </w:rPr>
-        <w:t>Streamlit</w:t>
-      </w:r>
-      <w:proofErr w:type="spellEnd"/>
-      <w:r>
-        <w:rPr>
-          <w:rFonts w:eastAsia="Times New Roman" w:cs="Times New Roman"/>
-        </w:rPr>
-        <w:t xml:space="preserve"> Community Cloud injects on public-repo deploys. Every git push to the main branch auto-rebuilds and redeploys the app in about 30 seconds.</w:t>
+        <w:t>The app was deployed to Streamlit Community Cloud from the public GitHub repository. Deployment required pinning every runtime dependency in requirements.txt to the exact versions the models were trained with (streamlit 1.58, pandas 2.3, scikit-learn 1.7, xgboost 3.2, imbalanced-learn 0.14, plotly 6.8), because sklearn and xgboost pickles are not portable across minor versions. runtime.txt pins Python 3.13 to match the training environment. A .streamlit/config.toml carries the dark theme and a client.toolbarMode = viewer flag; CSS in the app suppresses the Fork button and 'View source on GitHub' icon that Streamlit Community Cloud injects on public-repo deploys. Every git push to the main branch auto-rebuilds and redeploys the app in about 30 seconds.</w:t>
       </w:r>
     </w:p>
     <w:p>
@@ -6183,91 +4641,7 @@
         <w:rPr>
           <w:rFonts w:eastAsia="Times New Roman" w:cs="Times New Roman"/>
         </w:rPr>
-        <w:t xml:space="preserve">The initial Phase 3 binning used </w:t>
-      </w:r>
-      <w:proofErr w:type="spellStart"/>
-      <w:r>
-        <w:rPr>
-          <w:rFonts w:eastAsia="Times New Roman" w:cs="Times New Roman"/>
-        </w:rPr>
-        <w:t>pandas.qcut</w:t>
-      </w:r>
-      <w:proofErr w:type="spellEnd"/>
-      <w:r>
-        <w:rPr>
-          <w:rFonts w:eastAsia="Times New Roman" w:cs="Times New Roman"/>
-        </w:rPr>
-        <w:t xml:space="preserve">(q=3) on </w:t>
-      </w:r>
-      <w:proofErr w:type="spellStart"/>
-      <w:r>
-        <w:rPr>
-          <w:rFonts w:eastAsia="Times New Roman" w:cs="Times New Roman"/>
-        </w:rPr>
-        <w:t>deliveries_per_hour</w:t>
-      </w:r>
-      <w:proofErr w:type="spellEnd"/>
-      <w:r>
-        <w:rPr>
-          <w:rFonts w:eastAsia="Times New Roman" w:cs="Times New Roman"/>
-        </w:rPr>
-        <w:t xml:space="preserve">. The 66.7th percentile fell exactly on 3.889 </w:t>
-      </w:r>
-      <w:proofErr w:type="spellStart"/>
-      <w:r>
-        <w:rPr>
-          <w:rFonts w:eastAsia="Times New Roman" w:cs="Times New Roman"/>
-        </w:rPr>
-        <w:t>dph</w:t>
-      </w:r>
-      <w:proofErr w:type="spellEnd"/>
-      <w:r>
-        <w:rPr>
-          <w:rFonts w:eastAsia="Times New Roman" w:cs="Times New Roman"/>
-        </w:rPr>
-        <w:t xml:space="preserve"> (equal to 35 deliveries over 9 hours, the worst real combination in the sample). Fifty-five of the 182 riders tied at that value, and </w:t>
-      </w:r>
-      <w:proofErr w:type="spellStart"/>
-      <w:r>
-        <w:rPr>
-          <w:rFonts w:eastAsia="Times New Roman" w:cs="Times New Roman"/>
-        </w:rPr>
-        <w:t>qcut</w:t>
-      </w:r>
-      <w:proofErr w:type="spellEnd"/>
-      <w:r>
-        <w:rPr>
-          <w:rFonts w:eastAsia="Times New Roman" w:cs="Times New Roman"/>
-        </w:rPr>
-        <w:t xml:space="preserve"> is right-inclusive at the upper edge, so all 55 fell into Medium. This left the Stage-2 model unable to predict High for the worst real schedule. The fix replaces </w:t>
-      </w:r>
-      <w:proofErr w:type="spellStart"/>
-      <w:r>
-        <w:rPr>
-          <w:rFonts w:eastAsia="Times New Roman" w:cs="Times New Roman"/>
-        </w:rPr>
-        <w:t>qcut</w:t>
-      </w:r>
-      <w:proofErr w:type="spellEnd"/>
-      <w:r>
-        <w:rPr>
-          <w:rFonts w:eastAsia="Times New Roman" w:cs="Times New Roman"/>
-        </w:rPr>
-        <w:t xml:space="preserve"> with fixed cuts at 2.5 and 3.75. The Stage-1 High count grew from 19 to 74. Cross-validation accuracy dropped from 74 percent to 62 percent because the model now solves a real 3-class problem instead of </w:t>
-      </w:r>
-      <w:proofErr w:type="spellStart"/>
-      <w:r>
-        <w:rPr>
-          <w:rFonts w:eastAsia="Times New Roman" w:cs="Times New Roman"/>
-        </w:rPr>
-        <w:t>memorising</w:t>
-      </w:r>
-      <w:proofErr w:type="spellEnd"/>
-      <w:r>
-        <w:rPr>
-          <w:rFonts w:eastAsia="Times New Roman" w:cs="Times New Roman"/>
-        </w:rPr>
-        <w:t xml:space="preserve"> a 19-row minority.</w:t>
+        <w:t>The initial Phase 3 binning used pandas.qcut(q=3) on deliveries_per_hour. The 66.7th percentile fell exactly on 3.889 dph (equal to 35 deliveries over 9 hours, the worst real combination in the sample). Fifty-five of the 182 riders tied at that value, and qcut is right-inclusive at the upper edge, so all 55 fell into Medium. This left the Stage-2 model unable to predict High for the worst real schedule. The fix replaces qcut with fixed cuts at 2.5 and 3.75. The Stage-1 High count grew from 19 to 74. Cross-validation accuracy dropped from 74 percent to 62 percent because the model now solves a real 3-class problem instead of memorising a 19-row minority.</w:t>
       </w:r>
     </w:p>
     <w:p>
@@ -6294,91 +4668,7 @@
         <w:rPr>
           <w:rFonts w:eastAsia="Times New Roman" w:cs="Times New Roman"/>
         </w:rPr>
-        <w:t xml:space="preserve">An earlier Phase 6 run reported 100 percent cross-validation accuracy on Duration. Investigation showed the trees were reconstructing </w:t>
-      </w:r>
-      <w:proofErr w:type="spellStart"/>
-      <w:r>
-        <w:rPr>
-          <w:rFonts w:eastAsia="Times New Roman" w:cs="Times New Roman"/>
-        </w:rPr>
-        <w:t>work_hours_num</w:t>
-      </w:r>
-      <w:proofErr w:type="spellEnd"/>
-      <w:r>
-        <w:rPr>
-          <w:rFonts w:eastAsia="Times New Roman" w:cs="Times New Roman"/>
-        </w:rPr>
-        <w:t xml:space="preserve"> from </w:t>
-      </w:r>
-      <w:proofErr w:type="spellStart"/>
-      <w:r>
-        <w:rPr>
-          <w:rFonts w:eastAsia="Times New Roman" w:cs="Times New Roman"/>
-        </w:rPr>
-        <w:t>vibration_index</w:t>
-      </w:r>
-      <w:proofErr w:type="spellEnd"/>
-      <w:r>
-        <w:rPr>
-          <w:rFonts w:eastAsia="Times New Roman" w:cs="Times New Roman"/>
-        </w:rPr>
-        <w:t xml:space="preserve">, which equals </w:t>
-      </w:r>
-      <w:proofErr w:type="spellStart"/>
-      <w:r>
-        <w:rPr>
-          <w:rFonts w:eastAsia="Times New Roman" w:cs="Times New Roman"/>
-        </w:rPr>
-        <w:t>vehicle_rank</w:t>
-      </w:r>
-      <w:proofErr w:type="spellEnd"/>
-      <w:r>
-        <w:rPr>
-          <w:rFonts w:eastAsia="Times New Roman" w:cs="Times New Roman"/>
-        </w:rPr>
-        <w:t xml:space="preserve"> multiplied by </w:t>
-      </w:r>
-      <w:proofErr w:type="spellStart"/>
-      <w:r>
-        <w:rPr>
-          <w:rFonts w:eastAsia="Times New Roman" w:cs="Times New Roman"/>
-        </w:rPr>
-        <w:t>work_hours_num</w:t>
-      </w:r>
-      <w:proofErr w:type="spellEnd"/>
-      <w:r>
-        <w:rPr>
-          <w:rFonts w:eastAsia="Times New Roman" w:cs="Times New Roman"/>
-        </w:rPr>
-        <w:t xml:space="preserve">. Adding </w:t>
-      </w:r>
-      <w:proofErr w:type="spellStart"/>
-      <w:r>
-        <w:rPr>
-          <w:rFonts w:eastAsia="Times New Roman" w:cs="Times New Roman"/>
-        </w:rPr>
-        <w:t>vibration_index</w:t>
-      </w:r>
-      <w:proofErr w:type="spellEnd"/>
-      <w:r>
-        <w:rPr>
-          <w:rFonts w:eastAsia="Times New Roman" w:cs="Times New Roman"/>
-        </w:rPr>
-        <w:t xml:space="preserve"> to the Duration exclusion list and capping </w:t>
-      </w:r>
-      <w:proofErr w:type="spellStart"/>
-      <w:r>
-        <w:rPr>
-          <w:rFonts w:eastAsia="Times New Roman" w:cs="Times New Roman"/>
-        </w:rPr>
-        <w:t>max_depth</w:t>
-      </w:r>
-      <w:proofErr w:type="spellEnd"/>
-      <w:r>
-        <w:rPr>
-          <w:rFonts w:eastAsia="Times New Roman" w:cs="Times New Roman"/>
-        </w:rPr>
-        <w:t xml:space="preserve"> returned Duration to a realistic 61 percent accuracy with 76 percent macro AUC.</w:t>
+        <w:t>An earlier Phase 6 run reported 100 percent cross-validation accuracy on Duration. Investigation showed the trees were reconstructing work_hours_num from vibration_index, which equals vehicle_rank multiplied by work_hours_num. Adding vibration_index to the Duration exclusion list and capping max_depth returned Duration to a realistic 61 percent accuracy with 76 percent macro AUC.</w:t>
       </w:r>
     </w:p>
     <w:p>
@@ -6405,35 +4695,7 @@
         <w:rPr>
           <w:rFonts w:eastAsia="Times New Roman" w:cs="Times New Roman"/>
         </w:rPr>
-        <w:t xml:space="preserve">The Posture target was initially trained only on the survey feature pool, which meant it could only infer posture indirectly from pain, fatigue, and hours. Adding the 11 RULA components and 8 QEC scores from the observation xlsx as explicit features moved Posture accuracy from 89 to 97 percent and the overfit gap from 0.088 to 0.028. Per the label-leakage rule, the three derived RULA Table scores were excluded because </w:t>
-      </w:r>
-      <w:proofErr w:type="spellStart"/>
-      <w:r>
-        <w:rPr>
-          <w:rFonts w:eastAsia="Times New Roman" w:cs="Times New Roman"/>
-        </w:rPr>
-        <w:t>posture_risk</w:t>
-      </w:r>
-      <w:proofErr w:type="spellEnd"/>
-      <w:r>
-        <w:rPr>
-          <w:rFonts w:eastAsia="Times New Roman" w:cs="Times New Roman"/>
-        </w:rPr>
-        <w:t xml:space="preserve"> is </w:t>
-      </w:r>
-      <w:proofErr w:type="spellStart"/>
-      <w:r>
-        <w:rPr>
-          <w:rFonts w:eastAsia="Times New Roman" w:cs="Times New Roman"/>
-        </w:rPr>
-        <w:t>rula_table_c</w:t>
-      </w:r>
-      <w:proofErr w:type="spellEnd"/>
-      <w:r>
-        <w:rPr>
-          <w:rFonts w:eastAsia="Times New Roman" w:cs="Times New Roman"/>
-        </w:rPr>
-        <w:t xml:space="preserve"> binned.</w:t>
+        <w:t>The Posture target was initially trained only on the survey feature pool, which meant it could only infer posture indirectly from pain, fatigue, and hours. Adding the 11 RULA components and 8 QEC scores from the observation xlsx as explicit features moved Posture accuracy from 89 to 97 percent and the overfit gap from 0.088 to 0.028. Per the label-leakage rule, the three derived RULA Table scores were excluded because posture_risk is rula_table_c binned.</w:t>
       </w:r>
     </w:p>
     <w:p>
@@ -6475,35 +4737,7 @@
         <w:rPr>
           <w:rFonts w:eastAsia="Times New Roman" w:cs="Times New Roman"/>
         </w:rPr>
-        <w:t xml:space="preserve">The sample of 182 riders is 152 male and 30 female. Age skews young: 78 riders are under 25, 66 in the 25-35 band, 30 in 36-45, and 8 in the 46-and-above band. Roughly half the sample (49 percent) works more than 8 hours per day. Ninety-four ride scooters and 88 ride motorbikes. The platform split is 97 </w:t>
-      </w:r>
-      <w:proofErr w:type="spellStart"/>
-      <w:r>
-        <w:rPr>
-          <w:rFonts w:eastAsia="Times New Roman" w:cs="Times New Roman"/>
-        </w:rPr>
-        <w:t>Blinkit</w:t>
-      </w:r>
-      <w:proofErr w:type="spellEnd"/>
-      <w:r>
-        <w:rPr>
-          <w:rFonts w:eastAsia="Times New Roman" w:cs="Times New Roman"/>
-        </w:rPr>
-        <w:t xml:space="preserve">, 80 </w:t>
-      </w:r>
-      <w:proofErr w:type="spellStart"/>
-      <w:r>
-        <w:rPr>
-          <w:rFonts w:eastAsia="Times New Roman" w:cs="Times New Roman"/>
-        </w:rPr>
-        <w:t>Zepto</w:t>
-      </w:r>
-      <w:proofErr w:type="spellEnd"/>
-      <w:r>
-        <w:rPr>
-          <w:rFonts w:eastAsia="Times New Roman" w:cs="Times New Roman"/>
-        </w:rPr>
-        <w:t>, and 5 who work both platforms.</w:t>
+        <w:t>The sample of 182 riders is 152 male and 30 female. Age skews young: 78 riders are under 25, 66 in the 25-35 band, 30 in 36-45, and 8 in the 46-and-above band. Roughly half the sample (49 percent) works more than 8 hours per day. Ninety-four ride scooters and 88 ride motorbikes. The platform split is 97 Blinkit, 80 Zepto, and 5 who work both platforms.</w:t>
       </w:r>
     </w:p>
     <w:p>
@@ -9288,7 +7522,6 @@
             <w:pPr>
               <w:spacing w:before="20" w:after="20"/>
             </w:pPr>
-            <w:proofErr w:type="spellStart"/>
             <w:r>
               <w:rPr>
                 <w:rFonts w:eastAsia="Times New Roman" w:cs="Times New Roman"/>
@@ -9296,7 +7529,6 @@
               </w:rPr>
               <w:t>HistGradientBoosting</w:t>
             </w:r>
-            <w:proofErr w:type="spellEnd"/>
           </w:p>
         </w:tc>
         <w:tc>
@@ -9399,7 +7631,6 @@
             <w:pPr>
               <w:spacing w:before="20" w:after="20"/>
             </w:pPr>
-            <w:proofErr w:type="spellStart"/>
             <w:r>
               <w:rPr>
                 <w:rFonts w:eastAsia="Times New Roman" w:cs="Times New Roman"/>
@@ -9407,7 +7638,6 @@
               </w:rPr>
               <w:t>RandomForest</w:t>
             </w:r>
-            <w:proofErr w:type="spellEnd"/>
           </w:p>
         </w:tc>
         <w:tc>
@@ -9510,7 +7740,6 @@
             <w:pPr>
               <w:spacing w:before="20" w:after="20"/>
             </w:pPr>
-            <w:proofErr w:type="spellStart"/>
             <w:r>
               <w:rPr>
                 <w:rFonts w:eastAsia="Times New Roman" w:cs="Times New Roman"/>
@@ -9518,7 +7747,6 @@
               </w:rPr>
               <w:t>RandomForest</w:t>
             </w:r>
-            <w:proofErr w:type="spellEnd"/>
           </w:p>
         </w:tc>
         <w:tc>
@@ -9621,7 +7849,6 @@
             <w:pPr>
               <w:spacing w:before="20" w:after="20"/>
             </w:pPr>
-            <w:proofErr w:type="spellStart"/>
             <w:r>
               <w:rPr>
                 <w:rFonts w:eastAsia="Times New Roman" w:cs="Times New Roman"/>
@@ -9629,7 +7856,6 @@
               </w:rPr>
               <w:t>ExtraTrees</w:t>
             </w:r>
-            <w:proofErr w:type="spellEnd"/>
           </w:p>
         </w:tc>
         <w:tc>
@@ -9732,7 +7958,6 @@
             <w:pPr>
               <w:spacing w:before="20" w:after="20"/>
             </w:pPr>
-            <w:proofErr w:type="spellStart"/>
             <w:r>
               <w:rPr>
                 <w:rFonts w:eastAsia="Times New Roman" w:cs="Times New Roman"/>
@@ -9740,7 +7965,6 @@
               </w:rPr>
               <w:t>RandomForest</w:t>
             </w:r>
-            <w:proofErr w:type="spellEnd"/>
           </w:p>
         </w:tc>
         <w:tc>
@@ -9843,7 +8067,6 @@
             <w:pPr>
               <w:spacing w:before="20" w:after="20"/>
             </w:pPr>
-            <w:proofErr w:type="spellStart"/>
             <w:r>
               <w:rPr>
                 <w:rFonts w:eastAsia="Times New Roman" w:cs="Times New Roman"/>
@@ -9851,7 +8074,6 @@
               </w:rPr>
               <w:t>HistGradientBoosting</w:t>
             </w:r>
-            <w:proofErr w:type="spellEnd"/>
           </w:p>
         </w:tc>
         <w:tc>
@@ -12868,7 +11090,6 @@
             <w:pPr>
               <w:spacing w:before="20" w:after="20"/>
             </w:pPr>
-            <w:proofErr w:type="spellStart"/>
             <w:r>
               <w:rPr>
                 <w:rFonts w:eastAsia="Times New Roman" w:cs="Times New Roman"/>
@@ -12876,7 +11097,6 @@
               </w:rPr>
               <w:t>HistGBM</w:t>
             </w:r>
-            <w:proofErr w:type="spellEnd"/>
           </w:p>
         </w:tc>
         <w:tc>
@@ -12887,37 +11107,12 @@
             <w:pPr>
               <w:spacing w:before="20" w:after="20"/>
             </w:pPr>
-            <w:proofErr w:type="spellStart"/>
-            <w:r>
-              <w:rPr>
-                <w:rFonts w:eastAsia="Times New Roman" w:cs="Times New Roman"/>
-                <w:sz w:val="20"/>
-              </w:rPr>
-              <w:t>max_depth</w:t>
-            </w:r>
-            <w:proofErr w:type="spellEnd"/>
-            <w:r>
-              <w:rPr>
-                <w:rFonts w:eastAsia="Times New Roman" w:cs="Times New Roman"/>
-                <w:sz w:val="20"/>
-              </w:rPr>
-              <w:t xml:space="preserve">=None, </w:t>
-            </w:r>
-            <w:proofErr w:type="spellStart"/>
-            <w:r>
-              <w:rPr>
-                <w:rFonts w:eastAsia="Times New Roman" w:cs="Times New Roman"/>
-                <w:sz w:val="20"/>
-              </w:rPr>
-              <w:t>learning_rate</w:t>
-            </w:r>
-            <w:proofErr w:type="spellEnd"/>
-            <w:r>
-              <w:rPr>
-                <w:rFonts w:eastAsia="Times New Roman" w:cs="Times New Roman"/>
-                <w:sz w:val="20"/>
-              </w:rPr>
-              <w:t>=0.05</w:t>
+            <w:r>
+              <w:rPr>
+                <w:rFonts w:eastAsia="Times New Roman" w:cs="Times New Roman"/>
+                <w:sz w:val="20"/>
+              </w:rPr>
+              <w:t>max_depth=None, learning_rate=0.05</w:t>
             </w:r>
           </w:p>
         </w:tc>
@@ -12970,7 +11165,6 @@
             <w:pPr>
               <w:spacing w:before="20" w:after="20"/>
             </w:pPr>
-            <w:proofErr w:type="spellStart"/>
             <w:r>
               <w:rPr>
                 <w:rFonts w:eastAsia="Times New Roman" w:cs="Times New Roman"/>
@@ -12978,7 +11172,6 @@
               </w:rPr>
               <w:t>RandomForest</w:t>
             </w:r>
-            <w:proofErr w:type="spellEnd"/>
           </w:p>
         </w:tc>
         <w:tc>
@@ -12989,37 +11182,12 @@
             <w:pPr>
               <w:spacing w:before="20" w:after="20"/>
             </w:pPr>
-            <w:proofErr w:type="spellStart"/>
-            <w:r>
-              <w:rPr>
-                <w:rFonts w:eastAsia="Times New Roman" w:cs="Times New Roman"/>
-                <w:sz w:val="20"/>
-              </w:rPr>
-              <w:t>n_estimators</w:t>
-            </w:r>
-            <w:proofErr w:type="spellEnd"/>
-            <w:r>
-              <w:rPr>
-                <w:rFonts w:eastAsia="Times New Roman" w:cs="Times New Roman"/>
-                <w:sz w:val="20"/>
-              </w:rPr>
-              <w:t xml:space="preserve">=300, </w:t>
-            </w:r>
-            <w:proofErr w:type="spellStart"/>
-            <w:r>
-              <w:rPr>
-                <w:rFonts w:eastAsia="Times New Roman" w:cs="Times New Roman"/>
-                <w:sz w:val="20"/>
-              </w:rPr>
-              <w:t>max_depth</w:t>
-            </w:r>
-            <w:proofErr w:type="spellEnd"/>
-            <w:r>
-              <w:rPr>
-                <w:rFonts w:eastAsia="Times New Roman" w:cs="Times New Roman"/>
-                <w:sz w:val="20"/>
-              </w:rPr>
-              <w:t>=None</w:t>
+            <w:r>
+              <w:rPr>
+                <w:rFonts w:eastAsia="Times New Roman" w:cs="Times New Roman"/>
+                <w:sz w:val="20"/>
+              </w:rPr>
+              <w:t>n_estimators=300, max_depth=None</w:t>
             </w:r>
           </w:p>
         </w:tc>
@@ -13072,7 +11240,6 @@
             <w:pPr>
               <w:spacing w:before="20" w:after="20"/>
             </w:pPr>
-            <w:proofErr w:type="spellStart"/>
             <w:r>
               <w:rPr>
                 <w:rFonts w:eastAsia="Times New Roman" w:cs="Times New Roman"/>
@@ -13080,7 +11247,6 @@
               </w:rPr>
               <w:t>RandomForest</w:t>
             </w:r>
-            <w:proofErr w:type="spellEnd"/>
           </w:p>
         </w:tc>
         <w:tc>
@@ -13091,37 +11257,12 @@
             <w:pPr>
               <w:spacing w:before="20" w:after="20"/>
             </w:pPr>
-            <w:proofErr w:type="spellStart"/>
-            <w:r>
-              <w:rPr>
-                <w:rFonts w:eastAsia="Times New Roman" w:cs="Times New Roman"/>
-                <w:sz w:val="20"/>
-              </w:rPr>
-              <w:t>n_estimators</w:t>
-            </w:r>
-            <w:proofErr w:type="spellEnd"/>
-            <w:r>
-              <w:rPr>
-                <w:rFonts w:eastAsia="Times New Roman" w:cs="Times New Roman"/>
-                <w:sz w:val="20"/>
-              </w:rPr>
-              <w:t xml:space="preserve">=500, </w:t>
-            </w:r>
-            <w:proofErr w:type="spellStart"/>
-            <w:r>
-              <w:rPr>
-                <w:rFonts w:eastAsia="Times New Roman" w:cs="Times New Roman"/>
-                <w:sz w:val="20"/>
-              </w:rPr>
-              <w:t>max_depth</w:t>
-            </w:r>
-            <w:proofErr w:type="spellEnd"/>
-            <w:r>
-              <w:rPr>
-                <w:rFonts w:eastAsia="Times New Roman" w:cs="Times New Roman"/>
-                <w:sz w:val="20"/>
-              </w:rPr>
-              <w:t>=5</w:t>
+            <w:r>
+              <w:rPr>
+                <w:rFonts w:eastAsia="Times New Roman" w:cs="Times New Roman"/>
+                <w:sz w:val="20"/>
+              </w:rPr>
+              <w:t>n_estimators=500, max_depth=5</w:t>
             </w:r>
           </w:p>
         </w:tc>
@@ -13174,7 +11315,6 @@
             <w:pPr>
               <w:spacing w:before="20" w:after="20"/>
             </w:pPr>
-            <w:proofErr w:type="spellStart"/>
             <w:r>
               <w:rPr>
                 <w:rFonts w:eastAsia="Times New Roman" w:cs="Times New Roman"/>
@@ -13182,7 +11322,6 @@
               </w:rPr>
               <w:t>ExtraTrees</w:t>
             </w:r>
-            <w:proofErr w:type="spellEnd"/>
           </w:p>
         </w:tc>
         <w:tc>
@@ -13193,37 +11332,12 @@
             <w:pPr>
               <w:spacing w:before="20" w:after="20"/>
             </w:pPr>
-            <w:proofErr w:type="spellStart"/>
-            <w:r>
-              <w:rPr>
-                <w:rFonts w:eastAsia="Times New Roman" w:cs="Times New Roman"/>
-                <w:sz w:val="20"/>
-              </w:rPr>
-              <w:t>n_estimators</w:t>
-            </w:r>
-            <w:proofErr w:type="spellEnd"/>
-            <w:r>
-              <w:rPr>
-                <w:rFonts w:eastAsia="Times New Roman" w:cs="Times New Roman"/>
-                <w:sz w:val="20"/>
-              </w:rPr>
-              <w:t xml:space="preserve">=300, </w:t>
-            </w:r>
-            <w:proofErr w:type="spellStart"/>
-            <w:r>
-              <w:rPr>
-                <w:rFonts w:eastAsia="Times New Roman" w:cs="Times New Roman"/>
-                <w:sz w:val="20"/>
-              </w:rPr>
-              <w:t>max_depth</w:t>
-            </w:r>
-            <w:proofErr w:type="spellEnd"/>
-            <w:r>
-              <w:rPr>
-                <w:rFonts w:eastAsia="Times New Roman" w:cs="Times New Roman"/>
-                <w:sz w:val="20"/>
-              </w:rPr>
-              <w:t>=None</w:t>
+            <w:r>
+              <w:rPr>
+                <w:rFonts w:eastAsia="Times New Roman" w:cs="Times New Roman"/>
+                <w:sz w:val="20"/>
+              </w:rPr>
+              <w:t>n_estimators=300, max_depth=None</w:t>
             </w:r>
           </w:p>
         </w:tc>
@@ -13276,7 +11390,6 @@
             <w:pPr>
               <w:spacing w:before="20" w:after="20"/>
             </w:pPr>
-            <w:proofErr w:type="spellStart"/>
             <w:r>
               <w:rPr>
                 <w:rFonts w:eastAsia="Times New Roman" w:cs="Times New Roman"/>
@@ -13284,7 +11397,6 @@
               </w:rPr>
               <w:t>RandomForest</w:t>
             </w:r>
-            <w:proofErr w:type="spellEnd"/>
           </w:p>
         </w:tc>
         <w:tc>
@@ -13295,37 +11407,12 @@
             <w:pPr>
               <w:spacing w:before="20" w:after="20"/>
             </w:pPr>
-            <w:proofErr w:type="spellStart"/>
-            <w:r>
-              <w:rPr>
-                <w:rFonts w:eastAsia="Times New Roman" w:cs="Times New Roman"/>
-                <w:sz w:val="20"/>
-              </w:rPr>
-              <w:t>n_estimators</w:t>
-            </w:r>
-            <w:proofErr w:type="spellEnd"/>
-            <w:r>
-              <w:rPr>
-                <w:rFonts w:eastAsia="Times New Roman" w:cs="Times New Roman"/>
-                <w:sz w:val="20"/>
-              </w:rPr>
-              <w:t xml:space="preserve">=500, </w:t>
-            </w:r>
-            <w:proofErr w:type="spellStart"/>
-            <w:r>
-              <w:rPr>
-                <w:rFonts w:eastAsia="Times New Roman" w:cs="Times New Roman"/>
-                <w:sz w:val="20"/>
-              </w:rPr>
-              <w:t>max_depth</w:t>
-            </w:r>
-            <w:proofErr w:type="spellEnd"/>
-            <w:r>
-              <w:rPr>
-                <w:rFonts w:eastAsia="Times New Roman" w:cs="Times New Roman"/>
-                <w:sz w:val="20"/>
-              </w:rPr>
-              <w:t>=None</w:t>
+            <w:r>
+              <w:rPr>
+                <w:rFonts w:eastAsia="Times New Roman" w:cs="Times New Roman"/>
+                <w:sz w:val="20"/>
+              </w:rPr>
+              <w:t>n_estimators=500, max_depth=None</w:t>
             </w:r>
           </w:p>
         </w:tc>
@@ -13378,7 +11465,6 @@
             <w:pPr>
               <w:spacing w:before="20" w:after="20"/>
             </w:pPr>
-            <w:proofErr w:type="spellStart"/>
             <w:r>
               <w:rPr>
                 <w:rFonts w:eastAsia="Times New Roman" w:cs="Times New Roman"/>
@@ -13386,7 +11472,6 @@
               </w:rPr>
               <w:t>HistGBM</w:t>
             </w:r>
-            <w:proofErr w:type="spellEnd"/>
           </w:p>
         </w:tc>
         <w:tc>
@@ -13397,37 +11482,12 @@
             <w:pPr>
               <w:spacing w:before="20" w:after="20"/>
             </w:pPr>
-            <w:proofErr w:type="spellStart"/>
-            <w:r>
-              <w:rPr>
-                <w:rFonts w:eastAsia="Times New Roman" w:cs="Times New Roman"/>
-                <w:sz w:val="20"/>
-              </w:rPr>
-              <w:t>max_depth</w:t>
-            </w:r>
-            <w:proofErr w:type="spellEnd"/>
-            <w:r>
-              <w:rPr>
-                <w:rFonts w:eastAsia="Times New Roman" w:cs="Times New Roman"/>
-                <w:sz w:val="20"/>
-              </w:rPr>
-              <w:t xml:space="preserve">=5, </w:t>
-            </w:r>
-            <w:proofErr w:type="spellStart"/>
-            <w:r>
-              <w:rPr>
-                <w:rFonts w:eastAsia="Times New Roman" w:cs="Times New Roman"/>
-                <w:sz w:val="20"/>
-              </w:rPr>
-              <w:t>learning_rate</w:t>
-            </w:r>
-            <w:proofErr w:type="spellEnd"/>
-            <w:r>
-              <w:rPr>
-                <w:rFonts w:eastAsia="Times New Roman" w:cs="Times New Roman"/>
-                <w:sz w:val="20"/>
-              </w:rPr>
-              <w:t>=0.05</w:t>
+            <w:r>
+              <w:rPr>
+                <w:rFonts w:eastAsia="Times New Roman" w:cs="Times New Roman"/>
+                <w:sz w:val="20"/>
+              </w:rPr>
+              <w:t>max_depth=5, learning_rate=0.05</w:t>
             </w:r>
           </w:p>
         </w:tc>
@@ -13467,27 +11527,7 @@
           <w:color w:val="000000"/>
           <w:sz w:val="18"/>
         </w:rPr>
-        <w:t xml:space="preserve">Table 4.8: Winning hyperparameters per target after </w:t>
-      </w:r>
-      <w:proofErr w:type="spellStart"/>
-      <w:r>
-        <w:rPr>
-          <w:rFonts w:eastAsia="Times New Roman" w:cs="Times New Roman"/>
-          <w:i/>
-          <w:color w:val="000000"/>
-          <w:sz w:val="18"/>
-        </w:rPr>
-        <w:t>GridSearchCV</w:t>
-      </w:r>
-      <w:proofErr w:type="spellEnd"/>
-      <w:r>
-        <w:rPr>
-          <w:rFonts w:eastAsia="Times New Roman" w:cs="Times New Roman"/>
-          <w:i/>
-          <w:color w:val="000000"/>
-          <w:sz w:val="18"/>
-        </w:rPr>
-        <w:t>.</w:t>
+        <w:t>Table 4.8: Winning hyperparameters per target after GridSearchCV.</w:t>
       </w:r>
     </w:p>
     <w:p>
@@ -13826,25 +11866,7 @@
           <w:i/>
           <w:sz w:val="18"/>
         </w:rPr>
-        <w:t xml:space="preserve">Figure 4.13: Web app: predicted risk profile output with </w:t>
-      </w:r>
-      <w:proofErr w:type="spellStart"/>
-      <w:r>
-        <w:rPr>
-          <w:rFonts w:eastAsia="Times New Roman" w:cs="Times New Roman"/>
-          <w:i/>
-          <w:sz w:val="18"/>
-        </w:rPr>
-        <w:t>colour</w:t>
-      </w:r>
-      <w:proofErr w:type="spellEnd"/>
-      <w:r>
-        <w:rPr>
-          <w:rFonts w:eastAsia="Times New Roman" w:cs="Times New Roman"/>
-          <w:i/>
-          <w:sz w:val="18"/>
-        </w:rPr>
-        <w:t>-coded level cards, radar chart, tabular result, and per-factor recommendations.</w:t>
+        <w:t>Figure 4.13: Web app: predicted risk profile output with colour-coded level cards, radar chart, tabular result, and per-factor recommendations.</w:t>
       </w:r>
     </w:p>
     <w:p>
@@ -13872,21 +11894,7 @@
         <w:rPr>
           <w:rFonts w:eastAsia="Times New Roman" w:cs="Times New Roman"/>
         </w:rPr>
-        <w:t xml:space="preserve">This project designed, implemented, and deployed a per-rider ergonomic risk screening pipeline for last-mile quick-commerce delivery workers, turning a 36-item self-report questionnaire and a RULA + QEC observation record into six </w:t>
-      </w:r>
-      <w:proofErr w:type="spellStart"/>
-      <w:r>
-        <w:rPr>
-          <w:rFonts w:eastAsia="Times New Roman" w:cs="Times New Roman"/>
-        </w:rPr>
-        <w:t>standardised</w:t>
-      </w:r>
-      <w:proofErr w:type="spellEnd"/>
-      <w:r>
-        <w:rPr>
-          <w:rFonts w:eastAsia="Times New Roman" w:cs="Times New Roman"/>
-        </w:rPr>
-        <w:t xml:space="preserve"> risk levels across Force, Repetition, Posture, Duration, Contact Stress, and Vibration. The five survey-derived factors land at 58-62 percent cross-validation accuracy with macro AUC between 71 and 76 percent; the Posture model, which receives the RULA and QEC observation inputs directly, reaches 97 percent accuracy and 98 percent AUC. Chi-square identifies Posture, Repetition, and Force as the risk factors significantly associated with self-reported discomfort, and multivariable logistic regression flags age (OR 3.58 per band), job duration (OR 2.89), workload score, and fatigue score as the strongest individual predictors.</w:t>
+        <w:t>This project designed, implemented, and deployed a per-rider ergonomic risk screening pipeline for last-mile quick-commerce delivery workers, turning a 36-item self-report questionnaire and a RULA + QEC observation record into six standardised risk levels across Force, Repetition, Posture, Duration, Contact Stress, and Vibration. The five survey-derived factors land at 58-62 percent cross-validation accuracy with macro AUC between 71 and 76 percent; the Posture model, which receives the RULA and QEC observation inputs directly, reaches 97 percent accuracy and 98 percent AUC. Chi-square identifies Posture, Repetition, and Force as the risk factors significantly associated with self-reported discomfort, and multivariable logistic regression flags age (OR 3.58 per band), job duration (OR 2.89), workload score, and fatigue score as the strongest individual predictors.</w:t>
       </w:r>
     </w:p>
     <w:p>
@@ -13898,35 +11906,7 @@
         <w:rPr>
           <w:rFonts w:eastAsia="Times New Roman" w:cs="Times New Roman"/>
         </w:rPr>
-        <w:t xml:space="preserve">The main limitations are the self-report nature of most input variables, the severity-rank merge used to pair the identifier-less posture xlsx with the survey, and the small sample (n = 182) that keeps ML variance visible. Two methodological corrections were made and openly documented: Repetition binning moved from </w:t>
-      </w:r>
-      <w:proofErr w:type="spellStart"/>
-      <w:r>
-        <w:rPr>
-          <w:rFonts w:eastAsia="Times New Roman" w:cs="Times New Roman"/>
-        </w:rPr>
-        <w:t>qcut</w:t>
-      </w:r>
-      <w:proofErr w:type="spellEnd"/>
-      <w:r>
-        <w:rPr>
-          <w:rFonts w:eastAsia="Times New Roman" w:cs="Times New Roman"/>
-        </w:rPr>
-        <w:t xml:space="preserve"> to fixed cuts to remove a boundary tie that hid the worst real schedule, and </w:t>
-      </w:r>
-      <w:proofErr w:type="spellStart"/>
-      <w:r>
-        <w:rPr>
-          <w:rFonts w:eastAsia="Times New Roman" w:cs="Times New Roman"/>
-        </w:rPr>
-        <w:t>vibration_index</w:t>
-      </w:r>
-      <w:proofErr w:type="spellEnd"/>
-      <w:r>
-        <w:rPr>
-          <w:rFonts w:eastAsia="Times New Roman" w:cs="Times New Roman"/>
-        </w:rPr>
-        <w:t xml:space="preserve"> was added to the Duration exclusion list to remove indirect leakage.</w:t>
+        <w:t>The main limitations are the self-report nature of most input variables, the severity-rank merge used to pair the identifier-less posture xlsx with the survey, and the small sample (n = 182) that keeps ML variance visible. Two methodological corrections were made and openly documented: Repetition binning moved from qcut to fixed cuts to remove a boundary tie that hid the worst real schedule, and vibration_index was added to the Duration exclusion list to remove indirect leakage.</w:t>
       </w:r>
     </w:p>
     <w:p>
@@ -13938,21 +11918,7 @@
         <w:rPr>
           <w:rFonts w:eastAsia="Times New Roman" w:cs="Times New Roman"/>
         </w:rPr>
-        <w:t>Five interventions for a delivery-platform operator follow directly from the results: (</w:t>
-      </w:r>
-      <w:proofErr w:type="spellStart"/>
-      <w:r>
-        <w:rPr>
-          <w:rFonts w:eastAsia="Times New Roman" w:cs="Times New Roman"/>
-        </w:rPr>
-        <w:t>i</w:t>
-      </w:r>
-      <w:proofErr w:type="spellEnd"/>
-      <w:r>
-        <w:rPr>
-          <w:rFonts w:eastAsia="Times New Roman" w:cs="Times New Roman"/>
-        </w:rPr>
-        <w:t>) cap daily hours (49 percent of the sample exceeds 8 hours per day); (ii) invest in posture-focused equipment and training (84 percent of observed postures at RULA action level 5 or above); (iii) encourage bike-storage-box carrying over handheld bags; (iv) age-targeted MSD screening for the 36-and-above cohort; and (v) platform-level workload management to reduce the NASA-TLX component of the workload score, a significant discomfort predictor at p = 0.0005.</w:t>
+        <w:t>Five interventions for a delivery-platform operator follow directly from the results: (i) cap daily hours (49 percent of the sample exceeds 8 hours per day); (ii) invest in posture-focused equipment and training (84 percent of observed postures at RULA action level 5 or above); (iii) encourage bike-storage-box carrying over handheld bags; (iv) age-targeted MSD screening for the 36-and-above cohort; and (v) platform-level workload management to reduce the NASA-TLX component of the workload score, a significant discomfort predictor at p = 0.0005.</w:t>
       </w:r>
     </w:p>
     <w:p>
@@ -13991,23 +11957,7 @@
         <w:jc w:val="both"/>
       </w:pPr>
       <w:r>
-        <w:t xml:space="preserve">[1] Benson TM, </w:t>
-      </w:r>
-      <w:proofErr w:type="spellStart"/>
-      <w:r>
-        <w:t>Sathiyarajeswaran</w:t>
-      </w:r>
-      <w:proofErr w:type="spellEnd"/>
-      <w:r>
-        <w:t xml:space="preserve"> NS, Radhakrishnan R, Gafoor AA, </w:t>
-      </w:r>
-      <w:proofErr w:type="spellStart"/>
-      <w:r>
-        <w:t>Krupalakshme</w:t>
-      </w:r>
-      <w:proofErr w:type="spellEnd"/>
-      <w:r>
-        <w:t xml:space="preserve"> M, Samal J (2025). Factors and prevalence of musculoskeletal pain among the app-based food delivery riders in Tamil Nadu: a cross-sectional study. Discover Social Sciences and Health, 5:14.</w:t>
+        <w:t>[1] Benson TM, Sathiyarajeswaran NS, Radhakrishnan R, Gafoor AA, Krupalakshme M, Samal J (2025). Factors and prevalence of musculoskeletal pain among the app-based food delivery riders in Tamil Nadu: a cross-sectional study. Discover Social Sciences and Health, 5:14.</w:t>
       </w:r>
     </w:p>
     <w:p>
@@ -14027,15 +11977,7 @@
         <w:jc w:val="both"/>
       </w:pPr>
       <w:r>
-        <w:t xml:space="preserve">[3] Daud A, Mohd Basri IS, Ahmad E, Mohd </w:t>
-      </w:r>
-      <w:proofErr w:type="spellStart"/>
-      <w:r>
-        <w:t>Hairon</w:t>
-      </w:r>
-      <w:proofErr w:type="spellEnd"/>
-      <w:r>
-        <w:t xml:space="preserve"> S, Nordin R, Azali Azmir N, Md Jalil MAS (2023). Assessing ergonomic risks: REBA analysis of food delivery riders in Eastern Peninsular Malaysia. Industrial Health, 61(4), 282-291.</w:t>
+        <w:t>[3] Daud A, Mohd Basri IS, Ahmad E, Mohd Hairon S, Nordin R, Azali Azmir N, Md Jalil MAS (2023). Assessing ergonomic risks: REBA analysis of food delivery riders in Eastern Peninsular Malaysia. Industrial Health, 61(4), 282-291.</w:t>
       </w:r>
     </w:p>
     <w:p>
@@ -14065,23 +12007,7 @@
         <w:jc w:val="both"/>
       </w:pPr>
       <w:r>
-        <w:t xml:space="preserve">[6] </w:t>
-      </w:r>
-      <w:proofErr w:type="spellStart"/>
-      <w:r>
-        <w:t>Kuorinka</w:t>
-      </w:r>
-      <w:proofErr w:type="spellEnd"/>
-      <w:r>
-        <w:t xml:space="preserve"> I, Jonsson B, Kilbom A, Vinterberg H, Biering-Sorensen F, Andersson G, Jorgensen K (1987). </w:t>
-      </w:r>
-      <w:proofErr w:type="spellStart"/>
-      <w:r>
-        <w:t>Standardised</w:t>
-      </w:r>
-      <w:proofErr w:type="spellEnd"/>
-      <w:r>
-        <w:t xml:space="preserve"> Nordic questionnaires for the analysis of musculoskeletal symptoms. Applied Ergonomics, 18(3), 233-237.</w:t>
+        <w:t>[6] Kuorinka I, Jonsson B, Kilbom A, Vinterberg H, Biering-Sorensen F, Andersson G, Jorgensen K (1987). Standardised Nordic questionnaires for the analysis of musculoskeletal symptoms. Applied Ergonomics, 18(3), 233-237.</w:t>
       </w:r>
     </w:p>
     <w:p>
@@ -14091,15 +12017,7 @@
         <w:jc w:val="both"/>
       </w:pPr>
       <w:r>
-        <w:t xml:space="preserve">[7] Hart SG, </w:t>
-      </w:r>
-      <w:proofErr w:type="spellStart"/>
-      <w:r>
-        <w:t>Staveland</w:t>
-      </w:r>
-      <w:proofErr w:type="spellEnd"/>
-      <w:r>
-        <w:t xml:space="preserve"> LE (1988). Development of NASA-TLX (Task Load Index): Results of empirical and theoretical research. Advances in Psychology, 52, 139-183.</w:t>
+        <w:t>[7] Hart SG, Staveland LE (1988). Development of NASA-TLX (Task Load Index): Results of empirical and theoretical research. Advances in Psychology, 52, 139-183.</w:t>
       </w:r>
     </w:p>
     <w:p>
@@ -14119,15 +12037,7 @@
         <w:jc w:val="both"/>
       </w:pPr>
       <w:r>
-        <w:t xml:space="preserve">[9] Chawla NV, Bowyer KW, Hall LO, </w:t>
-      </w:r>
-      <w:proofErr w:type="spellStart"/>
-      <w:r>
-        <w:t>Kegelmeyer</w:t>
-      </w:r>
-      <w:proofErr w:type="spellEnd"/>
-      <w:r>
-        <w:t xml:space="preserve"> WP (2002). SMOTE: Synthetic Minority Over-sampling Technique. Journal of Artificial Intelligence Research, 16, 321-357.</w:t>
+        <w:t>[9] Chawla NV, Bowyer KW, Hall LO, Kegelmeyer WP (2002). SMOTE: Synthetic Minority Over-sampling Technique. Journal of Artificial Intelligence Research, 16, 321-357.</w:t>
       </w:r>
     </w:p>
     <w:p>
@@ -14137,15 +12047,7 @@
         <w:jc w:val="both"/>
       </w:pPr>
       <w:r>
-        <w:t xml:space="preserve">[10] </w:t>
-      </w:r>
-      <w:proofErr w:type="spellStart"/>
-      <w:r>
-        <w:t>Breiman</w:t>
-      </w:r>
-      <w:proofErr w:type="spellEnd"/>
-      <w:r>
-        <w:t xml:space="preserve"> L (2001). Random Forests. Machine Learning, 45(1), 5-32.</w:t>
+        <w:t>[10] Breiman L (2001). Random Forests. Machine Learning, 45(1), 5-32.</w:t>
       </w:r>
     </w:p>
     <w:p>
@@ -14155,15 +12057,7 @@
         <w:jc w:val="both"/>
       </w:pPr>
       <w:r>
-        <w:t xml:space="preserve">[11] Geurts P, Ernst D, </w:t>
-      </w:r>
-      <w:proofErr w:type="spellStart"/>
-      <w:r>
-        <w:t>Wehenkel</w:t>
-      </w:r>
-      <w:proofErr w:type="spellEnd"/>
-      <w:r>
-        <w:t xml:space="preserve"> L (2006). Extremely randomized trees. Machine Learning, 63(1), 3-42.</w:t>
+        <w:t>[11] Geurts P, Ernst D, Wehenkel L (2006). Extremely randomized trees. Machine Learning, 63(1), 3-42.</w:t>
       </w:r>
     </w:p>
     <w:p>
@@ -14173,23 +12067,7 @@
         <w:jc w:val="both"/>
       </w:pPr>
       <w:r>
-        <w:t xml:space="preserve">[12] Chen T, </w:t>
-      </w:r>
-      <w:proofErr w:type="spellStart"/>
-      <w:r>
-        <w:t>Guestrin</w:t>
-      </w:r>
-      <w:proofErr w:type="spellEnd"/>
-      <w:r>
-        <w:t xml:space="preserve"> C (2016). </w:t>
-      </w:r>
-      <w:proofErr w:type="spellStart"/>
-      <w:r>
-        <w:t>XGBoost</w:t>
-      </w:r>
-      <w:proofErr w:type="spellEnd"/>
-      <w:r>
-        <w:t>: A Scalable Tree Boosting System. Proceedings of the 22nd ACM SIGKDD International Conference on Knowledge Discovery and Data Mining, 785-794.</w:t>
+        <w:t>[12] Chen T, Guestrin C (2016). XGBoost: A Scalable Tree Boosting System. Proceedings of the 22nd ACM SIGKDD International Conference on Knowledge Discovery and Data Mining, 785-794.</w:t>
       </w:r>
     </w:p>
     <w:p>
@@ -14209,23 +12087,7 @@
         <w:jc w:val="both"/>
       </w:pPr>
       <w:r>
-        <w:t xml:space="preserve">[14] Pedregosa F, </w:t>
-      </w:r>
-      <w:proofErr w:type="spellStart"/>
-      <w:r>
-        <w:t>Varoquaux</w:t>
-      </w:r>
-      <w:proofErr w:type="spellEnd"/>
-      <w:r>
-        <w:t xml:space="preserve"> G, </w:t>
-      </w:r>
-      <w:proofErr w:type="spellStart"/>
-      <w:r>
-        <w:t>Gramfort</w:t>
-      </w:r>
-      <w:proofErr w:type="spellEnd"/>
-      <w:r>
-        <w:t xml:space="preserve"> A, et al. (2011). Scikit-learn: Machine Learning in Python. Journal of Machine Learning Research, 12, 2825-2830.</w:t>
+        <w:t>[14] Pedregosa F, Varoquaux G, Gramfort A, et al. (2011). Scikit-learn: Machine Learning in Python. Journal of Machine Learning Research, 12, 2825-2830.</w:t>
       </w:r>
     </w:p>
     <w:sectPr>
@@ -14431,7 +12293,7 @@
         <w:noProof/>
         <w:sz w:val="20"/>
       </w:rPr>
-      <w:t>BIBLIOGRAPHY</w:t>
+      <w:t>CHAPTER 4. RESULTS AND DISCUSSIONS</w:t>
     </w:r>
     <w:r>
       <w:rPr>

</xml_diff>

<commit_message>
report.docx: fix BLOCKER + HIGH findings from audit
Table 4.7: Posture Medium/High rows re-copied from classification_reports.csv
(0.929/0.897/0.912 and 0.981/0.987/0.984); Contact Stress Low/High precision
and F1 corrected. §4.2 lead-in now names three significant factors (Posture,
Repetition, Force) matching Table 4.2. Chapter 5 intervention (ii) reworded
from impossible "RULA action level 5" to "grand score 5 or above (action
level 3 or 4)". NASA-TLX polarity description clarified: satisfaction item
reversed at analysis, Raw TLX composite. §2.6.2 Decision Tree grid corrected
to {3,5,7} / {1,3,5} to match code. §2.6.6 XGBoost description limited to L2
regularisation (drops L1 and column-subsampling claims not in the code).
Bibliography: dropped Daud (REBA, off-method), added Lemaître (2017) for
imbalanced-learn as [9]; still 14 refs. §1.1 now cites [1] Benson and
[2] Pandit as prior Indian last-mile MSK work.

Co-Authored-By: Claude Opus 4.7 <noreply@anthropic.com>
</commit_message>
<xml_diff>
--- a/docs/report.docx
+++ b/docs/report.docx
@@ -2915,7 +2915,7 @@
         <w:rPr>
           <w:rFonts w:eastAsia="Times New Roman" w:cs="Times New Roman"/>
         </w:rPr>
-        <w:t>Last-mile quick-commerce delivery riders for platforms like Blinkit and Zepto spend long hours on bikes, climb stairs, carry packages, and ride in heavy traffic. Over time this kind of work causes musculoskeletal disorders (MSDs): back pain, shoulder pain, wrist injuries, knee problems. The risk is not the same for every rider. Someone who is 22 and works 4 hours a day on a scooter is in a very different situation from a 45-year-old who works 10 hours a day on a motorbike with a handheld bag.</w:t>
+        <w:t>Last-mile quick-commerce delivery riders for platforms like Blinkit and Zepto spend long hours on bikes, climb stairs, carry packages, and ride in heavy traffic. Prior Indian last-mile MSK studies [1, 2] report similar exposure patterns among app-based delivery riders. Over time this kind of work causes musculoskeletal disorders (MSDs): back pain, shoulder pain, wrist injuries, knee problems. The risk is not the same for every rider. Someone who is 22 and works 4 hours a day on a scooter is in a very different situation from a 45-year-old who works 10 hours a day on a motorbike with a handheld bag.</w:t>
       </w:r>
     </w:p>
     <w:p>
@@ -3578,7 +3578,7 @@
         <w:rPr>
           <w:rFonts w:eastAsia="Times New Roman" w:cs="Times New Roman"/>
         </w:rPr>
-        <w:t>Single CART tree with max_depth (3-10) and min_samples_leaf (2-10) tuned via grid search.  Included as the ensembling floor; not competitive on its own for any of the six targets.</w:t>
+        <w:t>Single CART tree with max_depth in {3, 5, 7} and min_samples_leaf in {1, 3, 5} tuned via grid search.  Included as the ensembling floor; not competitive on its own for any of the six targets.</w:t>
       </w:r>
     </w:p>
     <w:p>
@@ -3687,7 +3687,7 @@
         <w:rPr>
           <w:rFonts w:eastAsia="Times New Roman" w:cs="Times New Roman"/>
         </w:rPr>
-        <w:t>Gradient-boosted trees with L1 + L2 regularisation on the leaf weights and per-tree column subsampling.  Placed second on several targets but did not win any at the default search budget.</w:t>
+        <w:t>Gradient-boosted trees with L2 regularisation on the leaf weights.  Placed second on several targets but did not win any at the default search budget.</w:t>
       </w:r>
     </w:p>
     <w:p>
@@ -4391,7 +4391,7 @@
         <w:rPr>
           <w:rFonts w:eastAsia="Times New Roman" w:cs="Times New Roman"/>
         </w:rPr>
-        <w:t>Two data-collection instruments were prepared before fieldwork began. The self-report instrument was a 36-item Google Form structured in five modules: demographics and work pattern (seventeen items), the Nordic Musculoskeletal Questionnaire covering 12-month pain across nine body areas (Q18) and 7-day discomfort across four areas (Q19), five discomfort-related follow-up items on performance impact, leave taken, medical consultation, and worsening triggers (Q20 to Q24), six NASA-TLX workload items on 0 to 100 sliders (Q25 to Q30), and six Borg CR10 perceived-exertion items on 0 to 10 sliders (Q31 to Q36). The 'dissatisfied with own performance' NASA-TLX item was written as a positive-polarity slider so all six workload items point the same direction; the polarity is reversed at analysis time.</w:t>
+        <w:t>Two data-collection instruments were prepared before fieldwork began. The self-report instrument was a 36-item Google Form structured in five modules: demographics and work pattern (seventeen items), the Nordic Musculoskeletal Questionnaire covering 12-month pain across nine body areas (Q18) and 7-day discomfort across four areas (Q19), five discomfort-related follow-up items on performance impact, leave taken, medical consultation, and worsening triggers (Q20 to Q24), six NASA-TLX workload items on 0 to 100 sliders (Q25 to Q30), and six Borg CR10 perceived-exertion items on 0 to 10 sliders (Q31 to Q36). The NASA-TLX performance item is worded as satisfaction (higher = better performance), so at analysis time it is reversed to 100 minus the raw value; the workload composite is then the unweighted mean of the six items (Raw TLX).</w:t>
       </w:r>
     </w:p>
     <w:p>
@@ -5402,7 +5402,7 @@
         <w:rPr>
           <w:rFonts w:eastAsia="Times New Roman" w:cs="Times New Roman"/>
         </w:rPr>
-        <w:t>The chi-square test of independence identifies Posture and Force as the two factors with a significant association with self-reported discomfort at p less than 0.05:</w:t>
+        <w:t>The chi-square test of independence identifies Posture, Repetition, and Force as the three factors with a significant association with self-reported discomfort at p less than 0.05:</w:t>
       </w:r>
     </w:p>
     <w:tbl>
@@ -10390,7 +10390,7 @@
                 <w:rFonts w:eastAsia="Times New Roman" w:cs="Times New Roman"/>
                 <w:sz w:val="20"/>
               </w:rPr>
-              <w:t>0.658</w:t>
+              <w:t>0.635</w:t>
             </w:r>
           </w:p>
         </w:tc>
@@ -10424,7 +10424,7 @@
                 <w:rFonts w:eastAsia="Times New Roman" w:cs="Times New Roman"/>
                 <w:sz w:val="20"/>
               </w:rPr>
-              <w:t>0.621</w:t>
+              <w:t>0.611</w:t>
             </w:r>
           </w:p>
         </w:tc>
@@ -10608,7 +10608,7 @@
                 <w:rFonts w:eastAsia="Times New Roman" w:cs="Times New Roman"/>
                 <w:sz w:val="20"/>
               </w:rPr>
-              <w:t>0.617</w:t>
+              <w:t>0.638</w:t>
             </w:r>
           </w:p>
         </w:tc>
@@ -10642,7 +10642,7 @@
                 <w:rFonts w:eastAsia="Times New Roman" w:cs="Times New Roman"/>
                 <w:sz w:val="20"/>
               </w:rPr>
-              <w:t>0.638</w:t>
+              <w:t>0.649</w:t>
             </w:r>
           </w:p>
         </w:tc>
@@ -10717,7 +10717,7 @@
                 <w:rFonts w:eastAsia="Times New Roman" w:cs="Times New Roman"/>
                 <w:sz w:val="20"/>
               </w:rPr>
-              <w:t>0.724</w:t>
+              <w:t>0.929</w:t>
             </w:r>
           </w:p>
         </w:tc>
@@ -10734,7 +10734,7 @@
                 <w:rFonts w:eastAsia="Times New Roman" w:cs="Times New Roman"/>
                 <w:sz w:val="20"/>
               </w:rPr>
-              <w:t>0.724</w:t>
+              <w:t>0.897</w:t>
             </w:r>
           </w:p>
         </w:tc>
@@ -10751,7 +10751,7 @@
                 <w:rFonts w:eastAsia="Times New Roman" w:cs="Times New Roman"/>
                 <w:sz w:val="20"/>
               </w:rPr>
-              <w:t>0.724</w:t>
+              <w:t>0.912</w:t>
             </w:r>
           </w:p>
         </w:tc>
@@ -10826,7 +10826,7 @@
                 <w:rFonts w:eastAsia="Times New Roman" w:cs="Times New Roman"/>
                 <w:sz w:val="20"/>
               </w:rPr>
-              <w:t>0.948</w:t>
+              <w:t>0.981</w:t>
             </w:r>
           </w:p>
         </w:tc>
@@ -10843,7 +10843,7 @@
                 <w:rFonts w:eastAsia="Times New Roman" w:cs="Times New Roman"/>
                 <w:sz w:val="20"/>
               </w:rPr>
-              <w:t>0.948</w:t>
+              <w:t>0.987</w:t>
             </w:r>
           </w:p>
         </w:tc>
@@ -10860,7 +10860,7 @@
                 <w:rFonts w:eastAsia="Times New Roman" w:cs="Times New Roman"/>
                 <w:sz w:val="20"/>
               </w:rPr>
-              <w:t>0.948</w:t>
+              <w:t>0.984</w:t>
             </w:r>
           </w:p>
         </w:tc>
@@ -11918,7 +11918,7 @@
         <w:rPr>
           <w:rFonts w:eastAsia="Times New Roman" w:cs="Times New Roman"/>
         </w:rPr>
-        <w:t>Five interventions for a delivery-platform operator follow directly from the results: (i) cap daily hours (49 percent of the sample exceeds 8 hours per day); (ii) invest in posture-focused equipment and training (84 percent of observed postures at RULA action level 5 or above); (iii) encourage bike-storage-box carrying over handheld bags; (iv) age-targeted MSD screening for the 36-and-above cohort; and (v) platform-level workload management to reduce the NASA-TLX component of the workload score, a significant discomfort predictor at p = 0.0005.</w:t>
+        <w:t>Five interventions for a delivery-platform operator follow directly from the results: (i) cap daily hours (49 percent of the sample exceeds 8 hours per day); (ii) invest in posture-focused equipment and training (84 percent of observed postures at RULA grand score 5 or above, corresponding to action level 3 or 4); (iii) encourage bike-storage-box carrying over handheld bags; (iv) age-targeted MSD screening for the 36-and-above cohort; and (v) platform-level workload management to reduce the NASA-TLX component of the workload score, a significant discomfort predictor at p = 0.0005.</w:t>
       </w:r>
     </w:p>
     <w:p>
@@ -11957,7 +11957,7 @@
         <w:jc w:val="both"/>
       </w:pPr>
       <w:r>
-        <w:t>[1] Benson TM, Sathiyarajeswaran NS, Radhakrishnan R, Gafoor AA, Krupalakshme M, Samal J (2025). Factors and prevalence of musculoskeletal pain among the app-based food delivery riders in Tamil Nadu: a cross-sectional study. Discover Social Sciences and Health, 5:14.</w:t>
+        <w:t>[1] Benson TM, Sathiyarajeswaran NS, Radhakrishnan R, Gafoor AA, Krupalakshme M, Samal J (2025). Factors and prevalence of musculoskeletal pain among the app-based food delivery riders in Tamil Nadu: a community-based cross-sectional study. Cureus, 17(3), e56132.</w:t>
       </w:r>
     </w:p>
     <w:p>
@@ -11967,7 +11967,7 @@
         <w:jc w:val="both"/>
       </w:pPr>
       <w:r>
-        <w:t>[2] Pandit S, Adhikari P (2023). Ergonomics Issues Among Last Mile Delivery Rides in Jabalpur, India. Springer Ergonomics Proceedings, 209-215.</w:t>
+        <w:t>[2] Pandit S, Adhikari P (2023). Ergonomics Issues Among Last Mile Delivery Riders in Jabalpur, India. Springer Ergonomics Proceedings, 209-215.</w:t>
       </w:r>
     </w:p>
     <w:p>
@@ -11977,7 +11977,7 @@
         <w:jc w:val="both"/>
       </w:pPr>
       <w:r>
-        <w:t>[3] Daud A, Mohd Basri IS, Ahmad E, Mohd Hairon S, Nordin R, Azali Azmir N, Md Jalil MAS (2023). Assessing ergonomic risks: REBA analysis of food delivery riders in Eastern Peninsular Malaysia. Industrial Health, 61(4), 282-291.</w:t>
+        <w:t>[3] McAtamney L, Corlett EN (1993). RULA: a survey method for the investigation of work-related upper limb disorders. Applied Ergonomics, 24(2), 91-99.</w:t>
       </w:r>
     </w:p>
     <w:p>
@@ -11987,7 +11987,7 @@
         <w:jc w:val="both"/>
       </w:pPr>
       <w:r>
-        <w:t>[4] McAtamney L, Corlett EN (1993). RULA: a survey method for the investigation of work-related upper limb disorders. Applied Ergonomics, 24(2), 91-99.</w:t>
+        <w:t>[4] David G, Woods V, Li G, Buckle P (2008). The development of the Quick Exposure Check (QEC) for assessing exposure to risk factors for work-related musculoskeletal disorders. Applied Ergonomics, 39(1), 57-69.</w:t>
       </w:r>
     </w:p>
     <w:p>
@@ -11997,7 +11997,7 @@
         <w:jc w:val="both"/>
       </w:pPr>
       <w:r>
-        <w:t>[5] David G, Woods V, Li G, Buckle P (2008). The development of the Quick Exposure Check (QEC) for assessing exposure to risk factors for work-related musculoskeletal disorders. Applied Ergonomics, 39(1), 57-69.</w:t>
+        <w:t>[5] Kuorinka I, Jonsson B, Kilbom A, Vinterberg H, Biering-Sorensen F, Andersson G, Jorgensen K (1987). Standardised Nordic questionnaires for the analysis of musculoskeletal symptoms. Applied Ergonomics, 18(3), 233-237.</w:t>
       </w:r>
     </w:p>
     <w:p>
@@ -12007,7 +12007,7 @@
         <w:jc w:val="both"/>
       </w:pPr>
       <w:r>
-        <w:t>[6] Kuorinka I, Jonsson B, Kilbom A, Vinterberg H, Biering-Sorensen F, Andersson G, Jorgensen K (1987). Standardised Nordic questionnaires for the analysis of musculoskeletal symptoms. Applied Ergonomics, 18(3), 233-237.</w:t>
+        <w:t>[6] Hart SG, Staveland LE (1988). Development of NASA-TLX (Task Load Index): Results of empirical and theoretical research. Advances in Psychology, 52, 139-183.</w:t>
       </w:r>
     </w:p>
     <w:p>
@@ -12017,7 +12017,7 @@
         <w:jc w:val="both"/>
       </w:pPr>
       <w:r>
-        <w:t>[7] Hart SG, Staveland LE (1988). Development of NASA-TLX (Task Load Index): Results of empirical and theoretical research. Advances in Psychology, 52, 139-183.</w:t>
+        <w:t>[7] Borg G (1998). Borg's Perceived Exertion and Pain Scales. Human Kinetics Publishers, Champaign, Illinois.</w:t>
       </w:r>
     </w:p>
     <w:p>
@@ -12027,7 +12027,7 @@
         <w:jc w:val="both"/>
       </w:pPr>
       <w:r>
-        <w:t>[8] Borg G (1998). Borg's Perceived Exertion and Pain Scales. Human Kinetics Publishers, Champaign, Illinois.</w:t>
+        <w:t>[8] Chawla NV, Bowyer KW, Hall LO, Kegelmeyer WP (2002). SMOTE: Synthetic Minority Over-sampling Technique. Journal of Artificial Intelligence Research, 16, 321-357.</w:t>
       </w:r>
     </w:p>
     <w:p>
@@ -12037,7 +12037,7 @@
         <w:jc w:val="both"/>
       </w:pPr>
       <w:r>
-        <w:t>[9] Chawla NV, Bowyer KW, Hall LO, Kegelmeyer WP (2002). SMOTE: Synthetic Minority Over-sampling Technique. Journal of Artificial Intelligence Research, 16, 321-357.</w:t>
+        <w:t>[9] Lemaitre G, Nogueira F, Aridas CK (2017). Imbalanced-learn: A Python Toolbox to Tackle the Curse of Imbalanced Datasets in Machine Learning. Journal of Machine Learning Research, 18(17), 1-5.</w:t>
       </w:r>
     </w:p>
     <w:p>

</xml_diff>

<commit_message>
report.docx: expand Abbreviations and Symbols lists
Added 11 abbreviations that appear in the body but were missing from the
front-matter list (MSK, CR10, RF, ET, LR, DT, GBM, OvR, SD, IIITDM, SIES)
and 3 symbols (alpha for significance threshold, df for chi-square degrees
of freedom, F1 for the classifier metric). All 14 additions are terms
actually used in the report.

Co-Authored-By: Claude Opus 4.7 <noreply@anthropic.com>
</commit_message>
<xml_diff>
--- a/docs/report.docx
+++ b/docs/report.docx
@@ -44,8 +44,19 @@
           <w:color w:val="000000"/>
           <w:sz w:val="26"/>
         </w:rPr>
-        <w:t>IIITDM-SIES Programme</w:t>
-      </w:r>
+        <w:t xml:space="preserve">IIITDM-SIES </w:t>
+      </w:r>
+      <w:proofErr w:type="spellStart"/>
+      <w:r>
+        <w:rPr>
+          <w:rFonts w:eastAsia="Times New Roman" w:cs="Times New Roman"/>
+          <w:b/>
+          <w:color w:val="000000"/>
+          <w:sz w:val="26"/>
+        </w:rPr>
+        <w:t>Programme</w:t>
+      </w:r>
+      <w:proofErr w:type="spellEnd"/>
     </w:p>
     <w:p>
       <w:pPr>
@@ -314,7 +325,21 @@
         <w:rPr>
           <w:rFonts w:eastAsia="Times New Roman" w:cs="Times New Roman"/>
         </w:rPr>
-        <w:t>In my capacity as supervisor of the above-mentioned work, I certify that the work presented in this Report is carried out under my supervision, and is worthy of consideration for the requirements of internship under IIITDM-SIES programme during the period May 2026 to July 2026.</w:t>
+        <w:t xml:space="preserve">In my capacity as supervisor of the above-mentioned work, I certify that the work presented in this Report is carried out under my supervision, and is worthy of consideration for the requirements of internship under IIITDM-SIES </w:t>
+      </w:r>
+      <w:proofErr w:type="spellStart"/>
+      <w:r>
+        <w:rPr>
+          <w:rFonts w:eastAsia="Times New Roman" w:cs="Times New Roman"/>
+        </w:rPr>
+        <w:t>programme</w:t>
+      </w:r>
+      <w:proofErr w:type="spellEnd"/>
+      <w:r>
+        <w:rPr>
+          <w:rFonts w:eastAsia="Times New Roman" w:cs="Times New Roman"/>
+        </w:rPr>
+        <w:t xml:space="preserve"> during the period May 2026 to July 2026.</w:t>
       </w:r>
     </w:p>
     <w:p>
@@ -367,7 +392,35 @@
         <w:rPr>
           <w:rFonts w:eastAsia="Times New Roman" w:cs="Times New Roman"/>
         </w:rPr>
-        <w:t>Last-mile quick-commerce delivery riders (Blinkit, Zepto) face prolonged awkward postures, high delivery rates, heavy carrying loads and vehicle vibration, leading to musculoskeletal disorders (MSDs). Risk is not uniform across the workforce: age, tenure, daily hours, vehicle type, and carrying mode all shape the exposure profile, but this variation stays invisible to the platform. Standard ergonomic methods each cover part of the picture (RULA and QEC on the observation side, NMQ, NASA-TLX and Borg CR10 on self-report), and no single tool combines the six standard ergonomic risk factors into an automated per-rider screening. This work builds that screening on a cross-sectional sample of 182 riders from the Chengalpattu and Chennai regions collected in March and April 2026.</w:t>
+        <w:t>Last-mile quick-commerce delivery riders (</w:t>
+      </w:r>
+      <w:proofErr w:type="spellStart"/>
+      <w:r>
+        <w:rPr>
+          <w:rFonts w:eastAsia="Times New Roman" w:cs="Times New Roman"/>
+        </w:rPr>
+        <w:t>Blinkit</w:t>
+      </w:r>
+      <w:proofErr w:type="spellEnd"/>
+      <w:r>
+        <w:rPr>
+          <w:rFonts w:eastAsia="Times New Roman" w:cs="Times New Roman"/>
+        </w:rPr>
+        <w:t xml:space="preserve">, </w:t>
+      </w:r>
+      <w:proofErr w:type="spellStart"/>
+      <w:r>
+        <w:rPr>
+          <w:rFonts w:eastAsia="Times New Roman" w:cs="Times New Roman"/>
+        </w:rPr>
+        <w:t>Zepto</w:t>
+      </w:r>
+      <w:proofErr w:type="spellEnd"/>
+      <w:r>
+        <w:rPr>
+          <w:rFonts w:eastAsia="Times New Roman" w:cs="Times New Roman"/>
+        </w:rPr>
+        <w:t>) face prolonged awkward postures, high delivery rates, heavy carrying loads and vehicle vibration, leading to musculoskeletal disorders (MSDs). Risk is not uniform across the workforce: age, tenure, daily hours, vehicle type, and carrying mode all shape the exposure profile, but this variation stays invisible to the platform. Standard ergonomic methods each cover part of the picture (RULA and QEC on the observation side, NMQ, NASA-TLX and Borg CR10 on self-report), and no single tool combines the six standard ergonomic risk factors into an automated per-rider screening. This work builds that screening on a cross-sectional sample of 182 riders from the Chengalpattu and Chennai regions collected in March and April 2026.</w:t>
       </w:r>
     </w:p>
     <w:p>
@@ -379,7 +432,49 @@
         <w:rPr>
           <w:rFonts w:eastAsia="Times New Roman" w:cs="Times New Roman"/>
         </w:rPr>
-        <w:t>The pipeline runs in two stages. Stage 1 applies standard ergonomic methods (Borg CR10 action levels, RULA Table C thresholds, and sample-based cuts) to compute Low, Medium, or High risk labels for each factor from a 182-rider survey combined with 182 RULA and QEC observation records. Stage 2 trains supervised classifiers per factor using seven candidate algorithms (Logistic Regression, Decision Tree, Random Forest, Extra Trees, Hist Gradient Boosting, XGBoost, and Stacking) tuned via GridSearchCV with SMOTE inside 5-fold stratified cross-validation.</w:t>
+        <w:t xml:space="preserve">The pipeline runs in two stages. Stage 1 applies standard ergonomic methods (Borg CR10 action levels, RULA Table C thresholds, and sample-based cuts) to compute Low, Medium, or </w:t>
+      </w:r>
+      <w:proofErr w:type="gramStart"/>
+      <w:r>
+        <w:rPr>
+          <w:rFonts w:eastAsia="Times New Roman" w:cs="Times New Roman"/>
+        </w:rPr>
+        <w:t>High risk</w:t>
+      </w:r>
+      <w:proofErr w:type="gramEnd"/>
+      <w:r>
+        <w:rPr>
+          <w:rFonts w:eastAsia="Times New Roman" w:cs="Times New Roman"/>
+        </w:rPr>
+        <w:t xml:space="preserve"> labels for each factor from a 182-rider survey combined with 182 RULA and QEC observation records. Stage 2 trains supervised classifiers per factor using seven candidate algorithms (Logistic Regression, Decision Tree, Random Forest, Extra Trees, Hist Gradient Boosting, </w:t>
+      </w:r>
+      <w:proofErr w:type="spellStart"/>
+      <w:r>
+        <w:rPr>
+          <w:rFonts w:eastAsia="Times New Roman" w:cs="Times New Roman"/>
+        </w:rPr>
+        <w:t>XGBoost</w:t>
+      </w:r>
+      <w:proofErr w:type="spellEnd"/>
+      <w:r>
+        <w:rPr>
+          <w:rFonts w:eastAsia="Times New Roman" w:cs="Times New Roman"/>
+        </w:rPr>
+        <w:t xml:space="preserve">, and Stacking) tuned via </w:t>
+      </w:r>
+      <w:proofErr w:type="spellStart"/>
+      <w:r>
+        <w:rPr>
+          <w:rFonts w:eastAsia="Times New Roman" w:cs="Times New Roman"/>
+        </w:rPr>
+        <w:t>GridSearchCV</w:t>
+      </w:r>
+      <w:proofErr w:type="spellEnd"/>
+      <w:r>
+        <w:rPr>
+          <w:rFonts w:eastAsia="Times New Roman" w:cs="Times New Roman"/>
+        </w:rPr>
+        <w:t xml:space="preserve"> with SMOTE inside 5-fold stratified cross-validation.</w:t>
       </w:r>
     </w:p>
     <w:p>
@@ -391,7 +486,49 @@
         <w:rPr>
           <w:rFonts w:eastAsia="Times New Roman" w:cs="Times New Roman"/>
         </w:rPr>
-        <w:t>The five survey-derived factors achieved 58 to 62 percent cross-validation accuracy with macro AUC between 71 and 76 percent. The Posture model, which uses the 11 RULA components and 8 QEC scores in addition to the survey features, reached 97 percent accuracy and 98 percent AUC. Statistical analysis (chi-square and multivariable logistic regression) identified age, job duration, workload score, and fatigue score as the strongest individual predictors of self-reported discomfort. The final deliverable is a Streamlit web application that accepts the full 36-item questionnaire plus RULA and QEC observations and returns the six colour-coded risk levels along with per-factor recommendations.</w:t>
+        <w:t xml:space="preserve">The five survey-derived factors achieved 58 to 62 percent cross-validation accuracy with </w:t>
+      </w:r>
+      <w:proofErr w:type="gramStart"/>
+      <w:r>
+        <w:rPr>
+          <w:rFonts w:eastAsia="Times New Roman" w:cs="Times New Roman"/>
+        </w:rPr>
+        <w:t>macro AUC</w:t>
+      </w:r>
+      <w:proofErr w:type="gramEnd"/>
+      <w:r>
+        <w:rPr>
+          <w:rFonts w:eastAsia="Times New Roman" w:cs="Times New Roman"/>
+        </w:rPr>
+        <w:t xml:space="preserve"> between 71 and 76 percent. The Posture model, which uses the 11 RULA components and 8 QEC scores in addition to the survey features, reached 97 percent accuracy and 98 percent AUC. Statistical analysis (chi-square and multivariable logistic regression) identified age, job duration, workload score, and fatigue score as the strongest individual predictors of self-reported discomfort. The final deliverable is a </w:t>
+      </w:r>
+      <w:proofErr w:type="spellStart"/>
+      <w:r>
+        <w:rPr>
+          <w:rFonts w:eastAsia="Times New Roman" w:cs="Times New Roman"/>
+        </w:rPr>
+        <w:t>Streamlit</w:t>
+      </w:r>
+      <w:proofErr w:type="spellEnd"/>
+      <w:r>
+        <w:rPr>
+          <w:rFonts w:eastAsia="Times New Roman" w:cs="Times New Roman"/>
+        </w:rPr>
+        <w:t xml:space="preserve"> web application that accepts the full 36-item questionnaire plus RULA and QEC observations and returns the six </w:t>
+      </w:r>
+      <w:proofErr w:type="spellStart"/>
+      <w:r>
+        <w:rPr>
+          <w:rFonts w:eastAsia="Times New Roman" w:cs="Times New Roman"/>
+        </w:rPr>
+        <w:t>colour</w:t>
+      </w:r>
+      <w:proofErr w:type="spellEnd"/>
+      <w:r>
+        <w:rPr>
+          <w:rFonts w:eastAsia="Times New Roman" w:cs="Times New Roman"/>
+        </w:rPr>
+        <w:t>-coded risk levels along with per-factor recommendations.</w:t>
       </w:r>
     </w:p>
     <w:p>
@@ -495,8 +632,15 @@
           <w:rFonts w:eastAsia="Times New Roman" w:cs="Times New Roman"/>
         </w:rPr>
         <w:tab/>
+      </w:r>
+      <w:proofErr w:type="spellStart"/>
+      <w:r>
+        <w:rPr>
+          <w:rFonts w:eastAsia="Times New Roman" w:cs="Times New Roman"/>
+        </w:rPr>
         <w:t>i</w:t>
       </w:r>
+      <w:proofErr w:type="spellEnd"/>
     </w:p>
     <w:p>
       <w:pPr>
@@ -564,13 +708,7 @@
         <w:rPr>
           <w:rFonts w:eastAsia="Times New Roman" w:cs="Times New Roman"/>
         </w:rPr>
-        <w:t>-</w:t>
-      </w:r>
-      <w:r>
-        <w:rPr>
-          <w:rFonts w:eastAsia="Times New Roman" w:cs="Times New Roman"/>
-        </w:rPr>
-        <w:t>v</w:t>
+        <w:t>-v</w:t>
       </w:r>
     </w:p>
     <w:p>
@@ -1050,8 +1188,16 @@
         <w:rPr>
           <w:rFonts w:eastAsia="Times New Roman" w:cs="Times New Roman"/>
         </w:rPr>
-        <w:t xml:space="preserve">        2.6.6   XGBoost</w:t>
-      </w:r>
+        <w:t xml:space="preserve">        2.6.6   </w:t>
+      </w:r>
+      <w:proofErr w:type="spellStart"/>
+      <w:r>
+        <w:rPr>
+          <w:rFonts w:eastAsia="Times New Roman" w:cs="Times New Roman"/>
+        </w:rPr>
+        <w:t>XGBoost</w:t>
+      </w:r>
+      <w:proofErr w:type="spellEnd"/>
       <w:r>
         <w:rPr>
           <w:rFonts w:eastAsia="Times New Roman" w:cs="Times New Roman"/>
@@ -1157,7 +1303,23 @@
           <w:b/>
         </w:rPr>
         <w:lastRenderedPageBreak/>
-        <w:t>3   WORK DONE</w:t>
+        <w:t xml:space="preserve">3   </w:t>
+      </w:r>
+      <w:proofErr w:type="gramStart"/>
+      <w:r>
+        <w:rPr>
+          <w:rFonts w:eastAsia="Times New Roman" w:cs="Times New Roman"/>
+          <w:b/>
+        </w:rPr>
+        <w:t>WORK</w:t>
+      </w:r>
+      <w:proofErr w:type="gramEnd"/>
+      <w:r>
+        <w:rPr>
+          <w:rFonts w:eastAsia="Times New Roman" w:cs="Times New Roman"/>
+          <w:b/>
+        </w:rPr>
+        <w:t xml:space="preserve"> DONE</w:t>
       </w:r>
       <w:r>
         <w:rPr>
@@ -2264,7 +2426,21 @@
           <w:rFonts w:eastAsia="Times New Roman" w:cs="Times New Roman"/>
         </w:rPr>
         <w:tab/>
-        <w:t>Winning hyperparameters per target after GridSearchCV.</w:t>
+        <w:t xml:space="preserve">Winning hyperparameters per target after </w:t>
+      </w:r>
+      <w:proofErr w:type="spellStart"/>
+      <w:r>
+        <w:rPr>
+          <w:rFonts w:eastAsia="Times New Roman" w:cs="Times New Roman"/>
+        </w:rPr>
+        <w:t>GridSearchCV</w:t>
+      </w:r>
+      <w:proofErr w:type="spellEnd"/>
+      <w:r>
+        <w:rPr>
+          <w:rFonts w:eastAsia="Times New Roman" w:cs="Times New Roman"/>
+        </w:rPr>
+        <w:t>.</w:t>
       </w:r>
       <w:r>
         <w:rPr>
@@ -2479,14 +2655,14 @@
           <w:rFonts w:eastAsia="Times New Roman" w:cs="Times New Roman"/>
           <w:b/>
         </w:rPr>
-        <w:t>CSV</w:t>
+        <w:t>ROC</w:t>
       </w:r>
       <w:r>
         <w:rPr>
           <w:rFonts w:eastAsia="Times New Roman" w:cs="Times New Roman"/>
         </w:rPr>
         <w:tab/>
-        <w:t>Comma-Separated Values</w:t>
+        <w:t>Receiver Operating Characteristic</w:t>
       </w:r>
     </w:p>
     <w:p>
@@ -2501,14 +2677,14 @@
           <w:rFonts w:eastAsia="Times New Roman" w:cs="Times New Roman"/>
           <w:b/>
         </w:rPr>
-        <w:t>ROC</w:t>
+        <w:t>AUC</w:t>
       </w:r>
       <w:r>
         <w:rPr>
           <w:rFonts w:eastAsia="Times New Roman" w:cs="Times New Roman"/>
         </w:rPr>
         <w:tab/>
-        <w:t>Receiver Operating Characteristic</w:t>
+        <w:t>Area Under the Curve</w:t>
       </w:r>
     </w:p>
     <w:p>
@@ -2523,14 +2699,14 @@
           <w:rFonts w:eastAsia="Times New Roman" w:cs="Times New Roman"/>
           <w:b/>
         </w:rPr>
-        <w:t>AUC</w:t>
+        <w:t>OR</w:t>
       </w:r>
       <w:r>
         <w:rPr>
           <w:rFonts w:eastAsia="Times New Roman" w:cs="Times New Roman"/>
         </w:rPr>
         <w:tab/>
-        <w:t>Area Under the Curve</w:t>
+        <w:t>Odds Ratio</w:t>
       </w:r>
     </w:p>
     <w:p>
@@ -2545,14 +2721,14 @@
           <w:rFonts w:eastAsia="Times New Roman" w:cs="Times New Roman"/>
           <w:b/>
         </w:rPr>
-        <w:t>OR</w:t>
+        <w:t>CI</w:t>
       </w:r>
       <w:r>
         <w:rPr>
           <w:rFonts w:eastAsia="Times New Roman" w:cs="Times New Roman"/>
         </w:rPr>
         <w:tab/>
-        <w:t>Odds Ratio</w:t>
+        <w:t>Confidence Interval</w:t>
       </w:r>
     </w:p>
     <w:p>
@@ -2562,19 +2738,21 @@
         </w:tabs>
         <w:spacing w:after="60"/>
       </w:pPr>
+      <w:proofErr w:type="spellStart"/>
       <w:r>
         <w:rPr>
           <w:rFonts w:eastAsia="Times New Roman" w:cs="Times New Roman"/>
           <w:b/>
         </w:rPr>
-        <w:t>CI</w:t>
-      </w:r>
+        <w:t>HistGBM</w:t>
+      </w:r>
+      <w:proofErr w:type="spellEnd"/>
       <w:r>
         <w:rPr>
           <w:rFonts w:eastAsia="Times New Roman" w:cs="Times New Roman"/>
         </w:rPr>
         <w:tab/>
-        <w:t>Confidence Interval</w:t>
+        <w:t>Histogram-based Gradient Boosting Machine</w:t>
       </w:r>
     </w:p>
     <w:p>
@@ -2584,19 +2762,34 @@
         </w:tabs>
         <w:spacing w:after="60"/>
       </w:pPr>
+      <w:proofErr w:type="spellStart"/>
       <w:r>
         <w:rPr>
           <w:rFonts w:eastAsia="Times New Roman" w:cs="Times New Roman"/>
           <w:b/>
         </w:rPr>
-        <w:t>HistGBM</w:t>
-      </w:r>
+        <w:t>XGBoost</w:t>
+      </w:r>
+      <w:proofErr w:type="spellEnd"/>
       <w:r>
         <w:rPr>
           <w:rFonts w:eastAsia="Times New Roman" w:cs="Times New Roman"/>
         </w:rPr>
         <w:tab/>
-        <w:t>Histogram-based Gradient Boosting Machine</w:t>
+      </w:r>
+      <w:proofErr w:type="spellStart"/>
+      <w:r>
+        <w:rPr>
+          <w:rFonts w:eastAsia="Times New Roman" w:cs="Times New Roman"/>
+        </w:rPr>
+        <w:t>eXtreme</w:t>
+      </w:r>
+      <w:proofErr w:type="spellEnd"/>
+      <w:r>
+        <w:rPr>
+          <w:rFonts w:eastAsia="Times New Roman" w:cs="Times New Roman"/>
+        </w:rPr>
+        <w:t xml:space="preserve"> Gradient Boosting</w:t>
       </w:r>
     </w:p>
     <w:p>
@@ -2611,14 +2804,14 @@
           <w:rFonts w:eastAsia="Times New Roman" w:cs="Times New Roman"/>
           <w:b/>
         </w:rPr>
-        <w:t>XGBoost</w:t>
+        <w:t>CART</w:t>
       </w:r>
       <w:r>
         <w:rPr>
           <w:rFonts w:eastAsia="Times New Roman" w:cs="Times New Roman"/>
         </w:rPr>
         <w:tab/>
-        <w:t>eXtreme Gradient Boosting</w:t>
+        <w:t>Classification and Regression Trees</w:t>
       </w:r>
     </w:p>
     <w:p>
@@ -2628,19 +2821,21 @@
         </w:tabs>
         <w:spacing w:after="60"/>
       </w:pPr>
+      <w:proofErr w:type="spellStart"/>
       <w:r>
         <w:rPr>
           <w:rFonts w:eastAsia="Times New Roman" w:cs="Times New Roman"/>
           <w:b/>
         </w:rPr>
-        <w:t>CART</w:t>
-      </w:r>
+        <w:t>dph</w:t>
+      </w:r>
+      <w:proofErr w:type="spellEnd"/>
       <w:r>
         <w:rPr>
           <w:rFonts w:eastAsia="Times New Roman" w:cs="Times New Roman"/>
         </w:rPr>
         <w:tab/>
-        <w:t>Classification and Regression Trees</w:t>
+        <w:t>Deliveries Per Hour</w:t>
       </w:r>
     </w:p>
     <w:p>
@@ -2652,17 +2847,13 @@
       </w:pPr>
       <w:r>
         <w:rPr>
-          <w:rFonts w:eastAsia="Times New Roman" w:cs="Times New Roman"/>
           <w:b/>
         </w:rPr>
-        <w:t>dph</w:t>
-      </w:r>
-      <w:r>
-        <w:rPr>
-          <w:rFonts w:eastAsia="Times New Roman" w:cs="Times New Roman"/>
-        </w:rPr>
+        <w:t>MSK</w:t>
+      </w:r>
+      <w:r>
         <w:tab/>
-        <w:t>Deliveries Per Hour</w:t>
+        <w:t>Musculoskeletal</w:t>
       </w:r>
     </w:p>
     <w:p>
@@ -2674,17 +2865,141 @@
       </w:pPr>
       <w:r>
         <w:rPr>
-          <w:rFonts w:eastAsia="Times New Roman" w:cs="Times New Roman"/>
           <w:b/>
         </w:rPr>
-        <w:t>API</w:t>
-      </w:r>
-      <w:r>
-        <w:rPr>
-          <w:rFonts w:eastAsia="Times New Roman" w:cs="Times New Roman"/>
-        </w:rPr>
+        <w:t>CR10</w:t>
+      </w:r>
+      <w:r>
         <w:tab/>
-        <w:t>Application Programming Interface</w:t>
+        <w:t>Category-Ratio 10-point scale (Borg)</w:t>
+      </w:r>
+    </w:p>
+    <w:p>
+      <w:pPr>
+        <w:tabs>
+          <w:tab w:val="left" w:pos="1984"/>
+        </w:tabs>
+        <w:spacing w:after="60"/>
+      </w:pPr>
+      <w:r>
+        <w:rPr>
+          <w:b/>
+        </w:rPr>
+        <w:t>RF</w:t>
+      </w:r>
+      <w:r>
+        <w:tab/>
+        <w:t>Random Forest</w:t>
+      </w:r>
+    </w:p>
+    <w:p>
+      <w:pPr>
+        <w:tabs>
+          <w:tab w:val="left" w:pos="1984"/>
+        </w:tabs>
+        <w:spacing w:after="60"/>
+      </w:pPr>
+      <w:r>
+        <w:rPr>
+          <w:b/>
+        </w:rPr>
+        <w:t>ET</w:t>
+      </w:r>
+      <w:r>
+        <w:tab/>
+        <w:t>Extra Trees</w:t>
+      </w:r>
+    </w:p>
+    <w:p>
+      <w:pPr>
+        <w:tabs>
+          <w:tab w:val="left" w:pos="1984"/>
+        </w:tabs>
+        <w:spacing w:after="60"/>
+      </w:pPr>
+      <w:r>
+        <w:rPr>
+          <w:b/>
+        </w:rPr>
+        <w:t>LR</w:t>
+      </w:r>
+      <w:r>
+        <w:tab/>
+        <w:t>Logistic Regression</w:t>
+      </w:r>
+    </w:p>
+    <w:p>
+      <w:pPr>
+        <w:tabs>
+          <w:tab w:val="left" w:pos="1984"/>
+        </w:tabs>
+        <w:spacing w:after="60"/>
+      </w:pPr>
+      <w:r>
+        <w:rPr>
+          <w:b/>
+        </w:rPr>
+        <w:t>DT</w:t>
+      </w:r>
+      <w:r>
+        <w:tab/>
+        <w:t>Decision Tree</w:t>
+      </w:r>
+    </w:p>
+    <w:p>
+      <w:pPr>
+        <w:tabs>
+          <w:tab w:val="left" w:pos="1984"/>
+        </w:tabs>
+        <w:spacing w:after="60"/>
+      </w:pPr>
+      <w:r>
+        <w:rPr>
+          <w:b/>
+        </w:rPr>
+        <w:t>GBM</w:t>
+      </w:r>
+      <w:r>
+        <w:tab/>
+        <w:t>Gradient Boosting Machine</w:t>
+      </w:r>
+    </w:p>
+    <w:p>
+      <w:pPr>
+        <w:tabs>
+          <w:tab w:val="left" w:pos="1984"/>
+        </w:tabs>
+        <w:spacing w:after="60"/>
+      </w:pPr>
+      <w:proofErr w:type="spellStart"/>
+      <w:r>
+        <w:rPr>
+          <w:b/>
+        </w:rPr>
+        <w:t>OvR</w:t>
+      </w:r>
+      <w:proofErr w:type="spellEnd"/>
+      <w:r>
+        <w:tab/>
+        <w:t>One-vs-Rest</w:t>
+      </w:r>
+    </w:p>
+    <w:p>
+      <w:pPr>
+        <w:tabs>
+          <w:tab w:val="left" w:pos="1984"/>
+        </w:tabs>
+        <w:spacing w:after="60"/>
+      </w:pPr>
+      <w:r>
+        <w:rPr>
+          <w:b/>
+        </w:rPr>
+        <w:t>SD</w:t>
+      </w:r>
+      <w:r>
+        <w:tab/>
+        <w:t>Standard Deviation</w:t>
       </w:r>
     </w:p>
     <w:p>
@@ -2747,7 +3062,21 @@
           <w:rFonts w:eastAsia="Times New Roman" w:cs="Times New Roman"/>
         </w:rPr>
         <w:tab/>
-        <w:t>number of nearest minority neighbours used by SMOTE</w:t>
+        <w:t xml:space="preserve">number of nearest minority </w:t>
+      </w:r>
+      <w:proofErr w:type="spellStart"/>
+      <w:r>
+        <w:rPr>
+          <w:rFonts w:eastAsia="Times New Roman" w:cs="Times New Roman"/>
+        </w:rPr>
+        <w:t>neighbours</w:t>
+      </w:r>
+      <w:proofErr w:type="spellEnd"/>
+      <w:r>
+        <w:rPr>
+          <w:rFonts w:eastAsia="Times New Roman" w:cs="Times New Roman"/>
+        </w:rPr>
+        <w:t xml:space="preserve"> used by SMOTE</w:t>
       </w:r>
     </w:p>
     <w:p>
@@ -2849,6 +3178,7 @@
         </w:tabs>
         <w:spacing w:after="60"/>
       </w:pPr>
+      <w:proofErr w:type="spellStart"/>
       <w:r>
         <w:rPr>
           <w:rFonts w:eastAsia="Times New Roman" w:cs="Times New Roman"/>
@@ -2857,12 +3187,91 @@
         </w:rPr>
         <w:t>dph</w:t>
       </w:r>
+      <w:proofErr w:type="spellEnd"/>
       <w:r>
         <w:rPr>
           <w:rFonts w:eastAsia="Times New Roman" w:cs="Times New Roman"/>
         </w:rPr>
         <w:tab/>
-        <w:t>deliveries per hour, deliveries_num / work_hours_num</w:t>
+        <w:t xml:space="preserve">deliveries per hour, </w:t>
+      </w:r>
+      <w:proofErr w:type="spellStart"/>
+      <w:r>
+        <w:rPr>
+          <w:rFonts w:eastAsia="Times New Roman" w:cs="Times New Roman"/>
+        </w:rPr>
+        <w:t>deliveries_num</w:t>
+      </w:r>
+      <w:proofErr w:type="spellEnd"/>
+      <w:r>
+        <w:rPr>
+          <w:rFonts w:eastAsia="Times New Roman" w:cs="Times New Roman"/>
+        </w:rPr>
+        <w:t xml:space="preserve"> / </w:t>
+      </w:r>
+      <w:proofErr w:type="spellStart"/>
+      <w:r>
+        <w:rPr>
+          <w:rFonts w:eastAsia="Times New Roman" w:cs="Times New Roman"/>
+        </w:rPr>
+        <w:t>work_hours_num</w:t>
+      </w:r>
+      <w:proofErr w:type="spellEnd"/>
+    </w:p>
+    <w:p>
+      <w:pPr>
+        <w:tabs>
+          <w:tab w:val="left" w:pos="1984"/>
+        </w:tabs>
+        <w:spacing w:after="60"/>
+      </w:pPr>
+      <w:r>
+        <w:rPr>
+          <w:b/>
+        </w:rPr>
+        <w:t>α</w:t>
+      </w:r>
+      <w:r>
+        <w:tab/>
+        <w:t>significance threshold (α = 0.05)</w:t>
+      </w:r>
+    </w:p>
+    <w:p>
+      <w:pPr>
+        <w:tabs>
+          <w:tab w:val="left" w:pos="1984"/>
+        </w:tabs>
+        <w:spacing w:after="60"/>
+      </w:pPr>
+      <w:proofErr w:type="spellStart"/>
+      <w:r>
+        <w:rPr>
+          <w:b/>
+        </w:rPr>
+        <w:t>df</w:t>
+      </w:r>
+      <w:proofErr w:type="spellEnd"/>
+      <w:r>
+        <w:tab/>
+        <w:t>degrees of freedom (chi-square test)</w:t>
+      </w:r>
+    </w:p>
+    <w:p>
+      <w:pPr>
+        <w:tabs>
+          <w:tab w:val="left" w:pos="1984"/>
+        </w:tabs>
+        <w:spacing w:after="60"/>
+      </w:pPr>
+      <w:r>
+        <w:rPr>
+          <w:b/>
+        </w:rPr>
+        <w:t>F1</w:t>
+      </w:r>
+      <w:r>
+        <w:tab/>
+        <w:t>harmonic mean of precision and recall</w:t>
       </w:r>
     </w:p>
     <w:p>
@@ -2915,7 +3324,35 @@
         <w:rPr>
           <w:rFonts w:eastAsia="Times New Roman" w:cs="Times New Roman"/>
         </w:rPr>
-        <w:t>Last-mile quick-commerce delivery riders for platforms like Blinkit and Zepto spend long hours on bikes, climb stairs, carry packages, and ride in heavy traffic. Prior Indian last-mile MSK studies [1, 2] report similar exposure patterns among app-based delivery riders. Over time this kind of work causes musculoskeletal disorders (MSDs): back pain, shoulder pain, wrist injuries, knee problems. The risk is not the same for every rider. Someone who is 22 and works 4 hours a day on a scooter is in a very different situation from a 45-year-old who works 10 hours a day on a motorbike with a handheld bag.</w:t>
+        <w:t xml:space="preserve">Last-mile quick-commerce delivery riders for platforms like </w:t>
+      </w:r>
+      <w:proofErr w:type="spellStart"/>
+      <w:r>
+        <w:rPr>
+          <w:rFonts w:eastAsia="Times New Roman" w:cs="Times New Roman"/>
+        </w:rPr>
+        <w:t>Blinkit</w:t>
+      </w:r>
+      <w:proofErr w:type="spellEnd"/>
+      <w:r>
+        <w:rPr>
+          <w:rFonts w:eastAsia="Times New Roman" w:cs="Times New Roman"/>
+        </w:rPr>
+        <w:t xml:space="preserve"> and </w:t>
+      </w:r>
+      <w:proofErr w:type="spellStart"/>
+      <w:r>
+        <w:rPr>
+          <w:rFonts w:eastAsia="Times New Roman" w:cs="Times New Roman"/>
+        </w:rPr>
+        <w:t>Zepto</w:t>
+      </w:r>
+      <w:proofErr w:type="spellEnd"/>
+      <w:r>
+        <w:rPr>
+          <w:rFonts w:eastAsia="Times New Roman" w:cs="Times New Roman"/>
+        </w:rPr>
+        <w:t xml:space="preserve"> spend long hours on bikes, climb stairs, carry packages, and ride in heavy traffic. Prior Indian last-mile MSK studies [1, 2] report similar exposure patterns among app-based delivery riders. Over time this kind of work causes musculoskeletal disorders (MSDs): back pain, shoulder pain, wrist injuries, knee problems. The risk is not the same for every rider. Someone who is 22 and works 4 hours a day on a scooter is in a very different situation from a 45-year-old who works 10 hours a day on a motorbike with a handheld bag.</w:t>
       </w:r>
     </w:p>
     <w:p>
@@ -3004,7 +3441,35 @@
           <w:rFonts w:eastAsia="Times New Roman" w:cs="Times New Roman"/>
         </w:rPr>
         <w:lastRenderedPageBreak/>
-        <w:t>Implement the pipeline reproducibly in Python (Jupyter notebooks, scikit-learn, XGBoost, imbalanced-learn, statsmodels) with a fixed random seed and end-to-end regeneration of every intermediate artefact.</w:t>
+        <w:t xml:space="preserve">Implement the pipeline reproducibly in Python (Jupyter notebooks, scikit-learn, </w:t>
+      </w:r>
+      <w:proofErr w:type="spellStart"/>
+      <w:r>
+        <w:rPr>
+          <w:rFonts w:eastAsia="Times New Roman" w:cs="Times New Roman"/>
+        </w:rPr>
+        <w:t>XGBoost</w:t>
+      </w:r>
+      <w:proofErr w:type="spellEnd"/>
+      <w:r>
+        <w:rPr>
+          <w:rFonts w:eastAsia="Times New Roman" w:cs="Times New Roman"/>
+        </w:rPr>
+        <w:t xml:space="preserve">, imbalanced-learn, </w:t>
+      </w:r>
+      <w:proofErr w:type="spellStart"/>
+      <w:r>
+        <w:rPr>
+          <w:rFonts w:eastAsia="Times New Roman" w:cs="Times New Roman"/>
+        </w:rPr>
+        <w:t>statsmodels</w:t>
+      </w:r>
+      <w:proofErr w:type="spellEnd"/>
+      <w:r>
+        <w:rPr>
+          <w:rFonts w:eastAsia="Times New Roman" w:cs="Times New Roman"/>
+        </w:rPr>
+        <w:t>) with a fixed random seed and end-to-end regeneration of every intermediate artefact.</w:t>
       </w:r>
     </w:p>
     <w:p>
@@ -3016,7 +3481,21 @@
         <w:rPr>
           <w:rFonts w:eastAsia="Times New Roman" w:cs="Times New Roman"/>
         </w:rPr>
-        <w:t>Train and evaluate seven candidate ML algorithms per risk factor using 5-fold stratified cross-validation with SMOTE oversampling inside every fold, and report accuracy, macro F1, and macro AUC.</w:t>
+        <w:t xml:space="preserve">Train and evaluate seven candidate ML algorithms per risk factor using 5-fold stratified cross-validation with SMOTE oversampling inside every fold, and report accuracy, macro F1, and </w:t>
+      </w:r>
+      <w:proofErr w:type="gramStart"/>
+      <w:r>
+        <w:rPr>
+          <w:rFonts w:eastAsia="Times New Roman" w:cs="Times New Roman"/>
+        </w:rPr>
+        <w:t>macro AUC</w:t>
+      </w:r>
+      <w:proofErr w:type="gramEnd"/>
+      <w:r>
+        <w:rPr>
+          <w:rFonts w:eastAsia="Times New Roman" w:cs="Times New Roman"/>
+        </w:rPr>
+        <w:t>.</w:t>
       </w:r>
     </w:p>
     <w:p>
@@ -3040,7 +3519,35 @@
         <w:rPr>
           <w:rFonts w:eastAsia="Times New Roman" w:cs="Times New Roman"/>
         </w:rPr>
-        <w:t>Deploy the trained models behind a Streamlit web application that accepts the full 36-item questionnaire plus the 11 RULA components and 8 QEC scores, and returns the six colour-coded risk levels with per-factor recommendations.</w:t>
+        <w:t xml:space="preserve">Deploy the trained models behind a </w:t>
+      </w:r>
+      <w:proofErr w:type="spellStart"/>
+      <w:r>
+        <w:rPr>
+          <w:rFonts w:eastAsia="Times New Roman" w:cs="Times New Roman"/>
+        </w:rPr>
+        <w:t>Streamlit</w:t>
+      </w:r>
+      <w:proofErr w:type="spellEnd"/>
+      <w:r>
+        <w:rPr>
+          <w:rFonts w:eastAsia="Times New Roman" w:cs="Times New Roman"/>
+        </w:rPr>
+        <w:t xml:space="preserve"> web application that accepts the full 36-item questionnaire plus the 11 RULA components and 8 QEC scores, and returns the six </w:t>
+      </w:r>
+      <w:proofErr w:type="spellStart"/>
+      <w:r>
+        <w:rPr>
+          <w:rFonts w:eastAsia="Times New Roman" w:cs="Times New Roman"/>
+        </w:rPr>
+        <w:t>colour</w:t>
+      </w:r>
+      <w:proofErr w:type="spellEnd"/>
+      <w:r>
+        <w:rPr>
+          <w:rFonts w:eastAsia="Times New Roman" w:cs="Times New Roman"/>
+        </w:rPr>
+        <w:t>-coded risk levels with per-factor recommendations.</w:t>
       </w:r>
     </w:p>
     <w:p>
@@ -3180,7 +3687,35 @@
         <w:rPr>
           <w:rFonts w:eastAsia="Times New Roman" w:cs="Times New Roman"/>
         </w:rPr>
-        <w:t>This is a cross-sectional study of Blinkit and Zepto quick-commerce delivery partners conducted in the Chengalpattu and Chennai regions in March-April 2026 using convenience sampling. The same 182 participants supplied both data streams: rider self-report through a Google Form and posture recorded during a delivery task by a trained observer. Eligibility was applied at the person level before either instrument.</w:t>
+        <w:t xml:space="preserve">This is a cross-sectional study of </w:t>
+      </w:r>
+      <w:proofErr w:type="spellStart"/>
+      <w:r>
+        <w:rPr>
+          <w:rFonts w:eastAsia="Times New Roman" w:cs="Times New Roman"/>
+        </w:rPr>
+        <w:t>Blinkit</w:t>
+      </w:r>
+      <w:proofErr w:type="spellEnd"/>
+      <w:r>
+        <w:rPr>
+          <w:rFonts w:eastAsia="Times New Roman" w:cs="Times New Roman"/>
+        </w:rPr>
+        <w:t xml:space="preserve"> and </w:t>
+      </w:r>
+      <w:proofErr w:type="spellStart"/>
+      <w:r>
+        <w:rPr>
+          <w:rFonts w:eastAsia="Times New Roman" w:cs="Times New Roman"/>
+        </w:rPr>
+        <w:t>Zepto</w:t>
+      </w:r>
+      <w:proofErr w:type="spellEnd"/>
+      <w:r>
+        <w:rPr>
+          <w:rFonts w:eastAsia="Times New Roman" w:cs="Times New Roman"/>
+        </w:rPr>
+        <w:t xml:space="preserve"> quick-commerce delivery partners conducted in the Chengalpattu and Chennai regions in March-April 2026 using convenience sampling. The same 182 participants supplied both data streams: rider self-report through a Google Form and posture recorded during a delivery task by a trained observer. Eligibility was applied at the person level before either instrument.</w:t>
       </w:r>
     </w:p>
     <w:p>
@@ -3206,7 +3741,35 @@
         <w:rPr>
           <w:rFonts w:eastAsia="Times New Roman" w:cs="Times New Roman"/>
         </w:rPr>
-        <w:t>Full-time delivery partners working on either the Blinkit or the Zepto platform.</w:t>
+        <w:t xml:space="preserve">Full-time delivery partners working on either the </w:t>
+      </w:r>
+      <w:proofErr w:type="spellStart"/>
+      <w:r>
+        <w:rPr>
+          <w:rFonts w:eastAsia="Times New Roman" w:cs="Times New Roman"/>
+        </w:rPr>
+        <w:t>Blinkit</w:t>
+      </w:r>
+      <w:proofErr w:type="spellEnd"/>
+      <w:r>
+        <w:rPr>
+          <w:rFonts w:eastAsia="Times New Roman" w:cs="Times New Roman"/>
+        </w:rPr>
+        <w:t xml:space="preserve"> or the </w:t>
+      </w:r>
+      <w:proofErr w:type="spellStart"/>
+      <w:r>
+        <w:rPr>
+          <w:rFonts w:eastAsia="Times New Roman" w:cs="Times New Roman"/>
+        </w:rPr>
+        <w:t>Zepto</w:t>
+      </w:r>
+      <w:proofErr w:type="spellEnd"/>
+      <w:r>
+        <w:rPr>
+          <w:rFonts w:eastAsia="Times New Roman" w:cs="Times New Roman"/>
+        </w:rPr>
+        <w:t xml:space="preserve"> platform.</w:t>
       </w:r>
     </w:p>
     <w:p>
@@ -3361,7 +3924,133 @@
         <w:rPr>
           <w:rFonts w:eastAsia="Times New Roman" w:cs="Times New Roman"/>
         </w:rPr>
-        <w:t>Phase 1 (01_data_cleaning.ipynb) normalises the raw CSV, standardises Yes/No answers, and validates row counts. Phase 2 (02_feature_engineering.ipynb) encodes ordered categorical bins to integers, assigns numeric midpoints to bin ranges, ranks vehicle type and carrying mode, aliases the 18 Yes/No items, and derives four composite features -- workload_score (mean of the six NASA-TLX items with satisfaction reversed), fatigue_score (mean of the six Borg CR10 items), force_exertion (the Borg lifting item), and vibration_index (vehicle_rank x work_hours_num) -- plus five product-form interactions so tree-based models can pick up combined effects.</w:t>
+        <w:t>Phase 1 (01_data_</w:t>
+      </w:r>
+      <w:proofErr w:type="gramStart"/>
+      <w:r>
+        <w:rPr>
+          <w:rFonts w:eastAsia="Times New Roman" w:cs="Times New Roman"/>
+        </w:rPr>
+        <w:t>cleaning.ipynb</w:t>
+      </w:r>
+      <w:proofErr w:type="gramEnd"/>
+      <w:r>
+        <w:rPr>
+          <w:rFonts w:eastAsia="Times New Roman" w:cs="Times New Roman"/>
+        </w:rPr>
+        <w:t xml:space="preserve">) </w:t>
+      </w:r>
+      <w:proofErr w:type="spellStart"/>
+      <w:r>
+        <w:rPr>
+          <w:rFonts w:eastAsia="Times New Roman" w:cs="Times New Roman"/>
+        </w:rPr>
+        <w:t>normalises</w:t>
+      </w:r>
+      <w:proofErr w:type="spellEnd"/>
+      <w:r>
+        <w:rPr>
+          <w:rFonts w:eastAsia="Times New Roman" w:cs="Times New Roman"/>
+        </w:rPr>
+        <w:t xml:space="preserve"> the raw CSV, </w:t>
+      </w:r>
+      <w:proofErr w:type="spellStart"/>
+      <w:r>
+        <w:rPr>
+          <w:rFonts w:eastAsia="Times New Roman" w:cs="Times New Roman"/>
+        </w:rPr>
+        <w:t>standardises</w:t>
+      </w:r>
+      <w:proofErr w:type="spellEnd"/>
+      <w:r>
+        <w:rPr>
+          <w:rFonts w:eastAsia="Times New Roman" w:cs="Times New Roman"/>
+        </w:rPr>
+        <w:t xml:space="preserve"> Yes/No answers, and validates row counts. Phase 2 (02_feature_engineering.ipynb) encodes ordered categorical bins to integers, assigns numeric midpoints to bin ranges, ranks vehicle type and carrying mode, aliases the 18 Yes/No items, and derives four composite features -- </w:t>
+      </w:r>
+      <w:proofErr w:type="spellStart"/>
+      <w:r>
+        <w:rPr>
+          <w:rFonts w:eastAsia="Times New Roman" w:cs="Times New Roman"/>
+        </w:rPr>
+        <w:t>workload_score</w:t>
+      </w:r>
+      <w:proofErr w:type="spellEnd"/>
+      <w:r>
+        <w:rPr>
+          <w:rFonts w:eastAsia="Times New Roman" w:cs="Times New Roman"/>
+        </w:rPr>
+        <w:t xml:space="preserve"> (mean of the six NASA-TLX items with satisfaction reversed), </w:t>
+      </w:r>
+      <w:proofErr w:type="spellStart"/>
+      <w:r>
+        <w:rPr>
+          <w:rFonts w:eastAsia="Times New Roman" w:cs="Times New Roman"/>
+        </w:rPr>
+        <w:t>fatigue_score</w:t>
+      </w:r>
+      <w:proofErr w:type="spellEnd"/>
+      <w:r>
+        <w:rPr>
+          <w:rFonts w:eastAsia="Times New Roman" w:cs="Times New Roman"/>
+        </w:rPr>
+        <w:t xml:space="preserve"> (mean of the six Borg CR10 items), </w:t>
+      </w:r>
+      <w:proofErr w:type="spellStart"/>
+      <w:r>
+        <w:rPr>
+          <w:rFonts w:eastAsia="Times New Roman" w:cs="Times New Roman"/>
+        </w:rPr>
+        <w:t>force_exertion</w:t>
+      </w:r>
+      <w:proofErr w:type="spellEnd"/>
+      <w:r>
+        <w:rPr>
+          <w:rFonts w:eastAsia="Times New Roman" w:cs="Times New Roman"/>
+        </w:rPr>
+        <w:t xml:space="preserve"> (the Borg lifting item), and </w:t>
+      </w:r>
+      <w:proofErr w:type="spellStart"/>
+      <w:r>
+        <w:rPr>
+          <w:rFonts w:eastAsia="Times New Roman" w:cs="Times New Roman"/>
+        </w:rPr>
+        <w:t>vibration_index</w:t>
+      </w:r>
+      <w:proofErr w:type="spellEnd"/>
+      <w:r>
+        <w:rPr>
+          <w:rFonts w:eastAsia="Times New Roman" w:cs="Times New Roman"/>
+        </w:rPr>
+        <w:t xml:space="preserve"> (</w:t>
+      </w:r>
+      <w:proofErr w:type="spellStart"/>
+      <w:r>
+        <w:rPr>
+          <w:rFonts w:eastAsia="Times New Roman" w:cs="Times New Roman"/>
+        </w:rPr>
+        <w:t>vehicle_rank</w:t>
+      </w:r>
+      <w:proofErr w:type="spellEnd"/>
+      <w:r>
+        <w:rPr>
+          <w:rFonts w:eastAsia="Times New Roman" w:cs="Times New Roman"/>
+        </w:rPr>
+        <w:t xml:space="preserve"> x </w:t>
+      </w:r>
+      <w:proofErr w:type="spellStart"/>
+      <w:r>
+        <w:rPr>
+          <w:rFonts w:eastAsia="Times New Roman" w:cs="Times New Roman"/>
+        </w:rPr>
+        <w:t>work_hours_num</w:t>
+      </w:r>
+      <w:proofErr w:type="spellEnd"/>
+      <w:r>
+        <w:rPr>
+          <w:rFonts w:eastAsia="Times New Roman" w:cs="Times New Roman"/>
+        </w:rPr>
+        <w:t>) -- plus five product-form interactions so tree-based models can pick up combined effects.</w:t>
       </w:r>
     </w:p>
     <w:p>
@@ -3373,7 +4062,35 @@
         <w:rPr>
           <w:rFonts w:eastAsia="Times New Roman" w:cs="Times New Roman"/>
         </w:rPr>
-        <w:t>The posture observations are merged into the survey via a severity-rank merge: riders are ranked by an exposure_severity index (normalised NMQ pain count + fatigue score + hours), posture rows by RULA Table C, and the two ranked lists are joined one-to-one. Caveats are noted in Chapter 5.</w:t>
+        <w:t xml:space="preserve">The posture observations are merged into the survey via a severity-rank merge: riders are ranked by an </w:t>
+      </w:r>
+      <w:proofErr w:type="spellStart"/>
+      <w:r>
+        <w:rPr>
+          <w:rFonts w:eastAsia="Times New Roman" w:cs="Times New Roman"/>
+        </w:rPr>
+        <w:t>exposure_severity</w:t>
+      </w:r>
+      <w:proofErr w:type="spellEnd"/>
+      <w:r>
+        <w:rPr>
+          <w:rFonts w:eastAsia="Times New Roman" w:cs="Times New Roman"/>
+        </w:rPr>
+        <w:t xml:space="preserve"> index (</w:t>
+      </w:r>
+      <w:proofErr w:type="spellStart"/>
+      <w:r>
+        <w:rPr>
+          <w:rFonts w:eastAsia="Times New Roman" w:cs="Times New Roman"/>
+        </w:rPr>
+        <w:t>normalised</w:t>
+      </w:r>
+      <w:proofErr w:type="spellEnd"/>
+      <w:r>
+        <w:rPr>
+          <w:rFonts w:eastAsia="Times New Roman" w:cs="Times New Roman"/>
+        </w:rPr>
+        <w:t xml:space="preserve"> NMQ pain count + fatigue score + hours), posture rows by RULA Table C, and the two ranked lists are joined one-to-one. Caveats are noted in Chapter 5.</w:t>
       </w:r>
     </w:p>
     <w:p>
@@ -3399,7 +4116,21 @@
         <w:rPr>
           <w:rFonts w:eastAsia="Times New Roman" w:cs="Times New Roman"/>
         </w:rPr>
-        <w:t>Phase 3 (03_risk_scoring.ipynb) applies the following rules and writes risk_profile.csv:</w:t>
+        <w:t>Phase 3 (03_risk_</w:t>
+      </w:r>
+      <w:proofErr w:type="gramStart"/>
+      <w:r>
+        <w:rPr>
+          <w:rFonts w:eastAsia="Times New Roman" w:cs="Times New Roman"/>
+        </w:rPr>
+        <w:t>scoring.ipynb</w:t>
+      </w:r>
+      <w:proofErr w:type="gramEnd"/>
+      <w:r>
+        <w:rPr>
+          <w:rFonts w:eastAsia="Times New Roman" w:cs="Times New Roman"/>
+        </w:rPr>
+        <w:t>) applies the following rules and writes risk_profile.csv:</w:t>
       </w:r>
     </w:p>
     <w:p>
@@ -3447,7 +4178,21 @@
         <w:rPr>
           <w:rFonts w:eastAsia="Times New Roman" w:cs="Times New Roman"/>
         </w:rPr>
-        <w:t>Vibration: vibration_index binned by sample tercile.</w:t>
+        <w:t xml:space="preserve">Vibration: </w:t>
+      </w:r>
+      <w:proofErr w:type="spellStart"/>
+      <w:r>
+        <w:rPr>
+          <w:rFonts w:eastAsia="Times New Roman" w:cs="Times New Roman"/>
+        </w:rPr>
+        <w:t>vibration_index</w:t>
+      </w:r>
+      <w:proofErr w:type="spellEnd"/>
+      <w:r>
+        <w:rPr>
+          <w:rFonts w:eastAsia="Times New Roman" w:cs="Times New Roman"/>
+        </w:rPr>
+        <w:t xml:space="preserve"> binned by sample tercile.</w:t>
       </w:r>
     </w:p>
     <w:p>
@@ -3459,7 +4204,35 @@
         <w:rPr>
           <w:rFonts w:eastAsia="Times New Roman" w:cs="Times New Roman"/>
         </w:rPr>
-        <w:t>Contact Stress: carrying_contact_rank x work_hours_num x age multiplier, sample tercile.</w:t>
+        <w:t xml:space="preserve">Contact Stress: </w:t>
+      </w:r>
+      <w:proofErr w:type="spellStart"/>
+      <w:r>
+        <w:rPr>
+          <w:rFonts w:eastAsia="Times New Roman" w:cs="Times New Roman"/>
+        </w:rPr>
+        <w:t>carrying_contact_rank</w:t>
+      </w:r>
+      <w:proofErr w:type="spellEnd"/>
+      <w:r>
+        <w:rPr>
+          <w:rFonts w:eastAsia="Times New Roman" w:cs="Times New Roman"/>
+        </w:rPr>
+        <w:t xml:space="preserve"> x </w:t>
+      </w:r>
+      <w:proofErr w:type="spellStart"/>
+      <w:r>
+        <w:rPr>
+          <w:rFonts w:eastAsia="Times New Roman" w:cs="Times New Roman"/>
+        </w:rPr>
+        <w:t>work_hours_num</w:t>
+      </w:r>
+      <w:proofErr w:type="spellEnd"/>
+      <w:r>
+        <w:rPr>
+          <w:rFonts w:eastAsia="Times New Roman" w:cs="Times New Roman"/>
+        </w:rPr>
+        <w:t xml:space="preserve"> x age multiplier, sample tercile.</w:t>
       </w:r>
     </w:p>
     <w:p>
@@ -3498,7 +4271,51 @@
         <w:rPr>
           <w:rFonts w:eastAsia="Times New Roman" w:cs="Times New Roman"/>
         </w:rPr>
-        <w:t>Phase 5 (05_stats.ipynb) runs two analyses on discomfort (binary: any NMQ 12-month pain). A chi-square test of independence (scipy.stats.chi2_contingency) checks whether each risk factor is associated with discomfort at p less than 0.05. Second, a multivariable logistic regression (statsmodels.api.Logit) estimates the effect of eleven predictors while controlling for the others; results are reported as odds ratios with 95 percent confidence intervals.</w:t>
+        <w:t>Phase 5 (05_</w:t>
+      </w:r>
+      <w:proofErr w:type="gramStart"/>
+      <w:r>
+        <w:rPr>
+          <w:rFonts w:eastAsia="Times New Roman" w:cs="Times New Roman"/>
+        </w:rPr>
+        <w:t>stats.ipynb</w:t>
+      </w:r>
+      <w:proofErr w:type="gramEnd"/>
+      <w:r>
+        <w:rPr>
+          <w:rFonts w:eastAsia="Times New Roman" w:cs="Times New Roman"/>
+        </w:rPr>
+        <w:t>) runs two analyses on discomfort (binary: any NMQ 12-month pain). A chi-square test of independence (</w:t>
+      </w:r>
+      <w:proofErr w:type="gramStart"/>
+      <w:r>
+        <w:rPr>
+          <w:rFonts w:eastAsia="Times New Roman" w:cs="Times New Roman"/>
+        </w:rPr>
+        <w:t>scipy.stats</w:t>
+      </w:r>
+      <w:proofErr w:type="gramEnd"/>
+      <w:r>
+        <w:rPr>
+          <w:rFonts w:eastAsia="Times New Roman" w:cs="Times New Roman"/>
+        </w:rPr>
+        <w:t>.chi2_contingency) checks whether each risk factor is associated with discomfort at p less than 0.05. Second, a multivariable logistic regression (</w:t>
+      </w:r>
+      <w:proofErr w:type="spellStart"/>
+      <w:proofErr w:type="gramStart"/>
+      <w:r>
+        <w:rPr>
+          <w:rFonts w:eastAsia="Times New Roman" w:cs="Times New Roman"/>
+        </w:rPr>
+        <w:t>statsmodels.api.Logit</w:t>
+      </w:r>
+      <w:proofErr w:type="spellEnd"/>
+      <w:proofErr w:type="gramEnd"/>
+      <w:r>
+        <w:rPr>
+          <w:rFonts w:eastAsia="Times New Roman" w:cs="Times New Roman"/>
+        </w:rPr>
+        <w:t>) estimates the effect of eleven predictors while controlling for the others; results are reported as odds ratios with 95 percent confidence intervals.</w:t>
       </w:r>
     </w:p>
     <w:p>
@@ -3524,7 +4341,87 @@
         <w:rPr>
           <w:rFonts w:eastAsia="Times New Roman" w:cs="Times New Roman"/>
         </w:rPr>
-        <w:t>Phase 6 (06_modeling.ipynb) trains a classifier per target from seven candidate algorithms.  Each sits inside an imblearn.Pipeline with SMOTE upstream so resampling only touches training folds. GridSearchCV tunes hyperparameters on macro-F1 inside 5-fold stratified CV, and the best model per target is refit on the full sample and saved as outputs/models/best_&lt;factor&gt;.pkl.</w:t>
+        <w:t>Phase 6 (06_</w:t>
+      </w:r>
+      <w:proofErr w:type="gramStart"/>
+      <w:r>
+        <w:rPr>
+          <w:rFonts w:eastAsia="Times New Roman" w:cs="Times New Roman"/>
+        </w:rPr>
+        <w:t>modeling.ipynb</w:t>
+      </w:r>
+      <w:proofErr w:type="gramEnd"/>
+      <w:r>
+        <w:rPr>
+          <w:rFonts w:eastAsia="Times New Roman" w:cs="Times New Roman"/>
+        </w:rPr>
+        <w:t xml:space="preserve">) trains a classifier per target from seven candidate algorithms.  Each </w:t>
+      </w:r>
+      <w:proofErr w:type="gramStart"/>
+      <w:r>
+        <w:rPr>
+          <w:rFonts w:eastAsia="Times New Roman" w:cs="Times New Roman"/>
+        </w:rPr>
+        <w:t>sits</w:t>
+      </w:r>
+      <w:proofErr w:type="gramEnd"/>
+      <w:r>
+        <w:rPr>
+          <w:rFonts w:eastAsia="Times New Roman" w:cs="Times New Roman"/>
+        </w:rPr>
+        <w:t xml:space="preserve"> inside an </w:t>
+      </w:r>
+      <w:proofErr w:type="spellStart"/>
+      <w:proofErr w:type="gramStart"/>
+      <w:r>
+        <w:rPr>
+          <w:rFonts w:eastAsia="Times New Roman" w:cs="Times New Roman"/>
+        </w:rPr>
+        <w:t>imblearn.Pipeline</w:t>
+      </w:r>
+      <w:proofErr w:type="spellEnd"/>
+      <w:proofErr w:type="gramEnd"/>
+      <w:r>
+        <w:rPr>
+          <w:rFonts w:eastAsia="Times New Roman" w:cs="Times New Roman"/>
+        </w:rPr>
+        <w:t xml:space="preserve"> with SMOTE upstream so resampling only touches training folds. </w:t>
+      </w:r>
+      <w:proofErr w:type="spellStart"/>
+      <w:r>
+        <w:rPr>
+          <w:rFonts w:eastAsia="Times New Roman" w:cs="Times New Roman"/>
+        </w:rPr>
+        <w:t>GridSearchCV</w:t>
+      </w:r>
+      <w:proofErr w:type="spellEnd"/>
+      <w:r>
+        <w:rPr>
+          <w:rFonts w:eastAsia="Times New Roman" w:cs="Times New Roman"/>
+        </w:rPr>
+        <w:t xml:space="preserve"> tunes hyperparameters on macro-F1 inside 5-fold stratified CV, and the best model per target is refit on the full sample and saved as outputs/models/best_&lt;factor</w:t>
+      </w:r>
+      <w:proofErr w:type="gramStart"/>
+      <w:r>
+        <w:rPr>
+          <w:rFonts w:eastAsia="Times New Roman" w:cs="Times New Roman"/>
+        </w:rPr>
+        <w:t>&gt;.</w:t>
+      </w:r>
+      <w:proofErr w:type="spellStart"/>
+      <w:r>
+        <w:rPr>
+          <w:rFonts w:eastAsia="Times New Roman" w:cs="Times New Roman"/>
+        </w:rPr>
+        <w:t>pkl</w:t>
+      </w:r>
+      <w:proofErr w:type="spellEnd"/>
+      <w:proofErr w:type="gramEnd"/>
+      <w:r>
+        <w:rPr>
+          <w:rFonts w:eastAsia="Times New Roman" w:cs="Times New Roman"/>
+        </w:rPr>
+        <w:t>.</w:t>
       </w:r>
     </w:p>
     <w:p>
@@ -3547,11 +4444,33 @@
         <w:spacing w:after="160" w:line="336" w:lineRule="auto"/>
         <w:jc w:val="both"/>
       </w:pPr>
-      <w:r>
-        <w:rPr>
-          <w:rFonts w:eastAsia="Times New Roman" w:cs="Times New Roman"/>
-        </w:rPr>
-        <w:t>Regularised linear classifier used as the baseline (L2 penalty, class_weight balanced).  Any tree-based method that fails to beat it on a factor is either overfitting or getting nothing from feature interactions.</w:t>
+      <w:proofErr w:type="spellStart"/>
+      <w:r>
+        <w:rPr>
+          <w:rFonts w:eastAsia="Times New Roman" w:cs="Times New Roman"/>
+        </w:rPr>
+        <w:t>Regularised</w:t>
+      </w:r>
+      <w:proofErr w:type="spellEnd"/>
+      <w:r>
+        <w:rPr>
+          <w:rFonts w:eastAsia="Times New Roman" w:cs="Times New Roman"/>
+        </w:rPr>
+        <w:t xml:space="preserve"> linear classifier used as the baseline (L2 penalty, </w:t>
+      </w:r>
+      <w:proofErr w:type="spellStart"/>
+      <w:r>
+        <w:rPr>
+          <w:rFonts w:eastAsia="Times New Roman" w:cs="Times New Roman"/>
+        </w:rPr>
+        <w:t>class_weight</w:t>
+      </w:r>
+      <w:proofErr w:type="spellEnd"/>
+      <w:r>
+        <w:rPr>
+          <w:rFonts w:eastAsia="Times New Roman" w:cs="Times New Roman"/>
+        </w:rPr>
+        <w:t xml:space="preserve"> balanced).  Any tree-based method that fails to beat it on a factor is either overfitting or getting nothing from feature interactions.</w:t>
       </w:r>
     </w:p>
     <w:p>
@@ -3578,7 +4497,49 @@
         <w:rPr>
           <w:rFonts w:eastAsia="Times New Roman" w:cs="Times New Roman"/>
         </w:rPr>
-        <w:t>Single CART tree with max_depth in {3, 5, 7} and min_samples_leaf in {1, 3, 5} tuned via grid search.  Included as the ensembling floor; not competitive on its own for any of the six targets.</w:t>
+        <w:t xml:space="preserve">Single CART tree with </w:t>
+      </w:r>
+      <w:proofErr w:type="spellStart"/>
+      <w:r>
+        <w:rPr>
+          <w:rFonts w:eastAsia="Times New Roman" w:cs="Times New Roman"/>
+        </w:rPr>
+        <w:t>max_depth</w:t>
+      </w:r>
+      <w:proofErr w:type="spellEnd"/>
+      <w:r>
+        <w:rPr>
+          <w:rFonts w:eastAsia="Times New Roman" w:cs="Times New Roman"/>
+        </w:rPr>
+        <w:t xml:space="preserve"> in {3, 5, 7} and </w:t>
+      </w:r>
+      <w:proofErr w:type="spellStart"/>
+      <w:r>
+        <w:rPr>
+          <w:rFonts w:eastAsia="Times New Roman" w:cs="Times New Roman"/>
+        </w:rPr>
+        <w:t>min_samples_leaf</w:t>
+      </w:r>
+      <w:proofErr w:type="spellEnd"/>
+      <w:r>
+        <w:rPr>
+          <w:rFonts w:eastAsia="Times New Roman" w:cs="Times New Roman"/>
+        </w:rPr>
+        <w:t xml:space="preserve"> in {1, 3, 5} tuned via grid search.  Included as the </w:t>
+      </w:r>
+      <w:proofErr w:type="spellStart"/>
+      <w:r>
+        <w:rPr>
+          <w:rFonts w:eastAsia="Times New Roman" w:cs="Times New Roman"/>
+        </w:rPr>
+        <w:t>ensembling</w:t>
+      </w:r>
+      <w:proofErr w:type="spellEnd"/>
+      <w:r>
+        <w:rPr>
+          <w:rFonts w:eastAsia="Times New Roman" w:cs="Times New Roman"/>
+        </w:rPr>
+        <w:t xml:space="preserve"> floor; not competitive on its own for any of the six targets.</w:t>
       </w:r>
     </w:p>
     <w:p>
@@ -3632,7 +4593,21 @@
         <w:rPr>
           <w:rFonts w:eastAsia="Times New Roman" w:cs="Times New Roman"/>
         </w:rPr>
-        <w:t>Like Random Forest but with fully random splits per node.  The extra randomisation lowers between-tree correlation and helped it win on Vibration.</w:t>
+        <w:t xml:space="preserve">Like Random Forest but with fully random splits per node.  The extra </w:t>
+      </w:r>
+      <w:proofErr w:type="spellStart"/>
+      <w:r>
+        <w:rPr>
+          <w:rFonts w:eastAsia="Times New Roman" w:cs="Times New Roman"/>
+        </w:rPr>
+        <w:t>randomisation</w:t>
+      </w:r>
+      <w:proofErr w:type="spellEnd"/>
+      <w:r>
+        <w:rPr>
+          <w:rFonts w:eastAsia="Times New Roman" w:cs="Times New Roman"/>
+        </w:rPr>
+        <w:t xml:space="preserve"> lowers between-tree correlation and helped it win on Vibration.</w:t>
       </w:r>
     </w:p>
     <w:p>
@@ -3675,26 +4650,9 @@
           <w:sz w:val="24"/>
         </w:rPr>
         <w:lastRenderedPageBreak/>
-        <w:t>2.6.6   XGBoost</w:t>
-      </w:r>
-    </w:p>
-    <w:p>
-      <w:pPr>
-        <w:spacing w:after="160" w:line="336" w:lineRule="auto"/>
-        <w:jc w:val="both"/>
-      </w:pPr>
-      <w:r>
-        <w:rPr>
-          <w:rFonts w:eastAsia="Times New Roman" w:cs="Times New Roman"/>
-        </w:rPr>
-        <w:t>Gradient-boosted trees with L2 regularisation on the leaf weights.  Placed second on several targets but did not win any at the default search budget.</w:t>
-      </w:r>
-    </w:p>
-    <w:p>
-      <w:pPr>
-        <w:pStyle w:val="Heading5"/>
-        <w:spacing w:before="180" w:after="60"/>
-      </w:pPr>
+        <w:t xml:space="preserve">2.6.6   </w:t>
+      </w:r>
+      <w:proofErr w:type="spellStart"/>
       <w:r>
         <w:rPr>
           <w:rFonts w:ascii="Times New Roman" w:eastAsia="Times New Roman" w:hAnsi="Times New Roman" w:cs="Times New Roman"/>
@@ -3702,8 +4660,9 @@
           <w:color w:val="000000"/>
           <w:sz w:val="24"/>
         </w:rPr>
-        <w:t>2.6.7   Stacking Classifier</w:t>
-      </w:r>
+        <w:t>XGBoost</w:t>
+      </w:r>
+      <w:proofErr w:type="spellEnd"/>
     </w:p>
     <w:p>
       <w:pPr>
@@ -3714,7 +4673,21 @@
         <w:rPr>
           <w:rFonts w:eastAsia="Times New Roman" w:cs="Times New Roman"/>
         </w:rPr>
-        <w:t>Meta-learner taking the out-of-fold predictions of Random Forest, Extra Trees, HistGBM, and XGBoost as inputs and fitting a Logistic Regression on top.  Failed to beat the strongest base learner because the four base learners largely agreed.</w:t>
+        <w:t xml:space="preserve">Gradient-boosted trees with L2 </w:t>
+      </w:r>
+      <w:proofErr w:type="spellStart"/>
+      <w:r>
+        <w:rPr>
+          <w:rFonts w:eastAsia="Times New Roman" w:cs="Times New Roman"/>
+        </w:rPr>
+        <w:t>regularisation</w:t>
+      </w:r>
+      <w:proofErr w:type="spellEnd"/>
+      <w:r>
+        <w:rPr>
+          <w:rFonts w:eastAsia="Times New Roman" w:cs="Times New Roman"/>
+        </w:rPr>
+        <w:t xml:space="preserve"> on the leaf weights.  Placed second on several targets but did not win any at the default search budget.</w:t>
       </w:r>
     </w:p>
     <w:p>
@@ -3729,7 +4702,7 @@
           <w:color w:val="000000"/>
           <w:sz w:val="24"/>
         </w:rPr>
-        <w:t>2.6.8   SMOTE and cross-validation</w:t>
+        <w:t>2.6.7   Stacking Classifier</w:t>
       </w:r>
     </w:p>
     <w:p>
@@ -3741,7 +4714,35 @@
         <w:rPr>
           <w:rFonts w:eastAsia="Times New Roman" w:cs="Times New Roman"/>
         </w:rPr>
-        <w:t>SMOTE synthesises new minority-class samples along segments between k nearest minority neighbours.  Wrapping it in imblearn.Pipeline keeps the synthesis inside training folds only, so validation-fold accuracy is never inflated.  k_neighbors is set per target below the minority training-fold count; GridSearchCV picks hyperparameters on macro-F1 with StratifiedKFold(5, shuffle=True, random_state=42).</w:t>
+        <w:t xml:space="preserve">Meta-learner taking the out-of-fold predictions of Random Forest, Extra Trees, </w:t>
+      </w:r>
+      <w:proofErr w:type="spellStart"/>
+      <w:r>
+        <w:rPr>
+          <w:rFonts w:eastAsia="Times New Roman" w:cs="Times New Roman"/>
+        </w:rPr>
+        <w:t>HistGBM</w:t>
+      </w:r>
+      <w:proofErr w:type="spellEnd"/>
+      <w:r>
+        <w:rPr>
+          <w:rFonts w:eastAsia="Times New Roman" w:cs="Times New Roman"/>
+        </w:rPr>
+        <w:t xml:space="preserve">, and </w:t>
+      </w:r>
+      <w:proofErr w:type="spellStart"/>
+      <w:r>
+        <w:rPr>
+          <w:rFonts w:eastAsia="Times New Roman" w:cs="Times New Roman"/>
+        </w:rPr>
+        <w:t>XGBoost</w:t>
+      </w:r>
+      <w:proofErr w:type="spellEnd"/>
+      <w:r>
+        <w:rPr>
+          <w:rFonts w:eastAsia="Times New Roman" w:cs="Times New Roman"/>
+        </w:rPr>
+        <w:t xml:space="preserve"> as inputs and fitting a Logistic Regression on top.  Failed to beat the strongest base learner because the four base learners largely agreed.</w:t>
       </w:r>
     </w:p>
     <w:p>
@@ -3756,7 +4757,7 @@
           <w:color w:val="000000"/>
           <w:sz w:val="24"/>
         </w:rPr>
-        <w:t>2.6.9   Per-target feature exclusions</w:t>
+        <w:t>2.6.8   SMOTE and cross-validation</w:t>
       </w:r>
     </w:p>
     <w:p>
@@ -3768,7 +4769,156 @@
         <w:rPr>
           <w:rFonts w:eastAsia="Times New Roman" w:cs="Times New Roman"/>
         </w:rPr>
-        <w:t>Each target excludes the survey inputs that directly define its Stage-1 label (otherwise the model would memorise the rule).  Posture additionally receives the 11 RULA components and 8 QEC scores, giving 63 total features.</w:t>
+        <w:t xml:space="preserve">SMOTE </w:t>
+      </w:r>
+      <w:proofErr w:type="spellStart"/>
+      <w:r>
+        <w:rPr>
+          <w:rFonts w:eastAsia="Times New Roman" w:cs="Times New Roman"/>
+        </w:rPr>
+        <w:t>synthesises</w:t>
+      </w:r>
+      <w:proofErr w:type="spellEnd"/>
+      <w:r>
+        <w:rPr>
+          <w:rFonts w:eastAsia="Times New Roman" w:cs="Times New Roman"/>
+        </w:rPr>
+        <w:t xml:space="preserve"> new minority-class samples along segments between k nearest minority </w:t>
+      </w:r>
+      <w:proofErr w:type="spellStart"/>
+      <w:r>
+        <w:rPr>
+          <w:rFonts w:eastAsia="Times New Roman" w:cs="Times New Roman"/>
+        </w:rPr>
+        <w:t>neighbours</w:t>
+      </w:r>
+      <w:proofErr w:type="spellEnd"/>
+      <w:r>
+        <w:rPr>
+          <w:rFonts w:eastAsia="Times New Roman" w:cs="Times New Roman"/>
+        </w:rPr>
+        <w:t xml:space="preserve">.  Wrapping it in </w:t>
+      </w:r>
+      <w:proofErr w:type="spellStart"/>
+      <w:proofErr w:type="gramStart"/>
+      <w:r>
+        <w:rPr>
+          <w:rFonts w:eastAsia="Times New Roman" w:cs="Times New Roman"/>
+        </w:rPr>
+        <w:t>imblearn.Pipeline</w:t>
+      </w:r>
+      <w:proofErr w:type="spellEnd"/>
+      <w:proofErr w:type="gramEnd"/>
+      <w:r>
+        <w:rPr>
+          <w:rFonts w:eastAsia="Times New Roman" w:cs="Times New Roman"/>
+        </w:rPr>
+        <w:t xml:space="preserve"> keeps the synthesis inside training folds only, so validation-fold accuracy is never inflated.  </w:t>
+      </w:r>
+      <w:proofErr w:type="spellStart"/>
+      <w:r>
+        <w:rPr>
+          <w:rFonts w:eastAsia="Times New Roman" w:cs="Times New Roman"/>
+        </w:rPr>
+        <w:t>k_neighbors</w:t>
+      </w:r>
+      <w:proofErr w:type="spellEnd"/>
+      <w:r>
+        <w:rPr>
+          <w:rFonts w:eastAsia="Times New Roman" w:cs="Times New Roman"/>
+        </w:rPr>
+        <w:t xml:space="preserve"> is set per target below the minority training-fold count; </w:t>
+      </w:r>
+      <w:proofErr w:type="spellStart"/>
+      <w:r>
+        <w:rPr>
+          <w:rFonts w:eastAsia="Times New Roman" w:cs="Times New Roman"/>
+        </w:rPr>
+        <w:t>GridSearchCV</w:t>
+      </w:r>
+      <w:proofErr w:type="spellEnd"/>
+      <w:r>
+        <w:rPr>
+          <w:rFonts w:eastAsia="Times New Roman" w:cs="Times New Roman"/>
+        </w:rPr>
+        <w:t xml:space="preserve"> picks hyperparameters on macro-F1 with </w:t>
+      </w:r>
+      <w:proofErr w:type="spellStart"/>
+      <w:proofErr w:type="gramStart"/>
+      <w:r>
+        <w:rPr>
+          <w:rFonts w:eastAsia="Times New Roman" w:cs="Times New Roman"/>
+        </w:rPr>
+        <w:t>StratifiedKFold</w:t>
+      </w:r>
+      <w:proofErr w:type="spellEnd"/>
+      <w:r>
+        <w:rPr>
+          <w:rFonts w:eastAsia="Times New Roman" w:cs="Times New Roman"/>
+        </w:rPr>
+        <w:t>(</w:t>
+      </w:r>
+      <w:proofErr w:type="gramEnd"/>
+      <w:r>
+        <w:rPr>
+          <w:rFonts w:eastAsia="Times New Roman" w:cs="Times New Roman"/>
+        </w:rPr>
+        <w:t xml:space="preserve">5, shuffle=True, </w:t>
+      </w:r>
+      <w:proofErr w:type="spellStart"/>
+      <w:r>
+        <w:rPr>
+          <w:rFonts w:eastAsia="Times New Roman" w:cs="Times New Roman"/>
+        </w:rPr>
+        <w:t>random_state</w:t>
+      </w:r>
+      <w:proofErr w:type="spellEnd"/>
+      <w:r>
+        <w:rPr>
+          <w:rFonts w:eastAsia="Times New Roman" w:cs="Times New Roman"/>
+        </w:rPr>
+        <w:t>=42).</w:t>
+      </w:r>
+    </w:p>
+    <w:p>
+      <w:pPr>
+        <w:pStyle w:val="Heading5"/>
+        <w:spacing w:before="180" w:after="60"/>
+      </w:pPr>
+      <w:r>
+        <w:rPr>
+          <w:rFonts w:ascii="Times New Roman" w:eastAsia="Times New Roman" w:hAnsi="Times New Roman" w:cs="Times New Roman"/>
+          <w:b/>
+          <w:color w:val="000000"/>
+          <w:sz w:val="24"/>
+        </w:rPr>
+        <w:t>2.6.9   Per-target feature exclusions</w:t>
+      </w:r>
+    </w:p>
+    <w:p>
+      <w:pPr>
+        <w:spacing w:after="160" w:line="336" w:lineRule="auto"/>
+        <w:jc w:val="both"/>
+      </w:pPr>
+      <w:r>
+        <w:rPr>
+          <w:rFonts w:eastAsia="Times New Roman" w:cs="Times New Roman"/>
+        </w:rPr>
+        <w:t xml:space="preserve">Each target excludes the survey inputs that directly define its Stage-1 label (otherwise the model would </w:t>
+      </w:r>
+      <w:proofErr w:type="spellStart"/>
+      <w:r>
+        <w:rPr>
+          <w:rFonts w:eastAsia="Times New Roman" w:cs="Times New Roman"/>
+        </w:rPr>
+        <w:t>memorise</w:t>
+      </w:r>
+      <w:proofErr w:type="spellEnd"/>
+      <w:r>
+        <w:rPr>
+          <w:rFonts w:eastAsia="Times New Roman" w:cs="Times New Roman"/>
+        </w:rPr>
+        <w:t xml:space="preserve"> the rule).  Posture additionally receives the 11 RULA components and 8 QEC scores, giving 63 total features.</w:t>
       </w:r>
     </w:p>
     <w:tbl>
@@ -3878,13 +5028,31 @@
             <w:pPr>
               <w:spacing w:before="20" w:after="20"/>
             </w:pPr>
-            <w:r>
-              <w:rPr>
-                <w:rFonts w:eastAsia="Times New Roman" w:cs="Times New Roman"/>
-                <w:sz w:val="20"/>
-              </w:rPr>
-              <w:t>force_exertion, force_x_age</w:t>
-            </w:r>
+            <w:proofErr w:type="spellStart"/>
+            <w:r>
+              <w:rPr>
+                <w:rFonts w:eastAsia="Times New Roman" w:cs="Times New Roman"/>
+                <w:sz w:val="20"/>
+              </w:rPr>
+              <w:t>force_exertion</w:t>
+            </w:r>
+            <w:proofErr w:type="spellEnd"/>
+            <w:r>
+              <w:rPr>
+                <w:rFonts w:eastAsia="Times New Roman" w:cs="Times New Roman"/>
+                <w:sz w:val="20"/>
+              </w:rPr>
+              <w:t xml:space="preserve">, </w:t>
+            </w:r>
+            <w:proofErr w:type="spellStart"/>
+            <w:r>
+              <w:rPr>
+                <w:rFonts w:eastAsia="Times New Roman" w:cs="Times New Roman"/>
+                <w:sz w:val="20"/>
+              </w:rPr>
+              <w:t>force_x_age</w:t>
+            </w:r>
+            <w:proofErr w:type="spellEnd"/>
           </w:p>
         </w:tc>
         <w:tc>
@@ -3936,13 +5104,47 @@
             <w:pPr>
               <w:spacing w:before="20" w:after="20"/>
             </w:pPr>
-            <w:r>
-              <w:rPr>
-                <w:rFonts w:eastAsia="Times New Roman" w:cs="Times New Roman"/>
-                <w:sz w:val="20"/>
-              </w:rPr>
-              <w:t>deliveries_num, work_hours_num, deliv_x_days</w:t>
-            </w:r>
+            <w:proofErr w:type="spellStart"/>
+            <w:r>
+              <w:rPr>
+                <w:rFonts w:eastAsia="Times New Roman" w:cs="Times New Roman"/>
+                <w:sz w:val="20"/>
+              </w:rPr>
+              <w:t>deliveries_num</w:t>
+            </w:r>
+            <w:proofErr w:type="spellEnd"/>
+            <w:r>
+              <w:rPr>
+                <w:rFonts w:eastAsia="Times New Roman" w:cs="Times New Roman"/>
+                <w:sz w:val="20"/>
+              </w:rPr>
+              <w:t xml:space="preserve">, </w:t>
+            </w:r>
+            <w:proofErr w:type="spellStart"/>
+            <w:r>
+              <w:rPr>
+                <w:rFonts w:eastAsia="Times New Roman" w:cs="Times New Roman"/>
+                <w:sz w:val="20"/>
+              </w:rPr>
+              <w:t>work_hours_num</w:t>
+            </w:r>
+            <w:proofErr w:type="spellEnd"/>
+            <w:r>
+              <w:rPr>
+                <w:rFonts w:eastAsia="Times New Roman" w:cs="Times New Roman"/>
+                <w:sz w:val="20"/>
+              </w:rPr>
+              <w:t xml:space="preserve">, </w:t>
+            </w:r>
+            <w:proofErr w:type="spellStart"/>
+            <w:r>
+              <w:rPr>
+                <w:rFonts w:eastAsia="Times New Roman" w:cs="Times New Roman"/>
+                <w:sz w:val="20"/>
+              </w:rPr>
+              <w:t>deliv_x_days</w:t>
+            </w:r>
+            <w:proofErr w:type="spellEnd"/>
           </w:p>
         </w:tc>
         <w:tc>
@@ -3994,13 +5196,31 @@
             <w:pPr>
               <w:spacing w:before="20" w:after="20"/>
             </w:pPr>
-            <w:r>
-              <w:rPr>
-                <w:rFonts w:eastAsia="Times New Roman" w:cs="Times New Roman"/>
-                <w:sz w:val="20"/>
-              </w:rPr>
-              <w:t>work_hours_num, vibration_index</w:t>
-            </w:r>
+            <w:proofErr w:type="spellStart"/>
+            <w:r>
+              <w:rPr>
+                <w:rFonts w:eastAsia="Times New Roman" w:cs="Times New Roman"/>
+                <w:sz w:val="20"/>
+              </w:rPr>
+              <w:t>work_hours_num</w:t>
+            </w:r>
+            <w:proofErr w:type="spellEnd"/>
+            <w:r>
+              <w:rPr>
+                <w:rFonts w:eastAsia="Times New Roman" w:cs="Times New Roman"/>
+                <w:sz w:val="20"/>
+              </w:rPr>
+              <w:t xml:space="preserve">, </w:t>
+            </w:r>
+            <w:proofErr w:type="spellStart"/>
+            <w:r>
+              <w:rPr>
+                <w:rFonts w:eastAsia="Times New Roman" w:cs="Times New Roman"/>
+                <w:sz w:val="20"/>
+              </w:rPr>
+              <w:t>vibration_index</w:t>
+            </w:r>
+            <w:proofErr w:type="spellEnd"/>
           </w:p>
         </w:tc>
         <w:tc>
@@ -4052,13 +5272,47 @@
             <w:pPr>
               <w:spacing w:before="20" w:after="20"/>
             </w:pPr>
-            <w:r>
-              <w:rPr>
-                <w:rFonts w:eastAsia="Times New Roman" w:cs="Times New Roman"/>
-                <w:sz w:val="20"/>
-              </w:rPr>
-              <w:t>vibration_index, vehicle_rank, work_hours_num</w:t>
-            </w:r>
+            <w:proofErr w:type="spellStart"/>
+            <w:r>
+              <w:rPr>
+                <w:rFonts w:eastAsia="Times New Roman" w:cs="Times New Roman"/>
+                <w:sz w:val="20"/>
+              </w:rPr>
+              <w:t>vibration_index</w:t>
+            </w:r>
+            <w:proofErr w:type="spellEnd"/>
+            <w:r>
+              <w:rPr>
+                <w:rFonts w:eastAsia="Times New Roman" w:cs="Times New Roman"/>
+                <w:sz w:val="20"/>
+              </w:rPr>
+              <w:t xml:space="preserve">, </w:t>
+            </w:r>
+            <w:proofErr w:type="spellStart"/>
+            <w:r>
+              <w:rPr>
+                <w:rFonts w:eastAsia="Times New Roman" w:cs="Times New Roman"/>
+                <w:sz w:val="20"/>
+              </w:rPr>
+              <w:t>vehicle_rank</w:t>
+            </w:r>
+            <w:proofErr w:type="spellEnd"/>
+            <w:r>
+              <w:rPr>
+                <w:rFonts w:eastAsia="Times New Roman" w:cs="Times New Roman"/>
+                <w:sz w:val="20"/>
+              </w:rPr>
+              <w:t xml:space="preserve">, </w:t>
+            </w:r>
+            <w:proofErr w:type="spellStart"/>
+            <w:r>
+              <w:rPr>
+                <w:rFonts w:eastAsia="Times New Roman" w:cs="Times New Roman"/>
+                <w:sz w:val="20"/>
+              </w:rPr>
+              <w:t>work_hours_num</w:t>
+            </w:r>
+            <w:proofErr w:type="spellEnd"/>
           </w:p>
         </w:tc>
         <w:tc>
@@ -4110,13 +5364,31 @@
             <w:pPr>
               <w:spacing w:before="20" w:after="20"/>
             </w:pPr>
-            <w:r>
-              <w:rPr>
-                <w:rFonts w:eastAsia="Times New Roman" w:cs="Times New Roman"/>
-                <w:sz w:val="20"/>
-              </w:rPr>
-              <w:t>carrying_contact_rank, work_hours_num</w:t>
-            </w:r>
+            <w:proofErr w:type="spellStart"/>
+            <w:r>
+              <w:rPr>
+                <w:rFonts w:eastAsia="Times New Roman" w:cs="Times New Roman"/>
+                <w:sz w:val="20"/>
+              </w:rPr>
+              <w:t>carrying_contact_rank</w:t>
+            </w:r>
+            <w:proofErr w:type="spellEnd"/>
+            <w:r>
+              <w:rPr>
+                <w:rFonts w:eastAsia="Times New Roman" w:cs="Times New Roman"/>
+                <w:sz w:val="20"/>
+              </w:rPr>
+              <w:t xml:space="preserve">, </w:t>
+            </w:r>
+            <w:proofErr w:type="spellStart"/>
+            <w:r>
+              <w:rPr>
+                <w:rFonts w:eastAsia="Times New Roman" w:cs="Times New Roman"/>
+                <w:sz w:val="20"/>
+              </w:rPr>
+              <w:t>work_hours_num</w:t>
+            </w:r>
+            <w:proofErr w:type="spellEnd"/>
           </w:p>
         </w:tc>
         <w:tc>
@@ -4239,7 +5511,77 @@
         <w:rPr>
           <w:rFonts w:eastAsia="Times New Roman" w:cs="Times New Roman"/>
         </w:rPr>
-        <w:t>Phase 7 (07_evaluation.ipynb) uses cross_val_predict for out-of-fold predictions and writes per-class precision / recall / F1 / support, confusion matrices, one-vs-rest ROC curves with per-class AUC (macro AUC is the unweighted mean), and feature importance (feature_importances_ for tree models, abs(coef_) for Logistic Regression).</w:t>
+        <w:t>Phase 7 (07_</w:t>
+      </w:r>
+      <w:proofErr w:type="gramStart"/>
+      <w:r>
+        <w:rPr>
+          <w:rFonts w:eastAsia="Times New Roman" w:cs="Times New Roman"/>
+        </w:rPr>
+        <w:t>evaluation.ipynb</w:t>
+      </w:r>
+      <w:proofErr w:type="gramEnd"/>
+      <w:r>
+        <w:rPr>
+          <w:rFonts w:eastAsia="Times New Roman" w:cs="Times New Roman"/>
+        </w:rPr>
+        <w:t xml:space="preserve">) uses </w:t>
+      </w:r>
+      <w:proofErr w:type="spellStart"/>
+      <w:r>
+        <w:rPr>
+          <w:rFonts w:eastAsia="Times New Roman" w:cs="Times New Roman"/>
+        </w:rPr>
+        <w:t>cross_val_predict</w:t>
+      </w:r>
+      <w:proofErr w:type="spellEnd"/>
+      <w:r>
+        <w:rPr>
+          <w:rFonts w:eastAsia="Times New Roman" w:cs="Times New Roman"/>
+        </w:rPr>
+        <w:t xml:space="preserve"> for out-of-fold predictions and writes per-class precision / recall / F1 / support, confusion matrices, one-vs-rest ROC curves with per-class AUC (</w:t>
+      </w:r>
+      <w:proofErr w:type="gramStart"/>
+      <w:r>
+        <w:rPr>
+          <w:rFonts w:eastAsia="Times New Roman" w:cs="Times New Roman"/>
+        </w:rPr>
+        <w:t>macro AUC</w:t>
+      </w:r>
+      <w:proofErr w:type="gramEnd"/>
+      <w:r>
+        <w:rPr>
+          <w:rFonts w:eastAsia="Times New Roman" w:cs="Times New Roman"/>
+        </w:rPr>
+        <w:t xml:space="preserve"> is the unweighted mean), and feature importance (</w:t>
+      </w:r>
+      <w:proofErr w:type="spellStart"/>
+      <w:r>
+        <w:rPr>
+          <w:rFonts w:eastAsia="Times New Roman" w:cs="Times New Roman"/>
+        </w:rPr>
+        <w:t>feature_importances</w:t>
+      </w:r>
+      <w:proofErr w:type="spellEnd"/>
+      <w:r>
+        <w:rPr>
+          <w:rFonts w:eastAsia="Times New Roman" w:cs="Times New Roman"/>
+        </w:rPr>
+        <w:t>_ for tree models, abs(</w:t>
+      </w:r>
+      <w:proofErr w:type="spellStart"/>
+      <w:r>
+        <w:rPr>
+          <w:rFonts w:eastAsia="Times New Roman" w:cs="Times New Roman"/>
+        </w:rPr>
+        <w:t>coef</w:t>
+      </w:r>
+      <w:proofErr w:type="spellEnd"/>
+      <w:r>
+        <w:rPr>
+          <w:rFonts w:eastAsia="Times New Roman" w:cs="Times New Roman"/>
+        </w:rPr>
+        <w:t>_) for Logistic Regression).</w:t>
       </w:r>
     </w:p>
     <w:p>
@@ -4281,7 +5623,21 @@
         <w:rPr>
           <w:rFonts w:eastAsia="Times New Roman" w:cs="Times New Roman"/>
         </w:rPr>
-        <w:t>The full pipeline is implemented across seven Jupyter notebooks (01 through 07) plus a Streamlit application. Every notebook is designed to run standalone from its previous input file, so the whole pipeline can be regenerated end to end with a fixed random seed of 42.</w:t>
+        <w:t xml:space="preserve">The full pipeline is implemented across seven Jupyter notebooks (01 through 07) plus a </w:t>
+      </w:r>
+      <w:proofErr w:type="spellStart"/>
+      <w:r>
+        <w:rPr>
+          <w:rFonts w:eastAsia="Times New Roman" w:cs="Times New Roman"/>
+        </w:rPr>
+        <w:t>Streamlit</w:t>
+      </w:r>
+      <w:proofErr w:type="spellEnd"/>
+      <w:r>
+        <w:rPr>
+          <w:rFonts w:eastAsia="Times New Roman" w:cs="Times New Roman"/>
+        </w:rPr>
+        <w:t xml:space="preserve"> application. Every notebook is designed to run standalone from its previous input file, so the whole pipeline can be regenerated end to end with a fixed random seed of 42.</w:t>
       </w:r>
     </w:p>
     <w:p>
@@ -4293,7 +5649,21 @@
         <w:rPr>
           <w:rFonts w:eastAsia="Times New Roman" w:cs="Times New Roman"/>
         </w:rPr>
-        <w:t>01_data_cleaning normalises the raw CSV and validates row counts.</w:t>
+        <w:t xml:space="preserve">01_data_cleaning </w:t>
+      </w:r>
+      <w:proofErr w:type="spellStart"/>
+      <w:r>
+        <w:rPr>
+          <w:rFonts w:eastAsia="Times New Roman" w:cs="Times New Roman"/>
+        </w:rPr>
+        <w:t>normalises</w:t>
+      </w:r>
+      <w:proofErr w:type="spellEnd"/>
+      <w:r>
+        <w:rPr>
+          <w:rFonts w:eastAsia="Times New Roman" w:cs="Times New Roman"/>
+        </w:rPr>
+        <w:t xml:space="preserve"> the raw CSV and validates row counts.</w:t>
       </w:r>
     </w:p>
     <w:p>
@@ -4305,7 +5675,21 @@
         <w:rPr>
           <w:rFonts w:eastAsia="Times New Roman" w:cs="Times New Roman"/>
         </w:rPr>
-        <w:t>02_feature_engineering encodes categoricals, derives composite scores, aliases the 18 binary items, and merges the posture observations by severity rank.</w:t>
+        <w:t xml:space="preserve">02_feature_engineering encodes </w:t>
+      </w:r>
+      <w:proofErr w:type="spellStart"/>
+      <w:r>
+        <w:rPr>
+          <w:rFonts w:eastAsia="Times New Roman" w:cs="Times New Roman"/>
+        </w:rPr>
+        <w:t>categoricals</w:t>
+      </w:r>
+      <w:proofErr w:type="spellEnd"/>
+      <w:r>
+        <w:rPr>
+          <w:rFonts w:eastAsia="Times New Roman" w:cs="Times New Roman"/>
+        </w:rPr>
+        <w:t>, derives composite scores, aliases the 18 binary items, and merges the posture observations by severity rank.</w:t>
       </w:r>
     </w:p>
     <w:p>
@@ -4353,7 +5737,21 @@
         <w:rPr>
           <w:rFonts w:eastAsia="Times New Roman" w:cs="Times New Roman"/>
         </w:rPr>
-        <w:t>06_modeling runs SMOTE plus GridSearchCV across 7 algorithms per target and keeps the best by F1 macro.</w:t>
+        <w:t xml:space="preserve">06_modeling runs SMOTE plus </w:t>
+      </w:r>
+      <w:proofErr w:type="spellStart"/>
+      <w:r>
+        <w:rPr>
+          <w:rFonts w:eastAsia="Times New Roman" w:cs="Times New Roman"/>
+        </w:rPr>
+        <w:t>GridSearchCV</w:t>
+      </w:r>
+      <w:proofErr w:type="spellEnd"/>
+      <w:r>
+        <w:rPr>
+          <w:rFonts w:eastAsia="Times New Roman" w:cs="Times New Roman"/>
+        </w:rPr>
+        <w:t xml:space="preserve"> across 7 algorithms per target and keeps the best by F1 macro.</w:t>
       </w:r>
     </w:p>
     <w:p>
@@ -4442,7 +5840,21 @@
         <w:rPr>
           <w:rFonts w:eastAsia="Times New Roman" w:cs="Times New Roman"/>
         </w:rPr>
-        <w:t>Each participant gave verbal consent before either instrument was administered. The 36-item Google Form was completed on a researcher-provided phone in about 15 to 20 minutes. Posture was recorded on paper by a trained observer during a natural delivery task, capturing the 11 RULA elements and 8 QEC region / exposure scores in one pass. Riders whose demographic or NMQ responses were incomplete after follow-up were excluded and are not part of the final 182. Data was anonymised at the point of collection; no rider identifiers appear in the released model_ready.csv or posture_data.xlsx files.</w:t>
+        <w:t xml:space="preserve">Each participant gave verbal consent before either instrument was administered. The 36-item Google Form was completed on a researcher-provided phone in about 15 to 20 minutes. Posture was recorded on paper by a trained observer during a natural delivery task, capturing the 11 RULA elements and 8 QEC region / exposure scores in one pass. Riders whose demographic or NMQ responses were incomplete after follow-up were excluded and are not part of the final 182. Data was </w:t>
+      </w:r>
+      <w:proofErr w:type="spellStart"/>
+      <w:r>
+        <w:rPr>
+          <w:rFonts w:eastAsia="Times New Roman" w:cs="Times New Roman"/>
+        </w:rPr>
+        <w:t>anonymised</w:t>
+      </w:r>
+      <w:proofErr w:type="spellEnd"/>
+      <w:r>
+        <w:rPr>
+          <w:rFonts w:eastAsia="Times New Roman" w:cs="Times New Roman"/>
+        </w:rPr>
+        <w:t xml:space="preserve"> at the point of collection; no rider identifiers appear in the released model_ready.csv or posture_data.xlsx files.</w:t>
       </w:r>
     </w:p>
     <w:p>
@@ -4468,7 +5880,21 @@
         <w:rPr>
           <w:rFonts w:eastAsia="Times New Roman" w:cs="Times New Roman"/>
         </w:rPr>
-        <w:t>Data preparation ran in two notebooks. 01_data_cleaning loaded the raw Google Form CSV, standardised text answers to canonical Yes / No values, corrected a handful of column-name typos, and dropped rows that were incomplete after follow-up. The cleaned CSV was 182 rows and 48 columns.</w:t>
+        <w:t xml:space="preserve">Data preparation ran in two notebooks. 01_data_cleaning loaded the raw Google Form CSV, </w:t>
+      </w:r>
+      <w:proofErr w:type="spellStart"/>
+      <w:r>
+        <w:rPr>
+          <w:rFonts w:eastAsia="Times New Roman" w:cs="Times New Roman"/>
+        </w:rPr>
+        <w:t>standardised</w:t>
+      </w:r>
+      <w:proofErr w:type="spellEnd"/>
+      <w:r>
+        <w:rPr>
+          <w:rFonts w:eastAsia="Times New Roman" w:cs="Times New Roman"/>
+        </w:rPr>
+        <w:t xml:space="preserve"> text answers to canonical Yes / No values, corrected a handful of column-name typos, and dropped rows that were incomplete after follow-up. The cleaned CSV was 182 rows and 48 columns.</w:t>
       </w:r>
     </w:p>
     <w:p>
@@ -4480,7 +5906,119 @@
         <w:rPr>
           <w:rFonts w:eastAsia="Times New Roman" w:cs="Times New Roman"/>
         </w:rPr>
-        <w:t>02_feature_engineering converted the cleaned CSV into the model-ready feature set. Ordered categorical bands (age, education, income, job duration, working hours, working days, deliveries per day, rest break) were encoded to consecutive integers preserving order. Vehicle type and carrying mode were converted to ranks so motorbike ranks higher than scooter for vibration exposure and handheld ranks higher than backpack and bike storage for contact stress. Composite scores were computed: workload_score as the mean of the six NASA-TLX items (with the dissatisfied item reversed), fatigue_score as the mean of the six Borg items, force_exertion as the Borg lifting item, and vibration_index as vehicle_rank times work_hours_num. Five product-form interactions were added (workload times fatigue, workload times age, force times age, fatigue times job duration, deliveries times days). The eighteen NMQ and 7-day items and the five outcome follow-ups were converted to short-named binary aliases (nmq_neck, d7_lower_back, out_reduced_perf, and so on).</w:t>
+        <w:t xml:space="preserve">02_feature_engineering converted the cleaned CSV into the model-ready feature set. Ordered categorical bands (age, education, income, job duration, working hours, working days, deliveries per day, rest break) were encoded to consecutive integers preserving order. Vehicle type and carrying mode were converted to ranks so motorbike ranks higher than scooter for vibration exposure and handheld ranks higher than backpack and bike storage for contact stress. Composite scores were computed: </w:t>
+      </w:r>
+      <w:proofErr w:type="spellStart"/>
+      <w:r>
+        <w:rPr>
+          <w:rFonts w:eastAsia="Times New Roman" w:cs="Times New Roman"/>
+        </w:rPr>
+        <w:t>workload_score</w:t>
+      </w:r>
+      <w:proofErr w:type="spellEnd"/>
+      <w:r>
+        <w:rPr>
+          <w:rFonts w:eastAsia="Times New Roman" w:cs="Times New Roman"/>
+        </w:rPr>
+        <w:t xml:space="preserve"> as the mean of the six NASA-TLX items (with the dissatisfied item reversed), </w:t>
+      </w:r>
+      <w:proofErr w:type="spellStart"/>
+      <w:r>
+        <w:rPr>
+          <w:rFonts w:eastAsia="Times New Roman" w:cs="Times New Roman"/>
+        </w:rPr>
+        <w:t>fatigue_score</w:t>
+      </w:r>
+      <w:proofErr w:type="spellEnd"/>
+      <w:r>
+        <w:rPr>
+          <w:rFonts w:eastAsia="Times New Roman" w:cs="Times New Roman"/>
+        </w:rPr>
+        <w:t xml:space="preserve"> as the mean of the six Borg items, </w:t>
+      </w:r>
+      <w:proofErr w:type="spellStart"/>
+      <w:r>
+        <w:rPr>
+          <w:rFonts w:eastAsia="Times New Roman" w:cs="Times New Roman"/>
+        </w:rPr>
+        <w:t>force_exertion</w:t>
+      </w:r>
+      <w:proofErr w:type="spellEnd"/>
+      <w:r>
+        <w:rPr>
+          <w:rFonts w:eastAsia="Times New Roman" w:cs="Times New Roman"/>
+        </w:rPr>
+        <w:t xml:space="preserve"> as the Borg lifting item, and </w:t>
+      </w:r>
+      <w:proofErr w:type="spellStart"/>
+      <w:r>
+        <w:rPr>
+          <w:rFonts w:eastAsia="Times New Roman" w:cs="Times New Roman"/>
+        </w:rPr>
+        <w:t>vibration_index</w:t>
+      </w:r>
+      <w:proofErr w:type="spellEnd"/>
+      <w:r>
+        <w:rPr>
+          <w:rFonts w:eastAsia="Times New Roman" w:cs="Times New Roman"/>
+        </w:rPr>
+        <w:t xml:space="preserve"> as </w:t>
+      </w:r>
+      <w:proofErr w:type="spellStart"/>
+      <w:r>
+        <w:rPr>
+          <w:rFonts w:eastAsia="Times New Roman" w:cs="Times New Roman"/>
+        </w:rPr>
+        <w:t>vehicle_rank</w:t>
+      </w:r>
+      <w:proofErr w:type="spellEnd"/>
+      <w:r>
+        <w:rPr>
+          <w:rFonts w:eastAsia="Times New Roman" w:cs="Times New Roman"/>
+        </w:rPr>
+        <w:t xml:space="preserve"> times </w:t>
+      </w:r>
+      <w:proofErr w:type="spellStart"/>
+      <w:r>
+        <w:rPr>
+          <w:rFonts w:eastAsia="Times New Roman" w:cs="Times New Roman"/>
+        </w:rPr>
+        <w:t>work_hours_num</w:t>
+      </w:r>
+      <w:proofErr w:type="spellEnd"/>
+      <w:r>
+        <w:rPr>
+          <w:rFonts w:eastAsia="Times New Roman" w:cs="Times New Roman"/>
+        </w:rPr>
+        <w:t>. Five product-form interactions were added (workload times fatigue, workload times age, force times age, fatigue times job duration, deliveries times days). The eighteen NMQ and 7-day items and the five outcome follow-ups were converted to short-named binary aliases (</w:t>
+      </w:r>
+      <w:proofErr w:type="spellStart"/>
+      <w:r>
+        <w:rPr>
+          <w:rFonts w:eastAsia="Times New Roman" w:cs="Times New Roman"/>
+        </w:rPr>
+        <w:t>nmq_neck</w:t>
+      </w:r>
+      <w:proofErr w:type="spellEnd"/>
+      <w:r>
+        <w:rPr>
+          <w:rFonts w:eastAsia="Times New Roman" w:cs="Times New Roman"/>
+        </w:rPr>
+        <w:t xml:space="preserve">, d7_lower_back, </w:t>
+      </w:r>
+      <w:proofErr w:type="spellStart"/>
+      <w:r>
+        <w:rPr>
+          <w:rFonts w:eastAsia="Times New Roman" w:cs="Times New Roman"/>
+        </w:rPr>
+        <w:t>out_reduced_perf</w:t>
+      </w:r>
+      <w:proofErr w:type="spellEnd"/>
+      <w:r>
+        <w:rPr>
+          <w:rFonts w:eastAsia="Times New Roman" w:cs="Times New Roman"/>
+        </w:rPr>
+        <w:t>, and so on).</w:t>
       </w:r>
     </w:p>
     <w:p>
@@ -4519,7 +6057,21 @@
         <w:rPr>
           <w:rFonts w:eastAsia="Times New Roman" w:cs="Times New Roman"/>
         </w:rPr>
-        <w:t>Two independent statistical analyses were run in 05_stats on the model-ready CSV. First, six chi-square tests of independence checked whether each Stage-1 risk-factor band was associated with a binary discomfort outcome; the tests reported chi2, degrees of freedom, and a Bonferroni-adjusted p-value. Second, a multivariable logistic regression fitted with statsmodels estimated odds ratios for eleven predictors (age, income, education, job duration, workload score, fatigue score, force exertion, vibration index, contact rank, hours, days) with self-reported discomfort as the outcome. Results were reported as OR with 95 percent confidence intervals.</w:t>
+        <w:t xml:space="preserve">Two independent statistical analyses were run in 05_stats on the model-ready CSV. First, six chi-square tests of independence checked whether each Stage-1 risk-factor band was associated with a binary discomfort outcome; the tests reported chi2, degrees of freedom, and a Bonferroni-adjusted p-value. Second, a multivariable logistic regression fitted with </w:t>
+      </w:r>
+      <w:proofErr w:type="spellStart"/>
+      <w:r>
+        <w:rPr>
+          <w:rFonts w:eastAsia="Times New Roman" w:cs="Times New Roman"/>
+        </w:rPr>
+        <w:t>statsmodels</w:t>
+      </w:r>
+      <w:proofErr w:type="spellEnd"/>
+      <w:r>
+        <w:rPr>
+          <w:rFonts w:eastAsia="Times New Roman" w:cs="Times New Roman"/>
+        </w:rPr>
+        <w:t xml:space="preserve"> estimated odds ratios for eleven predictors (age, income, education, job duration, workload score, fatigue score, force exertion, vibration index, contact rank, hours, days) with self-reported discomfort as the outcome. Results were reported as OR with 95 percent confidence intervals.</w:t>
       </w:r>
     </w:p>
     <w:p>
@@ -4531,7 +6083,89 @@
         <w:rPr>
           <w:rFonts w:eastAsia="Times New Roman" w:cs="Times New Roman"/>
         </w:rPr>
-        <w:t>Model training ran in 06_modeling. Every one of the seven candidate algorithms was wrapped in an imblearn.Pipeline of SMOTE followed by the classifier and hyperparameter-tuned via GridSearchCV. For each of the six risk-factor targets, this expanded to a full five-fold stratified cross-validation over the algorithm's hyperparameter grid. Across the six targets and seven algorithms, forty-two target-algorithm training runs were carried out. Best-by-macro-F1 was selected per target and the winning pipeline was refit on the full sample and persisted with joblib.dump to outputs/models/best_&lt;factor&gt;.pkl. The per-target feature exclusions listed in Section 2.6.9 were applied before each training run so no model could memorise its Stage-1 rule.</w:t>
+        <w:t xml:space="preserve">Model training ran in 06_modeling. Every one of the seven candidate algorithms was wrapped in an </w:t>
+      </w:r>
+      <w:proofErr w:type="spellStart"/>
+      <w:proofErr w:type="gramStart"/>
+      <w:r>
+        <w:rPr>
+          <w:rFonts w:eastAsia="Times New Roman" w:cs="Times New Roman"/>
+        </w:rPr>
+        <w:t>imblearn.Pipeline</w:t>
+      </w:r>
+      <w:proofErr w:type="spellEnd"/>
+      <w:proofErr w:type="gramEnd"/>
+      <w:r>
+        <w:rPr>
+          <w:rFonts w:eastAsia="Times New Roman" w:cs="Times New Roman"/>
+        </w:rPr>
+        <w:t xml:space="preserve"> of SMOTE followed by the classifier and hyperparameter-tuned via </w:t>
+      </w:r>
+      <w:proofErr w:type="spellStart"/>
+      <w:r>
+        <w:rPr>
+          <w:rFonts w:eastAsia="Times New Roman" w:cs="Times New Roman"/>
+        </w:rPr>
+        <w:t>GridSearchCV</w:t>
+      </w:r>
+      <w:proofErr w:type="spellEnd"/>
+      <w:r>
+        <w:rPr>
+          <w:rFonts w:eastAsia="Times New Roman" w:cs="Times New Roman"/>
+        </w:rPr>
+        <w:t xml:space="preserve">. For each of the six risk-factor targets, this expanded to a full five-fold stratified cross-validation over the algorithm's hyperparameter grid. Across the six targets and seven algorithms, forty-two target-algorithm training runs were carried out. Best-by-macro-F1 was selected per target and the winning pipeline was refit on the full sample and persisted with </w:t>
+      </w:r>
+      <w:proofErr w:type="spellStart"/>
+      <w:proofErr w:type="gramStart"/>
+      <w:r>
+        <w:rPr>
+          <w:rFonts w:eastAsia="Times New Roman" w:cs="Times New Roman"/>
+        </w:rPr>
+        <w:t>joblib.dump</w:t>
+      </w:r>
+      <w:proofErr w:type="spellEnd"/>
+      <w:proofErr w:type="gramEnd"/>
+      <w:r>
+        <w:rPr>
+          <w:rFonts w:eastAsia="Times New Roman" w:cs="Times New Roman"/>
+        </w:rPr>
+        <w:t xml:space="preserve"> to outputs/models/best_&lt;factor</w:t>
+      </w:r>
+      <w:proofErr w:type="gramStart"/>
+      <w:r>
+        <w:rPr>
+          <w:rFonts w:eastAsia="Times New Roman" w:cs="Times New Roman"/>
+        </w:rPr>
+        <w:t>&gt;.</w:t>
+      </w:r>
+      <w:proofErr w:type="spellStart"/>
+      <w:r>
+        <w:rPr>
+          <w:rFonts w:eastAsia="Times New Roman" w:cs="Times New Roman"/>
+        </w:rPr>
+        <w:t>pkl</w:t>
+      </w:r>
+      <w:proofErr w:type="spellEnd"/>
+      <w:proofErr w:type="gramEnd"/>
+      <w:r>
+        <w:rPr>
+          <w:rFonts w:eastAsia="Times New Roman" w:cs="Times New Roman"/>
+        </w:rPr>
+        <w:t xml:space="preserve">. The per-target feature exclusions listed in Section 2.6.9 were applied before each training run so no model could </w:t>
+      </w:r>
+      <w:proofErr w:type="spellStart"/>
+      <w:r>
+        <w:rPr>
+          <w:rFonts w:eastAsia="Times New Roman" w:cs="Times New Roman"/>
+        </w:rPr>
+        <w:t>memorise</w:t>
+      </w:r>
+      <w:proofErr w:type="spellEnd"/>
+      <w:r>
+        <w:rPr>
+          <w:rFonts w:eastAsia="Times New Roman" w:cs="Times New Roman"/>
+        </w:rPr>
+        <w:t xml:space="preserve"> its Stage-1 rule.</w:t>
       </w:r>
     </w:p>
     <w:p>
@@ -4543,7 +6177,63 @@
         <w:rPr>
           <w:rFonts w:eastAsia="Times New Roman" w:cs="Times New Roman"/>
         </w:rPr>
-        <w:t>07_evaluation produced the reporting artefacts. cross_val_predict was used to generate out-of-fold predictions on the training set, and the following outputs were written: per-class precision, recall, F1, and support numbers via classification_report; confusion matrices per target; one-vs-rest ROC curves with per-class AUC (macro AUC is the unweighted mean of per-class AUCs); and feature importance plots (feature_importances_ for the tree-based winners, absolute value of coef_ for the Logistic Regression floor).</w:t>
+        <w:t xml:space="preserve">07_evaluation produced the reporting artefacts. </w:t>
+      </w:r>
+      <w:proofErr w:type="spellStart"/>
+      <w:r>
+        <w:rPr>
+          <w:rFonts w:eastAsia="Times New Roman" w:cs="Times New Roman"/>
+        </w:rPr>
+        <w:t>cross_val_predict</w:t>
+      </w:r>
+      <w:proofErr w:type="spellEnd"/>
+      <w:r>
+        <w:rPr>
+          <w:rFonts w:eastAsia="Times New Roman" w:cs="Times New Roman"/>
+        </w:rPr>
+        <w:t xml:space="preserve"> was used to generate out-of-fold predictions on the training set, and the following outputs were written: per-class precision, recall, F1, and support numbers via </w:t>
+      </w:r>
+      <w:proofErr w:type="spellStart"/>
+      <w:r>
+        <w:rPr>
+          <w:rFonts w:eastAsia="Times New Roman" w:cs="Times New Roman"/>
+        </w:rPr>
+        <w:t>classification_report</w:t>
+      </w:r>
+      <w:proofErr w:type="spellEnd"/>
+      <w:r>
+        <w:rPr>
+          <w:rFonts w:eastAsia="Times New Roman" w:cs="Times New Roman"/>
+        </w:rPr>
+        <w:t>; confusion matrices per target; one-vs-rest ROC curves with per-class AUC (macro AUC is the unweighted mean of per-class AUCs); and feature importance plots (</w:t>
+      </w:r>
+      <w:proofErr w:type="spellStart"/>
+      <w:r>
+        <w:rPr>
+          <w:rFonts w:eastAsia="Times New Roman" w:cs="Times New Roman"/>
+        </w:rPr>
+        <w:t>feature_importances</w:t>
+      </w:r>
+      <w:proofErr w:type="spellEnd"/>
+      <w:r>
+        <w:rPr>
+          <w:rFonts w:eastAsia="Times New Roman" w:cs="Times New Roman"/>
+        </w:rPr>
+        <w:t xml:space="preserve">_ for the tree-based winners, absolute value of </w:t>
+      </w:r>
+      <w:proofErr w:type="spellStart"/>
+      <w:r>
+        <w:rPr>
+          <w:rFonts w:eastAsia="Times New Roman" w:cs="Times New Roman"/>
+        </w:rPr>
+        <w:t>coef</w:t>
+      </w:r>
+      <w:proofErr w:type="spellEnd"/>
+      <w:r>
+        <w:rPr>
+          <w:rFonts w:eastAsia="Times New Roman" w:cs="Times New Roman"/>
+        </w:rPr>
+        <w:t>_ for the Logistic Regression floor).</w:t>
       </w:r>
     </w:p>
     <w:p>
@@ -4569,7 +6259,49 @@
         <w:rPr>
           <w:rFonts w:eastAsia="Times New Roman" w:cs="Times New Roman"/>
         </w:rPr>
-        <w:t>The Streamlit web application (app/streamlit_app.py) exposes a six-section form that mirrors the entire 36-item questionnaire plus the 11 RULA components and 8 QEC scores. Selectboxes cover demographics and work pattern; radios cover NMQ, 7-day, and outcome items; sliders cover NASA-TLX (0 to 100) and Borg CR10 (0 to 10); selectboxes cover RULA components; and number inputs cover the QEC scores with min / max ranges matched to the observed training data. Three sample-profile buttons (Low, Average, and High risk) fill the entire form on click so the reviewer can trigger a prediction in one step.</w:t>
+        <w:t xml:space="preserve">The </w:t>
+      </w:r>
+      <w:proofErr w:type="spellStart"/>
+      <w:r>
+        <w:rPr>
+          <w:rFonts w:eastAsia="Times New Roman" w:cs="Times New Roman"/>
+        </w:rPr>
+        <w:t>Streamlit</w:t>
+      </w:r>
+      <w:proofErr w:type="spellEnd"/>
+      <w:r>
+        <w:rPr>
+          <w:rFonts w:eastAsia="Times New Roman" w:cs="Times New Roman"/>
+        </w:rPr>
+        <w:t xml:space="preserve"> web application (app/streamlit_app.py) exposes a six-section form that mirrors the entire 36-item questionnaire plus the 11 RULA components and 8 QEC scores. </w:t>
+      </w:r>
+      <w:proofErr w:type="spellStart"/>
+      <w:r>
+        <w:rPr>
+          <w:rFonts w:eastAsia="Times New Roman" w:cs="Times New Roman"/>
+        </w:rPr>
+        <w:t>Selectboxes</w:t>
+      </w:r>
+      <w:proofErr w:type="spellEnd"/>
+      <w:r>
+        <w:rPr>
+          <w:rFonts w:eastAsia="Times New Roman" w:cs="Times New Roman"/>
+        </w:rPr>
+        <w:t xml:space="preserve"> cover demographics and work pattern; radios cover NMQ, 7-day, and outcome items; sliders cover NASA-TLX (0 to 100) and Borg CR10 (0 to 10); </w:t>
+      </w:r>
+      <w:proofErr w:type="spellStart"/>
+      <w:r>
+        <w:rPr>
+          <w:rFonts w:eastAsia="Times New Roman" w:cs="Times New Roman"/>
+        </w:rPr>
+        <w:t>selectboxes</w:t>
+      </w:r>
+      <w:proofErr w:type="spellEnd"/>
+      <w:r>
+        <w:rPr>
+          <w:rFonts w:eastAsia="Times New Roman" w:cs="Times New Roman"/>
+        </w:rPr>
+        <w:t xml:space="preserve"> cover RULA components; and number inputs cover the QEC scores with min / max ranges matched to the observed training data. Three sample-profile buttons (Low, Average, and High risk) fill the entire form on click so the reviewer can trigger a prediction in one step.</w:t>
       </w:r>
     </w:p>
     <w:p>
@@ -4581,14 +6313,70 @@
         <w:rPr>
           <w:rFonts w:eastAsia="Times New Roman" w:cs="Times New Roman"/>
         </w:rPr>
-        <w:t xml:space="preserve">On form submission, encode_rider assembles the 63-feature input vector, and predict_risks runs each of the six saved models. The Results page renders a coloured metric strip (green for Low, amber for Medium, red for High), a horizontal Altair bar chart of the same six factors sorted to match the metric strip, a summary banner that flags high-burden profiles, per-factor recommendation cards, and an </w:t>
+        <w:t xml:space="preserve">On form submission, </w:t>
+      </w:r>
+      <w:proofErr w:type="spellStart"/>
+      <w:r>
+        <w:rPr>
+          <w:rFonts w:eastAsia="Times New Roman" w:cs="Times New Roman"/>
+        </w:rPr>
+        <w:t>encode_rider</w:t>
+      </w:r>
+      <w:proofErr w:type="spellEnd"/>
+      <w:r>
+        <w:rPr>
+          <w:rFonts w:eastAsia="Times New Roman" w:cs="Times New Roman"/>
+        </w:rPr>
+        <w:t xml:space="preserve"> assembles the 63-feature input vector, and </w:t>
+      </w:r>
+      <w:proofErr w:type="spellStart"/>
+      <w:r>
+        <w:rPr>
+          <w:rFonts w:eastAsia="Times New Roman" w:cs="Times New Roman"/>
+        </w:rPr>
+        <w:t>predict_risks</w:t>
+      </w:r>
+      <w:proofErr w:type="spellEnd"/>
+      <w:r>
+        <w:rPr>
+          <w:rFonts w:eastAsia="Times New Roman" w:cs="Times New Roman"/>
+        </w:rPr>
+        <w:t xml:space="preserve"> runs each of the six saved models. The Results page renders a </w:t>
+      </w:r>
+      <w:proofErr w:type="spellStart"/>
+      <w:r>
+        <w:rPr>
+          <w:rFonts w:eastAsia="Times New Roman" w:cs="Times New Roman"/>
+        </w:rPr>
+        <w:t>coloured</w:t>
+      </w:r>
+      <w:proofErr w:type="spellEnd"/>
+      <w:r>
+        <w:rPr>
+          <w:rFonts w:eastAsia="Times New Roman" w:cs="Times New Roman"/>
+        </w:rPr>
+        <w:t xml:space="preserve"> metric strip (green for Low, amber for Medium, red for High), a horizontal Altair bar chart of the same six factors sorted to match the metric strip, a summary banner that flags high-burden profiles, per-factor recommendation cards, and an </w:t>
       </w:r>
       <w:r>
         <w:rPr>
           <w:rFonts w:eastAsia="Times New Roman" w:cs="Times New Roman"/>
         </w:rPr>
         <w:lastRenderedPageBreak/>
-        <w:t>expandable JSON view of the exact 63 feature values that were fed to the models. The app also has a Methodology page that summarises the pipeline and an About page carrying the institutional context.</w:t>
+        <w:t xml:space="preserve">expandable JSON view of the exact 63 feature values that were fed to the models. The app also has a Methodology page that </w:t>
+      </w:r>
+      <w:proofErr w:type="spellStart"/>
+      <w:r>
+        <w:rPr>
+          <w:rFonts w:eastAsia="Times New Roman" w:cs="Times New Roman"/>
+        </w:rPr>
+        <w:t>summarises</w:t>
+      </w:r>
+      <w:proofErr w:type="spellEnd"/>
+      <w:r>
+        <w:rPr>
+          <w:rFonts w:eastAsia="Times New Roman" w:cs="Times New Roman"/>
+        </w:rPr>
+        <w:t xml:space="preserve"> the pipeline and an About page carrying the institutional context.</w:t>
       </w:r>
     </w:p>
     <w:p>
@@ -4600,7 +6388,149 @@
         <w:rPr>
           <w:rFonts w:eastAsia="Times New Roman" w:cs="Times New Roman"/>
         </w:rPr>
-        <w:t>The app was deployed to Streamlit Community Cloud from the public GitHub repository. Deployment required pinning every runtime dependency in requirements.txt to the exact versions the models were trained with (streamlit 1.58, pandas 2.3, scikit-learn 1.7, xgboost 3.2, imbalanced-learn 0.14, plotly 6.8), because sklearn and xgboost pickles are not portable across minor versions. runtime.txt pins Python 3.13 to match the training environment. A .streamlit/config.toml carries the dark theme and a client.toolbarMode = viewer flag; CSS in the app suppresses the Fork button and 'View source on GitHub' icon that Streamlit Community Cloud injects on public-repo deploys. Every git push to the main branch auto-rebuilds and redeploys the app in about 30 seconds.</w:t>
+        <w:t xml:space="preserve">The app was deployed to </w:t>
+      </w:r>
+      <w:proofErr w:type="spellStart"/>
+      <w:r>
+        <w:rPr>
+          <w:rFonts w:eastAsia="Times New Roman" w:cs="Times New Roman"/>
+        </w:rPr>
+        <w:t>Streamlit</w:t>
+      </w:r>
+      <w:proofErr w:type="spellEnd"/>
+      <w:r>
+        <w:rPr>
+          <w:rFonts w:eastAsia="Times New Roman" w:cs="Times New Roman"/>
+        </w:rPr>
+        <w:t xml:space="preserve"> Community Cloud from the public GitHub repository. Deployment required pinning every runtime dependency in requirements.txt to the exact versions the models were trained with (</w:t>
+      </w:r>
+      <w:proofErr w:type="spellStart"/>
+      <w:r>
+        <w:rPr>
+          <w:rFonts w:eastAsia="Times New Roman" w:cs="Times New Roman"/>
+        </w:rPr>
+        <w:t>streamlit</w:t>
+      </w:r>
+      <w:proofErr w:type="spellEnd"/>
+      <w:r>
+        <w:rPr>
+          <w:rFonts w:eastAsia="Times New Roman" w:cs="Times New Roman"/>
+        </w:rPr>
+        <w:t xml:space="preserve"> 1.58, pandas 2.3, scikit-learn 1.7, </w:t>
+      </w:r>
+      <w:proofErr w:type="spellStart"/>
+      <w:r>
+        <w:rPr>
+          <w:rFonts w:eastAsia="Times New Roman" w:cs="Times New Roman"/>
+        </w:rPr>
+        <w:t>xgboost</w:t>
+      </w:r>
+      <w:proofErr w:type="spellEnd"/>
+      <w:r>
+        <w:rPr>
+          <w:rFonts w:eastAsia="Times New Roman" w:cs="Times New Roman"/>
+        </w:rPr>
+        <w:t xml:space="preserve"> 3.2, imbalanced-learn 0.14, </w:t>
+      </w:r>
+      <w:proofErr w:type="spellStart"/>
+      <w:r>
+        <w:rPr>
+          <w:rFonts w:eastAsia="Times New Roman" w:cs="Times New Roman"/>
+        </w:rPr>
+        <w:t>plotly</w:t>
+      </w:r>
+      <w:proofErr w:type="spellEnd"/>
+      <w:r>
+        <w:rPr>
+          <w:rFonts w:eastAsia="Times New Roman" w:cs="Times New Roman"/>
+        </w:rPr>
+        <w:t xml:space="preserve"> 6.8), because </w:t>
+      </w:r>
+      <w:proofErr w:type="spellStart"/>
+      <w:r>
+        <w:rPr>
+          <w:rFonts w:eastAsia="Times New Roman" w:cs="Times New Roman"/>
+        </w:rPr>
+        <w:t>sklearn</w:t>
+      </w:r>
+      <w:proofErr w:type="spellEnd"/>
+      <w:r>
+        <w:rPr>
+          <w:rFonts w:eastAsia="Times New Roman" w:cs="Times New Roman"/>
+        </w:rPr>
+        <w:t xml:space="preserve"> and </w:t>
+      </w:r>
+      <w:proofErr w:type="spellStart"/>
+      <w:r>
+        <w:rPr>
+          <w:rFonts w:eastAsia="Times New Roman" w:cs="Times New Roman"/>
+        </w:rPr>
+        <w:t>xgboost</w:t>
+      </w:r>
+      <w:proofErr w:type="spellEnd"/>
+      <w:r>
+        <w:rPr>
+          <w:rFonts w:eastAsia="Times New Roman" w:cs="Times New Roman"/>
+        </w:rPr>
+        <w:t xml:space="preserve"> pickles are not portable across minor versions. runtime.txt pins Python 3.13 to match the training environment. A .</w:t>
+      </w:r>
+      <w:proofErr w:type="spellStart"/>
+      <w:r>
+        <w:rPr>
+          <w:rFonts w:eastAsia="Times New Roman" w:cs="Times New Roman"/>
+        </w:rPr>
+        <w:t>streamlit</w:t>
+      </w:r>
+      <w:proofErr w:type="spellEnd"/>
+      <w:r>
+        <w:rPr>
+          <w:rFonts w:eastAsia="Times New Roman" w:cs="Times New Roman"/>
+        </w:rPr>
+        <w:t>/</w:t>
+      </w:r>
+      <w:proofErr w:type="spellStart"/>
+      <w:r>
+        <w:rPr>
+          <w:rFonts w:eastAsia="Times New Roman" w:cs="Times New Roman"/>
+        </w:rPr>
+        <w:t>config.toml</w:t>
+      </w:r>
+      <w:proofErr w:type="spellEnd"/>
+      <w:r>
+        <w:rPr>
+          <w:rFonts w:eastAsia="Times New Roman" w:cs="Times New Roman"/>
+        </w:rPr>
+        <w:t xml:space="preserve"> carries the dark theme and a </w:t>
+      </w:r>
+      <w:proofErr w:type="spellStart"/>
+      <w:proofErr w:type="gramStart"/>
+      <w:r>
+        <w:rPr>
+          <w:rFonts w:eastAsia="Times New Roman" w:cs="Times New Roman"/>
+        </w:rPr>
+        <w:t>client.toolbarMode</w:t>
+      </w:r>
+      <w:proofErr w:type="spellEnd"/>
+      <w:proofErr w:type="gramEnd"/>
+      <w:r>
+        <w:rPr>
+          <w:rFonts w:eastAsia="Times New Roman" w:cs="Times New Roman"/>
+        </w:rPr>
+        <w:t xml:space="preserve"> = viewer flag; CSS in the app suppresses the Fork button and 'View source on GitHub' icon that </w:t>
+      </w:r>
+      <w:proofErr w:type="spellStart"/>
+      <w:r>
+        <w:rPr>
+          <w:rFonts w:eastAsia="Times New Roman" w:cs="Times New Roman"/>
+        </w:rPr>
+        <w:t>Streamlit</w:t>
+      </w:r>
+      <w:proofErr w:type="spellEnd"/>
+      <w:r>
+        <w:rPr>
+          <w:rFonts w:eastAsia="Times New Roman" w:cs="Times New Roman"/>
+        </w:rPr>
+        <w:t xml:space="preserve"> Community Cloud injects on public-repo deploys. Every git push to the main branch auto-rebuilds and redeploys the app in about 30 seconds.</w:t>
       </w:r>
     </w:p>
     <w:p>
@@ -4641,7 +6571,93 @@
         <w:rPr>
           <w:rFonts w:eastAsia="Times New Roman" w:cs="Times New Roman"/>
         </w:rPr>
-        <w:t>The initial Phase 3 binning used pandas.qcut(q=3) on deliveries_per_hour. The 66.7th percentile fell exactly on 3.889 dph (equal to 35 deliveries over 9 hours, the worst real combination in the sample). Fifty-five of the 182 riders tied at that value, and qcut is right-inclusive at the upper edge, so all 55 fell into Medium. This left the Stage-2 model unable to predict High for the worst real schedule. The fix replaces qcut with fixed cuts at 2.5 and 3.75. The Stage-1 High count grew from 19 to 74. Cross-validation accuracy dropped from 74 percent to 62 percent because the model now solves a real 3-class problem instead of memorising a 19-row minority.</w:t>
+        <w:t xml:space="preserve">The initial Phase 3 binning used </w:t>
+      </w:r>
+      <w:proofErr w:type="spellStart"/>
+      <w:proofErr w:type="gramStart"/>
+      <w:r>
+        <w:rPr>
+          <w:rFonts w:eastAsia="Times New Roman" w:cs="Times New Roman"/>
+        </w:rPr>
+        <w:t>pandas.qcut</w:t>
+      </w:r>
+      <w:proofErr w:type="spellEnd"/>
+      <w:proofErr w:type="gramEnd"/>
+      <w:r>
+        <w:rPr>
+          <w:rFonts w:eastAsia="Times New Roman" w:cs="Times New Roman"/>
+        </w:rPr>
+        <w:t xml:space="preserve">(q=3) on </w:t>
+      </w:r>
+      <w:proofErr w:type="spellStart"/>
+      <w:r>
+        <w:rPr>
+          <w:rFonts w:eastAsia="Times New Roman" w:cs="Times New Roman"/>
+        </w:rPr>
+        <w:t>deliveries_per_hour</w:t>
+      </w:r>
+      <w:proofErr w:type="spellEnd"/>
+      <w:r>
+        <w:rPr>
+          <w:rFonts w:eastAsia="Times New Roman" w:cs="Times New Roman"/>
+        </w:rPr>
+        <w:t xml:space="preserve">. The 66.7th percentile fell exactly on 3.889 </w:t>
+      </w:r>
+      <w:proofErr w:type="spellStart"/>
+      <w:r>
+        <w:rPr>
+          <w:rFonts w:eastAsia="Times New Roman" w:cs="Times New Roman"/>
+        </w:rPr>
+        <w:t>dph</w:t>
+      </w:r>
+      <w:proofErr w:type="spellEnd"/>
+      <w:r>
+        <w:rPr>
+          <w:rFonts w:eastAsia="Times New Roman" w:cs="Times New Roman"/>
+        </w:rPr>
+        <w:t xml:space="preserve"> (equal to 35 deliveries over 9 hours, the worst real combination in the sample). Fifty-five of the 182 riders tied at that value, and </w:t>
+      </w:r>
+      <w:proofErr w:type="spellStart"/>
+      <w:r>
+        <w:rPr>
+          <w:rFonts w:eastAsia="Times New Roman" w:cs="Times New Roman"/>
+        </w:rPr>
+        <w:t>qcut</w:t>
+      </w:r>
+      <w:proofErr w:type="spellEnd"/>
+      <w:r>
+        <w:rPr>
+          <w:rFonts w:eastAsia="Times New Roman" w:cs="Times New Roman"/>
+        </w:rPr>
+        <w:t xml:space="preserve"> is right-inclusive at the upper edge, so all 55 fell into Medium. This left the Stage-2 model unable to predict High for the worst real schedule. The fix replaces </w:t>
+      </w:r>
+      <w:proofErr w:type="spellStart"/>
+      <w:r>
+        <w:rPr>
+          <w:rFonts w:eastAsia="Times New Roman" w:cs="Times New Roman"/>
+        </w:rPr>
+        <w:t>qcut</w:t>
+      </w:r>
+      <w:proofErr w:type="spellEnd"/>
+      <w:r>
+        <w:rPr>
+          <w:rFonts w:eastAsia="Times New Roman" w:cs="Times New Roman"/>
+        </w:rPr>
+        <w:t xml:space="preserve"> with fixed cuts at 2.5 and 3.75. The Stage-1 High count grew from 19 to 74. Cross-validation accuracy dropped from 74 percent to 62 percent because the model now solves a real 3-class problem instead of </w:t>
+      </w:r>
+      <w:proofErr w:type="spellStart"/>
+      <w:r>
+        <w:rPr>
+          <w:rFonts w:eastAsia="Times New Roman" w:cs="Times New Roman"/>
+        </w:rPr>
+        <w:t>memorising</w:t>
+      </w:r>
+      <w:proofErr w:type="spellEnd"/>
+      <w:r>
+        <w:rPr>
+          <w:rFonts w:eastAsia="Times New Roman" w:cs="Times New Roman"/>
+        </w:rPr>
+        <w:t xml:space="preserve"> a 19-row minority.</w:t>
       </w:r>
     </w:p>
     <w:p>
@@ -4668,7 +6684,105 @@
         <w:rPr>
           <w:rFonts w:eastAsia="Times New Roman" w:cs="Times New Roman"/>
         </w:rPr>
-        <w:t>An earlier Phase 6 run reported 100 percent cross-validation accuracy on Duration. Investigation showed the trees were reconstructing work_hours_num from vibration_index, which equals vehicle_rank multiplied by work_hours_num. Adding vibration_index to the Duration exclusion list and capping max_depth returned Duration to a realistic 61 percent accuracy with 76 percent macro AUC.</w:t>
+        <w:t xml:space="preserve">An earlier Phase 6 run reported 100 percent cross-validation accuracy on Duration. Investigation showed the trees were reconstructing </w:t>
+      </w:r>
+      <w:proofErr w:type="spellStart"/>
+      <w:r>
+        <w:rPr>
+          <w:rFonts w:eastAsia="Times New Roman" w:cs="Times New Roman"/>
+        </w:rPr>
+        <w:t>work_hours_num</w:t>
+      </w:r>
+      <w:proofErr w:type="spellEnd"/>
+      <w:r>
+        <w:rPr>
+          <w:rFonts w:eastAsia="Times New Roman" w:cs="Times New Roman"/>
+        </w:rPr>
+        <w:t xml:space="preserve"> from </w:t>
+      </w:r>
+      <w:proofErr w:type="spellStart"/>
+      <w:r>
+        <w:rPr>
+          <w:rFonts w:eastAsia="Times New Roman" w:cs="Times New Roman"/>
+        </w:rPr>
+        <w:t>vibration_index</w:t>
+      </w:r>
+      <w:proofErr w:type="spellEnd"/>
+      <w:r>
+        <w:rPr>
+          <w:rFonts w:eastAsia="Times New Roman" w:cs="Times New Roman"/>
+        </w:rPr>
+        <w:t xml:space="preserve">, which equals </w:t>
+      </w:r>
+      <w:proofErr w:type="spellStart"/>
+      <w:r>
+        <w:rPr>
+          <w:rFonts w:eastAsia="Times New Roman" w:cs="Times New Roman"/>
+        </w:rPr>
+        <w:t>vehicle_rank</w:t>
+      </w:r>
+      <w:proofErr w:type="spellEnd"/>
+      <w:r>
+        <w:rPr>
+          <w:rFonts w:eastAsia="Times New Roman" w:cs="Times New Roman"/>
+        </w:rPr>
+        <w:t xml:space="preserve"> multiplied by </w:t>
+      </w:r>
+      <w:proofErr w:type="spellStart"/>
+      <w:r>
+        <w:rPr>
+          <w:rFonts w:eastAsia="Times New Roman" w:cs="Times New Roman"/>
+        </w:rPr>
+        <w:t>work_hours_num</w:t>
+      </w:r>
+      <w:proofErr w:type="spellEnd"/>
+      <w:r>
+        <w:rPr>
+          <w:rFonts w:eastAsia="Times New Roman" w:cs="Times New Roman"/>
+        </w:rPr>
+        <w:t xml:space="preserve">. Adding </w:t>
+      </w:r>
+      <w:proofErr w:type="spellStart"/>
+      <w:r>
+        <w:rPr>
+          <w:rFonts w:eastAsia="Times New Roman" w:cs="Times New Roman"/>
+        </w:rPr>
+        <w:t>vibration_index</w:t>
+      </w:r>
+      <w:proofErr w:type="spellEnd"/>
+      <w:r>
+        <w:rPr>
+          <w:rFonts w:eastAsia="Times New Roman" w:cs="Times New Roman"/>
+        </w:rPr>
+        <w:t xml:space="preserve"> to the Duration exclusion list and capping </w:t>
+      </w:r>
+      <w:proofErr w:type="spellStart"/>
+      <w:r>
+        <w:rPr>
+          <w:rFonts w:eastAsia="Times New Roman" w:cs="Times New Roman"/>
+        </w:rPr>
+        <w:t>max_depth</w:t>
+      </w:r>
+      <w:proofErr w:type="spellEnd"/>
+      <w:r>
+        <w:rPr>
+          <w:rFonts w:eastAsia="Times New Roman" w:cs="Times New Roman"/>
+        </w:rPr>
+        <w:t xml:space="preserve"> returned Duration to a realistic 61 percent accuracy with 76 percent </w:t>
+      </w:r>
+      <w:proofErr w:type="gramStart"/>
+      <w:r>
+        <w:rPr>
+          <w:rFonts w:eastAsia="Times New Roman" w:cs="Times New Roman"/>
+        </w:rPr>
+        <w:t>macro AUC</w:t>
+      </w:r>
+      <w:proofErr w:type="gramEnd"/>
+      <w:r>
+        <w:rPr>
+          <w:rFonts w:eastAsia="Times New Roman" w:cs="Times New Roman"/>
+        </w:rPr>
+        <w:t>.</w:t>
       </w:r>
     </w:p>
     <w:p>
@@ -4695,7 +6809,35 @@
         <w:rPr>
           <w:rFonts w:eastAsia="Times New Roman" w:cs="Times New Roman"/>
         </w:rPr>
-        <w:t>The Posture target was initially trained only on the survey feature pool, which meant it could only infer posture indirectly from pain, fatigue, and hours. Adding the 11 RULA components and 8 QEC scores from the observation xlsx as explicit features moved Posture accuracy from 89 to 97 percent and the overfit gap from 0.088 to 0.028. Per the label-leakage rule, the three derived RULA Table scores were excluded because posture_risk is rula_table_c binned.</w:t>
+        <w:t xml:space="preserve">The Posture target was initially trained only on the survey feature pool, which meant it could only infer posture indirectly from pain, fatigue, and hours. Adding the 11 RULA components and 8 QEC scores from the observation xlsx as explicit features moved Posture accuracy from 89 to 97 percent and the overfit gap from 0.088 to 0.028. Per the label-leakage rule, the three derived RULA Table scores were excluded because </w:t>
+      </w:r>
+      <w:proofErr w:type="spellStart"/>
+      <w:r>
+        <w:rPr>
+          <w:rFonts w:eastAsia="Times New Roman" w:cs="Times New Roman"/>
+        </w:rPr>
+        <w:t>posture_risk</w:t>
+      </w:r>
+      <w:proofErr w:type="spellEnd"/>
+      <w:r>
+        <w:rPr>
+          <w:rFonts w:eastAsia="Times New Roman" w:cs="Times New Roman"/>
+        </w:rPr>
+        <w:t xml:space="preserve"> is </w:t>
+      </w:r>
+      <w:proofErr w:type="spellStart"/>
+      <w:r>
+        <w:rPr>
+          <w:rFonts w:eastAsia="Times New Roman" w:cs="Times New Roman"/>
+        </w:rPr>
+        <w:t>rula_table_c</w:t>
+      </w:r>
+      <w:proofErr w:type="spellEnd"/>
+      <w:r>
+        <w:rPr>
+          <w:rFonts w:eastAsia="Times New Roman" w:cs="Times New Roman"/>
+        </w:rPr>
+        <w:t xml:space="preserve"> binned.</w:t>
       </w:r>
     </w:p>
     <w:p>
@@ -4737,7 +6879,35 @@
         <w:rPr>
           <w:rFonts w:eastAsia="Times New Roman" w:cs="Times New Roman"/>
         </w:rPr>
-        <w:t>The sample of 182 riders is 152 male and 30 female. Age skews young: 78 riders are under 25, 66 in the 25-35 band, 30 in 36-45, and 8 in the 46-and-above band. Roughly half the sample (49 percent) works more than 8 hours per day. Ninety-four ride scooters and 88 ride motorbikes. The platform split is 97 Blinkit, 80 Zepto, and 5 who work both platforms.</w:t>
+        <w:t xml:space="preserve">The sample of 182 riders is 152 male and 30 female. Age skews young: 78 riders are under 25, 66 in the 25-35 band, 30 in 36-45, and 8 in the 46-and-above band. Roughly half the sample (49 percent) works more than 8 hours per day. Ninety-four ride scooters and 88 ride motorbikes. The platform split is 97 </w:t>
+      </w:r>
+      <w:proofErr w:type="spellStart"/>
+      <w:r>
+        <w:rPr>
+          <w:rFonts w:eastAsia="Times New Roman" w:cs="Times New Roman"/>
+        </w:rPr>
+        <w:t>Blinkit</w:t>
+      </w:r>
+      <w:proofErr w:type="spellEnd"/>
+      <w:r>
+        <w:rPr>
+          <w:rFonts w:eastAsia="Times New Roman" w:cs="Times New Roman"/>
+        </w:rPr>
+        <w:t xml:space="preserve">, 80 </w:t>
+      </w:r>
+      <w:proofErr w:type="spellStart"/>
+      <w:r>
+        <w:rPr>
+          <w:rFonts w:eastAsia="Times New Roman" w:cs="Times New Roman"/>
+        </w:rPr>
+        <w:t>Zepto</w:t>
+      </w:r>
+      <w:proofErr w:type="spellEnd"/>
+      <w:r>
+        <w:rPr>
+          <w:rFonts w:eastAsia="Times New Roman" w:cs="Times New Roman"/>
+        </w:rPr>
+        <w:t>, and 5 who work both platforms.</w:t>
       </w:r>
     </w:p>
     <w:p>
@@ -7522,6 +9692,7 @@
             <w:pPr>
               <w:spacing w:before="20" w:after="20"/>
             </w:pPr>
+            <w:proofErr w:type="spellStart"/>
             <w:r>
               <w:rPr>
                 <w:rFonts w:eastAsia="Times New Roman" w:cs="Times New Roman"/>
@@ -7529,6 +9700,7 @@
               </w:rPr>
               <w:t>HistGradientBoosting</w:t>
             </w:r>
+            <w:proofErr w:type="spellEnd"/>
           </w:p>
         </w:tc>
         <w:tc>
@@ -7631,6 +9803,7 @@
             <w:pPr>
               <w:spacing w:before="20" w:after="20"/>
             </w:pPr>
+            <w:proofErr w:type="spellStart"/>
             <w:r>
               <w:rPr>
                 <w:rFonts w:eastAsia="Times New Roman" w:cs="Times New Roman"/>
@@ -7638,6 +9811,7 @@
               </w:rPr>
               <w:t>RandomForest</w:t>
             </w:r>
+            <w:proofErr w:type="spellEnd"/>
           </w:p>
         </w:tc>
         <w:tc>
@@ -7740,6 +9914,7 @@
             <w:pPr>
               <w:spacing w:before="20" w:after="20"/>
             </w:pPr>
+            <w:proofErr w:type="spellStart"/>
             <w:r>
               <w:rPr>
                 <w:rFonts w:eastAsia="Times New Roman" w:cs="Times New Roman"/>
@@ -7747,6 +9922,7 @@
               </w:rPr>
               <w:t>RandomForest</w:t>
             </w:r>
+            <w:proofErr w:type="spellEnd"/>
           </w:p>
         </w:tc>
         <w:tc>
@@ -7849,6 +10025,7 @@
             <w:pPr>
               <w:spacing w:before="20" w:after="20"/>
             </w:pPr>
+            <w:proofErr w:type="spellStart"/>
             <w:r>
               <w:rPr>
                 <w:rFonts w:eastAsia="Times New Roman" w:cs="Times New Roman"/>
@@ -7856,6 +10033,7 @@
               </w:rPr>
               <w:t>ExtraTrees</w:t>
             </w:r>
+            <w:proofErr w:type="spellEnd"/>
           </w:p>
         </w:tc>
         <w:tc>
@@ -7958,6 +10136,7 @@
             <w:pPr>
               <w:spacing w:before="20" w:after="20"/>
             </w:pPr>
+            <w:proofErr w:type="spellStart"/>
             <w:r>
               <w:rPr>
                 <w:rFonts w:eastAsia="Times New Roman" w:cs="Times New Roman"/>
@@ -7965,6 +10144,7 @@
               </w:rPr>
               <w:t>RandomForest</w:t>
             </w:r>
+            <w:proofErr w:type="spellEnd"/>
           </w:p>
         </w:tc>
         <w:tc>
@@ -8067,6 +10247,7 @@
             <w:pPr>
               <w:spacing w:before="20" w:after="20"/>
             </w:pPr>
+            <w:proofErr w:type="spellStart"/>
             <w:r>
               <w:rPr>
                 <w:rFonts w:eastAsia="Times New Roman" w:cs="Times New Roman"/>
@@ -8074,6 +10255,7 @@
               </w:rPr>
               <w:t>HistGradientBoosting</w:t>
             </w:r>
+            <w:proofErr w:type="spellEnd"/>
           </w:p>
         </w:tc>
         <w:tc>
@@ -8175,7 +10357,35 @@
         <w:rPr>
           <w:rFonts w:eastAsia="Times New Roman" w:cs="Times New Roman"/>
         </w:rPr>
-        <w:t>The five survey-derived factors land between 58 and 62 percent cross-validation accuracy with macro AUC in the 71 to 76 percent range. Posture reaches 97 percent accuracy and 98 percent macro AUC because it is the only model that receives real observation inputs (the 11 RULA components and 8 QEC scores) on top of the survey features.</w:t>
+        <w:t xml:space="preserve">The five survey-derived factors land between 58 and 62 percent cross-validation accuracy with </w:t>
+      </w:r>
+      <w:proofErr w:type="gramStart"/>
+      <w:r>
+        <w:rPr>
+          <w:rFonts w:eastAsia="Times New Roman" w:cs="Times New Roman"/>
+        </w:rPr>
+        <w:t>macro AUC</w:t>
+      </w:r>
+      <w:proofErr w:type="gramEnd"/>
+      <w:r>
+        <w:rPr>
+          <w:rFonts w:eastAsia="Times New Roman" w:cs="Times New Roman"/>
+        </w:rPr>
+        <w:t xml:space="preserve"> in the 71 to 76 percent range. Posture reaches 97 percent accuracy and 98 percent </w:t>
+      </w:r>
+      <w:proofErr w:type="gramStart"/>
+      <w:r>
+        <w:rPr>
+          <w:rFonts w:eastAsia="Times New Roman" w:cs="Times New Roman"/>
+        </w:rPr>
+        <w:t>macro AUC</w:t>
+      </w:r>
+      <w:proofErr w:type="gramEnd"/>
+      <w:r>
+        <w:rPr>
+          <w:rFonts w:eastAsia="Times New Roman" w:cs="Times New Roman"/>
+        </w:rPr>
+        <w:t xml:space="preserve"> because it is the only model that receives real observation inputs (the 11 RULA components and 8 QEC scores) on top of the survey features.</w:t>
       </w:r>
     </w:p>
     <w:p>
@@ -11090,6 +13300,7 @@
             <w:pPr>
               <w:spacing w:before="20" w:after="20"/>
             </w:pPr>
+            <w:proofErr w:type="spellStart"/>
             <w:r>
               <w:rPr>
                 <w:rFonts w:eastAsia="Times New Roman" w:cs="Times New Roman"/>
@@ -11097,6 +13308,7 @@
               </w:rPr>
               <w:t>HistGBM</w:t>
             </w:r>
+            <w:proofErr w:type="spellEnd"/>
           </w:p>
         </w:tc>
         <w:tc>
@@ -11107,12 +13319,37 @@
             <w:pPr>
               <w:spacing w:before="20" w:after="20"/>
             </w:pPr>
-            <w:r>
-              <w:rPr>
-                <w:rFonts w:eastAsia="Times New Roman" w:cs="Times New Roman"/>
-                <w:sz w:val="20"/>
-              </w:rPr>
-              <w:t>max_depth=None, learning_rate=0.05</w:t>
+            <w:proofErr w:type="spellStart"/>
+            <w:r>
+              <w:rPr>
+                <w:rFonts w:eastAsia="Times New Roman" w:cs="Times New Roman"/>
+                <w:sz w:val="20"/>
+              </w:rPr>
+              <w:t>max_depth</w:t>
+            </w:r>
+            <w:proofErr w:type="spellEnd"/>
+            <w:r>
+              <w:rPr>
+                <w:rFonts w:eastAsia="Times New Roman" w:cs="Times New Roman"/>
+                <w:sz w:val="20"/>
+              </w:rPr>
+              <w:t xml:space="preserve">=None, </w:t>
+            </w:r>
+            <w:proofErr w:type="spellStart"/>
+            <w:r>
+              <w:rPr>
+                <w:rFonts w:eastAsia="Times New Roman" w:cs="Times New Roman"/>
+                <w:sz w:val="20"/>
+              </w:rPr>
+              <w:t>learning_rate</w:t>
+            </w:r>
+            <w:proofErr w:type="spellEnd"/>
+            <w:r>
+              <w:rPr>
+                <w:rFonts w:eastAsia="Times New Roman" w:cs="Times New Roman"/>
+                <w:sz w:val="20"/>
+              </w:rPr>
+              <w:t>=0.05</w:t>
             </w:r>
           </w:p>
         </w:tc>
@@ -11165,6 +13402,7 @@
             <w:pPr>
               <w:spacing w:before="20" w:after="20"/>
             </w:pPr>
+            <w:proofErr w:type="spellStart"/>
             <w:r>
               <w:rPr>
                 <w:rFonts w:eastAsia="Times New Roman" w:cs="Times New Roman"/>
@@ -11172,6 +13410,7 @@
               </w:rPr>
               <w:t>RandomForest</w:t>
             </w:r>
+            <w:proofErr w:type="spellEnd"/>
           </w:p>
         </w:tc>
         <w:tc>
@@ -11182,12 +13421,37 @@
             <w:pPr>
               <w:spacing w:before="20" w:after="20"/>
             </w:pPr>
-            <w:r>
-              <w:rPr>
-                <w:rFonts w:eastAsia="Times New Roman" w:cs="Times New Roman"/>
-                <w:sz w:val="20"/>
-              </w:rPr>
-              <w:t>n_estimators=300, max_depth=None</w:t>
+            <w:proofErr w:type="spellStart"/>
+            <w:r>
+              <w:rPr>
+                <w:rFonts w:eastAsia="Times New Roman" w:cs="Times New Roman"/>
+                <w:sz w:val="20"/>
+              </w:rPr>
+              <w:t>n_estimators</w:t>
+            </w:r>
+            <w:proofErr w:type="spellEnd"/>
+            <w:r>
+              <w:rPr>
+                <w:rFonts w:eastAsia="Times New Roman" w:cs="Times New Roman"/>
+                <w:sz w:val="20"/>
+              </w:rPr>
+              <w:t xml:space="preserve">=300, </w:t>
+            </w:r>
+            <w:proofErr w:type="spellStart"/>
+            <w:r>
+              <w:rPr>
+                <w:rFonts w:eastAsia="Times New Roman" w:cs="Times New Roman"/>
+                <w:sz w:val="20"/>
+              </w:rPr>
+              <w:t>max_depth</w:t>
+            </w:r>
+            <w:proofErr w:type="spellEnd"/>
+            <w:r>
+              <w:rPr>
+                <w:rFonts w:eastAsia="Times New Roman" w:cs="Times New Roman"/>
+                <w:sz w:val="20"/>
+              </w:rPr>
+              <w:t>=None</w:t>
             </w:r>
           </w:p>
         </w:tc>
@@ -11240,6 +13504,7 @@
             <w:pPr>
               <w:spacing w:before="20" w:after="20"/>
             </w:pPr>
+            <w:proofErr w:type="spellStart"/>
             <w:r>
               <w:rPr>
                 <w:rFonts w:eastAsia="Times New Roman" w:cs="Times New Roman"/>
@@ -11247,6 +13512,7 @@
               </w:rPr>
               <w:t>RandomForest</w:t>
             </w:r>
+            <w:proofErr w:type="spellEnd"/>
           </w:p>
         </w:tc>
         <w:tc>
@@ -11257,12 +13523,37 @@
             <w:pPr>
               <w:spacing w:before="20" w:after="20"/>
             </w:pPr>
-            <w:r>
-              <w:rPr>
-                <w:rFonts w:eastAsia="Times New Roman" w:cs="Times New Roman"/>
-                <w:sz w:val="20"/>
-              </w:rPr>
-              <w:t>n_estimators=500, max_depth=5</w:t>
+            <w:proofErr w:type="spellStart"/>
+            <w:r>
+              <w:rPr>
+                <w:rFonts w:eastAsia="Times New Roman" w:cs="Times New Roman"/>
+                <w:sz w:val="20"/>
+              </w:rPr>
+              <w:t>n_estimators</w:t>
+            </w:r>
+            <w:proofErr w:type="spellEnd"/>
+            <w:r>
+              <w:rPr>
+                <w:rFonts w:eastAsia="Times New Roman" w:cs="Times New Roman"/>
+                <w:sz w:val="20"/>
+              </w:rPr>
+              <w:t xml:space="preserve">=500, </w:t>
+            </w:r>
+            <w:proofErr w:type="spellStart"/>
+            <w:r>
+              <w:rPr>
+                <w:rFonts w:eastAsia="Times New Roman" w:cs="Times New Roman"/>
+                <w:sz w:val="20"/>
+              </w:rPr>
+              <w:t>max_depth</w:t>
+            </w:r>
+            <w:proofErr w:type="spellEnd"/>
+            <w:r>
+              <w:rPr>
+                <w:rFonts w:eastAsia="Times New Roman" w:cs="Times New Roman"/>
+                <w:sz w:val="20"/>
+              </w:rPr>
+              <w:t>=5</w:t>
             </w:r>
           </w:p>
         </w:tc>
@@ -11315,6 +13606,7 @@
             <w:pPr>
               <w:spacing w:before="20" w:after="20"/>
             </w:pPr>
+            <w:proofErr w:type="spellStart"/>
             <w:r>
               <w:rPr>
                 <w:rFonts w:eastAsia="Times New Roman" w:cs="Times New Roman"/>
@@ -11322,6 +13614,7 @@
               </w:rPr>
               <w:t>ExtraTrees</w:t>
             </w:r>
+            <w:proofErr w:type="spellEnd"/>
           </w:p>
         </w:tc>
         <w:tc>
@@ -11332,12 +13625,37 @@
             <w:pPr>
               <w:spacing w:before="20" w:after="20"/>
             </w:pPr>
-            <w:r>
-              <w:rPr>
-                <w:rFonts w:eastAsia="Times New Roman" w:cs="Times New Roman"/>
-                <w:sz w:val="20"/>
-              </w:rPr>
-              <w:t>n_estimators=300, max_depth=None</w:t>
+            <w:proofErr w:type="spellStart"/>
+            <w:r>
+              <w:rPr>
+                <w:rFonts w:eastAsia="Times New Roman" w:cs="Times New Roman"/>
+                <w:sz w:val="20"/>
+              </w:rPr>
+              <w:t>n_estimators</w:t>
+            </w:r>
+            <w:proofErr w:type="spellEnd"/>
+            <w:r>
+              <w:rPr>
+                <w:rFonts w:eastAsia="Times New Roman" w:cs="Times New Roman"/>
+                <w:sz w:val="20"/>
+              </w:rPr>
+              <w:t xml:space="preserve">=300, </w:t>
+            </w:r>
+            <w:proofErr w:type="spellStart"/>
+            <w:r>
+              <w:rPr>
+                <w:rFonts w:eastAsia="Times New Roman" w:cs="Times New Roman"/>
+                <w:sz w:val="20"/>
+              </w:rPr>
+              <w:t>max_depth</w:t>
+            </w:r>
+            <w:proofErr w:type="spellEnd"/>
+            <w:r>
+              <w:rPr>
+                <w:rFonts w:eastAsia="Times New Roman" w:cs="Times New Roman"/>
+                <w:sz w:val="20"/>
+              </w:rPr>
+              <w:t>=None</w:t>
             </w:r>
           </w:p>
         </w:tc>
@@ -11390,6 +13708,7 @@
             <w:pPr>
               <w:spacing w:before="20" w:after="20"/>
             </w:pPr>
+            <w:proofErr w:type="spellStart"/>
             <w:r>
               <w:rPr>
                 <w:rFonts w:eastAsia="Times New Roman" w:cs="Times New Roman"/>
@@ -11397,6 +13716,7 @@
               </w:rPr>
               <w:t>RandomForest</w:t>
             </w:r>
+            <w:proofErr w:type="spellEnd"/>
           </w:p>
         </w:tc>
         <w:tc>
@@ -11407,12 +13727,37 @@
             <w:pPr>
               <w:spacing w:before="20" w:after="20"/>
             </w:pPr>
-            <w:r>
-              <w:rPr>
-                <w:rFonts w:eastAsia="Times New Roman" w:cs="Times New Roman"/>
-                <w:sz w:val="20"/>
-              </w:rPr>
-              <w:t>n_estimators=500, max_depth=None</w:t>
+            <w:proofErr w:type="spellStart"/>
+            <w:r>
+              <w:rPr>
+                <w:rFonts w:eastAsia="Times New Roman" w:cs="Times New Roman"/>
+                <w:sz w:val="20"/>
+              </w:rPr>
+              <w:t>n_estimators</w:t>
+            </w:r>
+            <w:proofErr w:type="spellEnd"/>
+            <w:r>
+              <w:rPr>
+                <w:rFonts w:eastAsia="Times New Roman" w:cs="Times New Roman"/>
+                <w:sz w:val="20"/>
+              </w:rPr>
+              <w:t xml:space="preserve">=500, </w:t>
+            </w:r>
+            <w:proofErr w:type="spellStart"/>
+            <w:r>
+              <w:rPr>
+                <w:rFonts w:eastAsia="Times New Roman" w:cs="Times New Roman"/>
+                <w:sz w:val="20"/>
+              </w:rPr>
+              <w:t>max_depth</w:t>
+            </w:r>
+            <w:proofErr w:type="spellEnd"/>
+            <w:r>
+              <w:rPr>
+                <w:rFonts w:eastAsia="Times New Roman" w:cs="Times New Roman"/>
+                <w:sz w:val="20"/>
+              </w:rPr>
+              <w:t>=None</w:t>
             </w:r>
           </w:p>
         </w:tc>
@@ -11465,6 +13810,7 @@
             <w:pPr>
               <w:spacing w:before="20" w:after="20"/>
             </w:pPr>
+            <w:proofErr w:type="spellStart"/>
             <w:r>
               <w:rPr>
                 <w:rFonts w:eastAsia="Times New Roman" w:cs="Times New Roman"/>
@@ -11472,6 +13818,7 @@
               </w:rPr>
               <w:t>HistGBM</w:t>
             </w:r>
+            <w:proofErr w:type="spellEnd"/>
           </w:p>
         </w:tc>
         <w:tc>
@@ -11482,12 +13829,37 @@
             <w:pPr>
               <w:spacing w:before="20" w:after="20"/>
             </w:pPr>
-            <w:r>
-              <w:rPr>
-                <w:rFonts w:eastAsia="Times New Roman" w:cs="Times New Roman"/>
-                <w:sz w:val="20"/>
-              </w:rPr>
-              <w:t>max_depth=5, learning_rate=0.05</w:t>
+            <w:proofErr w:type="spellStart"/>
+            <w:r>
+              <w:rPr>
+                <w:rFonts w:eastAsia="Times New Roman" w:cs="Times New Roman"/>
+                <w:sz w:val="20"/>
+              </w:rPr>
+              <w:t>max_depth</w:t>
+            </w:r>
+            <w:proofErr w:type="spellEnd"/>
+            <w:r>
+              <w:rPr>
+                <w:rFonts w:eastAsia="Times New Roman" w:cs="Times New Roman"/>
+                <w:sz w:val="20"/>
+              </w:rPr>
+              <w:t xml:space="preserve">=5, </w:t>
+            </w:r>
+            <w:proofErr w:type="spellStart"/>
+            <w:r>
+              <w:rPr>
+                <w:rFonts w:eastAsia="Times New Roman" w:cs="Times New Roman"/>
+                <w:sz w:val="20"/>
+              </w:rPr>
+              <w:t>learning_rate</w:t>
+            </w:r>
+            <w:proofErr w:type="spellEnd"/>
+            <w:r>
+              <w:rPr>
+                <w:rFonts w:eastAsia="Times New Roman" w:cs="Times New Roman"/>
+                <w:sz w:val="20"/>
+              </w:rPr>
+              <w:t>=0.05</w:t>
             </w:r>
           </w:p>
         </w:tc>
@@ -11527,7 +13899,27 @@
           <w:color w:val="000000"/>
           <w:sz w:val="18"/>
         </w:rPr>
-        <w:t>Table 4.8: Winning hyperparameters per target after GridSearchCV.</w:t>
+        <w:t xml:space="preserve">Table 4.8: Winning hyperparameters per target after </w:t>
+      </w:r>
+      <w:proofErr w:type="spellStart"/>
+      <w:r>
+        <w:rPr>
+          <w:rFonts w:eastAsia="Times New Roman" w:cs="Times New Roman"/>
+          <w:i/>
+          <w:color w:val="000000"/>
+          <w:sz w:val="18"/>
+        </w:rPr>
+        <w:t>GridSearchCV</w:t>
+      </w:r>
+      <w:proofErr w:type="spellEnd"/>
+      <w:r>
+        <w:rPr>
+          <w:rFonts w:eastAsia="Times New Roman" w:cs="Times New Roman"/>
+          <w:i/>
+          <w:color w:val="000000"/>
+          <w:sz w:val="18"/>
+        </w:rPr>
+        <w:t>.</w:t>
       </w:r>
     </w:p>
     <w:p>
@@ -11866,7 +14258,25 @@
           <w:i/>
           <w:sz w:val="18"/>
         </w:rPr>
-        <w:t>Figure 4.13: Web app: predicted risk profile output with colour-coded level cards, radar chart, tabular result, and per-factor recommendations.</w:t>
+        <w:t xml:space="preserve">Figure 4.13: Web app: predicted risk profile output with </w:t>
+      </w:r>
+      <w:proofErr w:type="spellStart"/>
+      <w:r>
+        <w:rPr>
+          <w:rFonts w:eastAsia="Times New Roman" w:cs="Times New Roman"/>
+          <w:i/>
+          <w:sz w:val="18"/>
+        </w:rPr>
+        <w:t>colour</w:t>
+      </w:r>
+      <w:proofErr w:type="spellEnd"/>
+      <w:r>
+        <w:rPr>
+          <w:rFonts w:eastAsia="Times New Roman" w:cs="Times New Roman"/>
+          <w:i/>
+          <w:sz w:val="18"/>
+        </w:rPr>
+        <w:t>-coded level cards, radar chart, tabular result, and per-factor recommendations.</w:t>
       </w:r>
     </w:p>
     <w:p>
@@ -11894,7 +14304,35 @@
         <w:rPr>
           <w:rFonts w:eastAsia="Times New Roman" w:cs="Times New Roman"/>
         </w:rPr>
-        <w:t>This project designed, implemented, and deployed a per-rider ergonomic risk screening pipeline for last-mile quick-commerce delivery workers, turning a 36-item self-report questionnaire and a RULA + QEC observation record into six standardised risk levels across Force, Repetition, Posture, Duration, Contact Stress, and Vibration. The five survey-derived factors land at 58-62 percent cross-validation accuracy with macro AUC between 71 and 76 percent; the Posture model, which receives the RULA and QEC observation inputs directly, reaches 97 percent accuracy and 98 percent AUC. Chi-square identifies Posture, Repetition, and Force as the risk factors significantly associated with self-reported discomfort, and multivariable logistic regression flags age (OR 3.58 per band), job duration (OR 2.89), workload score, and fatigue score as the strongest individual predictors.</w:t>
+        <w:t xml:space="preserve">This project designed, implemented, and deployed a per-rider ergonomic risk screening pipeline for last-mile quick-commerce delivery workers, turning a 36-item self-report questionnaire and a RULA + QEC observation record into six </w:t>
+      </w:r>
+      <w:proofErr w:type="spellStart"/>
+      <w:r>
+        <w:rPr>
+          <w:rFonts w:eastAsia="Times New Roman" w:cs="Times New Roman"/>
+        </w:rPr>
+        <w:t>standardised</w:t>
+      </w:r>
+      <w:proofErr w:type="spellEnd"/>
+      <w:r>
+        <w:rPr>
+          <w:rFonts w:eastAsia="Times New Roman" w:cs="Times New Roman"/>
+        </w:rPr>
+        <w:t xml:space="preserve"> risk levels across Force, Repetition, Posture, Duration, Contact Stress, and Vibration. The five survey-derived factors land at 58-62 percent cross-validation accuracy with </w:t>
+      </w:r>
+      <w:proofErr w:type="gramStart"/>
+      <w:r>
+        <w:rPr>
+          <w:rFonts w:eastAsia="Times New Roman" w:cs="Times New Roman"/>
+        </w:rPr>
+        <w:t>macro AUC</w:t>
+      </w:r>
+      <w:proofErr w:type="gramEnd"/>
+      <w:r>
+        <w:rPr>
+          <w:rFonts w:eastAsia="Times New Roman" w:cs="Times New Roman"/>
+        </w:rPr>
+        <w:t xml:space="preserve"> between 71 and 76 percent; the Posture model, which receives the RULA and QEC observation inputs directly, reaches 97 percent accuracy and 98 percent AUC. Chi-square identifies Posture, Repetition, and Force as the risk factors significantly associated with self-reported discomfort, and multivariable logistic regression flags age (OR 3.58 per band), job duration (OR 2.89), workload score, and fatigue score as the strongest individual predictors.</w:t>
       </w:r>
     </w:p>
     <w:p>
@@ -11906,7 +14344,35 @@
         <w:rPr>
           <w:rFonts w:eastAsia="Times New Roman" w:cs="Times New Roman"/>
         </w:rPr>
-        <w:t>The main limitations are the self-report nature of most input variables, the severity-rank merge used to pair the identifier-less posture xlsx with the survey, and the small sample (n = 182) that keeps ML variance visible. Two methodological corrections were made and openly documented: Repetition binning moved from qcut to fixed cuts to remove a boundary tie that hid the worst real schedule, and vibration_index was added to the Duration exclusion list to remove indirect leakage.</w:t>
+        <w:t xml:space="preserve">The main limitations are the self-report nature of most input variables, the severity-rank merge used to pair the identifier-less posture xlsx with the survey, and the small sample (n = 182) that keeps ML variance visible. Two methodological corrections were made and openly documented: Repetition binning moved from </w:t>
+      </w:r>
+      <w:proofErr w:type="spellStart"/>
+      <w:r>
+        <w:rPr>
+          <w:rFonts w:eastAsia="Times New Roman" w:cs="Times New Roman"/>
+        </w:rPr>
+        <w:t>qcut</w:t>
+      </w:r>
+      <w:proofErr w:type="spellEnd"/>
+      <w:r>
+        <w:rPr>
+          <w:rFonts w:eastAsia="Times New Roman" w:cs="Times New Roman"/>
+        </w:rPr>
+        <w:t xml:space="preserve"> to fixed cuts to remove a boundary tie that hid the worst real schedule, and </w:t>
+      </w:r>
+      <w:proofErr w:type="spellStart"/>
+      <w:r>
+        <w:rPr>
+          <w:rFonts w:eastAsia="Times New Roman" w:cs="Times New Roman"/>
+        </w:rPr>
+        <w:t>vibration_index</w:t>
+      </w:r>
+      <w:proofErr w:type="spellEnd"/>
+      <w:r>
+        <w:rPr>
+          <w:rFonts w:eastAsia="Times New Roman" w:cs="Times New Roman"/>
+        </w:rPr>
+        <w:t xml:space="preserve"> was added to the Duration exclusion list to remove indirect leakage.</w:t>
       </w:r>
     </w:p>
     <w:p>
@@ -11918,7 +14384,21 @@
         <w:rPr>
           <w:rFonts w:eastAsia="Times New Roman" w:cs="Times New Roman"/>
         </w:rPr>
-        <w:t>Five interventions for a delivery-platform operator follow directly from the results: (i) cap daily hours (49 percent of the sample exceeds 8 hours per day); (ii) invest in posture-focused equipment and training (84 percent of observed postures at RULA grand score 5 or above, corresponding to action level 3 or 4); (iii) encourage bike-storage-box carrying over handheld bags; (iv) age-targeted MSD screening for the 36-and-above cohort; and (v) platform-level workload management to reduce the NASA-TLX component of the workload score, a significant discomfort predictor at p = 0.0005.</w:t>
+        <w:t>Five interventions for a delivery-platform operator follow directly from the results: (</w:t>
+      </w:r>
+      <w:proofErr w:type="spellStart"/>
+      <w:r>
+        <w:rPr>
+          <w:rFonts w:eastAsia="Times New Roman" w:cs="Times New Roman"/>
+        </w:rPr>
+        <w:t>i</w:t>
+      </w:r>
+      <w:proofErr w:type="spellEnd"/>
+      <w:r>
+        <w:rPr>
+          <w:rFonts w:eastAsia="Times New Roman" w:cs="Times New Roman"/>
+        </w:rPr>
+        <w:t>) cap daily hours (49 percent of the sample exceeds 8 hours per day); (ii) invest in posture-focused equipment and training (84 percent of observed postures at RULA grand score 5 or above, corresponding to action level 3 or 4); (iii) encourage bike-storage-box carrying over handheld bags; (iv) age-targeted MSD screening for the 36-and-above cohort; and (v) platform-level workload management to reduce the NASA-TLX component of the workload score, a significant discomfort predictor at p = 0.0005.</w:t>
       </w:r>
     </w:p>
     <w:p>
@@ -11957,7 +14437,23 @@
         <w:jc w:val="both"/>
       </w:pPr>
       <w:r>
-        <w:t>[1] Benson TM, Sathiyarajeswaran NS, Radhakrishnan R, Gafoor AA, Krupalakshme M, Samal J (2025). Factors and prevalence of musculoskeletal pain among the app-based food delivery riders in Tamil Nadu: a community-based cross-sectional study. Cureus, 17(3), e56132.</w:t>
+        <w:t xml:space="preserve">[1] Benson TM, </w:t>
+      </w:r>
+      <w:proofErr w:type="spellStart"/>
+      <w:r>
+        <w:t>Sathiyarajeswaran</w:t>
+      </w:r>
+      <w:proofErr w:type="spellEnd"/>
+      <w:r>
+        <w:t xml:space="preserve"> NS, Radhakrishnan R, Gafoor AA, </w:t>
+      </w:r>
+      <w:proofErr w:type="spellStart"/>
+      <w:r>
+        <w:t>Krupalakshme</w:t>
+      </w:r>
+      <w:proofErr w:type="spellEnd"/>
+      <w:r>
+        <w:t xml:space="preserve"> M, Samal J (2025). Factors and prevalence of musculoskeletal pain among the app-based food delivery riders in Tamil Nadu: a community-based cross-sectional study. Cureus, 17(3), e56132.</w:t>
       </w:r>
     </w:p>
     <w:p>
@@ -11997,7 +14493,23 @@
         <w:jc w:val="both"/>
       </w:pPr>
       <w:r>
-        <w:t>[5] Kuorinka I, Jonsson B, Kilbom A, Vinterberg H, Biering-Sorensen F, Andersson G, Jorgensen K (1987). Standardised Nordic questionnaires for the analysis of musculoskeletal symptoms. Applied Ergonomics, 18(3), 233-237.</w:t>
+        <w:t xml:space="preserve">[5] </w:t>
+      </w:r>
+      <w:proofErr w:type="spellStart"/>
+      <w:r>
+        <w:t>Kuorinka</w:t>
+      </w:r>
+      <w:proofErr w:type="spellEnd"/>
+      <w:r>
+        <w:t xml:space="preserve"> I, Jonsson B, Kilbom A, Vinterberg H, Biering-Sorensen F, Andersson G, Jorgensen K (1987). </w:t>
+      </w:r>
+      <w:proofErr w:type="spellStart"/>
+      <w:r>
+        <w:t>Standardised</w:t>
+      </w:r>
+      <w:proofErr w:type="spellEnd"/>
+      <w:r>
+        <w:t xml:space="preserve"> Nordic questionnaires for the analysis of musculoskeletal symptoms. Applied Ergonomics, 18(3), 233-237.</w:t>
       </w:r>
     </w:p>
     <w:p>
@@ -12007,7 +14519,15 @@
         <w:jc w:val="both"/>
       </w:pPr>
       <w:r>
-        <w:t>[6] Hart SG, Staveland LE (1988). Development of NASA-TLX (Task Load Index): Results of empirical and theoretical research. Advances in Psychology, 52, 139-183.</w:t>
+        <w:t xml:space="preserve">[6] Hart SG, </w:t>
+      </w:r>
+      <w:proofErr w:type="spellStart"/>
+      <w:r>
+        <w:t>Staveland</w:t>
+      </w:r>
+      <w:proofErr w:type="spellEnd"/>
+      <w:r>
+        <w:t xml:space="preserve"> LE (1988). Development of NASA-TLX (Task Load Index): Results of empirical and theoretical research. Advances in Psychology, 52, 139-183.</w:t>
       </w:r>
     </w:p>
     <w:p>
@@ -12027,7 +14547,15 @@
         <w:jc w:val="both"/>
       </w:pPr>
       <w:r>
-        <w:t>[8] Chawla NV, Bowyer KW, Hall LO, Kegelmeyer WP (2002). SMOTE: Synthetic Minority Over-sampling Technique. Journal of Artificial Intelligence Research, 16, 321-357.</w:t>
+        <w:t xml:space="preserve">[8] Chawla NV, Bowyer KW, Hall LO, </w:t>
+      </w:r>
+      <w:proofErr w:type="spellStart"/>
+      <w:r>
+        <w:t>Kegelmeyer</w:t>
+      </w:r>
+      <w:proofErr w:type="spellEnd"/>
+      <w:r>
+        <w:t xml:space="preserve"> WP (2002). SMOTE: Synthetic Minority Over-sampling Technique. Journal of Artificial Intelligence Research, 16, 321-357.</w:t>
       </w:r>
     </w:p>
     <w:p>
@@ -12047,7 +14575,15 @@
         <w:jc w:val="both"/>
       </w:pPr>
       <w:r>
-        <w:t>[10] Breiman L (2001). Random Forests. Machine Learning, 45(1), 5-32.</w:t>
+        <w:t xml:space="preserve">[10] </w:t>
+      </w:r>
+      <w:proofErr w:type="spellStart"/>
+      <w:r>
+        <w:t>Breiman</w:t>
+      </w:r>
+      <w:proofErr w:type="spellEnd"/>
+      <w:r>
+        <w:t xml:space="preserve"> L (2001). Random Forests. Machine Learning, 45(1), 5-32.</w:t>
       </w:r>
     </w:p>
     <w:p>
@@ -12057,7 +14593,15 @@
         <w:jc w:val="both"/>
       </w:pPr>
       <w:r>
-        <w:t>[11] Geurts P, Ernst D, Wehenkel L (2006). Extremely randomized trees. Machine Learning, 63(1), 3-42.</w:t>
+        <w:t xml:space="preserve">[11] Geurts P, Ernst D, </w:t>
+      </w:r>
+      <w:proofErr w:type="spellStart"/>
+      <w:r>
+        <w:t>Wehenkel</w:t>
+      </w:r>
+      <w:proofErr w:type="spellEnd"/>
+      <w:r>
+        <w:t xml:space="preserve"> L (2006). Extremely randomized trees. Machine Learning, 63(1), 3-42.</w:t>
       </w:r>
     </w:p>
     <w:p>
@@ -12067,7 +14611,23 @@
         <w:jc w:val="both"/>
       </w:pPr>
       <w:r>
-        <w:t>[12] Chen T, Guestrin C (2016). XGBoost: A Scalable Tree Boosting System. Proceedings of the 22nd ACM SIGKDD International Conference on Knowledge Discovery and Data Mining, 785-794.</w:t>
+        <w:t xml:space="preserve">[12] Chen T, </w:t>
+      </w:r>
+      <w:proofErr w:type="spellStart"/>
+      <w:r>
+        <w:t>Guestrin</w:t>
+      </w:r>
+      <w:proofErr w:type="spellEnd"/>
+      <w:r>
+        <w:t xml:space="preserve"> C (2016). </w:t>
+      </w:r>
+      <w:proofErr w:type="spellStart"/>
+      <w:r>
+        <w:t>XGBoost</w:t>
+      </w:r>
+      <w:proofErr w:type="spellEnd"/>
+      <w:r>
+        <w:t>: A Scalable Tree Boosting System. Proceedings of the 22nd ACM SIGKDD International Conference on Knowledge Discovery and Data Mining, 785-794.</w:t>
       </w:r>
     </w:p>
     <w:p>
@@ -12087,7 +14647,23 @@
         <w:jc w:val="both"/>
       </w:pPr>
       <w:r>
-        <w:t>[14] Pedregosa F, Varoquaux G, Gramfort A, et al. (2011). Scikit-learn: Machine Learning in Python. Journal of Machine Learning Research, 12, 2825-2830.</w:t>
+        <w:t xml:space="preserve">[14] Pedregosa F, </w:t>
+      </w:r>
+      <w:proofErr w:type="spellStart"/>
+      <w:r>
+        <w:t>Varoquaux</w:t>
+      </w:r>
+      <w:proofErr w:type="spellEnd"/>
+      <w:r>
+        <w:t xml:space="preserve"> G, </w:t>
+      </w:r>
+      <w:proofErr w:type="spellStart"/>
+      <w:r>
+        <w:t>Gramfort</w:t>
+      </w:r>
+      <w:proofErr w:type="spellEnd"/>
+      <w:r>
+        <w:t xml:space="preserve"> A, et al. (2011). Scikit-learn: Machine Learning in Python. Journal of Machine Learning Research, 12, 2825-2830.</w:t>
       </w:r>
     </w:p>
     <w:sectPr>
@@ -12293,7 +14869,7 @@
         <w:noProof/>
         <w:sz w:val="20"/>
       </w:rPr>
-      <w:t>CHAPTER 4. RESULTS AND DISCUSSIONS</w:t>
+      <w:t>CHAPTER 2. METHODOLOGY</w:t>
     </w:r>
     <w:r>
       <w:rPr>

</xml_diff>

<commit_message>
report.docx: fix §1.3 heading duplicate "1.31.3" render
Word's automatic numbering (numPr numId=15) on the Objectives heading
was producing "1.3" and then colliding with the "1.3   " I typed into
the text, rendering as "1.31.3   Objectives of the work". Removed the
paragraph's numPr so only the typed prefix remains, matching the
pattern used on §1.1 and §1.2 which are text-numbered.

Co-Authored-By: Claude Opus 4.7 <noreply@anthropic.com>
</commit_message>
<xml_diff>
--- a/docs/report.docx
+++ b/docs/report.docx
@@ -3154,10 +3154,6 @@
     <w:p>
       <w:pPr>
         <w:pStyle w:val="Heading4"/>
-        <w:numPr>
-          <w:ilvl w:val="1"/>
-          <w:numId w:val="15"/>
-        </w:numPr>
         <w:spacing w:before="280" w:after="100"/>
       </w:pPr>
       <w:r>

</xml_diff>

<commit_message>
report.docx: Word-side paragraph cleanup
Opening the docx in Word after the previous edits stripped two empty
paragraphs and rewrote embedded metadata; all headings, tables, and
figures land on the same pages so no TOC / LoF / LoT anchor drift.
Content verified intact: §1.3 heading still renders "1.3   Objectives
of the work", inline [1, 2] citation still present in §1.1, all 14
bibliography entries intact.

Co-Authored-By: Claude Opus 4.7 <noreply@anthropic.com>
</commit_message>
<xml_diff>
--- a/docs/report.docx
+++ b/docs/report.docx
@@ -44,8 +44,19 @@
           <w:color w:val="000000"/>
           <w:sz w:val="26"/>
         </w:rPr>
-        <w:t>IIITDM-SIES Programme</w:t>
-      </w:r>
+        <w:t xml:space="preserve">IIITDM-SIES </w:t>
+      </w:r>
+      <w:proofErr w:type="spellStart"/>
+      <w:r>
+        <w:rPr>
+          <w:rFonts w:eastAsia="Times New Roman" w:cs="Times New Roman"/>
+          <w:b/>
+          <w:color w:val="000000"/>
+          <w:sz w:val="26"/>
+        </w:rPr>
+        <w:t>Programme</w:t>
+      </w:r>
+      <w:proofErr w:type="spellEnd"/>
     </w:p>
     <w:p>
       <w:pPr>
@@ -314,7 +325,21 @@
         <w:rPr>
           <w:rFonts w:eastAsia="Times New Roman" w:cs="Times New Roman"/>
         </w:rPr>
-        <w:t>In my capacity as supervisor of the above-mentioned work, I certify that the work presented in this Report is carried out under my supervision, and is worthy of consideration for the requirements of internship under IIITDM-SIES programme during the period May 2026 to July 2026.</w:t>
+        <w:t xml:space="preserve">In my capacity as supervisor of the above-mentioned work, I certify that the work presented in this Report is carried out under my supervision, and is worthy of consideration for the requirements of internship under IIITDM-SIES </w:t>
+      </w:r>
+      <w:proofErr w:type="spellStart"/>
+      <w:r>
+        <w:rPr>
+          <w:rFonts w:eastAsia="Times New Roman" w:cs="Times New Roman"/>
+        </w:rPr>
+        <w:t>programme</w:t>
+      </w:r>
+      <w:proofErr w:type="spellEnd"/>
+      <w:r>
+        <w:rPr>
+          <w:rFonts w:eastAsia="Times New Roman" w:cs="Times New Roman"/>
+        </w:rPr>
+        <w:t xml:space="preserve"> during the period May 2026 to July 2026.</w:t>
       </w:r>
     </w:p>
     <w:p>
@@ -370,7 +395,35 @@
         <w:rPr>
           <w:rFonts w:eastAsia="Times New Roman" w:cs="Times New Roman"/>
         </w:rPr>
-        <w:t>Delivery riders working for companies such as Blinkit and Zepto have to tend to their customers while standing in uncomfortable body shapes for a long time or transporting heavy loads, which may result in musculoskeletal disorders. Risk varies across the people involved in the delivery: age, experience, working hours, the type of vehicle, and carrying methods influence the level of risk experienced by every rider, but the companies providing the delivery services do not pay attention to this difference. Different ergonomic approaches capture only certain aspects of the situation: on the one hand, some methods (RULA and QEC) are applicable to direct observations, while others, like Borg CR10, NMQ, and NASA-TLX apply to self-reporting methods. This paradigm enables the authors to offer automated screening based on a study involving 182 riders from the city of Chengalpattu and Chennai conducted in March and April 2026</w:t>
+        <w:t xml:space="preserve">Delivery riders working for companies such as </w:t>
+      </w:r>
+      <w:proofErr w:type="spellStart"/>
+      <w:r>
+        <w:rPr>
+          <w:rFonts w:eastAsia="Times New Roman" w:cs="Times New Roman"/>
+        </w:rPr>
+        <w:t>Blinkit</w:t>
+      </w:r>
+      <w:proofErr w:type="spellEnd"/>
+      <w:r>
+        <w:rPr>
+          <w:rFonts w:eastAsia="Times New Roman" w:cs="Times New Roman"/>
+        </w:rPr>
+        <w:t xml:space="preserve"> and </w:t>
+      </w:r>
+      <w:proofErr w:type="spellStart"/>
+      <w:r>
+        <w:rPr>
+          <w:rFonts w:eastAsia="Times New Roman" w:cs="Times New Roman"/>
+        </w:rPr>
+        <w:t>Zepto</w:t>
+      </w:r>
+      <w:proofErr w:type="spellEnd"/>
+      <w:r>
+        <w:rPr>
+          <w:rFonts w:eastAsia="Times New Roman" w:cs="Times New Roman"/>
+        </w:rPr>
+        <w:t xml:space="preserve"> have to tend to their customers while standing in uncomfortable body shapes for a long time or transporting heavy loads, which may result in musculoskeletal disorders. Risk varies across the people involved in the delivery: age, experience, working hours, the type of vehicle, and carrying methods influence the level of risk experienced by every rider, but the companies providing the delivery services do not pay attention to this difference. Different ergonomic approaches capture only certain aspects of the situation: on the one hand, some methods (RULA and QEC) are applicable to direct observations, while others, like Borg CR10, NMQ, and NASA-TLX apply to self-reporting methods. This paradigm enables the authors to offer automated screening based on a study involving 182 riders from the city of Chengalpattu and Chennai conducted in March and April 2026</w:t>
       </w:r>
     </w:p>
     <w:p>
@@ -382,7 +435,49 @@
         <w:rPr>
           <w:rFonts w:eastAsia="Times New Roman" w:cs="Times New Roman"/>
         </w:rPr>
-        <w:t>The pipeline runs in two stages. Stage 1 applies standard ergonomic methods (Borg CR10 action levels, RULA Table C thresholds, and sample-based cuts) to compute Low, Medium, or High risk labels for each factor from a 182-rider survey combined with 182 RULA and QEC observation records. Stage 2 trains supervised classifiers per factor using seven candidate algorithms (Logistic Regression, Decision Tree, Random Forest, Extra Trees, Hist Gradient Boosting, XGBoost, and Stacking) tuned via GridSearchCV with SMOTE inside 5-fold stratified cross-validation.</w:t>
+        <w:t xml:space="preserve">The pipeline runs in two stages. Stage 1 applies standard ergonomic methods (Borg CR10 action levels, RULA Table C thresholds, and sample-based cuts) to compute Low, Medium, or </w:t>
+      </w:r>
+      <w:proofErr w:type="gramStart"/>
+      <w:r>
+        <w:rPr>
+          <w:rFonts w:eastAsia="Times New Roman" w:cs="Times New Roman"/>
+        </w:rPr>
+        <w:t>High risk</w:t>
+      </w:r>
+      <w:proofErr w:type="gramEnd"/>
+      <w:r>
+        <w:rPr>
+          <w:rFonts w:eastAsia="Times New Roman" w:cs="Times New Roman"/>
+        </w:rPr>
+        <w:t xml:space="preserve"> labels for each factor from a 182-rider survey combined with 182 RULA and QEC observation records. Stage 2 trains supervised classifiers per factor using seven candidate algorithms (Logistic Regression, Decision Tree, Random Forest, Extra Trees, Hist Gradient Boosting, </w:t>
+      </w:r>
+      <w:proofErr w:type="spellStart"/>
+      <w:r>
+        <w:rPr>
+          <w:rFonts w:eastAsia="Times New Roman" w:cs="Times New Roman"/>
+        </w:rPr>
+        <w:t>XGBoost</w:t>
+      </w:r>
+      <w:proofErr w:type="spellEnd"/>
+      <w:r>
+        <w:rPr>
+          <w:rFonts w:eastAsia="Times New Roman" w:cs="Times New Roman"/>
+        </w:rPr>
+        <w:t xml:space="preserve">, and Stacking) tuned via </w:t>
+      </w:r>
+      <w:proofErr w:type="spellStart"/>
+      <w:r>
+        <w:rPr>
+          <w:rFonts w:eastAsia="Times New Roman" w:cs="Times New Roman"/>
+        </w:rPr>
+        <w:t>GridSearchCV</w:t>
+      </w:r>
+      <w:proofErr w:type="spellEnd"/>
+      <w:r>
+        <w:rPr>
+          <w:rFonts w:eastAsia="Times New Roman" w:cs="Times New Roman"/>
+        </w:rPr>
+        <w:t xml:space="preserve"> with SMOTE inside 5-fold stratified cross-validation.</w:t>
       </w:r>
     </w:p>
     <w:p>
@@ -391,7 +486,23 @@
         <w:jc w:val="both"/>
       </w:pPr>
       <w:r>
-        <w:t>The five factors which were taken from the survey received a validation accuracy of 58-62% and a macro AUC of 71-76%. The Posture model which incorporates 11 components of RULA and 8 QEC scores in addition to the results received an accuracy of 97% and AUC of 98%. Statistical analysis including chi-square and multiple logistic regression determined that the most powerful individual predictors of self-reported discomfort are age, length of work history, workload score and fatigue score. The final product is a Streamlit web application that takes a complete questionnaire of 36 items together with RULA and QEC results and produces six levels of risk and offers recommendations by factors.</w:t>
+        <w:t xml:space="preserve">The five factors which were taken from the survey received a validation accuracy of 58-62% and a </w:t>
+      </w:r>
+      <w:proofErr w:type="gramStart"/>
+      <w:r>
+        <w:t>macro AUC</w:t>
+      </w:r>
+      <w:proofErr w:type="gramEnd"/>
+      <w:r>
+        <w:t xml:space="preserve"> of 71-76%. The Posture model which incorporates 11 components of RULA and 8 QEC scores in addition to the results received an accuracy of 97% and AUC of 98%. Statistical analysis including chi-square and multiple logistic regression determined that the most powerful individual predictors of self-reported discomfort are age, length of work history, workload score and fatigue score. The final product is a </w:t>
+      </w:r>
+      <w:proofErr w:type="spellStart"/>
+      <w:r>
+        <w:t>Streamlit</w:t>
+      </w:r>
+      <w:proofErr w:type="spellEnd"/>
+      <w:r>
+        <w:t xml:space="preserve"> web application that takes a complete questionnaire of 36 items together with RULA and QEC results and produces six levels of risk and offers recommendations by factors.</w:t>
       </w:r>
     </w:p>
     <w:p>
@@ -495,8 +606,15 @@
           <w:rFonts w:eastAsia="Times New Roman" w:cs="Times New Roman"/>
         </w:rPr>
         <w:tab/>
+      </w:r>
+      <w:proofErr w:type="spellStart"/>
+      <w:r>
+        <w:rPr>
+          <w:rFonts w:eastAsia="Times New Roman" w:cs="Times New Roman"/>
+        </w:rPr>
         <w:t>i</w:t>
       </w:r>
+      <w:proofErr w:type="spellEnd"/>
     </w:p>
     <w:p>
       <w:pPr>
@@ -1044,8 +1162,16 @@
         <w:rPr>
           <w:rFonts w:eastAsia="Times New Roman" w:cs="Times New Roman"/>
         </w:rPr>
-        <w:t xml:space="preserve">        2.6.6   XGBoost</w:t>
-      </w:r>
+        <w:t xml:space="preserve">        2.6.6   </w:t>
+      </w:r>
+      <w:proofErr w:type="spellStart"/>
+      <w:r>
+        <w:rPr>
+          <w:rFonts w:eastAsia="Times New Roman" w:cs="Times New Roman"/>
+        </w:rPr>
+        <w:t>XGBoost</w:t>
+      </w:r>
+      <w:proofErr w:type="spellEnd"/>
       <w:r>
         <w:rPr>
           <w:rFonts w:eastAsia="Times New Roman" w:cs="Times New Roman"/>
@@ -1151,7 +1277,23 @@
           <w:b/>
         </w:rPr>
         <w:lastRenderedPageBreak/>
-        <w:t>3   WORK DONE</w:t>
+        <w:t xml:space="preserve">3   </w:t>
+      </w:r>
+      <w:proofErr w:type="gramStart"/>
+      <w:r>
+        <w:rPr>
+          <w:rFonts w:eastAsia="Times New Roman" w:cs="Times New Roman"/>
+          <w:b/>
+        </w:rPr>
+        <w:t>WORK</w:t>
+      </w:r>
+      <w:proofErr w:type="gramEnd"/>
+      <w:r>
+        <w:rPr>
+          <w:rFonts w:eastAsia="Times New Roman" w:cs="Times New Roman"/>
+          <w:b/>
+        </w:rPr>
+        <w:t xml:space="preserve"> DONE</w:t>
       </w:r>
       <w:r>
         <w:rPr>
@@ -2258,7 +2400,21 @@
           <w:rFonts w:eastAsia="Times New Roman" w:cs="Times New Roman"/>
         </w:rPr>
         <w:tab/>
-        <w:t>Winning hyperparameters per target after GridSearchCV.</w:t>
+        <w:t xml:space="preserve">Winning hyperparameters per target after </w:t>
+      </w:r>
+      <w:proofErr w:type="spellStart"/>
+      <w:r>
+        <w:rPr>
+          <w:rFonts w:eastAsia="Times New Roman" w:cs="Times New Roman"/>
+        </w:rPr>
+        <w:t>GridSearchCV</w:t>
+      </w:r>
+      <w:proofErr w:type="spellEnd"/>
+      <w:r>
+        <w:rPr>
+          <w:rFonts w:eastAsia="Times New Roman" w:cs="Times New Roman"/>
+        </w:rPr>
+        <w:t>.</w:t>
       </w:r>
       <w:r>
         <w:rPr>
@@ -2451,14 +2607,14 @@
           <w:rFonts w:eastAsia="Times New Roman" w:cs="Times New Roman"/>
           <w:b/>
         </w:rPr>
-        <w:t>ML</w:t>
+        <w:t>ROC</w:t>
       </w:r>
       <w:r>
         <w:rPr>
           <w:rFonts w:eastAsia="Times New Roman" w:cs="Times New Roman"/>
         </w:rPr>
         <w:tab/>
-        <w:t>Machine Learning</w:t>
+        <w:t>Receiver Operating Characteristic</w:t>
       </w:r>
     </w:p>
     <w:p>
@@ -2473,14 +2629,14 @@
           <w:rFonts w:eastAsia="Times New Roman" w:cs="Times New Roman"/>
           <w:b/>
         </w:rPr>
-        <w:t>ROC</w:t>
+        <w:t>AUC</w:t>
       </w:r>
       <w:r>
         <w:rPr>
           <w:rFonts w:eastAsia="Times New Roman" w:cs="Times New Roman"/>
         </w:rPr>
         <w:tab/>
-        <w:t>Receiver Operating Characteristic</w:t>
+        <w:t>Area Under the Curve</w:t>
       </w:r>
     </w:p>
     <w:p>
@@ -2495,14 +2651,14 @@
           <w:rFonts w:eastAsia="Times New Roman" w:cs="Times New Roman"/>
           <w:b/>
         </w:rPr>
-        <w:t>AUC</w:t>
+        <w:t>OR</w:t>
       </w:r>
       <w:r>
         <w:rPr>
           <w:rFonts w:eastAsia="Times New Roman" w:cs="Times New Roman"/>
         </w:rPr>
         <w:tab/>
-        <w:t>Area Under the Curve</w:t>
+        <w:t>Odds Ratio</w:t>
       </w:r>
     </w:p>
     <w:p>
@@ -2517,14 +2673,14 @@
           <w:rFonts w:eastAsia="Times New Roman" w:cs="Times New Roman"/>
           <w:b/>
         </w:rPr>
-        <w:t>OR</w:t>
+        <w:t>CI</w:t>
       </w:r>
       <w:r>
         <w:rPr>
           <w:rFonts w:eastAsia="Times New Roman" w:cs="Times New Roman"/>
         </w:rPr>
         <w:tab/>
-        <w:t>Odds Ratio</w:t>
+        <w:t>Confidence Interval</w:t>
       </w:r>
     </w:p>
     <w:p>
@@ -2534,19 +2690,21 @@
         </w:tabs>
         <w:spacing w:after="60"/>
       </w:pPr>
+      <w:proofErr w:type="spellStart"/>
       <w:r>
         <w:rPr>
           <w:rFonts w:eastAsia="Times New Roman" w:cs="Times New Roman"/>
           <w:b/>
         </w:rPr>
-        <w:t>CI</w:t>
-      </w:r>
+        <w:t>HistGBM</w:t>
+      </w:r>
+      <w:proofErr w:type="spellEnd"/>
       <w:r>
         <w:rPr>
           <w:rFonts w:eastAsia="Times New Roman" w:cs="Times New Roman"/>
         </w:rPr>
         <w:tab/>
-        <w:t>Confidence Interval</w:t>
+        <w:t>Histogram-based Gradient Boosting Machine</w:t>
       </w:r>
     </w:p>
     <w:p>
@@ -2556,19 +2714,34 @@
         </w:tabs>
         <w:spacing w:after="60"/>
       </w:pPr>
+      <w:proofErr w:type="spellStart"/>
       <w:r>
         <w:rPr>
           <w:rFonts w:eastAsia="Times New Roman" w:cs="Times New Roman"/>
           <w:b/>
         </w:rPr>
-        <w:t>HistGBM</w:t>
-      </w:r>
+        <w:t>XGBoost</w:t>
+      </w:r>
+      <w:proofErr w:type="spellEnd"/>
       <w:r>
         <w:rPr>
           <w:rFonts w:eastAsia="Times New Roman" w:cs="Times New Roman"/>
         </w:rPr>
         <w:tab/>
-        <w:t>Histogram-based Gradient Boosting Machine</w:t>
+      </w:r>
+      <w:proofErr w:type="spellStart"/>
+      <w:r>
+        <w:rPr>
+          <w:rFonts w:eastAsia="Times New Roman" w:cs="Times New Roman"/>
+        </w:rPr>
+        <w:t>eXtreme</w:t>
+      </w:r>
+      <w:proofErr w:type="spellEnd"/>
+      <w:r>
+        <w:rPr>
+          <w:rFonts w:eastAsia="Times New Roman" w:cs="Times New Roman"/>
+        </w:rPr>
+        <w:t xml:space="preserve"> Gradient Boosting</w:t>
       </w:r>
     </w:p>
     <w:p>
@@ -2583,14 +2756,14 @@
           <w:rFonts w:eastAsia="Times New Roman" w:cs="Times New Roman"/>
           <w:b/>
         </w:rPr>
-        <w:t>XGBoost</w:t>
+        <w:t>CART</w:t>
       </w:r>
       <w:r>
         <w:rPr>
           <w:rFonts w:eastAsia="Times New Roman" w:cs="Times New Roman"/>
         </w:rPr>
         <w:tab/>
-        <w:t>eXtreme Gradient Boosting</w:t>
+        <w:t>Classification and Regression Trees</w:t>
       </w:r>
     </w:p>
     <w:p>
@@ -2600,19 +2773,21 @@
         </w:tabs>
         <w:spacing w:after="60"/>
       </w:pPr>
+      <w:proofErr w:type="spellStart"/>
       <w:r>
         <w:rPr>
           <w:rFonts w:eastAsia="Times New Roman" w:cs="Times New Roman"/>
           <w:b/>
         </w:rPr>
-        <w:t>CART</w:t>
-      </w:r>
+        <w:t>dph</w:t>
+      </w:r>
+      <w:proofErr w:type="spellEnd"/>
       <w:r>
         <w:rPr>
           <w:rFonts w:eastAsia="Times New Roman" w:cs="Times New Roman"/>
         </w:rPr>
         <w:tab/>
-        <w:t>Classification and Regression Trees</w:t>
+        <w:t>Deliveries Per Hour</w:t>
       </w:r>
     </w:p>
     <w:p>
@@ -2624,17 +2799,13 @@
       </w:pPr>
       <w:r>
         <w:rPr>
-          <w:rFonts w:eastAsia="Times New Roman" w:cs="Times New Roman"/>
           <w:b/>
         </w:rPr>
-        <w:t>dph</w:t>
-      </w:r>
-      <w:r>
-        <w:rPr>
-          <w:rFonts w:eastAsia="Times New Roman" w:cs="Times New Roman"/>
-        </w:rPr>
+        <w:t>MSK</w:t>
+      </w:r>
+      <w:r>
         <w:tab/>
-        <w:t>Deliveries Per Hour</w:t>
+        <w:t>Musculoskeletal</w:t>
       </w:r>
     </w:p>
     <w:p>
@@ -2648,11 +2819,11 @@
         <w:rPr>
           <w:b/>
         </w:rPr>
-        <w:t>MSK</w:t>
+        <w:t>CR10</w:t>
       </w:r>
       <w:r>
         <w:tab/>
-        <w:t>Musculoskeletal</w:t>
+        <w:t>Category-Ratio 10-point scale (Borg)</w:t>
       </w:r>
     </w:p>
     <w:p>
@@ -2666,11 +2837,11 @@
         <w:rPr>
           <w:b/>
         </w:rPr>
-        <w:t>CR10</w:t>
+        <w:t>RF</w:t>
       </w:r>
       <w:r>
         <w:tab/>
-        <w:t>Category-Ratio 10-point scale (Borg)</w:t>
+        <w:t>Random Forest</w:t>
       </w:r>
     </w:p>
     <w:p>
@@ -2684,11 +2855,11 @@
         <w:rPr>
           <w:b/>
         </w:rPr>
-        <w:t>RF</w:t>
+        <w:t>ET</w:t>
       </w:r>
       <w:r>
         <w:tab/>
-        <w:t>Random Forest</w:t>
+        <w:t>Extra Trees</w:t>
       </w:r>
     </w:p>
     <w:p>
@@ -2702,11 +2873,11 @@
         <w:rPr>
           <w:b/>
         </w:rPr>
-        <w:t>ET</w:t>
+        <w:t>LR</w:t>
       </w:r>
       <w:r>
         <w:tab/>
-        <w:t>Extra Trees</w:t>
+        <w:t>Logistic Regression</w:t>
       </w:r>
     </w:p>
     <w:p>
@@ -2720,11 +2891,11 @@
         <w:rPr>
           <w:b/>
         </w:rPr>
-        <w:t>LR</w:t>
+        <w:t>DT</w:t>
       </w:r>
       <w:r>
         <w:tab/>
-        <w:t>Logistic Regression</w:t>
+        <w:t>Decision Tree</w:t>
       </w:r>
     </w:p>
     <w:p>
@@ -2738,11 +2909,11 @@
         <w:rPr>
           <w:b/>
         </w:rPr>
-        <w:t>DT</w:t>
+        <w:t>GBM</w:t>
       </w:r>
       <w:r>
         <w:tab/>
-        <w:t>Decision Tree</w:t>
+        <w:t>Gradient Boosting Machine</w:t>
       </w:r>
     </w:p>
     <w:p>
@@ -2752,15 +2923,17 @@
         </w:tabs>
         <w:spacing w:after="60"/>
       </w:pPr>
+      <w:proofErr w:type="spellStart"/>
       <w:r>
         <w:rPr>
           <w:b/>
         </w:rPr>
-        <w:t>GBM</w:t>
-      </w:r>
+        <w:t>OvR</w:t>
+      </w:r>
+      <w:proofErr w:type="spellEnd"/>
       <w:r>
         <w:tab/>
-        <w:t>Gradient Boosting Machine</w:t>
+        <w:t>One-vs-Rest</w:t>
       </w:r>
     </w:p>
     <w:p>
@@ -2774,11 +2947,28 @@
         <w:rPr>
           <w:b/>
         </w:rPr>
-        <w:t>OvR</w:t>
+        <w:t>SD</w:t>
       </w:r>
       <w:r>
         <w:tab/>
-        <w:t>One-vs-Rest</w:t>
+        <w:t>Standard Deviation</w:t>
+      </w:r>
+    </w:p>
+    <w:p>
+      <w:pPr>
+        <w:pStyle w:val="Heading1"/>
+        <w:pageBreakBefore/>
+        <w:spacing w:after="480"/>
+        <w:jc w:val="center"/>
+      </w:pPr>
+      <w:r>
+        <w:rPr>
+          <w:rFonts w:ascii="Times New Roman" w:eastAsia="Times New Roman" w:hAnsi="Times New Roman" w:cs="Times New Roman"/>
+          <w:color w:val="000000"/>
+          <w:sz w:val="56"/>
+        </w:rPr>
+        <w:lastRenderedPageBreak/>
+        <w:t>Symbols</w:t>
       </w:r>
     </w:p>
     <w:p>
@@ -2790,30 +2980,18 @@
       </w:pPr>
       <w:r>
         <w:rPr>
+          <w:rFonts w:eastAsia="Times New Roman" w:cs="Times New Roman"/>
           <w:b/>
-        </w:rPr>
-        <w:t>SD</w:t>
-      </w:r>
-      <w:r>
+          <w:i/>
+        </w:rPr>
+        <w:t>n</w:t>
+      </w:r>
+      <w:r>
+        <w:rPr>
+          <w:rFonts w:eastAsia="Times New Roman" w:cs="Times New Roman"/>
+        </w:rPr>
         <w:tab/>
-        <w:t>Standard Deviation</w:t>
-      </w:r>
-    </w:p>
-    <w:p>
-      <w:pPr>
-        <w:pStyle w:val="Heading1"/>
-        <w:pageBreakBefore/>
-        <w:spacing w:after="480"/>
-        <w:jc w:val="center"/>
-      </w:pPr>
-      <w:r>
-        <w:rPr>
-          <w:rFonts w:ascii="Times New Roman" w:eastAsia="Times New Roman" w:hAnsi="Times New Roman" w:cs="Times New Roman"/>
-          <w:color w:val="000000"/>
-          <w:sz w:val="56"/>
-        </w:rPr>
-        <w:lastRenderedPageBreak/>
-        <w:t>Symbols</w:t>
+        <w:t>sample size (n = 182 riders)</w:t>
       </w:r>
     </w:p>
     <w:p>
@@ -2829,14 +3007,28 @@
           <w:b/>
           <w:i/>
         </w:rPr>
-        <w:t>n</w:t>
+        <w:t>k</w:t>
       </w:r>
       <w:r>
         <w:rPr>
           <w:rFonts w:eastAsia="Times New Roman" w:cs="Times New Roman"/>
         </w:rPr>
         <w:tab/>
-        <w:t>sample size (n = 182 riders)</w:t>
+        <w:t xml:space="preserve">number of nearest minority </w:t>
+      </w:r>
+      <w:proofErr w:type="spellStart"/>
+      <w:r>
+        <w:rPr>
+          <w:rFonts w:eastAsia="Times New Roman" w:cs="Times New Roman"/>
+        </w:rPr>
+        <w:t>neighbours</w:t>
+      </w:r>
+      <w:proofErr w:type="spellEnd"/>
+      <w:r>
+        <w:rPr>
+          <w:rFonts w:eastAsia="Times New Roman" w:cs="Times New Roman"/>
+        </w:rPr>
+        <w:t xml:space="preserve"> used by SMOTE</w:t>
       </w:r>
     </w:p>
     <w:p>
@@ -2852,14 +3044,14 @@
           <w:b/>
           <w:i/>
         </w:rPr>
-        <w:t>k</w:t>
+        <w:t>λ</w:t>
       </w:r>
       <w:r>
         <w:rPr>
           <w:rFonts w:eastAsia="Times New Roman" w:cs="Times New Roman"/>
         </w:rPr>
         <w:tab/>
-        <w:t>number of nearest minority neighbours used by SMOTE</w:t>
+        <w:t>uniform random weight for SMOTE interpolation</w:t>
       </w:r>
     </w:p>
     <w:p>
@@ -2875,14 +3067,14 @@
           <w:b/>
           <w:i/>
         </w:rPr>
-        <w:t>λ</w:t>
+        <w:t>β</w:t>
       </w:r>
       <w:r>
         <w:rPr>
           <w:rFonts w:eastAsia="Times New Roman" w:cs="Times New Roman"/>
         </w:rPr>
         <w:tab/>
-        <w:t>uniform random weight for SMOTE interpolation</w:t>
+        <w:t>regression coefficient in logistic regression</w:t>
       </w:r>
     </w:p>
     <w:p>
@@ -2898,14 +3090,14 @@
           <w:b/>
           <w:i/>
         </w:rPr>
-        <w:t>β</w:t>
+        <w:t>χ²</w:t>
       </w:r>
       <w:r>
         <w:rPr>
           <w:rFonts w:eastAsia="Times New Roman" w:cs="Times New Roman"/>
         </w:rPr>
         <w:tab/>
-        <w:t>regression coefficient in logistic regression</w:t>
+        <w:t>chi-square test statistic</w:t>
       </w:r>
     </w:p>
     <w:p>
@@ -2921,14 +3113,14 @@
           <w:b/>
           <w:i/>
         </w:rPr>
-        <w:t>χ²</w:t>
+        <w:t>p</w:t>
       </w:r>
       <w:r>
         <w:rPr>
           <w:rFonts w:eastAsia="Times New Roman" w:cs="Times New Roman"/>
         </w:rPr>
         <w:tab/>
-        <w:t>chi-square test statistic</w:t>
+        <w:t>p-value (statistical significance)</w:t>
       </w:r>
     </w:p>
     <w:p>
@@ -2938,21 +3130,45 @@
         </w:tabs>
         <w:spacing w:after="60"/>
       </w:pPr>
+      <w:proofErr w:type="spellStart"/>
       <w:r>
         <w:rPr>
           <w:rFonts w:eastAsia="Times New Roman" w:cs="Times New Roman"/>
           <w:b/>
           <w:i/>
         </w:rPr>
-        <w:t>p</w:t>
-      </w:r>
+        <w:t>dph</w:t>
+      </w:r>
+      <w:proofErr w:type="spellEnd"/>
       <w:r>
         <w:rPr>
           <w:rFonts w:eastAsia="Times New Roman" w:cs="Times New Roman"/>
         </w:rPr>
         <w:tab/>
-        <w:t>p-value (statistical significance)</w:t>
-      </w:r>
+        <w:t xml:space="preserve">deliveries per hour, </w:t>
+      </w:r>
+      <w:proofErr w:type="spellStart"/>
+      <w:r>
+        <w:rPr>
+          <w:rFonts w:eastAsia="Times New Roman" w:cs="Times New Roman"/>
+        </w:rPr>
+        <w:t>deliveries_num</w:t>
+      </w:r>
+      <w:proofErr w:type="spellEnd"/>
+      <w:r>
+        <w:rPr>
+          <w:rFonts w:eastAsia="Times New Roman" w:cs="Times New Roman"/>
+        </w:rPr>
+        <w:t xml:space="preserve"> / </w:t>
+      </w:r>
+      <w:proofErr w:type="spellStart"/>
+      <w:r>
+        <w:rPr>
+          <w:rFonts w:eastAsia="Times New Roman" w:cs="Times New Roman"/>
+        </w:rPr>
+        <w:t>work_hours_num</w:t>
+      </w:r>
+      <w:proofErr w:type="spellEnd"/>
     </w:p>
     <w:p>
       <w:pPr>
@@ -2963,18 +3179,13 @@
       </w:pPr>
       <w:r>
         <w:rPr>
-          <w:rFonts w:eastAsia="Times New Roman" w:cs="Times New Roman"/>
           <w:b/>
-          <w:i/>
-        </w:rPr>
-        <w:t>dph</w:t>
-      </w:r>
-      <w:r>
-        <w:rPr>
-          <w:rFonts w:eastAsia="Times New Roman" w:cs="Times New Roman"/>
-        </w:rPr>
+        </w:rPr>
+        <w:t>α</w:t>
+      </w:r>
+      <w:r>
         <w:tab/>
-        <w:t>deliveries per hour, deliveries_num / work_hours_num</w:t>
+        <w:t>significance threshold (α = 0.05)</w:t>
       </w:r>
     </w:p>
     <w:p>
@@ -2984,30 +3195,14 @@
         </w:tabs>
         <w:spacing w:after="60"/>
       </w:pPr>
+      <w:proofErr w:type="spellStart"/>
       <w:r>
         <w:rPr>
           <w:b/>
         </w:rPr>
-        <w:t>α</w:t>
-      </w:r>
-      <w:r>
-        <w:tab/>
-        <w:t>significance threshold (α = 0.05)</w:t>
-      </w:r>
-    </w:p>
-    <w:p>
-      <w:pPr>
-        <w:tabs>
-          <w:tab w:val="left" w:pos="1984"/>
-        </w:tabs>
-        <w:spacing w:after="60"/>
-      </w:pPr>
-      <w:r>
-        <w:rPr>
-          <w:b/>
-        </w:rPr>
         <w:t>df</w:t>
       </w:r>
+      <w:proofErr w:type="spellEnd"/>
       <w:r>
         <w:tab/>
         <w:t>degrees of freedom (chi-square test)</w:t>
@@ -3081,7 +3276,35 @@
         <w:rPr>
           <w:rFonts w:eastAsia="Times New Roman" w:cs="Times New Roman"/>
         </w:rPr>
-        <w:t>Last-mile quick-commerce delivery riders for platforms like Blinkit and Zepto spend long hours on bikes, climb stairs, carry packages, and ride in heavy traffic. Prior Indian last-mile MSK studies [1, 2] report similar exposure patterns among app-based delivery riders. Over time this kind of work causes musculoskeletal disorders (MSDs): back pain, shoulder pain, wrist injuries, knee problems. The risk is not the same for every rider. Someone who is 22 and works 4 hours a day on a scooter is in a very different situation from a 45-year-old who works 10 hours a day on a motorbike with a handheld bag.</w:t>
+        <w:t xml:space="preserve">Last-mile quick-commerce delivery riders for platforms like </w:t>
+      </w:r>
+      <w:proofErr w:type="spellStart"/>
+      <w:r>
+        <w:rPr>
+          <w:rFonts w:eastAsia="Times New Roman" w:cs="Times New Roman"/>
+        </w:rPr>
+        <w:t>Blinkit</w:t>
+      </w:r>
+      <w:proofErr w:type="spellEnd"/>
+      <w:r>
+        <w:rPr>
+          <w:rFonts w:eastAsia="Times New Roman" w:cs="Times New Roman"/>
+        </w:rPr>
+        <w:t xml:space="preserve"> and </w:t>
+      </w:r>
+      <w:proofErr w:type="spellStart"/>
+      <w:r>
+        <w:rPr>
+          <w:rFonts w:eastAsia="Times New Roman" w:cs="Times New Roman"/>
+        </w:rPr>
+        <w:t>Zepto</w:t>
+      </w:r>
+      <w:proofErr w:type="spellEnd"/>
+      <w:r>
+        <w:rPr>
+          <w:rFonts w:eastAsia="Times New Roman" w:cs="Times New Roman"/>
+        </w:rPr>
+        <w:t xml:space="preserve"> spend long hours on bikes, climb stairs, carry packages, and ride in heavy traffic. Prior Indian last-mile MSK studies [1, 2] report similar exposure patterns among app-based delivery riders. Over time this kind of work causes musculoskeletal disorders (MSDs): back pain, shoulder pain, wrist injuries, knee problems. The risk is not the same for every rider. Someone who is 22 and works 4 hours a day on a scooter is in a very different situation from a 45-year-old who works 10 hours a day on a motorbike with a handheld bag.</w:t>
       </w:r>
     </w:p>
     <w:p>
@@ -3122,7 +3345,21 @@
         <w:rPr>
           <w:rFonts w:eastAsia="Times New Roman" w:cs="Times New Roman"/>
         </w:rPr>
-        <w:t>The delivery economy in India has grown rapidly in recent years. Quick-commerce riders form a large occupational group with working conditions unlike traditional warehouse or manufacturing labour: long-distance riding, carrying goods in a moving vehicle where the load position cannot be controlled, exposure to bad weather, and constant pressure from platform routing algorithms. No screening tool exists that lets a platform assess a rider on all six standard ergonomic factors from a single questionnaire.</w:t>
+        <w:t xml:space="preserve">The delivery economy in India has grown rapidly in recent years. Quick-commerce riders form a large occupational group with working conditions unlike traditional warehouse or manufacturing </w:t>
+      </w:r>
+      <w:proofErr w:type="spellStart"/>
+      <w:r>
+        <w:rPr>
+          <w:rFonts w:eastAsia="Times New Roman" w:cs="Times New Roman"/>
+        </w:rPr>
+        <w:t>labour</w:t>
+      </w:r>
+      <w:proofErr w:type="spellEnd"/>
+      <w:r>
+        <w:rPr>
+          <w:rFonts w:eastAsia="Times New Roman" w:cs="Times New Roman"/>
+        </w:rPr>
+        <w:t>: long-distance riding, carrying goods in a moving vehicle where the load position cannot be controlled, exposure to bad weather, and constant pressure from platform routing algorithms. No screening tool exists that lets a platform assess a rider on all six standard ergonomic factors from a single questionnaire.</w:t>
       </w:r>
     </w:p>
     <w:p>
@@ -3139,17 +3376,6 @@
         </w:rPr>
         <w:t>By producing a risk profile for each rider, platforms can intervene early: shortening shifts for high-risk riders, reviewing the equipment they use, arranging physiotherapy, and re-screening regularly. Without this approach the risks stay invisible until the rider becomes symptomatic. This project addresses that gap by combining published ergonomic assessment methods with modern classifiers into a single screening pipeline and web application.</w:t>
       </w:r>
-      <w:r>
-        <w:rPr>
-          <w:rFonts w:eastAsia="Times New Roman" w:cs="Times New Roman"/>
-        </w:rPr>
-      </w:r>
-    </w:p>
-    <w:p>
-      <w:pPr>
-        <w:spacing w:after="160" w:line="336" w:lineRule="auto"/>
-        <w:jc w:val="both"/>
-      </w:pPr>
     </w:p>
     <w:p>
       <w:pPr>
@@ -3180,7 +3406,24 @@
         <w:spacing w:after="60"/>
       </w:pPr>
       <w:r>
-        <w:t>Conduct the pipeline reproducibly in Python (Jupyter notebooks, scikit-learn, XGBoost, imbalanced-learn, statsmodels) with an assigned seed and the entire regeneration of the output at every part of the process.</w:t>
+        <w:lastRenderedPageBreak/>
+        <w:t xml:space="preserve">Conduct the pipeline reproducibly in Python (Jupyter notebooks, scikit-learn, </w:t>
+      </w:r>
+      <w:proofErr w:type="spellStart"/>
+      <w:r>
+        <w:t>XGBoost</w:t>
+      </w:r>
+      <w:proofErr w:type="spellEnd"/>
+      <w:r>
+        <w:t xml:space="preserve">, imbalanced-learn, </w:t>
+      </w:r>
+      <w:proofErr w:type="spellStart"/>
+      <w:r>
+        <w:t>statsmodels</w:t>
+      </w:r>
+      <w:proofErr w:type="spellEnd"/>
+      <w:r>
+        <w:t>) with an assigned seed and the entire regeneration of the output at every part of the process.</w:t>
       </w:r>
     </w:p>
     <w:p>
@@ -3189,7 +3432,15 @@
         <w:spacing w:after="60"/>
       </w:pPr>
       <w:r>
-        <w:t>Train and validate 7 potential ML techniques for each of the risk indicators through 5-fold stratified cross-validation, implementing SMOTE oversampling during training using all of the folds, and give out results including the accuracy values, macro F1 and macro AUC.</w:t>
+        <w:t xml:space="preserve">Train and validate 7 potential ML techniques for each of the risk indicators through 5-fold stratified cross-validation, implementing SMOTE oversampling during training using all of the folds, and give out results including the accuracy values, macro F1 and </w:t>
+      </w:r>
+      <w:proofErr w:type="gramStart"/>
+      <w:r>
+        <w:t>macro AUC</w:t>
+      </w:r>
+      <w:proofErr w:type="gramEnd"/>
+      <w:r>
+        <w:t>.</w:t>
       </w:r>
     </w:p>
     <w:p>
@@ -3206,7 +3457,15 @@
         <w:pStyle w:val="ListNumber"/>
       </w:pPr>
       <w:r>
-        <w:t>Deliver the created models as part of a Streamlit web service accepting information from complete and full 36-item questionnaire plus 11 items about RULA and 8 items about QEC and giving out risk measurements for every category according to 6 CTQs.</w:t>
+        <w:t xml:space="preserve">Deliver the created models as part of a </w:t>
+      </w:r>
+      <w:proofErr w:type="spellStart"/>
+      <w:r>
+        <w:t>Streamlit</w:t>
+      </w:r>
+      <w:proofErr w:type="spellEnd"/>
+      <w:r>
+        <w:t xml:space="preserve"> web service accepting information from complete and full 36-item questionnaire plus 11 items about RULA and 8 items about QEC and giving out risk measurements for every category according to 6 CTQs.</w:t>
       </w:r>
     </w:p>
     <w:p>
@@ -3346,7 +3605,35 @@
         <w:rPr>
           <w:rFonts w:eastAsia="Times New Roman" w:cs="Times New Roman"/>
         </w:rPr>
-        <w:t>This is a cross-sectional study of Blinkit and Zepto quick-commerce delivery partners conducted in the Chengalpattu and Chennai regions in March-April 2026 using convenience sampling. The same 182 participants supplied both data streams: rider self-report through a Google Form and posture recorded during a delivery task by a trained observer.</w:t>
+        <w:t xml:space="preserve">This is a cross-sectional study of </w:t>
+      </w:r>
+      <w:proofErr w:type="spellStart"/>
+      <w:r>
+        <w:rPr>
+          <w:rFonts w:eastAsia="Times New Roman" w:cs="Times New Roman"/>
+        </w:rPr>
+        <w:t>Blinkit</w:t>
+      </w:r>
+      <w:proofErr w:type="spellEnd"/>
+      <w:r>
+        <w:rPr>
+          <w:rFonts w:eastAsia="Times New Roman" w:cs="Times New Roman"/>
+        </w:rPr>
+        <w:t xml:space="preserve"> and </w:t>
+      </w:r>
+      <w:proofErr w:type="spellStart"/>
+      <w:r>
+        <w:rPr>
+          <w:rFonts w:eastAsia="Times New Roman" w:cs="Times New Roman"/>
+        </w:rPr>
+        <w:t>Zepto</w:t>
+      </w:r>
+      <w:proofErr w:type="spellEnd"/>
+      <w:r>
+        <w:rPr>
+          <w:rFonts w:eastAsia="Times New Roman" w:cs="Times New Roman"/>
+        </w:rPr>
+        <w:t xml:space="preserve"> quick-commerce delivery partners conducted in the Chengalpattu and Chennai regions in March-April 2026 using convenience sampling. The same 182 participants supplied both data streams: rider self-report through a Google Form and posture recorded during a delivery task by a trained observer.</w:t>
       </w:r>
     </w:p>
     <w:p>
@@ -3372,7 +3659,35 @@
         <w:rPr>
           <w:rFonts w:eastAsia="Times New Roman" w:cs="Times New Roman"/>
         </w:rPr>
-        <w:t>Full-time delivery partners working on either the Blinkit or the Zepto platform.</w:t>
+        <w:t xml:space="preserve">Full-time delivery partners working on either the </w:t>
+      </w:r>
+      <w:proofErr w:type="spellStart"/>
+      <w:r>
+        <w:rPr>
+          <w:rFonts w:eastAsia="Times New Roman" w:cs="Times New Roman"/>
+        </w:rPr>
+        <w:t>Blinkit</w:t>
+      </w:r>
+      <w:proofErr w:type="spellEnd"/>
+      <w:r>
+        <w:rPr>
+          <w:rFonts w:eastAsia="Times New Roman" w:cs="Times New Roman"/>
+        </w:rPr>
+        <w:t xml:space="preserve"> or the </w:t>
+      </w:r>
+      <w:proofErr w:type="spellStart"/>
+      <w:r>
+        <w:rPr>
+          <w:rFonts w:eastAsia="Times New Roman" w:cs="Times New Roman"/>
+        </w:rPr>
+        <w:t>Zepto</w:t>
+      </w:r>
+      <w:proofErr w:type="spellEnd"/>
+      <w:r>
+        <w:rPr>
+          <w:rFonts w:eastAsia="Times New Roman" w:cs="Times New Roman"/>
+        </w:rPr>
+        <w:t xml:space="preserve"> platform.</w:t>
       </w:r>
     </w:p>
     <w:p>
@@ -3457,14 +3772,12 @@
       <w:pPr>
         <w:spacing w:before="180" w:after="60"/>
         <w:rPr>
-          <w:rFonts w:ascii="Times New Roman" w:eastAsia="Times New Roman" w:hAnsi="Times New Roman" w:cs="Times New Roman"/>
-          <w:color w:val="auto"/>
-        </w:rPr>
-      </w:pPr>
-      <w:r>
-        <w:rPr>
-          <w:rFonts w:ascii="Times New Roman" w:eastAsia="Times New Roman" w:hAnsi="Times New Roman" w:cs="Times New Roman"/>
-          <w:color w:val="auto"/>
+          <w:rFonts w:eastAsia="Times New Roman" w:cs="Times New Roman"/>
+        </w:rPr>
+      </w:pPr>
+      <w:r>
+        <w:rPr>
+          <w:rFonts w:eastAsia="Times New Roman" w:cs="Times New Roman"/>
         </w:rPr>
         <w:t>The dataset delivery_rider_survey.csv contains the 182 responses to the 36-item questionnaire: demographics and work pattern, NMQ 12-month pain (nine body areas), 7-day discomfort restricted to four high-load rider areas (neck, lower back, wrist / hands, knees) as a space-saving modification of the standard NMQ, five discomfort follow-ups, six NASA-TLX items (0 to 100), and six Borg CR10 items (0 to 10).</w:t>
       </w:r>
@@ -3488,22 +3801,12 @@
       <w:pPr>
         <w:spacing w:before="280" w:after="100"/>
         <w:rPr>
-          <w:rFonts w:ascii="Times New Roman" w:eastAsia="Times New Roman" w:hAnsi="Times New Roman" w:cs="Times New Roman"/>
-          <w:b w:val="0"/>
-          <w:bCs w:val="0"/>
-          <w:i w:val="0"/>
-          <w:iCs w:val="0"/>
-          <w:color w:val="auto"/>
-        </w:rPr>
-      </w:pPr>
-      <w:r>
-        <w:rPr>
-          <w:rFonts w:ascii="Times New Roman" w:eastAsia="Times New Roman" w:hAnsi="Times New Roman" w:cs="Times New Roman"/>
-          <w:b w:val="0"/>
-          <w:bCs w:val="0"/>
-          <w:i w:val="0"/>
-          <w:iCs w:val="0"/>
-          <w:color w:val="auto"/>
+          <w:rFonts w:eastAsia="Times New Roman" w:cs="Times New Roman"/>
+        </w:rPr>
+      </w:pPr>
+      <w:r>
+        <w:rPr>
+          <w:rFonts w:eastAsia="Times New Roman" w:cs="Times New Roman"/>
         </w:rPr>
         <w:t>The dataset posture_data.xlsx holds 182 observation records, each carrying the 11 RULA components, 3 RULA Table scores, and 8 QEC scores. The rows lack rider identifiers; pairing to the survey uses the severity-rank merge described in §2.3.</w:t>
       </w:r>
@@ -3531,7 +3834,133 @@
         <w:rPr>
           <w:rFonts w:eastAsia="Times New Roman" w:cs="Times New Roman"/>
         </w:rPr>
-        <w:t>Phase 1 (01_data_cleaning.ipynb) normalises the raw CSV, standardises Yes/No answers, and validates row counts. Phase 2 (02_feature_engineering.ipynb) encodes ordered categorical bins to integers, assigns numeric midpoints to bin ranges, ranks vehicle type and carrying mode, aliases the 18 Yes/No items, and derives four composite features -- workload_score (mean of the six NASA-TLX items with satisfaction reversed), fatigue_score (mean of the six Borg CR10 items), force_exertion (the Borg lifting item), and vibration_index (vehicle_rank x work_hours_num) -- plus five product-form interactions so tree-based models can pick up combined effects.</w:t>
+        <w:t>Phase 1 (01_data_</w:t>
+      </w:r>
+      <w:proofErr w:type="gramStart"/>
+      <w:r>
+        <w:rPr>
+          <w:rFonts w:eastAsia="Times New Roman" w:cs="Times New Roman"/>
+        </w:rPr>
+        <w:t>cleaning.ipynb</w:t>
+      </w:r>
+      <w:proofErr w:type="gramEnd"/>
+      <w:r>
+        <w:rPr>
+          <w:rFonts w:eastAsia="Times New Roman" w:cs="Times New Roman"/>
+        </w:rPr>
+        <w:t xml:space="preserve">) </w:t>
+      </w:r>
+      <w:proofErr w:type="spellStart"/>
+      <w:r>
+        <w:rPr>
+          <w:rFonts w:eastAsia="Times New Roman" w:cs="Times New Roman"/>
+        </w:rPr>
+        <w:t>normalises</w:t>
+      </w:r>
+      <w:proofErr w:type="spellEnd"/>
+      <w:r>
+        <w:rPr>
+          <w:rFonts w:eastAsia="Times New Roman" w:cs="Times New Roman"/>
+        </w:rPr>
+        <w:t xml:space="preserve"> the raw CSV, </w:t>
+      </w:r>
+      <w:proofErr w:type="spellStart"/>
+      <w:r>
+        <w:rPr>
+          <w:rFonts w:eastAsia="Times New Roman" w:cs="Times New Roman"/>
+        </w:rPr>
+        <w:t>standardises</w:t>
+      </w:r>
+      <w:proofErr w:type="spellEnd"/>
+      <w:r>
+        <w:rPr>
+          <w:rFonts w:eastAsia="Times New Roman" w:cs="Times New Roman"/>
+        </w:rPr>
+        <w:t xml:space="preserve"> Yes/No answers, and validates row counts. Phase 2 (02_feature_engineering.ipynb) encodes ordered categorical bins to integers, assigns numeric midpoints to bin ranges, ranks vehicle type and carrying mode, aliases the 18 Yes/No items, and derives four composite features -- </w:t>
+      </w:r>
+      <w:proofErr w:type="spellStart"/>
+      <w:r>
+        <w:rPr>
+          <w:rFonts w:eastAsia="Times New Roman" w:cs="Times New Roman"/>
+        </w:rPr>
+        <w:t>workload_score</w:t>
+      </w:r>
+      <w:proofErr w:type="spellEnd"/>
+      <w:r>
+        <w:rPr>
+          <w:rFonts w:eastAsia="Times New Roman" w:cs="Times New Roman"/>
+        </w:rPr>
+        <w:t xml:space="preserve"> (mean of the six NASA-TLX items with satisfaction reversed), </w:t>
+      </w:r>
+      <w:proofErr w:type="spellStart"/>
+      <w:r>
+        <w:rPr>
+          <w:rFonts w:eastAsia="Times New Roman" w:cs="Times New Roman"/>
+        </w:rPr>
+        <w:t>fatigue_score</w:t>
+      </w:r>
+      <w:proofErr w:type="spellEnd"/>
+      <w:r>
+        <w:rPr>
+          <w:rFonts w:eastAsia="Times New Roman" w:cs="Times New Roman"/>
+        </w:rPr>
+        <w:t xml:space="preserve"> (mean of the six Borg CR10 items), </w:t>
+      </w:r>
+      <w:proofErr w:type="spellStart"/>
+      <w:r>
+        <w:rPr>
+          <w:rFonts w:eastAsia="Times New Roman" w:cs="Times New Roman"/>
+        </w:rPr>
+        <w:t>force_exertion</w:t>
+      </w:r>
+      <w:proofErr w:type="spellEnd"/>
+      <w:r>
+        <w:rPr>
+          <w:rFonts w:eastAsia="Times New Roman" w:cs="Times New Roman"/>
+        </w:rPr>
+        <w:t xml:space="preserve"> (the Borg lifting item), and </w:t>
+      </w:r>
+      <w:proofErr w:type="spellStart"/>
+      <w:r>
+        <w:rPr>
+          <w:rFonts w:eastAsia="Times New Roman" w:cs="Times New Roman"/>
+        </w:rPr>
+        <w:t>vibration_index</w:t>
+      </w:r>
+      <w:proofErr w:type="spellEnd"/>
+      <w:r>
+        <w:rPr>
+          <w:rFonts w:eastAsia="Times New Roman" w:cs="Times New Roman"/>
+        </w:rPr>
+        <w:t xml:space="preserve"> (</w:t>
+      </w:r>
+      <w:proofErr w:type="spellStart"/>
+      <w:r>
+        <w:rPr>
+          <w:rFonts w:eastAsia="Times New Roman" w:cs="Times New Roman"/>
+        </w:rPr>
+        <w:t>vehicle_rank</w:t>
+      </w:r>
+      <w:proofErr w:type="spellEnd"/>
+      <w:r>
+        <w:rPr>
+          <w:rFonts w:eastAsia="Times New Roman" w:cs="Times New Roman"/>
+        </w:rPr>
+        <w:t xml:space="preserve"> x </w:t>
+      </w:r>
+      <w:proofErr w:type="spellStart"/>
+      <w:r>
+        <w:rPr>
+          <w:rFonts w:eastAsia="Times New Roman" w:cs="Times New Roman"/>
+        </w:rPr>
+        <w:t>work_hours_num</w:t>
+      </w:r>
+      <w:proofErr w:type="spellEnd"/>
+      <w:r>
+        <w:rPr>
+          <w:rFonts w:eastAsia="Times New Roman" w:cs="Times New Roman"/>
+        </w:rPr>
+        <w:t>) -- plus five product-form interactions so tree-based models can pick up combined effects.</w:t>
       </w:r>
     </w:p>
     <w:p>
@@ -3543,7 +3972,35 @@
         <w:rPr>
           <w:rFonts w:eastAsia="Times New Roman" w:cs="Times New Roman"/>
         </w:rPr>
-        <w:t>The posture observations are merged into the survey via a severity-rank merge: riders are ranked by an exposure_severity index (normalised NMQ pain count + fatigue score + hours), posture rows by RULA Table C, and the two ranked lists are joined one-to-one. Caveats are noted in Chapter 5.</w:t>
+        <w:t xml:space="preserve">The posture observations are merged into the survey via a severity-rank merge: riders are ranked by an </w:t>
+      </w:r>
+      <w:proofErr w:type="spellStart"/>
+      <w:r>
+        <w:rPr>
+          <w:rFonts w:eastAsia="Times New Roman" w:cs="Times New Roman"/>
+        </w:rPr>
+        <w:t>exposure_severity</w:t>
+      </w:r>
+      <w:proofErr w:type="spellEnd"/>
+      <w:r>
+        <w:rPr>
+          <w:rFonts w:eastAsia="Times New Roman" w:cs="Times New Roman"/>
+        </w:rPr>
+        <w:t xml:space="preserve"> index (</w:t>
+      </w:r>
+      <w:proofErr w:type="spellStart"/>
+      <w:r>
+        <w:rPr>
+          <w:rFonts w:eastAsia="Times New Roman" w:cs="Times New Roman"/>
+        </w:rPr>
+        <w:t>normalised</w:t>
+      </w:r>
+      <w:proofErr w:type="spellEnd"/>
+      <w:r>
+        <w:rPr>
+          <w:rFonts w:eastAsia="Times New Roman" w:cs="Times New Roman"/>
+        </w:rPr>
+        <w:t xml:space="preserve"> NMQ pain count + fatigue score + hours), posture rows by RULA Table C, and the two ranked lists are joined one-to-one. Caveats are noted in Chapter 5.</w:t>
       </w:r>
     </w:p>
     <w:p>
@@ -3569,7 +4026,21 @@
         <w:rPr>
           <w:rFonts w:eastAsia="Times New Roman" w:cs="Times New Roman"/>
         </w:rPr>
-        <w:t>Phase 3 (03_risk_scoring.ipynb) applies the following rules and writes risk_profile.csv:</w:t>
+        <w:t>Phase 3 (03_risk_</w:t>
+      </w:r>
+      <w:proofErr w:type="gramStart"/>
+      <w:r>
+        <w:rPr>
+          <w:rFonts w:eastAsia="Times New Roman" w:cs="Times New Roman"/>
+        </w:rPr>
+        <w:t>scoring.ipynb</w:t>
+      </w:r>
+      <w:proofErr w:type="gramEnd"/>
+      <w:r>
+        <w:rPr>
+          <w:rFonts w:eastAsia="Times New Roman" w:cs="Times New Roman"/>
+        </w:rPr>
+        <w:t>) applies the following rules and writes risk_profile.csv:</w:t>
       </w:r>
     </w:p>
     <w:p>
@@ -3617,7 +4088,21 @@
         <w:rPr>
           <w:rFonts w:eastAsia="Times New Roman" w:cs="Times New Roman"/>
         </w:rPr>
-        <w:t>Vibration: vibration_index binned by sample tercile.</w:t>
+        <w:t xml:space="preserve">Vibration: </w:t>
+      </w:r>
+      <w:proofErr w:type="spellStart"/>
+      <w:r>
+        <w:rPr>
+          <w:rFonts w:eastAsia="Times New Roman" w:cs="Times New Roman"/>
+        </w:rPr>
+        <w:t>vibration_index</w:t>
+      </w:r>
+      <w:proofErr w:type="spellEnd"/>
+      <w:r>
+        <w:rPr>
+          <w:rFonts w:eastAsia="Times New Roman" w:cs="Times New Roman"/>
+        </w:rPr>
+        <w:t xml:space="preserve"> binned by sample tercile.</w:t>
       </w:r>
     </w:p>
     <w:p>
@@ -3629,7 +4114,35 @@
         <w:rPr>
           <w:rFonts w:eastAsia="Times New Roman" w:cs="Times New Roman"/>
         </w:rPr>
-        <w:t>Contact Stress: carrying_contact_rank x work_hours_num x age multiplier, sample tercile.</w:t>
+        <w:t xml:space="preserve">Contact Stress: </w:t>
+      </w:r>
+      <w:proofErr w:type="spellStart"/>
+      <w:r>
+        <w:rPr>
+          <w:rFonts w:eastAsia="Times New Roman" w:cs="Times New Roman"/>
+        </w:rPr>
+        <w:t>carrying_contact_rank</w:t>
+      </w:r>
+      <w:proofErr w:type="spellEnd"/>
+      <w:r>
+        <w:rPr>
+          <w:rFonts w:eastAsia="Times New Roman" w:cs="Times New Roman"/>
+        </w:rPr>
+        <w:t xml:space="preserve"> x </w:t>
+      </w:r>
+      <w:proofErr w:type="spellStart"/>
+      <w:r>
+        <w:rPr>
+          <w:rFonts w:eastAsia="Times New Roman" w:cs="Times New Roman"/>
+        </w:rPr>
+        <w:t>work_hours_num</w:t>
+      </w:r>
+      <w:proofErr w:type="spellEnd"/>
+      <w:r>
+        <w:rPr>
+          <w:rFonts w:eastAsia="Times New Roman" w:cs="Times New Roman"/>
+        </w:rPr>
+        <w:t xml:space="preserve"> x age multiplier, sample tercile.</w:t>
       </w:r>
     </w:p>
     <w:p>
@@ -3663,48 +4176,90 @@
       <w:pPr>
         <w:spacing w:before="280" w:after="100"/>
         <w:rPr>
-          <w:rFonts w:ascii="Times New Roman" w:eastAsia="Times New Roman" w:hAnsi="Times New Roman" w:cs="Times New Roman"/>
-          <w:b w:val="0"/>
-          <w:bCs w:val="0"/>
-          <w:i w:val="0"/>
-          <w:iCs w:val="0"/>
+          <w:rFonts w:eastAsia="Times New Roman" w:cs="Times New Roman"/>
           <w:color w:val="000000" w:themeColor="text1"/>
         </w:rPr>
       </w:pPr>
       <w:r>
         <w:rPr>
-          <w:rFonts w:ascii="Times New Roman" w:hAnsi="Times New Roman" w:cs="Times New Roman"/>
-          <w:b w:val="0"/>
-          <w:bCs w:val="0"/>
-          <w:i w:val="0"/>
-          <w:iCs w:val="0"/>
+          <w:rFonts w:cs="Times New Roman"/>
           <w:color w:val="000000" w:themeColor="text1"/>
         </w:rPr>
-        <w:t>Phase 4 (04_eda.ipynb) then produces demographic breakdowns, per-factor risk-band distributions, Nordic 12-month discomfort prevalence, discomfort rates split by demographic and by risk level, and a Pearson correlation heatmap on 15 columns (14 numeric and ordinal features plus the discomfort outcome).</w:t>
+        <w:t>Phase 4 (04_</w:t>
+      </w:r>
+      <w:proofErr w:type="gramStart"/>
+      <w:r>
+        <w:rPr>
+          <w:rFonts w:cs="Times New Roman"/>
+          <w:color w:val="000000" w:themeColor="text1"/>
+        </w:rPr>
+        <w:t>eda.ipynb</w:t>
+      </w:r>
+      <w:proofErr w:type="gramEnd"/>
+      <w:r>
+        <w:rPr>
+          <w:rFonts w:cs="Times New Roman"/>
+          <w:color w:val="000000" w:themeColor="text1"/>
+        </w:rPr>
+        <w:t>) then produces demographic breakdowns, per-factor risk-band distributions, Nordic 12-month discomfort prevalence, discomfort rates split by demographic and by risk level, and a Pearson correlation heatmap on 15 columns (14 numeric and ordinal features plus the discomfort outcome).</w:t>
       </w:r>
     </w:p>
     <w:p>
       <w:pPr>
         <w:spacing w:before="280" w:after="100"/>
         <w:rPr>
-          <w:rFonts w:ascii="Times New Roman" w:eastAsia="Times New Roman" w:hAnsi="Times New Roman" w:cs="Times New Roman"/>
-          <w:b w:val="0"/>
-          <w:bCs w:val="0"/>
-          <w:i w:val="0"/>
-          <w:iCs w:val="0"/>
-          <w:color w:val="auto"/>
-        </w:rPr>
-      </w:pPr>
-      <w:r>
-        <w:rPr>
-          <w:rFonts w:ascii="Times New Roman" w:eastAsia="Times New Roman" w:hAnsi="Times New Roman" w:cs="Times New Roman"/>
-          <w:b w:val="0"/>
-          <w:bCs w:val="0"/>
-          <w:i w:val="0"/>
-          <w:iCs w:val="0"/>
-          <w:color w:val="auto"/>
-        </w:rPr>
-        <w:t>Phase 5 (05_stats.ipynb) comprises two analyses on discomfort i.e. the binary: pain as per NMQ for 12 months. Chi-square test (scipy.stats.chi2_contingency) is performed to see if a given risk factor is connected with discomfort at a significance level of 5%. Then multivariate logistic regression (statsmodels.api.Logit) is conducted to look at the weight of 11 determinants at a time, controlling all the others with the results displayed in odds ratios at 95% confidence intervals.</w:t>
+          <w:rFonts w:eastAsia="Times New Roman" w:cs="Times New Roman"/>
+        </w:rPr>
+      </w:pPr>
+      <w:r>
+        <w:rPr>
+          <w:rFonts w:eastAsia="Times New Roman" w:cs="Times New Roman"/>
+        </w:rPr>
+        <w:t>Phase 5 (05_</w:t>
+      </w:r>
+      <w:proofErr w:type="gramStart"/>
+      <w:r>
+        <w:rPr>
+          <w:rFonts w:eastAsia="Times New Roman" w:cs="Times New Roman"/>
+        </w:rPr>
+        <w:t>stats.ipynb</w:t>
+      </w:r>
+      <w:proofErr w:type="gramEnd"/>
+      <w:r>
+        <w:rPr>
+          <w:rFonts w:eastAsia="Times New Roman" w:cs="Times New Roman"/>
+        </w:rPr>
+        <w:t>) comprises two analyses on discomfort i.e. the binary: pain as per NMQ for 12 months. Chi-square test (</w:t>
+      </w:r>
+      <w:proofErr w:type="gramStart"/>
+      <w:r>
+        <w:rPr>
+          <w:rFonts w:eastAsia="Times New Roman" w:cs="Times New Roman"/>
+        </w:rPr>
+        <w:t>scipy.stats</w:t>
+      </w:r>
+      <w:proofErr w:type="gramEnd"/>
+      <w:r>
+        <w:rPr>
+          <w:rFonts w:eastAsia="Times New Roman" w:cs="Times New Roman"/>
+        </w:rPr>
+        <w:t>.chi2_contingency) is performed to see if a given risk factor is connected with discomfort at a significance level of 5%. Then multivariate logistic regression (</w:t>
+      </w:r>
+      <w:proofErr w:type="spellStart"/>
+      <w:proofErr w:type="gramStart"/>
+      <w:r>
+        <w:rPr>
+          <w:rFonts w:eastAsia="Times New Roman" w:cs="Times New Roman"/>
+        </w:rPr>
+        <w:t>statsmodels.api.Logit</w:t>
+      </w:r>
+      <w:proofErr w:type="spellEnd"/>
+      <w:proofErr w:type="gramEnd"/>
+      <w:r>
+        <w:rPr>
+          <w:rFonts w:eastAsia="Times New Roman" w:cs="Times New Roman"/>
+        </w:rPr>
+        <w:t>) is conducted to look at the weight of 11 determinants at a time, controlling all the others with the results displayed in odds ratios at 95% confidence intervals.</w:t>
       </w:r>
     </w:p>
     <w:p>
@@ -3725,16 +4280,64 @@
       <w:pPr>
         <w:spacing w:before="180" w:after="60"/>
         <w:rPr>
-          <w:rFonts w:ascii="Times New Roman" w:eastAsia="Times New Roman" w:hAnsi="Times New Roman" w:cs="Times New Roman"/>
-          <w:color w:val="auto"/>
-        </w:rPr>
-      </w:pPr>
-      <w:r>
-        <w:rPr>
-          <w:rFonts w:ascii="Times New Roman" w:eastAsia="Times New Roman" w:hAnsi="Times New Roman" w:cs="Times New Roman"/>
-          <w:color w:val="auto"/>
-        </w:rPr>
-        <w:t>Phase 6 (06_modeling.ipynb) trains a classifier per target from seven candidate algorithms. GridSearchCV tunes hyperparameters on macro-F1 inside 5-fold stratified cross-validation, and the best model per target is refit on the full sample and saved as outputs/models/best_&lt;factor&gt;.pkl.</w:t>
+          <w:rFonts w:eastAsia="Times New Roman" w:cs="Times New Roman"/>
+        </w:rPr>
+      </w:pPr>
+      <w:r>
+        <w:rPr>
+          <w:rFonts w:eastAsia="Times New Roman" w:cs="Times New Roman"/>
+        </w:rPr>
+        <w:t>Phase 6 (06_</w:t>
+      </w:r>
+      <w:proofErr w:type="gramStart"/>
+      <w:r>
+        <w:rPr>
+          <w:rFonts w:eastAsia="Times New Roman" w:cs="Times New Roman"/>
+        </w:rPr>
+        <w:t>modeling.ipynb</w:t>
+      </w:r>
+      <w:proofErr w:type="gramEnd"/>
+      <w:r>
+        <w:rPr>
+          <w:rFonts w:eastAsia="Times New Roman" w:cs="Times New Roman"/>
+        </w:rPr>
+        <w:t xml:space="preserve">) trains a classifier per target from seven candidate algorithms. </w:t>
+      </w:r>
+      <w:proofErr w:type="spellStart"/>
+      <w:r>
+        <w:rPr>
+          <w:rFonts w:eastAsia="Times New Roman" w:cs="Times New Roman"/>
+        </w:rPr>
+        <w:t>GridSearchCV</w:t>
+      </w:r>
+      <w:proofErr w:type="spellEnd"/>
+      <w:r>
+        <w:rPr>
+          <w:rFonts w:eastAsia="Times New Roman" w:cs="Times New Roman"/>
+        </w:rPr>
+        <w:t xml:space="preserve"> tunes hyperparameters on macro-F1 inside 5-fold stratified cross-validation, and the best model per target is refit on the full sample and saved as outputs/models/best_&lt;factor</w:t>
+      </w:r>
+      <w:proofErr w:type="gramStart"/>
+      <w:r>
+        <w:rPr>
+          <w:rFonts w:eastAsia="Times New Roman" w:cs="Times New Roman"/>
+        </w:rPr>
+        <w:t>&gt;.</w:t>
+      </w:r>
+      <w:proofErr w:type="spellStart"/>
+      <w:r>
+        <w:rPr>
+          <w:rFonts w:eastAsia="Times New Roman" w:cs="Times New Roman"/>
+        </w:rPr>
+        <w:t>pkl</w:t>
+      </w:r>
+      <w:proofErr w:type="spellEnd"/>
+      <w:proofErr w:type="gramEnd"/>
+      <w:r>
+        <w:rPr>
+          <w:rFonts w:eastAsia="Times New Roman" w:cs="Times New Roman"/>
+        </w:rPr>
+        <w:t>.</w:t>
       </w:r>
     </w:p>
     <w:p>
@@ -3764,7 +4367,27 @@
         <w:rPr>
           <w:rFonts w:eastAsia="Times New Roman" w:cs="Times New Roman"/>
         </w:rPr>
-        <w:t>Regularised linear classifier used as the baseline (L2 penalty, class_weight balanced). Any tree-based method that fails to beat it on a factor is either overfitting or getting nothing from feature interactions.</w:t>
+        <w:t>Regularized</w:t>
+      </w:r>
+      <w:r>
+        <w:rPr>
+          <w:rFonts w:eastAsia="Times New Roman" w:cs="Times New Roman"/>
+        </w:rPr>
+        <w:t xml:space="preserve"> linear classifier used as the baseline (L2 penalty, </w:t>
+      </w:r>
+      <w:proofErr w:type="spellStart"/>
+      <w:r>
+        <w:rPr>
+          <w:rFonts w:eastAsia="Times New Roman" w:cs="Times New Roman"/>
+        </w:rPr>
+        <w:t>class_weight</w:t>
+      </w:r>
+      <w:proofErr w:type="spellEnd"/>
+      <w:r>
+        <w:rPr>
+          <w:rFonts w:eastAsia="Times New Roman" w:cs="Times New Roman"/>
+        </w:rPr>
+        <w:t xml:space="preserve"> balanced). Any tree-based method that fails to beat it on a factor is either overfitting or getting nothing from feature interactions.</w:t>
       </w:r>
     </w:p>
     <w:p>
@@ -3800,7 +4423,41 @@
         <w:rPr>
           <w:rFonts w:eastAsia="Times New Roman" w:cs="Times New Roman"/>
         </w:rPr>
-        <w:t>Utilised a single CART tree where max_depth ranged from 3 to 7, and min_samples_leaf varied from 1 to 5 for fine-tuning using grid search.</w:t>
+        <w:t>Utilized</w:t>
+      </w:r>
+      <w:r>
+        <w:rPr>
+          <w:rFonts w:eastAsia="Times New Roman" w:cs="Times New Roman"/>
+        </w:rPr>
+        <w:t xml:space="preserve"> a single CART tree where </w:t>
+      </w:r>
+      <w:proofErr w:type="spellStart"/>
+      <w:r>
+        <w:rPr>
+          <w:rFonts w:eastAsia="Times New Roman" w:cs="Times New Roman"/>
+        </w:rPr>
+        <w:t>max_depth</w:t>
+      </w:r>
+      <w:proofErr w:type="spellEnd"/>
+      <w:r>
+        <w:rPr>
+          <w:rFonts w:eastAsia="Times New Roman" w:cs="Times New Roman"/>
+        </w:rPr>
+        <w:t xml:space="preserve"> ranged from 3 to 7, and </w:t>
+      </w:r>
+      <w:proofErr w:type="spellStart"/>
+      <w:r>
+        <w:rPr>
+          <w:rFonts w:eastAsia="Times New Roman" w:cs="Times New Roman"/>
+        </w:rPr>
+        <w:t>min_samples_leaf</w:t>
+      </w:r>
+      <w:proofErr w:type="spellEnd"/>
+      <w:r>
+        <w:rPr>
+          <w:rFonts w:eastAsia="Times New Roman" w:cs="Times New Roman"/>
+        </w:rPr>
+        <w:t xml:space="preserve"> varied from 1 to 5 for fine-tuning using grid search.</w:t>
       </w:r>
     </w:p>
     <w:p>
@@ -3872,17 +4529,21 @@
         <w:rPr>
           <w:rFonts w:eastAsia="Times New Roman" w:cs="Times New Roman"/>
         </w:rPr>
-        <w:t>Like Random Forest but with fully random splits per node. The extra randomisation lowers between-tree correlation and helped it win on Vibration.</w:t>
-      </w:r>
-      <w:r>
-        <w:rPr>
-          <w:rFonts w:eastAsia="Times New Roman" w:cs="Times New Roman"/>
-        </w:rPr>
-      </w:r>
-      <w:r>
-        <w:rPr>
-          <w:rFonts w:eastAsia="Times New Roman" w:cs="Times New Roman"/>
-        </w:rPr>
+        <w:t xml:space="preserve">Like Random Forest but with fully random splits per node. The extra </w:t>
+      </w:r>
+      <w:proofErr w:type="spellStart"/>
+      <w:r>
+        <w:rPr>
+          <w:rFonts w:eastAsia="Times New Roman" w:cs="Times New Roman"/>
+        </w:rPr>
+        <w:t>randomisation</w:t>
+      </w:r>
+      <w:proofErr w:type="spellEnd"/>
+      <w:r>
+        <w:rPr>
+          <w:rFonts w:eastAsia="Times New Roman" w:cs="Times New Roman"/>
+        </w:rPr>
+        <w:t xml:space="preserve"> lowers between-tree correlation and helped it win on Vibration.</w:t>
       </w:r>
     </w:p>
     <w:p>
@@ -3937,30 +4598,9 @@
           <w:sz w:val="24"/>
         </w:rPr>
         <w:lastRenderedPageBreak/>
-        <w:t>2.6.6   XGBoost</w:t>
-      </w:r>
-    </w:p>
-    <w:p>
-      <w:pPr>
-        <w:spacing w:before="180" w:after="60"/>
-        <w:rPr>
-          <w:rFonts w:ascii="Times New Roman" w:eastAsia="Times New Roman" w:hAnsi="Times New Roman" w:cs="Times New Roman"/>
-          <w:color w:val="auto"/>
-        </w:rPr>
-      </w:pPr>
-      <w:r>
-        <w:rPr>
-          <w:rFonts w:ascii="Times New Roman" w:eastAsia="Times New Roman" w:hAnsi="Times New Roman" w:cs="Times New Roman"/>
-          <w:color w:val="auto"/>
-        </w:rPr>
-        <w:t>Gradient-boosted trees with L2 regularisation on the leaf weights. Placed second on Duration and Contact Stress but did not win any at the default search budget.</w:t>
-      </w:r>
-    </w:p>
-    <w:p>
-      <w:pPr>
-        <w:pStyle w:val="Heading5"/>
-        <w:spacing w:before="180" w:after="60"/>
-      </w:pPr>
+        <w:t xml:space="preserve">2.6.6   </w:t>
+      </w:r>
+      <w:proofErr w:type="spellStart"/>
       <w:r>
         <w:rPr>
           <w:rFonts w:ascii="Times New Roman" w:eastAsia="Times New Roman" w:hAnsi="Times New Roman" w:cs="Times New Roman"/>
@@ -3968,23 +4608,36 @@
           <w:color w:val="000000"/>
           <w:sz w:val="24"/>
         </w:rPr>
-        <w:t>2.6.7   Stacking Classifier</w:t>
-      </w:r>
+        <w:t>XGBoost</w:t>
+      </w:r>
+      <w:proofErr w:type="spellEnd"/>
     </w:p>
     <w:p>
       <w:pPr>
         <w:spacing w:before="180" w:after="60"/>
         <w:rPr>
-          <w:rFonts w:ascii="Times New Roman" w:eastAsia="Times New Roman" w:hAnsi="Times New Roman" w:cs="Times New Roman"/>
-          <w:color w:val="auto"/>
-        </w:rPr>
-      </w:pPr>
-      <w:r>
-        <w:rPr>
-          <w:rFonts w:ascii="Times New Roman" w:eastAsia="Times New Roman" w:hAnsi="Times New Roman" w:cs="Times New Roman"/>
-          <w:color w:val="auto"/>
-        </w:rPr>
-        <w:t>Meta-learner (Logistic Regression) trained on the out-of-fold predictions of Random Forest, Extra Trees, HistGBM, and XGBoost as base learners. Failed to strictly outperform the strongest base learner on any of the six targets.</w:t>
+          <w:rFonts w:eastAsia="Times New Roman" w:cs="Times New Roman"/>
+        </w:rPr>
+      </w:pPr>
+      <w:r>
+        <w:rPr>
+          <w:rFonts w:eastAsia="Times New Roman" w:cs="Times New Roman"/>
+        </w:rPr>
+        <w:t xml:space="preserve">Gradient-boosted trees with L2 </w:t>
+      </w:r>
+      <w:proofErr w:type="spellStart"/>
+      <w:r>
+        <w:rPr>
+          <w:rFonts w:eastAsia="Times New Roman" w:cs="Times New Roman"/>
+        </w:rPr>
+        <w:t>regularisation</w:t>
+      </w:r>
+      <w:proofErr w:type="spellEnd"/>
+      <w:r>
+        <w:rPr>
+          <w:rFonts w:eastAsia="Times New Roman" w:cs="Times New Roman"/>
+        </w:rPr>
+        <w:t xml:space="preserve"> on the leaf weights. Placed second on Duration and Contact Stress but did not win any at the default search budget.</w:t>
       </w:r>
     </w:p>
     <w:p>
@@ -3999,6 +4652,63 @@
           <w:color w:val="000000"/>
           <w:sz w:val="24"/>
         </w:rPr>
+        <w:t>2.6.7   Stacking Classifier</w:t>
+      </w:r>
+    </w:p>
+    <w:p>
+      <w:pPr>
+        <w:spacing w:before="180" w:after="60"/>
+        <w:rPr>
+          <w:rFonts w:eastAsia="Times New Roman" w:cs="Times New Roman"/>
+        </w:rPr>
+      </w:pPr>
+      <w:r>
+        <w:rPr>
+          <w:rFonts w:eastAsia="Times New Roman" w:cs="Times New Roman"/>
+        </w:rPr>
+        <w:t xml:space="preserve">Meta-learner (Logistic Regression) trained on the out-of-fold predictions of Random Forest, Extra Trees, </w:t>
+      </w:r>
+      <w:proofErr w:type="spellStart"/>
+      <w:r>
+        <w:rPr>
+          <w:rFonts w:eastAsia="Times New Roman" w:cs="Times New Roman"/>
+        </w:rPr>
+        <w:t>HistGBM</w:t>
+      </w:r>
+      <w:proofErr w:type="spellEnd"/>
+      <w:r>
+        <w:rPr>
+          <w:rFonts w:eastAsia="Times New Roman" w:cs="Times New Roman"/>
+        </w:rPr>
+        <w:t xml:space="preserve">, and </w:t>
+      </w:r>
+      <w:proofErr w:type="spellStart"/>
+      <w:r>
+        <w:rPr>
+          <w:rFonts w:eastAsia="Times New Roman" w:cs="Times New Roman"/>
+        </w:rPr>
+        <w:t>XGBoost</w:t>
+      </w:r>
+      <w:proofErr w:type="spellEnd"/>
+      <w:r>
+        <w:rPr>
+          <w:rFonts w:eastAsia="Times New Roman" w:cs="Times New Roman"/>
+        </w:rPr>
+        <w:t xml:space="preserve"> as base learners. Failed to strictly outperform the strongest base learner on any of the six targets.</w:t>
+      </w:r>
+    </w:p>
+    <w:p>
+      <w:pPr>
+        <w:pStyle w:val="Heading5"/>
+        <w:spacing w:before="180" w:after="60"/>
+      </w:pPr>
+      <w:r>
+        <w:rPr>
+          <w:rFonts w:ascii="Times New Roman" w:eastAsia="Times New Roman" w:hAnsi="Times New Roman" w:cs="Times New Roman"/>
+          <w:b/>
+          <w:color w:val="000000"/>
+          <w:sz w:val="24"/>
+        </w:rPr>
         <w:t>2.6.8   SMOTE and cross-validation</w:t>
       </w:r>
     </w:p>
@@ -4006,16 +4716,108 @@
       <w:pPr>
         <w:spacing w:before="180" w:after="60"/>
         <w:rPr>
-          <w:rFonts w:ascii="Times New Roman" w:eastAsia="Times New Roman" w:hAnsi="Times New Roman" w:cs="Times New Roman"/>
-          <w:color w:val="auto"/>
-        </w:rPr>
-      </w:pPr>
-      <w:r>
-        <w:rPr>
-          <w:rFonts w:ascii="Times New Roman" w:eastAsia="Times New Roman" w:hAnsi="Times New Roman" w:cs="Times New Roman"/>
-          <w:color w:val="auto"/>
-        </w:rPr>
-        <w:t>SMOTE synthesises new minority-class samples along segments between k nearest minority neighbours. Wrapping it in imblearn.Pipeline keeps the synthesis inside training folds only, so validation-fold accuracy is never inflated. GridSearchCV picks hyperparameters on macro-F1 with StratifiedKFold(5, shuffle=True, random_state=42).</w:t>
+          <w:rFonts w:eastAsia="Times New Roman" w:cs="Times New Roman"/>
+        </w:rPr>
+      </w:pPr>
+      <w:r>
+        <w:rPr>
+          <w:rFonts w:eastAsia="Times New Roman" w:cs="Times New Roman"/>
+        </w:rPr>
+        <w:t xml:space="preserve">SMOTE </w:t>
+      </w:r>
+      <w:proofErr w:type="spellStart"/>
+      <w:r>
+        <w:rPr>
+          <w:rFonts w:eastAsia="Times New Roman" w:cs="Times New Roman"/>
+        </w:rPr>
+        <w:t>synthesises</w:t>
+      </w:r>
+      <w:proofErr w:type="spellEnd"/>
+      <w:r>
+        <w:rPr>
+          <w:rFonts w:eastAsia="Times New Roman" w:cs="Times New Roman"/>
+        </w:rPr>
+        <w:t xml:space="preserve"> new minority-class samples along segments between k nearest minority </w:t>
+      </w:r>
+      <w:proofErr w:type="spellStart"/>
+      <w:r>
+        <w:rPr>
+          <w:rFonts w:eastAsia="Times New Roman" w:cs="Times New Roman"/>
+        </w:rPr>
+        <w:t>neighbours</w:t>
+      </w:r>
+      <w:proofErr w:type="spellEnd"/>
+      <w:r>
+        <w:rPr>
+          <w:rFonts w:eastAsia="Times New Roman" w:cs="Times New Roman"/>
+        </w:rPr>
+        <w:t xml:space="preserve">. Wrapping it in </w:t>
+      </w:r>
+      <w:proofErr w:type="spellStart"/>
+      <w:proofErr w:type="gramStart"/>
+      <w:r>
+        <w:rPr>
+          <w:rFonts w:eastAsia="Times New Roman" w:cs="Times New Roman"/>
+        </w:rPr>
+        <w:t>imblearn.Pipeline</w:t>
+      </w:r>
+      <w:proofErr w:type="spellEnd"/>
+      <w:proofErr w:type="gramEnd"/>
+      <w:r>
+        <w:rPr>
+          <w:rFonts w:eastAsia="Times New Roman" w:cs="Times New Roman"/>
+        </w:rPr>
+        <w:t xml:space="preserve"> keeps the synthesis inside training folds only, so validation-fold accuracy is never inflated. </w:t>
+      </w:r>
+      <w:proofErr w:type="spellStart"/>
+      <w:r>
+        <w:rPr>
+          <w:rFonts w:eastAsia="Times New Roman" w:cs="Times New Roman"/>
+        </w:rPr>
+        <w:t>GridSearchCV</w:t>
+      </w:r>
+      <w:proofErr w:type="spellEnd"/>
+      <w:r>
+        <w:rPr>
+          <w:rFonts w:eastAsia="Times New Roman" w:cs="Times New Roman"/>
+        </w:rPr>
+        <w:t xml:space="preserve"> picks hyperparameters on macro-F1 with </w:t>
+      </w:r>
+      <w:proofErr w:type="spellStart"/>
+      <w:proofErr w:type="gramStart"/>
+      <w:r>
+        <w:rPr>
+          <w:rFonts w:eastAsia="Times New Roman" w:cs="Times New Roman"/>
+        </w:rPr>
+        <w:t>StratifiedKFold</w:t>
+      </w:r>
+      <w:proofErr w:type="spellEnd"/>
+      <w:r>
+        <w:rPr>
+          <w:rFonts w:eastAsia="Times New Roman" w:cs="Times New Roman"/>
+        </w:rPr>
+        <w:t>(</w:t>
+      </w:r>
+      <w:proofErr w:type="gramEnd"/>
+      <w:r>
+        <w:rPr>
+          <w:rFonts w:eastAsia="Times New Roman" w:cs="Times New Roman"/>
+        </w:rPr>
+        <w:t xml:space="preserve">5, shuffle=True, </w:t>
+      </w:r>
+      <w:proofErr w:type="spellStart"/>
+      <w:r>
+        <w:rPr>
+          <w:rFonts w:eastAsia="Times New Roman" w:cs="Times New Roman"/>
+        </w:rPr>
+        <w:t>random_state</w:t>
+      </w:r>
+      <w:proofErr w:type="spellEnd"/>
+      <w:r>
+        <w:rPr>
+          <w:rFonts w:eastAsia="Times New Roman" w:cs="Times New Roman"/>
+        </w:rPr>
+        <w:t>=42).</w:t>
       </w:r>
     </w:p>
     <w:p>
@@ -4152,13 +4954,31 @@
             <w:pPr>
               <w:spacing w:before="20" w:after="20"/>
             </w:pPr>
-            <w:r>
-              <w:rPr>
-                <w:rFonts w:eastAsia="Times New Roman" w:cs="Times New Roman"/>
-                <w:sz w:val="20"/>
-              </w:rPr>
-              <w:t>force_exertion, force_x_age</w:t>
-            </w:r>
+            <w:proofErr w:type="spellStart"/>
+            <w:r>
+              <w:rPr>
+                <w:rFonts w:eastAsia="Times New Roman" w:cs="Times New Roman"/>
+                <w:sz w:val="20"/>
+              </w:rPr>
+              <w:t>force_exertion</w:t>
+            </w:r>
+            <w:proofErr w:type="spellEnd"/>
+            <w:r>
+              <w:rPr>
+                <w:rFonts w:eastAsia="Times New Roman" w:cs="Times New Roman"/>
+                <w:sz w:val="20"/>
+              </w:rPr>
+              <w:t xml:space="preserve">, </w:t>
+            </w:r>
+            <w:proofErr w:type="spellStart"/>
+            <w:r>
+              <w:rPr>
+                <w:rFonts w:eastAsia="Times New Roman" w:cs="Times New Roman"/>
+                <w:sz w:val="20"/>
+              </w:rPr>
+              <w:t>force_x_age</w:t>
+            </w:r>
+            <w:proofErr w:type="spellEnd"/>
           </w:p>
         </w:tc>
         <w:tc>
@@ -4210,13 +5030,47 @@
             <w:pPr>
               <w:spacing w:before="20" w:after="20"/>
             </w:pPr>
-            <w:r>
-              <w:rPr>
-                <w:rFonts w:eastAsia="Times New Roman" w:cs="Times New Roman"/>
-                <w:sz w:val="20"/>
-              </w:rPr>
-              <w:t>deliveries_num, work_hours_num, deliv_x_days</w:t>
-            </w:r>
+            <w:proofErr w:type="spellStart"/>
+            <w:r>
+              <w:rPr>
+                <w:rFonts w:eastAsia="Times New Roman" w:cs="Times New Roman"/>
+                <w:sz w:val="20"/>
+              </w:rPr>
+              <w:t>deliveries_num</w:t>
+            </w:r>
+            <w:proofErr w:type="spellEnd"/>
+            <w:r>
+              <w:rPr>
+                <w:rFonts w:eastAsia="Times New Roman" w:cs="Times New Roman"/>
+                <w:sz w:val="20"/>
+              </w:rPr>
+              <w:t xml:space="preserve">, </w:t>
+            </w:r>
+            <w:proofErr w:type="spellStart"/>
+            <w:r>
+              <w:rPr>
+                <w:rFonts w:eastAsia="Times New Roman" w:cs="Times New Roman"/>
+                <w:sz w:val="20"/>
+              </w:rPr>
+              <w:t>work_hours_num</w:t>
+            </w:r>
+            <w:proofErr w:type="spellEnd"/>
+            <w:r>
+              <w:rPr>
+                <w:rFonts w:eastAsia="Times New Roman" w:cs="Times New Roman"/>
+                <w:sz w:val="20"/>
+              </w:rPr>
+              <w:t xml:space="preserve">, </w:t>
+            </w:r>
+            <w:proofErr w:type="spellStart"/>
+            <w:r>
+              <w:rPr>
+                <w:rFonts w:eastAsia="Times New Roman" w:cs="Times New Roman"/>
+                <w:sz w:val="20"/>
+              </w:rPr>
+              <w:t>deliv_x_days</w:t>
+            </w:r>
+            <w:proofErr w:type="spellEnd"/>
           </w:p>
         </w:tc>
         <w:tc>
@@ -4268,13 +5122,31 @@
             <w:pPr>
               <w:spacing w:before="20" w:after="20"/>
             </w:pPr>
-            <w:r>
-              <w:rPr>
-                <w:rFonts w:eastAsia="Times New Roman" w:cs="Times New Roman"/>
-                <w:sz w:val="20"/>
-              </w:rPr>
-              <w:t>work_hours_num, vibration_index</w:t>
-            </w:r>
+            <w:proofErr w:type="spellStart"/>
+            <w:r>
+              <w:rPr>
+                <w:rFonts w:eastAsia="Times New Roman" w:cs="Times New Roman"/>
+                <w:sz w:val="20"/>
+              </w:rPr>
+              <w:t>work_hours_num</w:t>
+            </w:r>
+            <w:proofErr w:type="spellEnd"/>
+            <w:r>
+              <w:rPr>
+                <w:rFonts w:eastAsia="Times New Roman" w:cs="Times New Roman"/>
+                <w:sz w:val="20"/>
+              </w:rPr>
+              <w:t xml:space="preserve">, </w:t>
+            </w:r>
+            <w:proofErr w:type="spellStart"/>
+            <w:r>
+              <w:rPr>
+                <w:rFonts w:eastAsia="Times New Roman" w:cs="Times New Roman"/>
+                <w:sz w:val="20"/>
+              </w:rPr>
+              <w:t>vibration_index</w:t>
+            </w:r>
+            <w:proofErr w:type="spellEnd"/>
           </w:p>
         </w:tc>
         <w:tc>
@@ -4326,13 +5198,47 @@
             <w:pPr>
               <w:spacing w:before="20" w:after="20"/>
             </w:pPr>
-            <w:r>
-              <w:rPr>
-                <w:rFonts w:eastAsia="Times New Roman" w:cs="Times New Roman"/>
-                <w:sz w:val="20"/>
-              </w:rPr>
-              <w:t>vibration_index, vehicle_rank, work_hours_num</w:t>
-            </w:r>
+            <w:proofErr w:type="spellStart"/>
+            <w:r>
+              <w:rPr>
+                <w:rFonts w:eastAsia="Times New Roman" w:cs="Times New Roman"/>
+                <w:sz w:val="20"/>
+              </w:rPr>
+              <w:t>vibration_index</w:t>
+            </w:r>
+            <w:proofErr w:type="spellEnd"/>
+            <w:r>
+              <w:rPr>
+                <w:rFonts w:eastAsia="Times New Roman" w:cs="Times New Roman"/>
+                <w:sz w:val="20"/>
+              </w:rPr>
+              <w:t xml:space="preserve">, </w:t>
+            </w:r>
+            <w:proofErr w:type="spellStart"/>
+            <w:r>
+              <w:rPr>
+                <w:rFonts w:eastAsia="Times New Roman" w:cs="Times New Roman"/>
+                <w:sz w:val="20"/>
+              </w:rPr>
+              <w:t>vehicle_rank</w:t>
+            </w:r>
+            <w:proofErr w:type="spellEnd"/>
+            <w:r>
+              <w:rPr>
+                <w:rFonts w:eastAsia="Times New Roman" w:cs="Times New Roman"/>
+                <w:sz w:val="20"/>
+              </w:rPr>
+              <w:t xml:space="preserve">, </w:t>
+            </w:r>
+            <w:proofErr w:type="spellStart"/>
+            <w:r>
+              <w:rPr>
+                <w:rFonts w:eastAsia="Times New Roman" w:cs="Times New Roman"/>
+                <w:sz w:val="20"/>
+              </w:rPr>
+              <w:t>work_hours_num</w:t>
+            </w:r>
+            <w:proofErr w:type="spellEnd"/>
           </w:p>
         </w:tc>
         <w:tc>
@@ -4384,13 +5290,31 @@
             <w:pPr>
               <w:spacing w:before="20" w:after="20"/>
             </w:pPr>
-            <w:r>
-              <w:rPr>
-                <w:rFonts w:eastAsia="Times New Roman" w:cs="Times New Roman"/>
-                <w:sz w:val="20"/>
-              </w:rPr>
-              <w:t>carrying_contact_rank, work_hours_num</w:t>
-            </w:r>
+            <w:proofErr w:type="spellStart"/>
+            <w:r>
+              <w:rPr>
+                <w:rFonts w:eastAsia="Times New Roman" w:cs="Times New Roman"/>
+                <w:sz w:val="20"/>
+              </w:rPr>
+              <w:t>carrying_contact_rank</w:t>
+            </w:r>
+            <w:proofErr w:type="spellEnd"/>
+            <w:r>
+              <w:rPr>
+                <w:rFonts w:eastAsia="Times New Roman" w:cs="Times New Roman"/>
+                <w:sz w:val="20"/>
+              </w:rPr>
+              <w:t xml:space="preserve">, </w:t>
+            </w:r>
+            <w:proofErr w:type="spellStart"/>
+            <w:r>
+              <w:rPr>
+                <w:rFonts w:eastAsia="Times New Roman" w:cs="Times New Roman"/>
+                <w:sz w:val="20"/>
+              </w:rPr>
+              <w:t>work_hours_num</w:t>
+            </w:r>
+            <w:proofErr w:type="spellEnd"/>
           </w:p>
         </w:tc>
         <w:tc>
@@ -4510,7 +5434,47 @@
         <w:jc w:val="both"/>
       </w:pPr>
       <w:r>
-        <w:t>Phase 7 (07_evaluation.ipynb) involves cross_val_predict for out of fold predictions and generates class-wise metrics such as precision, recall, F1 score, support, confusion matrices, one-vs-all ROC curves with AUC per class (macro AUC is simply the average of all classes) and feature importance (feature_importances_ in case of tree models, abs(coef_) for the Logistic Regression classifier).</w:t>
+        <w:t>Phase 7 (07_</w:t>
+      </w:r>
+      <w:proofErr w:type="gramStart"/>
+      <w:r>
+        <w:t>evaluation.ipynb</w:t>
+      </w:r>
+      <w:proofErr w:type="gramEnd"/>
+      <w:r>
+        <w:t xml:space="preserve">) involves </w:t>
+      </w:r>
+      <w:proofErr w:type="spellStart"/>
+      <w:r>
+        <w:t>cross_val_predict</w:t>
+      </w:r>
+      <w:proofErr w:type="spellEnd"/>
+      <w:r>
+        <w:t xml:space="preserve"> for out of fold predictions and generates class-wise metrics such as precision, recall, F1 score, support, confusion matrices, one-vs-all ROC curves with AUC per class (</w:t>
+      </w:r>
+      <w:proofErr w:type="gramStart"/>
+      <w:r>
+        <w:t>macro AUC</w:t>
+      </w:r>
+      <w:proofErr w:type="gramEnd"/>
+      <w:r>
+        <w:t xml:space="preserve"> is simply the average of all classes) and feature importance (</w:t>
+      </w:r>
+      <w:proofErr w:type="spellStart"/>
+      <w:r>
+        <w:t>feature_importances</w:t>
+      </w:r>
+      <w:proofErr w:type="spellEnd"/>
+      <w:r>
+        <w:t>_ in case of tree models, abs(</w:t>
+      </w:r>
+      <w:proofErr w:type="spellStart"/>
+      <w:r>
+        <w:t>coef</w:t>
+      </w:r>
+      <w:proofErr w:type="spellEnd"/>
+      <w:r>
+        <w:t>_) for the Logistic Regression classifier).</w:t>
       </w:r>
     </w:p>
     <w:p>
@@ -4552,7 +5516,21 @@
         <w:rPr>
           <w:rFonts w:eastAsia="Times New Roman" w:cs="Times New Roman"/>
         </w:rPr>
-        <w:t>The complete pipeline comprises a total of 7 Jupyter notebooks (notebooks 01 to 07) together with a Streamlit application. Each of the notebooks is programmed in such a way that it is capable of functioning independently of the previous notebook. Thus, the total pipeline can be fully produced with a random seed set at 42.</w:t>
+        <w:t xml:space="preserve">The complete pipeline comprises a total of 7 Jupyter notebooks (notebooks 01 to 07) together with a </w:t>
+      </w:r>
+      <w:proofErr w:type="spellStart"/>
+      <w:r>
+        <w:rPr>
+          <w:rFonts w:eastAsia="Times New Roman" w:cs="Times New Roman"/>
+        </w:rPr>
+        <w:t>Streamlit</w:t>
+      </w:r>
+      <w:proofErr w:type="spellEnd"/>
+      <w:r>
+        <w:rPr>
+          <w:rFonts w:eastAsia="Times New Roman" w:cs="Times New Roman"/>
+        </w:rPr>
+        <w:t xml:space="preserve"> application. Each of the notebooks is programmed in such a way that it is capable of functioning independently of the previous notebook. Thus, the total pipeline can be fully produced with a random seed set at 42.</w:t>
       </w:r>
     </w:p>
     <w:p>
@@ -4564,29 +5542,35 @@
         <w:rPr>
           <w:rFonts w:eastAsia="Times New Roman" w:cs="Times New Roman"/>
         </w:rPr>
-        <w:t>01_data_cleaning normalises the raw CSV, standardises Yes / No answers, and validates row counts.</w:t>
-      </w:r>
-      <w:r>
-        <w:rPr>
-          <w:rFonts w:eastAsia="Times New Roman" w:cs="Times New Roman"/>
-        </w:rPr>
-      </w:r>
-      <w:r>
-        <w:rPr>
-          <w:rFonts w:eastAsia="Times New Roman" w:cs="Times New Roman"/>
-        </w:rPr>
-      </w:r>
-      <w:r>
-        <w:rPr>
-          <w:rFonts w:ascii="Nunito Sans" w:hAnsi="Nunito Sans"/>
-          <w:color w:val="131417"/>
-          <w:shd w:val="clear" w:color="auto" w:fill="FFFFFF"/>
-        </w:rPr>
-      </w:r>
-      <w:r>
-        <w:rPr>
-          <w:rFonts w:eastAsia="Times New Roman" w:cs="Times New Roman"/>
-        </w:rPr>
+        <w:t xml:space="preserve">01_data_cleaning </w:t>
+      </w:r>
+      <w:proofErr w:type="spellStart"/>
+      <w:r>
+        <w:rPr>
+          <w:rFonts w:eastAsia="Times New Roman" w:cs="Times New Roman"/>
+        </w:rPr>
+        <w:t>normalises</w:t>
+      </w:r>
+      <w:proofErr w:type="spellEnd"/>
+      <w:r>
+        <w:rPr>
+          <w:rFonts w:eastAsia="Times New Roman" w:cs="Times New Roman"/>
+        </w:rPr>
+        <w:t xml:space="preserve"> the raw CSV, </w:t>
+      </w:r>
+      <w:proofErr w:type="spellStart"/>
+      <w:r>
+        <w:rPr>
+          <w:rFonts w:eastAsia="Times New Roman" w:cs="Times New Roman"/>
+        </w:rPr>
+        <w:t>standardises</w:t>
+      </w:r>
+      <w:proofErr w:type="spellEnd"/>
+      <w:r>
+        <w:rPr>
+          <w:rFonts w:eastAsia="Times New Roman" w:cs="Times New Roman"/>
+        </w:rPr>
+        <w:t xml:space="preserve"> Yes / No answers, and validates row counts.</w:t>
       </w:r>
     </w:p>
     <w:p>
@@ -4622,7 +5606,21 @@
         <w:rPr>
           <w:rFonts w:eastAsia="Times New Roman" w:cs="Times New Roman"/>
         </w:rPr>
-        <w:t>04_eda reads model_ready.csv and risk_profile.csv and writes six figures under outputs/figures. It covers demographics, value_counts on the six risk columns, per body-area Nordic 12-month pain prevalence, discomfort split by demographic and by risk level, and a Pearson correlation heatmap on 15 columns (14 numeric and ordinal features plus the discomfort outcome). No CSVs or pickles are produced at this stage; the figures feed the Results chapter and motivate the tests in 05_stats.</w:t>
+        <w:t xml:space="preserve">04_eda reads model_ready.csv and risk_profile.csv and writes six figures under outputs/figures. It covers demographics, </w:t>
+      </w:r>
+      <w:proofErr w:type="spellStart"/>
+      <w:r>
+        <w:rPr>
+          <w:rFonts w:eastAsia="Times New Roman" w:cs="Times New Roman"/>
+        </w:rPr>
+        <w:t>value_counts</w:t>
+      </w:r>
+      <w:proofErr w:type="spellEnd"/>
+      <w:r>
+        <w:rPr>
+          <w:rFonts w:eastAsia="Times New Roman" w:cs="Times New Roman"/>
+        </w:rPr>
+        <w:t xml:space="preserve"> on the six risk columns, per body-area Nordic 12-month pain prevalence, discomfort split by demographic and by risk level, and a Pearson correlation heatmap on 15 columns (14 numeric and ordinal features plus the discomfort outcome). No CSVs or pickles are produced at this stage; the figures feed the Results chapter and motivate the tests in 05_stats.</w:t>
       </w:r>
     </w:p>
     <w:p>
@@ -4646,7 +5644,21 @@
         <w:rPr>
           <w:rFonts w:eastAsia="Times New Roman" w:cs="Times New Roman"/>
         </w:rPr>
-        <w:t>06_modeling conducts SMOTE and GridSearchCV for seven algorithms per target being scored.</w:t>
+        <w:t xml:space="preserve">06_modeling conducts SMOTE and </w:t>
+      </w:r>
+      <w:proofErr w:type="spellStart"/>
+      <w:r>
+        <w:rPr>
+          <w:rFonts w:eastAsia="Times New Roman" w:cs="Times New Roman"/>
+        </w:rPr>
+        <w:t>GridSearchCV</w:t>
+      </w:r>
+      <w:proofErr w:type="spellEnd"/>
+      <w:r>
+        <w:rPr>
+          <w:rFonts w:eastAsia="Times New Roman" w:cs="Times New Roman"/>
+        </w:rPr>
+        <w:t xml:space="preserve"> for seven algorithms per target being scored.</w:t>
       </w:r>
     </w:p>
     <w:p>
@@ -4696,14 +5708,8 @@
         <w:rPr>
           <w:rFonts w:eastAsia="Times New Roman" w:cs="Times New Roman"/>
         </w:rPr>
-        <w:t xml:space="preserve">The observation instrument was a paper form carrying the eleven standard RULA elements (upper arm, lower arm, wrist, wrist twist, neck position, trunk position, legs, muscle A, force A, muscle B, force </w:t>
-      </w:r>
-      <w:r>
-        <w:rPr>
-          <w:rFonts w:eastAsia="Times New Roman" w:cs="Times New Roman"/>
-        </w:rPr>
         <w:lastRenderedPageBreak/>
-        <w:t>B), the three RULA Table lookup scores (A, B, C), and the eight QEC region and exposure scores (back, shoulder / arm, wrist / hand, neck, driving, vibration, work pace, stress). Both instruments were piloted with three delivery partners outside the study region so the item wording, response options, and observer worksheet layout could be revised before real fieldwork began.</w:t>
+        <w:t>The observation instrument was a paper form carrying the eleven standard RULA elements (upper arm, lower arm, wrist, wrist twist, neck position, trunk position, legs, muscle A, force A, muscle B, force B), the three RULA Table lookup scores (A, B, C), and the eight QEC region and exposure scores (back, shoulder / arm, wrist / hand, neck, driving, vibration, work pace, stress). Both instruments were piloted with three delivery partners outside the study region so the item wording, response options, and observer worksheet layout could be revised before real fieldwork began.</w:t>
       </w:r>
     </w:p>
     <w:p>
@@ -4768,7 +5774,21 @@
         <w:rPr>
           <w:rFonts w:eastAsia="Times New Roman" w:cs="Times New Roman"/>
         </w:rPr>
-        <w:t>Data preparation ran in two notebooks. 01_data_cleaning loaded the raw Google Form CSV, standardised text answers to canonical Yes/No values, corrected a handful of column-name typos, and dropped rows that were incomplete after follow-up. The cleaned CSV was 182 rows and 48 columns.</w:t>
+        <w:t xml:space="preserve">Data preparation ran in two notebooks. 01_data_cleaning loaded the raw Google Form CSV, </w:t>
+      </w:r>
+      <w:proofErr w:type="spellStart"/>
+      <w:r>
+        <w:rPr>
+          <w:rFonts w:eastAsia="Times New Roman" w:cs="Times New Roman"/>
+        </w:rPr>
+        <w:t>standardised</w:t>
+      </w:r>
+      <w:proofErr w:type="spellEnd"/>
+      <w:r>
+        <w:rPr>
+          <w:rFonts w:eastAsia="Times New Roman" w:cs="Times New Roman"/>
+        </w:rPr>
+        <w:t xml:space="preserve"> text answers to canonical Yes/No values, corrected a handful of column-name typos, and dropped rows that were incomplete after follow-up. The cleaned CSV was 182 rows and 48 columns.</w:t>
       </w:r>
     </w:p>
     <w:p>
@@ -4780,7 +5800,119 @@
         <w:rPr>
           <w:rFonts w:eastAsia="Times New Roman" w:cs="Times New Roman"/>
         </w:rPr>
-        <w:t>02_feature_engineering converted the cleaned CSV into the model-ready feature set. Ordered categorical bands (age, education, income, job duration, working hours, working days, deliveries per day, rest break) were encoded to consecutive integers preserving order. Vehicle type and carrying mode were converted to ranks so motorbike ranks higher than scooter for vibration exposure and handheld ranks higher than backpack and bike storage for contact stress. Composite scores were computed: workload_score as the mean of the six NASA-TLX items (with the dissatisfied item reversed), fatigue_score as the mean of the six Borg items, force_exertion as the Borg lifting item, and vibration_index as vehicle_rank times work_hours_num. Five product-form interactions were added (workload times fatigue, workload times age, force times age, fatigue times job duration, deliveries times days). The 18 NMQ and 7-day items and the 5 outcome follow-ups were converted to short-named binary aliases (nmq_neck, d7_lower_back, out_reduced_perf, and so on).</w:t>
+        <w:t xml:space="preserve">02_feature_engineering converted the cleaned CSV into the model-ready feature set. Ordered categorical bands (age, education, income, job duration, working hours, working days, deliveries per day, rest break) were encoded to consecutive integers preserving order. Vehicle type and carrying mode were converted to ranks so motorbike ranks higher than scooter for vibration exposure and handheld ranks higher than backpack and bike storage for contact stress. Composite scores were computed: </w:t>
+      </w:r>
+      <w:proofErr w:type="spellStart"/>
+      <w:r>
+        <w:rPr>
+          <w:rFonts w:eastAsia="Times New Roman" w:cs="Times New Roman"/>
+        </w:rPr>
+        <w:t>workload_score</w:t>
+      </w:r>
+      <w:proofErr w:type="spellEnd"/>
+      <w:r>
+        <w:rPr>
+          <w:rFonts w:eastAsia="Times New Roman" w:cs="Times New Roman"/>
+        </w:rPr>
+        <w:t xml:space="preserve"> as the mean of the six NASA-TLX items (with the dissatisfied item reversed), </w:t>
+      </w:r>
+      <w:proofErr w:type="spellStart"/>
+      <w:r>
+        <w:rPr>
+          <w:rFonts w:eastAsia="Times New Roman" w:cs="Times New Roman"/>
+        </w:rPr>
+        <w:t>fatigue_score</w:t>
+      </w:r>
+      <w:proofErr w:type="spellEnd"/>
+      <w:r>
+        <w:rPr>
+          <w:rFonts w:eastAsia="Times New Roman" w:cs="Times New Roman"/>
+        </w:rPr>
+        <w:t xml:space="preserve"> as the mean of the six Borg items, </w:t>
+      </w:r>
+      <w:proofErr w:type="spellStart"/>
+      <w:r>
+        <w:rPr>
+          <w:rFonts w:eastAsia="Times New Roman" w:cs="Times New Roman"/>
+        </w:rPr>
+        <w:t>force_exertion</w:t>
+      </w:r>
+      <w:proofErr w:type="spellEnd"/>
+      <w:r>
+        <w:rPr>
+          <w:rFonts w:eastAsia="Times New Roman" w:cs="Times New Roman"/>
+        </w:rPr>
+        <w:t xml:space="preserve"> as the Borg lifting item, and </w:t>
+      </w:r>
+      <w:proofErr w:type="spellStart"/>
+      <w:r>
+        <w:rPr>
+          <w:rFonts w:eastAsia="Times New Roman" w:cs="Times New Roman"/>
+        </w:rPr>
+        <w:t>vibration_index</w:t>
+      </w:r>
+      <w:proofErr w:type="spellEnd"/>
+      <w:r>
+        <w:rPr>
+          <w:rFonts w:eastAsia="Times New Roman" w:cs="Times New Roman"/>
+        </w:rPr>
+        <w:t xml:space="preserve"> as </w:t>
+      </w:r>
+      <w:proofErr w:type="spellStart"/>
+      <w:r>
+        <w:rPr>
+          <w:rFonts w:eastAsia="Times New Roman" w:cs="Times New Roman"/>
+        </w:rPr>
+        <w:t>vehicle_rank</w:t>
+      </w:r>
+      <w:proofErr w:type="spellEnd"/>
+      <w:r>
+        <w:rPr>
+          <w:rFonts w:eastAsia="Times New Roman" w:cs="Times New Roman"/>
+        </w:rPr>
+        <w:t xml:space="preserve"> times </w:t>
+      </w:r>
+      <w:proofErr w:type="spellStart"/>
+      <w:r>
+        <w:rPr>
+          <w:rFonts w:eastAsia="Times New Roman" w:cs="Times New Roman"/>
+        </w:rPr>
+        <w:t>work_hours_num</w:t>
+      </w:r>
+      <w:proofErr w:type="spellEnd"/>
+      <w:r>
+        <w:rPr>
+          <w:rFonts w:eastAsia="Times New Roman" w:cs="Times New Roman"/>
+        </w:rPr>
+        <w:t>. Five product-form interactions were added (workload times fatigue, workload times age, force times age, fatigue times job duration, deliveries times days). The 18 NMQ and 7-day items and the 5 outcome follow-ups were converted to short-named binary aliases (</w:t>
+      </w:r>
+      <w:proofErr w:type="spellStart"/>
+      <w:r>
+        <w:rPr>
+          <w:rFonts w:eastAsia="Times New Roman" w:cs="Times New Roman"/>
+        </w:rPr>
+        <w:t>nmq_neck</w:t>
+      </w:r>
+      <w:proofErr w:type="spellEnd"/>
+      <w:r>
+        <w:rPr>
+          <w:rFonts w:eastAsia="Times New Roman" w:cs="Times New Roman"/>
+        </w:rPr>
+        <w:t xml:space="preserve">, d7_lower_back, </w:t>
+      </w:r>
+      <w:proofErr w:type="spellStart"/>
+      <w:r>
+        <w:rPr>
+          <w:rFonts w:eastAsia="Times New Roman" w:cs="Times New Roman"/>
+        </w:rPr>
+        <w:t>out_reduced_perf</w:t>
+      </w:r>
+      <w:proofErr w:type="spellEnd"/>
+      <w:r>
+        <w:rPr>
+          <w:rFonts w:eastAsia="Times New Roman" w:cs="Times New Roman"/>
+        </w:rPr>
+        <w:t>, and so on).</w:t>
       </w:r>
     </w:p>
     <w:p>
@@ -4802,7 +5934,23 @@
       </w:pPr>
       <w:r>
         <w:lastRenderedPageBreak/>
-        <w:t>Phase 3 (03_risk_scoring.ipynb) applied the Stage-1 rules from §2.4 to the merged frame and wrote risk_profile.csv with per-rider Low / Medium / High labels on the six ergonomic factors. Phase 4 (04_eda.ipynb) then produced the descriptive figures used in Chapter 4 (demographics, per-factor risk distribution, Nordic prevalence, discomfort split by demographic and by risk level, and a Pearson correlation heatmap) under outputs/figures/.</w:t>
+        <w:t>Phase 3 (03_risk_</w:t>
+      </w:r>
+      <w:proofErr w:type="gramStart"/>
+      <w:r>
+        <w:t>scoring.ipynb</w:t>
+      </w:r>
+      <w:proofErr w:type="gramEnd"/>
+      <w:r>
+        <w:t>) applied the Stage-1 rules from §2.4 to the merged frame and wrote risk_profile.csv with per-rider Low / Medium / High labels on the six ergonomic factors. Phase 4 (04_</w:t>
+      </w:r>
+      <w:proofErr w:type="gramStart"/>
+      <w:r>
+        <w:t>eda.ipynb</w:t>
+      </w:r>
+      <w:proofErr w:type="gramEnd"/>
+      <w:r>
+        <w:t>) then produced the descriptive figures used in Chapter 4 (demographics, per-factor risk distribution, Nordic prevalence, discomfort split by demographic and by risk level, and a Pearson correlation heatmap) under outputs/figures/.</w:t>
       </w:r>
     </w:p>
     <w:p>
@@ -4828,7 +5976,21 @@
         <w:rPr>
           <w:rFonts w:eastAsia="Times New Roman" w:cs="Times New Roman"/>
         </w:rPr>
-        <w:t>Two independent statistical analyses were run in 05_stats on the model-ready CSV. First, six chi-square tests of independence checked whether each Stage-1 risk-factor band was associated with a binary discomfort outcome; the tests reported chi2, degrees of freedom, and a raw p-value. Second, a multivariable logistic regression fitted with statsmodels estimated odds ratios for fourteen predictors (age, income, education, job duration, workload score, fatigue score, force exertion, vibration index, contact rank, hours, days) with self-reported discomfort as the outcome. Results were reported as OR with 95 percent confidence intervals.</w:t>
+        <w:t xml:space="preserve">Two independent statistical analyses were run in 05_stats on the model-ready CSV. First, six chi-square tests of independence checked whether each Stage-1 risk-factor band was associated with a binary discomfort outcome; the tests reported chi2, degrees of freedom, and a raw p-value. Second, a multivariable logistic regression fitted with </w:t>
+      </w:r>
+      <w:proofErr w:type="spellStart"/>
+      <w:r>
+        <w:rPr>
+          <w:rFonts w:eastAsia="Times New Roman" w:cs="Times New Roman"/>
+        </w:rPr>
+        <w:t>statsmodels</w:t>
+      </w:r>
+      <w:proofErr w:type="spellEnd"/>
+      <w:r>
+        <w:rPr>
+          <w:rFonts w:eastAsia="Times New Roman" w:cs="Times New Roman"/>
+        </w:rPr>
+        <w:t xml:space="preserve"> estimated odds ratios for fourteen predictors (age, income, education, job duration, workload score, fatigue score, force exertion, vibration index, contact rank, hours, days) with self-reported discomfort as the outcome. Results were reported as OR with 95 percent confidence intervals.</w:t>
       </w:r>
     </w:p>
     <w:p>
@@ -4840,27 +6002,99 @@
         <w:rPr>
           <w:rFonts w:eastAsia="Times New Roman" w:cs="Times New Roman"/>
         </w:rPr>
-        <w:t>Model training ran in 06_modeling. Each of the seven candidate algorithms was wrapped in an imblearn.Pipeline of SMOTE followed by the classifier and hyperparameter-tuned via GridSearchCV. For each of the six risk-factor targets, this expanded to a full five-fold stratified cross-validation over the algorithm's hyperparameter grid. Across the six targets and seven algorithms, forty-two target-algorithm training runs were carried out. Best-by-macro-F1 was selected per target and the winning pipeline was refit on the full sample and saved via joblib.dump to outputs/models as best_&lt;factor&gt;.pkl. The per-target feature exclusions listed in §2.6.9 were applied before each training run so no model could memorise its Stage-1 rule.</w:t>
-      </w:r>
-      <w:r>
-        <w:rPr>
-          <w:rFonts w:eastAsia="Times New Roman" w:cs="Times New Roman"/>
-        </w:rPr>
-      </w:r>
-      <w:r>
-        <w:rPr>
-          <w:rFonts w:eastAsia="Times New Roman" w:cs="Times New Roman"/>
-        </w:rPr>
-      </w:r>
-      <w:r>
-        <w:rPr>
-          <w:rFonts w:eastAsia="Times New Roman" w:cs="Times New Roman"/>
-        </w:rPr>
-      </w:r>
-      <w:r>
-        <w:rPr>
-          <w:rFonts w:eastAsia="Times New Roman" w:cs="Times New Roman"/>
-        </w:rPr>
+        <w:t xml:space="preserve">Model training ran in 06_modeling. Each of the seven candidate algorithms was wrapped in an </w:t>
+      </w:r>
+      <w:proofErr w:type="spellStart"/>
+      <w:r>
+        <w:rPr>
+          <w:rFonts w:eastAsia="Times New Roman" w:cs="Times New Roman"/>
+        </w:rPr>
+        <w:t>imblearn</w:t>
+      </w:r>
+      <w:proofErr w:type="spellEnd"/>
+      <w:r>
+        <w:rPr>
+          <w:rFonts w:eastAsia="Times New Roman" w:cs="Times New Roman"/>
+        </w:rPr>
+        <w:t>.</w:t>
+      </w:r>
+      <w:r>
+        <w:rPr>
+          <w:rFonts w:eastAsia="Times New Roman" w:cs="Times New Roman"/>
+        </w:rPr>
+        <w:t xml:space="preserve"> </w:t>
+      </w:r>
+      <w:r>
+        <w:rPr>
+          <w:rFonts w:eastAsia="Times New Roman" w:cs="Times New Roman"/>
+        </w:rPr>
+        <w:t xml:space="preserve">Pipeline of SMOTE followed by the classifier and hyperparameter-tuned via </w:t>
+      </w:r>
+      <w:proofErr w:type="spellStart"/>
+      <w:r>
+        <w:rPr>
+          <w:rFonts w:eastAsia="Times New Roman" w:cs="Times New Roman"/>
+        </w:rPr>
+        <w:t>GridSearchCV</w:t>
+      </w:r>
+      <w:proofErr w:type="spellEnd"/>
+      <w:r>
+        <w:rPr>
+          <w:rFonts w:eastAsia="Times New Roman" w:cs="Times New Roman"/>
+        </w:rPr>
+        <w:t xml:space="preserve">. For each of the six risk-factor targets, this expanded to a full five-fold stratified cross-validation over the algorithm's hyperparameter grid. Across the six targets and seven algorithms, forty-two target-algorithm training runs were carried out. Best-by-macro-F1 was selected per target and the winning pipeline was refit on the full sample and saved via </w:t>
+      </w:r>
+      <w:proofErr w:type="spellStart"/>
+      <w:proofErr w:type="gramStart"/>
+      <w:r>
+        <w:rPr>
+          <w:rFonts w:eastAsia="Times New Roman" w:cs="Times New Roman"/>
+        </w:rPr>
+        <w:t>joblib.dump</w:t>
+      </w:r>
+      <w:proofErr w:type="spellEnd"/>
+      <w:proofErr w:type="gramEnd"/>
+      <w:r>
+        <w:rPr>
+          <w:rFonts w:eastAsia="Times New Roman" w:cs="Times New Roman"/>
+        </w:rPr>
+        <w:t xml:space="preserve"> to outputs/models as best_&lt;factor</w:t>
+      </w:r>
+      <w:proofErr w:type="gramStart"/>
+      <w:r>
+        <w:rPr>
+          <w:rFonts w:eastAsia="Times New Roman" w:cs="Times New Roman"/>
+        </w:rPr>
+        <w:t>&gt;.</w:t>
+      </w:r>
+      <w:proofErr w:type="spellStart"/>
+      <w:r>
+        <w:rPr>
+          <w:rFonts w:eastAsia="Times New Roman" w:cs="Times New Roman"/>
+        </w:rPr>
+        <w:t>pkl</w:t>
+      </w:r>
+      <w:proofErr w:type="spellEnd"/>
+      <w:proofErr w:type="gramEnd"/>
+      <w:r>
+        <w:rPr>
+          <w:rFonts w:eastAsia="Times New Roman" w:cs="Times New Roman"/>
+        </w:rPr>
+        <w:t xml:space="preserve">. The per-target feature exclusions listed in §2.6.9 were applied before each training run so no model could </w:t>
+      </w:r>
+      <w:proofErr w:type="spellStart"/>
+      <w:r>
+        <w:rPr>
+          <w:rFonts w:eastAsia="Times New Roman" w:cs="Times New Roman"/>
+        </w:rPr>
+        <w:t>memorise</w:t>
+      </w:r>
+      <w:proofErr w:type="spellEnd"/>
+      <w:r>
+        <w:rPr>
+          <w:rFonts w:eastAsia="Times New Roman" w:cs="Times New Roman"/>
+        </w:rPr>
+        <w:t xml:space="preserve"> its Stage-1 rule.</w:t>
       </w:r>
     </w:p>
     <w:p>
@@ -4872,7 +6106,63 @@
         <w:rPr>
           <w:rFonts w:eastAsia="Times New Roman" w:cs="Times New Roman"/>
         </w:rPr>
-        <w:t>07_evaluation produced the reporting artefacts. cross_val_predict was used to generate out-of-fold predictions on the training set, and the following outputs were written: per-class precision, recall, F1, and support numbers via classification_report; confusion matrices per target; one-vs-rest ROC curves with per-class AUC (macro AUC is the unweighted mean of per-class AUCs); and feature importance plots (feature_importances_ for the tree-based winners, absolute value of coef_ for the Logistic Regression floor).</w:t>
+        <w:t xml:space="preserve">07_evaluation produced the reporting artefacts. </w:t>
+      </w:r>
+      <w:proofErr w:type="spellStart"/>
+      <w:r>
+        <w:rPr>
+          <w:rFonts w:eastAsia="Times New Roman" w:cs="Times New Roman"/>
+        </w:rPr>
+        <w:t>cross_val_predict</w:t>
+      </w:r>
+      <w:proofErr w:type="spellEnd"/>
+      <w:r>
+        <w:rPr>
+          <w:rFonts w:eastAsia="Times New Roman" w:cs="Times New Roman"/>
+        </w:rPr>
+        <w:t xml:space="preserve"> was used to generate out-of-fold predictions on the training set, and the following outputs were written: per-class precision, recall, F1, and support numbers via </w:t>
+      </w:r>
+      <w:proofErr w:type="spellStart"/>
+      <w:r>
+        <w:rPr>
+          <w:rFonts w:eastAsia="Times New Roman" w:cs="Times New Roman"/>
+        </w:rPr>
+        <w:t>classification_report</w:t>
+      </w:r>
+      <w:proofErr w:type="spellEnd"/>
+      <w:r>
+        <w:rPr>
+          <w:rFonts w:eastAsia="Times New Roman" w:cs="Times New Roman"/>
+        </w:rPr>
+        <w:t>; confusion matrices per target; one-vs-rest ROC curves with per-class AUC (macro AUC is the unweighted mean of per-class AUCs); and feature importance plots (</w:t>
+      </w:r>
+      <w:proofErr w:type="spellStart"/>
+      <w:r>
+        <w:rPr>
+          <w:rFonts w:eastAsia="Times New Roman" w:cs="Times New Roman"/>
+        </w:rPr>
+        <w:t>feature_importances</w:t>
+      </w:r>
+      <w:proofErr w:type="spellEnd"/>
+      <w:r>
+        <w:rPr>
+          <w:rFonts w:eastAsia="Times New Roman" w:cs="Times New Roman"/>
+        </w:rPr>
+        <w:t xml:space="preserve">_ for the tree-based winners, absolute value of </w:t>
+      </w:r>
+      <w:proofErr w:type="spellStart"/>
+      <w:r>
+        <w:rPr>
+          <w:rFonts w:eastAsia="Times New Roman" w:cs="Times New Roman"/>
+        </w:rPr>
+        <w:t>coef</w:t>
+      </w:r>
+      <w:proofErr w:type="spellEnd"/>
+      <w:r>
+        <w:rPr>
+          <w:rFonts w:eastAsia="Times New Roman" w:cs="Times New Roman"/>
+        </w:rPr>
+        <w:t>_ for the Logistic Regression floor).</w:t>
       </w:r>
     </w:p>
     <w:p>
@@ -4901,12 +6191,42 @@
         <w:rPr>
           <w:rFonts w:eastAsia="Times New Roman" w:cs="Times New Roman"/>
         </w:rPr>
-        <w:t>The Streamlit application (app/streamlit_app.py) exposes a six-section form that mirrors the entire 36-item survey along with the 11 RULA components and 8 QEC scores. Selectboxes cover demographics and work pattern; radios cover NMQ, 7-day discomfort, and the outcome follow-ups; sliders cover NASA-TLX (0 to 100) and Borg CR10 (0 to 10); and QEC score entries are bounded by their allowed range. Three sample-profile buttons (Low, Average, High risk) pre-fill every field so a reviewer can trigger a prediction without hand-entering the questionnaire.</w:t>
-      </w:r>
-      <w:r>
-        <w:rPr>
-          <w:rFonts w:eastAsia="Times New Roman" w:cs="Times New Roman"/>
-        </w:rPr>
+        <w:t xml:space="preserve">The </w:t>
+      </w:r>
+      <w:proofErr w:type="spellStart"/>
+      <w:r>
+        <w:rPr>
+          <w:rFonts w:eastAsia="Times New Roman" w:cs="Times New Roman"/>
+        </w:rPr>
+        <w:t>Streamlit</w:t>
+      </w:r>
+      <w:proofErr w:type="spellEnd"/>
+      <w:r>
+        <w:rPr>
+          <w:rFonts w:eastAsia="Times New Roman" w:cs="Times New Roman"/>
+        </w:rPr>
+        <w:t xml:space="preserve"> application (app/streamlit_app.py) exposes a six-section form that mirrors the entire 36-item survey along with the 11 RULA components and 8 QEC scores. </w:t>
+      </w:r>
+      <w:proofErr w:type="spellStart"/>
+      <w:r>
+        <w:rPr>
+          <w:rFonts w:eastAsia="Times New Roman" w:cs="Times New Roman"/>
+        </w:rPr>
+        <w:t>Selectboxes</w:t>
+      </w:r>
+      <w:proofErr w:type="spellEnd"/>
+      <w:r>
+        <w:rPr>
+          <w:rFonts w:eastAsia="Times New Roman" w:cs="Times New Roman"/>
+        </w:rPr>
+        <w:t xml:space="preserve"> cover demographics and work pattern; radios cover NMQ, 7-day discomfort, and the outcome follow-ups; sliders cover NASA-TLX (0 to 100) and Borg CR10 (0 to 10); and QEC score entries are bounded by their allowed </w:t>
+      </w:r>
+      <w:r>
+        <w:rPr>
+          <w:rFonts w:eastAsia="Times New Roman" w:cs="Times New Roman"/>
+        </w:rPr>
+        <w:lastRenderedPageBreak/>
+        <w:t>range. Three sample-profile buttons (Low, Average, High risk) pre-fill every field so a reviewer can trigger a prediction without hand-entering the questionnaire.</w:t>
       </w:r>
     </w:p>
     <w:p>
@@ -4918,36 +6238,133 @@
         <w:rPr>
           <w:rFonts w:eastAsia="Times New Roman" w:cs="Times New Roman"/>
         </w:rPr>
-        <w:t>On form submission, encode_rider builds the shared 63-column feature frame (each model then applies its own per-target exclusions per Table 2.1) and predict_risks runs all six saved models. The Results page renders a colour-coded metric strip (green for Low, amber for Medium, red for High), a horizontal Altair bar chart of the same six factors, a summary banner that flags high-burden profiles, and per-factor recommendation cards. An expandable JSON view shows the exact 63 encoded features passed to the classifiers.</w:t>
-      </w:r>
-      <w:r>
-        <w:rPr>
-          <w:rFonts w:eastAsia="Times New Roman" w:cs="Times New Roman"/>
-        </w:rPr>
+        <w:t xml:space="preserve">On form submission, </w:t>
+      </w:r>
+      <w:proofErr w:type="spellStart"/>
+      <w:r>
+        <w:rPr>
+          <w:rFonts w:eastAsia="Times New Roman" w:cs="Times New Roman"/>
+        </w:rPr>
+        <w:t>encode_rider</w:t>
+      </w:r>
+      <w:proofErr w:type="spellEnd"/>
+      <w:r>
+        <w:rPr>
+          <w:rFonts w:eastAsia="Times New Roman" w:cs="Times New Roman"/>
+        </w:rPr>
+        <w:t xml:space="preserve"> builds the shared 63-column feature frame (each model then applies its own per-target exclusions per Table 2.1) and </w:t>
+      </w:r>
+      <w:proofErr w:type="spellStart"/>
+      <w:r>
+        <w:rPr>
+          <w:rFonts w:eastAsia="Times New Roman" w:cs="Times New Roman"/>
+        </w:rPr>
+        <w:t>predict_risks</w:t>
+      </w:r>
+      <w:proofErr w:type="spellEnd"/>
+      <w:r>
+        <w:rPr>
+          <w:rFonts w:eastAsia="Times New Roman" w:cs="Times New Roman"/>
+        </w:rPr>
+        <w:t xml:space="preserve"> runs all six saved models. The Results page renders a </w:t>
+      </w:r>
+      <w:proofErr w:type="spellStart"/>
+      <w:r>
+        <w:rPr>
+          <w:rFonts w:eastAsia="Times New Roman" w:cs="Times New Roman"/>
+        </w:rPr>
+        <w:t>colour</w:t>
+      </w:r>
+      <w:proofErr w:type="spellEnd"/>
+      <w:r>
+        <w:rPr>
+          <w:rFonts w:eastAsia="Times New Roman" w:cs="Times New Roman"/>
+        </w:rPr>
+        <w:t>-coded metric strip (green for Low, amber for Medium, red for High), a horizontal Altair bar chart of the same six factors, a summary banner that flags high-burden profiles, and per-factor recommendation cards. An expandable JSON view shows the exact 63 encoded features passed to the classifiers.</w:t>
       </w:r>
     </w:p>
     <w:p>
       <w:pPr>
         <w:spacing w:before="280" w:after="100"/>
         <w:rPr>
-          <w:rFonts w:ascii="Times New Roman" w:eastAsia="Times New Roman" w:hAnsi="Times New Roman" w:cs="Times New Roman"/>
-          <w:b w:val="0"/>
-          <w:bCs w:val="0"/>
-          <w:i w:val="0"/>
-          <w:iCs w:val="0"/>
-          <w:color w:val="auto"/>
-        </w:rPr>
-      </w:pPr>
-      <w:r>
-        <w:rPr>
-          <w:rFonts w:ascii="Times New Roman" w:eastAsia="Times New Roman" w:hAnsi="Times New Roman" w:cs="Times New Roman"/>
-          <w:b w:val="0"/>
-          <w:bCs w:val="0"/>
-          <w:i w:val="0"/>
-          <w:iCs w:val="0"/>
-          <w:color w:val="auto"/>
-        </w:rPr>
-        <w:t>The application was deployed to Streamlit Community Cloud from the public GitHub repository. Deployment required pinning every runtime dependency in requirements.txt to the exact versions used during training (streamlit 1.58, pandas 2.3, scikit-learn 1.7, xgboost 3.2, imbalanced-learn 0.14) because sklearn and xgboost pickles are not portable across versions. runtime.txt pins Python to 3.13 to match the training environment.</w:t>
+          <w:rFonts w:eastAsia="Times New Roman" w:cs="Times New Roman"/>
+        </w:rPr>
+      </w:pPr>
+      <w:r>
+        <w:rPr>
+          <w:rFonts w:eastAsia="Times New Roman" w:cs="Times New Roman"/>
+        </w:rPr>
+        <w:t xml:space="preserve">The application was deployed to </w:t>
+      </w:r>
+      <w:proofErr w:type="spellStart"/>
+      <w:r>
+        <w:rPr>
+          <w:rFonts w:eastAsia="Times New Roman" w:cs="Times New Roman"/>
+        </w:rPr>
+        <w:t>Streamlit</w:t>
+      </w:r>
+      <w:proofErr w:type="spellEnd"/>
+      <w:r>
+        <w:rPr>
+          <w:rFonts w:eastAsia="Times New Roman" w:cs="Times New Roman"/>
+        </w:rPr>
+        <w:t xml:space="preserve"> Community Cloud from the public GitHub repository. Deployment required pinning every runtime dependency in requirements.txt to the exact versions used during training (</w:t>
+      </w:r>
+      <w:proofErr w:type="spellStart"/>
+      <w:r>
+        <w:rPr>
+          <w:rFonts w:eastAsia="Times New Roman" w:cs="Times New Roman"/>
+        </w:rPr>
+        <w:t>streamlit</w:t>
+      </w:r>
+      <w:proofErr w:type="spellEnd"/>
+      <w:r>
+        <w:rPr>
+          <w:rFonts w:eastAsia="Times New Roman" w:cs="Times New Roman"/>
+        </w:rPr>
+        <w:t xml:space="preserve"> 1.58, pandas 2.3, scikit-learn 1.7, </w:t>
+      </w:r>
+      <w:proofErr w:type="spellStart"/>
+      <w:r>
+        <w:rPr>
+          <w:rFonts w:eastAsia="Times New Roman" w:cs="Times New Roman"/>
+        </w:rPr>
+        <w:t>xgboost</w:t>
+      </w:r>
+      <w:proofErr w:type="spellEnd"/>
+      <w:r>
+        <w:rPr>
+          <w:rFonts w:eastAsia="Times New Roman" w:cs="Times New Roman"/>
+        </w:rPr>
+        <w:t xml:space="preserve"> 3.2, imbalanced-learn 0.14) because </w:t>
+      </w:r>
+      <w:proofErr w:type="spellStart"/>
+      <w:r>
+        <w:rPr>
+          <w:rFonts w:eastAsia="Times New Roman" w:cs="Times New Roman"/>
+        </w:rPr>
+        <w:t>sklearn</w:t>
+      </w:r>
+      <w:proofErr w:type="spellEnd"/>
+      <w:r>
+        <w:rPr>
+          <w:rFonts w:eastAsia="Times New Roman" w:cs="Times New Roman"/>
+        </w:rPr>
+        <w:t xml:space="preserve"> and </w:t>
+      </w:r>
+      <w:proofErr w:type="spellStart"/>
+      <w:r>
+        <w:rPr>
+          <w:rFonts w:eastAsia="Times New Roman" w:cs="Times New Roman"/>
+        </w:rPr>
+        <w:t>xgboost</w:t>
+      </w:r>
+      <w:proofErr w:type="spellEnd"/>
+      <w:r>
+        <w:rPr>
+          <w:rFonts w:eastAsia="Times New Roman" w:cs="Times New Roman"/>
+        </w:rPr>
+        <w:t xml:space="preserve"> pickles are not portable across versions. runtime.txt pins Python to 3.13 to match the training environment.</w:t>
       </w:r>
     </w:p>
     <w:p>
@@ -4988,7 +6405,93 @@
         <w:rPr>
           <w:rFonts w:eastAsia="Times New Roman" w:cs="Times New Roman"/>
         </w:rPr>
-        <w:t>The initial Phase 3 binning used pandas.qcut(q=3) on deliveries_per_hour. The 66.7th percentile fell exactly on 3.889 dph (35 deliveries over 9 hours, the worst real schedule in the sample). Fifty-five of the 182 riders tied at that value and qcut pushed all of them into Medium, leaving the Stage-2 model unable to predict High for the worst schedule. Replacing qcut with fixed cuts at 2.5 and 3.75 raised the Stage-1 High count from 19 to 74. CV accuracy fell from 74 percent to 62 percent because the model now solves a real 3-class problem instead of memorising a 19-row minority.</w:t>
+        <w:t xml:space="preserve">The initial Phase 3 binning used </w:t>
+      </w:r>
+      <w:proofErr w:type="spellStart"/>
+      <w:proofErr w:type="gramStart"/>
+      <w:r>
+        <w:rPr>
+          <w:rFonts w:eastAsia="Times New Roman" w:cs="Times New Roman"/>
+        </w:rPr>
+        <w:t>pandas.qcut</w:t>
+      </w:r>
+      <w:proofErr w:type="spellEnd"/>
+      <w:proofErr w:type="gramEnd"/>
+      <w:r>
+        <w:rPr>
+          <w:rFonts w:eastAsia="Times New Roman" w:cs="Times New Roman"/>
+        </w:rPr>
+        <w:t xml:space="preserve">(q=3) on </w:t>
+      </w:r>
+      <w:proofErr w:type="spellStart"/>
+      <w:r>
+        <w:rPr>
+          <w:rFonts w:eastAsia="Times New Roman" w:cs="Times New Roman"/>
+        </w:rPr>
+        <w:t>deliveries_per_hour</w:t>
+      </w:r>
+      <w:proofErr w:type="spellEnd"/>
+      <w:r>
+        <w:rPr>
+          <w:rFonts w:eastAsia="Times New Roman" w:cs="Times New Roman"/>
+        </w:rPr>
+        <w:t xml:space="preserve">. The 66.7th percentile fell exactly on 3.889 </w:t>
+      </w:r>
+      <w:proofErr w:type="spellStart"/>
+      <w:r>
+        <w:rPr>
+          <w:rFonts w:eastAsia="Times New Roman" w:cs="Times New Roman"/>
+        </w:rPr>
+        <w:t>dph</w:t>
+      </w:r>
+      <w:proofErr w:type="spellEnd"/>
+      <w:r>
+        <w:rPr>
+          <w:rFonts w:eastAsia="Times New Roman" w:cs="Times New Roman"/>
+        </w:rPr>
+        <w:t xml:space="preserve"> (35 deliveries over 9 hours, the worst real schedule in the sample). Fifty-five of the 182 riders tied at that value and </w:t>
+      </w:r>
+      <w:proofErr w:type="spellStart"/>
+      <w:r>
+        <w:rPr>
+          <w:rFonts w:eastAsia="Times New Roman" w:cs="Times New Roman"/>
+        </w:rPr>
+        <w:t>qcut</w:t>
+      </w:r>
+      <w:proofErr w:type="spellEnd"/>
+      <w:r>
+        <w:rPr>
+          <w:rFonts w:eastAsia="Times New Roman" w:cs="Times New Roman"/>
+        </w:rPr>
+        <w:t xml:space="preserve"> pushed all of them into Medium, leaving the Stage-2 model unable to predict High for the worst schedule. Replacing </w:t>
+      </w:r>
+      <w:proofErr w:type="spellStart"/>
+      <w:r>
+        <w:rPr>
+          <w:rFonts w:eastAsia="Times New Roman" w:cs="Times New Roman"/>
+        </w:rPr>
+        <w:t>qcut</w:t>
+      </w:r>
+      <w:proofErr w:type="spellEnd"/>
+      <w:r>
+        <w:rPr>
+          <w:rFonts w:eastAsia="Times New Roman" w:cs="Times New Roman"/>
+        </w:rPr>
+        <w:t xml:space="preserve"> with fixed cuts at 2.5 and 3.75 raised the Stage-1 High count from 19 to 74. CV accuracy fell from 74 percent to 62 percent because the model now solves a real 3-class problem instead of </w:t>
+      </w:r>
+      <w:proofErr w:type="spellStart"/>
+      <w:r>
+        <w:rPr>
+          <w:rFonts w:eastAsia="Times New Roman" w:cs="Times New Roman"/>
+        </w:rPr>
+        <w:t>memorising</w:t>
+      </w:r>
+      <w:proofErr w:type="spellEnd"/>
+      <w:r>
+        <w:rPr>
+          <w:rFonts w:eastAsia="Times New Roman" w:cs="Times New Roman"/>
+        </w:rPr>
+        <w:t xml:space="preserve"> a 19-row minority.</w:t>
       </w:r>
     </w:p>
     <w:p>
@@ -5015,7 +6518,105 @@
         <w:rPr>
           <w:rFonts w:eastAsia="Times New Roman" w:cs="Times New Roman"/>
         </w:rPr>
-        <w:t>An earlier Phase 6 run reported 100 percent cross-validation accuracy on Duration. Investigation showed the trees were reconstructing work_hours_num from vibration_index, which equals vehicle_rank multiplied by work_hours_num. Adding vibration_index to the Duration exclusion list and capping max_depth returned Duration to a realistic 61 percent accuracy with 76 percent macro AUC.</w:t>
+        <w:t xml:space="preserve">An earlier Phase 6 run reported 100 percent cross-validation accuracy on Duration. Investigation showed the trees were reconstructing </w:t>
+      </w:r>
+      <w:proofErr w:type="spellStart"/>
+      <w:r>
+        <w:rPr>
+          <w:rFonts w:eastAsia="Times New Roman" w:cs="Times New Roman"/>
+        </w:rPr>
+        <w:t>work_hours_num</w:t>
+      </w:r>
+      <w:proofErr w:type="spellEnd"/>
+      <w:r>
+        <w:rPr>
+          <w:rFonts w:eastAsia="Times New Roman" w:cs="Times New Roman"/>
+        </w:rPr>
+        <w:t xml:space="preserve"> from </w:t>
+      </w:r>
+      <w:proofErr w:type="spellStart"/>
+      <w:r>
+        <w:rPr>
+          <w:rFonts w:eastAsia="Times New Roman" w:cs="Times New Roman"/>
+        </w:rPr>
+        <w:t>vibration_index</w:t>
+      </w:r>
+      <w:proofErr w:type="spellEnd"/>
+      <w:r>
+        <w:rPr>
+          <w:rFonts w:eastAsia="Times New Roman" w:cs="Times New Roman"/>
+        </w:rPr>
+        <w:t xml:space="preserve">, which equals </w:t>
+      </w:r>
+      <w:proofErr w:type="spellStart"/>
+      <w:r>
+        <w:rPr>
+          <w:rFonts w:eastAsia="Times New Roman" w:cs="Times New Roman"/>
+        </w:rPr>
+        <w:t>vehicle_rank</w:t>
+      </w:r>
+      <w:proofErr w:type="spellEnd"/>
+      <w:r>
+        <w:rPr>
+          <w:rFonts w:eastAsia="Times New Roman" w:cs="Times New Roman"/>
+        </w:rPr>
+        <w:t xml:space="preserve"> multiplied by </w:t>
+      </w:r>
+      <w:proofErr w:type="spellStart"/>
+      <w:r>
+        <w:rPr>
+          <w:rFonts w:eastAsia="Times New Roman" w:cs="Times New Roman"/>
+        </w:rPr>
+        <w:t>work_hours_num</w:t>
+      </w:r>
+      <w:proofErr w:type="spellEnd"/>
+      <w:r>
+        <w:rPr>
+          <w:rFonts w:eastAsia="Times New Roman" w:cs="Times New Roman"/>
+        </w:rPr>
+        <w:t xml:space="preserve">. Adding </w:t>
+      </w:r>
+      <w:proofErr w:type="spellStart"/>
+      <w:r>
+        <w:rPr>
+          <w:rFonts w:eastAsia="Times New Roman" w:cs="Times New Roman"/>
+        </w:rPr>
+        <w:t>vibration_index</w:t>
+      </w:r>
+      <w:proofErr w:type="spellEnd"/>
+      <w:r>
+        <w:rPr>
+          <w:rFonts w:eastAsia="Times New Roman" w:cs="Times New Roman"/>
+        </w:rPr>
+        <w:t xml:space="preserve"> to the Duration exclusion list and capping </w:t>
+      </w:r>
+      <w:proofErr w:type="spellStart"/>
+      <w:r>
+        <w:rPr>
+          <w:rFonts w:eastAsia="Times New Roman" w:cs="Times New Roman"/>
+        </w:rPr>
+        <w:t>max_depth</w:t>
+      </w:r>
+      <w:proofErr w:type="spellEnd"/>
+      <w:r>
+        <w:rPr>
+          <w:rFonts w:eastAsia="Times New Roman" w:cs="Times New Roman"/>
+        </w:rPr>
+        <w:t xml:space="preserve"> returned Duration to a realistic 61 percent accuracy with 76 percent </w:t>
+      </w:r>
+      <w:proofErr w:type="gramStart"/>
+      <w:r>
+        <w:rPr>
+          <w:rFonts w:eastAsia="Times New Roman" w:cs="Times New Roman"/>
+        </w:rPr>
+        <w:t>macro AUC</w:t>
+      </w:r>
+      <w:proofErr w:type="gramEnd"/>
+      <w:r>
+        <w:rPr>
+          <w:rFonts w:eastAsia="Times New Roman" w:cs="Times New Roman"/>
+        </w:rPr>
+        <w:t>.</w:t>
       </w:r>
     </w:p>
     <w:p>
@@ -5030,7 +6631,6 @@
           <w:color w:val="000000"/>
           <w:sz w:val="24"/>
         </w:rPr>
-        <w:lastRenderedPageBreak/>
         <w:t>3.7.3   Posture model with RULA and QEC inputs</w:t>
       </w:r>
     </w:p>
@@ -5043,7 +6643,35 @@
         <w:rPr>
           <w:rFonts w:eastAsia="Times New Roman" w:cs="Times New Roman"/>
         </w:rPr>
-        <w:t>The Posture target was initially trained only on the survey feature pool, which meant it could only infer posture indirectly from pain, fatigue, and hours. Adding the 11 RULA components and 8 QEC scores from the observation xlsx as explicit features moved Posture accuracy from 89 to 97 percent and the overfit gap from 0.088 to 0.028. Per the label-leakage rule, the three derived RULA Table scores were excluded because posture_risk is rula_table_c binned.</w:t>
+        <w:t xml:space="preserve">The Posture target was initially trained only on the survey feature pool, which meant it could only infer posture indirectly from pain, fatigue, and hours. Adding the 11 RULA components and 8 QEC scores from the observation xlsx as explicit features moved Posture accuracy from 89 to 97 percent and the overfit gap from 0.088 to 0.028. Per the label-leakage rule, the three derived RULA Table scores were excluded because </w:t>
+      </w:r>
+      <w:proofErr w:type="spellStart"/>
+      <w:r>
+        <w:rPr>
+          <w:rFonts w:eastAsia="Times New Roman" w:cs="Times New Roman"/>
+        </w:rPr>
+        <w:t>posture_risk</w:t>
+      </w:r>
+      <w:proofErr w:type="spellEnd"/>
+      <w:r>
+        <w:rPr>
+          <w:rFonts w:eastAsia="Times New Roman" w:cs="Times New Roman"/>
+        </w:rPr>
+        <w:t xml:space="preserve"> is </w:t>
+      </w:r>
+      <w:proofErr w:type="spellStart"/>
+      <w:r>
+        <w:rPr>
+          <w:rFonts w:eastAsia="Times New Roman" w:cs="Times New Roman"/>
+        </w:rPr>
+        <w:t>rula_table_c</w:t>
+      </w:r>
+      <w:proofErr w:type="spellEnd"/>
+      <w:r>
+        <w:rPr>
+          <w:rFonts w:eastAsia="Times New Roman" w:cs="Times New Roman"/>
+        </w:rPr>
+        <w:t xml:space="preserve"> binned.</w:t>
       </w:r>
     </w:p>
     <w:p>
@@ -5085,7 +6713,35 @@
         <w:rPr>
           <w:rFonts w:eastAsia="Times New Roman" w:cs="Times New Roman"/>
         </w:rPr>
-        <w:t>The sample of 182 riders is 152 male and 30 female. Age skews young: 78 riders are under 25, 66 in the 25-35 band, 30 in 36-45, and 8 in the 46-and-above band. Roughly half the sample (49 percent) works more than 8 hours per day. Ninety-four ride scooters and 88 ride motorbikes. The platform split is 97 Blinkit, 80 Zepto, and 5 who work both platforms.</w:t>
+        <w:t xml:space="preserve">The sample of 182 riders is 152 male and 30 female. Age skews young: 78 riders are under 25, 66 in the 25-35 band, 30 in 36-45, and 8 in the 46-and-above band. Roughly half the sample (49 percent) works more than 8 hours per day. Ninety-four ride scooters and 88 ride motorbikes. The platform split is 97 </w:t>
+      </w:r>
+      <w:proofErr w:type="spellStart"/>
+      <w:r>
+        <w:rPr>
+          <w:rFonts w:eastAsia="Times New Roman" w:cs="Times New Roman"/>
+        </w:rPr>
+        <w:t>Blinkit</w:t>
+      </w:r>
+      <w:proofErr w:type="spellEnd"/>
+      <w:r>
+        <w:rPr>
+          <w:rFonts w:eastAsia="Times New Roman" w:cs="Times New Roman"/>
+        </w:rPr>
+        <w:t xml:space="preserve">, 80 </w:t>
+      </w:r>
+      <w:proofErr w:type="spellStart"/>
+      <w:r>
+        <w:rPr>
+          <w:rFonts w:eastAsia="Times New Roman" w:cs="Times New Roman"/>
+        </w:rPr>
+        <w:t>Zepto</w:t>
+      </w:r>
+      <w:proofErr w:type="spellEnd"/>
+      <w:r>
+        <w:rPr>
+          <w:rFonts w:eastAsia="Times New Roman" w:cs="Times New Roman"/>
+        </w:rPr>
+        <w:t>, and 5 who work both platforms.</w:t>
       </w:r>
     </w:p>
     <w:p>
@@ -7870,6 +9526,7 @@
             <w:pPr>
               <w:spacing w:before="20" w:after="20"/>
             </w:pPr>
+            <w:proofErr w:type="spellStart"/>
             <w:r>
               <w:rPr>
                 <w:rFonts w:eastAsia="Times New Roman" w:cs="Times New Roman"/>
@@ -7877,6 +9534,7 @@
               </w:rPr>
               <w:t>HistGradientBoosting</w:t>
             </w:r>
+            <w:proofErr w:type="spellEnd"/>
           </w:p>
         </w:tc>
         <w:tc>
@@ -7979,6 +9637,7 @@
             <w:pPr>
               <w:spacing w:before="20" w:after="20"/>
             </w:pPr>
+            <w:proofErr w:type="spellStart"/>
             <w:r>
               <w:rPr>
                 <w:rFonts w:eastAsia="Times New Roman" w:cs="Times New Roman"/>
@@ -7986,6 +9645,7 @@
               </w:rPr>
               <w:t>RandomForest</w:t>
             </w:r>
+            <w:proofErr w:type="spellEnd"/>
           </w:p>
         </w:tc>
         <w:tc>
@@ -8088,6 +9748,7 @@
             <w:pPr>
               <w:spacing w:before="20" w:after="20"/>
             </w:pPr>
+            <w:proofErr w:type="spellStart"/>
             <w:r>
               <w:rPr>
                 <w:rFonts w:eastAsia="Times New Roman" w:cs="Times New Roman"/>
@@ -8095,6 +9756,7 @@
               </w:rPr>
               <w:t>RandomForest</w:t>
             </w:r>
+            <w:proofErr w:type="spellEnd"/>
           </w:p>
         </w:tc>
         <w:tc>
@@ -8197,6 +9859,7 @@
             <w:pPr>
               <w:spacing w:before="20" w:after="20"/>
             </w:pPr>
+            <w:proofErr w:type="spellStart"/>
             <w:r>
               <w:rPr>
                 <w:rFonts w:eastAsia="Times New Roman" w:cs="Times New Roman"/>
@@ -8204,6 +9867,7 @@
               </w:rPr>
               <w:t>ExtraTrees</w:t>
             </w:r>
+            <w:proofErr w:type="spellEnd"/>
           </w:p>
         </w:tc>
         <w:tc>
@@ -8306,6 +9970,7 @@
             <w:pPr>
               <w:spacing w:before="20" w:after="20"/>
             </w:pPr>
+            <w:proofErr w:type="spellStart"/>
             <w:r>
               <w:rPr>
                 <w:rFonts w:eastAsia="Times New Roman" w:cs="Times New Roman"/>
@@ -8313,6 +9978,7 @@
               </w:rPr>
               <w:t>RandomForest</w:t>
             </w:r>
+            <w:proofErr w:type="spellEnd"/>
           </w:p>
         </w:tc>
         <w:tc>
@@ -8415,6 +10081,7 @@
             <w:pPr>
               <w:spacing w:before="20" w:after="20"/>
             </w:pPr>
+            <w:proofErr w:type="spellStart"/>
             <w:r>
               <w:rPr>
                 <w:rFonts w:eastAsia="Times New Roman" w:cs="Times New Roman"/>
@@ -8422,6 +10089,7 @@
               </w:rPr>
               <w:t>HistGradientBoosting</w:t>
             </w:r>
+            <w:proofErr w:type="spellEnd"/>
           </w:p>
         </w:tc>
         <w:tc>
@@ -8523,7 +10191,35 @@
         <w:rPr>
           <w:rFonts w:eastAsia="Times New Roman" w:cs="Times New Roman"/>
         </w:rPr>
-        <w:t>The five survey-derived factors land between 58 and 62 percent cross-validation accuracy with macro AUC in the 71 to 76 percent range. Posture reaches 97 percent accuracy and 98 percent macro AUC because it is the only model that receives real observation inputs (the 11 RULA components and 8 QEC scores) on top of the survey features.</w:t>
+        <w:t xml:space="preserve">The five survey-derived factors land between 58 and 62 percent cross-validation accuracy with </w:t>
+      </w:r>
+      <w:proofErr w:type="gramStart"/>
+      <w:r>
+        <w:rPr>
+          <w:rFonts w:eastAsia="Times New Roman" w:cs="Times New Roman"/>
+        </w:rPr>
+        <w:t>macro AUC</w:t>
+      </w:r>
+      <w:proofErr w:type="gramEnd"/>
+      <w:r>
+        <w:rPr>
+          <w:rFonts w:eastAsia="Times New Roman" w:cs="Times New Roman"/>
+        </w:rPr>
+        <w:t xml:space="preserve"> in the 71 to 76 percent range. Posture reaches 97 percent accuracy and 98 percent </w:t>
+      </w:r>
+      <w:proofErr w:type="gramStart"/>
+      <w:r>
+        <w:rPr>
+          <w:rFonts w:eastAsia="Times New Roman" w:cs="Times New Roman"/>
+        </w:rPr>
+        <w:t>macro AUC</w:t>
+      </w:r>
+      <w:proofErr w:type="gramEnd"/>
+      <w:r>
+        <w:rPr>
+          <w:rFonts w:eastAsia="Times New Roman" w:cs="Times New Roman"/>
+        </w:rPr>
+        <w:t xml:space="preserve"> because it is the only model that receives real observation inputs (the 11 RULA components and 8 QEC scores) on top of the survey features.</w:t>
       </w:r>
     </w:p>
     <w:p>
@@ -11438,6 +13134,7 @@
             <w:pPr>
               <w:spacing w:before="20" w:after="20"/>
             </w:pPr>
+            <w:proofErr w:type="spellStart"/>
             <w:r>
               <w:rPr>
                 <w:rFonts w:eastAsia="Times New Roman" w:cs="Times New Roman"/>
@@ -11445,6 +13142,7 @@
               </w:rPr>
               <w:t>HistGBM</w:t>
             </w:r>
+            <w:proofErr w:type="spellEnd"/>
           </w:p>
         </w:tc>
         <w:tc>
@@ -11455,12 +13153,37 @@
             <w:pPr>
               <w:spacing w:before="20" w:after="20"/>
             </w:pPr>
-            <w:r>
-              <w:rPr>
-                <w:rFonts w:eastAsia="Times New Roman" w:cs="Times New Roman"/>
-                <w:sz w:val="20"/>
-              </w:rPr>
-              <w:t>max_depth=None, learning_rate=0.05</w:t>
+            <w:proofErr w:type="spellStart"/>
+            <w:r>
+              <w:rPr>
+                <w:rFonts w:eastAsia="Times New Roman" w:cs="Times New Roman"/>
+                <w:sz w:val="20"/>
+              </w:rPr>
+              <w:t>max_depth</w:t>
+            </w:r>
+            <w:proofErr w:type="spellEnd"/>
+            <w:r>
+              <w:rPr>
+                <w:rFonts w:eastAsia="Times New Roman" w:cs="Times New Roman"/>
+                <w:sz w:val="20"/>
+              </w:rPr>
+              <w:t xml:space="preserve">=None, </w:t>
+            </w:r>
+            <w:proofErr w:type="spellStart"/>
+            <w:r>
+              <w:rPr>
+                <w:rFonts w:eastAsia="Times New Roman" w:cs="Times New Roman"/>
+                <w:sz w:val="20"/>
+              </w:rPr>
+              <w:t>learning_rate</w:t>
+            </w:r>
+            <w:proofErr w:type="spellEnd"/>
+            <w:r>
+              <w:rPr>
+                <w:rFonts w:eastAsia="Times New Roman" w:cs="Times New Roman"/>
+                <w:sz w:val="20"/>
+              </w:rPr>
+              <w:t>=0.05</w:t>
             </w:r>
           </w:p>
         </w:tc>
@@ -11513,6 +13236,7 @@
             <w:pPr>
               <w:spacing w:before="20" w:after="20"/>
             </w:pPr>
+            <w:proofErr w:type="spellStart"/>
             <w:r>
               <w:rPr>
                 <w:rFonts w:eastAsia="Times New Roman" w:cs="Times New Roman"/>
@@ -11520,6 +13244,7 @@
               </w:rPr>
               <w:t>RandomForest</w:t>
             </w:r>
+            <w:proofErr w:type="spellEnd"/>
           </w:p>
         </w:tc>
         <w:tc>
@@ -11530,12 +13255,37 @@
             <w:pPr>
               <w:spacing w:before="20" w:after="20"/>
             </w:pPr>
-            <w:r>
-              <w:rPr>
-                <w:rFonts w:eastAsia="Times New Roman" w:cs="Times New Roman"/>
-                <w:sz w:val="20"/>
-              </w:rPr>
-              <w:t>n_estimators=300, max_depth=None</w:t>
+            <w:proofErr w:type="spellStart"/>
+            <w:r>
+              <w:rPr>
+                <w:rFonts w:eastAsia="Times New Roman" w:cs="Times New Roman"/>
+                <w:sz w:val="20"/>
+              </w:rPr>
+              <w:t>n_estimators</w:t>
+            </w:r>
+            <w:proofErr w:type="spellEnd"/>
+            <w:r>
+              <w:rPr>
+                <w:rFonts w:eastAsia="Times New Roman" w:cs="Times New Roman"/>
+                <w:sz w:val="20"/>
+              </w:rPr>
+              <w:t xml:space="preserve">=300, </w:t>
+            </w:r>
+            <w:proofErr w:type="spellStart"/>
+            <w:r>
+              <w:rPr>
+                <w:rFonts w:eastAsia="Times New Roman" w:cs="Times New Roman"/>
+                <w:sz w:val="20"/>
+              </w:rPr>
+              <w:t>max_depth</w:t>
+            </w:r>
+            <w:proofErr w:type="spellEnd"/>
+            <w:r>
+              <w:rPr>
+                <w:rFonts w:eastAsia="Times New Roman" w:cs="Times New Roman"/>
+                <w:sz w:val="20"/>
+              </w:rPr>
+              <w:t>=None</w:t>
             </w:r>
           </w:p>
         </w:tc>
@@ -11588,6 +13338,7 @@
             <w:pPr>
               <w:spacing w:before="20" w:after="20"/>
             </w:pPr>
+            <w:proofErr w:type="spellStart"/>
             <w:r>
               <w:rPr>
                 <w:rFonts w:eastAsia="Times New Roman" w:cs="Times New Roman"/>
@@ -11595,6 +13346,7 @@
               </w:rPr>
               <w:t>RandomForest</w:t>
             </w:r>
+            <w:proofErr w:type="spellEnd"/>
           </w:p>
         </w:tc>
         <w:tc>
@@ -11605,12 +13357,37 @@
             <w:pPr>
               <w:spacing w:before="20" w:after="20"/>
             </w:pPr>
-            <w:r>
-              <w:rPr>
-                <w:rFonts w:eastAsia="Times New Roman" w:cs="Times New Roman"/>
-                <w:sz w:val="20"/>
-              </w:rPr>
-              <w:t>n_estimators=500, max_depth=5</w:t>
+            <w:proofErr w:type="spellStart"/>
+            <w:r>
+              <w:rPr>
+                <w:rFonts w:eastAsia="Times New Roman" w:cs="Times New Roman"/>
+                <w:sz w:val="20"/>
+              </w:rPr>
+              <w:t>n_estimators</w:t>
+            </w:r>
+            <w:proofErr w:type="spellEnd"/>
+            <w:r>
+              <w:rPr>
+                <w:rFonts w:eastAsia="Times New Roman" w:cs="Times New Roman"/>
+                <w:sz w:val="20"/>
+              </w:rPr>
+              <w:t xml:space="preserve">=500, </w:t>
+            </w:r>
+            <w:proofErr w:type="spellStart"/>
+            <w:r>
+              <w:rPr>
+                <w:rFonts w:eastAsia="Times New Roman" w:cs="Times New Roman"/>
+                <w:sz w:val="20"/>
+              </w:rPr>
+              <w:t>max_depth</w:t>
+            </w:r>
+            <w:proofErr w:type="spellEnd"/>
+            <w:r>
+              <w:rPr>
+                <w:rFonts w:eastAsia="Times New Roman" w:cs="Times New Roman"/>
+                <w:sz w:val="20"/>
+              </w:rPr>
+              <w:t>=5</w:t>
             </w:r>
           </w:p>
         </w:tc>
@@ -11663,6 +13440,7 @@
             <w:pPr>
               <w:spacing w:before="20" w:after="20"/>
             </w:pPr>
+            <w:proofErr w:type="spellStart"/>
             <w:r>
               <w:rPr>
                 <w:rFonts w:eastAsia="Times New Roman" w:cs="Times New Roman"/>
@@ -11670,6 +13448,7 @@
               </w:rPr>
               <w:t>ExtraTrees</w:t>
             </w:r>
+            <w:proofErr w:type="spellEnd"/>
           </w:p>
         </w:tc>
         <w:tc>
@@ -11680,12 +13459,37 @@
             <w:pPr>
               <w:spacing w:before="20" w:after="20"/>
             </w:pPr>
-            <w:r>
-              <w:rPr>
-                <w:rFonts w:eastAsia="Times New Roman" w:cs="Times New Roman"/>
-                <w:sz w:val="20"/>
-              </w:rPr>
-              <w:t>n_estimators=300, max_depth=None</w:t>
+            <w:proofErr w:type="spellStart"/>
+            <w:r>
+              <w:rPr>
+                <w:rFonts w:eastAsia="Times New Roman" w:cs="Times New Roman"/>
+                <w:sz w:val="20"/>
+              </w:rPr>
+              <w:t>n_estimators</w:t>
+            </w:r>
+            <w:proofErr w:type="spellEnd"/>
+            <w:r>
+              <w:rPr>
+                <w:rFonts w:eastAsia="Times New Roman" w:cs="Times New Roman"/>
+                <w:sz w:val="20"/>
+              </w:rPr>
+              <w:t xml:space="preserve">=300, </w:t>
+            </w:r>
+            <w:proofErr w:type="spellStart"/>
+            <w:r>
+              <w:rPr>
+                <w:rFonts w:eastAsia="Times New Roman" w:cs="Times New Roman"/>
+                <w:sz w:val="20"/>
+              </w:rPr>
+              <w:t>max_depth</w:t>
+            </w:r>
+            <w:proofErr w:type="spellEnd"/>
+            <w:r>
+              <w:rPr>
+                <w:rFonts w:eastAsia="Times New Roman" w:cs="Times New Roman"/>
+                <w:sz w:val="20"/>
+              </w:rPr>
+              <w:t>=None</w:t>
             </w:r>
           </w:p>
         </w:tc>
@@ -11738,6 +13542,7 @@
             <w:pPr>
               <w:spacing w:before="20" w:after="20"/>
             </w:pPr>
+            <w:proofErr w:type="spellStart"/>
             <w:r>
               <w:rPr>
                 <w:rFonts w:eastAsia="Times New Roman" w:cs="Times New Roman"/>
@@ -11745,6 +13550,7 @@
               </w:rPr>
               <w:t>RandomForest</w:t>
             </w:r>
+            <w:proofErr w:type="spellEnd"/>
           </w:p>
         </w:tc>
         <w:tc>
@@ -11755,12 +13561,37 @@
             <w:pPr>
               <w:spacing w:before="20" w:after="20"/>
             </w:pPr>
-            <w:r>
-              <w:rPr>
-                <w:rFonts w:eastAsia="Times New Roman" w:cs="Times New Roman"/>
-                <w:sz w:val="20"/>
-              </w:rPr>
-              <w:t>n_estimators=500, max_depth=None</w:t>
+            <w:proofErr w:type="spellStart"/>
+            <w:r>
+              <w:rPr>
+                <w:rFonts w:eastAsia="Times New Roman" w:cs="Times New Roman"/>
+                <w:sz w:val="20"/>
+              </w:rPr>
+              <w:t>n_estimators</w:t>
+            </w:r>
+            <w:proofErr w:type="spellEnd"/>
+            <w:r>
+              <w:rPr>
+                <w:rFonts w:eastAsia="Times New Roman" w:cs="Times New Roman"/>
+                <w:sz w:val="20"/>
+              </w:rPr>
+              <w:t xml:space="preserve">=500, </w:t>
+            </w:r>
+            <w:proofErr w:type="spellStart"/>
+            <w:r>
+              <w:rPr>
+                <w:rFonts w:eastAsia="Times New Roman" w:cs="Times New Roman"/>
+                <w:sz w:val="20"/>
+              </w:rPr>
+              <w:t>max_depth</w:t>
+            </w:r>
+            <w:proofErr w:type="spellEnd"/>
+            <w:r>
+              <w:rPr>
+                <w:rFonts w:eastAsia="Times New Roman" w:cs="Times New Roman"/>
+                <w:sz w:val="20"/>
+              </w:rPr>
+              <w:t>=None</w:t>
             </w:r>
           </w:p>
         </w:tc>
@@ -11813,6 +13644,7 @@
             <w:pPr>
               <w:spacing w:before="20" w:after="20"/>
             </w:pPr>
+            <w:proofErr w:type="spellStart"/>
             <w:r>
               <w:rPr>
                 <w:rFonts w:eastAsia="Times New Roman" w:cs="Times New Roman"/>
@@ -11820,6 +13652,7 @@
               </w:rPr>
               <w:t>HistGBM</w:t>
             </w:r>
+            <w:proofErr w:type="spellEnd"/>
           </w:p>
         </w:tc>
         <w:tc>
@@ -11830,12 +13663,37 @@
             <w:pPr>
               <w:spacing w:before="20" w:after="20"/>
             </w:pPr>
-            <w:r>
-              <w:rPr>
-                <w:rFonts w:eastAsia="Times New Roman" w:cs="Times New Roman"/>
-                <w:sz w:val="20"/>
-              </w:rPr>
-              <w:t>max_depth=5, learning_rate=0.05</w:t>
+            <w:proofErr w:type="spellStart"/>
+            <w:r>
+              <w:rPr>
+                <w:rFonts w:eastAsia="Times New Roman" w:cs="Times New Roman"/>
+                <w:sz w:val="20"/>
+              </w:rPr>
+              <w:t>max_depth</w:t>
+            </w:r>
+            <w:proofErr w:type="spellEnd"/>
+            <w:r>
+              <w:rPr>
+                <w:rFonts w:eastAsia="Times New Roman" w:cs="Times New Roman"/>
+                <w:sz w:val="20"/>
+              </w:rPr>
+              <w:t xml:space="preserve">=5, </w:t>
+            </w:r>
+            <w:proofErr w:type="spellStart"/>
+            <w:r>
+              <w:rPr>
+                <w:rFonts w:eastAsia="Times New Roman" w:cs="Times New Roman"/>
+                <w:sz w:val="20"/>
+              </w:rPr>
+              <w:t>learning_rate</w:t>
+            </w:r>
+            <w:proofErr w:type="spellEnd"/>
+            <w:r>
+              <w:rPr>
+                <w:rFonts w:eastAsia="Times New Roman" w:cs="Times New Roman"/>
+                <w:sz w:val="20"/>
+              </w:rPr>
+              <w:t>=0.05</w:t>
             </w:r>
           </w:p>
         </w:tc>
@@ -11875,7 +13733,27 @@
           <w:color w:val="000000"/>
           <w:sz w:val="18"/>
         </w:rPr>
-        <w:t>Table 4.8: Winning hyperparameters per target after GridSearchCV.</w:t>
+        <w:t xml:space="preserve">Table 4.8: Winning hyperparameters per target after </w:t>
+      </w:r>
+      <w:proofErr w:type="spellStart"/>
+      <w:r>
+        <w:rPr>
+          <w:rFonts w:eastAsia="Times New Roman" w:cs="Times New Roman"/>
+          <w:i/>
+          <w:color w:val="000000"/>
+          <w:sz w:val="18"/>
+        </w:rPr>
+        <w:t>GridSearchCV</w:t>
+      </w:r>
+      <w:proofErr w:type="spellEnd"/>
+      <w:r>
+        <w:rPr>
+          <w:rFonts w:eastAsia="Times New Roman" w:cs="Times New Roman"/>
+          <w:i/>
+          <w:color w:val="000000"/>
+          <w:sz w:val="18"/>
+        </w:rPr>
+        <w:t>.</w:t>
       </w:r>
     </w:p>
     <w:p>
@@ -12214,7 +14092,25 @@
           <w:i/>
           <w:sz w:val="18"/>
         </w:rPr>
-        <w:t>Figure 4.13: Web app: predicted risk profile output with colour-coded level cards, radar chart, tabular result, and per-factor recommendations.</w:t>
+        <w:t xml:space="preserve">Figure 4.13: Web app: predicted risk profile output with </w:t>
+      </w:r>
+      <w:proofErr w:type="spellStart"/>
+      <w:r>
+        <w:rPr>
+          <w:rFonts w:eastAsia="Times New Roman" w:cs="Times New Roman"/>
+          <w:i/>
+          <w:sz w:val="18"/>
+        </w:rPr>
+        <w:t>colour</w:t>
+      </w:r>
+      <w:proofErr w:type="spellEnd"/>
+      <w:r>
+        <w:rPr>
+          <w:rFonts w:eastAsia="Times New Roman" w:cs="Times New Roman"/>
+          <w:i/>
+          <w:sz w:val="18"/>
+        </w:rPr>
+        <w:t>-coded level cards, radar chart, tabular result, and per-factor recommendations.</w:t>
       </w:r>
     </w:p>
     <w:p>
@@ -12242,7 +14138,35 @@
         <w:rPr>
           <w:rFonts w:eastAsia="Times New Roman" w:cs="Times New Roman"/>
         </w:rPr>
-        <w:t>This project designed, implemented, and deployed a per-rider ergonomic risk screening pipeline for last-mile quick-commerce delivery workers, turning a 36-item self-report questionnaire and a RULA + QEC observation record into six standardised risk levels across Force, Repetition, Posture, Duration, Contact Stress, and Vibration. The five survey-derived factors land at 58-62 percent cross-validation accuracy with macro AUC between 71 and 76 percent; the Posture model, which receives the RULA and QEC observation inputs directly, reaches 97 percent accuracy and 98 percent AUC. Chi-square identifies Posture, Repetition, and Force as the risk factors significantly associated with self-reported discomfort, and multivariable logistic regression flags age (OR 3.58 per band), job duration (OR 2.89), workload score, and fatigue score as the strongest individual predictors.</w:t>
+        <w:t xml:space="preserve">This project designed, implemented, and deployed a per-rider ergonomic risk screening pipeline for last-mile quick-commerce delivery workers, turning a 36-item self-report questionnaire and a RULA + QEC observation record into six </w:t>
+      </w:r>
+      <w:proofErr w:type="spellStart"/>
+      <w:r>
+        <w:rPr>
+          <w:rFonts w:eastAsia="Times New Roman" w:cs="Times New Roman"/>
+        </w:rPr>
+        <w:t>standardised</w:t>
+      </w:r>
+      <w:proofErr w:type="spellEnd"/>
+      <w:r>
+        <w:rPr>
+          <w:rFonts w:eastAsia="Times New Roman" w:cs="Times New Roman"/>
+        </w:rPr>
+        <w:t xml:space="preserve"> risk levels across Force, Repetition, Posture, Duration, Contact Stress, and Vibration. The five survey-derived factors land at 58-62 percent cross-validation accuracy with </w:t>
+      </w:r>
+      <w:proofErr w:type="gramStart"/>
+      <w:r>
+        <w:rPr>
+          <w:rFonts w:eastAsia="Times New Roman" w:cs="Times New Roman"/>
+        </w:rPr>
+        <w:t>macro AUC</w:t>
+      </w:r>
+      <w:proofErr w:type="gramEnd"/>
+      <w:r>
+        <w:rPr>
+          <w:rFonts w:eastAsia="Times New Roman" w:cs="Times New Roman"/>
+        </w:rPr>
+        <w:t xml:space="preserve"> between 71 and 76 percent; the Posture model, which receives the RULA and QEC observation inputs directly, reaches 97 percent accuracy and 98 percent AUC. Chi-square identifies Posture, Repetition, and Force as the risk factors significantly associated with self-reported discomfort, and multivariable logistic regression flags age (OR 3.58 per band), job duration (OR 2.89), workload score, and fatigue score as the strongest individual predictors.</w:t>
       </w:r>
     </w:p>
     <w:p>
@@ -12254,7 +14178,35 @@
         <w:rPr>
           <w:rFonts w:eastAsia="Times New Roman" w:cs="Times New Roman"/>
         </w:rPr>
-        <w:t>The main limitations are the self-report nature of most input variables, the severity-rank merge used to pair the identifier-less posture xlsx with the survey, and the small sample (n = 182) that keeps ML variance visible. Two methodological corrections were made and openly documented: Repetition binning moved from qcut to fixed cuts to remove a boundary tie that hid the worst real schedule, and vibration_index was added to the Duration exclusion list to remove indirect leakage.</w:t>
+        <w:t xml:space="preserve">The main limitations are the self-report nature of most input variables, the severity-rank merge used to pair the identifier-less posture xlsx with the survey, and the small sample (n = 182) that keeps ML variance visible. Two methodological corrections were made and openly documented: Repetition binning moved from </w:t>
+      </w:r>
+      <w:proofErr w:type="spellStart"/>
+      <w:r>
+        <w:rPr>
+          <w:rFonts w:eastAsia="Times New Roman" w:cs="Times New Roman"/>
+        </w:rPr>
+        <w:t>qcut</w:t>
+      </w:r>
+      <w:proofErr w:type="spellEnd"/>
+      <w:r>
+        <w:rPr>
+          <w:rFonts w:eastAsia="Times New Roman" w:cs="Times New Roman"/>
+        </w:rPr>
+        <w:t xml:space="preserve"> to fixed cuts to remove a boundary tie that hid the worst real schedule, and </w:t>
+      </w:r>
+      <w:proofErr w:type="spellStart"/>
+      <w:r>
+        <w:rPr>
+          <w:rFonts w:eastAsia="Times New Roman" w:cs="Times New Roman"/>
+        </w:rPr>
+        <w:t>vibration_index</w:t>
+      </w:r>
+      <w:proofErr w:type="spellEnd"/>
+      <w:r>
+        <w:rPr>
+          <w:rFonts w:eastAsia="Times New Roman" w:cs="Times New Roman"/>
+        </w:rPr>
+        <w:t xml:space="preserve"> was added to the Duration exclusion list to remove indirect leakage.</w:t>
       </w:r>
     </w:p>
     <w:p>
@@ -12266,7 +14218,21 @@
         <w:rPr>
           <w:rFonts w:eastAsia="Times New Roman" w:cs="Times New Roman"/>
         </w:rPr>
-        <w:t>Five interventions for a delivery-platform operator follow directly from the results: (i) cap daily hours (49 percent of the sample exceeds 8 hours per day); (ii) invest in posture-focused equipment and training (84 percent of observed postures at RULA grand score 5 or above, corresponding to action level 3 or 4); (iii) encourage bike-storage-box carrying over handheld bags; (iv) age-targeted MSD screening for the 36-and-above cohort; and (v) platform-level workload management to reduce the NASA-TLX component of the workload score, a significant discomfort predictor at p = 0.0005.</w:t>
+        <w:t>Five interventions for a delivery-platform operator follow directly from the results: (</w:t>
+      </w:r>
+      <w:proofErr w:type="spellStart"/>
+      <w:r>
+        <w:rPr>
+          <w:rFonts w:eastAsia="Times New Roman" w:cs="Times New Roman"/>
+        </w:rPr>
+        <w:t>i</w:t>
+      </w:r>
+      <w:proofErr w:type="spellEnd"/>
+      <w:r>
+        <w:rPr>
+          <w:rFonts w:eastAsia="Times New Roman" w:cs="Times New Roman"/>
+        </w:rPr>
+        <w:t>) cap daily hours (49 percent of the sample exceeds 8 hours per day); (ii) invest in posture-focused equipment and training (84 percent of observed postures at RULA grand score 5 or above, corresponding to action level 3 or 4); (iii) encourage bike-storage-box carrying over handheld bags; (iv) age-targeted MSD screening for the 36-and-above cohort; and (v) platform-level workload management to reduce the NASA-TLX component of the workload score, a significant discomfort predictor at p = 0.0005.</w:t>
       </w:r>
     </w:p>
     <w:p>
@@ -12305,7 +14271,23 @@
         <w:jc w:val="both"/>
       </w:pPr>
       <w:r>
-        <w:t>[1] Benson TM, Sathiyarajeswaran NS, Radhakrishnan R, Gafoor AA, Krupalakshme M, Samal J (2025). Factors and prevalence of musculoskeletal pain among the app-based food delivery riders in Tamil Nadu: a community-based cross-sectional study. Cureus, 17(3), e56132.</w:t>
+        <w:t xml:space="preserve">[1] Benson TM, </w:t>
+      </w:r>
+      <w:proofErr w:type="spellStart"/>
+      <w:r>
+        <w:t>Sathiyarajeswaran</w:t>
+      </w:r>
+      <w:proofErr w:type="spellEnd"/>
+      <w:r>
+        <w:t xml:space="preserve"> NS, Radhakrishnan R, Gafoor AA, </w:t>
+      </w:r>
+      <w:proofErr w:type="spellStart"/>
+      <w:r>
+        <w:t>Krupalakshme</w:t>
+      </w:r>
+      <w:proofErr w:type="spellEnd"/>
+      <w:r>
+        <w:t xml:space="preserve"> M, Samal J (2025). Factors and prevalence of musculoskeletal pain among the app-based food delivery riders in Tamil Nadu: a community-based cross-sectional study. Cureus, 17(3), e56132.</w:t>
       </w:r>
     </w:p>
     <w:p>
@@ -12345,7 +14327,23 @@
         <w:jc w:val="both"/>
       </w:pPr>
       <w:r>
-        <w:t>[5] Kuorinka I, Jonsson B, Kilbom A, Vinterberg H, Biering-Sorensen F, Andersson G, Jorgensen K (1987). Standardised Nordic questionnaires for the analysis of musculoskeletal symptoms. Applied Ergonomics, 18(3), 233-237.</w:t>
+        <w:t xml:space="preserve">[5] </w:t>
+      </w:r>
+      <w:proofErr w:type="spellStart"/>
+      <w:r>
+        <w:t>Kuorinka</w:t>
+      </w:r>
+      <w:proofErr w:type="spellEnd"/>
+      <w:r>
+        <w:t xml:space="preserve"> I, Jonsson B, Kilbom A, Vinterberg H, Biering-Sorensen F, Andersson G, Jorgensen K (1987). </w:t>
+      </w:r>
+      <w:proofErr w:type="spellStart"/>
+      <w:r>
+        <w:t>Standardised</w:t>
+      </w:r>
+      <w:proofErr w:type="spellEnd"/>
+      <w:r>
+        <w:t xml:space="preserve"> Nordic questionnaires for the analysis of musculoskeletal symptoms. Applied Ergonomics, 18(3), 233-237.</w:t>
       </w:r>
     </w:p>
     <w:p>
@@ -12355,7 +14353,15 @@
         <w:jc w:val="both"/>
       </w:pPr>
       <w:r>
-        <w:t>[6] Hart SG, Staveland LE (1988). Development of NASA-TLX (Task Load Index): Results of empirical and theoretical research. Advances in Psychology, 52, 139-183.</w:t>
+        <w:t xml:space="preserve">[6] Hart SG, </w:t>
+      </w:r>
+      <w:proofErr w:type="spellStart"/>
+      <w:r>
+        <w:t>Staveland</w:t>
+      </w:r>
+      <w:proofErr w:type="spellEnd"/>
+      <w:r>
+        <w:t xml:space="preserve"> LE (1988). Development of NASA-TLX (Task Load Index): Results of empirical and theoretical research. Advances in Psychology, 52, 139-183.</w:t>
       </w:r>
     </w:p>
     <w:p>
@@ -12375,7 +14381,15 @@
         <w:jc w:val="both"/>
       </w:pPr>
       <w:r>
-        <w:t>[8] Chawla NV, Bowyer KW, Hall LO, Kegelmeyer WP (2002). SMOTE: Synthetic Minority Over-sampling Technique. Journal of Artificial Intelligence Research, 16, 321-357.</w:t>
+        <w:t xml:space="preserve">[8] Chawla NV, Bowyer KW, Hall LO, </w:t>
+      </w:r>
+      <w:proofErr w:type="spellStart"/>
+      <w:r>
+        <w:t>Kegelmeyer</w:t>
+      </w:r>
+      <w:proofErr w:type="spellEnd"/>
+      <w:r>
+        <w:t xml:space="preserve"> WP (2002). SMOTE: Synthetic Minority Over-sampling Technique. Journal of Artificial Intelligence Research, 16, 321-357.</w:t>
       </w:r>
     </w:p>
     <w:p>
@@ -12395,7 +14409,15 @@
         <w:jc w:val="both"/>
       </w:pPr>
       <w:r>
-        <w:t>[10] Breiman L (2001). Random Forests. Machine Learning, 45(1), 5-32.</w:t>
+        <w:t xml:space="preserve">[10] </w:t>
+      </w:r>
+      <w:proofErr w:type="spellStart"/>
+      <w:r>
+        <w:t>Breiman</w:t>
+      </w:r>
+      <w:proofErr w:type="spellEnd"/>
+      <w:r>
+        <w:t xml:space="preserve"> L (2001). Random Forests. Machine Learning, 45(1), 5-32.</w:t>
       </w:r>
     </w:p>
     <w:p>
@@ -12405,7 +14427,15 @@
         <w:jc w:val="both"/>
       </w:pPr>
       <w:r>
-        <w:t>[11] Geurts P, Ernst D, Wehenkel L (2006). Extremely randomized trees. Machine Learning, 63(1), 3-42.</w:t>
+        <w:t xml:space="preserve">[11] Geurts P, Ernst D, </w:t>
+      </w:r>
+      <w:proofErr w:type="spellStart"/>
+      <w:r>
+        <w:t>Wehenkel</w:t>
+      </w:r>
+      <w:proofErr w:type="spellEnd"/>
+      <w:r>
+        <w:t xml:space="preserve"> L (2006). Extremely randomized trees. Machine Learning, 63(1), 3-42.</w:t>
       </w:r>
     </w:p>
     <w:p>
@@ -12415,7 +14445,23 @@
         <w:jc w:val="both"/>
       </w:pPr>
       <w:r>
-        <w:t>[12] Chen T, Guestrin C (2016). XGBoost: A Scalable Tree Boosting System. Proceedings of the 22nd ACM SIGKDD International Conference on Knowledge Discovery and Data Mining, 785-794.</w:t>
+        <w:t xml:space="preserve">[12] Chen T, </w:t>
+      </w:r>
+      <w:proofErr w:type="spellStart"/>
+      <w:r>
+        <w:t>Guestrin</w:t>
+      </w:r>
+      <w:proofErr w:type="spellEnd"/>
+      <w:r>
+        <w:t xml:space="preserve"> C (2016). </w:t>
+      </w:r>
+      <w:proofErr w:type="spellStart"/>
+      <w:r>
+        <w:t>XGBoost</w:t>
+      </w:r>
+      <w:proofErr w:type="spellEnd"/>
+      <w:r>
+        <w:t>: A Scalable Tree Boosting System. Proceedings of the 22nd ACM SIGKDD International Conference on Knowledge Discovery and Data Mining, 785-794.</w:t>
       </w:r>
     </w:p>
     <w:p>
@@ -12435,7 +14481,23 @@
         <w:jc w:val="both"/>
       </w:pPr>
       <w:r>
-        <w:t>[14] Pedregosa F, Varoquaux G, Gramfort A, et al. (2011). Scikit-learn: Machine Learning in Python. Journal of Machine Learning Research, 12, 2825-2830.</w:t>
+        <w:t xml:space="preserve">[14] Pedregosa F, </w:t>
+      </w:r>
+      <w:proofErr w:type="spellStart"/>
+      <w:r>
+        <w:t>Varoquaux</w:t>
+      </w:r>
+      <w:proofErr w:type="spellEnd"/>
+      <w:r>
+        <w:t xml:space="preserve"> G, </w:t>
+      </w:r>
+      <w:proofErr w:type="spellStart"/>
+      <w:r>
+        <w:t>Gramfort</w:t>
+      </w:r>
+      <w:proofErr w:type="spellEnd"/>
+      <w:r>
+        <w:t xml:space="preserve"> A, et al. (2011). Scikit-learn: Machine Learning in Python. Journal of Machine Learning Research, 12, 2825-2830.</w:t>
       </w:r>
     </w:p>
     <w:sectPr>

</xml_diff>